<commit_message>
04/01/2026 - 14:25 h
</commit_message>
<xml_diff>
--- a/Pedi e obtereis/Pedi e obtereis.docx
+++ b/Pedi e obtereis/Pedi e obtereis.docx
@@ -381,7 +381,12 @@
       </w:pPr>
       <w:r>
         <w:rPr>
-          <w:shd w:fill="auto" w:val="clear"/>
+          <w:rFonts w:eastAsia="Times New Roman" w:cs="Times New Roman" w:ascii="Garamond" w:hAnsi="Garamond"/>
+          <w:color w:val="000000"/>
+          <w:kern w:val="0"/>
+          <w:sz w:val="36"/>
+          <w:szCs w:val="36"/>
+          <w:lang w:val="en-US" w:eastAsia="zh-CN" w:bidi="hi-IN"/>
         </w:rPr>
       </w:r>
     </w:p>
@@ -400,7 +405,12 @@
       </w:pPr>
       <w:r>
         <w:rPr>
-          <w:shd w:fill="auto" w:val="clear"/>
+          <w:rFonts w:eastAsia="Times New Roman" w:cs="Times New Roman" w:ascii="Garamond" w:hAnsi="Garamond"/>
+          <w:color w:val="000000"/>
+          <w:kern w:val="0"/>
+          <w:sz w:val="36"/>
+          <w:szCs w:val="36"/>
+          <w:lang w:val="en-US" w:eastAsia="zh-CN" w:bidi="hi-IN"/>
         </w:rPr>
       </w:r>
     </w:p>
@@ -441,7 +451,12 @@
       </w:pPr>
       <w:r>
         <w:rPr>
-          <w:shd w:fill="auto" w:val="clear"/>
+          <w:rFonts w:eastAsia="Times New Roman" w:cs="Times New Roman" w:ascii="Garamond" w:hAnsi="Garamond"/>
+          <w:color w:val="000000"/>
+          <w:kern w:val="0"/>
+          <w:sz w:val="36"/>
+          <w:szCs w:val="36"/>
+          <w:lang w:val="en-US" w:eastAsia="zh-CN" w:bidi="hi-IN"/>
         </w:rPr>
       </w:r>
     </w:p>
@@ -482,7 +497,12 @@
       </w:pPr>
       <w:r>
         <w:rPr>
-          <w:shd w:fill="auto" w:val="clear"/>
+          <w:rFonts w:eastAsia="Times New Roman" w:cs="Times New Roman" w:ascii="Garamond" w:hAnsi="Garamond"/>
+          <w:color w:val="000000"/>
+          <w:kern w:val="0"/>
+          <w:sz w:val="36"/>
+          <w:szCs w:val="36"/>
+          <w:lang w:val="en-US" w:eastAsia="zh-CN" w:bidi="hi-IN"/>
         </w:rPr>
       </w:r>
     </w:p>
@@ -523,7 +543,12 @@
       </w:pPr>
       <w:r>
         <w:rPr>
-          <w:shd w:fill="auto" w:val="clear"/>
+          <w:rFonts w:eastAsia="Times New Roman" w:cs="Times New Roman" w:ascii="Garamond" w:hAnsi="Garamond"/>
+          <w:color w:val="000000"/>
+          <w:kern w:val="0"/>
+          <w:sz w:val="36"/>
+          <w:szCs w:val="36"/>
+          <w:lang w:val="en-US" w:eastAsia="zh-CN" w:bidi="hi-IN"/>
         </w:rPr>
       </w:r>
     </w:p>
@@ -564,7 +589,12 @@
       </w:pPr>
       <w:r>
         <w:rPr>
-          <w:shd w:fill="auto" w:val="clear"/>
+          <w:rFonts w:eastAsia="Times New Roman" w:cs="Times New Roman" w:ascii="Garamond" w:hAnsi="Garamond"/>
+          <w:color w:val="000000"/>
+          <w:kern w:val="0"/>
+          <w:sz w:val="36"/>
+          <w:szCs w:val="36"/>
+          <w:lang w:val="en-US" w:eastAsia="zh-CN" w:bidi="hi-IN"/>
         </w:rPr>
       </w:r>
     </w:p>
@@ -605,7 +635,12 @@
       </w:pPr>
       <w:r>
         <w:rPr>
-          <w:shd w:fill="auto" w:val="clear"/>
+          <w:rFonts w:eastAsia="Times New Roman" w:cs="Times New Roman" w:ascii="Garamond" w:hAnsi="Garamond"/>
+          <w:color w:val="000000"/>
+          <w:kern w:val="0"/>
+          <w:sz w:val="36"/>
+          <w:szCs w:val="36"/>
+          <w:lang w:val="en-US" w:eastAsia="zh-CN" w:bidi="hi-IN"/>
         </w:rPr>
       </w:r>
     </w:p>
@@ -694,54 +729,617 @@
           <w:shd w:fill="auto" w:val="clear"/>
           <w:lang w:val="en-US" w:eastAsia="zh-CN" w:bidi="hi-IN"/>
         </w:rPr>
-        <w:t>p</w:t>
-      </w:r>
-      <w:r>
-        <w:rPr>
-          <w:rFonts w:eastAsia="Times New Roman" w:cs="Times New Roman" w:ascii="Garamond" w:hAnsi="Garamond"/>
-          <w:color w:val="000000"/>
-          <w:kern w:val="0"/>
-          <w:sz w:val="36"/>
-          <w:szCs w:val="36"/>
-          <w:shd w:fill="auto" w:val="clear"/>
-          <w:lang w:val="en-US" w:eastAsia="zh-CN" w:bidi="hi-IN"/>
-        </w:rPr>
-        <w:t>rocurar a lição em que Emmanuel fala que não devemos orar estando de mãos vazias. Falar sobre pedirmos auxílio à Espiritualidade da FEIG sem nada oferecer em troca;</w:t>
-      </w:r>
-    </w:p>
-    <w:p>
-      <w:pPr>
-        <w:pStyle w:val="Normal"/>
-        <w:numPr>
-          <w:ilvl w:val="0"/>
-          <w:numId w:val="1"/>
-        </w:numPr>
-        <w:jc w:val="both"/>
+        <w:t>os fluidos espirituais, que constituem um dos estados do fluido cósmico universal, são a atmosfera dos seres espirituais. O fluido espiritual é o veículo do pensamento, assim como o ar é o veículo do som.</w:t>
+      </w:r>
+    </w:p>
+    <w:p>
+      <w:pPr>
+        <w:pStyle w:val="Normal"/>
+        <w:jc w:val="both"/>
+        <w:rPr>
+          <w:rFonts w:ascii="Garamond" w:hAnsi="Garamond" w:eastAsia="Times New Roman" w:cs="Times New Roman"/>
+          <w:color w:val="000000"/>
+          <w:kern w:val="0"/>
+          <w:sz w:val="36"/>
+          <w:szCs w:val="36"/>
+          <w:highlight w:val="none"/>
+          <w:shd w:fill="auto" w:val="clear"/>
+          <w:lang w:val="en-US" w:eastAsia="zh-CN" w:bidi="hi-IN"/>
+        </w:rPr>
+      </w:pPr>
+      <w:r>
+        <w:rPr>
+          <w:rFonts w:eastAsia="Times New Roman" w:cs="Times New Roman" w:ascii="Garamond" w:hAnsi="Garamond"/>
+          <w:color w:val="000000"/>
+          <w:kern w:val="0"/>
+          <w:sz w:val="36"/>
+          <w:szCs w:val="36"/>
+          <w:shd w:fill="auto" w:val="clear"/>
+          <w:lang w:val="en-US" w:eastAsia="zh-CN" w:bidi="hi-IN"/>
+        </w:rPr>
+      </w:r>
+    </w:p>
+    <w:p>
+      <w:pPr>
+        <w:pStyle w:val="Normal"/>
+        <w:jc w:val="both"/>
+        <w:rPr>
+          <w:color w:val="1C99E0"/>
+          <w:highlight w:val="none"/>
+          <w:shd w:fill="auto" w:val="clear"/>
+        </w:rPr>
+      </w:pPr>
+      <w:r>
+        <w:rPr>
+          <w:rFonts w:eastAsia="Times New Roman" w:cs="Times New Roman" w:ascii="Garamond" w:hAnsi="Garamond"/>
+          <w:color w:val="1C99E0"/>
+          <w:kern w:val="0"/>
+          <w:sz w:val="36"/>
+          <w:szCs w:val="36"/>
+          <w:shd w:fill="auto" w:val="clear"/>
+          <w:lang w:val="en-US" w:eastAsia="zh-CN" w:bidi="hi-IN"/>
+        </w:rPr>
+        <w:t>[ Início do bloco que usa a lição Socorro e Concurso ]</w:t>
+      </w:r>
+    </w:p>
+    <w:p>
+      <w:pPr>
+        <w:pStyle w:val="Normal"/>
+        <w:jc w:val="both"/>
+        <w:rPr>
+          <w:color w:val="1C99E0"/>
+          <w:highlight w:val="none"/>
+          <w:shd w:fill="auto" w:val="clear"/>
+        </w:rPr>
+      </w:pPr>
+      <w:r>
         <w:rPr/>
-      </w:pPr>
-      <w:r>
-        <w:rPr>
-          <w:rFonts w:eastAsia="Times New Roman" w:cs="Times New Roman" w:ascii="Garamond" w:hAnsi="Garamond"/>
-          <w:color w:val="000000"/>
-          <w:kern w:val="0"/>
-          <w:sz w:val="36"/>
-          <w:szCs w:val="36"/>
-          <w:shd w:fill="auto" w:val="clear"/>
-          <w:lang w:val="en-US" w:eastAsia="zh-CN" w:bidi="hi-IN"/>
-        </w:rPr>
-        <w:t>o</w:t>
-      </w:r>
-      <w:r>
-        <w:rPr>
-          <w:rFonts w:eastAsia="Times New Roman" w:cs="Times New Roman" w:ascii="Garamond" w:hAnsi="Garamond"/>
-          <w:color w:val="000000"/>
-          <w:kern w:val="0"/>
-          <w:sz w:val="36"/>
-          <w:szCs w:val="36"/>
-          <w:shd w:fill="auto" w:val="clear"/>
-          <w:lang w:val="en-US" w:eastAsia="zh-CN" w:bidi="hi-IN"/>
-        </w:rPr>
-        <w:t>s fluidos espirituais, que constituem um dos estados do fluido cósmico universal, são a atmosfera dos seres espirituais. O fluido espiritual é o veículo do pensamento, assim como o ar é o veículo do som.</w:t>
+      </w:r>
+    </w:p>
+    <w:p>
+      <w:pPr>
+        <w:pStyle w:val="Normal"/>
+        <w:jc w:val="both"/>
+        <w:rPr>
+          <w:color w:val="auto"/>
+        </w:rPr>
+      </w:pPr>
+      <w:r>
+        <w:rPr>
+          <w:rFonts w:eastAsia="Times New Roman" w:cs="Times New Roman" w:ascii="Garamond" w:hAnsi="Garamond"/>
+          <w:color w:val="000000"/>
+          <w:kern w:val="0"/>
+          <w:sz w:val="36"/>
+          <w:szCs w:val="36"/>
+          <w:shd w:fill="auto" w:val="clear"/>
+          <w:lang w:val="en-US" w:eastAsia="zh-CN" w:bidi="hi-IN"/>
+        </w:rPr>
+        <w:t>Emmanuel, na obra Palavras de Vida Eterna, lição número 9 — Socorro e Concurso — aborda uma questão cuja compreensão é de grande importância para todos nós.</w:t>
+      </w:r>
+    </w:p>
+    <w:p>
+      <w:pPr>
+        <w:pStyle w:val="Normal"/>
+        <w:jc w:val="both"/>
+        <w:rPr>
+          <w:color w:val="auto"/>
+        </w:rPr>
+      </w:pPr>
+      <w:r>
+        <w:rPr>
+          <w:color w:val="auto"/>
+        </w:rPr>
+      </w:r>
+    </w:p>
+    <w:p>
+      <w:pPr>
+        <w:pStyle w:val="Normal"/>
+        <w:jc w:val="both"/>
+        <w:rPr>
+          <w:color w:val="auto"/>
+        </w:rPr>
+      </w:pPr>
+      <w:r>
+        <w:rPr>
+          <w:rFonts w:eastAsia="Times New Roman" w:cs="Times New Roman" w:ascii="Garamond" w:hAnsi="Garamond"/>
+          <w:color w:val="000000"/>
+          <w:kern w:val="0"/>
+          <w:sz w:val="36"/>
+          <w:szCs w:val="36"/>
+          <w:shd w:fill="auto" w:val="clear"/>
+          <w:lang w:val="en-US" w:eastAsia="zh-CN" w:bidi="hi-IN"/>
+        </w:rPr>
+        <w:t>Jesus realizou duas multiplicações de pães e peixes.</w:t>
+      </w:r>
+    </w:p>
+    <w:p>
+      <w:pPr>
+        <w:pStyle w:val="Normal"/>
+        <w:jc w:val="both"/>
+        <w:rPr>
+          <w:color w:val="auto"/>
+        </w:rPr>
+      </w:pPr>
+      <w:r>
+        <w:rPr>
+          <w:color w:val="auto"/>
+        </w:rPr>
+      </w:r>
+    </w:p>
+    <w:p>
+      <w:pPr>
+        <w:pStyle w:val="Normal"/>
+        <w:jc w:val="both"/>
+        <w:rPr>
+          <w:color w:val="auto"/>
+        </w:rPr>
+      </w:pPr>
+      <w:r>
+        <w:rPr>
+          <w:rFonts w:eastAsia="Times New Roman" w:cs="Times New Roman" w:ascii="Garamond" w:hAnsi="Garamond"/>
+          <w:color w:val="000000"/>
+          <w:kern w:val="0"/>
+          <w:sz w:val="36"/>
+          <w:szCs w:val="36"/>
+          <w:shd w:fill="auto" w:val="clear"/>
+          <w:lang w:val="en-US" w:eastAsia="zh-CN" w:bidi="hi-IN"/>
+        </w:rPr>
+        <w:t>A primeira está narrada nos quatro Evangelhos — Mateus, Marcos, Lucas e João. Nela, os discípulos dispunham de cinco pães e dois peixes. Jesus os multiplica de tal forma que são alimentados cinco mil homens, sem contar mulheres e crianças, e com as sobras enchem-se doze cestos de vime.</w:t>
+      </w:r>
+    </w:p>
+    <w:p>
+      <w:pPr>
+        <w:pStyle w:val="Normal"/>
+        <w:jc w:val="both"/>
+        <w:rPr>
+          <w:color w:val="auto"/>
+        </w:rPr>
+      </w:pPr>
+      <w:r>
+        <w:rPr>
+          <w:color w:val="auto"/>
+        </w:rPr>
+      </w:r>
+    </w:p>
+    <w:p>
+      <w:pPr>
+        <w:pStyle w:val="Normal"/>
+        <w:jc w:val="both"/>
+        <w:rPr>
+          <w:color w:val="auto"/>
+        </w:rPr>
+      </w:pPr>
+      <w:r>
+        <w:rPr>
+          <w:rFonts w:eastAsia="Times New Roman" w:cs="Times New Roman" w:ascii="Garamond" w:hAnsi="Garamond"/>
+          <w:color w:val="000000"/>
+          <w:kern w:val="0"/>
+          <w:sz w:val="36"/>
+          <w:szCs w:val="36"/>
+          <w:shd w:fill="auto" w:val="clear"/>
+          <w:lang w:val="en-US" w:eastAsia="zh-CN" w:bidi="hi-IN"/>
+        </w:rPr>
+        <w:t>A segunda multiplicação está narrada apenas nos Evangelhos de Mateus e Marcos. Nessa ocasião, os discípulos tinham sete pães e alguns peixinhos, conforme está registrado. Após a multiplicação, foram alimentados quatro mil homens, além de mulheres e crianças, e sete cestos foram preenchidos com as sobras.</w:t>
+      </w:r>
+    </w:p>
+    <w:p>
+      <w:pPr>
+        <w:pStyle w:val="Normal"/>
+        <w:jc w:val="both"/>
+        <w:rPr>
+          <w:color w:val="auto"/>
+        </w:rPr>
+      </w:pPr>
+      <w:r>
+        <w:rPr>
+          <w:color w:val="auto"/>
+        </w:rPr>
+      </w:r>
+    </w:p>
+    <w:p>
+      <w:pPr>
+        <w:pStyle w:val="Normal"/>
+        <w:jc w:val="both"/>
+        <w:rPr>
+          <w:color w:val="auto"/>
+        </w:rPr>
+      </w:pPr>
+      <w:r>
+        <w:rPr>
+          <w:rFonts w:eastAsia="Times New Roman" w:cs="Times New Roman" w:ascii="Garamond" w:hAnsi="Garamond"/>
+          <w:color w:val="000000"/>
+          <w:kern w:val="0"/>
+          <w:sz w:val="36"/>
+          <w:szCs w:val="36"/>
+          <w:shd w:fill="auto" w:val="clear"/>
+          <w:lang w:val="en-US" w:eastAsia="zh-CN" w:bidi="hi-IN"/>
+        </w:rPr>
+        <w:t>Na lição Socorro e Concurso, Emmanuel se utiliza da passagem que narra a segunda multiplicação dos pães e peixes. Existe um ensinamento implícito nessa escolha, mas falaremos disso um pouco mais adiante.</w:t>
+      </w:r>
+    </w:p>
+    <w:p>
+      <w:pPr>
+        <w:pStyle w:val="Normal"/>
+        <w:jc w:val="both"/>
+        <w:rPr>
+          <w:color w:val="auto"/>
+        </w:rPr>
+      </w:pPr>
+      <w:r>
+        <w:rPr>
+          <w:color w:val="auto"/>
+        </w:rPr>
+      </w:r>
+    </w:p>
+    <w:p>
+      <w:pPr>
+        <w:pStyle w:val="Normal"/>
+        <w:jc w:val="both"/>
+        <w:rPr>
+          <w:color w:val="auto"/>
+        </w:rPr>
+      </w:pPr>
+      <w:r>
+        <w:rPr>
+          <w:rFonts w:eastAsia="Times New Roman" w:cs="Times New Roman" w:ascii="Garamond" w:hAnsi="Garamond"/>
+          <w:color w:val="000000"/>
+          <w:kern w:val="0"/>
+          <w:sz w:val="36"/>
+          <w:szCs w:val="36"/>
+          <w:shd w:fill="auto" w:val="clear"/>
+          <w:lang w:val="en-US" w:eastAsia="zh-CN" w:bidi="hi-IN"/>
+        </w:rPr>
+        <w:t>Emmanuel destaca que Jesus não pergunta aos discípulos de quantos pães eles precisariam para alimentar a multidão; Ele pergunta quantos pães eles tinham. Com essa pergunta, o Mestre deixa claro a necessidade de oferecermos algo de nossa parte quando solicitamos socorro. Nas duas multiplicações, Jesus alimentou milhares de pessoas, havendo inclusive sobras significativas. Entretanto, em ambas as ocasiões, Ele precisou das “migalhas” oferecidas pelos discípulos.</w:t>
+      </w:r>
+    </w:p>
+    <w:p>
+      <w:pPr>
+        <w:pStyle w:val="Normal"/>
+        <w:jc w:val="both"/>
+        <w:rPr>
+          <w:color w:val="auto"/>
+        </w:rPr>
+      </w:pPr>
+      <w:r>
+        <w:rPr>
+          <w:color w:val="auto"/>
+        </w:rPr>
+      </w:r>
+    </w:p>
+    <w:p>
+      <w:pPr>
+        <w:pStyle w:val="Normal"/>
+        <w:jc w:val="both"/>
+        <w:rPr>
+          <w:color w:val="auto"/>
+        </w:rPr>
+      </w:pPr>
+      <w:r>
+        <w:rPr>
+          <w:rFonts w:eastAsia="Times New Roman" w:cs="Times New Roman" w:ascii="Garamond" w:hAnsi="Garamond"/>
+          <w:color w:val="000000"/>
+          <w:kern w:val="0"/>
+          <w:sz w:val="36"/>
+          <w:szCs w:val="36"/>
+          <w:shd w:fill="auto" w:val="clear"/>
+          <w:lang w:val="en-US" w:eastAsia="zh-CN" w:bidi="hi-IN"/>
+        </w:rPr>
+        <w:t>Emmanuel traz esse ensinamento para o campo da oração e nos diz que não é justo solicitarmos o amparo do Mais Alto estendendo sempre as mãos vazias. De que adianta fazermos preces belas e comoventes se nada oferecemos em troca? Se desejamos ser merecedores da proteção e do auxílio dos Céus, é indispensável que apresentemos algo de nossa parte.</w:t>
+      </w:r>
+    </w:p>
+    <w:p>
+      <w:pPr>
+        <w:pStyle w:val="Normal"/>
+        <w:jc w:val="both"/>
+        <w:rPr>
+          <w:color w:val="auto"/>
+        </w:rPr>
+      </w:pPr>
+      <w:r>
+        <w:rPr>
+          <w:color w:val="auto"/>
+        </w:rPr>
+      </w:r>
+    </w:p>
+    <w:p>
+      <w:pPr>
+        <w:pStyle w:val="Normal"/>
+        <w:jc w:val="both"/>
+        <w:rPr>
+          <w:color w:val="auto"/>
+        </w:rPr>
+      </w:pPr>
+      <w:r>
+        <w:rPr>
+          <w:rFonts w:eastAsia="Times New Roman" w:cs="Times New Roman" w:ascii="Garamond" w:hAnsi="Garamond"/>
+          <w:color w:val="000000"/>
+          <w:kern w:val="0"/>
+          <w:sz w:val="36"/>
+          <w:szCs w:val="36"/>
+          <w:shd w:fill="auto" w:val="clear"/>
+          <w:lang w:val="en-US" w:eastAsia="zh-CN" w:bidi="hi-IN"/>
+        </w:rPr>
+        <w:t>Quase todos nós aqui presentes hoje, em pelo menos uma ocasião, já colocamos um nome na urna ou no livro de irradiação. Concordam comigo? Já pedimos à Espiritualidade desta Casa amparo para nós mesmos, para alguém que amamos ou até mesmo para um desconhecido. É uma prática comum. Muitas vezes a pessoa nem nos pede esse auxílio; somos nós que o oferecemos.</w:t>
+      </w:r>
+    </w:p>
+    <w:p>
+      <w:pPr>
+        <w:pStyle w:val="Normal"/>
+        <w:jc w:val="both"/>
+        <w:rPr>
+          <w:color w:val="auto"/>
+        </w:rPr>
+      </w:pPr>
+      <w:r>
+        <w:rPr>
+          <w:color w:val="auto"/>
+        </w:rPr>
+      </w:r>
+    </w:p>
+    <w:p>
+      <w:pPr>
+        <w:pStyle w:val="Normal"/>
+        <w:jc w:val="both"/>
+        <w:rPr>
+          <w:color w:val="auto"/>
+        </w:rPr>
+      </w:pPr>
+      <w:r>
+        <w:rPr>
+          <w:rFonts w:eastAsia="Times New Roman" w:cs="Times New Roman" w:ascii="Garamond" w:hAnsi="Garamond"/>
+          <w:color w:val="000000"/>
+          <w:kern w:val="0"/>
+          <w:sz w:val="36"/>
+          <w:szCs w:val="36"/>
+          <w:shd w:fill="auto" w:val="clear"/>
+          <w:lang w:val="en-US" w:eastAsia="zh-CN" w:bidi="hi-IN"/>
+        </w:rPr>
+        <w:t>Alguém comenta conosco que tem um familiar internado em estado grave, e logo dizemos: “Passe o nome completo e o endereço do hospital que eu vou levar lá no Glacus”. É uma atitude bonita, porque revela nossa vontade de ajudar. Mas será que, a cada pedido que fazemos, também oferecemos algo em troca? Ou será que apenas acrescentamos trabalho à Espiritualidade?</w:t>
+      </w:r>
+    </w:p>
+    <w:p>
+      <w:pPr>
+        <w:pStyle w:val="Normal"/>
+        <w:jc w:val="both"/>
+        <w:rPr>
+          <w:color w:val="auto"/>
+        </w:rPr>
+      </w:pPr>
+      <w:r>
+        <w:rPr>
+          <w:color w:val="auto"/>
+        </w:rPr>
+      </w:r>
+    </w:p>
+    <w:p>
+      <w:pPr>
+        <w:pStyle w:val="Normal"/>
+        <w:jc w:val="both"/>
+        <w:rPr>
+          <w:color w:val="auto"/>
+        </w:rPr>
+      </w:pPr>
+      <w:r>
+        <w:rPr>
+          <w:rFonts w:eastAsia="Times New Roman" w:cs="Times New Roman" w:ascii="Garamond" w:hAnsi="Garamond"/>
+          <w:color w:val="000000"/>
+          <w:kern w:val="0"/>
+          <w:sz w:val="36"/>
+          <w:szCs w:val="36"/>
+          <w:shd w:fill="auto" w:val="clear"/>
+          <w:lang w:val="en-US" w:eastAsia="zh-CN" w:bidi="hi-IN"/>
+        </w:rPr>
+        <w:t>É justamente para isso que Emmanuel chama nossa atenção. Não podemos agir de maneira injusta, pedindo sempre, sem nunca oferecer. Pedir é legítimo, confiar é necessário, mas agir no bem é indispensável para que o pedido encontre resposta útil e educativa.</w:t>
+      </w:r>
+    </w:p>
+    <w:p>
+      <w:pPr>
+        <w:pStyle w:val="Normal"/>
+        <w:jc w:val="both"/>
+        <w:rPr>
+          <w:color w:val="auto"/>
+        </w:rPr>
+      </w:pPr>
+      <w:r>
+        <w:rPr>
+          <w:color w:val="auto"/>
+        </w:rPr>
+      </w:r>
+    </w:p>
+    <w:p>
+      <w:pPr>
+        <w:pStyle w:val="Normal"/>
+        <w:jc w:val="both"/>
+        <w:rPr>
+          <w:color w:val="auto"/>
+        </w:rPr>
+      </w:pPr>
+      <w:r>
+        <w:rPr>
+          <w:rFonts w:eastAsia="Times New Roman" w:cs="Times New Roman" w:ascii="Garamond" w:hAnsi="Garamond"/>
+          <w:color w:val="000000"/>
+          <w:kern w:val="0"/>
+          <w:sz w:val="36"/>
+          <w:szCs w:val="36"/>
+          <w:shd w:fill="auto" w:val="clear"/>
+          <w:lang w:val="en-US" w:eastAsia="zh-CN" w:bidi="hi-IN"/>
+        </w:rPr>
+        <w:t>E quando falamos em agir no bem, não estamos nos referindo apenas a uma tarefa aqui na Casa de Glacus. Se pudermos abraçar uma ou mais das inúmeras tarefas abençoadas que esta Casa nos oferece, melhor ainda. Mas, se no momento isso não for possível, façamos o bem com o tempo e os recursos que temos à disposição. Não importa onde, nem a quem. Importa, sim, trabalhar no bem, porque assim — e somente assim — nossas orações ganharão força para serem ouvidas e respondidas pelos planos mais altos da vida.</w:t>
+      </w:r>
+    </w:p>
+    <w:p>
+      <w:pPr>
+        <w:pStyle w:val="Normal"/>
+        <w:jc w:val="both"/>
+        <w:rPr>
+          <w:color w:val="auto"/>
+        </w:rPr>
+      </w:pPr>
+      <w:r>
+        <w:rPr>
+          <w:color w:val="auto"/>
+        </w:rPr>
+      </w:r>
+    </w:p>
+    <w:p>
+      <w:pPr>
+        <w:pStyle w:val="Normal"/>
+        <w:jc w:val="both"/>
+        <w:rPr>
+          <w:color w:val="auto"/>
+        </w:rPr>
+      </w:pPr>
+      <w:r>
+        <w:rPr>
+          <w:rFonts w:eastAsia="Times New Roman" w:cs="Times New Roman" w:ascii="Garamond" w:hAnsi="Garamond"/>
+          <w:color w:val="000000"/>
+          <w:kern w:val="0"/>
+          <w:sz w:val="36"/>
+          <w:szCs w:val="36"/>
+          <w:shd w:fill="auto" w:val="clear"/>
+          <w:lang w:val="en-US" w:eastAsia="zh-CN" w:bidi="hi-IN"/>
+        </w:rPr>
+        <w:t>Eu disse anteriormente que há um ensinamento implícito na escolha de Emmanuel ao utilizar a passagem da segunda multiplicação dos pães. Vamos identificá-lo.</w:t>
+      </w:r>
+    </w:p>
+    <w:p>
+      <w:pPr>
+        <w:pStyle w:val="Normal"/>
+        <w:jc w:val="both"/>
+        <w:rPr>
+          <w:color w:val="auto"/>
+        </w:rPr>
+      </w:pPr>
+      <w:r>
+        <w:rPr>
+          <w:color w:val="auto"/>
+        </w:rPr>
+      </w:r>
+    </w:p>
+    <w:p>
+      <w:pPr>
+        <w:pStyle w:val="Normal"/>
+        <w:jc w:val="both"/>
+        <w:rPr>
+          <w:color w:val="auto"/>
+        </w:rPr>
+      </w:pPr>
+      <w:r>
+        <w:rPr>
+          <w:rFonts w:eastAsia="Times New Roman" w:cs="Times New Roman" w:ascii="Garamond" w:hAnsi="Garamond"/>
+          <w:color w:val="000000"/>
+          <w:kern w:val="0"/>
+          <w:sz w:val="36"/>
+          <w:szCs w:val="36"/>
+          <w:shd w:fill="auto" w:val="clear"/>
+          <w:lang w:val="en-US" w:eastAsia="zh-CN" w:bidi="hi-IN"/>
+        </w:rPr>
+        <w:t>Em Marcos 8:14–21, logo após a segunda multiplicação, Jesus entra no barco com os discípulos para atravessar o mar da Galileia. No meio da travessia, eles demonstram preocupação por terem levado apenas um pão. Jesus os adverte a se guardarem do fermento dos fariseus e de Herodes, mas eles interpretam suas palavras apenas no sentido material, pensando na falta de alimento.</w:t>
+      </w:r>
+    </w:p>
+    <w:p>
+      <w:pPr>
+        <w:pStyle w:val="Normal"/>
+        <w:jc w:val="both"/>
+        <w:rPr>
+          <w:color w:val="auto"/>
+        </w:rPr>
+      </w:pPr>
+      <w:r>
+        <w:rPr>
+          <w:color w:val="auto"/>
+        </w:rPr>
+      </w:r>
+    </w:p>
+    <w:p>
+      <w:pPr>
+        <w:pStyle w:val="Normal"/>
+        <w:jc w:val="both"/>
+        <w:rPr>
+          <w:color w:val="auto"/>
+        </w:rPr>
+      </w:pPr>
+      <w:r>
+        <w:rPr>
+          <w:rFonts w:eastAsia="Times New Roman" w:cs="Times New Roman" w:ascii="Garamond" w:hAnsi="Garamond"/>
+          <w:color w:val="000000"/>
+          <w:kern w:val="0"/>
+          <w:sz w:val="36"/>
+          <w:szCs w:val="36"/>
+          <w:shd w:fill="auto" w:val="clear"/>
+          <w:lang w:val="en-US" w:eastAsia="zh-CN" w:bidi="hi-IN"/>
+        </w:rPr>
+        <w:t>Jesus então pergunta: quantos cestos sobraram na primeira multiplicação? Eles respondem: doze. E quantos cestos sobraram na segunda? Eles dizem: sete. Então Jesus os adverte: “Têm olhos e não veem? Têm ouvidos e não ouvem? Depois de tudo o que foi feito, ainda não compreendeis?”</w:t>
+      </w:r>
+    </w:p>
+    <w:p>
+      <w:pPr>
+        <w:pStyle w:val="Normal"/>
+        <w:jc w:val="both"/>
+        <w:rPr>
+          <w:color w:val="auto"/>
+        </w:rPr>
+      </w:pPr>
+      <w:r>
+        <w:rPr>
+          <w:color w:val="auto"/>
+        </w:rPr>
+      </w:r>
+    </w:p>
+    <w:p>
+      <w:pPr>
+        <w:pStyle w:val="Normal"/>
+        <w:jc w:val="both"/>
+        <w:rPr>
+          <w:color w:val="auto"/>
+        </w:rPr>
+      </w:pPr>
+      <w:r>
+        <w:rPr>
+          <w:rFonts w:eastAsia="Times New Roman" w:cs="Times New Roman" w:ascii="Garamond" w:hAnsi="Garamond"/>
+          <w:color w:val="000000"/>
+          <w:kern w:val="0"/>
+          <w:sz w:val="36"/>
+          <w:szCs w:val="36"/>
+          <w:shd w:fill="auto" w:val="clear"/>
+          <w:lang w:val="en-US" w:eastAsia="zh-CN" w:bidi="hi-IN"/>
+        </w:rPr>
+        <w:t>Com isso, Jesus mostra que, apesar das experiências vividas, os discípulos ainda não haviam adquirido plena confiança no Mestre.</w:t>
+      </w:r>
+    </w:p>
+    <w:p>
+      <w:pPr>
+        <w:pStyle w:val="Normal"/>
+        <w:jc w:val="both"/>
+        <w:rPr>
+          <w:color w:val="auto"/>
+        </w:rPr>
+      </w:pPr>
+      <w:r>
+        <w:rPr>
+          <w:color w:val="auto"/>
+        </w:rPr>
+      </w:r>
+    </w:p>
+    <w:p>
+      <w:pPr>
+        <w:pStyle w:val="Normal"/>
+        <w:jc w:val="both"/>
+        <w:rPr>
+          <w:color w:val="auto"/>
+        </w:rPr>
+      </w:pPr>
+      <w:r>
+        <w:rPr>
+          <w:rFonts w:eastAsia="Times New Roman" w:cs="Times New Roman" w:ascii="Garamond" w:hAnsi="Garamond"/>
+          <w:color w:val="000000"/>
+          <w:kern w:val="0"/>
+          <w:sz w:val="36"/>
+          <w:szCs w:val="36"/>
+          <w:shd w:fill="auto" w:val="clear"/>
+          <w:lang w:val="en-US" w:eastAsia="zh-CN" w:bidi="hi-IN"/>
+        </w:rPr>
+        <w:t>Aqui entra, com muita clareza, o ensinamento de Emmanuel: nós também, apesar de já termos recebido inúmeras provas do amor e da misericórdia de Jesus em resposta às nossas rogativas, ainda não confiamos plenamente no Mestre.</w:t>
       </w:r>
     </w:p>
     <w:p>
@@ -750,13 +1348,71 @@
         <w:jc w:val="both"/>
         <w:rPr>
           <w:rFonts w:ascii="Garamond" w:hAnsi="Garamond" w:eastAsia="Times New Roman" w:cs="Times New Roman"/>
-          <w:color w:val="000000"/>
-          <w:kern w:val="0"/>
-          <w:sz w:val="36"/>
-          <w:szCs w:val="36"/>
-          <w:highlight w:val="none"/>
-          <w:shd w:fill="auto" w:val="clear"/>
-          <w:lang w:val="en-US" w:eastAsia="zh-CN" w:bidi="hi-IN"/>
+          <w:kern w:val="0"/>
+          <w:sz w:val="36"/>
+          <w:szCs w:val="36"/>
+          <w:shd w:fill="auto" w:val="clear"/>
+          <w:lang w:val="en-US" w:eastAsia="zh-CN" w:bidi="hi-IN"/>
+        </w:rPr>
+      </w:pPr>
+      <w:r>
+        <w:rPr>
+          <w:color w:val="auto"/>
+        </w:rPr>
+      </w:r>
+    </w:p>
+    <w:p>
+      <w:pPr>
+        <w:pStyle w:val="Normal"/>
+        <w:jc w:val="both"/>
+        <w:rPr>
+          <w:color w:val="auto"/>
+        </w:rPr>
+      </w:pPr>
+      <w:r>
+        <w:rPr>
+          <w:rFonts w:eastAsia="Times New Roman" w:cs="Times New Roman" w:ascii="Garamond" w:hAnsi="Garamond"/>
+          <w:color w:val="000000"/>
+          <w:kern w:val="0"/>
+          <w:sz w:val="36"/>
+          <w:szCs w:val="36"/>
+          <w:shd w:fill="auto" w:val="clear"/>
+          <w:lang w:val="en-US" w:eastAsia="zh-CN" w:bidi="hi-IN"/>
+        </w:rPr>
+        <w:t>Jesus continua confiando em nós, mas espera que aprendamos com aquilo que já recebemos; não para pedir mais, e sim para confiar mais e trabalhar melhor.</w:t>
+      </w:r>
+    </w:p>
+    <w:p>
+      <w:pPr>
+        <w:pStyle w:val="Normal"/>
+        <w:jc w:val="both"/>
+        <w:rPr>
+          <w:color w:val="1C99E0"/>
+          <w:highlight w:val="none"/>
+          <w:shd w:fill="auto" w:val="clear"/>
+        </w:rPr>
+      </w:pPr>
+      <w:r>
+        <w:rPr>
+          <w:rFonts w:eastAsia="Times New Roman" w:cs="Times New Roman" w:ascii="Garamond" w:hAnsi="Garamond"/>
+          <w:color w:val="1C99E0"/>
+          <w:kern w:val="0"/>
+          <w:sz w:val="36"/>
+          <w:szCs w:val="36"/>
+          <w:shd w:fill="auto" w:val="clear"/>
+          <w:lang w:val="en-US" w:eastAsia="zh-CN" w:bidi="hi-IN"/>
+        </w:rPr>
+        <w:t>[ Término do bloco que usa a lição Socorro e Concurso]</w:t>
+      </w:r>
+    </w:p>
+    <w:p>
+      <w:pPr>
+        <w:pStyle w:val="Normal"/>
+        <w:jc w:val="both"/>
+        <w:rPr>
+          <w:color w:val="1C99E0"/>
+          <w:highlight w:val="none"/>
+          <w:shd w:fill="auto" w:val="clear"/>
         </w:rPr>
       </w:pPr>
       <w:r>
@@ -774,9 +1430,37 @@
         </w:rPr>
       </w:pPr>
       <w:r>
-        <w:rPr>
-          <w:rFonts w:eastAsia="Times New Roman" w:cs="Times New Roman" w:ascii="Garamond" w:hAnsi="Garamond"/>
+        <w:rPr/>
+      </w:r>
+    </w:p>
+    <w:p>
+      <w:pPr>
+        <w:pStyle w:val="Normal"/>
+        <w:jc w:val="both"/>
+        <w:rPr>
           <w:color w:val="1C99E0"/>
+          <w:highlight w:val="none"/>
+          <w:shd w:fill="auto" w:val="clear"/>
+        </w:rPr>
+      </w:pPr>
+      <w:r>
+        <w:rPr/>
+      </w:r>
+    </w:p>
+    <w:p>
+      <w:pPr>
+        <w:pStyle w:val="Normal"/>
+        <w:jc w:val="both"/>
+        <w:rPr>
+          <w:color w:val="1C99E0"/>
+          <w:highlight w:val="none"/>
+          <w:shd w:fill="auto" w:val="clear"/>
+        </w:rPr>
+      </w:pPr>
+      <w:r>
+        <w:rPr>
+          <w:rFonts w:eastAsia="Times New Roman" w:cs="Times New Roman" w:ascii="Garamond" w:hAnsi="Garamond"/>
+          <w:color w:val="1C99E0"/>
           <w:kern w:val="0"/>
           <w:sz w:val="36"/>
           <w:szCs w:val="36"/>
@@ -801,7 +1485,12 @@
       </w:pPr>
       <w:r>
         <w:rPr>
-          <w:shd w:fill="auto" w:val="clear"/>
+          <w:rFonts w:eastAsia="Times New Roman" w:cs="Times New Roman" w:ascii="Garamond" w:hAnsi="Garamond"/>
+          <w:color w:val="000000"/>
+          <w:kern w:val="0"/>
+          <w:sz w:val="36"/>
+          <w:szCs w:val="36"/>
+          <w:lang w:val="en-US" w:eastAsia="zh-CN" w:bidi="hi-IN"/>
         </w:rPr>
       </w:r>
     </w:p>
@@ -930,7 +1619,12 @@
       </w:pPr>
       <w:r>
         <w:rPr>
-          <w:shd w:fill="auto" w:val="clear"/>
+          <w:rFonts w:eastAsia="Times New Roman" w:cs="Times New Roman" w:ascii="Garamond" w:hAnsi="Garamond"/>
+          <w:color w:val="000000"/>
+          <w:kern w:val="0"/>
+          <w:sz w:val="36"/>
+          <w:szCs w:val="36"/>
+          <w:lang w:val="en-US" w:eastAsia="zh-CN" w:bidi="hi-IN"/>
         </w:rPr>
       </w:r>
     </w:p>
@@ -971,32 +1665,373 @@
       </w:pPr>
       <w:r>
         <w:rPr>
+          <w:rFonts w:eastAsia="Times New Roman" w:cs="Times New Roman" w:ascii="Garamond" w:hAnsi="Garamond"/>
+          <w:kern w:val="0"/>
+          <w:sz w:val="36"/>
+          <w:szCs w:val="36"/>
+          <w:lang w:val="en-US" w:eastAsia="zh-CN" w:bidi="hi-IN"/>
+        </w:rPr>
+      </w:r>
+    </w:p>
+    <w:p>
+      <w:pPr>
+        <w:pStyle w:val="Normal"/>
+        <w:jc w:val="both"/>
+        <w:rPr>
           <w:color w:val="1C99E0"/>
-          <w:shd w:fill="auto" w:val="clear"/>
-        </w:rPr>
-      </w:r>
-    </w:p>
-    <w:p>
-      <w:pPr>
-        <w:pStyle w:val="Normal"/>
-        <w:jc w:val="both"/>
-        <w:rPr>
+          <w:highlight w:val="none"/>
+          <w:shd w:fill="auto" w:val="clear"/>
+        </w:rPr>
+      </w:pPr>
+      <w:r>
+        <w:rPr>
+          <w:rFonts w:eastAsia="Times New Roman" w:cs="Times New Roman" w:ascii="Garamond" w:hAnsi="Garamond"/>
           <w:color w:val="1C99E0"/>
-          <w:highlight w:val="none"/>
-          <w:shd w:fill="auto" w:val="clear"/>
-        </w:rPr>
-      </w:pPr>
-      <w:r>
-        <w:rPr>
-          <w:rFonts w:eastAsia="Times New Roman" w:cs="Times New Roman" w:ascii="Garamond" w:hAnsi="Garamond"/>
+          <w:kern w:val="0"/>
+          <w:sz w:val="36"/>
+          <w:szCs w:val="36"/>
+          <w:shd w:fill="auto" w:val="clear"/>
+          <w:lang w:val="en-US" w:eastAsia="zh-CN" w:bidi="hi-IN"/>
+        </w:rPr>
+        <w:t>[ Explicação de Fluido Cósmico Universal e fluidos espirituais dadas pelo ChatGPT ]</w:t>
+      </w:r>
+    </w:p>
+    <w:p>
+      <w:pPr>
+        <w:pStyle w:val="Normal"/>
+        <w:jc w:val="both"/>
+        <w:rPr>
+          <w:rFonts w:ascii="Garamond" w:hAnsi="Garamond" w:eastAsia="Times New Roman" w:cs="Times New Roman"/>
+          <w:kern w:val="0"/>
+          <w:sz w:val="36"/>
+          <w:szCs w:val="36"/>
+          <w:lang w:val="en-US" w:eastAsia="zh-CN" w:bidi="hi-IN"/>
+        </w:rPr>
+      </w:pPr>
+      <w:r>
+        <w:rPr>
+          <w:rFonts w:eastAsia="Times New Roman" w:cs="Times New Roman" w:ascii="Garamond" w:hAnsi="Garamond"/>
+          <w:kern w:val="0"/>
+          <w:sz w:val="36"/>
+          <w:szCs w:val="36"/>
+          <w:lang w:val="en-US" w:eastAsia="zh-CN" w:bidi="hi-IN"/>
+        </w:rPr>
+      </w:r>
+    </w:p>
+    <w:p>
+      <w:pPr>
+        <w:pStyle w:val="Normal"/>
+        <w:jc w:val="both"/>
+        <w:rPr>
+          <w:color w:val="auto"/>
+          <w:highlight w:val="none"/>
+          <w:shd w:fill="auto" w:val="clear"/>
+        </w:rPr>
+      </w:pPr>
+      <w:r>
+        <w:rPr>
+          <w:rFonts w:eastAsia="Times New Roman" w:cs="Times New Roman" w:ascii="Garamond" w:hAnsi="Garamond"/>
+          <w:color w:val="000000"/>
+          <w:kern w:val="0"/>
+          <w:sz w:val="36"/>
+          <w:szCs w:val="36"/>
+          <w:shd w:fill="auto" w:val="clear"/>
+          <w:lang w:val="en-US" w:eastAsia="zh-CN" w:bidi="hi-IN"/>
+        </w:rPr>
+        <w:t>Em A Gênese, Allan Kardec explica que, além da matéria visível, existe no Universo um elemento fundamental e invisível, presente em toda parte, chamado fluido cósmico universal. Esse fluido é o princípio elementar de todas as coisas. Tudo o que existe no mundo material e no mundo espiritual tem nele a sua origem. Ele preenche o espaço, envolve os corpos e penetra toda a criação, funcionando como o meio no qual a vida se manifesta.</w:t>
+      </w:r>
+    </w:p>
+    <w:p>
+      <w:pPr>
+        <w:pStyle w:val="Normal"/>
+        <w:jc w:val="both"/>
+        <w:rPr>
+          <w:rFonts w:ascii="Garamond" w:hAnsi="Garamond" w:eastAsia="Times New Roman" w:cs="Times New Roman"/>
+          <w:kern w:val="0"/>
+          <w:sz w:val="36"/>
+          <w:szCs w:val="36"/>
+          <w:lang w:val="en-US" w:eastAsia="zh-CN" w:bidi="hi-IN"/>
+        </w:rPr>
+      </w:pPr>
+      <w:r>
+        <w:rPr>
+          <w:rFonts w:eastAsia="Times New Roman" w:cs="Times New Roman" w:ascii="Garamond" w:hAnsi="Garamond"/>
+          <w:kern w:val="0"/>
+          <w:sz w:val="36"/>
+          <w:szCs w:val="36"/>
+          <w:lang w:val="en-US" w:eastAsia="zh-CN" w:bidi="hi-IN"/>
+        </w:rPr>
+      </w:r>
+    </w:p>
+    <w:p>
+      <w:pPr>
+        <w:pStyle w:val="Normal"/>
+        <w:jc w:val="both"/>
+        <w:rPr>
+          <w:color w:val="auto"/>
+          <w:highlight w:val="none"/>
+          <w:shd w:fill="auto" w:val="clear"/>
+        </w:rPr>
+      </w:pPr>
+      <w:r>
+        <w:rPr>
+          <w:rFonts w:eastAsia="Times New Roman" w:cs="Times New Roman" w:ascii="Garamond" w:hAnsi="Garamond"/>
+          <w:color w:val="000000"/>
+          <w:kern w:val="0"/>
+          <w:sz w:val="36"/>
+          <w:szCs w:val="36"/>
+          <w:shd w:fill="auto" w:val="clear"/>
+          <w:lang w:val="en-US" w:eastAsia="zh-CN" w:bidi="hi-IN"/>
+        </w:rPr>
+        <w:t>O fluido cósmico universal não é, em si mesmo, espírito nem matéria grosseira como a conhecemos. Ele ocupa uma posição intermediária entre ambos, servindo de elo entre o mundo material e o mundo espiritual. Kardec ensina que, por meio de diferentes transformações desse fluido, formam-se tanto a matéria propriamente dita quanto os chamados fluidos espirituais. Assim, a diversidade das substâncias e dos estados da matéria decorre das múltiplas modificações desse elemento primitivo.</w:t>
+      </w:r>
+    </w:p>
+    <w:p>
+      <w:pPr>
+        <w:pStyle w:val="Normal"/>
+        <w:jc w:val="both"/>
+        <w:rPr>
+          <w:rFonts w:ascii="Garamond" w:hAnsi="Garamond" w:eastAsia="Times New Roman" w:cs="Times New Roman"/>
+          <w:kern w:val="0"/>
+          <w:sz w:val="36"/>
+          <w:szCs w:val="36"/>
+          <w:lang w:val="en-US" w:eastAsia="zh-CN" w:bidi="hi-IN"/>
+        </w:rPr>
+      </w:pPr>
+      <w:r>
+        <w:rPr>
+          <w:rFonts w:eastAsia="Times New Roman" w:cs="Times New Roman" w:ascii="Garamond" w:hAnsi="Garamond"/>
+          <w:kern w:val="0"/>
+          <w:sz w:val="36"/>
+          <w:szCs w:val="36"/>
+          <w:lang w:val="en-US" w:eastAsia="zh-CN" w:bidi="hi-IN"/>
+        </w:rPr>
+      </w:r>
+    </w:p>
+    <w:p>
+      <w:pPr>
+        <w:pStyle w:val="Normal"/>
+        <w:jc w:val="both"/>
+        <w:rPr>
+          <w:color w:val="auto"/>
+          <w:highlight w:val="none"/>
+          <w:shd w:fill="auto" w:val="clear"/>
+        </w:rPr>
+      </w:pPr>
+      <w:r>
+        <w:rPr>
+          <w:rFonts w:eastAsia="Times New Roman" w:cs="Times New Roman" w:ascii="Garamond" w:hAnsi="Garamond"/>
+          <w:color w:val="000000"/>
+          <w:kern w:val="0"/>
+          <w:sz w:val="36"/>
+          <w:szCs w:val="36"/>
+          <w:shd w:fill="auto" w:val="clear"/>
+          <w:lang w:val="en-US" w:eastAsia="zh-CN" w:bidi="hi-IN"/>
+        </w:rPr>
+        <w:t>Os fluidos espirituais são, portanto, variações do fluido cósmico universal, adaptadas às necessidades do mundo espiritual. Eles constituem o ambiente próprio dos Espíritos e são o instrumento por meio do qual eles atuam sobre a matéria e sobre os encarnados. Esses fluidos podem ser mais ou menos sutis, mais ou menos densos, conforme o grau de adiantamento moral dos Espíritos que os utilizam.</w:t>
+      </w:r>
+    </w:p>
+    <w:p>
+      <w:pPr>
+        <w:pStyle w:val="Normal"/>
+        <w:jc w:val="both"/>
+        <w:rPr>
+          <w:rFonts w:ascii="Garamond" w:hAnsi="Garamond" w:eastAsia="Times New Roman" w:cs="Times New Roman"/>
+          <w:kern w:val="0"/>
+          <w:sz w:val="36"/>
+          <w:szCs w:val="36"/>
+          <w:lang w:val="en-US" w:eastAsia="zh-CN" w:bidi="hi-IN"/>
+        </w:rPr>
+      </w:pPr>
+      <w:r>
+        <w:rPr>
+          <w:rFonts w:eastAsia="Times New Roman" w:cs="Times New Roman" w:ascii="Garamond" w:hAnsi="Garamond"/>
+          <w:kern w:val="0"/>
+          <w:sz w:val="36"/>
+          <w:szCs w:val="36"/>
+          <w:lang w:val="en-US" w:eastAsia="zh-CN" w:bidi="hi-IN"/>
+        </w:rPr>
+      </w:r>
+    </w:p>
+    <w:p>
+      <w:pPr>
+        <w:pStyle w:val="Normal"/>
+        <w:jc w:val="both"/>
+        <w:rPr>
+          <w:color w:val="auto"/>
+          <w:highlight w:val="none"/>
+          <w:shd w:fill="auto" w:val="clear"/>
+        </w:rPr>
+      </w:pPr>
+      <w:r>
+        <w:rPr>
+          <w:rFonts w:eastAsia="Times New Roman" w:cs="Times New Roman" w:ascii="Garamond" w:hAnsi="Garamond"/>
+          <w:color w:val="000000"/>
+          <w:kern w:val="0"/>
+          <w:sz w:val="36"/>
+          <w:szCs w:val="36"/>
+          <w:shd w:fill="auto" w:val="clear"/>
+          <w:lang w:val="en-US" w:eastAsia="zh-CN" w:bidi="hi-IN"/>
+        </w:rPr>
+        <w:t>Kardec destaca que o pensamento é uma força real, capaz de agir diretamente sobre os fluidos espirituais. Ao pensar, o Espírito imprime nesses fluidos uma direção, uma forma e uma qualidade. Pensamentos elevados, nobres e harmoniosos produzem fluidos igualmente sutis e benéficos; pensamentos inferiores, egoístas ou perturbados geram fluidos mais densos e pesados. Dessa forma, cada pessoa cria ao seu redor uma atmosfera fluídica que reflete o seu mundo íntimo.</w:t>
+      </w:r>
+    </w:p>
+    <w:p>
+      <w:pPr>
+        <w:pStyle w:val="Normal"/>
+        <w:jc w:val="both"/>
+        <w:rPr>
+          <w:rFonts w:ascii="Garamond" w:hAnsi="Garamond" w:eastAsia="Times New Roman" w:cs="Times New Roman"/>
+          <w:kern w:val="0"/>
+          <w:sz w:val="36"/>
+          <w:szCs w:val="36"/>
+          <w:lang w:val="en-US" w:eastAsia="zh-CN" w:bidi="hi-IN"/>
+        </w:rPr>
+      </w:pPr>
+      <w:r>
+        <w:rPr>
+          <w:rFonts w:eastAsia="Times New Roman" w:cs="Times New Roman" w:ascii="Garamond" w:hAnsi="Garamond"/>
+          <w:kern w:val="0"/>
+          <w:sz w:val="36"/>
+          <w:szCs w:val="36"/>
+          <w:lang w:val="en-US" w:eastAsia="zh-CN" w:bidi="hi-IN"/>
+        </w:rPr>
+      </w:r>
+    </w:p>
+    <w:p>
+      <w:pPr>
+        <w:pStyle w:val="Normal"/>
+        <w:jc w:val="both"/>
+        <w:rPr>
+          <w:color w:val="auto"/>
+          <w:highlight w:val="none"/>
+          <w:shd w:fill="auto" w:val="clear"/>
+        </w:rPr>
+      </w:pPr>
+      <w:r>
+        <w:rPr>
+          <w:rFonts w:eastAsia="Times New Roman" w:cs="Times New Roman" w:ascii="Garamond" w:hAnsi="Garamond"/>
+          <w:color w:val="000000"/>
+          <w:kern w:val="0"/>
+          <w:sz w:val="36"/>
+          <w:szCs w:val="36"/>
+          <w:shd w:fill="auto" w:val="clear"/>
+          <w:lang w:val="en-US" w:eastAsia="zh-CN" w:bidi="hi-IN"/>
+        </w:rPr>
+        <w:t>A prece é um exemplo claro dessa ação do pensamento sobre os fluidos. Quando alguém ora com sinceridade, fé e intenção verdadeira, seu pensamento atua sobre o fluido cósmico universal, colocando-o em vibração elevada e estabelecendo uma ligação com os planos espirituais superiores. A eficácia da prece não está nas palavras pronunciadas, mas na qualidade dos sentimentos e da vontade que as acompanham. É essa força interior que determina o alcance e os efeitos da oração.</w:t>
+      </w:r>
+    </w:p>
+    <w:p>
+      <w:pPr>
+        <w:pStyle w:val="Normal"/>
+        <w:jc w:val="both"/>
+        <w:rPr>
+          <w:rFonts w:ascii="Garamond" w:hAnsi="Garamond" w:eastAsia="Times New Roman" w:cs="Times New Roman"/>
+          <w:kern w:val="0"/>
+          <w:sz w:val="36"/>
+          <w:szCs w:val="36"/>
+          <w:lang w:val="en-US" w:eastAsia="zh-CN" w:bidi="hi-IN"/>
+        </w:rPr>
+      </w:pPr>
+      <w:r>
+        <w:rPr>
+          <w:rFonts w:eastAsia="Times New Roman" w:cs="Times New Roman" w:ascii="Garamond" w:hAnsi="Garamond"/>
+          <w:kern w:val="0"/>
+          <w:sz w:val="36"/>
+          <w:szCs w:val="36"/>
+          <w:lang w:val="en-US" w:eastAsia="zh-CN" w:bidi="hi-IN"/>
+        </w:rPr>
+      </w:r>
+    </w:p>
+    <w:p>
+      <w:pPr>
+        <w:pStyle w:val="Normal"/>
+        <w:jc w:val="both"/>
+        <w:rPr>
+          <w:color w:val="auto"/>
+          <w:highlight w:val="none"/>
+          <w:shd w:fill="auto" w:val="clear"/>
+        </w:rPr>
+      </w:pPr>
+      <w:r>
+        <w:rPr>
+          <w:rFonts w:eastAsia="Times New Roman" w:cs="Times New Roman" w:ascii="Garamond" w:hAnsi="Garamond"/>
+          <w:color w:val="000000"/>
+          <w:kern w:val="0"/>
+          <w:sz w:val="36"/>
+          <w:szCs w:val="36"/>
+          <w:shd w:fill="auto" w:val="clear"/>
+          <w:lang w:val="en-US" w:eastAsia="zh-CN" w:bidi="hi-IN"/>
+        </w:rPr>
+        <w:t>Em A Gênese, Kardec explica ainda que todos os fenômenos espirituais — como as comunicações mediúnicas, as influências espirituais, as ações à distância e até certos processos de cura — encontram nos fluidos o seu mecanismo natural. Nada ocorre de forma milagrosa ou sobrenatural; trata-se da aplicação de leis naturais ainda pouco conhecidas pela humanidade, mas tão reais quanto as leis físicas que regem o mundo material.</w:t>
+      </w:r>
+    </w:p>
+    <w:p>
+      <w:pPr>
+        <w:pStyle w:val="Normal"/>
+        <w:jc w:val="both"/>
+        <w:rPr>
+          <w:rFonts w:ascii="Garamond" w:hAnsi="Garamond" w:eastAsia="Times New Roman" w:cs="Times New Roman"/>
+          <w:kern w:val="0"/>
+          <w:sz w:val="36"/>
+          <w:szCs w:val="36"/>
+          <w:lang w:val="en-US" w:eastAsia="zh-CN" w:bidi="hi-IN"/>
+        </w:rPr>
+      </w:pPr>
+      <w:r>
+        <w:rPr>
+          <w:rFonts w:eastAsia="Times New Roman" w:cs="Times New Roman" w:ascii="Garamond" w:hAnsi="Garamond"/>
+          <w:kern w:val="0"/>
+          <w:sz w:val="36"/>
+          <w:szCs w:val="36"/>
+          <w:lang w:val="en-US" w:eastAsia="zh-CN" w:bidi="hi-IN"/>
+        </w:rPr>
+      </w:r>
+    </w:p>
+    <w:p>
+      <w:pPr>
+        <w:pStyle w:val="Normal"/>
+        <w:jc w:val="both"/>
+        <w:rPr>
+          <w:color w:val="auto"/>
+          <w:highlight w:val="none"/>
+          <w:shd w:fill="auto" w:val="clear"/>
+        </w:rPr>
+      </w:pPr>
+      <w:r>
+        <w:rPr>
+          <w:rFonts w:eastAsia="Times New Roman" w:cs="Times New Roman" w:ascii="Garamond" w:hAnsi="Garamond"/>
+          <w:color w:val="000000"/>
+          <w:kern w:val="0"/>
+          <w:sz w:val="36"/>
+          <w:szCs w:val="36"/>
+          <w:shd w:fill="auto" w:val="clear"/>
+          <w:lang w:val="en-US" w:eastAsia="zh-CN" w:bidi="hi-IN"/>
+        </w:rPr>
+        <w:t>Assim, o fluido cósmico universal pode ser compreendido como o grande elemento da criação, enquanto os fluidos espirituais são suas manifestações moldadas pela ação do pensamento e da vontade. Ao elevar nossos pensamentos e sentimentos, especialmente por meio da prece, participamos conscientemente desse intercâmbio fluídico, harmonizando-nos com as forças superiores e contribuindo para o nosso próprio aperfeiçoamento espiritual.</w:t>
+      </w:r>
+    </w:p>
+    <w:p>
+      <w:pPr>
+        <w:pStyle w:val="Normal"/>
+        <w:jc w:val="both"/>
+        <w:rPr>
           <w:color w:val="1C99E0"/>
-          <w:kern w:val="0"/>
-          <w:sz w:val="36"/>
-          <w:szCs w:val="36"/>
-          <w:shd w:fill="auto" w:val="clear"/>
-          <w:lang w:val="en-US" w:eastAsia="zh-CN" w:bidi="hi-IN"/>
-        </w:rPr>
-        <w:t>[ Explicação de Fluido Cósmico Universal e fluidos espirituais dadas pelo ChatGPT ]</w:t>
+          <w:highlight w:val="none"/>
+          <w:shd w:fill="auto" w:val="clear"/>
+        </w:rPr>
+      </w:pPr>
+      <w:r>
+        <w:rPr>
+          <w:rFonts w:eastAsia="Times New Roman" w:cs="Times New Roman" w:ascii="Garamond" w:hAnsi="Garamond"/>
+          <w:color w:val="1C99E0"/>
+          <w:kern w:val="0"/>
+          <w:sz w:val="36"/>
+          <w:szCs w:val="36"/>
+          <w:shd w:fill="auto" w:val="clear"/>
+          <w:lang w:val="en-US" w:eastAsia="zh-CN" w:bidi="hi-IN"/>
+        </w:rPr>
+        <w:t>[ Término explicação ChatGPT ]</w:t>
       </w:r>
     </w:p>
     <w:p>
@@ -1013,325 +2048,11 @@
       </w:pPr>
       <w:r>
         <w:rPr>
-          <w:color w:val="1C99E0"/>
-          <w:shd w:fill="auto" w:val="clear"/>
-        </w:rPr>
-      </w:r>
-    </w:p>
-    <w:p>
-      <w:pPr>
-        <w:pStyle w:val="Normal"/>
-        <w:jc w:val="both"/>
-        <w:rPr>
-          <w:color w:val="auto"/>
-          <w:highlight w:val="none"/>
-          <w:shd w:fill="auto" w:val="clear"/>
-        </w:rPr>
-      </w:pPr>
-      <w:r>
-        <w:rPr>
-          <w:rFonts w:eastAsia="Times New Roman" w:cs="Times New Roman" w:ascii="Garamond" w:hAnsi="Garamond"/>
-          <w:color w:val="000000"/>
-          <w:kern w:val="0"/>
-          <w:sz w:val="36"/>
-          <w:szCs w:val="36"/>
-          <w:shd w:fill="auto" w:val="clear"/>
-          <w:lang w:val="en-US" w:eastAsia="zh-CN" w:bidi="hi-IN"/>
-        </w:rPr>
-        <w:t>Em A Gênese, Allan Kardec explica que, além da matéria visível, existe no Universo um elemento fundamental e invisível, presente em toda parte, chamado fluido cósmico universal. Esse fluido é o princípio elementar de todas as coisas. Tudo o que existe no mundo material e no mundo espiritual tem nele a sua origem. Ele preenche o espaço, envolve os corpos e penetra toda a criação, funcionando como o meio no qual a vida se manifesta.</w:t>
-      </w:r>
-    </w:p>
-    <w:p>
-      <w:pPr>
-        <w:pStyle w:val="Normal"/>
-        <w:jc w:val="both"/>
-        <w:rPr>
-          <w:rFonts w:ascii="Garamond" w:hAnsi="Garamond" w:eastAsia="Times New Roman" w:cs="Times New Roman"/>
-          <w:kern w:val="0"/>
-          <w:sz w:val="36"/>
-          <w:szCs w:val="36"/>
-          <w:lang w:val="en-US" w:eastAsia="zh-CN" w:bidi="hi-IN"/>
-        </w:rPr>
-      </w:pPr>
-      <w:r>
-        <w:rPr>
-          <w:color w:val="000000"/>
-          <w:shd w:fill="auto" w:val="clear"/>
-        </w:rPr>
-      </w:r>
-    </w:p>
-    <w:p>
-      <w:pPr>
-        <w:pStyle w:val="Normal"/>
-        <w:jc w:val="both"/>
-        <w:rPr>
-          <w:color w:val="auto"/>
-          <w:highlight w:val="none"/>
-          <w:shd w:fill="auto" w:val="clear"/>
-        </w:rPr>
-      </w:pPr>
-      <w:r>
-        <w:rPr>
-          <w:rFonts w:eastAsia="Times New Roman" w:cs="Times New Roman" w:ascii="Garamond" w:hAnsi="Garamond"/>
-          <w:color w:val="000000"/>
-          <w:kern w:val="0"/>
-          <w:sz w:val="36"/>
-          <w:szCs w:val="36"/>
-          <w:shd w:fill="auto" w:val="clear"/>
-          <w:lang w:val="en-US" w:eastAsia="zh-CN" w:bidi="hi-IN"/>
-        </w:rPr>
-        <w:t>O fluido cósmico universal não é, em si mesmo, espírito nem matéria grosseira como a conhecemos. Ele ocupa uma posição intermediária entre ambos, servindo de elo entre o mundo material e o mundo espiritual. Kardec ensina que, por meio de diferentes transformações desse fluido, formam-se tanto a matéria propriamente dita quanto os chamados fluidos espirituais. Assim, a diversidade das substâncias e dos estados da matéria decorre das múltiplas modificações desse elemento primitivo.</w:t>
-      </w:r>
-    </w:p>
-    <w:p>
-      <w:pPr>
-        <w:pStyle w:val="Normal"/>
-        <w:jc w:val="both"/>
-        <w:rPr>
-          <w:rFonts w:ascii="Garamond" w:hAnsi="Garamond" w:eastAsia="Times New Roman" w:cs="Times New Roman"/>
-          <w:kern w:val="0"/>
-          <w:sz w:val="36"/>
-          <w:szCs w:val="36"/>
-          <w:lang w:val="en-US" w:eastAsia="zh-CN" w:bidi="hi-IN"/>
-        </w:rPr>
-      </w:pPr>
-      <w:r>
-        <w:rPr>
-          <w:color w:val="000000"/>
-          <w:shd w:fill="auto" w:val="clear"/>
-        </w:rPr>
-      </w:r>
-    </w:p>
-    <w:p>
-      <w:pPr>
-        <w:pStyle w:val="Normal"/>
-        <w:jc w:val="both"/>
-        <w:rPr>
-          <w:color w:val="auto"/>
-          <w:highlight w:val="none"/>
-          <w:shd w:fill="auto" w:val="clear"/>
-        </w:rPr>
-      </w:pPr>
-      <w:r>
-        <w:rPr>
-          <w:rFonts w:eastAsia="Times New Roman" w:cs="Times New Roman" w:ascii="Garamond" w:hAnsi="Garamond"/>
-          <w:color w:val="000000"/>
-          <w:kern w:val="0"/>
-          <w:sz w:val="36"/>
-          <w:szCs w:val="36"/>
-          <w:shd w:fill="auto" w:val="clear"/>
-          <w:lang w:val="en-US" w:eastAsia="zh-CN" w:bidi="hi-IN"/>
-        </w:rPr>
-        <w:t>Os fluidos espirituais são, portanto, variações do fluido cósmico universal, adaptadas às necessidades do mundo espiritual. Eles constituem o ambiente próprio dos Espíritos e são o instrumento por meio do qual eles atuam sobre a matéria e sobre os encarnados. Esses fluidos podem ser mais ou menos sutis, mais ou menos densos, conforme o grau de adiantamento moral dos Espíritos que os utilizam.</w:t>
-      </w:r>
-    </w:p>
-    <w:p>
-      <w:pPr>
-        <w:pStyle w:val="Normal"/>
-        <w:jc w:val="both"/>
-        <w:rPr>
-          <w:rFonts w:ascii="Garamond" w:hAnsi="Garamond" w:eastAsia="Times New Roman" w:cs="Times New Roman"/>
-          <w:kern w:val="0"/>
-          <w:sz w:val="36"/>
-          <w:szCs w:val="36"/>
-          <w:lang w:val="en-US" w:eastAsia="zh-CN" w:bidi="hi-IN"/>
-        </w:rPr>
-      </w:pPr>
-      <w:r>
-        <w:rPr>
-          <w:color w:val="000000"/>
-          <w:shd w:fill="auto" w:val="clear"/>
-        </w:rPr>
-      </w:r>
-    </w:p>
-    <w:p>
-      <w:pPr>
-        <w:pStyle w:val="Normal"/>
-        <w:jc w:val="both"/>
-        <w:rPr>
-          <w:color w:val="auto"/>
-          <w:highlight w:val="none"/>
-          <w:shd w:fill="auto" w:val="clear"/>
-        </w:rPr>
-      </w:pPr>
-      <w:r>
-        <w:rPr>
-          <w:rFonts w:eastAsia="Times New Roman" w:cs="Times New Roman" w:ascii="Garamond" w:hAnsi="Garamond"/>
-          <w:color w:val="000000"/>
-          <w:kern w:val="0"/>
-          <w:sz w:val="36"/>
-          <w:szCs w:val="36"/>
-          <w:shd w:fill="auto" w:val="clear"/>
-          <w:lang w:val="en-US" w:eastAsia="zh-CN" w:bidi="hi-IN"/>
-        </w:rPr>
-        <w:t>Kardec destaca que o pensamento é uma força real, capaz de agir diretamente sobre os fluidos espirituais. Ao pensar, o Espírito imprime nesses fluidos uma direção, uma forma e uma qualidade. Pensamentos elevados, nobres e harmoniosos produzem fluidos igualmente sutis e benéficos; pensamentos inferiores, egoístas ou perturbados geram fluidos mais densos e pesados. Dessa forma, cada pessoa cria ao seu redor uma atmosfera fluídica que reflete o seu mundo íntimo.</w:t>
-      </w:r>
-    </w:p>
-    <w:p>
-      <w:pPr>
-        <w:pStyle w:val="Normal"/>
-        <w:jc w:val="both"/>
-        <w:rPr>
-          <w:rFonts w:ascii="Garamond" w:hAnsi="Garamond" w:eastAsia="Times New Roman" w:cs="Times New Roman"/>
-          <w:kern w:val="0"/>
-          <w:sz w:val="36"/>
-          <w:szCs w:val="36"/>
-          <w:lang w:val="en-US" w:eastAsia="zh-CN" w:bidi="hi-IN"/>
-        </w:rPr>
-      </w:pPr>
-      <w:r>
-        <w:rPr>
-          <w:color w:val="000000"/>
-          <w:shd w:fill="auto" w:val="clear"/>
-        </w:rPr>
-      </w:r>
-    </w:p>
-    <w:p>
-      <w:pPr>
-        <w:pStyle w:val="Normal"/>
-        <w:jc w:val="both"/>
-        <w:rPr>
-          <w:color w:val="auto"/>
-          <w:highlight w:val="none"/>
-          <w:shd w:fill="auto" w:val="clear"/>
-        </w:rPr>
-      </w:pPr>
-      <w:r>
-        <w:rPr>
-          <w:rFonts w:eastAsia="Times New Roman" w:cs="Times New Roman" w:ascii="Garamond" w:hAnsi="Garamond"/>
-          <w:color w:val="000000"/>
-          <w:kern w:val="0"/>
-          <w:sz w:val="36"/>
-          <w:szCs w:val="36"/>
-          <w:shd w:fill="auto" w:val="clear"/>
-          <w:lang w:val="en-US" w:eastAsia="zh-CN" w:bidi="hi-IN"/>
-        </w:rPr>
-        <w:t>A prece é um exemplo claro dessa ação do pensamento sobre os fluidos. Quando alguém ora com sinceridade, fé e intenção verdadeira, seu pensamento atua sobre o fluido cósmico universal, colocando-o em vibração elevada e estabelecendo uma ligação com os planos espirituais superiores. A eficácia da prece não está nas palavras pronunciadas, mas na qualidade dos sentimentos e da vontade que as acompanham. É essa força interior que determina o alcance e os efeitos da oração.</w:t>
-      </w:r>
-    </w:p>
-    <w:p>
-      <w:pPr>
-        <w:pStyle w:val="Normal"/>
-        <w:jc w:val="both"/>
-        <w:rPr>
-          <w:rFonts w:ascii="Garamond" w:hAnsi="Garamond" w:eastAsia="Times New Roman" w:cs="Times New Roman"/>
-          <w:kern w:val="0"/>
-          <w:sz w:val="36"/>
-          <w:szCs w:val="36"/>
-          <w:lang w:val="en-US" w:eastAsia="zh-CN" w:bidi="hi-IN"/>
-        </w:rPr>
-      </w:pPr>
-      <w:r>
-        <w:rPr>
-          <w:color w:val="000000"/>
-          <w:shd w:fill="auto" w:val="clear"/>
-        </w:rPr>
-      </w:r>
-    </w:p>
-    <w:p>
-      <w:pPr>
-        <w:pStyle w:val="Normal"/>
-        <w:jc w:val="both"/>
-        <w:rPr>
-          <w:color w:val="auto"/>
-          <w:highlight w:val="none"/>
-          <w:shd w:fill="auto" w:val="clear"/>
-        </w:rPr>
-      </w:pPr>
-      <w:r>
-        <w:rPr>
-          <w:rFonts w:eastAsia="Times New Roman" w:cs="Times New Roman" w:ascii="Garamond" w:hAnsi="Garamond"/>
-          <w:color w:val="000000"/>
-          <w:kern w:val="0"/>
-          <w:sz w:val="36"/>
-          <w:szCs w:val="36"/>
-          <w:shd w:fill="auto" w:val="clear"/>
-          <w:lang w:val="en-US" w:eastAsia="zh-CN" w:bidi="hi-IN"/>
-        </w:rPr>
-        <w:t>Em A Gênese, Kardec explica ainda que todos os fenômenos espirituais — como as comunicações mediúnicas, as influências espirituais, as ações à distância e até certos processos de cura — encontram nos fluidos o seu mecanismo natural. Nada ocorre de forma milagrosa ou sobrenatural; trata-se da aplicação de leis naturais ainda pouco conhecidas pela humanidade, mas tão reais quanto as leis físicas que regem o mundo material.</w:t>
-      </w:r>
-    </w:p>
-    <w:p>
-      <w:pPr>
-        <w:pStyle w:val="Normal"/>
-        <w:jc w:val="both"/>
-        <w:rPr>
-          <w:rFonts w:ascii="Garamond" w:hAnsi="Garamond" w:eastAsia="Times New Roman" w:cs="Times New Roman"/>
-          <w:kern w:val="0"/>
-          <w:sz w:val="36"/>
-          <w:szCs w:val="36"/>
-          <w:lang w:val="en-US" w:eastAsia="zh-CN" w:bidi="hi-IN"/>
-        </w:rPr>
-      </w:pPr>
-      <w:r>
-        <w:rPr>
-          <w:color w:val="000000"/>
-          <w:shd w:fill="auto" w:val="clear"/>
-        </w:rPr>
-      </w:r>
-    </w:p>
-    <w:p>
-      <w:pPr>
-        <w:pStyle w:val="Normal"/>
-        <w:jc w:val="both"/>
-        <w:rPr>
-          <w:color w:val="auto"/>
-          <w:highlight w:val="none"/>
-          <w:shd w:fill="auto" w:val="clear"/>
-        </w:rPr>
-      </w:pPr>
-      <w:r>
-        <w:rPr>
-          <w:rFonts w:eastAsia="Times New Roman" w:cs="Times New Roman" w:ascii="Garamond" w:hAnsi="Garamond"/>
-          <w:color w:val="000000"/>
-          <w:kern w:val="0"/>
-          <w:sz w:val="36"/>
-          <w:szCs w:val="36"/>
-          <w:shd w:fill="auto" w:val="clear"/>
-          <w:lang w:val="en-US" w:eastAsia="zh-CN" w:bidi="hi-IN"/>
-        </w:rPr>
-        <w:t>Assim, o fluido cósmico universal pode ser compreendido como o grande elemento da criação, enquanto os fluidos espirituais são suas manifestações moldadas pela ação do pensamento e da vontade. Ao elevar nossos pensamentos e sentimentos, especialmente por meio da prece, participamos conscientemente desse intercâmbio fluídico, harmonizando-nos com as forças superiores e contribuindo para o nosso próprio aperfeiçoamento espiritual.</w:t>
-      </w:r>
-    </w:p>
-    <w:p>
-      <w:pPr>
-        <w:pStyle w:val="Normal"/>
-        <w:jc w:val="both"/>
-        <w:rPr>
-          <w:color w:val="1C99E0"/>
-          <w:highlight w:val="none"/>
-          <w:shd w:fill="auto" w:val="clear"/>
-        </w:rPr>
-      </w:pPr>
-      <w:r>
-        <w:rPr>
-          <w:rFonts w:eastAsia="Times New Roman" w:cs="Times New Roman" w:ascii="Garamond" w:hAnsi="Garamond"/>
-          <w:color w:val="1C99E0"/>
-          <w:kern w:val="0"/>
-          <w:sz w:val="36"/>
-          <w:szCs w:val="36"/>
-          <w:shd w:fill="auto" w:val="clear"/>
-          <w:lang w:val="en-US" w:eastAsia="zh-CN" w:bidi="hi-IN"/>
-        </w:rPr>
-        <w:t>[ Término explicação ChatGPT ]</w:t>
-      </w:r>
-    </w:p>
-    <w:p>
-      <w:pPr>
-        <w:pStyle w:val="Normal"/>
-        <w:jc w:val="both"/>
-        <w:rPr>
-          <w:rFonts w:ascii="Garamond" w:hAnsi="Garamond" w:eastAsia="Times New Roman" w:cs="Times New Roman"/>
-          <w:kern w:val="0"/>
-          <w:sz w:val="36"/>
-          <w:szCs w:val="36"/>
-          <w:lang w:val="en-US" w:eastAsia="zh-CN" w:bidi="hi-IN"/>
-        </w:rPr>
-      </w:pPr>
-      <w:r>
-        <w:rPr>
-          <w:color w:val="1C99E0"/>
-          <w:shd w:fill="auto" w:val="clear"/>
+          <w:rFonts w:eastAsia="Times New Roman" w:cs="Times New Roman" w:ascii="Garamond" w:hAnsi="Garamond"/>
+          <w:kern w:val="0"/>
+          <w:sz w:val="36"/>
+          <w:szCs w:val="36"/>
+          <w:lang w:val="en-US" w:eastAsia="zh-CN" w:bidi="hi-IN"/>
         </w:rPr>
       </w:r>
     </w:p>
@@ -1631,8 +2352,11 @@
       </w:pPr>
       <w:r>
         <w:rPr>
-          <w:color w:val="000000"/>
-          <w:shd w:fill="auto" w:val="clear"/>
+          <w:rFonts w:eastAsia="Times New Roman" w:cs="Times New Roman" w:ascii="Garamond" w:hAnsi="Garamond"/>
+          <w:kern w:val="0"/>
+          <w:sz w:val="36"/>
+          <w:szCs w:val="36"/>
+          <w:lang w:val="en-US" w:eastAsia="zh-CN" w:bidi="hi-IN"/>
         </w:rPr>
       </w:r>
     </w:p>
@@ -1744,8 +2468,11 @@
       </w:pPr>
       <w:r>
         <w:rPr>
-          <w:color w:val="000000"/>
-          <w:shd w:fill="auto" w:val="clear"/>
+          <w:rFonts w:eastAsia="Times New Roman" w:cs="Times New Roman" w:ascii="Garamond" w:hAnsi="Garamond"/>
+          <w:kern w:val="0"/>
+          <w:sz w:val="36"/>
+          <w:szCs w:val="36"/>
+          <w:lang w:val="en-US" w:eastAsia="zh-CN" w:bidi="hi-IN"/>
         </w:rPr>
       </w:r>
     </w:p>
@@ -2131,8 +2858,11 @@
       </w:pPr>
       <w:r>
         <w:rPr>
-          <w:color w:val="000000"/>
-          <w:shd w:fill="auto" w:val="clear"/>
+          <w:rFonts w:eastAsia="Times New Roman" w:cs="Times New Roman" w:ascii="Garamond" w:hAnsi="Garamond"/>
+          <w:kern w:val="0"/>
+          <w:sz w:val="36"/>
+          <w:szCs w:val="36"/>
+          <w:lang w:val="en-US" w:eastAsia="zh-CN" w:bidi="hi-IN"/>
         </w:rPr>
       </w:r>
     </w:p>
@@ -2173,8 +2903,11 @@
       </w:pPr>
       <w:r>
         <w:rPr>
-          <w:color w:val="1C99E0"/>
-          <w:shd w:fill="auto" w:val="clear"/>
+          <w:rFonts w:eastAsia="Times New Roman" w:cs="Times New Roman" w:ascii="Garamond" w:hAnsi="Garamond"/>
+          <w:kern w:val="0"/>
+          <w:sz w:val="36"/>
+          <w:szCs w:val="36"/>
+          <w:lang w:val="en-US" w:eastAsia="zh-CN" w:bidi="hi-IN"/>
         </w:rPr>
       </w:r>
     </w:p>
@@ -2193,7 +2926,12 @@
       </w:pPr>
       <w:r>
         <w:rPr>
-          <w:shd w:fill="auto" w:val="clear"/>
+          <w:rFonts w:eastAsia="Times New Roman" w:cs="Times New Roman" w:ascii="Garamond" w:hAnsi="Garamond"/>
+          <w:color w:val="000000"/>
+          <w:kern w:val="0"/>
+          <w:sz w:val="36"/>
+          <w:szCs w:val="36"/>
+          <w:lang w:val="en-US" w:eastAsia="zh-CN" w:bidi="hi-IN"/>
         </w:rPr>
       </w:r>
     </w:p>
@@ -2212,7 +2950,12 @@
       </w:pPr>
       <w:r>
         <w:rPr>
-          <w:shd w:fill="auto" w:val="clear"/>
+          <w:rFonts w:eastAsia="Times New Roman" w:cs="Times New Roman" w:ascii="Garamond" w:hAnsi="Garamond"/>
+          <w:color w:val="000000"/>
+          <w:kern w:val="0"/>
+          <w:sz w:val="36"/>
+          <w:szCs w:val="36"/>
+          <w:lang w:val="en-US" w:eastAsia="zh-CN" w:bidi="hi-IN"/>
         </w:rPr>
       </w:r>
     </w:p>
@@ -2289,9 +3032,7 @@
         </w:rPr>
       </w:pPr>
       <w:r>
-        <w:rPr>
-          <w:shd w:fill="auto" w:val="clear"/>
-        </w:rPr>
+        <w:rPr/>
       </w:r>
     </w:p>
     <w:sectPr>
@@ -2363,7 +3104,7 @@
         <w:bCs/>
         <w:rFonts w:ascii="Garamond" w:hAnsi="Garamond"/>
       </w:rPr>
-      <w:t>13</w:t>
+      <w:t>18</w:t>
     </w:r>
     <w:r>
       <w:rPr>

</xml_diff>

<commit_message>
17/01/2026 - 20:08 h
</commit_message>
<xml_diff>
--- a/Pedi e obtereis/Pedi e obtereis.docx
+++ b/Pedi e obtereis/Pedi e obtereis.docx
@@ -89,250 +89,2620 @@
           <w:shd w:fill="auto" w:val="clear"/>
           <w:lang w:val="en-US" w:eastAsia="zh-CN" w:bidi="hi-IN"/>
         </w:rPr>
-        <w:t>Vamos iniciar nossas reflexões lendo a passagem evangélica na qual Jesus nos apresenta o mandamento maior. Ela se encontra em Mateus 22:34-40:</w:t>
-      </w:r>
-    </w:p>
-    <w:p>
-      <w:pPr>
-        <w:pStyle w:val="Normal"/>
-        <w:jc w:val="both"/>
-        <w:rPr>
-          <w:sz w:val="36"/>
-          <w:szCs w:val="36"/>
-        </w:rPr>
-      </w:pPr>
-      <w:r>
-        <w:rPr>
-          <w:sz w:val="36"/>
-          <w:szCs w:val="36"/>
-        </w:rPr>
-      </w:r>
-    </w:p>
-    <w:p>
-      <w:pPr>
-        <w:pStyle w:val="Normal"/>
-        <w:ind w:left="720" w:hanging="0"/>
-        <w:jc w:val="both"/>
-        <w:rPr>
-          <w:i/>
+        <w:t>O “</w:t>
+      </w:r>
+      <w:r>
+        <w:rPr>
+          <w:rFonts w:eastAsia="Times New Roman" w:cs="Times New Roman" w:ascii="Garamond" w:hAnsi="Garamond"/>
           <w:i/>
           <w:iCs/>
-          <w:sz w:val="36"/>
-          <w:szCs w:val="36"/>
-        </w:rPr>
-      </w:pPr>
-      <w:r>
-        <w:rPr>
-          <w:rFonts w:eastAsia="Times New Roman" w:cs="Times New Roman" w:ascii="Garamond" w:hAnsi="Garamond"/>
-          <w:i/>
-          <w:iCs/>
-          <w:color w:val="000000"/>
-          <w:kern w:val="0"/>
-          <w:sz w:val="36"/>
-          <w:szCs w:val="36"/>
-          <w:shd w:fill="auto" w:val="clear"/>
-          <w:lang w:val="en-US" w:eastAsia="zh-CN" w:bidi="hi-IN"/>
-        </w:rPr>
-        <w:t>E os fariseus, ouvindo que ele fizera emudecer os saduceus, reuniram-se no mesmo lugar. E um deles, doutor da lei, interrogou-o para o experimentar, dizendo: Mestre, qual é o grande mandamento na lei?</w:t>
-      </w:r>
-    </w:p>
-    <w:p>
-      <w:pPr>
-        <w:pStyle w:val="Normal"/>
-        <w:ind w:left="720" w:hanging="0"/>
-        <w:jc w:val="both"/>
-        <w:rPr>
-          <w:i/>
-          <w:i/>
-          <w:iCs/>
-          <w:sz w:val="36"/>
-          <w:szCs w:val="36"/>
-        </w:rPr>
-      </w:pPr>
-      <w:r>
-        <w:rPr>
-          <w:i/>
-          <w:iCs/>
-          <w:sz w:val="36"/>
-          <w:szCs w:val="36"/>
-        </w:rPr>
-      </w:r>
-    </w:p>
-    <w:p>
-      <w:pPr>
-        <w:pStyle w:val="Normal"/>
-        <w:ind w:left="720" w:hanging="0"/>
-        <w:jc w:val="both"/>
-        <w:rPr>
-          <w:i/>
-          <w:i/>
-          <w:iCs/>
-          <w:sz w:val="36"/>
-          <w:szCs w:val="36"/>
-        </w:rPr>
-      </w:pPr>
-      <w:r>
-        <w:rPr>
-          <w:rFonts w:eastAsia="Times New Roman" w:cs="Times New Roman" w:ascii="Garamond" w:hAnsi="Garamond"/>
-          <w:i/>
-          <w:iCs/>
-          <w:color w:val="000000"/>
-          <w:kern w:val="0"/>
-          <w:sz w:val="36"/>
-          <w:szCs w:val="36"/>
-          <w:shd w:fill="auto" w:val="clear"/>
-          <w:lang w:val="en-US" w:eastAsia="zh-CN" w:bidi="hi-IN"/>
-        </w:rPr>
-        <w:t>E Jesus disse-lhe: Amarás o Senhor teu Deus de todo o teu coração, e de toda a tua alma, e de todo o teu pensamento. Este é o primeiro e grande mandamento.</w:t>
-      </w:r>
-    </w:p>
-    <w:p>
-      <w:pPr>
-        <w:pStyle w:val="Normal"/>
-        <w:ind w:left="720" w:hanging="0"/>
-        <w:jc w:val="both"/>
-        <w:rPr>
-          <w:i/>
-          <w:i/>
-          <w:iCs/>
-          <w:sz w:val="36"/>
-          <w:szCs w:val="36"/>
-        </w:rPr>
-      </w:pPr>
-      <w:r>
-        <w:rPr>
-          <w:i/>
-          <w:iCs/>
-          <w:sz w:val="36"/>
-          <w:szCs w:val="36"/>
-        </w:rPr>
-      </w:r>
-    </w:p>
-    <w:p>
-      <w:pPr>
-        <w:pStyle w:val="Normal"/>
-        <w:ind w:left="720" w:hanging="0"/>
-        <w:jc w:val="both"/>
-        <w:rPr>
-          <w:i/>
-          <w:i/>
-          <w:iCs/>
-          <w:sz w:val="36"/>
-          <w:szCs w:val="36"/>
-        </w:rPr>
-      </w:pPr>
-      <w:r>
-        <w:rPr>
-          <w:rFonts w:eastAsia="Times New Roman" w:cs="Times New Roman" w:ascii="Garamond" w:hAnsi="Garamond"/>
-          <w:i/>
-          <w:iCs/>
-          <w:color w:val="000000"/>
-          <w:kern w:val="0"/>
-          <w:sz w:val="36"/>
-          <w:szCs w:val="36"/>
-          <w:shd w:fill="auto" w:val="clear"/>
-          <w:lang w:val="en-US" w:eastAsia="zh-CN" w:bidi="hi-IN"/>
-        </w:rPr>
-        <w:t>E o segundo, semelhante a este, é: Amarás o teu próximo como a ti mesmo.</w:t>
-      </w:r>
-    </w:p>
-    <w:p>
-      <w:pPr>
-        <w:pStyle w:val="Normal"/>
-        <w:ind w:left="720" w:hanging="0"/>
-        <w:jc w:val="both"/>
-        <w:rPr>
-          <w:i/>
-          <w:i/>
-          <w:iCs/>
-          <w:sz w:val="36"/>
-          <w:szCs w:val="36"/>
-        </w:rPr>
-      </w:pPr>
-      <w:r>
-        <w:rPr>
-          <w:i/>
-          <w:iCs/>
-          <w:sz w:val="36"/>
-          <w:szCs w:val="36"/>
-        </w:rPr>
-      </w:r>
-    </w:p>
-    <w:p>
-      <w:pPr>
-        <w:pStyle w:val="Normal"/>
-        <w:ind w:left="720" w:hanging="0"/>
-        <w:jc w:val="both"/>
-        <w:rPr>
-          <w:i/>
-          <w:i/>
-          <w:iCs/>
-          <w:sz w:val="36"/>
-          <w:szCs w:val="36"/>
-        </w:rPr>
-      </w:pPr>
-      <w:r>
-        <w:rPr>
-          <w:rFonts w:eastAsia="Times New Roman" w:cs="Times New Roman" w:ascii="Garamond" w:hAnsi="Garamond"/>
-          <w:i/>
-          <w:iCs/>
-          <w:color w:val="000000"/>
-          <w:kern w:val="0"/>
-          <w:sz w:val="36"/>
-          <w:szCs w:val="36"/>
-          <w:shd w:fill="auto" w:val="clear"/>
-          <w:lang w:val="en-US" w:eastAsia="zh-CN" w:bidi="hi-IN"/>
-        </w:rPr>
-        <w:t xml:space="preserve">Destes dois mandamentos dependem toda a lei e os profetas. </w:t>
-      </w:r>
-    </w:p>
-    <w:p>
-      <w:pPr>
-        <w:pStyle w:val="Normal"/>
-        <w:jc w:val="both"/>
-        <w:rPr>
-          <w:sz w:val="36"/>
-          <w:szCs w:val="36"/>
-        </w:rPr>
-      </w:pPr>
-      <w:r>
-        <w:rPr>
-          <w:sz w:val="36"/>
-          <w:szCs w:val="36"/>
-        </w:rPr>
-      </w:r>
-    </w:p>
-    <w:p>
-      <w:pPr>
-        <w:pStyle w:val="Normal"/>
-        <w:jc w:val="both"/>
-        <w:rPr>
-          <w:highlight w:val="none"/>
-          <w:shd w:fill="auto" w:val="clear"/>
-        </w:rPr>
-      </w:pPr>
-      <w:r>
-        <w:rPr>
-          <w:rFonts w:eastAsia="Times New Roman" w:cs="Times New Roman" w:ascii="Garamond" w:hAnsi="Garamond"/>
-          <w:color w:val="000000"/>
-          <w:kern w:val="0"/>
-          <w:sz w:val="36"/>
-          <w:szCs w:val="36"/>
-          <w:shd w:fill="auto" w:val="clear"/>
-          <w:lang w:val="en-US" w:eastAsia="zh-CN" w:bidi="hi-IN"/>
-        </w:rPr>
-        <w:t>Aos estudarmos os capítulos 21,22 e 23 do evangelho de Mateus, observamos um conflito constante entre Jesus e as lideranças religiosas da época.</w:t>
-      </w:r>
-    </w:p>
-    <w:p>
-      <w:pPr>
-        <w:pStyle w:val="Normal"/>
-        <w:jc w:val="both"/>
-        <w:rPr>
-          <w:sz w:val="36"/>
-          <w:szCs w:val="36"/>
-          <w:highlight w:val="none"/>
-          <w:shd w:fill="auto" w:val="clear"/>
+          <w:color w:val="000000"/>
+          <w:kern w:val="0"/>
+          <w:sz w:val="36"/>
+          <w:szCs w:val="36"/>
+          <w:shd w:fill="auto" w:val="clear"/>
+          <w:lang w:val="en-US" w:eastAsia="zh-CN" w:bidi="hi-IN"/>
+        </w:rPr>
+        <w:t>Pedi e obtereis</w:t>
+      </w:r>
+      <w:r>
+        <w:rPr>
+          <w:rFonts w:eastAsia="Times New Roman" w:cs="Times New Roman" w:ascii="Garamond" w:hAnsi="Garamond"/>
+          <w:color w:val="000000"/>
+          <w:kern w:val="0"/>
+          <w:sz w:val="36"/>
+          <w:szCs w:val="36"/>
+          <w:shd w:fill="auto" w:val="clear"/>
+          <w:lang w:val="en-US" w:eastAsia="zh-CN" w:bidi="hi-IN"/>
+        </w:rPr>
+        <w:t>” é um daqueles ensinamentos de Jesus que continuam sendo mal interpretados até os dias de hoje.</w:t>
+      </w:r>
+    </w:p>
+    <w:p>
+      <w:pPr>
+        <w:pStyle w:val="Normal"/>
+        <w:jc w:val="both"/>
+        <w:rPr>
+          <w:sz w:val="36"/>
+          <w:szCs w:val="36"/>
+        </w:rPr>
+      </w:pPr>
+      <w:r>
+        <w:rPr/>
+      </w:r>
+    </w:p>
+    <w:p>
+      <w:pPr>
+        <w:pStyle w:val="Normal"/>
+        <w:jc w:val="both"/>
+        <w:rPr>
+          <w:sz w:val="36"/>
+          <w:szCs w:val="36"/>
+        </w:rPr>
+      </w:pPr>
+      <w:r>
+        <w:rPr>
+          <w:rFonts w:eastAsia="Times New Roman" w:cs="Times New Roman" w:ascii="Garamond" w:hAnsi="Garamond"/>
+          <w:color w:val="000000"/>
+          <w:kern w:val="0"/>
+          <w:sz w:val="36"/>
+          <w:szCs w:val="36"/>
+          <w:shd w:fill="auto" w:val="clear"/>
+          <w:lang w:val="en-US" w:eastAsia="zh-CN" w:bidi="hi-IN"/>
+        </w:rPr>
+        <w:t>Quando Jesus falou sobre odiar pai e mãe, deixar aos mortos o cuidado de enterrar seus mortos ou ainda abandonar pai, mãe e filhos, Ele causou grande estranheza. Isso acontece porque, quando esses ensinamentos são interpretados de forma superficial, passam a impressão de que Jesus estaria contrariando tudo aquilo que ensinou anteriormente sobre amor, caridade e responsabilidade.</w:t>
+      </w:r>
+    </w:p>
+    <w:p>
+      <w:pPr>
+        <w:pStyle w:val="Normal"/>
+        <w:jc w:val="both"/>
+        <w:rPr>
+          <w:sz w:val="36"/>
+          <w:szCs w:val="36"/>
+        </w:rPr>
+      </w:pPr>
+      <w:r>
+        <w:rPr/>
+      </w:r>
+    </w:p>
+    <w:p>
+      <w:pPr>
+        <w:pStyle w:val="Normal"/>
+        <w:jc w:val="both"/>
+        <w:rPr>
+          <w:sz w:val="36"/>
+          <w:szCs w:val="36"/>
+        </w:rPr>
+      </w:pPr>
+      <w:r>
+        <w:rPr>
+          <w:rFonts w:eastAsia="Times New Roman" w:cs="Times New Roman" w:ascii="Garamond" w:hAnsi="Garamond"/>
+          <w:color w:val="000000"/>
+          <w:kern w:val="0"/>
+          <w:sz w:val="36"/>
+          <w:szCs w:val="36"/>
+          <w:shd w:fill="auto" w:val="clear"/>
+          <w:lang w:val="en-US" w:eastAsia="zh-CN" w:bidi="hi-IN"/>
+        </w:rPr>
+        <w:t>No entanto, o “Pedi e obtereis” se enquadra em uma outra categoria de ensinamentos — a mesma em que está, por exemplo, o “Observai os pássaros do céu”, quando Jesus nos orienta a não nos preocuparmos excessivamente com o dia de amanhã, afirmando que Deus nos proverá com tudo o que for necessário.</w:t>
+      </w:r>
+    </w:p>
+    <w:p>
+      <w:pPr>
+        <w:pStyle w:val="Normal"/>
+        <w:jc w:val="both"/>
+        <w:rPr>
+          <w:sz w:val="36"/>
+          <w:szCs w:val="36"/>
+        </w:rPr>
+      </w:pPr>
+      <w:r>
+        <w:rPr/>
+      </w:r>
+    </w:p>
+    <w:p>
+      <w:pPr>
+        <w:pStyle w:val="Normal"/>
+        <w:jc w:val="both"/>
+        <w:rPr>
+          <w:sz w:val="36"/>
+          <w:szCs w:val="36"/>
+        </w:rPr>
+      </w:pPr>
+      <w:r>
+        <w:rPr>
+          <w:rFonts w:eastAsia="Times New Roman" w:cs="Times New Roman" w:ascii="Garamond" w:hAnsi="Garamond"/>
+          <w:color w:val="000000"/>
+          <w:kern w:val="0"/>
+          <w:sz w:val="36"/>
+          <w:szCs w:val="36"/>
+          <w:shd w:fill="auto" w:val="clear"/>
+          <w:lang w:val="en-US" w:eastAsia="zh-CN" w:bidi="hi-IN"/>
+        </w:rPr>
+        <w:t>De modo geral, costumamos interpretar esses ensinamentos como se nenhum esforço fosse exigido de nossa parte, como se bastasse apenas pedir, ou simplesmente esperar, para que Deus nos conceda tudo aquilo que desejamos.</w:t>
+      </w:r>
+    </w:p>
+    <w:p>
+      <w:pPr>
+        <w:pStyle w:val="Normal"/>
+        <w:jc w:val="both"/>
+        <w:rPr>
+          <w:sz w:val="36"/>
+          <w:szCs w:val="36"/>
+        </w:rPr>
+      </w:pPr>
+      <w:r>
+        <w:rPr/>
+      </w:r>
+    </w:p>
+    <w:p>
+      <w:pPr>
+        <w:pStyle w:val="Normal"/>
+        <w:jc w:val="both"/>
+        <w:rPr>
+          <w:sz w:val="36"/>
+          <w:szCs w:val="36"/>
+        </w:rPr>
+      </w:pPr>
+      <w:r>
+        <w:rPr>
+          <w:rFonts w:eastAsia="Times New Roman" w:cs="Times New Roman" w:ascii="Garamond" w:hAnsi="Garamond"/>
+          <w:color w:val="000000"/>
+          <w:kern w:val="0"/>
+          <w:sz w:val="36"/>
+          <w:szCs w:val="36"/>
+          <w:shd w:fill="auto" w:val="clear"/>
+          <w:lang w:val="en-US" w:eastAsia="zh-CN" w:bidi="hi-IN"/>
+        </w:rPr>
+        <w:t>Talvez essas interpretações equivocadas persistam porque, no fundo, elas nos parecem mais cômodas. É mais confortável imaginar um Deus que concede tudo sem exigir esforço, transformação ou compromisso de nossa parte. Assim, transformamos ensinamentos profundos de Jesus em promessas de facilidade, quando na verdade eles nos convidam à responsabilidade, à confiança ativa e ao trabalho no bem.</w:t>
+      </w:r>
+    </w:p>
+    <w:p>
+      <w:pPr>
+        <w:pStyle w:val="Normal"/>
+        <w:jc w:val="both"/>
+        <w:rPr>
+          <w:sz w:val="36"/>
+          <w:szCs w:val="36"/>
+        </w:rPr>
+      </w:pPr>
+      <w:r>
+        <w:rPr/>
+      </w:r>
+    </w:p>
+    <w:p>
+      <w:pPr>
+        <w:pStyle w:val="Normal"/>
+        <w:jc w:val="both"/>
+        <w:rPr>
+          <w:sz w:val="36"/>
+          <w:szCs w:val="36"/>
+        </w:rPr>
+      </w:pPr>
+      <w:r>
+        <w:rPr>
+          <w:rFonts w:eastAsia="Times New Roman" w:cs="Times New Roman" w:ascii="Garamond" w:hAnsi="Garamond"/>
+          <w:color w:val="000000"/>
+          <w:kern w:val="0"/>
+          <w:sz w:val="36"/>
+          <w:szCs w:val="36"/>
+          <w:shd w:fill="auto" w:val="clear"/>
+          <w:lang w:val="en-US" w:eastAsia="zh-CN" w:bidi="hi-IN"/>
+        </w:rPr>
+        <w:t>E é justamente isso que veremos ao longo de nossas reflexões.</w:t>
+      </w:r>
+    </w:p>
+    <w:p>
+      <w:pPr>
+        <w:pStyle w:val="Normal"/>
+        <w:jc w:val="both"/>
+        <w:rPr>
+          <w:sz w:val="36"/>
+          <w:szCs w:val="36"/>
+        </w:rPr>
+      </w:pPr>
+      <w:r>
+        <w:rPr/>
+      </w:r>
+    </w:p>
+    <w:p>
+      <w:pPr>
+        <w:pStyle w:val="Normal"/>
+        <w:jc w:val="both"/>
+        <w:rPr>
+          <w:color w:val="1C99E0"/>
+        </w:rPr>
+      </w:pPr>
+      <w:r>
+        <w:rPr>
+          <w:rFonts w:eastAsia="Times New Roman" w:cs="Times New Roman" w:ascii="Garamond" w:hAnsi="Garamond"/>
+          <w:color w:val="1C99E0"/>
+          <w:kern w:val="0"/>
+          <w:sz w:val="36"/>
+          <w:szCs w:val="36"/>
+          <w:shd w:fill="auto" w:val="clear"/>
+          <w:lang w:val="en-US" w:eastAsia="zh-CN" w:bidi="hi-IN"/>
+        </w:rPr>
+        <w:t xml:space="preserve">[ Inicío de tópico a ser </w:t>
+      </w:r>
+      <w:r>
+        <w:rPr>
+          <w:rFonts w:eastAsia="Times New Roman" w:cs="Times New Roman" w:ascii="Garamond" w:hAnsi="Garamond"/>
+          <w:color w:val="1C99E0"/>
+          <w:kern w:val="0"/>
+          <w:sz w:val="36"/>
+          <w:szCs w:val="36"/>
+          <w:shd w:fill="auto" w:val="clear"/>
+          <w:lang w:val="en-US" w:eastAsia="zh-CN" w:bidi="hi-IN"/>
+        </w:rPr>
+        <w:t>encaixado</w:t>
+      </w:r>
+      <w:r>
+        <w:rPr>
+          <w:rFonts w:eastAsia="Times New Roman" w:cs="Times New Roman" w:ascii="Garamond" w:hAnsi="Garamond"/>
+          <w:color w:val="1C99E0"/>
+          <w:kern w:val="0"/>
+          <w:sz w:val="36"/>
+          <w:szCs w:val="36"/>
+          <w:shd w:fill="auto" w:val="clear"/>
+          <w:lang w:val="en-US" w:eastAsia="zh-CN" w:bidi="hi-IN"/>
+        </w:rPr>
+        <w:t xml:space="preserve"> ]</w:t>
+      </w:r>
+    </w:p>
+    <w:p>
+      <w:pPr>
+        <w:pStyle w:val="Normal"/>
+        <w:jc w:val="both"/>
+        <w:rPr>
+          <w:rFonts w:ascii="Garamond" w:hAnsi="Garamond" w:eastAsia="Times New Roman" w:cs="Times New Roman"/>
+          <w:kern w:val="0"/>
+          <w:sz w:val="36"/>
+          <w:szCs w:val="36"/>
+          <w:shd w:fill="auto" w:val="clear"/>
+          <w:lang w:val="en-US" w:eastAsia="zh-CN" w:bidi="hi-IN"/>
+        </w:rPr>
+      </w:pPr>
+      <w:r>
+        <w:rPr>
+          <w:color w:val="1C99E0"/>
+        </w:rPr>
+      </w:r>
+    </w:p>
+    <w:p>
+      <w:pPr>
+        <w:pStyle w:val="Normal"/>
+        <w:jc w:val="both"/>
+        <w:rPr>
+          <w:color w:val="auto"/>
+        </w:rPr>
+      </w:pPr>
+      <w:r>
+        <w:rPr>
+          <w:rFonts w:eastAsia="Times New Roman" w:cs="Times New Roman" w:ascii="Garamond" w:hAnsi="Garamond"/>
+          <w:color w:val="000000"/>
+          <w:kern w:val="0"/>
+          <w:sz w:val="36"/>
+          <w:szCs w:val="36"/>
+          <w:shd w:fill="auto" w:val="clear"/>
+          <w:lang w:val="en-US" w:eastAsia="zh-CN" w:bidi="hi-IN"/>
+        </w:rPr>
+        <w:t>O Pedi e Obtereis é ensinado por Jesus em duas ocasiões: a primeira está em Mateus 7:7-8 e acontece durante o sermão do monte quando Jesus fala à multidão. A segunda está em Lucas 11:</w:t>
+      </w:r>
+      <w:r>
+        <w:rPr>
+          <w:rFonts w:eastAsia="Times New Roman" w:cs="Times New Roman" w:ascii="Garamond" w:hAnsi="Garamond"/>
+          <w:color w:val="000000"/>
+          <w:kern w:val="0"/>
+          <w:sz w:val="36"/>
+          <w:szCs w:val="36"/>
+          <w:shd w:fill="auto" w:val="clear"/>
+          <w:lang w:val="en-US" w:eastAsia="zh-CN" w:bidi="hi-IN"/>
+        </w:rPr>
+        <w:t xml:space="preserve">9-11 e ocorre logo depois que </w:t>
+      </w:r>
+      <w:r>
+        <w:rPr>
+          <w:rFonts w:eastAsia="Times New Roman" w:cs="Times New Roman" w:ascii="Garamond" w:hAnsi="Garamond"/>
+          <w:color w:val="000000"/>
+          <w:kern w:val="0"/>
+          <w:sz w:val="36"/>
+          <w:szCs w:val="36"/>
+          <w:shd w:fill="auto" w:val="clear"/>
+          <w:lang w:val="en-US" w:eastAsia="zh-CN" w:bidi="hi-IN"/>
+        </w:rPr>
+        <w:t xml:space="preserve">Jesus ensina aos discípulos a oração do Pai-Nosso. </w:t>
+      </w:r>
+      <w:r>
+        <w:rPr>
+          <w:rFonts w:eastAsia="Times New Roman" w:cs="Times New Roman" w:ascii="Garamond" w:hAnsi="Garamond"/>
+          <w:color w:val="000000"/>
+          <w:kern w:val="0"/>
+          <w:sz w:val="36"/>
+          <w:szCs w:val="36"/>
+          <w:shd w:fill="auto" w:val="clear"/>
+          <w:lang w:val="en-US" w:eastAsia="zh-CN" w:bidi="hi-IN"/>
+        </w:rPr>
+        <w:t>Após ensinar o Pai Nosso,</w:t>
+      </w:r>
+      <w:r>
+        <w:rPr>
+          <w:rFonts w:eastAsia="Times New Roman" w:cs="Times New Roman" w:ascii="Garamond" w:hAnsi="Garamond"/>
+          <w:color w:val="000000"/>
+          <w:kern w:val="0"/>
+          <w:sz w:val="36"/>
+          <w:szCs w:val="36"/>
+          <w:shd w:fill="auto" w:val="clear"/>
+          <w:lang w:val="en-US" w:eastAsia="zh-CN" w:bidi="hi-IN"/>
+        </w:rPr>
+        <w:t xml:space="preserve"> Jesus apresenta uma pequena parábola, conhecida como a Parábola do Amigo Importuno.</w:t>
+      </w:r>
+    </w:p>
+    <w:p>
+      <w:pPr>
+        <w:pStyle w:val="Normal"/>
+        <w:jc w:val="both"/>
+        <w:rPr>
+          <w:rFonts w:ascii="Garamond" w:hAnsi="Garamond" w:eastAsia="Times New Roman" w:cs="Times New Roman"/>
+          <w:kern w:val="0"/>
+          <w:sz w:val="36"/>
+          <w:szCs w:val="36"/>
+          <w:shd w:fill="auto" w:val="clear"/>
+          <w:lang w:val="en-US" w:eastAsia="zh-CN" w:bidi="hi-IN"/>
+        </w:rPr>
+      </w:pPr>
+      <w:r>
+        <w:rPr>
+          <w:color w:val="auto"/>
+        </w:rPr>
+      </w:r>
+    </w:p>
+    <w:p>
+      <w:pPr>
+        <w:pStyle w:val="Normal"/>
+        <w:jc w:val="both"/>
+        <w:rPr>
+          <w:color w:val="auto"/>
+        </w:rPr>
+      </w:pPr>
+      <w:r>
+        <w:rPr>
+          <w:rFonts w:eastAsia="Times New Roman" w:cs="Times New Roman" w:ascii="Garamond" w:hAnsi="Garamond"/>
+          <w:color w:val="000000"/>
+          <w:kern w:val="0"/>
+          <w:sz w:val="36"/>
+          <w:szCs w:val="36"/>
+          <w:shd w:fill="auto" w:val="clear"/>
+          <w:lang w:val="en-US" w:eastAsia="zh-CN" w:bidi="hi-IN"/>
+        </w:rPr>
+        <w:t>Nessa parábola, Jesus conta que um homem recebe a visita inesperada de um amigo, à meia-noite, e não tem nada para lhe oferecer. Então ele procura outro amigo e lhe pede três pães emprestados. Do lado de dentro da casa, o amigo responde que não pode atender: a porta já está fechada, os filhos estão deitados e ele não quer ser incomodado. Jesus conclui dizendo que, mesmo não se levantando por amizade, aquele homem acabará atendendo ao pedido por causa da insistência de quem bate à porta.</w:t>
+      </w:r>
+    </w:p>
+    <w:p>
+      <w:pPr>
+        <w:pStyle w:val="Normal"/>
+        <w:jc w:val="both"/>
+        <w:rPr>
+          <w:rFonts w:ascii="Garamond" w:hAnsi="Garamond" w:eastAsia="Times New Roman" w:cs="Times New Roman"/>
+          <w:kern w:val="0"/>
+          <w:sz w:val="36"/>
+          <w:szCs w:val="36"/>
+          <w:shd w:fill="auto" w:val="clear"/>
+          <w:lang w:val="en-US" w:eastAsia="zh-CN" w:bidi="hi-IN"/>
+        </w:rPr>
+      </w:pPr>
+      <w:r>
+        <w:rPr>
+          <w:color w:val="auto"/>
+        </w:rPr>
+      </w:r>
+    </w:p>
+    <w:p>
+      <w:pPr>
+        <w:pStyle w:val="Normal"/>
+        <w:jc w:val="both"/>
+        <w:rPr>
+          <w:color w:val="auto"/>
+        </w:rPr>
+      </w:pPr>
+      <w:r>
+        <w:rPr>
+          <w:rFonts w:eastAsia="Times New Roman" w:cs="Times New Roman" w:ascii="Garamond" w:hAnsi="Garamond"/>
+          <w:color w:val="000000"/>
+          <w:kern w:val="0"/>
+          <w:sz w:val="36"/>
+          <w:szCs w:val="36"/>
+          <w:shd w:fill="auto" w:val="clear"/>
+          <w:lang w:val="en-US" w:eastAsia="zh-CN" w:bidi="hi-IN"/>
+        </w:rPr>
+        <w:t>Com essa parábola, Jesus nos ensina que é necessário pedir com perseverança, criando em nós mesmos uma condição interior de receptividade. Todas as parábolas de Jesus possuem um elemento material e um elemento espiritual, e é fundamental que saibamos ir além da letra, buscando o ensinamento profundo que elas encerram. Evidentemente, Deus não pode se sentir importunado por nossas preces, nem nos atende para se livrar de pedidos insistentes. O ensinamento de Jesus aponta para outra direção.</w:t>
+      </w:r>
+    </w:p>
+    <w:p>
+      <w:pPr>
+        <w:pStyle w:val="Normal"/>
+        <w:jc w:val="both"/>
+        <w:rPr>
+          <w:rFonts w:ascii="Garamond" w:hAnsi="Garamond" w:eastAsia="Times New Roman" w:cs="Times New Roman"/>
+          <w:kern w:val="0"/>
+          <w:sz w:val="36"/>
+          <w:szCs w:val="36"/>
+          <w:shd w:fill="auto" w:val="clear"/>
+          <w:lang w:val="en-US" w:eastAsia="zh-CN" w:bidi="hi-IN"/>
+        </w:rPr>
+      </w:pPr>
+      <w:r>
+        <w:rPr>
+          <w:color w:val="auto"/>
+        </w:rPr>
+      </w:r>
+    </w:p>
+    <w:p>
+      <w:pPr>
+        <w:pStyle w:val="Normal"/>
+        <w:jc w:val="both"/>
+        <w:rPr>
+          <w:color w:val="auto"/>
+        </w:rPr>
+      </w:pPr>
+      <w:r>
+        <w:rPr>
+          <w:rFonts w:eastAsia="Times New Roman" w:cs="Times New Roman" w:ascii="Garamond" w:hAnsi="Garamond"/>
+          <w:color w:val="000000"/>
+          <w:kern w:val="0"/>
+          <w:sz w:val="36"/>
+          <w:szCs w:val="36"/>
+          <w:shd w:fill="auto" w:val="clear"/>
+          <w:lang w:val="en-US" w:eastAsia="zh-CN" w:bidi="hi-IN"/>
+        </w:rPr>
+        <w:t>Muitos podem questionar: se Deus conhece perfeitamente tudo aquilo de que necessitamos antes mesmo de pedirmos, por que então precisamos orar? A resposta é simples e profunda: a oração não tem por finalidade informar a Deus sobre nossas necessidades, mas transformar a nós mesmos. Orar é criar em nosso íntimo as condições necessárias para receber aquilo que a Providência pode nos oferecer.</w:t>
+      </w:r>
+    </w:p>
+    <w:p>
+      <w:pPr>
+        <w:pStyle w:val="Normal"/>
+        <w:jc w:val="both"/>
+        <w:rPr>
+          <w:rFonts w:ascii="Garamond" w:hAnsi="Garamond" w:eastAsia="Times New Roman" w:cs="Times New Roman"/>
+          <w:kern w:val="0"/>
+          <w:sz w:val="36"/>
+          <w:szCs w:val="36"/>
+          <w:shd w:fill="auto" w:val="clear"/>
+          <w:lang w:val="en-US" w:eastAsia="zh-CN" w:bidi="hi-IN"/>
+        </w:rPr>
+      </w:pPr>
+      <w:r>
+        <w:rPr>
+          <w:color w:val="auto"/>
+        </w:rPr>
+      </w:r>
+    </w:p>
+    <w:p>
+      <w:pPr>
+        <w:pStyle w:val="Normal"/>
+        <w:jc w:val="both"/>
+        <w:rPr>
+          <w:color w:val="auto"/>
+        </w:rPr>
+      </w:pPr>
+      <w:r>
+        <w:rPr>
+          <w:rFonts w:eastAsia="Times New Roman" w:cs="Times New Roman" w:ascii="Garamond" w:hAnsi="Garamond"/>
+          <w:color w:val="000000"/>
+          <w:kern w:val="0"/>
+          <w:sz w:val="36"/>
+          <w:szCs w:val="36"/>
+          <w:shd w:fill="auto" w:val="clear"/>
+          <w:lang w:val="en-US" w:eastAsia="zh-CN" w:bidi="hi-IN"/>
+        </w:rPr>
+        <w:t>Através do livre-arbítrio, podemos ampliar ou reduzir nossa capacidade de recepção dos dons divinos. O pedir, o buscar e o bater não existem para convencer Deus, mas para alargar, pouco a pouco, o nosso recipiente interior. É nesse sentido que a oração se torna um exercício de crescimento espiritual.</w:t>
+      </w:r>
+    </w:p>
+    <w:p>
+      <w:pPr>
+        <w:pStyle w:val="Normal"/>
+        <w:jc w:val="both"/>
+        <w:rPr>
+          <w:rFonts w:ascii="Garamond" w:hAnsi="Garamond" w:eastAsia="Times New Roman" w:cs="Times New Roman"/>
+          <w:kern w:val="0"/>
+          <w:sz w:val="36"/>
+          <w:szCs w:val="36"/>
+          <w:shd w:fill="auto" w:val="clear"/>
+          <w:lang w:val="en-US" w:eastAsia="zh-CN" w:bidi="hi-IN"/>
+        </w:rPr>
+      </w:pPr>
+      <w:r>
+        <w:rPr>
+          <w:color w:val="auto"/>
+        </w:rPr>
+      </w:r>
+    </w:p>
+    <w:p>
+      <w:pPr>
+        <w:pStyle w:val="Normal"/>
+        <w:jc w:val="both"/>
+        <w:rPr>
+          <w:color w:val="auto"/>
+        </w:rPr>
+      </w:pPr>
+      <w:r>
+        <w:rPr>
+          <w:rFonts w:eastAsia="Times New Roman" w:cs="Times New Roman" w:ascii="Garamond" w:hAnsi="Garamond"/>
+          <w:color w:val="000000"/>
+          <w:kern w:val="0"/>
+          <w:sz w:val="36"/>
+          <w:szCs w:val="36"/>
+          <w:shd w:fill="auto" w:val="clear"/>
+          <w:lang w:val="en-US" w:eastAsia="zh-CN" w:bidi="hi-IN"/>
+        </w:rPr>
+        <w:t>Podemos comparar, de forma simples, aquilo que Deus tem a nos oferecer a um</w:t>
+      </w:r>
+      <w:r>
+        <w:rPr>
+          <w:rFonts w:eastAsia="Times New Roman" w:cs="Times New Roman" w:ascii="Garamond" w:hAnsi="Garamond"/>
+          <w:color w:val="000000"/>
+          <w:kern w:val="0"/>
+          <w:sz w:val="36"/>
+          <w:szCs w:val="36"/>
+          <w:shd w:fill="auto" w:val="clear"/>
+          <w:lang w:val="en-US" w:eastAsia="zh-CN" w:bidi="hi-IN"/>
+        </w:rPr>
+        <w:t>a</w:t>
+      </w:r>
+      <w:r>
+        <w:rPr>
+          <w:rFonts w:eastAsia="Times New Roman" w:cs="Times New Roman" w:ascii="Garamond" w:hAnsi="Garamond"/>
+          <w:color w:val="000000"/>
+          <w:kern w:val="0"/>
+          <w:sz w:val="36"/>
+          <w:szCs w:val="36"/>
+          <w:shd w:fill="auto" w:val="clear"/>
+          <w:lang w:val="en-US" w:eastAsia="zh-CN" w:bidi="hi-IN"/>
+        </w:rPr>
+        <w:t xml:space="preserve"> </w:t>
+      </w:r>
+      <w:r>
+        <w:rPr>
+          <w:rFonts w:eastAsia="Times New Roman" w:cs="Times New Roman" w:ascii="Garamond" w:hAnsi="Garamond"/>
+          <w:color w:val="000000"/>
+          <w:kern w:val="0"/>
+          <w:sz w:val="36"/>
+          <w:szCs w:val="36"/>
+          <w:shd w:fill="auto" w:val="clear"/>
+          <w:lang w:val="en-US" w:eastAsia="zh-CN" w:bidi="hi-IN"/>
+        </w:rPr>
+        <w:t>fonte</w:t>
+      </w:r>
+      <w:r>
+        <w:rPr>
+          <w:rFonts w:eastAsia="Times New Roman" w:cs="Times New Roman" w:ascii="Garamond" w:hAnsi="Garamond"/>
+          <w:color w:val="000000"/>
+          <w:kern w:val="0"/>
+          <w:sz w:val="36"/>
+          <w:szCs w:val="36"/>
+          <w:shd w:fill="auto" w:val="clear"/>
+          <w:lang w:val="en-US" w:eastAsia="zh-CN" w:bidi="hi-IN"/>
+        </w:rPr>
+        <w:t>. Quem vai à</w:t>
+      </w:r>
+      <w:r>
+        <w:rPr>
+          <w:rFonts w:eastAsia="Times New Roman" w:cs="Times New Roman" w:ascii="Garamond" w:hAnsi="Garamond"/>
+          <w:color w:val="000000"/>
+          <w:kern w:val="0"/>
+          <w:sz w:val="36"/>
+          <w:szCs w:val="36"/>
+          <w:shd w:fill="auto" w:val="clear"/>
+          <w:lang w:val="en-US" w:eastAsia="zh-CN" w:bidi="hi-IN"/>
+        </w:rPr>
+        <w:t xml:space="preserve"> fonte</w:t>
+      </w:r>
+      <w:r>
+        <w:rPr>
+          <w:rFonts w:eastAsia="Times New Roman" w:cs="Times New Roman" w:ascii="Garamond" w:hAnsi="Garamond"/>
+          <w:color w:val="000000"/>
+          <w:kern w:val="0"/>
+          <w:sz w:val="36"/>
+          <w:szCs w:val="36"/>
+          <w:shd w:fill="auto" w:val="clear"/>
+          <w:lang w:val="en-US" w:eastAsia="zh-CN" w:bidi="hi-IN"/>
+        </w:rPr>
+        <w:t xml:space="preserve"> com um copo recolhe um copo de água; quem vai com um recipiente maior recolhe mais; quem vai com um balde recolhe um balde. Em nenhum desses casos </w:t>
+      </w:r>
+      <w:r>
+        <w:rPr>
+          <w:rFonts w:eastAsia="Times New Roman" w:cs="Times New Roman" w:ascii="Garamond" w:hAnsi="Garamond"/>
+          <w:color w:val="000000"/>
+          <w:kern w:val="0"/>
+          <w:sz w:val="36"/>
+          <w:szCs w:val="36"/>
+          <w:shd w:fill="auto" w:val="clear"/>
+          <w:lang w:val="en-US" w:eastAsia="zh-CN" w:bidi="hi-IN"/>
+        </w:rPr>
+        <w:t xml:space="preserve">a fonte </w:t>
+      </w:r>
+      <w:r>
+        <w:rPr>
+          <w:rFonts w:eastAsia="Times New Roman" w:cs="Times New Roman" w:ascii="Garamond" w:hAnsi="Garamond"/>
+          <w:color w:val="000000"/>
+          <w:kern w:val="0"/>
+          <w:sz w:val="36"/>
+          <w:szCs w:val="36"/>
+          <w:shd w:fill="auto" w:val="clear"/>
+          <w:lang w:val="en-US" w:eastAsia="zh-CN" w:bidi="hi-IN"/>
+        </w:rPr>
+        <w:t>se modifica. Da mesma forma, nossa capacidade de receber não altera em nada a capacidade infinita de doação divina — ela diz respeito apenas ao quanto nós estamos preparados para acolher.</w:t>
+      </w:r>
+    </w:p>
+    <w:p>
+      <w:pPr>
+        <w:pStyle w:val="Normal"/>
+        <w:jc w:val="both"/>
+        <w:rPr>
+          <w:rFonts w:ascii="Garamond" w:hAnsi="Garamond" w:eastAsia="Times New Roman" w:cs="Times New Roman"/>
+          <w:kern w:val="0"/>
+          <w:sz w:val="36"/>
+          <w:szCs w:val="36"/>
+          <w:shd w:fill="auto" w:val="clear"/>
+          <w:lang w:val="en-US" w:eastAsia="zh-CN" w:bidi="hi-IN"/>
+        </w:rPr>
+      </w:pPr>
+      <w:r>
+        <w:rPr>
+          <w:color w:val="auto"/>
+        </w:rPr>
+      </w:r>
+    </w:p>
+    <w:p>
+      <w:pPr>
+        <w:pStyle w:val="Normal"/>
+        <w:jc w:val="both"/>
+        <w:rPr>
+          <w:color w:val="auto"/>
+        </w:rPr>
+      </w:pPr>
+      <w:r>
+        <w:rPr>
+          <w:rFonts w:eastAsia="Times New Roman" w:cs="Times New Roman" w:ascii="Garamond" w:hAnsi="Garamond"/>
+          <w:color w:val="000000"/>
+          <w:kern w:val="0"/>
+          <w:sz w:val="36"/>
+          <w:szCs w:val="36"/>
+          <w:shd w:fill="auto" w:val="clear"/>
+          <w:lang w:val="en-US" w:eastAsia="zh-CN" w:bidi="hi-IN"/>
+        </w:rPr>
+        <w:t>Observando alguns elementos simbólicos da parábola, encontramos ensinamentos ainda mais profundos. Jesus menciona que o homem procura o amigo à meia-noite, horário que aparece com frequência no Evangelho como símbolo de crise, de dificuldade e de escuridão interior. Muitas vezes desperdiçamos as oportunidades durante a “luz do dia” e só buscamos auxílio quando a dor, o sofrimento ou a aflição já se instalaram em nossas vidas. A noite simboliza justamente esse momento em que as sombras interiores nos despertam para a necessidade de buscar a luz.</w:t>
+      </w:r>
+    </w:p>
+    <w:p>
+      <w:pPr>
+        <w:pStyle w:val="Normal"/>
+        <w:jc w:val="both"/>
+        <w:rPr>
+          <w:rFonts w:ascii="Garamond" w:hAnsi="Garamond" w:eastAsia="Times New Roman" w:cs="Times New Roman"/>
+          <w:kern w:val="0"/>
+          <w:sz w:val="36"/>
+          <w:szCs w:val="36"/>
+          <w:shd w:fill="auto" w:val="clear"/>
+          <w:lang w:val="en-US" w:eastAsia="zh-CN" w:bidi="hi-IN"/>
+        </w:rPr>
+      </w:pPr>
+      <w:r>
+        <w:rPr>
+          <w:color w:val="auto"/>
+        </w:rPr>
+      </w:r>
+    </w:p>
+    <w:p>
+      <w:pPr>
+        <w:pStyle w:val="Normal"/>
+        <w:jc w:val="both"/>
+        <w:rPr>
+          <w:color w:val="auto"/>
+        </w:rPr>
+      </w:pPr>
+      <w:r>
+        <w:rPr>
+          <w:rFonts w:eastAsia="Times New Roman" w:cs="Times New Roman" w:ascii="Garamond" w:hAnsi="Garamond"/>
+          <w:color w:val="000000"/>
+          <w:kern w:val="0"/>
+          <w:sz w:val="36"/>
+          <w:szCs w:val="36"/>
+          <w:shd w:fill="auto" w:val="clear"/>
+          <w:lang w:val="en-US" w:eastAsia="zh-CN" w:bidi="hi-IN"/>
+        </w:rPr>
+        <w:t>O amigo que está dentro da casa pode representar os valores superiores que já existem em nós, mas que muitas vezes preferimos manter adormecidos. Ele diz que está deitado e não quer se levantar, o que simboliza nossa resistência em sair da zona de conforto. Sabemos, intuitivamente, que despertar esses valores implicará esforço, mudança e compromisso com o bem.</w:t>
+      </w:r>
+    </w:p>
+    <w:p>
+      <w:pPr>
+        <w:pStyle w:val="Normal"/>
+        <w:jc w:val="both"/>
+        <w:rPr>
+          <w:rFonts w:ascii="Garamond" w:hAnsi="Garamond" w:eastAsia="Times New Roman" w:cs="Times New Roman"/>
+          <w:kern w:val="0"/>
+          <w:sz w:val="36"/>
+          <w:szCs w:val="36"/>
+          <w:shd w:fill="auto" w:val="clear"/>
+          <w:lang w:val="en-US" w:eastAsia="zh-CN" w:bidi="hi-IN"/>
+        </w:rPr>
+      </w:pPr>
+      <w:r>
+        <w:rPr>
+          <w:color w:val="auto"/>
+        </w:rPr>
+      </w:r>
+    </w:p>
+    <w:p>
+      <w:pPr>
+        <w:pStyle w:val="Normal"/>
+        <w:jc w:val="both"/>
+        <w:rPr>
+          <w:color w:val="auto"/>
+        </w:rPr>
+      </w:pPr>
+      <w:r>
+        <w:rPr>
+          <w:rFonts w:eastAsia="Times New Roman" w:cs="Times New Roman" w:ascii="Garamond" w:hAnsi="Garamond"/>
+          <w:color w:val="000000"/>
+          <w:kern w:val="0"/>
+          <w:sz w:val="36"/>
+          <w:szCs w:val="36"/>
+          <w:shd w:fill="auto" w:val="clear"/>
+          <w:lang w:val="en-US" w:eastAsia="zh-CN" w:bidi="hi-IN"/>
+        </w:rPr>
+        <w:t>Já o amigo que bate à porta representa os estímulos exteriores que recebemos ao longo da vida — nem sempre agradáveis — e que nos impulsionam a buscar, dentro de nós mesmos, esses valores mais elevados. São as experiências, os desafios e as dificuldades que nos convidam a olhar para dentro e a reconhecer aquilo que precisa ser transformado.</w:t>
+      </w:r>
+    </w:p>
+    <w:p>
+      <w:pPr>
+        <w:pStyle w:val="Normal"/>
+        <w:jc w:val="both"/>
+        <w:rPr>
+          <w:rFonts w:ascii="Garamond" w:hAnsi="Garamond" w:eastAsia="Times New Roman" w:cs="Times New Roman"/>
+          <w:kern w:val="0"/>
+          <w:sz w:val="36"/>
+          <w:szCs w:val="36"/>
+          <w:shd w:fill="auto" w:val="clear"/>
+          <w:lang w:val="en-US" w:eastAsia="zh-CN" w:bidi="hi-IN"/>
+        </w:rPr>
+      </w:pPr>
+      <w:r>
+        <w:rPr>
+          <w:color w:val="auto"/>
+        </w:rPr>
+      </w:r>
+    </w:p>
+    <w:p>
+      <w:pPr>
+        <w:pStyle w:val="Normal"/>
+        <w:jc w:val="both"/>
+        <w:rPr>
+          <w:color w:val="auto"/>
+        </w:rPr>
+      </w:pPr>
+      <w:r>
+        <w:rPr>
+          <w:rFonts w:eastAsia="Times New Roman" w:cs="Times New Roman" w:ascii="Garamond" w:hAnsi="Garamond"/>
+          <w:color w:val="000000"/>
+          <w:kern w:val="0"/>
+          <w:sz w:val="36"/>
+          <w:szCs w:val="36"/>
+          <w:shd w:fill="auto" w:val="clear"/>
+          <w:lang w:val="en-US" w:eastAsia="zh-CN" w:bidi="hi-IN"/>
+        </w:rPr>
+        <w:t>Por fim, há um ponto central nessa parábola: por maior que fosse a necessidade do homem que pedia os pães, ele não podia abrir a porta da casa. A porta só se abre pelo lado de dentro. Assim também acontece com a porta do nosso coração. Somente nós podemos abri-la, quando decidimos atender aos apelos da própria consciência, muitas vezes manifestados através da dor, do desequilíbrio, da doença ou da fome de sentido espiritual.</w:t>
+      </w:r>
+    </w:p>
+    <w:p>
+      <w:pPr>
+        <w:pStyle w:val="Normal"/>
+        <w:jc w:val="both"/>
+        <w:rPr>
+          <w:rFonts w:ascii="Garamond" w:hAnsi="Garamond" w:eastAsia="Times New Roman" w:cs="Times New Roman"/>
+          <w:kern w:val="0"/>
+          <w:sz w:val="36"/>
+          <w:szCs w:val="36"/>
+          <w:shd w:fill="auto" w:val="clear"/>
+          <w:lang w:val="en-US" w:eastAsia="zh-CN" w:bidi="hi-IN"/>
+        </w:rPr>
+      </w:pPr>
+      <w:r>
+        <w:rPr>
+          <w:color w:val="auto"/>
+        </w:rPr>
+      </w:r>
+    </w:p>
+    <w:p>
+      <w:pPr>
+        <w:pStyle w:val="Normal"/>
+        <w:jc w:val="both"/>
+        <w:rPr>
+          <w:color w:val="auto"/>
+        </w:rPr>
+      </w:pPr>
+      <w:r>
+        <w:rPr>
+          <w:rFonts w:eastAsia="Times New Roman" w:cs="Times New Roman" w:ascii="Garamond" w:hAnsi="Garamond"/>
+          <w:color w:val="000000"/>
+          <w:kern w:val="0"/>
+          <w:sz w:val="36"/>
+          <w:szCs w:val="36"/>
+          <w:shd w:fill="auto" w:val="clear"/>
+          <w:lang w:val="en-US" w:eastAsia="zh-CN" w:bidi="hi-IN"/>
+        </w:rPr>
+        <w:t>A Parábola do Amigo Importuno nos ensina, portanto, a necessidade da prece constante — não uma prece mecânica, repetitiva ou interesseira, mas uma oração sincera, consciente e transformadora. Uma prece que não apenas pede, mas que prepara o coração para receber, agir e crescer. É essa oração viva que se torna a chave capaz de abrir as portas do nosso mundo interior para tudo aquilo que pode promover nossa evolução espiritual.</w:t>
+      </w:r>
+    </w:p>
+    <w:p>
+      <w:pPr>
+        <w:pStyle w:val="Normal"/>
+        <w:jc w:val="both"/>
+        <w:rPr>
+          <w:sz w:val="36"/>
+          <w:szCs w:val="36"/>
+        </w:rPr>
+      </w:pPr>
+      <w:r>
+        <w:rPr>
+          <w:color w:val="1C99E0"/>
+        </w:rPr>
+      </w:r>
+    </w:p>
+    <w:p>
+      <w:pPr>
+        <w:pStyle w:val="Normal"/>
+        <w:jc w:val="both"/>
+        <w:rPr>
+          <w:color w:val="1C99E0"/>
+        </w:rPr>
+      </w:pPr>
+      <w:r>
+        <w:rPr>
+          <w:rFonts w:eastAsia="Times New Roman" w:cs="Times New Roman" w:ascii="Garamond" w:hAnsi="Garamond"/>
+          <w:color w:val="1C99E0"/>
+          <w:kern w:val="0"/>
+          <w:sz w:val="36"/>
+          <w:szCs w:val="36"/>
+          <w:shd w:fill="auto" w:val="clear"/>
+          <w:lang w:val="en-US" w:eastAsia="zh-CN" w:bidi="hi-IN"/>
+        </w:rPr>
+        <w:t xml:space="preserve">[ </w:t>
+      </w:r>
+      <w:r>
+        <w:rPr>
+          <w:rFonts w:eastAsia="Times New Roman" w:cs="Times New Roman" w:ascii="Garamond" w:hAnsi="Garamond"/>
+          <w:color w:val="1C99E0"/>
+          <w:kern w:val="0"/>
+          <w:sz w:val="36"/>
+          <w:szCs w:val="36"/>
+          <w:shd w:fill="auto" w:val="clear"/>
+          <w:lang w:val="en-US" w:eastAsia="zh-CN" w:bidi="hi-IN"/>
+        </w:rPr>
+        <w:t>Término</w:t>
+      </w:r>
+      <w:r>
+        <w:rPr>
+          <w:rFonts w:eastAsia="Times New Roman" w:cs="Times New Roman" w:ascii="Garamond" w:hAnsi="Garamond"/>
+          <w:color w:val="1C99E0"/>
+          <w:kern w:val="0"/>
+          <w:sz w:val="36"/>
+          <w:szCs w:val="36"/>
+          <w:shd w:fill="auto" w:val="clear"/>
+          <w:lang w:val="en-US" w:eastAsia="zh-CN" w:bidi="hi-IN"/>
+        </w:rPr>
+        <w:t xml:space="preserve"> de tópico a ser </w:t>
+      </w:r>
+      <w:r>
+        <w:rPr>
+          <w:rFonts w:eastAsia="Times New Roman" w:cs="Times New Roman" w:ascii="Garamond" w:hAnsi="Garamond"/>
+          <w:color w:val="1C99E0"/>
+          <w:kern w:val="0"/>
+          <w:sz w:val="36"/>
+          <w:szCs w:val="36"/>
+          <w:shd w:fill="auto" w:val="clear"/>
+          <w:lang w:val="en-US" w:eastAsia="zh-CN" w:bidi="hi-IN"/>
+        </w:rPr>
+        <w:t>encaixado</w:t>
+      </w:r>
+      <w:r>
+        <w:rPr>
+          <w:rFonts w:eastAsia="Times New Roman" w:cs="Times New Roman" w:ascii="Garamond" w:hAnsi="Garamond"/>
+          <w:color w:val="1C99E0"/>
+          <w:kern w:val="0"/>
+          <w:sz w:val="36"/>
+          <w:szCs w:val="36"/>
+          <w:shd w:fill="auto" w:val="clear"/>
+          <w:lang w:val="en-US" w:eastAsia="zh-CN" w:bidi="hi-IN"/>
+        </w:rPr>
+        <w:t xml:space="preserve"> ]</w:t>
+      </w:r>
+    </w:p>
+    <w:p>
+      <w:pPr>
+        <w:pStyle w:val="Normal"/>
+        <w:jc w:val="both"/>
+        <w:rPr>
+          <w:rFonts w:ascii="Garamond" w:hAnsi="Garamond" w:eastAsia="Times New Roman" w:cs="Times New Roman"/>
+          <w:kern w:val="0"/>
+          <w:sz w:val="36"/>
+          <w:szCs w:val="36"/>
+          <w:shd w:fill="auto" w:val="clear"/>
+          <w:lang w:val="en-US" w:eastAsia="zh-CN" w:bidi="hi-IN"/>
+        </w:rPr>
+      </w:pPr>
+      <w:r>
+        <w:rPr>
+          <w:color w:val="1C99E0"/>
+        </w:rPr>
+      </w:r>
+    </w:p>
+    <w:p>
+      <w:pPr>
+        <w:pStyle w:val="Normal"/>
+        <w:jc w:val="both"/>
+        <w:rPr>
+          <w:color w:val="1C99E0"/>
+        </w:rPr>
+      </w:pPr>
+      <w:r>
+        <w:rPr>
+          <w:rFonts w:eastAsia="Times New Roman" w:cs="Times New Roman" w:ascii="Garamond" w:hAnsi="Garamond"/>
+          <w:color w:val="1C99E0"/>
+          <w:kern w:val="0"/>
+          <w:sz w:val="36"/>
+          <w:szCs w:val="36"/>
+          <w:shd w:fill="auto" w:val="clear"/>
+          <w:lang w:val="en-US" w:eastAsia="zh-CN" w:bidi="hi-IN"/>
+        </w:rPr>
+        <w:t xml:space="preserve">[ </w:t>
+      </w:r>
+      <w:r>
+        <w:rPr>
+          <w:rFonts w:eastAsia="Times New Roman" w:cs="Times New Roman" w:ascii="Garamond" w:hAnsi="Garamond"/>
+          <w:color w:val="1C99E0"/>
+          <w:kern w:val="0"/>
+          <w:sz w:val="36"/>
+          <w:szCs w:val="36"/>
+          <w:shd w:fill="auto" w:val="clear"/>
+          <w:lang w:val="en-US" w:eastAsia="zh-CN" w:bidi="hi-IN"/>
+        </w:rPr>
+        <w:t>Início Prece refratada</w:t>
+      </w:r>
+      <w:r>
+        <w:rPr>
+          <w:rFonts w:eastAsia="Times New Roman" w:cs="Times New Roman" w:ascii="Garamond" w:hAnsi="Garamond"/>
+          <w:color w:val="1C99E0"/>
+          <w:kern w:val="0"/>
+          <w:sz w:val="36"/>
+          <w:szCs w:val="36"/>
+          <w:shd w:fill="auto" w:val="clear"/>
+          <w:lang w:val="en-US" w:eastAsia="zh-CN" w:bidi="hi-IN"/>
+        </w:rPr>
+        <w:t xml:space="preserve"> ]</w:t>
+      </w:r>
+    </w:p>
+    <w:p>
+      <w:pPr>
+        <w:pStyle w:val="Normal"/>
+        <w:jc w:val="both"/>
+        <w:rPr>
+          <w:rFonts w:ascii="Garamond" w:hAnsi="Garamond" w:eastAsia="Times New Roman" w:cs="Times New Roman"/>
+          <w:kern w:val="0"/>
+          <w:sz w:val="36"/>
+          <w:szCs w:val="36"/>
+          <w:shd w:fill="auto" w:val="clear"/>
+          <w:lang w:val="en-US" w:eastAsia="zh-CN" w:bidi="hi-IN"/>
+        </w:rPr>
+      </w:pPr>
+      <w:r>
+        <w:rPr>
+          <w:color w:val="1C99E0"/>
+        </w:rPr>
+      </w:r>
+    </w:p>
+    <w:p>
+      <w:pPr>
+        <w:pStyle w:val="Normal"/>
+        <w:jc w:val="both"/>
+        <w:rPr>
+          <w:color w:val="auto"/>
+        </w:rPr>
+      </w:pPr>
+      <w:r>
+        <w:rPr>
+          <w:rFonts w:eastAsia="Times New Roman" w:cs="Times New Roman" w:ascii="Garamond" w:hAnsi="Garamond"/>
+          <w:color w:val="000000"/>
+          <w:kern w:val="0"/>
+          <w:sz w:val="36"/>
+          <w:szCs w:val="36"/>
+          <w:shd w:fill="auto" w:val="clear"/>
+          <w:lang w:val="en-US" w:eastAsia="zh-CN" w:bidi="hi-IN"/>
+        </w:rPr>
+        <w:t>Em toda parte estamos envolvidos pelo amor e pela solicitude de Deus. Nenhuma prece sincera se perde, ainda que, muitas vezes, não seja atendida exatamente da forma ou pelo caminho que imaginamos.</w:t>
+      </w:r>
+    </w:p>
+    <w:p>
+      <w:pPr>
+        <w:pStyle w:val="Normal"/>
+        <w:jc w:val="both"/>
+        <w:rPr>
+          <w:rFonts w:ascii="Garamond" w:hAnsi="Garamond" w:eastAsia="Times New Roman" w:cs="Times New Roman"/>
+          <w:kern w:val="0"/>
+          <w:sz w:val="36"/>
+          <w:szCs w:val="36"/>
+          <w:shd w:fill="auto" w:val="clear"/>
+          <w:lang w:val="en-US" w:eastAsia="zh-CN" w:bidi="hi-IN"/>
+        </w:rPr>
+      </w:pPr>
+      <w:r>
+        <w:rPr>
+          <w:color w:val="auto"/>
+        </w:rPr>
+      </w:r>
+    </w:p>
+    <w:p>
+      <w:pPr>
+        <w:pStyle w:val="Normal"/>
+        <w:jc w:val="both"/>
+        <w:rPr>
+          <w:color w:val="auto"/>
+        </w:rPr>
+      </w:pPr>
+      <w:r>
+        <w:rPr>
+          <w:rFonts w:eastAsia="Times New Roman" w:cs="Times New Roman" w:ascii="Garamond" w:hAnsi="Garamond"/>
+          <w:color w:val="000000"/>
+          <w:kern w:val="0"/>
+          <w:sz w:val="36"/>
+          <w:szCs w:val="36"/>
+          <w:shd w:fill="auto" w:val="clear"/>
+          <w:lang w:val="en-US" w:eastAsia="zh-CN" w:bidi="hi-IN"/>
+        </w:rPr>
+        <w:t>Essa realidade espiritual é ilustrada de maneira muito tocante na obra Entre a Terra e o Céu, psicografada por Chico Xavier. No capítulo 2, intitulado “No Cenário Terrestre”, encontramos o drama de uma jovem chamada Evelina, então com apenas quinze anos de idade.</w:t>
+      </w:r>
+    </w:p>
+    <w:p>
+      <w:pPr>
+        <w:pStyle w:val="Normal"/>
+        <w:jc w:val="both"/>
+        <w:rPr>
+          <w:rFonts w:ascii="Garamond" w:hAnsi="Garamond" w:eastAsia="Times New Roman" w:cs="Times New Roman"/>
+          <w:kern w:val="0"/>
+          <w:sz w:val="36"/>
+          <w:szCs w:val="36"/>
+          <w:shd w:fill="auto" w:val="clear"/>
+          <w:lang w:val="en-US" w:eastAsia="zh-CN" w:bidi="hi-IN"/>
+        </w:rPr>
+      </w:pPr>
+      <w:r>
+        <w:rPr>
+          <w:color w:val="auto"/>
+        </w:rPr>
+      </w:r>
+    </w:p>
+    <w:p>
+      <w:pPr>
+        <w:pStyle w:val="Normal"/>
+        <w:jc w:val="both"/>
+        <w:rPr>
+          <w:color w:val="auto"/>
+        </w:rPr>
+      </w:pPr>
+      <w:r>
+        <w:rPr>
+          <w:rFonts w:eastAsia="Times New Roman" w:cs="Times New Roman" w:ascii="Garamond" w:hAnsi="Garamond"/>
+          <w:color w:val="000000"/>
+          <w:kern w:val="0"/>
+          <w:sz w:val="36"/>
+          <w:szCs w:val="36"/>
+          <w:shd w:fill="auto" w:val="clear"/>
+          <w:lang w:val="en-US" w:eastAsia="zh-CN" w:bidi="hi-IN"/>
+        </w:rPr>
+        <w:t>Evelina vivia uma situação familiar profundamente dolorosa. Sua mãe havia desencarnado, o pai encontrava-se gravemente enfermo após a morte trágica do filho mais novo, e o lar estava mergulhado em conflitos emocionais intensos. A madrasta, consumida pela culpa e pelo sofrimento, encontrava-se fragilizada espiritualmente, enquanto o ambiente doméstico era marcado por desequilíbrios e influências perturbadoras.</w:t>
+      </w:r>
+    </w:p>
+    <w:p>
+      <w:pPr>
+        <w:pStyle w:val="Normal"/>
+        <w:jc w:val="both"/>
+        <w:rPr>
+          <w:rFonts w:ascii="Garamond" w:hAnsi="Garamond" w:eastAsia="Times New Roman" w:cs="Times New Roman"/>
+          <w:kern w:val="0"/>
+          <w:sz w:val="36"/>
+          <w:szCs w:val="36"/>
+          <w:shd w:fill="auto" w:val="clear"/>
+          <w:lang w:val="en-US" w:eastAsia="zh-CN" w:bidi="hi-IN"/>
+        </w:rPr>
+      </w:pPr>
+      <w:r>
+        <w:rPr>
+          <w:color w:val="auto"/>
+        </w:rPr>
+      </w:r>
+    </w:p>
+    <w:p>
+      <w:pPr>
+        <w:pStyle w:val="Normal"/>
+        <w:jc w:val="both"/>
+        <w:rPr>
+          <w:color w:val="auto"/>
+        </w:rPr>
+      </w:pPr>
+      <w:r>
+        <w:rPr>
+          <w:rFonts w:eastAsia="Times New Roman" w:cs="Times New Roman" w:ascii="Garamond" w:hAnsi="Garamond"/>
+          <w:color w:val="000000"/>
+          <w:kern w:val="0"/>
+          <w:sz w:val="36"/>
+          <w:szCs w:val="36"/>
+          <w:shd w:fill="auto" w:val="clear"/>
+          <w:lang w:val="en-US" w:eastAsia="zh-CN" w:bidi="hi-IN"/>
+        </w:rPr>
+        <w:t>Diante de tamanho sofrimento, Evelina orava com insistência e dor, suplicando pela proteção da mãe desencarnada. No entanto, aquela a quem a jovem dirigia suas preces não se encontrava em condições espirituais de ouvi-la ou de oferecer o auxílio solicitado. Ainda assim, a oração da menina não se perdeu.</w:t>
+      </w:r>
+    </w:p>
+    <w:p>
+      <w:pPr>
+        <w:pStyle w:val="Normal"/>
+        <w:jc w:val="both"/>
+        <w:rPr>
+          <w:rFonts w:ascii="Garamond" w:hAnsi="Garamond" w:eastAsia="Times New Roman" w:cs="Times New Roman"/>
+          <w:kern w:val="0"/>
+          <w:sz w:val="36"/>
+          <w:szCs w:val="36"/>
+          <w:shd w:fill="auto" w:val="clear"/>
+          <w:lang w:val="en-US" w:eastAsia="zh-CN" w:bidi="hi-IN"/>
+        </w:rPr>
+      </w:pPr>
+      <w:r>
+        <w:rPr>
+          <w:color w:val="auto"/>
+        </w:rPr>
+      </w:r>
+    </w:p>
+    <w:p>
+      <w:pPr>
+        <w:pStyle w:val="Normal"/>
+        <w:jc w:val="both"/>
+        <w:rPr>
+          <w:color w:val="auto"/>
+        </w:rPr>
+      </w:pPr>
+      <w:r>
+        <w:rPr>
+          <w:rFonts w:eastAsia="Times New Roman" w:cs="Times New Roman" w:ascii="Garamond" w:hAnsi="Garamond"/>
+          <w:color w:val="000000"/>
+          <w:kern w:val="0"/>
+          <w:sz w:val="36"/>
+          <w:szCs w:val="36"/>
+          <w:shd w:fill="auto" w:val="clear"/>
+          <w:lang w:val="en-US" w:eastAsia="zh-CN" w:bidi="hi-IN"/>
+        </w:rPr>
+        <w:t>Orando com profunda sinceridade, fé e elevação de sentimentos, Evelina produziu uma vibração tão intensa que sua súplica, não encontrando acolhimento no destino inicial, mudou de direção. Sustentada pela força moral que a animava, a prece ultrapassou planos espirituais inferiores e alcançou esferas onde havia trabalhadores espirituais capazes de compreender a situação e prestar o auxílio necessário.</w:t>
+      </w:r>
+    </w:p>
+    <w:p>
+      <w:pPr>
+        <w:pStyle w:val="Normal"/>
+        <w:jc w:val="both"/>
+        <w:rPr>
+          <w:rFonts w:ascii="Garamond" w:hAnsi="Garamond" w:eastAsia="Times New Roman" w:cs="Times New Roman"/>
+          <w:kern w:val="0"/>
+          <w:sz w:val="36"/>
+          <w:szCs w:val="36"/>
+          <w:shd w:fill="auto" w:val="clear"/>
+          <w:lang w:val="en-US" w:eastAsia="zh-CN" w:bidi="hi-IN"/>
+        </w:rPr>
+      </w:pPr>
+      <w:r>
+        <w:rPr>
+          <w:color w:val="auto"/>
+        </w:rPr>
+      </w:r>
+    </w:p>
+    <w:p>
+      <w:pPr>
+        <w:pStyle w:val="Normal"/>
+        <w:jc w:val="both"/>
+        <w:rPr>
+          <w:color w:val="auto"/>
+        </w:rPr>
+      </w:pPr>
+      <w:r>
+        <w:rPr>
+          <w:rFonts w:eastAsia="Times New Roman" w:cs="Times New Roman" w:ascii="Garamond" w:hAnsi="Garamond"/>
+          <w:color w:val="000000"/>
+          <w:kern w:val="0"/>
+          <w:sz w:val="36"/>
+          <w:szCs w:val="36"/>
+          <w:shd w:fill="auto" w:val="clear"/>
+          <w:lang w:val="en-US" w:eastAsia="zh-CN" w:bidi="hi-IN"/>
+        </w:rPr>
+        <w:t>Esse episódio nos ajuda a compreender o fenômeno conhecido como prece refratada. Assim como um raio de luz, ao encontrar um obstáculo, pode desviar seu curso e seguir por outro caminho, a oração verdadeira, quando não encontra resposta no ponto a que foi dirigida, é naturalmente conduzida às regiões espirituais compatíveis com sua elevação e com a justiça do pedido.</w:t>
+      </w:r>
+    </w:p>
+    <w:p>
+      <w:pPr>
+        <w:pStyle w:val="Normal"/>
+        <w:jc w:val="both"/>
+        <w:rPr>
+          <w:rFonts w:ascii="Garamond" w:hAnsi="Garamond" w:eastAsia="Times New Roman" w:cs="Times New Roman"/>
+          <w:kern w:val="0"/>
+          <w:sz w:val="36"/>
+          <w:szCs w:val="36"/>
+          <w:shd w:fill="auto" w:val="clear"/>
+          <w:lang w:val="en-US" w:eastAsia="zh-CN" w:bidi="hi-IN"/>
+        </w:rPr>
+      </w:pPr>
+      <w:r>
+        <w:rPr>
+          <w:color w:val="auto"/>
+        </w:rPr>
+      </w:r>
+    </w:p>
+    <w:p>
+      <w:pPr>
+        <w:pStyle w:val="Normal"/>
+        <w:jc w:val="both"/>
+        <w:rPr>
+          <w:color w:val="auto"/>
+        </w:rPr>
+      </w:pPr>
+      <w:r>
+        <w:rPr>
+          <w:rFonts w:eastAsia="Times New Roman" w:cs="Times New Roman" w:ascii="Garamond" w:hAnsi="Garamond"/>
+          <w:color w:val="000000"/>
+          <w:kern w:val="0"/>
+          <w:sz w:val="36"/>
+          <w:szCs w:val="36"/>
+          <w:shd w:fill="auto" w:val="clear"/>
+          <w:lang w:val="en-US" w:eastAsia="zh-CN" w:bidi="hi-IN"/>
+        </w:rPr>
+        <w:t>Essa compreensão amplia o sentido do ensinamento de Jesus quando afirma: “Pedi e obtereis.” Ele não nos prometeu que toda prece seria atendida exatamente como desejamos, nem por aqueles a quem dirigimos nossos pedidos. O Mestre nos ensinou que a oração sincera, aliada à fé e à retidão de intenções, encontra resposta útil e educativa, segundo a sabedoria divina.</w:t>
+      </w:r>
+    </w:p>
+    <w:p>
+      <w:pPr>
+        <w:pStyle w:val="Normal"/>
+        <w:jc w:val="both"/>
+        <w:rPr>
+          <w:rFonts w:ascii="Garamond" w:hAnsi="Garamond" w:eastAsia="Times New Roman" w:cs="Times New Roman"/>
+          <w:kern w:val="0"/>
+          <w:sz w:val="36"/>
+          <w:szCs w:val="36"/>
+          <w:shd w:fill="auto" w:val="clear"/>
+          <w:lang w:val="en-US" w:eastAsia="zh-CN" w:bidi="hi-IN"/>
+        </w:rPr>
+      </w:pPr>
+      <w:r>
+        <w:rPr>
+          <w:color w:val="auto"/>
+        </w:rPr>
+      </w:r>
+    </w:p>
+    <w:p>
+      <w:pPr>
+        <w:pStyle w:val="Normal"/>
+        <w:jc w:val="both"/>
+        <w:rPr>
+          <w:color w:val="auto"/>
+        </w:rPr>
+      </w:pPr>
+      <w:r>
+        <w:rPr>
+          <w:rFonts w:eastAsia="Times New Roman" w:cs="Times New Roman" w:ascii="Garamond" w:hAnsi="Garamond"/>
+          <w:color w:val="000000"/>
+          <w:kern w:val="0"/>
+          <w:sz w:val="36"/>
+          <w:szCs w:val="36"/>
+          <w:shd w:fill="auto" w:val="clear"/>
+          <w:lang w:val="en-US" w:eastAsia="zh-CN" w:bidi="hi-IN"/>
+        </w:rPr>
+        <w:t>Deus não está limitado aos nossos endereçamentos mentais. Quando oramos com sentimentos elevados, com propósitos justos e com confiança verdadeira, nossas rogativas encontram eco na espiritualidade maior, ainda que sigam caminhos diferentes daqueles que idealizamos. O essencial não é apenas pedir, mas como pedimos, com que sentimentos e para que finalidade.</w:t>
+      </w:r>
+    </w:p>
+    <w:p>
+      <w:pPr>
+        <w:pStyle w:val="Normal"/>
+        <w:jc w:val="both"/>
+        <w:rPr>
+          <w:rFonts w:ascii="Garamond" w:hAnsi="Garamond" w:eastAsia="Times New Roman" w:cs="Times New Roman"/>
+          <w:kern w:val="0"/>
+          <w:sz w:val="36"/>
+          <w:szCs w:val="36"/>
+          <w:shd w:fill="auto" w:val="clear"/>
+          <w:lang w:val="en-US" w:eastAsia="zh-CN" w:bidi="hi-IN"/>
+        </w:rPr>
+      </w:pPr>
+      <w:r>
+        <w:rPr>
+          <w:color w:val="auto"/>
+        </w:rPr>
+      </w:r>
+    </w:p>
+    <w:p>
+      <w:pPr>
+        <w:pStyle w:val="Normal"/>
+        <w:jc w:val="both"/>
+        <w:rPr>
+          <w:color w:val="auto"/>
+        </w:rPr>
+      </w:pPr>
+      <w:r>
+        <w:rPr>
+          <w:rFonts w:eastAsia="Times New Roman" w:cs="Times New Roman" w:ascii="Garamond" w:hAnsi="Garamond"/>
+          <w:color w:val="000000"/>
+          <w:kern w:val="0"/>
+          <w:sz w:val="36"/>
+          <w:szCs w:val="36"/>
+          <w:shd w:fill="auto" w:val="clear"/>
+          <w:lang w:val="en-US" w:eastAsia="zh-CN" w:bidi="hi-IN"/>
+        </w:rPr>
+        <w:t>Assim, o “Pedi e obtereis” não deve ser entendido como uma promessa de facilidades, mas como a certeza de que nenhuma oração sincera se perde. Toda prece elevada mobiliza recursos espirituais, amplia nossa capacidade de receber e nos coloca em sintonia com o amparo divino sempre presente.</w:t>
+      </w:r>
+    </w:p>
+    <w:p>
+      <w:pPr>
+        <w:pStyle w:val="Normal"/>
+        <w:jc w:val="both"/>
+        <w:rPr>
+          <w:rFonts w:ascii="Garamond" w:hAnsi="Garamond" w:eastAsia="Times New Roman" w:cs="Times New Roman"/>
+          <w:kern w:val="0"/>
+          <w:sz w:val="36"/>
+          <w:szCs w:val="36"/>
+          <w:shd w:fill="auto" w:val="clear"/>
+          <w:lang w:val="en-US" w:eastAsia="zh-CN" w:bidi="hi-IN"/>
+        </w:rPr>
+      </w:pPr>
+      <w:r>
+        <w:rPr>
+          <w:color w:val="auto"/>
+        </w:rPr>
+      </w:r>
+    </w:p>
+    <w:p>
+      <w:pPr>
+        <w:pStyle w:val="Normal"/>
+        <w:jc w:val="both"/>
+        <w:rPr>
+          <w:color w:val="auto"/>
+        </w:rPr>
+      </w:pPr>
+      <w:r>
+        <w:rPr>
+          <w:rFonts w:eastAsia="Times New Roman" w:cs="Times New Roman" w:ascii="Garamond" w:hAnsi="Garamond"/>
+          <w:color w:val="000000"/>
+          <w:kern w:val="0"/>
+          <w:sz w:val="36"/>
+          <w:szCs w:val="36"/>
+          <w:shd w:fill="auto" w:val="clear"/>
+          <w:lang w:val="en-US" w:eastAsia="zh-CN" w:bidi="hi-IN"/>
+        </w:rPr>
+        <w:t>Deus sempre responde. Nem sempre da forma que esperamos, mas sempre da maneira que mais nos auxilia a crescer.</w:t>
+      </w:r>
+    </w:p>
+    <w:p>
+      <w:pPr>
+        <w:pStyle w:val="Normal"/>
+        <w:jc w:val="both"/>
+        <w:rPr>
+          <w:rFonts w:ascii="Garamond" w:hAnsi="Garamond" w:eastAsia="Times New Roman" w:cs="Times New Roman"/>
+          <w:kern w:val="0"/>
+          <w:sz w:val="36"/>
+          <w:szCs w:val="36"/>
+          <w:shd w:fill="auto" w:val="clear"/>
+          <w:lang w:val="en-US" w:eastAsia="zh-CN" w:bidi="hi-IN"/>
+        </w:rPr>
+      </w:pPr>
+      <w:r>
+        <w:rPr>
+          <w:color w:val="1C99E0"/>
+        </w:rPr>
+      </w:r>
+    </w:p>
+    <w:p>
+      <w:pPr>
+        <w:pStyle w:val="Normal"/>
+        <w:jc w:val="both"/>
+        <w:rPr>
+          <w:color w:val="1C99E0"/>
+        </w:rPr>
+      </w:pPr>
+      <w:r>
+        <w:rPr>
+          <w:rFonts w:eastAsia="Times New Roman" w:cs="Times New Roman" w:ascii="Garamond" w:hAnsi="Garamond"/>
+          <w:color w:val="1C99E0"/>
+          <w:kern w:val="0"/>
+          <w:sz w:val="36"/>
+          <w:szCs w:val="36"/>
+          <w:shd w:fill="auto" w:val="clear"/>
+          <w:lang w:val="en-US" w:eastAsia="zh-CN" w:bidi="hi-IN"/>
+        </w:rPr>
+        <w:t xml:space="preserve">[ </w:t>
+      </w:r>
+      <w:r>
+        <w:rPr>
+          <w:rFonts w:eastAsia="Times New Roman" w:cs="Times New Roman" w:ascii="Garamond" w:hAnsi="Garamond"/>
+          <w:color w:val="1C99E0"/>
+          <w:kern w:val="0"/>
+          <w:sz w:val="36"/>
+          <w:szCs w:val="36"/>
+          <w:shd w:fill="auto" w:val="clear"/>
+          <w:lang w:val="en-US" w:eastAsia="zh-CN" w:bidi="hi-IN"/>
+        </w:rPr>
+        <w:t>Término Prece refratada</w:t>
+      </w:r>
+      <w:r>
+        <w:rPr>
+          <w:rFonts w:eastAsia="Times New Roman" w:cs="Times New Roman" w:ascii="Garamond" w:hAnsi="Garamond"/>
+          <w:color w:val="1C99E0"/>
+          <w:kern w:val="0"/>
+          <w:sz w:val="36"/>
+          <w:szCs w:val="36"/>
+          <w:shd w:fill="auto" w:val="clear"/>
+          <w:lang w:val="en-US" w:eastAsia="zh-CN" w:bidi="hi-IN"/>
+        </w:rPr>
+        <w:t xml:space="preserve"> ]</w:t>
+      </w:r>
+    </w:p>
+    <w:p>
+      <w:pPr>
+        <w:pStyle w:val="Normal"/>
+        <w:jc w:val="both"/>
+        <w:rPr>
+          <w:sz w:val="36"/>
+          <w:szCs w:val="36"/>
+        </w:rPr>
+      </w:pPr>
+      <w:r>
+        <w:rPr/>
+      </w:r>
+    </w:p>
+    <w:p>
+      <w:pPr>
+        <w:pStyle w:val="Normal"/>
+        <w:jc w:val="both"/>
+        <w:rPr>
+          <w:sz w:val="36"/>
+          <w:szCs w:val="36"/>
+        </w:rPr>
+      </w:pPr>
+      <w:r>
+        <w:rPr/>
+      </w:r>
+    </w:p>
+    <w:p>
+      <w:pPr>
+        <w:pStyle w:val="Normal"/>
+        <w:jc w:val="both"/>
+        <w:rPr>
+          <w:color w:val="1C99E0"/>
+        </w:rPr>
+      </w:pPr>
+      <w:r>
+        <w:rPr>
+          <w:rFonts w:eastAsia="Times New Roman" w:cs="Times New Roman" w:ascii="Garamond" w:hAnsi="Garamond"/>
+          <w:color w:val="1C99E0"/>
+          <w:kern w:val="0"/>
+          <w:sz w:val="36"/>
+          <w:szCs w:val="36"/>
+          <w:shd w:fill="auto" w:val="clear"/>
+          <w:lang w:val="en-US" w:eastAsia="zh-CN" w:bidi="hi-IN"/>
+        </w:rPr>
+        <w:t>[ Inicío de tópico a ser desenvolvido ]</w:t>
+      </w:r>
+    </w:p>
+    <w:p>
+      <w:pPr>
+        <w:pStyle w:val="Normal"/>
+        <w:jc w:val="both"/>
+        <w:rPr>
+          <w:sz w:val="36"/>
+          <w:szCs w:val="36"/>
+        </w:rPr>
+      </w:pPr>
+      <w:r>
+        <w:rPr/>
+      </w:r>
+    </w:p>
+    <w:p>
+      <w:pPr>
+        <w:pStyle w:val="Normal"/>
+        <w:jc w:val="both"/>
+        <w:rPr>
+          <w:sz w:val="36"/>
+          <w:szCs w:val="36"/>
+        </w:rPr>
+      </w:pPr>
+      <w:r>
+        <w:rPr>
+          <w:rFonts w:eastAsia="Times New Roman" w:cs="Times New Roman" w:ascii="Garamond" w:hAnsi="Garamond"/>
+          <w:color w:val="000000"/>
+          <w:kern w:val="0"/>
+          <w:sz w:val="36"/>
+          <w:szCs w:val="36"/>
+          <w:shd w:fill="auto" w:val="clear"/>
+          <w:lang w:val="en-US" w:eastAsia="zh-CN" w:bidi="hi-IN"/>
+        </w:rPr>
+        <w:t>O Pedi e Obtereis é ensinado à multidão no Sermão do Monte (evangelho de Mateus) e aos discípulos, após a oração do Pai Nosso.</w:t>
+      </w:r>
+    </w:p>
+    <w:p>
+      <w:pPr>
+        <w:pStyle w:val="Normal"/>
+        <w:jc w:val="both"/>
+        <w:rPr>
+          <w:sz w:val="36"/>
+          <w:szCs w:val="36"/>
+        </w:rPr>
+      </w:pPr>
+      <w:r>
+        <w:rPr/>
+      </w:r>
+    </w:p>
+    <w:p>
+      <w:pPr>
+        <w:pStyle w:val="Normal"/>
+        <w:jc w:val="both"/>
+        <w:rPr>
+          <w:sz w:val="36"/>
+          <w:szCs w:val="36"/>
+        </w:rPr>
+      </w:pPr>
+      <w:r>
+        <w:rPr>
+          <w:rFonts w:eastAsia="Times New Roman" w:cs="Times New Roman" w:ascii="Garamond" w:hAnsi="Garamond"/>
+          <w:color w:val="000000"/>
+          <w:kern w:val="0"/>
+          <w:sz w:val="36"/>
+          <w:szCs w:val="36"/>
+          <w:shd w:fill="auto" w:val="clear"/>
+          <w:lang w:val="en-US" w:eastAsia="zh-CN" w:bidi="hi-IN"/>
+        </w:rPr>
+        <w:t>Ao falar aos discípulos Jesus se utiliza da parábola do amigo importuno. Ao falar à multidão, Jesus fala de maneira mais direta.</w:t>
+      </w:r>
+    </w:p>
+    <w:p>
+      <w:pPr>
+        <w:pStyle w:val="Normal"/>
+        <w:jc w:val="both"/>
+        <w:rPr>
+          <w:sz w:val="36"/>
+          <w:szCs w:val="36"/>
+        </w:rPr>
+      </w:pPr>
+      <w:r>
+        <w:rPr/>
+      </w:r>
+    </w:p>
+    <w:p>
+      <w:pPr>
+        <w:pStyle w:val="Normal"/>
+        <w:jc w:val="both"/>
+        <w:rPr>
+          <w:sz w:val="36"/>
+          <w:szCs w:val="36"/>
+        </w:rPr>
+      </w:pPr>
+      <w:r>
+        <w:rPr>
+          <w:rFonts w:eastAsia="Times New Roman" w:cs="Times New Roman" w:ascii="Garamond" w:hAnsi="Garamond"/>
+          <w:color w:val="000000"/>
+          <w:kern w:val="0"/>
+          <w:sz w:val="36"/>
+          <w:szCs w:val="36"/>
+          <w:shd w:fill="auto" w:val="clear"/>
+          <w:lang w:val="en-US" w:eastAsia="zh-CN" w:bidi="hi-IN"/>
+        </w:rPr>
+        <w:t>1. Dois públicos, dois níveis de ensino</w:t>
+      </w:r>
+    </w:p>
+    <w:p>
+      <w:pPr>
+        <w:pStyle w:val="Normal"/>
+        <w:jc w:val="both"/>
+        <w:rPr>
+          <w:sz w:val="36"/>
+          <w:szCs w:val="36"/>
+        </w:rPr>
+      </w:pPr>
+      <w:r>
+        <w:rPr/>
+      </w:r>
+    </w:p>
+    <w:p>
+      <w:pPr>
+        <w:pStyle w:val="Normal"/>
+        <w:jc w:val="both"/>
+        <w:rPr>
+          <w:sz w:val="36"/>
+          <w:szCs w:val="36"/>
+        </w:rPr>
+      </w:pPr>
+      <w:r>
+        <w:rPr>
+          <w:rFonts w:eastAsia="Times New Roman" w:cs="Times New Roman" w:ascii="Garamond" w:hAnsi="Garamond"/>
+          <w:color w:val="000000"/>
+          <w:kern w:val="0"/>
+          <w:sz w:val="36"/>
+          <w:szCs w:val="36"/>
+          <w:shd w:fill="auto" w:val="clear"/>
+          <w:lang w:val="en-US" w:eastAsia="zh-CN" w:bidi="hi-IN"/>
+        </w:rPr>
+        <w:t>Você captou um ponto essencial:</w:t>
+      </w:r>
+    </w:p>
+    <w:p>
+      <w:pPr>
+        <w:pStyle w:val="Normal"/>
+        <w:jc w:val="both"/>
+        <w:rPr>
+          <w:sz w:val="36"/>
+          <w:szCs w:val="36"/>
+        </w:rPr>
+      </w:pPr>
+      <w:r>
+        <w:rPr/>
+      </w:r>
+    </w:p>
+    <w:p>
+      <w:pPr>
+        <w:pStyle w:val="Normal"/>
+        <w:jc w:val="both"/>
+        <w:rPr>
+          <w:sz w:val="36"/>
+          <w:szCs w:val="36"/>
+        </w:rPr>
+      </w:pPr>
+      <w:r>
+        <w:rPr>
+          <w:rFonts w:eastAsia="Times New Roman" w:cs="Times New Roman" w:ascii="Garamond" w:hAnsi="Garamond"/>
+          <w:color w:val="000000"/>
+          <w:kern w:val="0"/>
+          <w:sz w:val="36"/>
+          <w:szCs w:val="36"/>
+          <w:shd w:fill="auto" w:val="clear"/>
+          <w:lang w:val="en-US" w:eastAsia="zh-CN" w:bidi="hi-IN"/>
+        </w:rPr>
+        <w:t>No Sermão do Monte (Mateus 7), Jesus fala à multidão → usa frases diretas, curtas, de forte impacto moral:</w:t>
+      </w:r>
+    </w:p>
+    <w:p>
+      <w:pPr>
+        <w:pStyle w:val="Normal"/>
+        <w:jc w:val="both"/>
+        <w:rPr>
+          <w:sz w:val="36"/>
+          <w:szCs w:val="36"/>
+        </w:rPr>
+      </w:pPr>
+      <w:r>
+        <w:rPr>
+          <w:rFonts w:eastAsia="Times New Roman" w:cs="Times New Roman" w:ascii="Garamond" w:hAnsi="Garamond"/>
+          <w:color w:val="000000"/>
+          <w:kern w:val="0"/>
+          <w:sz w:val="36"/>
+          <w:szCs w:val="36"/>
+          <w:shd w:fill="auto" w:val="clear"/>
+          <w:lang w:val="en-US" w:eastAsia="zh-CN" w:bidi="hi-IN"/>
+        </w:rPr>
+        <w:t>“</w:t>
+      </w:r>
+      <w:r>
+        <w:rPr>
+          <w:rFonts w:eastAsia="Times New Roman" w:cs="Times New Roman" w:ascii="Garamond" w:hAnsi="Garamond"/>
+          <w:color w:val="000000"/>
+          <w:kern w:val="0"/>
+          <w:sz w:val="36"/>
+          <w:szCs w:val="36"/>
+          <w:shd w:fill="auto" w:val="clear"/>
+          <w:lang w:val="en-US" w:eastAsia="zh-CN" w:bidi="hi-IN"/>
+        </w:rPr>
+        <w:t>Pedi, buscai, batei.”</w:t>
+      </w:r>
+    </w:p>
+    <w:p>
+      <w:pPr>
+        <w:pStyle w:val="Normal"/>
+        <w:jc w:val="both"/>
+        <w:rPr>
+          <w:sz w:val="36"/>
+          <w:szCs w:val="36"/>
+        </w:rPr>
+      </w:pPr>
+      <w:r>
+        <w:rPr/>
+      </w:r>
+    </w:p>
+    <w:p>
+      <w:pPr>
+        <w:pStyle w:val="Normal"/>
+        <w:jc w:val="both"/>
+        <w:rPr>
+          <w:sz w:val="36"/>
+          <w:szCs w:val="36"/>
+        </w:rPr>
+      </w:pPr>
+      <w:r>
+        <w:rPr>
+          <w:rFonts w:eastAsia="Times New Roman" w:cs="Times New Roman" w:ascii="Garamond" w:hAnsi="Garamond"/>
+          <w:color w:val="000000"/>
+          <w:kern w:val="0"/>
+          <w:sz w:val="36"/>
+          <w:szCs w:val="36"/>
+          <w:shd w:fill="auto" w:val="clear"/>
+          <w:lang w:val="en-US" w:eastAsia="zh-CN" w:bidi="hi-IN"/>
+        </w:rPr>
+        <w:t>Em Lucas 11, Ele fala aos discípulos, após eles pedirem:</w:t>
+      </w:r>
+    </w:p>
+    <w:p>
+      <w:pPr>
+        <w:pStyle w:val="Normal"/>
+        <w:jc w:val="both"/>
+        <w:rPr>
+          <w:sz w:val="36"/>
+          <w:szCs w:val="36"/>
+        </w:rPr>
+      </w:pPr>
+      <w:r>
+        <w:rPr>
+          <w:rFonts w:eastAsia="Times New Roman" w:cs="Times New Roman" w:ascii="Garamond" w:hAnsi="Garamond"/>
+          <w:color w:val="000000"/>
+          <w:kern w:val="0"/>
+          <w:sz w:val="36"/>
+          <w:szCs w:val="36"/>
+          <w:shd w:fill="auto" w:val="clear"/>
+          <w:lang w:val="en-US" w:eastAsia="zh-CN" w:bidi="hi-IN"/>
+        </w:rPr>
+        <w:t>“</w:t>
+      </w:r>
+      <w:r>
+        <w:rPr>
+          <w:rFonts w:eastAsia="Times New Roman" w:cs="Times New Roman" w:ascii="Garamond" w:hAnsi="Garamond"/>
+          <w:color w:val="000000"/>
+          <w:kern w:val="0"/>
+          <w:sz w:val="36"/>
+          <w:szCs w:val="36"/>
+          <w:shd w:fill="auto" w:val="clear"/>
+          <w:lang w:val="en-US" w:eastAsia="zh-CN" w:bidi="hi-IN"/>
+        </w:rPr>
+        <w:t>Senhor, ensina-nos a orar.”</w:t>
+      </w:r>
+    </w:p>
+    <w:p>
+      <w:pPr>
+        <w:pStyle w:val="Normal"/>
+        <w:jc w:val="both"/>
+        <w:rPr>
+          <w:sz w:val="36"/>
+          <w:szCs w:val="36"/>
+        </w:rPr>
+      </w:pPr>
+      <w:r>
+        <w:rPr/>
+      </w:r>
+    </w:p>
+    <w:p>
+      <w:pPr>
+        <w:pStyle w:val="Normal"/>
+        <w:jc w:val="both"/>
+        <w:rPr>
+          <w:sz w:val="36"/>
+          <w:szCs w:val="36"/>
+        </w:rPr>
+      </w:pPr>
+      <w:r>
+        <w:rPr>
+          <w:rFonts w:eastAsia="Times New Roman" w:cs="Times New Roman" w:ascii="Garamond" w:hAnsi="Garamond"/>
+          <w:color w:val="000000"/>
+          <w:kern w:val="0"/>
+          <w:sz w:val="36"/>
+          <w:szCs w:val="36"/>
+          <w:shd w:fill="auto" w:val="clear"/>
+          <w:lang w:val="en-US" w:eastAsia="zh-CN" w:bidi="hi-IN"/>
+        </w:rPr>
+        <w:t>Aqui, Jesus não apenas afirma — Ele explica.</w:t>
+      </w:r>
+    </w:p>
+    <w:p>
+      <w:pPr>
+        <w:pStyle w:val="Normal"/>
+        <w:jc w:val="both"/>
+        <w:rPr>
+          <w:sz w:val="36"/>
+          <w:szCs w:val="36"/>
+        </w:rPr>
+      </w:pPr>
+      <w:r>
+        <w:rPr/>
+      </w:r>
+    </w:p>
+    <w:p>
+      <w:pPr>
+        <w:pStyle w:val="Normal"/>
+        <w:jc w:val="both"/>
+        <w:rPr>
+          <w:sz w:val="36"/>
+          <w:szCs w:val="36"/>
+        </w:rPr>
+      </w:pPr>
+      <w:r>
+        <w:rPr>
+          <w:rFonts w:eastAsia="Times New Roman" w:cs="Times New Roman" w:ascii="Garamond" w:hAnsi="Garamond"/>
+          <w:color w:val="000000"/>
+          <w:kern w:val="0"/>
+          <w:sz w:val="36"/>
+          <w:szCs w:val="36"/>
+          <w:shd w:fill="auto" w:val="clear"/>
+          <w:lang w:val="en-US" w:eastAsia="zh-CN" w:bidi="hi-IN"/>
+        </w:rPr>
+        <w:t>E Ele explica por meio de uma pequena parábola, justamente porque os discípulos já tinham vivência com Ele suficiente para ir além da letra.</w:t>
+      </w:r>
+    </w:p>
+    <w:p>
+      <w:pPr>
+        <w:pStyle w:val="Normal"/>
+        <w:jc w:val="both"/>
+        <w:rPr>
+          <w:sz w:val="36"/>
+          <w:szCs w:val="36"/>
+        </w:rPr>
+      </w:pPr>
+      <w:r>
+        <w:rPr/>
+      </w:r>
+    </w:p>
+    <w:p>
+      <w:pPr>
+        <w:pStyle w:val="Normal"/>
+        <w:jc w:val="both"/>
+        <w:rPr>
+          <w:sz w:val="36"/>
+          <w:szCs w:val="36"/>
+        </w:rPr>
+      </w:pPr>
+      <w:r>
+        <w:rPr>
+          <w:rFonts w:eastAsia="Times New Roman" w:cs="Times New Roman" w:ascii="Garamond" w:hAnsi="Garamond"/>
+          <w:color w:val="000000"/>
+          <w:kern w:val="0"/>
+          <w:sz w:val="36"/>
+          <w:szCs w:val="36"/>
+          <w:shd w:fill="auto" w:val="clear"/>
+          <w:lang w:val="en-US" w:eastAsia="zh-CN" w:bidi="hi-IN"/>
+        </w:rPr>
+        <w:t>2. A parábola do amigo importuno: por que ela aparece aqui?</w:t>
+      </w:r>
+    </w:p>
+    <w:p>
+      <w:pPr>
+        <w:pStyle w:val="Normal"/>
+        <w:jc w:val="both"/>
+        <w:rPr>
+          <w:sz w:val="36"/>
+          <w:szCs w:val="36"/>
+        </w:rPr>
+      </w:pPr>
+      <w:r>
+        <w:rPr/>
+      </w:r>
+    </w:p>
+    <w:p>
+      <w:pPr>
+        <w:pStyle w:val="Normal"/>
+        <w:jc w:val="both"/>
+        <w:rPr>
+          <w:sz w:val="36"/>
+          <w:szCs w:val="36"/>
+        </w:rPr>
+      </w:pPr>
+      <w:r>
+        <w:rPr>
+          <w:rFonts w:eastAsia="Times New Roman" w:cs="Times New Roman" w:ascii="Garamond" w:hAnsi="Garamond"/>
+          <w:color w:val="000000"/>
+          <w:kern w:val="0"/>
+          <w:sz w:val="36"/>
+          <w:szCs w:val="36"/>
+          <w:shd w:fill="auto" w:val="clear"/>
+          <w:lang w:val="en-US" w:eastAsia="zh-CN" w:bidi="hi-IN"/>
+        </w:rPr>
+        <w:t>A parábola do homem que bate à porta do amigo à meia-noite pedindo três pães não é um enfeite narrativo. Ela cumpre três funções claras:</w:t>
+      </w:r>
+    </w:p>
+    <w:p>
+      <w:pPr>
+        <w:pStyle w:val="Normal"/>
+        <w:jc w:val="both"/>
+        <w:rPr>
+          <w:sz w:val="36"/>
+          <w:szCs w:val="36"/>
+        </w:rPr>
+      </w:pPr>
+      <w:r>
+        <w:rPr/>
+      </w:r>
+    </w:p>
+    <w:p>
+      <w:pPr>
+        <w:pStyle w:val="Normal"/>
+        <w:jc w:val="both"/>
+        <w:rPr>
+          <w:sz w:val="36"/>
+          <w:szCs w:val="36"/>
+        </w:rPr>
+      </w:pPr>
+      <w:r>
+        <w:rPr>
+          <w:rFonts w:eastAsia="Times New Roman" w:cs="Times New Roman" w:ascii="Garamond" w:hAnsi="Garamond"/>
+          <w:color w:val="000000"/>
+          <w:kern w:val="0"/>
+          <w:sz w:val="36"/>
+          <w:szCs w:val="36"/>
+          <w:shd w:fill="auto" w:val="clear"/>
+          <w:lang w:val="en-US" w:eastAsia="zh-CN" w:bidi="hi-IN"/>
+        </w:rPr>
+        <w:t xml:space="preserve">🔹 </w:t>
+      </w:r>
+      <w:r>
+        <w:rPr>
+          <w:rFonts w:eastAsia="Times New Roman" w:cs="Times New Roman" w:ascii="Garamond" w:hAnsi="Garamond"/>
+          <w:color w:val="000000"/>
+          <w:kern w:val="0"/>
+          <w:sz w:val="36"/>
+          <w:szCs w:val="36"/>
+          <w:shd w:fill="auto" w:val="clear"/>
+          <w:lang w:val="en-US" w:eastAsia="zh-CN" w:bidi="hi-IN"/>
+        </w:rPr>
+        <w:t>a) Ensinar perseverança consciente</w:t>
+      </w:r>
+    </w:p>
+    <w:p>
+      <w:pPr>
+        <w:pStyle w:val="Normal"/>
+        <w:jc w:val="both"/>
+        <w:rPr>
+          <w:sz w:val="36"/>
+          <w:szCs w:val="36"/>
+        </w:rPr>
+      </w:pPr>
+      <w:r>
+        <w:rPr/>
+      </w:r>
+    </w:p>
+    <w:p>
+      <w:pPr>
+        <w:pStyle w:val="Normal"/>
+        <w:jc w:val="both"/>
+        <w:rPr>
+          <w:sz w:val="36"/>
+          <w:szCs w:val="36"/>
+        </w:rPr>
+      </w:pPr>
+      <w:r>
+        <w:rPr>
+          <w:rFonts w:eastAsia="Times New Roman" w:cs="Times New Roman" w:ascii="Garamond" w:hAnsi="Garamond"/>
+          <w:color w:val="000000"/>
+          <w:kern w:val="0"/>
+          <w:sz w:val="36"/>
+          <w:szCs w:val="36"/>
+          <w:shd w:fill="auto" w:val="clear"/>
+          <w:lang w:val="en-US" w:eastAsia="zh-CN" w:bidi="hi-IN"/>
+        </w:rPr>
+        <w:t>O amigo atende não por amizade, mas por causa da insistência.</w:t>
+      </w:r>
+    </w:p>
+    <w:p>
+      <w:pPr>
+        <w:pStyle w:val="Normal"/>
+        <w:jc w:val="both"/>
+        <w:rPr>
+          <w:sz w:val="36"/>
+          <w:szCs w:val="36"/>
+        </w:rPr>
+      </w:pPr>
+      <w:r>
+        <w:rPr>
+          <w:rFonts w:eastAsia="Times New Roman" w:cs="Times New Roman" w:ascii="Garamond" w:hAnsi="Garamond"/>
+          <w:color w:val="000000"/>
+          <w:kern w:val="0"/>
+          <w:sz w:val="36"/>
+          <w:szCs w:val="36"/>
+          <w:shd w:fill="auto" w:val="clear"/>
+          <w:lang w:val="en-US" w:eastAsia="zh-CN" w:bidi="hi-IN"/>
+        </w:rPr>
+        <w:t>Jesus não está dizendo que Deus é relutante — está ensinando que a prece verdadeira não é desistente, nem superficial.</w:t>
+      </w:r>
+    </w:p>
+    <w:p>
+      <w:pPr>
+        <w:pStyle w:val="Normal"/>
+        <w:jc w:val="both"/>
+        <w:rPr>
+          <w:sz w:val="36"/>
+          <w:szCs w:val="36"/>
+        </w:rPr>
+      </w:pPr>
+      <w:r>
+        <w:rPr/>
+      </w:r>
+    </w:p>
+    <w:p>
+      <w:pPr>
+        <w:pStyle w:val="Normal"/>
+        <w:jc w:val="both"/>
+        <w:rPr>
+          <w:sz w:val="36"/>
+          <w:szCs w:val="36"/>
+        </w:rPr>
+      </w:pPr>
+      <w:r>
+        <w:rPr>
+          <w:rFonts w:eastAsia="Times New Roman" w:cs="Times New Roman" w:ascii="Garamond" w:hAnsi="Garamond"/>
+          <w:color w:val="000000"/>
+          <w:kern w:val="0"/>
+          <w:sz w:val="36"/>
+          <w:szCs w:val="36"/>
+          <w:shd w:fill="auto" w:val="clear"/>
+          <w:lang w:val="en-US" w:eastAsia="zh-CN" w:bidi="hi-IN"/>
+        </w:rPr>
+        <w:t xml:space="preserve">🔹 </w:t>
+      </w:r>
+      <w:r>
+        <w:rPr>
+          <w:rFonts w:eastAsia="Times New Roman" w:cs="Times New Roman" w:ascii="Garamond" w:hAnsi="Garamond"/>
+          <w:color w:val="000000"/>
+          <w:kern w:val="0"/>
+          <w:sz w:val="36"/>
+          <w:szCs w:val="36"/>
+          <w:shd w:fill="auto" w:val="clear"/>
+          <w:lang w:val="en-US" w:eastAsia="zh-CN" w:bidi="hi-IN"/>
+        </w:rPr>
+        <w:t>b) Mostrar que pedir envolve responsabilidade</w:t>
+      </w:r>
+    </w:p>
+    <w:p>
+      <w:pPr>
+        <w:pStyle w:val="Normal"/>
+        <w:jc w:val="both"/>
+        <w:rPr>
+          <w:sz w:val="36"/>
+          <w:szCs w:val="36"/>
+        </w:rPr>
+      </w:pPr>
+      <w:r>
+        <w:rPr/>
+      </w:r>
+    </w:p>
+    <w:p>
+      <w:pPr>
+        <w:pStyle w:val="Normal"/>
+        <w:jc w:val="both"/>
+        <w:rPr>
+          <w:sz w:val="36"/>
+          <w:szCs w:val="36"/>
+        </w:rPr>
+      </w:pPr>
+      <w:r>
+        <w:rPr>
+          <w:rFonts w:eastAsia="Times New Roman" w:cs="Times New Roman" w:ascii="Garamond" w:hAnsi="Garamond"/>
+          <w:color w:val="000000"/>
+          <w:kern w:val="0"/>
+          <w:sz w:val="36"/>
+          <w:szCs w:val="36"/>
+          <w:shd w:fill="auto" w:val="clear"/>
+          <w:lang w:val="en-US" w:eastAsia="zh-CN" w:bidi="hi-IN"/>
+        </w:rPr>
+        <w:t>O pedido não é egoísta:</w:t>
+      </w:r>
+    </w:p>
+    <w:p>
+      <w:pPr>
+        <w:pStyle w:val="Normal"/>
+        <w:jc w:val="both"/>
+        <w:rPr>
+          <w:sz w:val="36"/>
+          <w:szCs w:val="36"/>
+        </w:rPr>
+      </w:pPr>
+      <w:r>
+        <w:rPr/>
+      </w:r>
+    </w:p>
+    <w:p>
+      <w:pPr>
+        <w:pStyle w:val="Normal"/>
+        <w:jc w:val="both"/>
+        <w:rPr>
+          <w:sz w:val="36"/>
+          <w:szCs w:val="36"/>
+        </w:rPr>
+      </w:pPr>
+      <w:r>
+        <w:rPr>
+          <w:rFonts w:eastAsia="Times New Roman" w:cs="Times New Roman" w:ascii="Garamond" w:hAnsi="Garamond"/>
+          <w:color w:val="000000"/>
+          <w:kern w:val="0"/>
+          <w:sz w:val="36"/>
+          <w:szCs w:val="36"/>
+          <w:shd w:fill="auto" w:val="clear"/>
+          <w:lang w:val="en-US" w:eastAsia="zh-CN" w:bidi="hi-IN"/>
+        </w:rPr>
+        <w:t>os pães não são para quem pede,</w:t>
+      </w:r>
+    </w:p>
+    <w:p>
+      <w:pPr>
+        <w:pStyle w:val="Normal"/>
+        <w:jc w:val="both"/>
+        <w:rPr>
+          <w:sz w:val="36"/>
+          <w:szCs w:val="36"/>
+        </w:rPr>
+      </w:pPr>
+      <w:r>
+        <w:rPr/>
+      </w:r>
+    </w:p>
+    <w:p>
+      <w:pPr>
+        <w:pStyle w:val="Normal"/>
+        <w:jc w:val="both"/>
+        <w:rPr>
+          <w:sz w:val="36"/>
+          <w:szCs w:val="36"/>
+        </w:rPr>
+      </w:pPr>
+      <w:r>
+        <w:rPr>
+          <w:rFonts w:eastAsia="Times New Roman" w:cs="Times New Roman" w:ascii="Garamond" w:hAnsi="Garamond"/>
+          <w:color w:val="000000"/>
+          <w:kern w:val="0"/>
+          <w:sz w:val="36"/>
+          <w:szCs w:val="36"/>
+          <w:shd w:fill="auto" w:val="clear"/>
+          <w:lang w:val="en-US" w:eastAsia="zh-CN" w:bidi="hi-IN"/>
+        </w:rPr>
+        <w:t>são para atender outro amigo.</w:t>
+      </w:r>
+    </w:p>
+    <w:p>
+      <w:pPr>
+        <w:pStyle w:val="Normal"/>
+        <w:jc w:val="both"/>
+        <w:rPr>
+          <w:sz w:val="36"/>
+          <w:szCs w:val="36"/>
+        </w:rPr>
+      </w:pPr>
+      <w:r>
+        <w:rPr/>
+      </w:r>
+    </w:p>
+    <w:p>
+      <w:pPr>
+        <w:pStyle w:val="Normal"/>
+        <w:jc w:val="both"/>
+        <w:rPr>
+          <w:sz w:val="36"/>
+          <w:szCs w:val="36"/>
+        </w:rPr>
+      </w:pPr>
+      <w:r>
+        <w:rPr>
+          <w:rFonts w:eastAsia="Times New Roman" w:cs="Times New Roman" w:ascii="Garamond" w:hAnsi="Garamond"/>
+          <w:color w:val="000000"/>
+          <w:kern w:val="0"/>
+          <w:sz w:val="36"/>
+          <w:szCs w:val="36"/>
+          <w:shd w:fill="auto" w:val="clear"/>
+          <w:lang w:val="en-US" w:eastAsia="zh-CN" w:bidi="hi-IN"/>
+        </w:rPr>
+        <w:t>Isso é muito significativo e se alinha perfeitamente com Emmanuel:</w:t>
+      </w:r>
+    </w:p>
+    <w:p>
+      <w:pPr>
+        <w:pStyle w:val="Normal"/>
+        <w:jc w:val="both"/>
+        <w:rPr>
+          <w:sz w:val="36"/>
+          <w:szCs w:val="36"/>
+        </w:rPr>
+      </w:pPr>
+      <w:r>
+        <w:rPr/>
+      </w:r>
+    </w:p>
+    <w:p>
+      <w:pPr>
+        <w:pStyle w:val="Normal"/>
+        <w:jc w:val="both"/>
+        <w:rPr>
+          <w:sz w:val="36"/>
+          <w:szCs w:val="36"/>
+        </w:rPr>
+      </w:pPr>
+      <w:r>
+        <w:rPr>
+          <w:rFonts w:eastAsia="Times New Roman" w:cs="Times New Roman" w:ascii="Garamond" w:hAnsi="Garamond"/>
+          <w:color w:val="000000"/>
+          <w:kern w:val="0"/>
+          <w:sz w:val="36"/>
+          <w:szCs w:val="36"/>
+          <w:shd w:fill="auto" w:val="clear"/>
+          <w:lang w:val="en-US" w:eastAsia="zh-CN" w:bidi="hi-IN"/>
+        </w:rPr>
+        <w:t>o pedido legítimo nasce de uma necessidade real e justa.</w:t>
+      </w:r>
+    </w:p>
+    <w:p>
+      <w:pPr>
+        <w:pStyle w:val="Normal"/>
+        <w:jc w:val="both"/>
+        <w:rPr>
+          <w:sz w:val="36"/>
+          <w:szCs w:val="36"/>
+        </w:rPr>
+      </w:pPr>
+      <w:r>
+        <w:rPr/>
+      </w:r>
+    </w:p>
+    <w:p>
+      <w:pPr>
+        <w:pStyle w:val="Normal"/>
+        <w:jc w:val="both"/>
+        <w:rPr>
+          <w:sz w:val="36"/>
+          <w:szCs w:val="36"/>
+        </w:rPr>
+      </w:pPr>
+      <w:r>
+        <w:rPr>
+          <w:rFonts w:eastAsia="Times New Roman" w:cs="Times New Roman" w:ascii="Garamond" w:hAnsi="Garamond"/>
+          <w:color w:val="000000"/>
+          <w:kern w:val="0"/>
+          <w:sz w:val="36"/>
+          <w:szCs w:val="36"/>
+          <w:shd w:fill="auto" w:val="clear"/>
+          <w:lang w:val="en-US" w:eastAsia="zh-CN" w:bidi="hi-IN"/>
+        </w:rPr>
+        <w:t xml:space="preserve">🔹 </w:t>
+      </w:r>
+      <w:r>
+        <w:rPr>
+          <w:rFonts w:eastAsia="Times New Roman" w:cs="Times New Roman" w:ascii="Garamond" w:hAnsi="Garamond"/>
+          <w:color w:val="000000"/>
+          <w:kern w:val="0"/>
+          <w:sz w:val="36"/>
+          <w:szCs w:val="36"/>
+          <w:shd w:fill="auto" w:val="clear"/>
+          <w:lang w:val="en-US" w:eastAsia="zh-CN" w:bidi="hi-IN"/>
+        </w:rPr>
+        <w:t>c) Preparar o discípulo para a ação</w:t>
+      </w:r>
+    </w:p>
+    <w:p>
+      <w:pPr>
+        <w:pStyle w:val="Normal"/>
+        <w:jc w:val="both"/>
+        <w:rPr>
+          <w:sz w:val="36"/>
+          <w:szCs w:val="36"/>
+        </w:rPr>
+      </w:pPr>
+      <w:r>
+        <w:rPr/>
+      </w:r>
+    </w:p>
+    <w:p>
+      <w:pPr>
+        <w:pStyle w:val="Normal"/>
+        <w:jc w:val="both"/>
+        <w:rPr>
+          <w:sz w:val="36"/>
+          <w:szCs w:val="36"/>
+        </w:rPr>
+      </w:pPr>
+      <w:r>
+        <w:rPr>
+          <w:rFonts w:eastAsia="Times New Roman" w:cs="Times New Roman" w:ascii="Garamond" w:hAnsi="Garamond"/>
+          <w:color w:val="000000"/>
+          <w:kern w:val="0"/>
+          <w:sz w:val="36"/>
+          <w:szCs w:val="36"/>
+          <w:shd w:fill="auto" w:val="clear"/>
+          <w:lang w:val="en-US" w:eastAsia="zh-CN" w:bidi="hi-IN"/>
+        </w:rPr>
+        <w:t>O homem:</w:t>
+      </w:r>
+    </w:p>
+    <w:p>
+      <w:pPr>
+        <w:pStyle w:val="Normal"/>
+        <w:jc w:val="both"/>
+        <w:rPr>
+          <w:sz w:val="36"/>
+          <w:szCs w:val="36"/>
+        </w:rPr>
+      </w:pPr>
+      <w:r>
+        <w:rPr/>
+      </w:r>
+    </w:p>
+    <w:p>
+      <w:pPr>
+        <w:pStyle w:val="Normal"/>
+        <w:jc w:val="both"/>
+        <w:rPr>
+          <w:sz w:val="36"/>
+          <w:szCs w:val="36"/>
+        </w:rPr>
+      </w:pPr>
+      <w:r>
+        <w:rPr>
+          <w:rFonts w:eastAsia="Times New Roman" w:cs="Times New Roman" w:ascii="Garamond" w:hAnsi="Garamond"/>
+          <w:color w:val="000000"/>
+          <w:kern w:val="0"/>
+          <w:sz w:val="36"/>
+          <w:szCs w:val="36"/>
+          <w:shd w:fill="auto" w:val="clear"/>
+          <w:lang w:val="en-US" w:eastAsia="zh-CN" w:bidi="hi-IN"/>
+        </w:rPr>
+        <w:t>levanta-se,</w:t>
+      </w:r>
+    </w:p>
+    <w:p>
+      <w:pPr>
+        <w:pStyle w:val="Normal"/>
+        <w:jc w:val="both"/>
+        <w:rPr>
+          <w:sz w:val="36"/>
+          <w:szCs w:val="36"/>
+        </w:rPr>
+      </w:pPr>
+      <w:r>
+        <w:rPr/>
+      </w:r>
+    </w:p>
+    <w:p>
+      <w:pPr>
+        <w:pStyle w:val="Normal"/>
+        <w:jc w:val="both"/>
+        <w:rPr>
+          <w:sz w:val="36"/>
+          <w:szCs w:val="36"/>
+        </w:rPr>
+      </w:pPr>
+      <w:r>
+        <w:rPr>
+          <w:rFonts w:eastAsia="Times New Roman" w:cs="Times New Roman" w:ascii="Garamond" w:hAnsi="Garamond"/>
+          <w:color w:val="000000"/>
+          <w:kern w:val="0"/>
+          <w:sz w:val="36"/>
+          <w:szCs w:val="36"/>
+          <w:shd w:fill="auto" w:val="clear"/>
+          <w:lang w:val="en-US" w:eastAsia="zh-CN" w:bidi="hi-IN"/>
+        </w:rPr>
+        <w:t>atravessa a noite,</w:t>
+      </w:r>
+    </w:p>
+    <w:p>
+      <w:pPr>
+        <w:pStyle w:val="Normal"/>
+        <w:jc w:val="both"/>
+        <w:rPr>
+          <w:sz w:val="36"/>
+          <w:szCs w:val="36"/>
+        </w:rPr>
+      </w:pPr>
+      <w:r>
+        <w:rPr/>
+      </w:r>
+    </w:p>
+    <w:p>
+      <w:pPr>
+        <w:pStyle w:val="Normal"/>
+        <w:jc w:val="both"/>
+        <w:rPr>
+          <w:sz w:val="36"/>
+          <w:szCs w:val="36"/>
+        </w:rPr>
+      </w:pPr>
+      <w:r>
+        <w:rPr>
+          <w:rFonts w:eastAsia="Times New Roman" w:cs="Times New Roman" w:ascii="Garamond" w:hAnsi="Garamond"/>
+          <w:color w:val="000000"/>
+          <w:kern w:val="0"/>
+          <w:sz w:val="36"/>
+          <w:szCs w:val="36"/>
+          <w:shd w:fill="auto" w:val="clear"/>
+          <w:lang w:val="en-US" w:eastAsia="zh-CN" w:bidi="hi-IN"/>
+        </w:rPr>
+        <w:t>bate à porta,</w:t>
+      </w:r>
+    </w:p>
+    <w:p>
+      <w:pPr>
+        <w:pStyle w:val="Normal"/>
+        <w:jc w:val="both"/>
+        <w:rPr>
+          <w:sz w:val="36"/>
+          <w:szCs w:val="36"/>
+        </w:rPr>
+      </w:pPr>
+      <w:r>
+        <w:rPr/>
+      </w:r>
+    </w:p>
+    <w:p>
+      <w:pPr>
+        <w:pStyle w:val="Normal"/>
+        <w:jc w:val="both"/>
+        <w:rPr>
+          <w:sz w:val="36"/>
+          <w:szCs w:val="36"/>
+        </w:rPr>
+      </w:pPr>
+      <w:r>
+        <w:rPr>
+          <w:rFonts w:eastAsia="Times New Roman" w:cs="Times New Roman" w:ascii="Garamond" w:hAnsi="Garamond"/>
+          <w:color w:val="000000"/>
+          <w:kern w:val="0"/>
+          <w:sz w:val="36"/>
+          <w:szCs w:val="36"/>
+          <w:shd w:fill="auto" w:val="clear"/>
+          <w:lang w:val="en-US" w:eastAsia="zh-CN" w:bidi="hi-IN"/>
+        </w:rPr>
+        <w:t>insiste.</w:t>
+      </w:r>
+    </w:p>
+    <w:p>
+      <w:pPr>
+        <w:pStyle w:val="Normal"/>
+        <w:jc w:val="both"/>
+        <w:rPr>
+          <w:sz w:val="36"/>
+          <w:szCs w:val="36"/>
+        </w:rPr>
+      </w:pPr>
+      <w:r>
+        <w:rPr/>
+      </w:r>
+    </w:p>
+    <w:p>
+      <w:pPr>
+        <w:pStyle w:val="Normal"/>
+        <w:jc w:val="both"/>
+        <w:rPr>
+          <w:sz w:val="36"/>
+          <w:szCs w:val="36"/>
+        </w:rPr>
+      </w:pPr>
+      <w:r>
+        <w:rPr>
+          <w:rFonts w:eastAsia="Times New Roman" w:cs="Times New Roman" w:ascii="Garamond" w:hAnsi="Garamond"/>
+          <w:color w:val="000000"/>
+          <w:kern w:val="0"/>
+          <w:sz w:val="36"/>
+          <w:szCs w:val="36"/>
+          <w:shd w:fill="auto" w:val="clear"/>
+          <w:lang w:val="en-US" w:eastAsia="zh-CN" w:bidi="hi-IN"/>
+        </w:rPr>
+        <w:t>Ou seja: ele age.</w:t>
+      </w:r>
+    </w:p>
+    <w:p>
+      <w:pPr>
+        <w:pStyle w:val="Normal"/>
+        <w:jc w:val="both"/>
+        <w:rPr>
+          <w:sz w:val="36"/>
+          <w:szCs w:val="36"/>
+        </w:rPr>
+      </w:pPr>
+      <w:r>
+        <w:rPr/>
+      </w:r>
+    </w:p>
+    <w:p>
+      <w:pPr>
+        <w:pStyle w:val="Normal"/>
+        <w:jc w:val="both"/>
+        <w:rPr>
+          <w:sz w:val="36"/>
+          <w:szCs w:val="36"/>
+        </w:rPr>
+      </w:pPr>
+      <w:r>
+        <w:rPr>
+          <w:rFonts w:eastAsia="Times New Roman" w:cs="Times New Roman" w:ascii="Garamond" w:hAnsi="Garamond"/>
+          <w:color w:val="000000"/>
+          <w:kern w:val="0"/>
+          <w:sz w:val="36"/>
+          <w:szCs w:val="36"/>
+          <w:shd w:fill="auto" w:val="clear"/>
+          <w:lang w:val="en-US" w:eastAsia="zh-CN" w:bidi="hi-IN"/>
+        </w:rPr>
+        <w:t>Jesus ensina, de forma indireta, que a oração não substitui o movimento da alma — ela o impulsiona.</w:t>
+      </w:r>
+    </w:p>
+    <w:p>
+      <w:pPr>
+        <w:pStyle w:val="Normal"/>
+        <w:jc w:val="both"/>
+        <w:rPr>
+          <w:sz w:val="36"/>
+          <w:szCs w:val="36"/>
+        </w:rPr>
+      </w:pPr>
+      <w:r>
+        <w:rPr/>
+      </w:r>
+    </w:p>
+    <w:p>
+      <w:pPr>
+        <w:pStyle w:val="Normal"/>
+        <w:jc w:val="both"/>
+        <w:rPr>
+          <w:sz w:val="36"/>
+          <w:szCs w:val="36"/>
+        </w:rPr>
+      </w:pPr>
+      <w:r>
+        <w:rPr/>
+      </w:r>
+    </w:p>
+    <w:p>
+      <w:pPr>
+        <w:pStyle w:val="Normal"/>
+        <w:jc w:val="both"/>
+        <w:rPr>
+          <w:color w:val="1C99E0"/>
+        </w:rPr>
+      </w:pPr>
+      <w:r>
+        <w:rPr>
+          <w:rFonts w:eastAsia="Times New Roman" w:cs="Times New Roman" w:ascii="Garamond" w:hAnsi="Garamond"/>
+          <w:color w:val="1C99E0"/>
+          <w:kern w:val="0"/>
+          <w:sz w:val="36"/>
+          <w:szCs w:val="36"/>
+          <w:shd w:fill="auto" w:val="clear"/>
+          <w:lang w:val="en-US" w:eastAsia="zh-CN" w:bidi="hi-IN"/>
+        </w:rPr>
+        <w:t>[ Término de tópico a ser desenvolvido ]</w:t>
+      </w:r>
+    </w:p>
+    <w:p>
+      <w:pPr>
+        <w:pStyle w:val="Normal"/>
+        <w:jc w:val="both"/>
+        <w:rPr>
+          <w:rFonts w:ascii="Garamond" w:hAnsi="Garamond" w:eastAsia="Times New Roman" w:cs="Times New Roman"/>
+          <w:kern w:val="0"/>
+          <w:sz w:val="36"/>
+          <w:szCs w:val="36"/>
+          <w:shd w:fill="auto" w:val="clear"/>
+          <w:lang w:val="en-US" w:eastAsia="zh-CN" w:bidi="hi-IN"/>
+        </w:rPr>
+      </w:pPr>
+      <w:r>
+        <w:rPr>
+          <w:color w:val="0369A3"/>
+        </w:rPr>
+      </w:r>
+    </w:p>
+    <w:p>
+      <w:pPr>
+        <w:pStyle w:val="Normal"/>
+        <w:jc w:val="both"/>
+        <w:rPr>
+          <w:sz w:val="36"/>
+          <w:szCs w:val="36"/>
         </w:rPr>
       </w:pPr>
       <w:r>
@@ -793,7 +3163,10 @@
         </w:rPr>
       </w:pPr>
       <w:r>
-        <w:rPr/>
+        <w:rPr>
+          <w:color w:val="1C99E0"/>
+          <w:shd w:fill="auto" w:val="clear"/>
+        </w:rPr>
       </w:r>
     </w:p>
     <w:p>
@@ -1357,7 +3730,12 @@
       </w:pPr>
       <w:r>
         <w:rPr>
-          <w:color w:val="auto"/>
+          <w:rFonts w:eastAsia="Times New Roman" w:cs="Times New Roman" w:ascii="Garamond" w:hAnsi="Garamond"/>
+          <w:kern w:val="0"/>
+          <w:sz w:val="36"/>
+          <w:szCs w:val="36"/>
+          <w:shd w:fill="auto" w:val="clear"/>
+          <w:lang w:val="en-US" w:eastAsia="zh-CN" w:bidi="hi-IN"/>
         </w:rPr>
       </w:r>
     </w:p>
@@ -1416,21 +3794,10 @@
         </w:rPr>
       </w:pPr>
       <w:r>
-        <w:rPr/>
-      </w:r>
-    </w:p>
-    <w:p>
-      <w:pPr>
-        <w:pStyle w:val="Normal"/>
-        <w:jc w:val="both"/>
         <w:rPr>
           <w:color w:val="1C99E0"/>
-          <w:highlight w:val="none"/>
-          <w:shd w:fill="auto" w:val="clear"/>
-        </w:rPr>
-      </w:pPr>
-      <w:r>
-        <w:rPr/>
+          <w:shd w:fill="auto" w:val="clear"/>
+        </w:rPr>
       </w:r>
     </w:p>
     <w:p>
@@ -1444,7 +3811,27 @@
         </w:rPr>
       </w:pPr>
       <w:r>
-        <w:rPr/>
+        <w:rPr>
+          <w:color w:val="1C99E0"/>
+          <w:shd w:fill="auto" w:val="clear"/>
+        </w:rPr>
+      </w:r>
+    </w:p>
+    <w:p>
+      <w:pPr>
+        <w:pStyle w:val="Normal"/>
+        <w:jc w:val="both"/>
+        <w:rPr>
+          <w:color w:val="1C99E0"/>
+          <w:highlight w:val="none"/>
+          <w:shd w:fill="auto" w:val="clear"/>
+        </w:rPr>
+      </w:pPr>
+      <w:r>
+        <w:rPr>
+          <w:color w:val="1C99E0"/>
+          <w:shd w:fill="auto" w:val="clear"/>
+        </w:rPr>
       </w:r>
     </w:p>
     <w:p>
@@ -3104,7 +5491,7 @@
         <w:bCs/>
         <w:rFonts w:ascii="Garamond" w:hAnsi="Garamond"/>
       </w:rPr>
-      <w:t>18</w:t>
+      <w:t>29</w:t>
     </w:r>
     <w:r>
       <w:rPr>

</xml_diff>

<commit_message>
15/02/2026 - 21:08 h
</commit_message>
<xml_diff>
--- a/Pedi e obtereis/Pedi e obtereis.docx
+++ b/Pedi e obtereis/Pedi e obtereis.docx
@@ -128,6 +128,258 @@
         </w:rPr>
       </w:pPr>
       <w:r>
+        <w:rPr>
+          <w:sz w:val="36"/>
+          <w:szCs w:val="36"/>
+        </w:rPr>
+      </w:r>
+    </w:p>
+    <w:p>
+      <w:pPr>
+        <w:pStyle w:val="Normal"/>
+        <w:jc w:val="both"/>
+        <w:rPr>
+          <w:sz w:val="36"/>
+          <w:szCs w:val="36"/>
+        </w:rPr>
+      </w:pPr>
+      <w:r>
+        <w:rPr>
+          <w:rFonts w:eastAsia="Times New Roman" w:cs="Times New Roman" w:ascii="Garamond" w:hAnsi="Garamond"/>
+          <w:color w:val="000000"/>
+          <w:kern w:val="0"/>
+          <w:sz w:val="36"/>
+          <w:szCs w:val="36"/>
+          <w:shd w:fill="auto" w:val="clear"/>
+          <w:lang w:val="en-US" w:eastAsia="zh-CN" w:bidi="hi-IN"/>
+        </w:rPr>
+        <w:t>Quando Jesus falou sobre odiar pai e mãe, deixar aos mortos o cuidado de enterrar seus mortos ou ainda abandonar pai, mãe e filhos, Ele causou grande estranheza. Isso acontece</w:t>
+      </w:r>
+      <w:r>
+        <w:rPr>
+          <w:rFonts w:eastAsia="Times New Roman" w:cs="Times New Roman" w:ascii="Garamond" w:hAnsi="Garamond"/>
+          <w:color w:val="000000"/>
+          <w:kern w:val="0"/>
+          <w:sz w:val="36"/>
+          <w:szCs w:val="36"/>
+          <w:shd w:fill="auto" w:val="clear"/>
+          <w:lang w:val="en-US" w:eastAsia="zh-CN" w:bidi="hi-IN"/>
+        </w:rPr>
+        <w:t>u e ainda acontece</w:t>
+      </w:r>
+      <w:r>
+        <w:rPr>
+          <w:rFonts w:eastAsia="Times New Roman" w:cs="Times New Roman" w:ascii="Garamond" w:hAnsi="Garamond"/>
+          <w:color w:val="000000"/>
+          <w:kern w:val="0"/>
+          <w:sz w:val="36"/>
+          <w:szCs w:val="36"/>
+          <w:shd w:fill="auto" w:val="clear"/>
+          <w:lang w:val="en-US" w:eastAsia="zh-CN" w:bidi="hi-IN"/>
+        </w:rPr>
+        <w:t xml:space="preserve"> porque, quando esses ensinamentos são interpretados de forma superficial, passam a impressão de que Jesus estaria contrariando tudo aquilo que </w:t>
+      </w:r>
+      <w:r>
+        <w:rPr>
+          <w:rFonts w:eastAsia="Times New Roman" w:cs="Times New Roman" w:ascii="Garamond" w:hAnsi="Garamond"/>
+          <w:color w:val="000000"/>
+          <w:kern w:val="0"/>
+          <w:sz w:val="36"/>
+          <w:szCs w:val="36"/>
+          <w:shd w:fill="auto" w:val="clear"/>
+          <w:lang w:val="en-US" w:eastAsia="zh-CN" w:bidi="hi-IN"/>
+        </w:rPr>
+        <w:t xml:space="preserve">Ele </w:t>
+      </w:r>
+      <w:r>
+        <w:rPr>
+          <w:rFonts w:eastAsia="Times New Roman" w:cs="Times New Roman" w:ascii="Garamond" w:hAnsi="Garamond"/>
+          <w:color w:val="000000"/>
+          <w:kern w:val="0"/>
+          <w:sz w:val="36"/>
+          <w:szCs w:val="36"/>
+          <w:shd w:fill="auto" w:val="clear"/>
+          <w:lang w:val="en-US" w:eastAsia="zh-CN" w:bidi="hi-IN"/>
+        </w:rPr>
+        <w:t>ensinou anteriormente sobre amor, caridade e responsabilidade.</w:t>
+      </w:r>
+    </w:p>
+    <w:p>
+      <w:pPr>
+        <w:pStyle w:val="Normal"/>
+        <w:jc w:val="both"/>
+        <w:rPr>
+          <w:sz w:val="36"/>
+          <w:szCs w:val="36"/>
+        </w:rPr>
+      </w:pPr>
+      <w:r>
+        <w:rPr>
+          <w:sz w:val="36"/>
+          <w:szCs w:val="36"/>
+        </w:rPr>
+      </w:r>
+    </w:p>
+    <w:p>
+      <w:pPr>
+        <w:pStyle w:val="Normal"/>
+        <w:jc w:val="both"/>
+        <w:rPr>
+          <w:sz w:val="36"/>
+          <w:szCs w:val="36"/>
+        </w:rPr>
+      </w:pPr>
+      <w:r>
+        <w:rPr>
+          <w:rFonts w:eastAsia="Times New Roman" w:cs="Times New Roman" w:ascii="Garamond" w:hAnsi="Garamond"/>
+          <w:color w:val="000000"/>
+          <w:kern w:val="0"/>
+          <w:sz w:val="36"/>
+          <w:szCs w:val="36"/>
+          <w:shd w:fill="auto" w:val="clear"/>
+          <w:lang w:val="en-US" w:eastAsia="zh-CN" w:bidi="hi-IN"/>
+        </w:rPr>
+        <w:t>No entanto, o “</w:t>
+      </w:r>
+      <w:r>
+        <w:rPr>
+          <w:rFonts w:eastAsia="Times New Roman" w:cs="Times New Roman" w:ascii="Garamond" w:hAnsi="Garamond"/>
+          <w:i/>
+          <w:iCs/>
+          <w:color w:val="000000"/>
+          <w:kern w:val="0"/>
+          <w:sz w:val="36"/>
+          <w:szCs w:val="36"/>
+          <w:shd w:fill="auto" w:val="clear"/>
+          <w:lang w:val="en-US" w:eastAsia="zh-CN" w:bidi="hi-IN"/>
+        </w:rPr>
+        <w:t>Pedi e obtereis</w:t>
+      </w:r>
+      <w:r>
+        <w:rPr>
+          <w:rFonts w:eastAsia="Times New Roman" w:cs="Times New Roman" w:ascii="Garamond" w:hAnsi="Garamond"/>
+          <w:color w:val="000000"/>
+          <w:kern w:val="0"/>
+          <w:sz w:val="36"/>
+          <w:szCs w:val="36"/>
+          <w:shd w:fill="auto" w:val="clear"/>
+          <w:lang w:val="en-US" w:eastAsia="zh-CN" w:bidi="hi-IN"/>
+        </w:rPr>
+        <w:t>” se enquadra em uma outra categoria de ensinamentos — a mesma em que está, por exemplo, o “</w:t>
+      </w:r>
+      <w:r>
+        <w:rPr>
+          <w:rFonts w:eastAsia="Times New Roman" w:cs="Times New Roman" w:ascii="Garamond" w:hAnsi="Garamond"/>
+          <w:i/>
+          <w:iCs/>
+          <w:color w:val="000000"/>
+          <w:kern w:val="0"/>
+          <w:sz w:val="36"/>
+          <w:szCs w:val="36"/>
+          <w:shd w:fill="auto" w:val="clear"/>
+          <w:lang w:val="en-US" w:eastAsia="zh-CN" w:bidi="hi-IN"/>
+        </w:rPr>
+        <w:t>Observai os pássaros do céu</w:t>
+      </w:r>
+      <w:r>
+        <w:rPr>
+          <w:rFonts w:eastAsia="Times New Roman" w:cs="Times New Roman" w:ascii="Garamond" w:hAnsi="Garamond"/>
+          <w:color w:val="000000"/>
+          <w:kern w:val="0"/>
+          <w:sz w:val="36"/>
+          <w:szCs w:val="36"/>
+          <w:shd w:fill="auto" w:val="clear"/>
+          <w:lang w:val="en-US" w:eastAsia="zh-CN" w:bidi="hi-IN"/>
+        </w:rPr>
+        <w:t>”, quando Jesus nos orienta a não nos preocuparmos excessivamente com o dia de amanhã, afirmando que Deus nos proverá com tudo o que for necessário.</w:t>
+      </w:r>
+    </w:p>
+    <w:p>
+      <w:pPr>
+        <w:pStyle w:val="Normal"/>
+        <w:jc w:val="both"/>
+        <w:rPr>
+          <w:sz w:val="36"/>
+          <w:szCs w:val="36"/>
+        </w:rPr>
+      </w:pPr>
+      <w:r>
+        <w:rPr>
+          <w:sz w:val="36"/>
+          <w:szCs w:val="36"/>
+        </w:rPr>
+      </w:r>
+    </w:p>
+    <w:p>
+      <w:pPr>
+        <w:pStyle w:val="Normal"/>
+        <w:jc w:val="both"/>
+        <w:rPr>
+          <w:sz w:val="36"/>
+          <w:szCs w:val="36"/>
+        </w:rPr>
+      </w:pPr>
+      <w:r>
+        <w:rPr>
+          <w:rFonts w:eastAsia="Times New Roman" w:cs="Times New Roman" w:ascii="Garamond" w:hAnsi="Garamond"/>
+          <w:color w:val="000000"/>
+          <w:kern w:val="0"/>
+          <w:sz w:val="36"/>
+          <w:szCs w:val="36"/>
+          <w:shd w:fill="auto" w:val="clear"/>
+          <w:lang w:val="en-US" w:eastAsia="zh-CN" w:bidi="hi-IN"/>
+        </w:rPr>
+        <w:t>De modo geral, costumamos interpretar esses ensinamentos como se nenhum esforço fosse exigido de nossa parte, como se bastasse apenas pedir, ou simplesmente esperar, para que Deus nos conceda tudo aquilo que desejamos.</w:t>
+      </w:r>
+    </w:p>
+    <w:p>
+      <w:pPr>
+        <w:pStyle w:val="Normal"/>
+        <w:jc w:val="both"/>
+        <w:rPr>
+          <w:sz w:val="36"/>
+          <w:szCs w:val="36"/>
+        </w:rPr>
+      </w:pPr>
+      <w:r>
+        <w:rPr>
+          <w:sz w:val="36"/>
+          <w:szCs w:val="36"/>
+        </w:rPr>
+      </w:r>
+    </w:p>
+    <w:p>
+      <w:pPr>
+        <w:pStyle w:val="Normal"/>
+        <w:jc w:val="both"/>
+        <w:rPr>
+          <w:sz w:val="36"/>
+          <w:szCs w:val="36"/>
+        </w:rPr>
+      </w:pPr>
+      <w:r>
+        <w:rPr>
+          <w:rFonts w:eastAsia="Times New Roman" w:cs="Times New Roman" w:ascii="Garamond" w:hAnsi="Garamond"/>
+          <w:color w:val="000000"/>
+          <w:kern w:val="0"/>
+          <w:sz w:val="36"/>
+          <w:szCs w:val="36"/>
+          <w:shd w:fill="auto" w:val="clear"/>
+          <w:lang w:val="en-US" w:eastAsia="zh-CN" w:bidi="hi-IN"/>
+        </w:rPr>
+        <w:t xml:space="preserve">Talvez essas interpretações equivocadas persistam porque, no fundo, elas nos parecem mais cômodas. É mais confortável imaginar um Deus que concede tudo sem exigir esforço, transformação ou compromisso de nossa parte. </w:t>
+      </w:r>
+    </w:p>
+    <w:p>
+      <w:pPr>
+        <w:pStyle w:val="Normal"/>
+        <w:jc w:val="both"/>
+        <w:rPr>
+          <w:sz w:val="36"/>
+          <w:szCs w:val="36"/>
+        </w:rPr>
+      </w:pPr>
+      <w:r>
         <w:rPr/>
       </w:r>
     </w:p>
@@ -150,16 +402,298 @@
           <w:shd w:fill="auto" w:val="clear"/>
           <w:lang w:val="en-US" w:eastAsia="zh-CN" w:bidi="hi-IN"/>
         </w:rPr>
-        <w:t>Quando Jesus falou sobre odiar pai e mãe, deixar aos mortos o cuidado de enterrar seus mortos ou ainda abandonar pai, mãe e filhos, Ele causou grande estranheza. Isso acontece porque, quando esses ensinamentos são interpretados de forma superficial, passam a impressão de que Jesus estaria contrariando tudo aquilo que ensinou anteriormente sobre amor, caridade e responsabilidade.</w:t>
-      </w:r>
-    </w:p>
-    <w:p>
-      <w:pPr>
-        <w:pStyle w:val="Normal"/>
-        <w:jc w:val="both"/>
-        <w:rPr>
-          <w:sz w:val="36"/>
-          <w:szCs w:val="36"/>
+        <w:t>Assim, transformamos ensinamentos profundos de Jesus em promessas de facilidade, quando na verdade eles nos convidam à responsabilidade, à confiança ativa e ao trabalho no bem.</w:t>
+      </w:r>
+    </w:p>
+    <w:p>
+      <w:pPr>
+        <w:pStyle w:val="Normal"/>
+        <w:jc w:val="both"/>
+        <w:rPr>
+          <w:sz w:val="36"/>
+          <w:szCs w:val="36"/>
+        </w:rPr>
+      </w:pPr>
+      <w:r>
+        <w:rPr>
+          <w:sz w:val="36"/>
+          <w:szCs w:val="36"/>
+        </w:rPr>
+      </w:r>
+    </w:p>
+    <w:p>
+      <w:pPr>
+        <w:pStyle w:val="Normal"/>
+        <w:jc w:val="both"/>
+        <w:rPr>
+          <w:sz w:val="36"/>
+          <w:szCs w:val="36"/>
+        </w:rPr>
+      </w:pPr>
+      <w:r>
+        <w:rPr>
+          <w:rFonts w:eastAsia="Times New Roman" w:cs="Times New Roman" w:ascii="Garamond" w:hAnsi="Garamond"/>
+          <w:color w:val="000000"/>
+          <w:kern w:val="0"/>
+          <w:sz w:val="36"/>
+          <w:szCs w:val="36"/>
+          <w:shd w:fill="auto" w:val="clear"/>
+          <w:lang w:val="en-US" w:eastAsia="zh-CN" w:bidi="hi-IN"/>
+        </w:rPr>
+        <w:t>E é justamente isso que veremos ao longo de nossas reflexões.</w:t>
+      </w:r>
+    </w:p>
+    <w:p>
+      <w:pPr>
+        <w:pStyle w:val="Normal"/>
+        <w:jc w:val="both"/>
+        <w:rPr>
+          <w:sz w:val="36"/>
+          <w:szCs w:val="36"/>
+        </w:rPr>
+      </w:pPr>
+      <w:r>
+        <w:rPr>
+          <w:rFonts w:eastAsia="Times New Roman" w:cs="Times New Roman" w:ascii="Garamond" w:hAnsi="Garamond"/>
+          <w:kern w:val="0"/>
+          <w:sz w:val="36"/>
+          <w:szCs w:val="36"/>
+          <w:shd w:fill="auto" w:val="clear"/>
+          <w:lang w:val="en-US" w:eastAsia="zh-CN" w:bidi="hi-IN"/>
+        </w:rPr>
+      </w:r>
+    </w:p>
+    <w:p>
+      <w:pPr>
+        <w:pStyle w:val="Normal"/>
+        <w:jc w:val="both"/>
+        <w:rPr>
+          <w:color w:val="auto"/>
+        </w:rPr>
+      </w:pPr>
+      <w:r>
+        <w:rPr>
+          <w:rFonts w:eastAsia="Times New Roman" w:cs="Times New Roman" w:ascii="Garamond" w:hAnsi="Garamond"/>
+          <w:color w:val="000000"/>
+          <w:kern w:val="0"/>
+          <w:sz w:val="36"/>
+          <w:szCs w:val="36"/>
+          <w:shd w:fill="auto" w:val="clear"/>
+          <w:lang w:val="en-US" w:eastAsia="zh-CN" w:bidi="hi-IN"/>
+        </w:rPr>
+        <w:t xml:space="preserve">O </w:t>
+      </w:r>
+      <w:r>
+        <w:rPr>
+          <w:rFonts w:eastAsia="Times New Roman" w:cs="Times New Roman" w:ascii="Garamond" w:hAnsi="Garamond"/>
+          <w:i/>
+          <w:iCs/>
+          <w:color w:val="000000"/>
+          <w:kern w:val="0"/>
+          <w:sz w:val="36"/>
+          <w:szCs w:val="36"/>
+          <w:shd w:fill="auto" w:val="clear"/>
+          <w:lang w:val="en-US" w:eastAsia="zh-CN" w:bidi="hi-IN"/>
+        </w:rPr>
+        <w:t>"</w:t>
+      </w:r>
+      <w:r>
+        <w:rPr>
+          <w:rFonts w:eastAsia="Times New Roman" w:cs="Times New Roman" w:ascii="Garamond" w:hAnsi="Garamond"/>
+          <w:i/>
+          <w:iCs/>
+          <w:color w:val="000000"/>
+          <w:kern w:val="0"/>
+          <w:sz w:val="36"/>
+          <w:szCs w:val="36"/>
+          <w:shd w:fill="auto" w:val="clear"/>
+          <w:lang w:val="en-US" w:eastAsia="zh-CN" w:bidi="hi-IN"/>
+        </w:rPr>
+        <w:t>Pedi e Obtereis</w:t>
+      </w:r>
+      <w:r>
+        <w:rPr>
+          <w:rFonts w:eastAsia="Times New Roman" w:cs="Times New Roman" w:ascii="Garamond" w:hAnsi="Garamond"/>
+          <w:i/>
+          <w:iCs/>
+          <w:color w:val="000000"/>
+          <w:kern w:val="0"/>
+          <w:sz w:val="36"/>
+          <w:szCs w:val="36"/>
+          <w:shd w:fill="auto" w:val="clear"/>
+          <w:lang w:val="en-US" w:eastAsia="zh-CN" w:bidi="hi-IN"/>
+        </w:rPr>
+        <w:t>"</w:t>
+      </w:r>
+      <w:r>
+        <w:rPr>
+          <w:rFonts w:eastAsia="Times New Roman" w:cs="Times New Roman" w:ascii="Garamond" w:hAnsi="Garamond"/>
+          <w:color w:val="000000"/>
+          <w:kern w:val="0"/>
+          <w:sz w:val="36"/>
+          <w:szCs w:val="36"/>
+          <w:shd w:fill="auto" w:val="clear"/>
+          <w:lang w:val="en-US" w:eastAsia="zh-CN" w:bidi="hi-IN"/>
+        </w:rPr>
+        <w:t xml:space="preserve"> é ensinado por Jesus em duas </w:t>
+      </w:r>
+      <w:r>
+        <w:rPr>
+          <w:rFonts w:eastAsia="Times New Roman" w:cs="Times New Roman" w:ascii="Garamond" w:hAnsi="Garamond"/>
+          <w:color w:val="000000"/>
+          <w:kern w:val="0"/>
+          <w:sz w:val="36"/>
+          <w:szCs w:val="36"/>
+          <w:shd w:fill="auto" w:val="clear"/>
+          <w:lang w:val="en-US" w:eastAsia="zh-CN" w:bidi="hi-IN"/>
+        </w:rPr>
+        <w:t>passagens</w:t>
+      </w:r>
+      <w:r>
+        <w:rPr>
+          <w:rFonts w:eastAsia="Times New Roman" w:cs="Times New Roman" w:ascii="Garamond" w:hAnsi="Garamond"/>
+          <w:color w:val="000000"/>
+          <w:kern w:val="0"/>
+          <w:sz w:val="36"/>
+          <w:szCs w:val="36"/>
+          <w:shd w:fill="auto" w:val="clear"/>
+          <w:lang w:val="en-US" w:eastAsia="zh-CN" w:bidi="hi-IN"/>
+        </w:rPr>
+        <w:t xml:space="preserve">: a primeira está em Mateus 7:7-8 durante o sermão do monte quando Jesus fala à multidão. </w:t>
+      </w:r>
+    </w:p>
+    <w:p>
+      <w:pPr>
+        <w:pStyle w:val="Normal"/>
+        <w:jc w:val="both"/>
+        <w:rPr>
+          <w:color w:val="auto"/>
+        </w:rPr>
+      </w:pPr>
+      <w:r>
+        <w:rPr>
+          <w:rFonts w:eastAsia="Times New Roman" w:cs="Times New Roman" w:ascii="Garamond" w:hAnsi="Garamond"/>
+          <w:color w:val="000000"/>
+          <w:kern w:val="0"/>
+          <w:sz w:val="36"/>
+          <w:szCs w:val="36"/>
+          <w:shd w:fill="auto" w:val="clear"/>
+          <w:lang w:val="en-US" w:eastAsia="zh-CN" w:bidi="hi-IN"/>
+        </w:rPr>
+        <w:t xml:space="preserve">A segunda está em Lucas 11:9-11 logo </w:t>
+      </w:r>
+      <w:r>
+        <w:rPr>
+          <w:rFonts w:eastAsia="Times New Roman" w:cs="Times New Roman" w:ascii="Garamond" w:hAnsi="Garamond"/>
+          <w:color w:val="000000"/>
+          <w:kern w:val="0"/>
+          <w:sz w:val="36"/>
+          <w:szCs w:val="36"/>
+          <w:shd w:fill="auto" w:val="clear"/>
+          <w:lang w:val="en-US" w:eastAsia="zh-CN" w:bidi="hi-IN"/>
+        </w:rPr>
+        <w:t>após</w:t>
+      </w:r>
+      <w:r>
+        <w:rPr>
+          <w:rFonts w:eastAsia="Times New Roman" w:cs="Times New Roman" w:ascii="Garamond" w:hAnsi="Garamond"/>
+          <w:color w:val="000000"/>
+          <w:kern w:val="0"/>
+          <w:sz w:val="36"/>
+          <w:szCs w:val="36"/>
+          <w:shd w:fill="auto" w:val="clear"/>
+          <w:lang w:val="en-US" w:eastAsia="zh-CN" w:bidi="hi-IN"/>
+        </w:rPr>
+        <w:t xml:space="preserve"> Jesus ensina</w:t>
+      </w:r>
+      <w:r>
+        <w:rPr>
+          <w:rFonts w:eastAsia="Times New Roman" w:cs="Times New Roman" w:ascii="Garamond" w:hAnsi="Garamond"/>
+          <w:color w:val="000000"/>
+          <w:kern w:val="0"/>
+          <w:sz w:val="36"/>
+          <w:szCs w:val="36"/>
+          <w:shd w:fill="auto" w:val="clear"/>
+          <w:lang w:val="en-US" w:eastAsia="zh-CN" w:bidi="hi-IN"/>
+        </w:rPr>
+        <w:t>r</w:t>
+      </w:r>
+      <w:r>
+        <w:rPr>
+          <w:rFonts w:eastAsia="Times New Roman" w:cs="Times New Roman" w:ascii="Garamond" w:hAnsi="Garamond"/>
+          <w:color w:val="000000"/>
+          <w:kern w:val="0"/>
+          <w:sz w:val="36"/>
+          <w:szCs w:val="36"/>
+          <w:shd w:fill="auto" w:val="clear"/>
+          <w:lang w:val="en-US" w:eastAsia="zh-CN" w:bidi="hi-IN"/>
+        </w:rPr>
+        <w:t xml:space="preserve"> aos discípulos a oração do Pai-Nosso. Jesus apresenta uma pequena parábola, conhecida como a Parábola do Amigo Importuno.</w:t>
+      </w:r>
+    </w:p>
+    <w:p>
+      <w:pPr>
+        <w:pStyle w:val="Normal"/>
+        <w:jc w:val="both"/>
+        <w:rPr>
+          <w:rFonts w:ascii="Garamond" w:hAnsi="Garamond" w:eastAsia="Times New Roman" w:cs="Times New Roman"/>
+          <w:kern w:val="0"/>
+          <w:sz w:val="36"/>
+          <w:szCs w:val="36"/>
+          <w:shd w:fill="auto" w:val="clear"/>
+          <w:lang w:val="en-US" w:eastAsia="zh-CN" w:bidi="hi-IN"/>
+        </w:rPr>
+      </w:pPr>
+      <w:r>
+        <w:rPr>
+          <w:rFonts w:eastAsia="Times New Roman" w:cs="Times New Roman" w:ascii="Garamond" w:hAnsi="Garamond"/>
+          <w:kern w:val="0"/>
+          <w:sz w:val="36"/>
+          <w:szCs w:val="36"/>
+          <w:shd w:fill="auto" w:val="clear"/>
+          <w:lang w:val="en-US" w:eastAsia="zh-CN" w:bidi="hi-IN"/>
+        </w:rPr>
+      </w:r>
+    </w:p>
+    <w:p>
+      <w:pPr>
+        <w:pStyle w:val="Normal"/>
+        <w:jc w:val="both"/>
+        <w:rPr>
+          <w:color w:val="auto"/>
+        </w:rPr>
+      </w:pPr>
+      <w:r>
+        <w:rPr>
+          <w:rFonts w:eastAsia="Times New Roman" w:cs="Times New Roman" w:ascii="Garamond" w:hAnsi="Garamond"/>
+          <w:color w:val="000000"/>
+          <w:kern w:val="0"/>
+          <w:sz w:val="36"/>
+          <w:szCs w:val="36"/>
+          <w:shd w:fill="auto" w:val="clear"/>
+          <w:lang w:val="en-US" w:eastAsia="zh-CN" w:bidi="hi-IN"/>
+        </w:rPr>
+        <w:t>O Mestre</w:t>
+      </w:r>
+      <w:r>
+        <w:rPr>
+          <w:rFonts w:eastAsia="Times New Roman" w:cs="Times New Roman" w:ascii="Garamond" w:hAnsi="Garamond"/>
+          <w:color w:val="000000"/>
+          <w:kern w:val="0"/>
+          <w:sz w:val="36"/>
+          <w:szCs w:val="36"/>
+          <w:shd w:fill="auto" w:val="clear"/>
+          <w:lang w:val="en-US" w:eastAsia="zh-CN" w:bidi="hi-IN"/>
+        </w:rPr>
+        <w:t xml:space="preserve"> conta que um homem recebe, à meia-noite, a visita inesperada de um amigo e não tem nada para lhe oferecer. Então ele vai até a casa de um vizinho, bate à porta e diz: “Amigo, empresta-me três pães, pois chegou uma visita em minha casa, e eu não tenho o que colocar à mesa”.</w:t>
+      </w:r>
+    </w:p>
+    <w:p>
+      <w:pPr>
+        <w:pStyle w:val="Normal"/>
+        <w:jc w:val="both"/>
+        <w:rPr>
+          <w:color w:val="auto"/>
         </w:rPr>
       </w:pPr>
       <w:r>
@@ -171,30 +705,28 @@
         <w:pStyle w:val="Normal"/>
         <w:jc w:val="both"/>
         <w:rPr>
-          <w:sz w:val="36"/>
-          <w:szCs w:val="36"/>
-        </w:rPr>
-      </w:pPr>
-      <w:r>
-        <w:rPr>
-          <w:rFonts w:eastAsia="Times New Roman" w:cs="Times New Roman" w:ascii="Garamond" w:hAnsi="Garamond"/>
-          <w:color w:val="000000"/>
-          <w:kern w:val="0"/>
-          <w:sz w:val="36"/>
-          <w:szCs w:val="36"/>
-          <w:shd w:fill="auto" w:val="clear"/>
-          <w:lang w:val="en-US" w:eastAsia="zh-CN" w:bidi="hi-IN"/>
-        </w:rPr>
-        <w:t>No entanto, o “Pedi e obtereis” se enquadra em uma outra categoria de ensinamentos — a mesma em que está, por exemplo, o “Observai os pássaros do céu”, quando Jesus nos orienta a não nos preocuparmos excessivamente com o dia de amanhã, afirmando que Deus nos proverá com tudo o que for necessário.</w:t>
-      </w:r>
-    </w:p>
-    <w:p>
-      <w:pPr>
-        <w:pStyle w:val="Normal"/>
-        <w:jc w:val="both"/>
-        <w:rPr>
-          <w:sz w:val="36"/>
-          <w:szCs w:val="36"/>
+          <w:color w:val="auto"/>
+        </w:rPr>
+      </w:pPr>
+      <w:r>
+        <w:rPr>
+          <w:rFonts w:eastAsia="Times New Roman" w:cs="Times New Roman" w:ascii="Garamond" w:hAnsi="Garamond"/>
+          <w:color w:val="000000"/>
+          <w:kern w:val="0"/>
+          <w:sz w:val="36"/>
+          <w:szCs w:val="36"/>
+          <w:shd w:fill="auto" w:val="clear"/>
+          <w:lang w:val="en-US" w:eastAsia="zh-CN" w:bidi="hi-IN"/>
+        </w:rPr>
+        <w:t>O homem que está dentro responde: “Não me incomodes. A porta já está fechada, meus filhos já estão deitados, e eu não posso me levantar agora”.</w:t>
+      </w:r>
+    </w:p>
+    <w:p>
+      <w:pPr>
+        <w:pStyle w:val="Normal"/>
+        <w:jc w:val="both"/>
+        <w:rPr>
+          <w:color w:val="auto"/>
         </w:rPr>
       </w:pPr>
       <w:r>
@@ -206,30 +738,76 @@
         <w:pStyle w:val="Normal"/>
         <w:jc w:val="both"/>
         <w:rPr>
-          <w:sz w:val="36"/>
-          <w:szCs w:val="36"/>
-        </w:rPr>
-      </w:pPr>
-      <w:r>
-        <w:rPr>
-          <w:rFonts w:eastAsia="Times New Roman" w:cs="Times New Roman" w:ascii="Garamond" w:hAnsi="Garamond"/>
-          <w:color w:val="000000"/>
-          <w:kern w:val="0"/>
-          <w:sz w:val="36"/>
-          <w:szCs w:val="36"/>
-          <w:shd w:fill="auto" w:val="clear"/>
-          <w:lang w:val="en-US" w:eastAsia="zh-CN" w:bidi="hi-IN"/>
-        </w:rPr>
-        <w:t>De modo geral, costumamos interpretar esses ensinamentos como se nenhum esforço fosse exigido de nossa parte, como se bastasse apenas pedir, ou simplesmente esperar, para que Deus nos conceda tudo aquilo que desejamos.</w:t>
-      </w:r>
-    </w:p>
-    <w:p>
-      <w:pPr>
-        <w:pStyle w:val="Normal"/>
-        <w:jc w:val="both"/>
-        <w:rPr>
-          <w:sz w:val="36"/>
-          <w:szCs w:val="36"/>
+          <w:color w:val="auto"/>
+        </w:rPr>
+      </w:pPr>
+      <w:r>
+        <w:rPr>
+          <w:rFonts w:eastAsia="Times New Roman" w:cs="Times New Roman" w:ascii="Garamond" w:hAnsi="Garamond"/>
+          <w:color w:val="000000"/>
+          <w:kern w:val="0"/>
+          <w:sz w:val="36"/>
+          <w:szCs w:val="36"/>
+          <w:shd w:fill="auto" w:val="clear"/>
+          <w:lang w:val="en-US" w:eastAsia="zh-CN" w:bidi="hi-IN"/>
+        </w:rPr>
+        <w:t xml:space="preserve">Jesus </w:t>
+      </w:r>
+      <w:r>
+        <w:rPr>
+          <w:rFonts w:eastAsia="Times New Roman" w:cs="Times New Roman" w:ascii="Garamond" w:hAnsi="Garamond"/>
+          <w:color w:val="000000"/>
+          <w:kern w:val="0"/>
+          <w:sz w:val="36"/>
+          <w:szCs w:val="36"/>
+          <w:shd w:fill="auto" w:val="clear"/>
+          <w:lang w:val="en-US" w:eastAsia="zh-CN" w:bidi="hi-IN"/>
+        </w:rPr>
+        <w:t>diz</w:t>
+      </w:r>
+      <w:r>
+        <w:rPr>
+          <w:rFonts w:eastAsia="Times New Roman" w:cs="Times New Roman" w:ascii="Garamond" w:hAnsi="Garamond"/>
+          <w:color w:val="000000"/>
+          <w:kern w:val="0"/>
+          <w:sz w:val="36"/>
+          <w:szCs w:val="36"/>
+          <w:shd w:fill="auto" w:val="clear"/>
+          <w:lang w:val="en-US" w:eastAsia="zh-CN" w:bidi="hi-IN"/>
+        </w:rPr>
+        <w:t xml:space="preserve"> que, mesmo que </w:t>
+      </w:r>
+      <w:r>
+        <w:rPr>
+          <w:rFonts w:eastAsia="Times New Roman" w:cs="Times New Roman" w:ascii="Garamond" w:hAnsi="Garamond"/>
+          <w:color w:val="000000"/>
+          <w:kern w:val="0"/>
+          <w:sz w:val="36"/>
+          <w:szCs w:val="36"/>
+          <w:shd w:fill="auto" w:val="clear"/>
+          <w:lang w:val="en-US" w:eastAsia="zh-CN" w:bidi="hi-IN"/>
+        </w:rPr>
+        <w:t>aquele homem</w:t>
+      </w:r>
+      <w:r>
+        <w:rPr>
+          <w:rFonts w:eastAsia="Times New Roman" w:cs="Times New Roman" w:ascii="Garamond" w:hAnsi="Garamond"/>
+          <w:color w:val="000000"/>
+          <w:kern w:val="0"/>
+          <w:sz w:val="36"/>
+          <w:szCs w:val="36"/>
+          <w:shd w:fill="auto" w:val="clear"/>
+          <w:lang w:val="en-US" w:eastAsia="zh-CN" w:bidi="hi-IN"/>
+        </w:rPr>
+        <w:t xml:space="preserve"> não se levante por amizade, acabará se levantando por causa da insistência daquele que pede e lhe dará tudo o que for necessário.</w:t>
+      </w:r>
+    </w:p>
+    <w:p>
+      <w:pPr>
+        <w:pStyle w:val="Normal"/>
+        <w:jc w:val="both"/>
+        <w:rPr>
+          <w:color w:val="auto"/>
         </w:rPr>
       </w:pPr>
       <w:r>
@@ -241,30 +819,40 @@
         <w:pStyle w:val="Normal"/>
         <w:jc w:val="both"/>
         <w:rPr>
-          <w:sz w:val="36"/>
-          <w:szCs w:val="36"/>
-        </w:rPr>
-      </w:pPr>
-      <w:r>
-        <w:rPr>
-          <w:rFonts w:eastAsia="Times New Roman" w:cs="Times New Roman" w:ascii="Garamond" w:hAnsi="Garamond"/>
-          <w:color w:val="000000"/>
-          <w:kern w:val="0"/>
-          <w:sz w:val="36"/>
-          <w:szCs w:val="36"/>
-          <w:shd w:fill="auto" w:val="clear"/>
-          <w:lang w:val="en-US" w:eastAsia="zh-CN" w:bidi="hi-IN"/>
-        </w:rPr>
-        <w:t>Talvez essas interpretações equivocadas persistam porque, no fundo, elas nos parecem mais cômodas. É mais confortável imaginar um Deus que concede tudo sem exigir esforço, transformação ou compromisso de nossa parte. Assim, transformamos ensinamentos profundos de Jesus em promessas de facilidade, quando na verdade eles nos convidam à responsabilidade, à confiança ativa e ao trabalho no bem.</w:t>
-      </w:r>
-    </w:p>
-    <w:p>
-      <w:pPr>
-        <w:pStyle w:val="Normal"/>
-        <w:jc w:val="both"/>
-        <w:rPr>
-          <w:sz w:val="36"/>
-          <w:szCs w:val="36"/>
+          <w:color w:val="auto"/>
+        </w:rPr>
+      </w:pPr>
+      <w:r>
+        <w:rPr>
+          <w:rFonts w:eastAsia="Times New Roman" w:cs="Times New Roman" w:ascii="Garamond" w:hAnsi="Garamond"/>
+          <w:color w:val="000000"/>
+          <w:kern w:val="0"/>
+          <w:sz w:val="36"/>
+          <w:szCs w:val="36"/>
+          <w:shd w:fill="auto" w:val="clear"/>
+          <w:lang w:val="en-US" w:eastAsia="zh-CN" w:bidi="hi-IN"/>
+        </w:rPr>
+        <w:t xml:space="preserve">Logo </w:t>
+      </w:r>
+      <w:r>
+        <w:rPr>
+          <w:rFonts w:eastAsia="Times New Roman" w:cs="Times New Roman" w:ascii="Garamond" w:hAnsi="Garamond"/>
+          <w:color w:val="000000"/>
+          <w:kern w:val="0"/>
+          <w:sz w:val="36"/>
+          <w:szCs w:val="36"/>
+          <w:shd w:fill="auto" w:val="clear"/>
+          <w:lang w:val="en-US" w:eastAsia="zh-CN" w:bidi="hi-IN"/>
+        </w:rPr>
+        <w:t>em seguida o Mestre diz:</w:t>
+      </w:r>
+    </w:p>
+    <w:p>
+      <w:pPr>
+        <w:pStyle w:val="Normal"/>
+        <w:jc w:val="both"/>
+        <w:rPr>
+          <w:color w:val="auto"/>
         </w:rPr>
       </w:pPr>
       <w:r>
@@ -274,32 +862,49 @@
     <w:p>
       <w:pPr>
         <w:pStyle w:val="Normal"/>
-        <w:jc w:val="both"/>
-        <w:rPr>
-          <w:sz w:val="36"/>
-          <w:szCs w:val="36"/>
-        </w:rPr>
-      </w:pPr>
-      <w:r>
-        <w:rPr>
-          <w:rFonts w:eastAsia="Times New Roman" w:cs="Times New Roman" w:ascii="Garamond" w:hAnsi="Garamond"/>
-          <w:color w:val="000000"/>
-          <w:kern w:val="0"/>
-          <w:sz w:val="36"/>
-          <w:szCs w:val="36"/>
-          <w:shd w:fill="auto" w:val="clear"/>
-          <w:lang w:val="en-US" w:eastAsia="zh-CN" w:bidi="hi-IN"/>
-        </w:rPr>
-        <w:t>E é justamente isso que veremos ao longo de nossas reflexões.</w:t>
-      </w:r>
-    </w:p>
-    <w:p>
-      <w:pPr>
-        <w:pStyle w:val="Normal"/>
-        <w:jc w:val="both"/>
-        <w:rPr>
-          <w:sz w:val="36"/>
-          <w:szCs w:val="36"/>
+        <w:ind w:left="720" w:hanging="0"/>
+        <w:jc w:val="both"/>
+        <w:rPr>
+          <w:i/>
+          <w:i/>
+          <w:iCs/>
+        </w:rPr>
+      </w:pPr>
+      <w:r>
+        <w:rPr>
+          <w:rFonts w:eastAsia="Times New Roman" w:cs="Times New Roman" w:ascii="Garamond" w:hAnsi="Garamond"/>
+          <w:i/>
+          <w:iCs/>
+          <w:color w:val="000000"/>
+          <w:kern w:val="0"/>
+          <w:sz w:val="36"/>
+          <w:szCs w:val="36"/>
+          <w:shd w:fill="auto" w:val="clear"/>
+          <w:lang w:val="en-US" w:eastAsia="zh-CN" w:bidi="hi-IN"/>
+        </w:rPr>
+        <w:t>“</w:t>
+      </w:r>
+      <w:r>
+        <w:rPr>
+          <w:rFonts w:eastAsia="Times New Roman" w:cs="Times New Roman" w:ascii="Garamond" w:hAnsi="Garamond"/>
+          <w:i/>
+          <w:iCs/>
+          <w:color w:val="000000"/>
+          <w:kern w:val="0"/>
+          <w:sz w:val="36"/>
+          <w:szCs w:val="36"/>
+          <w:shd w:fill="auto" w:val="clear"/>
+          <w:lang w:val="en-US" w:eastAsia="zh-CN" w:bidi="hi-IN"/>
+        </w:rPr>
+        <w:t>Pedi, e dar-se-vos-á; buscai, e encontrareis; batei, e abrir-se-vos-á.”</w:t>
+      </w:r>
+    </w:p>
+    <w:p>
+      <w:pPr>
+        <w:pStyle w:val="Normal"/>
+        <w:jc w:val="both"/>
+        <w:rPr>
+          <w:color w:val="auto"/>
         </w:rPr>
       </w:pPr>
       <w:r>
@@ -311,44 +916,748 @@
         <w:pStyle w:val="Normal"/>
         <w:jc w:val="both"/>
         <w:rPr>
+          <w:rFonts w:ascii="Garamond" w:hAnsi="Garamond" w:eastAsia="Times New Roman" w:cs="Times New Roman"/>
+          <w:kern w:val="0"/>
+          <w:sz w:val="36"/>
+          <w:szCs w:val="36"/>
+          <w:shd w:fill="auto" w:val="clear"/>
+          <w:lang w:val="en-US" w:eastAsia="zh-CN" w:bidi="hi-IN"/>
+        </w:rPr>
+      </w:pPr>
+      <w:r>
+        <w:rPr>
+          <w:rFonts w:eastAsia="Times New Roman" w:cs="Times New Roman" w:ascii="Garamond" w:hAnsi="Garamond"/>
+          <w:kern w:val="0"/>
+          <w:sz w:val="36"/>
+          <w:szCs w:val="36"/>
+          <w:shd w:fill="auto" w:val="clear"/>
+          <w:lang w:val="en-US" w:eastAsia="zh-CN" w:bidi="hi-IN"/>
+        </w:rPr>
+      </w:r>
+    </w:p>
+    <w:p>
+      <w:pPr>
+        <w:pStyle w:val="Normal"/>
+        <w:jc w:val="both"/>
+        <w:rPr>
+          <w:color w:val="auto"/>
+        </w:rPr>
+      </w:pPr>
+      <w:r>
+        <w:rPr>
+          <w:rFonts w:eastAsia="Times New Roman" w:cs="Times New Roman" w:ascii="Garamond" w:hAnsi="Garamond"/>
+          <w:color w:val="000000"/>
+          <w:kern w:val="0"/>
+          <w:sz w:val="36"/>
+          <w:szCs w:val="36"/>
+          <w:shd w:fill="auto" w:val="clear"/>
+          <w:lang w:val="en-US" w:eastAsia="zh-CN" w:bidi="hi-IN"/>
+        </w:rPr>
+        <w:t xml:space="preserve">Observando alguns elementos simbólicos da parábola, encontramos ensinamentos ainda mais profundos. Jesus menciona que o homem procura o amigo à meia-noite, horário que aparece com frequência no Evangelho como símbolo de crise, de dificuldade e de escuridão interior. </w:t>
+      </w:r>
+    </w:p>
+    <w:p>
+      <w:pPr>
+        <w:pStyle w:val="Normal"/>
+        <w:jc w:val="both"/>
+        <w:rPr>
+          <w:color w:val="auto"/>
+        </w:rPr>
+      </w:pPr>
+      <w:r>
+        <w:rPr/>
+      </w:r>
+    </w:p>
+    <w:p>
+      <w:pPr>
+        <w:pStyle w:val="Normal"/>
+        <w:jc w:val="both"/>
+        <w:rPr>
+          <w:color w:val="auto"/>
+        </w:rPr>
+      </w:pPr>
+      <w:r>
+        <w:rPr>
+          <w:rFonts w:eastAsia="Times New Roman" w:cs="Times New Roman" w:ascii="Garamond" w:hAnsi="Garamond"/>
+          <w:color w:val="000000"/>
+          <w:kern w:val="0"/>
+          <w:sz w:val="36"/>
+          <w:szCs w:val="36"/>
+          <w:shd w:fill="auto" w:val="clear"/>
+          <w:lang w:val="en-US" w:eastAsia="zh-CN" w:bidi="hi-IN"/>
+        </w:rPr>
+        <w:t>Muitas vezes desperdiçamos as oportunidades durante a “luz do dia” e só buscamos auxílio quando a dor, o sofrimento ou a aflição já se instalaram em nossas vidas. A noite simboliza justamente esse momento em que as sombras interiores nos despertam para a necessidade de buscar a luz.</w:t>
+      </w:r>
+    </w:p>
+    <w:p>
+      <w:pPr>
+        <w:pStyle w:val="Normal"/>
+        <w:jc w:val="both"/>
+        <w:rPr>
+          <w:rFonts w:ascii="Garamond" w:hAnsi="Garamond" w:eastAsia="Times New Roman" w:cs="Times New Roman"/>
+          <w:kern w:val="0"/>
+          <w:sz w:val="36"/>
+          <w:szCs w:val="36"/>
+          <w:shd w:fill="auto" w:val="clear"/>
+          <w:lang w:val="en-US" w:eastAsia="zh-CN" w:bidi="hi-IN"/>
+        </w:rPr>
+      </w:pPr>
+      <w:r>
+        <w:rPr>
+          <w:rFonts w:eastAsia="Times New Roman" w:cs="Times New Roman" w:ascii="Garamond" w:hAnsi="Garamond"/>
+          <w:kern w:val="0"/>
+          <w:sz w:val="36"/>
+          <w:szCs w:val="36"/>
+          <w:shd w:fill="auto" w:val="clear"/>
+          <w:lang w:val="en-US" w:eastAsia="zh-CN" w:bidi="hi-IN"/>
+        </w:rPr>
+      </w:r>
+    </w:p>
+    <w:p>
+      <w:pPr>
+        <w:pStyle w:val="Normal"/>
+        <w:jc w:val="both"/>
+        <w:rPr>
+          <w:color w:val="auto"/>
+        </w:rPr>
+      </w:pPr>
+      <w:r>
+        <w:rPr>
+          <w:rFonts w:eastAsia="Times New Roman" w:cs="Times New Roman" w:ascii="Garamond" w:hAnsi="Garamond"/>
+          <w:color w:val="000000"/>
+          <w:kern w:val="0"/>
+          <w:sz w:val="36"/>
+          <w:szCs w:val="36"/>
+          <w:shd w:fill="auto" w:val="clear"/>
+          <w:lang w:val="en-US" w:eastAsia="zh-CN" w:bidi="hi-IN"/>
+        </w:rPr>
+        <w:t xml:space="preserve">O amigo que está dentro da casa </w:t>
+      </w:r>
+      <w:r>
+        <w:rPr>
+          <w:rFonts w:eastAsia="Times New Roman" w:cs="Times New Roman" w:ascii="Garamond" w:hAnsi="Garamond"/>
+          <w:color w:val="000000"/>
+          <w:kern w:val="0"/>
+          <w:sz w:val="36"/>
+          <w:szCs w:val="36"/>
+          <w:shd w:fill="auto" w:val="clear"/>
+          <w:lang w:val="en-US" w:eastAsia="zh-CN" w:bidi="hi-IN"/>
+        </w:rPr>
+        <w:t>representa</w:t>
+      </w:r>
+      <w:r>
+        <w:rPr>
+          <w:rFonts w:eastAsia="Times New Roman" w:cs="Times New Roman" w:ascii="Garamond" w:hAnsi="Garamond"/>
+          <w:color w:val="000000"/>
+          <w:kern w:val="0"/>
+          <w:sz w:val="36"/>
+          <w:szCs w:val="36"/>
+          <w:shd w:fill="auto" w:val="clear"/>
+          <w:lang w:val="en-US" w:eastAsia="zh-CN" w:bidi="hi-IN"/>
+        </w:rPr>
+        <w:t xml:space="preserve"> os valores superiores que já existem em nós, mas que muitas vezes preferimos manter adormecidos. </w:t>
+      </w:r>
+      <w:r>
+        <w:rPr>
+          <w:rFonts w:eastAsia="Times New Roman" w:cs="Times New Roman" w:ascii="Garamond" w:hAnsi="Garamond"/>
+          <w:color w:val="000000"/>
+          <w:kern w:val="0"/>
+          <w:sz w:val="36"/>
+          <w:szCs w:val="36"/>
+          <w:shd w:fill="auto" w:val="clear"/>
+          <w:lang w:val="en-US" w:eastAsia="zh-CN" w:bidi="hi-IN"/>
+        </w:rPr>
+        <w:t>O homem</w:t>
+      </w:r>
+      <w:r>
+        <w:rPr>
+          <w:rFonts w:eastAsia="Times New Roman" w:cs="Times New Roman" w:ascii="Garamond" w:hAnsi="Garamond"/>
+          <w:color w:val="000000"/>
+          <w:kern w:val="0"/>
+          <w:sz w:val="36"/>
+          <w:szCs w:val="36"/>
+          <w:shd w:fill="auto" w:val="clear"/>
+          <w:lang w:val="en-US" w:eastAsia="zh-CN" w:bidi="hi-IN"/>
+        </w:rPr>
+        <w:t xml:space="preserve"> diz que está deitado e não quer se levantar, o que simboliza nossa resistência em sair da zona de conforto. Sabemos, intuitivamente, que despertar esses valores implicará esforço, mudança e compromisso com o bem.</w:t>
+      </w:r>
+    </w:p>
+    <w:p>
+      <w:pPr>
+        <w:pStyle w:val="Normal"/>
+        <w:jc w:val="both"/>
+        <w:rPr>
+          <w:rFonts w:ascii="Garamond" w:hAnsi="Garamond" w:eastAsia="Times New Roman" w:cs="Times New Roman"/>
+          <w:kern w:val="0"/>
+          <w:sz w:val="36"/>
+          <w:szCs w:val="36"/>
+          <w:shd w:fill="auto" w:val="clear"/>
+          <w:lang w:val="en-US" w:eastAsia="zh-CN" w:bidi="hi-IN"/>
+        </w:rPr>
+      </w:pPr>
+      <w:r>
+        <w:rPr>
+          <w:rFonts w:eastAsia="Times New Roman" w:cs="Times New Roman" w:ascii="Garamond" w:hAnsi="Garamond"/>
+          <w:kern w:val="0"/>
+          <w:sz w:val="36"/>
+          <w:szCs w:val="36"/>
+          <w:shd w:fill="auto" w:val="clear"/>
+          <w:lang w:val="en-US" w:eastAsia="zh-CN" w:bidi="hi-IN"/>
+        </w:rPr>
+      </w:r>
+    </w:p>
+    <w:p>
+      <w:pPr>
+        <w:pStyle w:val="Normal"/>
+        <w:jc w:val="both"/>
+        <w:rPr>
+          <w:color w:val="auto"/>
+        </w:rPr>
+      </w:pPr>
+      <w:r>
+        <w:rPr>
+          <w:rFonts w:eastAsia="Times New Roman" w:cs="Times New Roman" w:ascii="Garamond" w:hAnsi="Garamond"/>
+          <w:color w:val="000000"/>
+          <w:kern w:val="0"/>
+          <w:sz w:val="36"/>
+          <w:szCs w:val="36"/>
+          <w:shd w:fill="auto" w:val="clear"/>
+          <w:lang w:val="en-US" w:eastAsia="zh-CN" w:bidi="hi-IN"/>
+        </w:rPr>
+        <w:t>Já o amigo que bate à porta representa os estímulos exteriores que recebemos ao longo da vida — nem sempre agradáveis — e que nos impulsionam a buscar, dentro de nós mesmos, esses valores mais elevados. São as experiências, os desafios e as dificuldades que nos convidam a olhar para dentro e a reconhecer aquilo que precisa ser transformado.</w:t>
+      </w:r>
+    </w:p>
+    <w:p>
+      <w:pPr>
+        <w:pStyle w:val="Normal"/>
+        <w:jc w:val="both"/>
+        <w:rPr>
+          <w:rFonts w:ascii="Garamond" w:hAnsi="Garamond" w:eastAsia="Times New Roman" w:cs="Times New Roman"/>
+          <w:kern w:val="0"/>
+          <w:sz w:val="36"/>
+          <w:szCs w:val="36"/>
+          <w:shd w:fill="auto" w:val="clear"/>
+          <w:lang w:val="en-US" w:eastAsia="zh-CN" w:bidi="hi-IN"/>
+        </w:rPr>
+      </w:pPr>
+      <w:r>
+        <w:rPr>
+          <w:rFonts w:eastAsia="Times New Roman" w:cs="Times New Roman" w:ascii="Garamond" w:hAnsi="Garamond"/>
+          <w:kern w:val="0"/>
+          <w:sz w:val="36"/>
+          <w:szCs w:val="36"/>
+          <w:shd w:fill="auto" w:val="clear"/>
+          <w:lang w:val="en-US" w:eastAsia="zh-CN" w:bidi="hi-IN"/>
+        </w:rPr>
+      </w:r>
+    </w:p>
+    <w:p>
+      <w:pPr>
+        <w:pStyle w:val="Normal"/>
+        <w:jc w:val="both"/>
+        <w:rPr>
+          <w:color w:val="auto"/>
+        </w:rPr>
+      </w:pPr>
+      <w:r>
+        <w:rPr>
+          <w:rFonts w:eastAsia="Times New Roman" w:cs="Times New Roman" w:ascii="Garamond" w:hAnsi="Garamond"/>
+          <w:color w:val="000000"/>
+          <w:kern w:val="0"/>
+          <w:sz w:val="36"/>
+          <w:szCs w:val="36"/>
+          <w:shd w:fill="auto" w:val="clear"/>
+          <w:lang w:val="en-US" w:eastAsia="zh-CN" w:bidi="hi-IN"/>
+        </w:rPr>
+        <w:t>Por fim, há um ponto central nessa parábola: por maior que fosse a necessidade do homem que pedia os pães, ele não podia abrir a porta da casa. A porta só se abre pelo lado de dentro. Assim também acontece com a porta do nosso coração. Somente nós podemos abri-la, quando decidimos atender aos apelos da própria consciência, muitas vezes manifestados através da dor, do desequilíbrio, da doença ou da fome de sentido espiritual.</w:t>
+      </w:r>
+    </w:p>
+    <w:p>
+      <w:pPr>
+        <w:pStyle w:val="Normal"/>
+        <w:jc w:val="both"/>
+        <w:rPr>
+          <w:rFonts w:ascii="Garamond" w:hAnsi="Garamond" w:eastAsia="Times New Roman" w:cs="Times New Roman"/>
+          <w:kern w:val="0"/>
+          <w:sz w:val="36"/>
+          <w:szCs w:val="36"/>
+          <w:shd w:fill="auto" w:val="clear"/>
+          <w:lang w:val="en-US" w:eastAsia="zh-CN" w:bidi="hi-IN"/>
+        </w:rPr>
+      </w:pPr>
+      <w:r>
+        <w:rPr>
+          <w:rFonts w:eastAsia="Times New Roman" w:cs="Times New Roman" w:ascii="Garamond" w:hAnsi="Garamond"/>
+          <w:kern w:val="0"/>
+          <w:sz w:val="36"/>
+          <w:szCs w:val="36"/>
+          <w:shd w:fill="auto" w:val="clear"/>
+          <w:lang w:val="en-US" w:eastAsia="zh-CN" w:bidi="hi-IN"/>
+        </w:rPr>
+      </w:r>
+    </w:p>
+    <w:p>
+      <w:pPr>
+        <w:pStyle w:val="Normal"/>
+        <w:jc w:val="both"/>
+        <w:rPr>
+          <w:color w:val="auto"/>
+        </w:rPr>
+      </w:pPr>
+      <w:r>
+        <w:rPr>
+          <w:rFonts w:eastAsia="Times New Roman" w:cs="Times New Roman" w:ascii="Garamond" w:hAnsi="Garamond"/>
+          <w:color w:val="000000"/>
+          <w:kern w:val="0"/>
+          <w:sz w:val="36"/>
+          <w:szCs w:val="36"/>
+          <w:shd w:fill="auto" w:val="clear"/>
+          <w:lang w:val="en-US" w:eastAsia="zh-CN" w:bidi="hi-IN"/>
+        </w:rPr>
+        <w:t xml:space="preserve">A Parábola do Amigo Importuno nos ensina, portanto, a necessidade da prece constante — não uma prece mecânica, repetitiva ou interesseira, mas uma oração sincera, consciente e transformadora. </w:t>
+      </w:r>
+    </w:p>
+    <w:p>
+      <w:pPr>
+        <w:pStyle w:val="Normal"/>
+        <w:jc w:val="both"/>
+        <w:rPr>
+          <w:color w:val="auto"/>
+        </w:rPr>
+      </w:pPr>
+      <w:r>
+        <w:rPr/>
+      </w:r>
+    </w:p>
+    <w:p>
+      <w:pPr>
+        <w:pStyle w:val="Normal"/>
+        <w:jc w:val="both"/>
+        <w:rPr>
+          <w:color w:val="auto"/>
+        </w:rPr>
+      </w:pPr>
+      <w:r>
+        <w:rPr>
+          <w:rFonts w:eastAsia="Times New Roman" w:cs="Times New Roman" w:ascii="Garamond" w:hAnsi="Garamond"/>
+          <w:color w:val="000000"/>
+          <w:kern w:val="0"/>
+          <w:sz w:val="36"/>
+          <w:szCs w:val="36"/>
+          <w:shd w:fill="auto" w:val="clear"/>
+          <w:lang w:val="en-US" w:eastAsia="zh-CN" w:bidi="hi-IN"/>
+        </w:rPr>
+        <w:t>Uma prece que não apenas pede, mas que prepara o coração para receber, agir e crescer. É essa oração viva que se torna a chave capaz de abrir as portas do nosso mundo interior para tudo aquilo que pode promover nossa evolução espiritual.</w:t>
+      </w:r>
+    </w:p>
+    <w:p>
+      <w:pPr>
+        <w:pStyle w:val="Normal"/>
+        <w:jc w:val="both"/>
+        <w:rPr>
+          <w:sz w:val="36"/>
+          <w:szCs w:val="36"/>
+        </w:rPr>
+      </w:pPr>
+      <w:r>
+        <w:rPr>
+          <w:sz w:val="36"/>
+          <w:szCs w:val="36"/>
+        </w:rPr>
+      </w:r>
+    </w:p>
+    <w:p>
+      <w:pPr>
+        <w:pStyle w:val="Normal"/>
+        <w:jc w:val="both"/>
+        <w:rPr>
+          <w:color w:val="auto"/>
+        </w:rPr>
+      </w:pPr>
+      <w:r>
+        <w:rPr>
+          <w:rFonts w:eastAsia="Times New Roman" w:cs="Times New Roman" w:ascii="Garamond" w:hAnsi="Garamond"/>
+          <w:color w:val="000000"/>
+          <w:kern w:val="0"/>
+          <w:sz w:val="36"/>
+          <w:szCs w:val="36"/>
+          <w:shd w:fill="auto" w:val="clear"/>
+          <w:lang w:val="en-US" w:eastAsia="zh-CN" w:bidi="hi-IN"/>
+        </w:rPr>
+        <w:t xml:space="preserve">Muitos podem questionar: se Deus conhece perfeitamente tudo aquilo de que necessitamos antes mesmo de pedirmos, por que então precisamos orar? </w:t>
+      </w:r>
+    </w:p>
+    <w:p>
+      <w:pPr>
+        <w:pStyle w:val="Normal"/>
+        <w:jc w:val="both"/>
+        <w:rPr>
+          <w:color w:val="auto"/>
+        </w:rPr>
+      </w:pPr>
+      <w:r>
+        <w:rPr/>
+      </w:r>
+    </w:p>
+    <w:p>
+      <w:pPr>
+        <w:pStyle w:val="Normal"/>
+        <w:jc w:val="both"/>
+        <w:rPr>
+          <w:color w:val="auto"/>
+        </w:rPr>
+      </w:pPr>
+      <w:r>
+        <w:rPr>
+          <w:rFonts w:eastAsia="Times New Roman" w:cs="Times New Roman" w:ascii="Garamond" w:hAnsi="Garamond"/>
+          <w:color w:val="000000"/>
+          <w:kern w:val="0"/>
+          <w:sz w:val="36"/>
+          <w:szCs w:val="36"/>
+          <w:shd w:fill="auto" w:val="clear"/>
+          <w:lang w:val="en-US" w:eastAsia="zh-CN" w:bidi="hi-IN"/>
+        </w:rPr>
+        <w:t>A resposta é simples e profunda: a oração não tem por finalidade informar a Deus sobre nossas necessidades, mas transformar a nós mesmos. Orar é criar em nosso íntimo as condições necessárias para receber aquilo que a Providência pode nos oferecer.</w:t>
+      </w:r>
+    </w:p>
+    <w:p>
+      <w:pPr>
+        <w:pStyle w:val="Normal"/>
+        <w:jc w:val="both"/>
+        <w:rPr>
+          <w:rFonts w:ascii="Garamond" w:hAnsi="Garamond" w:eastAsia="Times New Roman" w:cs="Times New Roman"/>
+          <w:kern w:val="0"/>
+          <w:sz w:val="36"/>
+          <w:szCs w:val="36"/>
+          <w:shd w:fill="auto" w:val="clear"/>
+          <w:lang w:val="en-US" w:eastAsia="zh-CN" w:bidi="hi-IN"/>
+        </w:rPr>
+      </w:pPr>
+      <w:r>
+        <w:rPr>
+          <w:rFonts w:eastAsia="Times New Roman" w:cs="Times New Roman" w:ascii="Garamond" w:hAnsi="Garamond"/>
+          <w:kern w:val="0"/>
+          <w:sz w:val="36"/>
+          <w:szCs w:val="36"/>
+          <w:shd w:fill="auto" w:val="clear"/>
+          <w:lang w:val="en-US" w:eastAsia="zh-CN" w:bidi="hi-IN"/>
+        </w:rPr>
+      </w:r>
+    </w:p>
+    <w:p>
+      <w:pPr>
+        <w:pStyle w:val="Normal"/>
+        <w:jc w:val="both"/>
+        <w:rPr>
+          <w:color w:val="auto"/>
+        </w:rPr>
+      </w:pPr>
+      <w:r>
+        <w:rPr>
+          <w:rFonts w:eastAsia="Times New Roman" w:cs="Times New Roman" w:ascii="Garamond" w:hAnsi="Garamond"/>
+          <w:color w:val="000000"/>
+          <w:kern w:val="0"/>
+          <w:sz w:val="36"/>
+          <w:szCs w:val="36"/>
+          <w:shd w:fill="auto" w:val="clear"/>
+          <w:lang w:val="en-US" w:eastAsia="zh-CN" w:bidi="hi-IN"/>
+        </w:rPr>
+        <w:t>Através do livre-arbítrio, podemos ampliar ou reduzir nossa capacidade de recepção dos dons divinos. O pedir, o buscar e o bater não existem para convencer Deus, mas para alargar, pouco a pouco, o nosso recipiente interior. É nesse sentido que a oração se torna um exercício de crescimento espiritual.</w:t>
+      </w:r>
+    </w:p>
+    <w:p>
+      <w:pPr>
+        <w:pStyle w:val="Normal"/>
+        <w:jc w:val="both"/>
+        <w:rPr>
+          <w:rFonts w:ascii="Garamond" w:hAnsi="Garamond" w:eastAsia="Times New Roman" w:cs="Times New Roman"/>
+          <w:kern w:val="0"/>
+          <w:sz w:val="36"/>
+          <w:szCs w:val="36"/>
+          <w:shd w:fill="auto" w:val="clear"/>
+          <w:lang w:val="en-US" w:eastAsia="zh-CN" w:bidi="hi-IN"/>
+        </w:rPr>
+      </w:pPr>
+      <w:r>
+        <w:rPr>
+          <w:rFonts w:eastAsia="Times New Roman" w:cs="Times New Roman" w:ascii="Garamond" w:hAnsi="Garamond"/>
+          <w:kern w:val="0"/>
+          <w:sz w:val="36"/>
+          <w:szCs w:val="36"/>
+          <w:shd w:fill="auto" w:val="clear"/>
+          <w:lang w:val="en-US" w:eastAsia="zh-CN" w:bidi="hi-IN"/>
+        </w:rPr>
+      </w:r>
+    </w:p>
+    <w:p>
+      <w:pPr>
+        <w:pStyle w:val="Normal"/>
+        <w:jc w:val="both"/>
+        <w:rPr>
+          <w:color w:val="auto"/>
+        </w:rPr>
+      </w:pPr>
+      <w:r>
+        <w:rPr>
+          <w:rFonts w:eastAsia="Times New Roman" w:cs="Times New Roman" w:ascii="Garamond" w:hAnsi="Garamond"/>
+          <w:color w:val="000000"/>
+          <w:kern w:val="0"/>
+          <w:sz w:val="36"/>
+          <w:szCs w:val="36"/>
+          <w:shd w:fill="auto" w:val="clear"/>
+          <w:lang w:val="en-US" w:eastAsia="zh-CN" w:bidi="hi-IN"/>
+        </w:rPr>
+        <w:t xml:space="preserve">Podemos comparar, de forma simples, aquilo que Deus tem a nos oferecer a uma fonte. Quem vai à fonte com um copo recolhe um copo; quem vai com um </w:t>
+      </w:r>
+      <w:r>
+        <w:rPr>
+          <w:rFonts w:eastAsia="Times New Roman" w:cs="Times New Roman" w:ascii="Garamond" w:hAnsi="Garamond"/>
+          <w:color w:val="000000"/>
+          <w:kern w:val="0"/>
+          <w:sz w:val="36"/>
+          <w:szCs w:val="36"/>
+          <w:shd w:fill="auto" w:val="clear"/>
+          <w:lang w:val="en-US" w:eastAsia="zh-CN" w:bidi="hi-IN"/>
+        </w:rPr>
+        <w:t>vaso, recolhe um vaso e</w:t>
+      </w:r>
+      <w:r>
+        <w:rPr>
+          <w:rFonts w:eastAsia="Times New Roman" w:cs="Times New Roman" w:ascii="Garamond" w:hAnsi="Garamond"/>
+          <w:color w:val="000000"/>
+          <w:kern w:val="0"/>
+          <w:sz w:val="36"/>
+          <w:szCs w:val="36"/>
+          <w:shd w:fill="auto" w:val="clear"/>
+          <w:lang w:val="en-US" w:eastAsia="zh-CN" w:bidi="hi-IN"/>
+        </w:rPr>
+        <w:t xml:space="preserve"> quem vai com um balde recolhe um balde. </w:t>
+      </w:r>
+      <w:r>
+        <w:rPr>
+          <w:rFonts w:eastAsia="Times New Roman" w:cs="Times New Roman" w:ascii="Garamond" w:hAnsi="Garamond"/>
+          <w:color w:val="000000"/>
+          <w:kern w:val="0"/>
+          <w:sz w:val="36"/>
+          <w:szCs w:val="36"/>
+          <w:shd w:fill="auto" w:val="clear"/>
+          <w:lang w:val="en-US" w:eastAsia="zh-CN" w:bidi="hi-IN"/>
+        </w:rPr>
+        <w:t>A</w:t>
+      </w:r>
+      <w:r>
+        <w:rPr>
+          <w:rFonts w:eastAsia="Times New Roman" w:cs="Times New Roman" w:ascii="Garamond" w:hAnsi="Garamond"/>
+          <w:color w:val="000000"/>
+          <w:kern w:val="0"/>
+          <w:sz w:val="36"/>
+          <w:szCs w:val="36"/>
+          <w:shd w:fill="auto" w:val="clear"/>
+          <w:lang w:val="en-US" w:eastAsia="zh-CN" w:bidi="hi-IN"/>
+        </w:rPr>
+        <w:t xml:space="preserve"> fonte </w:t>
+      </w:r>
+      <w:r>
+        <w:rPr>
+          <w:rFonts w:eastAsia="Times New Roman" w:cs="Times New Roman" w:ascii="Garamond" w:hAnsi="Garamond"/>
+          <w:color w:val="000000"/>
+          <w:kern w:val="0"/>
+          <w:sz w:val="36"/>
+          <w:szCs w:val="36"/>
+          <w:shd w:fill="auto" w:val="clear"/>
+          <w:lang w:val="en-US" w:eastAsia="zh-CN" w:bidi="hi-IN"/>
+        </w:rPr>
+        <w:t xml:space="preserve">não </w:t>
+      </w:r>
+      <w:r>
+        <w:rPr>
+          <w:rFonts w:eastAsia="Times New Roman" w:cs="Times New Roman" w:ascii="Garamond" w:hAnsi="Garamond"/>
+          <w:color w:val="000000"/>
+          <w:kern w:val="0"/>
+          <w:sz w:val="36"/>
+          <w:szCs w:val="36"/>
+          <w:shd w:fill="auto" w:val="clear"/>
+          <w:lang w:val="en-US" w:eastAsia="zh-CN" w:bidi="hi-IN"/>
+        </w:rPr>
+        <w:t>se modifica</w:t>
+      </w:r>
+      <w:r>
+        <w:rPr>
+          <w:rFonts w:eastAsia="Times New Roman" w:cs="Times New Roman" w:ascii="Garamond" w:hAnsi="Garamond"/>
+          <w:color w:val="000000"/>
+          <w:kern w:val="0"/>
+          <w:sz w:val="36"/>
+          <w:szCs w:val="36"/>
+          <w:shd w:fill="auto" w:val="clear"/>
+          <w:lang w:val="en-US" w:eastAsia="zh-CN" w:bidi="hi-IN"/>
+        </w:rPr>
+        <w:t xml:space="preserve"> em função do recepiente que cada um leva; ela permanece a mesma</w:t>
+      </w:r>
+      <w:r>
+        <w:rPr>
+          <w:rFonts w:eastAsia="Times New Roman" w:cs="Times New Roman" w:ascii="Garamond" w:hAnsi="Garamond"/>
+          <w:color w:val="000000"/>
+          <w:kern w:val="0"/>
+          <w:sz w:val="36"/>
+          <w:szCs w:val="36"/>
+          <w:shd w:fill="auto" w:val="clear"/>
+          <w:lang w:val="en-US" w:eastAsia="zh-CN" w:bidi="hi-IN"/>
+        </w:rPr>
+        <w:t xml:space="preserve">. </w:t>
+      </w:r>
+    </w:p>
+    <w:p>
+      <w:pPr>
+        <w:pStyle w:val="Normal"/>
+        <w:jc w:val="both"/>
+        <w:rPr>
+          <w:color w:val="auto"/>
+        </w:rPr>
+      </w:pPr>
+      <w:r>
+        <w:rPr>
+          <w:sz w:val="36"/>
+          <w:szCs w:val="36"/>
+        </w:rPr>
+      </w:r>
+    </w:p>
+    <w:p>
+      <w:pPr>
+        <w:pStyle w:val="Normal"/>
+        <w:jc w:val="both"/>
+        <w:rPr>
+          <w:color w:val="auto"/>
+        </w:rPr>
+      </w:pPr>
+      <w:r>
+        <w:rPr>
+          <w:rFonts w:eastAsia="Times New Roman" w:cs="Times New Roman" w:ascii="Garamond" w:hAnsi="Garamond"/>
+          <w:color w:val="000000"/>
+          <w:kern w:val="0"/>
+          <w:sz w:val="36"/>
+          <w:szCs w:val="36"/>
+          <w:shd w:fill="auto" w:val="clear"/>
+          <w:lang w:val="en-US" w:eastAsia="zh-CN" w:bidi="hi-IN"/>
+        </w:rPr>
+        <w:t xml:space="preserve">De igual maneira, a capacidade de doação divina também não se altera em função da </w:t>
+      </w:r>
+      <w:r>
+        <w:rPr>
+          <w:rFonts w:eastAsia="Times New Roman" w:cs="Times New Roman" w:ascii="Garamond" w:hAnsi="Garamond"/>
+          <w:color w:val="000000"/>
+          <w:kern w:val="0"/>
+          <w:sz w:val="36"/>
+          <w:szCs w:val="36"/>
+          <w:shd w:fill="auto" w:val="clear"/>
+          <w:lang w:val="en-US" w:eastAsia="zh-CN" w:bidi="hi-IN"/>
+        </w:rPr>
+        <w:t>nossa capacidade de receber</w:t>
+      </w:r>
+      <w:r>
+        <w:rPr>
+          <w:rFonts w:eastAsia="Times New Roman" w:cs="Times New Roman" w:ascii="Garamond" w:hAnsi="Garamond"/>
+          <w:color w:val="000000"/>
+          <w:kern w:val="0"/>
+          <w:sz w:val="36"/>
+          <w:szCs w:val="36"/>
+          <w:shd w:fill="auto" w:val="clear"/>
+          <w:lang w:val="en-US" w:eastAsia="zh-CN" w:bidi="hi-IN"/>
+        </w:rPr>
+        <w:t xml:space="preserve">. </w:t>
+      </w:r>
+      <w:r>
+        <w:rPr>
+          <w:rFonts w:eastAsia="Times New Roman" w:cs="Times New Roman" w:ascii="Garamond" w:hAnsi="Garamond"/>
+          <w:color w:val="000000"/>
+          <w:kern w:val="0"/>
+          <w:sz w:val="36"/>
+          <w:szCs w:val="36"/>
+          <w:shd w:fill="auto" w:val="clear"/>
+          <w:lang w:val="en-US" w:eastAsia="zh-CN" w:bidi="hi-IN"/>
+        </w:rPr>
+        <w:t xml:space="preserve"> </w:t>
+      </w:r>
+    </w:p>
+    <w:p>
+      <w:pPr>
+        <w:pStyle w:val="Normal"/>
+        <w:jc w:val="both"/>
+        <w:rPr>
           <w:color w:val="1C99E0"/>
         </w:rPr>
       </w:pPr>
       <w:r>
-        <w:rPr>
-          <w:rFonts w:eastAsia="Times New Roman" w:cs="Times New Roman" w:ascii="Garamond" w:hAnsi="Garamond"/>
+        <w:rPr/>
+      </w:r>
+    </w:p>
+    <w:p>
+      <w:pPr>
+        <w:pStyle w:val="Normal"/>
+        <w:jc w:val="both"/>
+        <w:rPr>
           <w:color w:val="1C99E0"/>
-          <w:kern w:val="0"/>
-          <w:sz w:val="36"/>
-          <w:szCs w:val="36"/>
-          <w:shd w:fill="auto" w:val="clear"/>
-          <w:lang w:val="en-US" w:eastAsia="zh-CN" w:bidi="hi-IN"/>
-        </w:rPr>
-        <w:t xml:space="preserve">[ Inicío de tópico a ser </w:t>
-      </w:r>
-      <w:r>
-        <w:rPr>
-          <w:rFonts w:eastAsia="Times New Roman" w:cs="Times New Roman" w:ascii="Garamond" w:hAnsi="Garamond"/>
+        </w:rPr>
+      </w:pPr>
+      <w:r>
+        <w:rPr>
           <w:color w:val="1C99E0"/>
-          <w:kern w:val="0"/>
-          <w:sz w:val="36"/>
-          <w:szCs w:val="36"/>
-          <w:shd w:fill="auto" w:val="clear"/>
-          <w:lang w:val="en-US" w:eastAsia="zh-CN" w:bidi="hi-IN"/>
-        </w:rPr>
-        <w:t>encaixado</w:t>
-      </w:r>
-      <w:r>
-        <w:rPr>
-          <w:rFonts w:eastAsia="Times New Roman" w:cs="Times New Roman" w:ascii="Garamond" w:hAnsi="Garamond"/>
+        </w:rPr>
+      </w:r>
+    </w:p>
+    <w:p>
+      <w:pPr>
+        <w:pStyle w:val="Normal"/>
+        <w:jc w:val="both"/>
+        <w:rPr>
           <w:color w:val="1C99E0"/>
-          <w:kern w:val="0"/>
-          <w:sz w:val="36"/>
-          <w:szCs w:val="36"/>
-          <w:shd w:fill="auto" w:val="clear"/>
-          <w:lang w:val="en-US" w:eastAsia="zh-CN" w:bidi="hi-IN"/>
-        </w:rPr>
-        <w:t xml:space="preserve"> ]</w:t>
+        </w:rPr>
+      </w:pPr>
+      <w:r>
+        <w:rPr>
+          <w:rFonts w:eastAsia="Times New Roman" w:cs="Times New Roman" w:ascii="Garamond" w:hAnsi="Garamond"/>
+          <w:color w:val="1C99E0"/>
+          <w:kern w:val="0"/>
+          <w:sz w:val="36"/>
+          <w:szCs w:val="36"/>
+          <w:shd w:fill="auto" w:val="clear"/>
+          <w:lang w:val="en-US" w:eastAsia="zh-CN" w:bidi="hi-IN"/>
+        </w:rPr>
+        <w:t>[ Início de texto que pode ser usado para explicar o funcionamento da prece ]</w:t>
+      </w:r>
+    </w:p>
+    <w:p>
+      <w:pPr>
+        <w:pStyle w:val="Normal"/>
+        <w:jc w:val="both"/>
+        <w:rPr>
+          <w:color w:val="1C99E0"/>
+        </w:rPr>
+      </w:pPr>
+      <w:r>
+        <w:rPr>
+          <w:color w:val="1C99E0"/>
+        </w:rPr>
+      </w:r>
+    </w:p>
+    <w:p>
+      <w:pPr>
+        <w:pStyle w:val="Normal"/>
+        <w:jc w:val="both"/>
+        <w:rPr>
+          <w:color w:val="auto"/>
+        </w:rPr>
+      </w:pPr>
+      <w:r>
+        <w:rPr>
+          <w:rFonts w:eastAsia="Times New Roman" w:cs="Times New Roman" w:ascii="Garamond" w:hAnsi="Garamond"/>
+          <w:color w:val="000000"/>
+          <w:kern w:val="0"/>
+          <w:sz w:val="36"/>
+          <w:szCs w:val="36"/>
+          <w:shd w:fill="auto" w:val="clear"/>
+          <w:lang w:val="en-US" w:eastAsia="zh-CN" w:bidi="hi-IN"/>
+        </w:rPr>
+        <w:t>Sendo os fluidos o veículo do pensamento, este atua sobre os fluidos como o som sobre o ar; eles nos trazem o pensamento, como o ar nos traz o som. Pode-se pois dizer, sem receio de errar, que há, nesses fluidos, ondas e raios de pensamentos, que se cruzam sem se confundirem, como há no ar ondas e raios sonoros.</w:t>
       </w:r>
     </w:p>
     <w:p>
@@ -366,77 +1675,34 @@
       </w:pPr>
       <w:r>
         <w:rPr>
+          <w:rFonts w:eastAsia="Times New Roman" w:cs="Times New Roman" w:ascii="Garamond" w:hAnsi="Garamond"/>
+          <w:kern w:val="0"/>
+          <w:sz w:val="36"/>
+          <w:szCs w:val="36"/>
+          <w:shd w:fill="auto" w:val="clear"/>
+          <w:lang w:val="en-US" w:eastAsia="zh-CN" w:bidi="hi-IN"/>
+        </w:rPr>
+      </w:r>
+    </w:p>
+    <w:p>
+      <w:pPr>
+        <w:pStyle w:val="Normal"/>
+        <w:jc w:val="both"/>
+        <w:rPr>
           <w:color w:val="1C99E0"/>
         </w:rPr>
-      </w:r>
-    </w:p>
-    <w:p>
-      <w:pPr>
-        <w:pStyle w:val="Normal"/>
-        <w:jc w:val="both"/>
-        <w:rPr>
-          <w:color w:val="auto"/>
-        </w:rPr>
-      </w:pPr>
-      <w:r>
-        <w:rPr>
-          <w:rFonts w:eastAsia="Times New Roman" w:cs="Times New Roman" w:ascii="Garamond" w:hAnsi="Garamond"/>
-          <w:color w:val="000000"/>
-          <w:kern w:val="0"/>
-          <w:sz w:val="36"/>
-          <w:szCs w:val="36"/>
-          <w:shd w:fill="auto" w:val="clear"/>
-          <w:lang w:val="en-US" w:eastAsia="zh-CN" w:bidi="hi-IN"/>
-        </w:rPr>
-        <w:t>O Pedi e Obtereis é ensinado por Jesus em duas ocasiões: a primeira está em Mateus 7:7-8 e acontece durante o sermão do monte quando Jesus fala à multidão. A segunda está em Lucas 11:</w:t>
-      </w:r>
-      <w:r>
-        <w:rPr>
-          <w:rFonts w:eastAsia="Times New Roman" w:cs="Times New Roman" w:ascii="Garamond" w:hAnsi="Garamond"/>
-          <w:color w:val="000000"/>
-          <w:kern w:val="0"/>
-          <w:sz w:val="36"/>
-          <w:szCs w:val="36"/>
-          <w:shd w:fill="auto" w:val="clear"/>
-          <w:lang w:val="en-US" w:eastAsia="zh-CN" w:bidi="hi-IN"/>
-        </w:rPr>
-        <w:t xml:space="preserve">9-11 e ocorre logo depois que </w:t>
-      </w:r>
-      <w:r>
-        <w:rPr>
-          <w:rFonts w:eastAsia="Times New Roman" w:cs="Times New Roman" w:ascii="Garamond" w:hAnsi="Garamond"/>
-          <w:color w:val="000000"/>
-          <w:kern w:val="0"/>
-          <w:sz w:val="36"/>
-          <w:szCs w:val="36"/>
-          <w:shd w:fill="auto" w:val="clear"/>
-          <w:lang w:val="en-US" w:eastAsia="zh-CN" w:bidi="hi-IN"/>
-        </w:rPr>
-        <w:t xml:space="preserve">Jesus ensina aos discípulos a oração do Pai-Nosso. </w:t>
-      </w:r>
-      <w:r>
-        <w:rPr>
-          <w:rFonts w:eastAsia="Times New Roman" w:cs="Times New Roman" w:ascii="Garamond" w:hAnsi="Garamond"/>
-          <w:color w:val="000000"/>
-          <w:kern w:val="0"/>
-          <w:sz w:val="36"/>
-          <w:szCs w:val="36"/>
-          <w:shd w:fill="auto" w:val="clear"/>
-          <w:lang w:val="en-US" w:eastAsia="zh-CN" w:bidi="hi-IN"/>
-        </w:rPr>
-        <w:t>Após ensinar o Pai Nosso,</w:t>
-      </w:r>
-      <w:r>
-        <w:rPr>
-          <w:rFonts w:eastAsia="Times New Roman" w:cs="Times New Roman" w:ascii="Garamond" w:hAnsi="Garamond"/>
-          <w:color w:val="000000"/>
-          <w:kern w:val="0"/>
-          <w:sz w:val="36"/>
-          <w:szCs w:val="36"/>
-          <w:shd w:fill="auto" w:val="clear"/>
-          <w:lang w:val="en-US" w:eastAsia="zh-CN" w:bidi="hi-IN"/>
-        </w:rPr>
-        <w:t xml:space="preserve"> Jesus apresenta uma pequena parábola, conhecida como a Parábola do Amigo Importuno.</w:t>
+      </w:pPr>
+      <w:r>
+        <w:rPr>
+          <w:rFonts w:eastAsia="Times New Roman" w:cs="Times New Roman" w:ascii="Garamond" w:hAnsi="Garamond"/>
+          <w:color w:val="1C99E0"/>
+          <w:kern w:val="0"/>
+          <w:sz w:val="36"/>
+          <w:szCs w:val="36"/>
+          <w:shd w:fill="auto" w:val="clear"/>
+          <w:lang w:val="en-US" w:eastAsia="zh-CN" w:bidi="hi-IN"/>
+        </w:rPr>
+        <w:t>[ Término de texto que pode ser usado para explicar o funcionamento da prece ]</w:t>
       </w:r>
     </w:p>
     <w:p>
@@ -454,29 +1720,34 @@
       </w:pPr>
       <w:r>
         <w:rPr>
-          <w:color w:val="auto"/>
-        </w:rPr>
-      </w:r>
-    </w:p>
-    <w:p>
-      <w:pPr>
-        <w:pStyle w:val="Normal"/>
-        <w:jc w:val="both"/>
-        <w:rPr>
-          <w:color w:val="auto"/>
-        </w:rPr>
-      </w:pPr>
-      <w:r>
-        <w:rPr>
-          <w:rFonts w:eastAsia="Times New Roman" w:cs="Times New Roman" w:ascii="Garamond" w:hAnsi="Garamond"/>
-          <w:color w:val="000000"/>
-          <w:kern w:val="0"/>
-          <w:sz w:val="36"/>
-          <w:szCs w:val="36"/>
-          <w:shd w:fill="auto" w:val="clear"/>
-          <w:lang w:val="en-US" w:eastAsia="zh-CN" w:bidi="hi-IN"/>
-        </w:rPr>
-        <w:t>Nessa parábola, Jesus conta que um homem recebe a visita inesperada de um amigo, à meia-noite, e não tem nada para lhe oferecer. Então ele procura outro amigo e lhe pede três pães emprestados. Do lado de dentro da casa, o amigo responde que não pode atender: a porta já está fechada, os filhos estão deitados e ele não quer ser incomodado. Jesus conclui dizendo que, mesmo não se levantando por amizade, aquele homem acabará atendendo ao pedido por causa da insistência de quem bate à porta.</w:t>
+          <w:rFonts w:eastAsia="Times New Roman" w:cs="Times New Roman" w:ascii="Garamond" w:hAnsi="Garamond"/>
+          <w:kern w:val="0"/>
+          <w:sz w:val="36"/>
+          <w:szCs w:val="36"/>
+          <w:shd w:fill="auto" w:val="clear"/>
+          <w:lang w:val="en-US" w:eastAsia="zh-CN" w:bidi="hi-IN"/>
+        </w:rPr>
+      </w:r>
+    </w:p>
+    <w:p>
+      <w:pPr>
+        <w:pStyle w:val="Normal"/>
+        <w:jc w:val="both"/>
+        <w:rPr>
+          <w:color w:val="1C99E0"/>
+        </w:rPr>
+      </w:pPr>
+      <w:r>
+        <w:rPr>
+          <w:rFonts w:eastAsia="Times New Roman" w:cs="Times New Roman" w:ascii="Garamond" w:hAnsi="Garamond"/>
+          <w:color w:val="1C99E0"/>
+          <w:kern w:val="0"/>
+          <w:sz w:val="36"/>
+          <w:szCs w:val="36"/>
+          <w:shd w:fill="auto" w:val="clear"/>
+          <w:lang w:val="en-US" w:eastAsia="zh-CN" w:bidi="hi-IN"/>
+        </w:rPr>
+        <w:t>[ Início Prece refratada ]</w:t>
       </w:r>
     </w:p>
     <w:p>
@@ -494,29 +1765,34 @@
       </w:pPr>
       <w:r>
         <w:rPr>
-          <w:color w:val="auto"/>
-        </w:rPr>
-      </w:r>
-    </w:p>
-    <w:p>
-      <w:pPr>
-        <w:pStyle w:val="Normal"/>
-        <w:jc w:val="both"/>
-        <w:rPr>
-          <w:color w:val="auto"/>
-        </w:rPr>
-      </w:pPr>
-      <w:r>
-        <w:rPr>
-          <w:rFonts w:eastAsia="Times New Roman" w:cs="Times New Roman" w:ascii="Garamond" w:hAnsi="Garamond"/>
-          <w:color w:val="000000"/>
-          <w:kern w:val="0"/>
-          <w:sz w:val="36"/>
-          <w:szCs w:val="36"/>
-          <w:shd w:fill="auto" w:val="clear"/>
-          <w:lang w:val="en-US" w:eastAsia="zh-CN" w:bidi="hi-IN"/>
-        </w:rPr>
-        <w:t>Com essa parábola, Jesus nos ensina que é necessário pedir com perseverança, criando em nós mesmos uma condição interior de receptividade. Todas as parábolas de Jesus possuem um elemento material e um elemento espiritual, e é fundamental que saibamos ir além da letra, buscando o ensinamento profundo que elas encerram. Evidentemente, Deus não pode se sentir importunado por nossas preces, nem nos atende para se livrar de pedidos insistentes. O ensinamento de Jesus aponta para outra direção.</w:t>
+          <w:rFonts w:eastAsia="Times New Roman" w:cs="Times New Roman" w:ascii="Garamond" w:hAnsi="Garamond"/>
+          <w:kern w:val="0"/>
+          <w:sz w:val="36"/>
+          <w:szCs w:val="36"/>
+          <w:shd w:fill="auto" w:val="clear"/>
+          <w:lang w:val="en-US" w:eastAsia="zh-CN" w:bidi="hi-IN"/>
+        </w:rPr>
+      </w:r>
+    </w:p>
+    <w:p>
+      <w:pPr>
+        <w:pStyle w:val="Normal"/>
+        <w:jc w:val="both"/>
+        <w:rPr>
+          <w:color w:val="auto"/>
+        </w:rPr>
+      </w:pPr>
+      <w:r>
+        <w:rPr>
+          <w:rFonts w:eastAsia="Times New Roman" w:cs="Times New Roman" w:ascii="Garamond" w:hAnsi="Garamond"/>
+          <w:color w:val="000000"/>
+          <w:kern w:val="0"/>
+          <w:sz w:val="36"/>
+          <w:szCs w:val="36"/>
+          <w:shd w:fill="auto" w:val="clear"/>
+          <w:lang w:val="en-US" w:eastAsia="zh-CN" w:bidi="hi-IN"/>
+        </w:rPr>
+        <w:t>Em toda parte estamos envolvidos pelo amor e pela solicitude de Deus. Nenhuma prece sincera se perde, ainda que, muitas vezes, não seja atendida exatamente da forma ou pelo caminho que imaginamos.</w:t>
       </w:r>
     </w:p>
     <w:p>
@@ -534,29 +1810,34 @@
       </w:pPr>
       <w:r>
         <w:rPr>
-          <w:color w:val="auto"/>
-        </w:rPr>
-      </w:r>
-    </w:p>
-    <w:p>
-      <w:pPr>
-        <w:pStyle w:val="Normal"/>
-        <w:jc w:val="both"/>
-        <w:rPr>
-          <w:color w:val="auto"/>
-        </w:rPr>
-      </w:pPr>
-      <w:r>
-        <w:rPr>
-          <w:rFonts w:eastAsia="Times New Roman" w:cs="Times New Roman" w:ascii="Garamond" w:hAnsi="Garamond"/>
-          <w:color w:val="000000"/>
-          <w:kern w:val="0"/>
-          <w:sz w:val="36"/>
-          <w:szCs w:val="36"/>
-          <w:shd w:fill="auto" w:val="clear"/>
-          <w:lang w:val="en-US" w:eastAsia="zh-CN" w:bidi="hi-IN"/>
-        </w:rPr>
-        <w:t>Muitos podem questionar: se Deus conhece perfeitamente tudo aquilo de que necessitamos antes mesmo de pedirmos, por que então precisamos orar? A resposta é simples e profunda: a oração não tem por finalidade informar a Deus sobre nossas necessidades, mas transformar a nós mesmos. Orar é criar em nosso íntimo as condições necessárias para receber aquilo que a Providência pode nos oferecer.</w:t>
+          <w:rFonts w:eastAsia="Times New Roman" w:cs="Times New Roman" w:ascii="Garamond" w:hAnsi="Garamond"/>
+          <w:kern w:val="0"/>
+          <w:sz w:val="36"/>
+          <w:szCs w:val="36"/>
+          <w:shd w:fill="auto" w:val="clear"/>
+          <w:lang w:val="en-US" w:eastAsia="zh-CN" w:bidi="hi-IN"/>
+        </w:rPr>
+      </w:r>
+    </w:p>
+    <w:p>
+      <w:pPr>
+        <w:pStyle w:val="Normal"/>
+        <w:jc w:val="both"/>
+        <w:rPr>
+          <w:color w:val="auto"/>
+        </w:rPr>
+      </w:pPr>
+      <w:r>
+        <w:rPr>
+          <w:rFonts w:eastAsia="Times New Roman" w:cs="Times New Roman" w:ascii="Garamond" w:hAnsi="Garamond"/>
+          <w:color w:val="000000"/>
+          <w:kern w:val="0"/>
+          <w:sz w:val="36"/>
+          <w:szCs w:val="36"/>
+          <w:shd w:fill="auto" w:val="clear"/>
+          <w:lang w:val="en-US" w:eastAsia="zh-CN" w:bidi="hi-IN"/>
+        </w:rPr>
+        <w:t>Essa realidade espiritual é ilustrada de maneira muito tocante na obra Entre a Terra e o Céu, psicografada por Chico Xavier. No capítulo 2, intitulado “No Cenário Terrestre”, encontramos o drama de uma jovem chamada Evelina, então com apenas quinze anos de idade.</w:t>
       </w:r>
     </w:p>
     <w:p>
@@ -574,29 +1855,34 @@
       </w:pPr>
       <w:r>
         <w:rPr>
-          <w:color w:val="auto"/>
-        </w:rPr>
-      </w:r>
-    </w:p>
-    <w:p>
-      <w:pPr>
-        <w:pStyle w:val="Normal"/>
-        <w:jc w:val="both"/>
-        <w:rPr>
-          <w:color w:val="auto"/>
-        </w:rPr>
-      </w:pPr>
-      <w:r>
-        <w:rPr>
-          <w:rFonts w:eastAsia="Times New Roman" w:cs="Times New Roman" w:ascii="Garamond" w:hAnsi="Garamond"/>
-          <w:color w:val="000000"/>
-          <w:kern w:val="0"/>
-          <w:sz w:val="36"/>
-          <w:szCs w:val="36"/>
-          <w:shd w:fill="auto" w:val="clear"/>
-          <w:lang w:val="en-US" w:eastAsia="zh-CN" w:bidi="hi-IN"/>
-        </w:rPr>
-        <w:t>Através do livre-arbítrio, podemos ampliar ou reduzir nossa capacidade de recepção dos dons divinos. O pedir, o buscar e o bater não existem para convencer Deus, mas para alargar, pouco a pouco, o nosso recipiente interior. É nesse sentido que a oração se torna um exercício de crescimento espiritual.</w:t>
+          <w:rFonts w:eastAsia="Times New Roman" w:cs="Times New Roman" w:ascii="Garamond" w:hAnsi="Garamond"/>
+          <w:kern w:val="0"/>
+          <w:sz w:val="36"/>
+          <w:szCs w:val="36"/>
+          <w:shd w:fill="auto" w:val="clear"/>
+          <w:lang w:val="en-US" w:eastAsia="zh-CN" w:bidi="hi-IN"/>
+        </w:rPr>
+      </w:r>
+    </w:p>
+    <w:p>
+      <w:pPr>
+        <w:pStyle w:val="Normal"/>
+        <w:jc w:val="both"/>
+        <w:rPr>
+          <w:color w:val="auto"/>
+        </w:rPr>
+      </w:pPr>
+      <w:r>
+        <w:rPr>
+          <w:rFonts w:eastAsia="Times New Roman" w:cs="Times New Roman" w:ascii="Garamond" w:hAnsi="Garamond"/>
+          <w:color w:val="000000"/>
+          <w:kern w:val="0"/>
+          <w:sz w:val="36"/>
+          <w:szCs w:val="36"/>
+          <w:shd w:fill="auto" w:val="clear"/>
+          <w:lang w:val="en-US" w:eastAsia="zh-CN" w:bidi="hi-IN"/>
+        </w:rPr>
+        <w:t>Evelina vivia uma situação familiar profundamente dolorosa. Sua mãe havia desencarnado, o pai encontrava-se gravemente enfermo após a morte trágica do filho mais novo, e o lar estava mergulhado em conflitos emocionais intensos. A madrasta, consumida pela culpa e pelo sofrimento, encontrava-se fragilizada espiritualmente, enquanto o ambiente doméstico era marcado por desequilíbrios e influências perturbadoras.</w:t>
       </w:r>
     </w:p>
     <w:p>
@@ -614,125 +1900,34 @@
       </w:pPr>
       <w:r>
         <w:rPr>
-          <w:color w:val="auto"/>
-        </w:rPr>
-      </w:r>
-    </w:p>
-    <w:p>
-      <w:pPr>
-        <w:pStyle w:val="Normal"/>
-        <w:jc w:val="both"/>
-        <w:rPr>
-          <w:color w:val="auto"/>
-        </w:rPr>
-      </w:pPr>
-      <w:r>
-        <w:rPr>
-          <w:rFonts w:eastAsia="Times New Roman" w:cs="Times New Roman" w:ascii="Garamond" w:hAnsi="Garamond"/>
-          <w:color w:val="000000"/>
-          <w:kern w:val="0"/>
-          <w:sz w:val="36"/>
-          <w:szCs w:val="36"/>
-          <w:shd w:fill="auto" w:val="clear"/>
-          <w:lang w:val="en-US" w:eastAsia="zh-CN" w:bidi="hi-IN"/>
-        </w:rPr>
-        <w:t>Podemos comparar, de forma simples, aquilo que Deus tem a nos oferecer a um</w:t>
-      </w:r>
-      <w:r>
-        <w:rPr>
-          <w:rFonts w:eastAsia="Times New Roman" w:cs="Times New Roman" w:ascii="Garamond" w:hAnsi="Garamond"/>
-          <w:color w:val="000000"/>
-          <w:kern w:val="0"/>
-          <w:sz w:val="36"/>
-          <w:szCs w:val="36"/>
-          <w:shd w:fill="auto" w:val="clear"/>
-          <w:lang w:val="en-US" w:eastAsia="zh-CN" w:bidi="hi-IN"/>
-        </w:rPr>
-        <w:t>a</w:t>
-      </w:r>
-      <w:r>
-        <w:rPr>
-          <w:rFonts w:eastAsia="Times New Roman" w:cs="Times New Roman" w:ascii="Garamond" w:hAnsi="Garamond"/>
-          <w:color w:val="000000"/>
-          <w:kern w:val="0"/>
-          <w:sz w:val="36"/>
-          <w:szCs w:val="36"/>
-          <w:shd w:fill="auto" w:val="clear"/>
-          <w:lang w:val="en-US" w:eastAsia="zh-CN" w:bidi="hi-IN"/>
-        </w:rPr>
-        <w:t xml:space="preserve"> </w:t>
-      </w:r>
-      <w:r>
-        <w:rPr>
-          <w:rFonts w:eastAsia="Times New Roman" w:cs="Times New Roman" w:ascii="Garamond" w:hAnsi="Garamond"/>
-          <w:color w:val="000000"/>
-          <w:kern w:val="0"/>
-          <w:sz w:val="36"/>
-          <w:szCs w:val="36"/>
-          <w:shd w:fill="auto" w:val="clear"/>
-          <w:lang w:val="en-US" w:eastAsia="zh-CN" w:bidi="hi-IN"/>
-        </w:rPr>
-        <w:t>fonte</w:t>
-      </w:r>
-      <w:r>
-        <w:rPr>
-          <w:rFonts w:eastAsia="Times New Roman" w:cs="Times New Roman" w:ascii="Garamond" w:hAnsi="Garamond"/>
-          <w:color w:val="000000"/>
-          <w:kern w:val="0"/>
-          <w:sz w:val="36"/>
-          <w:szCs w:val="36"/>
-          <w:shd w:fill="auto" w:val="clear"/>
-          <w:lang w:val="en-US" w:eastAsia="zh-CN" w:bidi="hi-IN"/>
-        </w:rPr>
-        <w:t>. Quem vai à</w:t>
-      </w:r>
-      <w:r>
-        <w:rPr>
-          <w:rFonts w:eastAsia="Times New Roman" w:cs="Times New Roman" w:ascii="Garamond" w:hAnsi="Garamond"/>
-          <w:color w:val="000000"/>
-          <w:kern w:val="0"/>
-          <w:sz w:val="36"/>
-          <w:szCs w:val="36"/>
-          <w:shd w:fill="auto" w:val="clear"/>
-          <w:lang w:val="en-US" w:eastAsia="zh-CN" w:bidi="hi-IN"/>
-        </w:rPr>
-        <w:t xml:space="preserve"> fonte</w:t>
-      </w:r>
-      <w:r>
-        <w:rPr>
-          <w:rFonts w:eastAsia="Times New Roman" w:cs="Times New Roman" w:ascii="Garamond" w:hAnsi="Garamond"/>
-          <w:color w:val="000000"/>
-          <w:kern w:val="0"/>
-          <w:sz w:val="36"/>
-          <w:szCs w:val="36"/>
-          <w:shd w:fill="auto" w:val="clear"/>
-          <w:lang w:val="en-US" w:eastAsia="zh-CN" w:bidi="hi-IN"/>
-        </w:rPr>
-        <w:t xml:space="preserve"> com um copo recolhe um copo de água; quem vai com um recipiente maior recolhe mais; quem vai com um balde recolhe um balde. Em nenhum desses casos </w:t>
-      </w:r>
-      <w:r>
-        <w:rPr>
-          <w:rFonts w:eastAsia="Times New Roman" w:cs="Times New Roman" w:ascii="Garamond" w:hAnsi="Garamond"/>
-          <w:color w:val="000000"/>
-          <w:kern w:val="0"/>
-          <w:sz w:val="36"/>
-          <w:szCs w:val="36"/>
-          <w:shd w:fill="auto" w:val="clear"/>
-          <w:lang w:val="en-US" w:eastAsia="zh-CN" w:bidi="hi-IN"/>
-        </w:rPr>
-        <w:t xml:space="preserve">a fonte </w:t>
-      </w:r>
-      <w:r>
-        <w:rPr>
-          <w:rFonts w:eastAsia="Times New Roman" w:cs="Times New Roman" w:ascii="Garamond" w:hAnsi="Garamond"/>
-          <w:color w:val="000000"/>
-          <w:kern w:val="0"/>
-          <w:sz w:val="36"/>
-          <w:szCs w:val="36"/>
-          <w:shd w:fill="auto" w:val="clear"/>
-          <w:lang w:val="en-US" w:eastAsia="zh-CN" w:bidi="hi-IN"/>
-        </w:rPr>
-        <w:t>se modifica. Da mesma forma, nossa capacidade de receber não altera em nada a capacidade infinita de doação divina — ela diz respeito apenas ao quanto nós estamos preparados para acolher.</w:t>
+          <w:rFonts w:eastAsia="Times New Roman" w:cs="Times New Roman" w:ascii="Garamond" w:hAnsi="Garamond"/>
+          <w:kern w:val="0"/>
+          <w:sz w:val="36"/>
+          <w:szCs w:val="36"/>
+          <w:shd w:fill="auto" w:val="clear"/>
+          <w:lang w:val="en-US" w:eastAsia="zh-CN" w:bidi="hi-IN"/>
+        </w:rPr>
+      </w:r>
+    </w:p>
+    <w:p>
+      <w:pPr>
+        <w:pStyle w:val="Normal"/>
+        <w:jc w:val="both"/>
+        <w:rPr>
+          <w:color w:val="auto"/>
+        </w:rPr>
+      </w:pPr>
+      <w:r>
+        <w:rPr>
+          <w:rFonts w:eastAsia="Times New Roman" w:cs="Times New Roman" w:ascii="Garamond" w:hAnsi="Garamond"/>
+          <w:color w:val="000000"/>
+          <w:kern w:val="0"/>
+          <w:sz w:val="36"/>
+          <w:szCs w:val="36"/>
+          <w:shd w:fill="auto" w:val="clear"/>
+          <w:lang w:val="en-US" w:eastAsia="zh-CN" w:bidi="hi-IN"/>
+        </w:rPr>
+        <w:t>Diante de tamanho sofrimento, Evelina orava com insistência e dor, suplicando pela proteção da mãe desencarnada. No entanto, aquela a quem a jovem dirigia suas preces não se encontrava em condições espirituais de ouvi-la ou de oferecer o auxílio solicitado. Ainda assim, a oração da menina não se perdeu.</w:t>
       </w:r>
     </w:p>
     <w:p>
@@ -750,29 +1945,34 @@
       </w:pPr>
       <w:r>
         <w:rPr>
-          <w:color w:val="auto"/>
-        </w:rPr>
-      </w:r>
-    </w:p>
-    <w:p>
-      <w:pPr>
-        <w:pStyle w:val="Normal"/>
-        <w:jc w:val="both"/>
-        <w:rPr>
-          <w:color w:val="auto"/>
-        </w:rPr>
-      </w:pPr>
-      <w:r>
-        <w:rPr>
-          <w:rFonts w:eastAsia="Times New Roman" w:cs="Times New Roman" w:ascii="Garamond" w:hAnsi="Garamond"/>
-          <w:color w:val="000000"/>
-          <w:kern w:val="0"/>
-          <w:sz w:val="36"/>
-          <w:szCs w:val="36"/>
-          <w:shd w:fill="auto" w:val="clear"/>
-          <w:lang w:val="en-US" w:eastAsia="zh-CN" w:bidi="hi-IN"/>
-        </w:rPr>
-        <w:t>Observando alguns elementos simbólicos da parábola, encontramos ensinamentos ainda mais profundos. Jesus menciona que o homem procura o amigo à meia-noite, horário que aparece com frequência no Evangelho como símbolo de crise, de dificuldade e de escuridão interior. Muitas vezes desperdiçamos as oportunidades durante a “luz do dia” e só buscamos auxílio quando a dor, o sofrimento ou a aflição já se instalaram em nossas vidas. A noite simboliza justamente esse momento em que as sombras interiores nos despertam para a necessidade de buscar a luz.</w:t>
+          <w:rFonts w:eastAsia="Times New Roman" w:cs="Times New Roman" w:ascii="Garamond" w:hAnsi="Garamond"/>
+          <w:kern w:val="0"/>
+          <w:sz w:val="36"/>
+          <w:szCs w:val="36"/>
+          <w:shd w:fill="auto" w:val="clear"/>
+          <w:lang w:val="en-US" w:eastAsia="zh-CN" w:bidi="hi-IN"/>
+        </w:rPr>
+      </w:r>
+    </w:p>
+    <w:p>
+      <w:pPr>
+        <w:pStyle w:val="Normal"/>
+        <w:jc w:val="both"/>
+        <w:rPr>
+          <w:color w:val="auto"/>
+        </w:rPr>
+      </w:pPr>
+      <w:r>
+        <w:rPr>
+          <w:rFonts w:eastAsia="Times New Roman" w:cs="Times New Roman" w:ascii="Garamond" w:hAnsi="Garamond"/>
+          <w:color w:val="000000"/>
+          <w:kern w:val="0"/>
+          <w:sz w:val="36"/>
+          <w:szCs w:val="36"/>
+          <w:shd w:fill="auto" w:val="clear"/>
+          <w:lang w:val="en-US" w:eastAsia="zh-CN" w:bidi="hi-IN"/>
+        </w:rPr>
+        <w:t>Orando com profunda sinceridade, fé e elevação de sentimentos, Evelina produziu uma vibração tão intensa que sua súplica, não encontrando acolhimento no destino inicial, mudou de direção. Sustentada pela força moral que a animava, a prece ultrapassou planos espirituais inferiores e alcançou esferas onde havia trabalhadores espirituais capazes de compreender a situação e prestar o auxílio necessário.</w:t>
       </w:r>
     </w:p>
     <w:p>
@@ -790,29 +1990,34 @@
       </w:pPr>
       <w:r>
         <w:rPr>
-          <w:color w:val="auto"/>
-        </w:rPr>
-      </w:r>
-    </w:p>
-    <w:p>
-      <w:pPr>
-        <w:pStyle w:val="Normal"/>
-        <w:jc w:val="both"/>
-        <w:rPr>
-          <w:color w:val="auto"/>
-        </w:rPr>
-      </w:pPr>
-      <w:r>
-        <w:rPr>
-          <w:rFonts w:eastAsia="Times New Roman" w:cs="Times New Roman" w:ascii="Garamond" w:hAnsi="Garamond"/>
-          <w:color w:val="000000"/>
-          <w:kern w:val="0"/>
-          <w:sz w:val="36"/>
-          <w:szCs w:val="36"/>
-          <w:shd w:fill="auto" w:val="clear"/>
-          <w:lang w:val="en-US" w:eastAsia="zh-CN" w:bidi="hi-IN"/>
-        </w:rPr>
-        <w:t>O amigo que está dentro da casa pode representar os valores superiores que já existem em nós, mas que muitas vezes preferimos manter adormecidos. Ele diz que está deitado e não quer se levantar, o que simboliza nossa resistência em sair da zona de conforto. Sabemos, intuitivamente, que despertar esses valores implicará esforço, mudança e compromisso com o bem.</w:t>
+          <w:rFonts w:eastAsia="Times New Roman" w:cs="Times New Roman" w:ascii="Garamond" w:hAnsi="Garamond"/>
+          <w:kern w:val="0"/>
+          <w:sz w:val="36"/>
+          <w:szCs w:val="36"/>
+          <w:shd w:fill="auto" w:val="clear"/>
+          <w:lang w:val="en-US" w:eastAsia="zh-CN" w:bidi="hi-IN"/>
+        </w:rPr>
+      </w:r>
+    </w:p>
+    <w:p>
+      <w:pPr>
+        <w:pStyle w:val="Normal"/>
+        <w:jc w:val="both"/>
+        <w:rPr>
+          <w:color w:val="auto"/>
+        </w:rPr>
+      </w:pPr>
+      <w:r>
+        <w:rPr>
+          <w:rFonts w:eastAsia="Times New Roman" w:cs="Times New Roman" w:ascii="Garamond" w:hAnsi="Garamond"/>
+          <w:color w:val="000000"/>
+          <w:kern w:val="0"/>
+          <w:sz w:val="36"/>
+          <w:szCs w:val="36"/>
+          <w:shd w:fill="auto" w:val="clear"/>
+          <w:lang w:val="en-US" w:eastAsia="zh-CN" w:bidi="hi-IN"/>
+        </w:rPr>
+        <w:t>Esse episódio nos ajuda a compreender o fenômeno conhecido como prece refratada. Assim como um raio de luz, ao encontrar um obstáculo, pode desviar seu curso e seguir por outro caminho, a oração verdadeira, quando não encontra resposta no ponto a que foi dirigida, é naturalmente conduzida às regiões espirituais compatíveis com sua elevação e com a justiça do pedido.</w:t>
       </w:r>
     </w:p>
     <w:p>
@@ -830,29 +2035,34 @@
       </w:pPr>
       <w:r>
         <w:rPr>
-          <w:color w:val="auto"/>
-        </w:rPr>
-      </w:r>
-    </w:p>
-    <w:p>
-      <w:pPr>
-        <w:pStyle w:val="Normal"/>
-        <w:jc w:val="both"/>
-        <w:rPr>
-          <w:color w:val="auto"/>
-        </w:rPr>
-      </w:pPr>
-      <w:r>
-        <w:rPr>
-          <w:rFonts w:eastAsia="Times New Roman" w:cs="Times New Roman" w:ascii="Garamond" w:hAnsi="Garamond"/>
-          <w:color w:val="000000"/>
-          <w:kern w:val="0"/>
-          <w:sz w:val="36"/>
-          <w:szCs w:val="36"/>
-          <w:shd w:fill="auto" w:val="clear"/>
-          <w:lang w:val="en-US" w:eastAsia="zh-CN" w:bidi="hi-IN"/>
-        </w:rPr>
-        <w:t>Já o amigo que bate à porta representa os estímulos exteriores que recebemos ao longo da vida — nem sempre agradáveis — e que nos impulsionam a buscar, dentro de nós mesmos, esses valores mais elevados. São as experiências, os desafios e as dificuldades que nos convidam a olhar para dentro e a reconhecer aquilo que precisa ser transformado.</w:t>
+          <w:rFonts w:eastAsia="Times New Roman" w:cs="Times New Roman" w:ascii="Garamond" w:hAnsi="Garamond"/>
+          <w:kern w:val="0"/>
+          <w:sz w:val="36"/>
+          <w:szCs w:val="36"/>
+          <w:shd w:fill="auto" w:val="clear"/>
+          <w:lang w:val="en-US" w:eastAsia="zh-CN" w:bidi="hi-IN"/>
+        </w:rPr>
+      </w:r>
+    </w:p>
+    <w:p>
+      <w:pPr>
+        <w:pStyle w:val="Normal"/>
+        <w:jc w:val="both"/>
+        <w:rPr>
+          <w:color w:val="auto"/>
+        </w:rPr>
+      </w:pPr>
+      <w:r>
+        <w:rPr>
+          <w:rFonts w:eastAsia="Times New Roman" w:cs="Times New Roman" w:ascii="Garamond" w:hAnsi="Garamond"/>
+          <w:color w:val="000000"/>
+          <w:kern w:val="0"/>
+          <w:sz w:val="36"/>
+          <w:szCs w:val="36"/>
+          <w:shd w:fill="auto" w:val="clear"/>
+          <w:lang w:val="en-US" w:eastAsia="zh-CN" w:bidi="hi-IN"/>
+        </w:rPr>
+        <w:t>Essa compreensão amplia o sentido do ensinamento de Jesus quando afirma: “Pedi e obtereis.” Ele não nos prometeu que toda prece seria atendida exatamente como desejamos, nem por aqueles a quem dirigimos nossos pedidos. O Mestre nos ensinou que a oração sincera, aliada à fé e à retidão de intenções, encontra resposta útil e educativa, segundo a sabedoria divina.</w:t>
       </w:r>
     </w:p>
     <w:p>
@@ -870,29 +2080,34 @@
       </w:pPr>
       <w:r>
         <w:rPr>
-          <w:color w:val="auto"/>
-        </w:rPr>
-      </w:r>
-    </w:p>
-    <w:p>
-      <w:pPr>
-        <w:pStyle w:val="Normal"/>
-        <w:jc w:val="both"/>
-        <w:rPr>
-          <w:color w:val="auto"/>
-        </w:rPr>
-      </w:pPr>
-      <w:r>
-        <w:rPr>
-          <w:rFonts w:eastAsia="Times New Roman" w:cs="Times New Roman" w:ascii="Garamond" w:hAnsi="Garamond"/>
-          <w:color w:val="000000"/>
-          <w:kern w:val="0"/>
-          <w:sz w:val="36"/>
-          <w:szCs w:val="36"/>
-          <w:shd w:fill="auto" w:val="clear"/>
-          <w:lang w:val="en-US" w:eastAsia="zh-CN" w:bidi="hi-IN"/>
-        </w:rPr>
-        <w:t>Por fim, há um ponto central nessa parábola: por maior que fosse a necessidade do homem que pedia os pães, ele não podia abrir a porta da casa. A porta só se abre pelo lado de dentro. Assim também acontece com a porta do nosso coração. Somente nós podemos abri-la, quando decidimos atender aos apelos da própria consciência, muitas vezes manifestados através da dor, do desequilíbrio, da doença ou da fome de sentido espiritual.</w:t>
+          <w:rFonts w:eastAsia="Times New Roman" w:cs="Times New Roman" w:ascii="Garamond" w:hAnsi="Garamond"/>
+          <w:kern w:val="0"/>
+          <w:sz w:val="36"/>
+          <w:szCs w:val="36"/>
+          <w:shd w:fill="auto" w:val="clear"/>
+          <w:lang w:val="en-US" w:eastAsia="zh-CN" w:bidi="hi-IN"/>
+        </w:rPr>
+      </w:r>
+    </w:p>
+    <w:p>
+      <w:pPr>
+        <w:pStyle w:val="Normal"/>
+        <w:jc w:val="both"/>
+        <w:rPr>
+          <w:color w:val="auto"/>
+        </w:rPr>
+      </w:pPr>
+      <w:r>
+        <w:rPr>
+          <w:rFonts w:eastAsia="Times New Roman" w:cs="Times New Roman" w:ascii="Garamond" w:hAnsi="Garamond"/>
+          <w:color w:val="000000"/>
+          <w:kern w:val="0"/>
+          <w:sz w:val="36"/>
+          <w:szCs w:val="36"/>
+          <w:shd w:fill="auto" w:val="clear"/>
+          <w:lang w:val="en-US" w:eastAsia="zh-CN" w:bidi="hi-IN"/>
+        </w:rPr>
+        <w:t>Deus não está limitado aos nossos endereçamentos mentais. Quando oramos com sentimentos elevados, com propósitos justos e com confiança verdadeira, nossas rogativas encontram eco na espiritualidade maior, ainda que sigam caminhos diferentes daqueles que idealizamos. O essencial não é apenas pedir, mas como pedimos, com que sentimentos e para que finalidade.</w:t>
       </w:r>
     </w:p>
     <w:p>
@@ -910,1806 +2125,159 @@
       </w:pPr>
       <w:r>
         <w:rPr>
-          <w:color w:val="auto"/>
-        </w:rPr>
-      </w:r>
-    </w:p>
-    <w:p>
-      <w:pPr>
-        <w:pStyle w:val="Normal"/>
-        <w:jc w:val="both"/>
-        <w:rPr>
-          <w:color w:val="auto"/>
-        </w:rPr>
-      </w:pPr>
-      <w:r>
-        <w:rPr>
-          <w:rFonts w:eastAsia="Times New Roman" w:cs="Times New Roman" w:ascii="Garamond" w:hAnsi="Garamond"/>
-          <w:color w:val="000000"/>
-          <w:kern w:val="0"/>
-          <w:sz w:val="36"/>
-          <w:szCs w:val="36"/>
-          <w:shd w:fill="auto" w:val="clear"/>
-          <w:lang w:val="en-US" w:eastAsia="zh-CN" w:bidi="hi-IN"/>
-        </w:rPr>
-        <w:t>A Parábola do Amigo Importuno nos ensina, portanto, a necessidade da prece constante — não uma prece mecânica, repetitiva ou interesseira, mas uma oração sincera, consciente e transformadora. Uma prece que não apenas pede, mas que prepara o coração para receber, agir e crescer. É essa oração viva que se torna a chave capaz de abrir as portas do nosso mundo interior para tudo aquilo que pode promover nossa evolução espiritual.</w:t>
-      </w:r>
-    </w:p>
-    <w:p>
-      <w:pPr>
-        <w:pStyle w:val="Normal"/>
-        <w:jc w:val="both"/>
-        <w:rPr>
-          <w:sz w:val="36"/>
-          <w:szCs w:val="36"/>
-        </w:rPr>
-      </w:pPr>
-      <w:r>
+          <w:rFonts w:eastAsia="Times New Roman" w:cs="Times New Roman" w:ascii="Garamond" w:hAnsi="Garamond"/>
+          <w:kern w:val="0"/>
+          <w:sz w:val="36"/>
+          <w:szCs w:val="36"/>
+          <w:shd w:fill="auto" w:val="clear"/>
+          <w:lang w:val="en-US" w:eastAsia="zh-CN" w:bidi="hi-IN"/>
+        </w:rPr>
+      </w:r>
+    </w:p>
+    <w:p>
+      <w:pPr>
+        <w:pStyle w:val="Normal"/>
+        <w:jc w:val="both"/>
+        <w:rPr>
+          <w:color w:val="auto"/>
+        </w:rPr>
+      </w:pPr>
+      <w:r>
+        <w:rPr>
+          <w:rFonts w:eastAsia="Times New Roman" w:cs="Times New Roman" w:ascii="Garamond" w:hAnsi="Garamond"/>
+          <w:color w:val="000000"/>
+          <w:kern w:val="0"/>
+          <w:sz w:val="36"/>
+          <w:szCs w:val="36"/>
+          <w:shd w:fill="auto" w:val="clear"/>
+          <w:lang w:val="en-US" w:eastAsia="zh-CN" w:bidi="hi-IN"/>
+        </w:rPr>
+        <w:t>Assim, o “Pedi e obtereis” não deve ser entendido como uma promessa de facilidades, mas como a certeza de que nenhuma oração sincera se perde. Toda prece elevada mobiliza recursos espirituais, amplia nossa capacidade de receber e nos coloca em sintonia com o amparo divino sempre presente.</w:t>
+      </w:r>
+    </w:p>
+    <w:p>
+      <w:pPr>
+        <w:pStyle w:val="Normal"/>
+        <w:jc w:val="both"/>
+        <w:rPr>
+          <w:rFonts w:ascii="Garamond" w:hAnsi="Garamond" w:eastAsia="Times New Roman" w:cs="Times New Roman"/>
+          <w:kern w:val="0"/>
+          <w:sz w:val="36"/>
+          <w:szCs w:val="36"/>
+          <w:shd w:fill="auto" w:val="clear"/>
+          <w:lang w:val="en-US" w:eastAsia="zh-CN" w:bidi="hi-IN"/>
+        </w:rPr>
+      </w:pPr>
+      <w:r>
+        <w:rPr>
+          <w:rFonts w:eastAsia="Times New Roman" w:cs="Times New Roman" w:ascii="Garamond" w:hAnsi="Garamond"/>
+          <w:kern w:val="0"/>
+          <w:sz w:val="36"/>
+          <w:szCs w:val="36"/>
+          <w:shd w:fill="auto" w:val="clear"/>
+          <w:lang w:val="en-US" w:eastAsia="zh-CN" w:bidi="hi-IN"/>
+        </w:rPr>
+      </w:r>
+    </w:p>
+    <w:p>
+      <w:pPr>
+        <w:pStyle w:val="Normal"/>
+        <w:jc w:val="both"/>
+        <w:rPr>
+          <w:color w:val="auto"/>
+        </w:rPr>
+      </w:pPr>
+      <w:r>
+        <w:rPr>
+          <w:rFonts w:eastAsia="Times New Roman" w:cs="Times New Roman" w:ascii="Garamond" w:hAnsi="Garamond"/>
+          <w:color w:val="000000"/>
+          <w:kern w:val="0"/>
+          <w:sz w:val="36"/>
+          <w:szCs w:val="36"/>
+          <w:shd w:fill="auto" w:val="clear"/>
+          <w:lang w:val="en-US" w:eastAsia="zh-CN" w:bidi="hi-IN"/>
+        </w:rPr>
+        <w:t>Deus sempre responde. Nem sempre da forma que esperamos, mas sempre da maneira que mais nos auxilia a crescer.</w:t>
+      </w:r>
+    </w:p>
+    <w:p>
+      <w:pPr>
+        <w:pStyle w:val="Normal"/>
+        <w:jc w:val="both"/>
+        <w:rPr>
+          <w:rFonts w:ascii="Garamond" w:hAnsi="Garamond" w:eastAsia="Times New Roman" w:cs="Times New Roman"/>
+          <w:kern w:val="0"/>
+          <w:sz w:val="36"/>
+          <w:szCs w:val="36"/>
+          <w:shd w:fill="auto" w:val="clear"/>
+          <w:lang w:val="en-US" w:eastAsia="zh-CN" w:bidi="hi-IN"/>
+        </w:rPr>
+      </w:pPr>
+      <w:r>
+        <w:rPr>
+          <w:rFonts w:eastAsia="Times New Roman" w:cs="Times New Roman" w:ascii="Garamond" w:hAnsi="Garamond"/>
+          <w:kern w:val="0"/>
+          <w:sz w:val="36"/>
+          <w:szCs w:val="36"/>
+          <w:shd w:fill="auto" w:val="clear"/>
+          <w:lang w:val="en-US" w:eastAsia="zh-CN" w:bidi="hi-IN"/>
+        </w:rPr>
+      </w:r>
+    </w:p>
+    <w:p>
+      <w:pPr>
+        <w:pStyle w:val="Normal"/>
+        <w:jc w:val="both"/>
         <w:rPr>
           <w:color w:val="1C99E0"/>
         </w:rPr>
-      </w:r>
-    </w:p>
-    <w:p>
-      <w:pPr>
-        <w:pStyle w:val="Normal"/>
-        <w:jc w:val="both"/>
-        <w:rPr>
+      </w:pPr>
+      <w:r>
+        <w:rPr>
+          <w:rFonts w:eastAsia="Times New Roman" w:cs="Times New Roman" w:ascii="Garamond" w:hAnsi="Garamond"/>
           <w:color w:val="1C99E0"/>
-        </w:rPr>
-      </w:pPr>
-      <w:r>
-        <w:rPr>
-          <w:rFonts w:eastAsia="Times New Roman" w:cs="Times New Roman" w:ascii="Garamond" w:hAnsi="Garamond"/>
-          <w:color w:val="1C99E0"/>
-          <w:kern w:val="0"/>
-          <w:sz w:val="36"/>
-          <w:szCs w:val="36"/>
-          <w:shd w:fill="auto" w:val="clear"/>
-          <w:lang w:val="en-US" w:eastAsia="zh-CN" w:bidi="hi-IN"/>
-        </w:rPr>
-        <w:t xml:space="preserve">[ </w:t>
-      </w:r>
-      <w:r>
-        <w:rPr>
-          <w:rFonts w:eastAsia="Times New Roman" w:cs="Times New Roman" w:ascii="Garamond" w:hAnsi="Garamond"/>
-          <w:color w:val="1C99E0"/>
-          <w:kern w:val="0"/>
-          <w:sz w:val="36"/>
-          <w:szCs w:val="36"/>
-          <w:shd w:fill="auto" w:val="clear"/>
-          <w:lang w:val="en-US" w:eastAsia="zh-CN" w:bidi="hi-IN"/>
-        </w:rPr>
-        <w:t>Término</w:t>
-      </w:r>
-      <w:r>
-        <w:rPr>
-          <w:rFonts w:eastAsia="Times New Roman" w:cs="Times New Roman" w:ascii="Garamond" w:hAnsi="Garamond"/>
-          <w:color w:val="1C99E0"/>
-          <w:kern w:val="0"/>
-          <w:sz w:val="36"/>
-          <w:szCs w:val="36"/>
-          <w:shd w:fill="auto" w:val="clear"/>
-          <w:lang w:val="en-US" w:eastAsia="zh-CN" w:bidi="hi-IN"/>
-        </w:rPr>
-        <w:t xml:space="preserve"> de tópico a ser </w:t>
-      </w:r>
-      <w:r>
-        <w:rPr>
-          <w:rFonts w:eastAsia="Times New Roman" w:cs="Times New Roman" w:ascii="Garamond" w:hAnsi="Garamond"/>
-          <w:color w:val="1C99E0"/>
-          <w:kern w:val="0"/>
-          <w:sz w:val="36"/>
-          <w:szCs w:val="36"/>
-          <w:shd w:fill="auto" w:val="clear"/>
-          <w:lang w:val="en-US" w:eastAsia="zh-CN" w:bidi="hi-IN"/>
-        </w:rPr>
-        <w:t>encaixado</w:t>
-      </w:r>
-      <w:r>
-        <w:rPr>
-          <w:rFonts w:eastAsia="Times New Roman" w:cs="Times New Roman" w:ascii="Garamond" w:hAnsi="Garamond"/>
-          <w:color w:val="1C99E0"/>
-          <w:kern w:val="0"/>
-          <w:sz w:val="36"/>
-          <w:szCs w:val="36"/>
-          <w:shd w:fill="auto" w:val="clear"/>
-          <w:lang w:val="en-US" w:eastAsia="zh-CN" w:bidi="hi-IN"/>
-        </w:rPr>
-        <w:t xml:space="preserve"> ]</w:t>
-      </w:r>
-    </w:p>
-    <w:p>
-      <w:pPr>
-        <w:pStyle w:val="Normal"/>
-        <w:jc w:val="both"/>
-        <w:rPr>
-          <w:rFonts w:ascii="Garamond" w:hAnsi="Garamond" w:eastAsia="Times New Roman" w:cs="Times New Roman"/>
-          <w:kern w:val="0"/>
-          <w:sz w:val="36"/>
-          <w:szCs w:val="36"/>
-          <w:shd w:fill="auto" w:val="clear"/>
-          <w:lang w:val="en-US" w:eastAsia="zh-CN" w:bidi="hi-IN"/>
-        </w:rPr>
-      </w:pPr>
-      <w:r>
-        <w:rPr>
-          <w:color w:val="1C99E0"/>
-        </w:rPr>
-      </w:r>
-    </w:p>
-    <w:p>
-      <w:pPr>
-        <w:pStyle w:val="Normal"/>
-        <w:jc w:val="both"/>
-        <w:rPr>
-          <w:color w:val="1C99E0"/>
-        </w:rPr>
-      </w:pPr>
-      <w:r>
-        <w:rPr>
-          <w:rFonts w:eastAsia="Times New Roman" w:cs="Times New Roman" w:ascii="Garamond" w:hAnsi="Garamond"/>
-          <w:color w:val="1C99E0"/>
-          <w:kern w:val="0"/>
-          <w:sz w:val="36"/>
-          <w:szCs w:val="36"/>
-          <w:shd w:fill="auto" w:val="clear"/>
-          <w:lang w:val="en-US" w:eastAsia="zh-CN" w:bidi="hi-IN"/>
-        </w:rPr>
-        <w:t xml:space="preserve">[ </w:t>
-      </w:r>
-      <w:r>
-        <w:rPr>
-          <w:rFonts w:eastAsia="Times New Roman" w:cs="Times New Roman" w:ascii="Garamond" w:hAnsi="Garamond"/>
-          <w:color w:val="1C99E0"/>
-          <w:kern w:val="0"/>
-          <w:sz w:val="36"/>
-          <w:szCs w:val="36"/>
-          <w:shd w:fill="auto" w:val="clear"/>
-          <w:lang w:val="en-US" w:eastAsia="zh-CN" w:bidi="hi-IN"/>
-        </w:rPr>
-        <w:t>Início Prece refratada</w:t>
-      </w:r>
-      <w:r>
-        <w:rPr>
-          <w:rFonts w:eastAsia="Times New Roman" w:cs="Times New Roman" w:ascii="Garamond" w:hAnsi="Garamond"/>
-          <w:color w:val="1C99E0"/>
-          <w:kern w:val="0"/>
-          <w:sz w:val="36"/>
-          <w:szCs w:val="36"/>
-          <w:shd w:fill="auto" w:val="clear"/>
-          <w:lang w:val="en-US" w:eastAsia="zh-CN" w:bidi="hi-IN"/>
-        </w:rPr>
-        <w:t xml:space="preserve"> ]</w:t>
-      </w:r>
-    </w:p>
-    <w:p>
-      <w:pPr>
-        <w:pStyle w:val="Normal"/>
-        <w:jc w:val="both"/>
-        <w:rPr>
-          <w:rFonts w:ascii="Garamond" w:hAnsi="Garamond" w:eastAsia="Times New Roman" w:cs="Times New Roman"/>
-          <w:kern w:val="0"/>
-          <w:sz w:val="36"/>
-          <w:szCs w:val="36"/>
-          <w:shd w:fill="auto" w:val="clear"/>
-          <w:lang w:val="en-US" w:eastAsia="zh-CN" w:bidi="hi-IN"/>
-        </w:rPr>
-      </w:pPr>
-      <w:r>
-        <w:rPr>
-          <w:color w:val="1C99E0"/>
-        </w:rPr>
-      </w:r>
-    </w:p>
-    <w:p>
-      <w:pPr>
-        <w:pStyle w:val="Normal"/>
-        <w:jc w:val="both"/>
-        <w:rPr>
-          <w:color w:val="auto"/>
-        </w:rPr>
-      </w:pPr>
-      <w:r>
-        <w:rPr>
-          <w:rFonts w:eastAsia="Times New Roman" w:cs="Times New Roman" w:ascii="Garamond" w:hAnsi="Garamond"/>
-          <w:color w:val="000000"/>
-          <w:kern w:val="0"/>
-          <w:sz w:val="36"/>
-          <w:szCs w:val="36"/>
-          <w:shd w:fill="auto" w:val="clear"/>
-          <w:lang w:val="en-US" w:eastAsia="zh-CN" w:bidi="hi-IN"/>
-        </w:rPr>
-        <w:t>Em toda parte estamos envolvidos pelo amor e pela solicitude de Deus. Nenhuma prece sincera se perde, ainda que, muitas vezes, não seja atendida exatamente da forma ou pelo caminho que imaginamos.</w:t>
-      </w:r>
-    </w:p>
-    <w:p>
-      <w:pPr>
-        <w:pStyle w:val="Normal"/>
-        <w:jc w:val="both"/>
-        <w:rPr>
-          <w:rFonts w:ascii="Garamond" w:hAnsi="Garamond" w:eastAsia="Times New Roman" w:cs="Times New Roman"/>
-          <w:kern w:val="0"/>
-          <w:sz w:val="36"/>
-          <w:szCs w:val="36"/>
-          <w:shd w:fill="auto" w:val="clear"/>
-          <w:lang w:val="en-US" w:eastAsia="zh-CN" w:bidi="hi-IN"/>
-        </w:rPr>
-      </w:pPr>
-      <w:r>
-        <w:rPr>
-          <w:color w:val="auto"/>
-        </w:rPr>
-      </w:r>
-    </w:p>
-    <w:p>
-      <w:pPr>
-        <w:pStyle w:val="Normal"/>
-        <w:jc w:val="both"/>
-        <w:rPr>
-          <w:color w:val="auto"/>
-        </w:rPr>
-      </w:pPr>
-      <w:r>
-        <w:rPr>
-          <w:rFonts w:eastAsia="Times New Roman" w:cs="Times New Roman" w:ascii="Garamond" w:hAnsi="Garamond"/>
-          <w:color w:val="000000"/>
-          <w:kern w:val="0"/>
-          <w:sz w:val="36"/>
-          <w:szCs w:val="36"/>
-          <w:shd w:fill="auto" w:val="clear"/>
-          <w:lang w:val="en-US" w:eastAsia="zh-CN" w:bidi="hi-IN"/>
-        </w:rPr>
-        <w:t>Essa realidade espiritual é ilustrada de maneira muito tocante na obra Entre a Terra e o Céu, psicografada por Chico Xavier. No capítulo 2, intitulado “No Cenário Terrestre”, encontramos o drama de uma jovem chamada Evelina, então com apenas quinze anos de idade.</w:t>
-      </w:r>
-    </w:p>
-    <w:p>
-      <w:pPr>
-        <w:pStyle w:val="Normal"/>
-        <w:jc w:val="both"/>
-        <w:rPr>
-          <w:rFonts w:ascii="Garamond" w:hAnsi="Garamond" w:eastAsia="Times New Roman" w:cs="Times New Roman"/>
-          <w:kern w:val="0"/>
-          <w:sz w:val="36"/>
-          <w:szCs w:val="36"/>
-          <w:shd w:fill="auto" w:val="clear"/>
-          <w:lang w:val="en-US" w:eastAsia="zh-CN" w:bidi="hi-IN"/>
-        </w:rPr>
-      </w:pPr>
-      <w:r>
-        <w:rPr>
-          <w:color w:val="auto"/>
-        </w:rPr>
-      </w:r>
-    </w:p>
-    <w:p>
-      <w:pPr>
-        <w:pStyle w:val="Normal"/>
-        <w:jc w:val="both"/>
-        <w:rPr>
-          <w:color w:val="auto"/>
-        </w:rPr>
-      </w:pPr>
-      <w:r>
-        <w:rPr>
-          <w:rFonts w:eastAsia="Times New Roman" w:cs="Times New Roman" w:ascii="Garamond" w:hAnsi="Garamond"/>
-          <w:color w:val="000000"/>
-          <w:kern w:val="0"/>
-          <w:sz w:val="36"/>
-          <w:szCs w:val="36"/>
-          <w:shd w:fill="auto" w:val="clear"/>
-          <w:lang w:val="en-US" w:eastAsia="zh-CN" w:bidi="hi-IN"/>
-        </w:rPr>
-        <w:t>Evelina vivia uma situação familiar profundamente dolorosa. Sua mãe havia desencarnado, o pai encontrava-se gravemente enfermo após a morte trágica do filho mais novo, e o lar estava mergulhado em conflitos emocionais intensos. A madrasta, consumida pela culpa e pelo sofrimento, encontrava-se fragilizada espiritualmente, enquanto o ambiente doméstico era marcado por desequilíbrios e influências perturbadoras.</w:t>
-      </w:r>
-    </w:p>
-    <w:p>
-      <w:pPr>
-        <w:pStyle w:val="Normal"/>
-        <w:jc w:val="both"/>
-        <w:rPr>
-          <w:rFonts w:ascii="Garamond" w:hAnsi="Garamond" w:eastAsia="Times New Roman" w:cs="Times New Roman"/>
-          <w:kern w:val="0"/>
-          <w:sz w:val="36"/>
-          <w:szCs w:val="36"/>
-          <w:shd w:fill="auto" w:val="clear"/>
-          <w:lang w:val="en-US" w:eastAsia="zh-CN" w:bidi="hi-IN"/>
-        </w:rPr>
-      </w:pPr>
-      <w:r>
-        <w:rPr>
-          <w:color w:val="auto"/>
-        </w:rPr>
-      </w:r>
-    </w:p>
-    <w:p>
-      <w:pPr>
-        <w:pStyle w:val="Normal"/>
-        <w:jc w:val="both"/>
-        <w:rPr>
-          <w:color w:val="auto"/>
-        </w:rPr>
-      </w:pPr>
-      <w:r>
-        <w:rPr>
-          <w:rFonts w:eastAsia="Times New Roman" w:cs="Times New Roman" w:ascii="Garamond" w:hAnsi="Garamond"/>
-          <w:color w:val="000000"/>
-          <w:kern w:val="0"/>
-          <w:sz w:val="36"/>
-          <w:szCs w:val="36"/>
-          <w:shd w:fill="auto" w:val="clear"/>
-          <w:lang w:val="en-US" w:eastAsia="zh-CN" w:bidi="hi-IN"/>
-        </w:rPr>
-        <w:t>Diante de tamanho sofrimento, Evelina orava com insistência e dor, suplicando pela proteção da mãe desencarnada. No entanto, aquela a quem a jovem dirigia suas preces não se encontrava em condições espirituais de ouvi-la ou de oferecer o auxílio solicitado. Ainda assim, a oração da menina não se perdeu.</w:t>
-      </w:r>
-    </w:p>
-    <w:p>
-      <w:pPr>
-        <w:pStyle w:val="Normal"/>
-        <w:jc w:val="both"/>
-        <w:rPr>
-          <w:rFonts w:ascii="Garamond" w:hAnsi="Garamond" w:eastAsia="Times New Roman" w:cs="Times New Roman"/>
-          <w:kern w:val="0"/>
-          <w:sz w:val="36"/>
-          <w:szCs w:val="36"/>
-          <w:shd w:fill="auto" w:val="clear"/>
-          <w:lang w:val="en-US" w:eastAsia="zh-CN" w:bidi="hi-IN"/>
-        </w:rPr>
-      </w:pPr>
-      <w:r>
-        <w:rPr>
-          <w:color w:val="auto"/>
-        </w:rPr>
-      </w:r>
-    </w:p>
-    <w:p>
-      <w:pPr>
-        <w:pStyle w:val="Normal"/>
-        <w:jc w:val="both"/>
-        <w:rPr>
-          <w:color w:val="auto"/>
-        </w:rPr>
-      </w:pPr>
-      <w:r>
-        <w:rPr>
-          <w:rFonts w:eastAsia="Times New Roman" w:cs="Times New Roman" w:ascii="Garamond" w:hAnsi="Garamond"/>
-          <w:color w:val="000000"/>
-          <w:kern w:val="0"/>
-          <w:sz w:val="36"/>
-          <w:szCs w:val="36"/>
-          <w:shd w:fill="auto" w:val="clear"/>
-          <w:lang w:val="en-US" w:eastAsia="zh-CN" w:bidi="hi-IN"/>
-        </w:rPr>
-        <w:t>Orando com profunda sinceridade, fé e elevação de sentimentos, Evelina produziu uma vibração tão intensa que sua súplica, não encontrando acolhimento no destino inicial, mudou de direção. Sustentada pela força moral que a animava, a prece ultrapassou planos espirituais inferiores e alcançou esferas onde havia trabalhadores espirituais capazes de compreender a situação e prestar o auxílio necessário.</w:t>
-      </w:r>
-    </w:p>
-    <w:p>
-      <w:pPr>
-        <w:pStyle w:val="Normal"/>
-        <w:jc w:val="both"/>
-        <w:rPr>
-          <w:rFonts w:ascii="Garamond" w:hAnsi="Garamond" w:eastAsia="Times New Roman" w:cs="Times New Roman"/>
-          <w:kern w:val="0"/>
-          <w:sz w:val="36"/>
-          <w:szCs w:val="36"/>
-          <w:shd w:fill="auto" w:val="clear"/>
-          <w:lang w:val="en-US" w:eastAsia="zh-CN" w:bidi="hi-IN"/>
-        </w:rPr>
-      </w:pPr>
-      <w:r>
-        <w:rPr>
-          <w:color w:val="auto"/>
-        </w:rPr>
-      </w:r>
-    </w:p>
-    <w:p>
-      <w:pPr>
-        <w:pStyle w:val="Normal"/>
-        <w:jc w:val="both"/>
-        <w:rPr>
-          <w:color w:val="auto"/>
-        </w:rPr>
-      </w:pPr>
-      <w:r>
-        <w:rPr>
-          <w:rFonts w:eastAsia="Times New Roman" w:cs="Times New Roman" w:ascii="Garamond" w:hAnsi="Garamond"/>
-          <w:color w:val="000000"/>
-          <w:kern w:val="0"/>
-          <w:sz w:val="36"/>
-          <w:szCs w:val="36"/>
-          <w:shd w:fill="auto" w:val="clear"/>
-          <w:lang w:val="en-US" w:eastAsia="zh-CN" w:bidi="hi-IN"/>
-        </w:rPr>
-        <w:t>Esse episódio nos ajuda a compreender o fenômeno conhecido como prece refratada. Assim como um raio de luz, ao encontrar um obstáculo, pode desviar seu curso e seguir por outro caminho, a oração verdadeira, quando não encontra resposta no ponto a que foi dirigida, é naturalmente conduzida às regiões espirituais compatíveis com sua elevação e com a justiça do pedido.</w:t>
-      </w:r>
-    </w:p>
-    <w:p>
-      <w:pPr>
-        <w:pStyle w:val="Normal"/>
-        <w:jc w:val="both"/>
-        <w:rPr>
-          <w:rFonts w:ascii="Garamond" w:hAnsi="Garamond" w:eastAsia="Times New Roman" w:cs="Times New Roman"/>
-          <w:kern w:val="0"/>
-          <w:sz w:val="36"/>
-          <w:szCs w:val="36"/>
-          <w:shd w:fill="auto" w:val="clear"/>
-          <w:lang w:val="en-US" w:eastAsia="zh-CN" w:bidi="hi-IN"/>
-        </w:rPr>
-      </w:pPr>
-      <w:r>
-        <w:rPr>
-          <w:color w:val="auto"/>
-        </w:rPr>
-      </w:r>
-    </w:p>
-    <w:p>
-      <w:pPr>
-        <w:pStyle w:val="Normal"/>
-        <w:jc w:val="both"/>
-        <w:rPr>
-          <w:color w:val="auto"/>
-        </w:rPr>
-      </w:pPr>
-      <w:r>
-        <w:rPr>
-          <w:rFonts w:eastAsia="Times New Roman" w:cs="Times New Roman" w:ascii="Garamond" w:hAnsi="Garamond"/>
-          <w:color w:val="000000"/>
-          <w:kern w:val="0"/>
-          <w:sz w:val="36"/>
-          <w:szCs w:val="36"/>
-          <w:shd w:fill="auto" w:val="clear"/>
-          <w:lang w:val="en-US" w:eastAsia="zh-CN" w:bidi="hi-IN"/>
-        </w:rPr>
-        <w:t>Essa compreensão amplia o sentido do ensinamento de Jesus quando afirma: “Pedi e obtereis.” Ele não nos prometeu que toda prece seria atendida exatamente como desejamos, nem por aqueles a quem dirigimos nossos pedidos. O Mestre nos ensinou que a oração sincera, aliada à fé e à retidão de intenções, encontra resposta útil e educativa, segundo a sabedoria divina.</w:t>
-      </w:r>
-    </w:p>
-    <w:p>
-      <w:pPr>
-        <w:pStyle w:val="Normal"/>
-        <w:jc w:val="both"/>
-        <w:rPr>
-          <w:rFonts w:ascii="Garamond" w:hAnsi="Garamond" w:eastAsia="Times New Roman" w:cs="Times New Roman"/>
-          <w:kern w:val="0"/>
-          <w:sz w:val="36"/>
-          <w:szCs w:val="36"/>
-          <w:shd w:fill="auto" w:val="clear"/>
-          <w:lang w:val="en-US" w:eastAsia="zh-CN" w:bidi="hi-IN"/>
-        </w:rPr>
-      </w:pPr>
-      <w:r>
-        <w:rPr>
-          <w:color w:val="auto"/>
-        </w:rPr>
-      </w:r>
-    </w:p>
-    <w:p>
-      <w:pPr>
-        <w:pStyle w:val="Normal"/>
-        <w:jc w:val="both"/>
-        <w:rPr>
-          <w:color w:val="auto"/>
-        </w:rPr>
-      </w:pPr>
-      <w:r>
-        <w:rPr>
-          <w:rFonts w:eastAsia="Times New Roman" w:cs="Times New Roman" w:ascii="Garamond" w:hAnsi="Garamond"/>
-          <w:color w:val="000000"/>
-          <w:kern w:val="0"/>
-          <w:sz w:val="36"/>
-          <w:szCs w:val="36"/>
-          <w:shd w:fill="auto" w:val="clear"/>
-          <w:lang w:val="en-US" w:eastAsia="zh-CN" w:bidi="hi-IN"/>
-        </w:rPr>
-        <w:t>Deus não está limitado aos nossos endereçamentos mentais. Quando oramos com sentimentos elevados, com propósitos justos e com confiança verdadeira, nossas rogativas encontram eco na espiritualidade maior, ainda que sigam caminhos diferentes daqueles que idealizamos. O essencial não é apenas pedir, mas como pedimos, com que sentimentos e para que finalidade.</w:t>
-      </w:r>
-    </w:p>
-    <w:p>
-      <w:pPr>
-        <w:pStyle w:val="Normal"/>
-        <w:jc w:val="both"/>
-        <w:rPr>
-          <w:rFonts w:ascii="Garamond" w:hAnsi="Garamond" w:eastAsia="Times New Roman" w:cs="Times New Roman"/>
-          <w:kern w:val="0"/>
-          <w:sz w:val="36"/>
-          <w:szCs w:val="36"/>
-          <w:shd w:fill="auto" w:val="clear"/>
-          <w:lang w:val="en-US" w:eastAsia="zh-CN" w:bidi="hi-IN"/>
-        </w:rPr>
-      </w:pPr>
-      <w:r>
-        <w:rPr>
-          <w:color w:val="auto"/>
-        </w:rPr>
-      </w:r>
-    </w:p>
-    <w:p>
-      <w:pPr>
-        <w:pStyle w:val="Normal"/>
-        <w:jc w:val="both"/>
-        <w:rPr>
-          <w:color w:val="auto"/>
-        </w:rPr>
-      </w:pPr>
-      <w:r>
-        <w:rPr>
-          <w:rFonts w:eastAsia="Times New Roman" w:cs="Times New Roman" w:ascii="Garamond" w:hAnsi="Garamond"/>
-          <w:color w:val="000000"/>
-          <w:kern w:val="0"/>
-          <w:sz w:val="36"/>
-          <w:szCs w:val="36"/>
-          <w:shd w:fill="auto" w:val="clear"/>
-          <w:lang w:val="en-US" w:eastAsia="zh-CN" w:bidi="hi-IN"/>
-        </w:rPr>
-        <w:t>Assim, o “Pedi e obtereis” não deve ser entendido como uma promessa de facilidades, mas como a certeza de que nenhuma oração sincera se perde. Toda prece elevada mobiliza recursos espirituais, amplia nossa capacidade de receber e nos coloca em sintonia com o amparo divino sempre presente.</w:t>
-      </w:r>
-    </w:p>
-    <w:p>
-      <w:pPr>
-        <w:pStyle w:val="Normal"/>
-        <w:jc w:val="both"/>
-        <w:rPr>
-          <w:rFonts w:ascii="Garamond" w:hAnsi="Garamond" w:eastAsia="Times New Roman" w:cs="Times New Roman"/>
-          <w:kern w:val="0"/>
-          <w:sz w:val="36"/>
-          <w:szCs w:val="36"/>
-          <w:shd w:fill="auto" w:val="clear"/>
-          <w:lang w:val="en-US" w:eastAsia="zh-CN" w:bidi="hi-IN"/>
-        </w:rPr>
-      </w:pPr>
-      <w:r>
-        <w:rPr>
-          <w:color w:val="auto"/>
-        </w:rPr>
-      </w:r>
-    </w:p>
-    <w:p>
-      <w:pPr>
-        <w:pStyle w:val="Normal"/>
-        <w:jc w:val="both"/>
-        <w:rPr>
-          <w:color w:val="auto"/>
-        </w:rPr>
-      </w:pPr>
-      <w:r>
-        <w:rPr>
-          <w:rFonts w:eastAsia="Times New Roman" w:cs="Times New Roman" w:ascii="Garamond" w:hAnsi="Garamond"/>
-          <w:color w:val="000000"/>
-          <w:kern w:val="0"/>
-          <w:sz w:val="36"/>
-          <w:szCs w:val="36"/>
-          <w:shd w:fill="auto" w:val="clear"/>
-          <w:lang w:val="en-US" w:eastAsia="zh-CN" w:bidi="hi-IN"/>
-        </w:rPr>
-        <w:t>Deus sempre responde. Nem sempre da forma que esperamos, mas sempre da maneira que mais nos auxilia a crescer.</w:t>
-      </w:r>
-    </w:p>
-    <w:p>
-      <w:pPr>
-        <w:pStyle w:val="Normal"/>
-        <w:jc w:val="both"/>
-        <w:rPr>
-          <w:rFonts w:ascii="Garamond" w:hAnsi="Garamond" w:eastAsia="Times New Roman" w:cs="Times New Roman"/>
-          <w:kern w:val="0"/>
-          <w:sz w:val="36"/>
-          <w:szCs w:val="36"/>
-          <w:shd w:fill="auto" w:val="clear"/>
-          <w:lang w:val="en-US" w:eastAsia="zh-CN" w:bidi="hi-IN"/>
-        </w:rPr>
-      </w:pPr>
-      <w:r>
-        <w:rPr>
-          <w:color w:val="1C99E0"/>
-        </w:rPr>
-      </w:r>
-    </w:p>
-    <w:p>
-      <w:pPr>
-        <w:pStyle w:val="Normal"/>
-        <w:jc w:val="both"/>
-        <w:rPr>
-          <w:color w:val="1C99E0"/>
-        </w:rPr>
-      </w:pPr>
-      <w:r>
-        <w:rPr>
-          <w:rFonts w:eastAsia="Times New Roman" w:cs="Times New Roman" w:ascii="Garamond" w:hAnsi="Garamond"/>
-          <w:color w:val="1C99E0"/>
-          <w:kern w:val="0"/>
-          <w:sz w:val="36"/>
-          <w:szCs w:val="36"/>
-          <w:shd w:fill="auto" w:val="clear"/>
-          <w:lang w:val="en-US" w:eastAsia="zh-CN" w:bidi="hi-IN"/>
-        </w:rPr>
-        <w:t xml:space="preserve">[ </w:t>
-      </w:r>
-      <w:r>
-        <w:rPr>
-          <w:rFonts w:eastAsia="Times New Roman" w:cs="Times New Roman" w:ascii="Garamond" w:hAnsi="Garamond"/>
-          <w:color w:val="1C99E0"/>
-          <w:kern w:val="0"/>
-          <w:sz w:val="36"/>
-          <w:szCs w:val="36"/>
-          <w:shd w:fill="auto" w:val="clear"/>
-          <w:lang w:val="en-US" w:eastAsia="zh-CN" w:bidi="hi-IN"/>
-        </w:rPr>
-        <w:t>Término Prece refratada</w:t>
-      </w:r>
-      <w:r>
-        <w:rPr>
-          <w:rFonts w:eastAsia="Times New Roman" w:cs="Times New Roman" w:ascii="Garamond" w:hAnsi="Garamond"/>
-          <w:color w:val="1C99E0"/>
-          <w:kern w:val="0"/>
-          <w:sz w:val="36"/>
-          <w:szCs w:val="36"/>
-          <w:shd w:fill="auto" w:val="clear"/>
-          <w:lang w:val="en-US" w:eastAsia="zh-CN" w:bidi="hi-IN"/>
-        </w:rPr>
-        <w:t xml:space="preserve"> ]</w:t>
-      </w:r>
-    </w:p>
-    <w:p>
-      <w:pPr>
-        <w:pStyle w:val="Normal"/>
-        <w:jc w:val="both"/>
-        <w:rPr>
-          <w:sz w:val="36"/>
-          <w:szCs w:val="36"/>
-        </w:rPr>
-      </w:pPr>
-      <w:r>
-        <w:rPr/>
-      </w:r>
-    </w:p>
-    <w:p>
-      <w:pPr>
-        <w:pStyle w:val="Normal"/>
-        <w:jc w:val="both"/>
-        <w:rPr>
-          <w:sz w:val="36"/>
-          <w:szCs w:val="36"/>
-        </w:rPr>
-      </w:pPr>
-      <w:r>
-        <w:rPr/>
-      </w:r>
-    </w:p>
-    <w:p>
-      <w:pPr>
-        <w:pStyle w:val="Normal"/>
-        <w:jc w:val="both"/>
-        <w:rPr>
-          <w:color w:val="1C99E0"/>
-        </w:rPr>
-      </w:pPr>
-      <w:r>
-        <w:rPr>
-          <w:rFonts w:eastAsia="Times New Roman" w:cs="Times New Roman" w:ascii="Garamond" w:hAnsi="Garamond"/>
-          <w:color w:val="1C99E0"/>
-          <w:kern w:val="0"/>
-          <w:sz w:val="36"/>
-          <w:szCs w:val="36"/>
-          <w:shd w:fill="auto" w:val="clear"/>
-          <w:lang w:val="en-US" w:eastAsia="zh-CN" w:bidi="hi-IN"/>
-        </w:rPr>
-        <w:t>[ Inicío de tópico a ser desenvolvido ]</w:t>
-      </w:r>
-    </w:p>
-    <w:p>
-      <w:pPr>
-        <w:pStyle w:val="Normal"/>
-        <w:jc w:val="both"/>
-        <w:rPr>
-          <w:sz w:val="36"/>
-          <w:szCs w:val="36"/>
-        </w:rPr>
-      </w:pPr>
-      <w:r>
-        <w:rPr/>
-      </w:r>
-    </w:p>
-    <w:p>
-      <w:pPr>
-        <w:pStyle w:val="Normal"/>
-        <w:jc w:val="both"/>
-        <w:rPr>
-          <w:sz w:val="36"/>
-          <w:szCs w:val="36"/>
-        </w:rPr>
-      </w:pPr>
-      <w:r>
-        <w:rPr>
-          <w:rFonts w:eastAsia="Times New Roman" w:cs="Times New Roman" w:ascii="Garamond" w:hAnsi="Garamond"/>
-          <w:color w:val="000000"/>
-          <w:kern w:val="0"/>
-          <w:sz w:val="36"/>
-          <w:szCs w:val="36"/>
-          <w:shd w:fill="auto" w:val="clear"/>
-          <w:lang w:val="en-US" w:eastAsia="zh-CN" w:bidi="hi-IN"/>
-        </w:rPr>
-        <w:t>O Pedi e Obtereis é ensinado à multidão no Sermão do Monte (evangelho de Mateus) e aos discípulos, após a oração do Pai Nosso.</w:t>
-      </w:r>
-    </w:p>
-    <w:p>
-      <w:pPr>
-        <w:pStyle w:val="Normal"/>
-        <w:jc w:val="both"/>
-        <w:rPr>
-          <w:sz w:val="36"/>
-          <w:szCs w:val="36"/>
-        </w:rPr>
-      </w:pPr>
-      <w:r>
-        <w:rPr/>
-      </w:r>
-    </w:p>
-    <w:p>
-      <w:pPr>
-        <w:pStyle w:val="Normal"/>
-        <w:jc w:val="both"/>
-        <w:rPr>
-          <w:sz w:val="36"/>
-          <w:szCs w:val="36"/>
-        </w:rPr>
-      </w:pPr>
-      <w:r>
-        <w:rPr>
-          <w:rFonts w:eastAsia="Times New Roman" w:cs="Times New Roman" w:ascii="Garamond" w:hAnsi="Garamond"/>
-          <w:color w:val="000000"/>
-          <w:kern w:val="0"/>
-          <w:sz w:val="36"/>
-          <w:szCs w:val="36"/>
-          <w:shd w:fill="auto" w:val="clear"/>
-          <w:lang w:val="en-US" w:eastAsia="zh-CN" w:bidi="hi-IN"/>
-        </w:rPr>
-        <w:t>Ao falar aos discípulos Jesus se utiliza da parábola do amigo importuno. Ao falar à multidão, Jesus fala de maneira mais direta.</w:t>
-      </w:r>
-    </w:p>
-    <w:p>
-      <w:pPr>
-        <w:pStyle w:val="Normal"/>
-        <w:jc w:val="both"/>
-        <w:rPr>
-          <w:sz w:val="36"/>
-          <w:szCs w:val="36"/>
-        </w:rPr>
-      </w:pPr>
-      <w:r>
-        <w:rPr/>
-      </w:r>
-    </w:p>
-    <w:p>
-      <w:pPr>
-        <w:pStyle w:val="Normal"/>
-        <w:jc w:val="both"/>
-        <w:rPr>
-          <w:sz w:val="36"/>
-          <w:szCs w:val="36"/>
-        </w:rPr>
-      </w:pPr>
-      <w:r>
-        <w:rPr>
-          <w:rFonts w:eastAsia="Times New Roman" w:cs="Times New Roman" w:ascii="Garamond" w:hAnsi="Garamond"/>
-          <w:color w:val="000000"/>
-          <w:kern w:val="0"/>
-          <w:sz w:val="36"/>
-          <w:szCs w:val="36"/>
-          <w:shd w:fill="auto" w:val="clear"/>
-          <w:lang w:val="en-US" w:eastAsia="zh-CN" w:bidi="hi-IN"/>
-        </w:rPr>
-        <w:t>1. Dois públicos, dois níveis de ensino</w:t>
-      </w:r>
-    </w:p>
-    <w:p>
-      <w:pPr>
-        <w:pStyle w:val="Normal"/>
-        <w:jc w:val="both"/>
-        <w:rPr>
-          <w:sz w:val="36"/>
-          <w:szCs w:val="36"/>
-        </w:rPr>
-      </w:pPr>
-      <w:r>
-        <w:rPr/>
-      </w:r>
-    </w:p>
-    <w:p>
-      <w:pPr>
-        <w:pStyle w:val="Normal"/>
-        <w:jc w:val="both"/>
-        <w:rPr>
-          <w:sz w:val="36"/>
-          <w:szCs w:val="36"/>
-        </w:rPr>
-      </w:pPr>
-      <w:r>
-        <w:rPr>
-          <w:rFonts w:eastAsia="Times New Roman" w:cs="Times New Roman" w:ascii="Garamond" w:hAnsi="Garamond"/>
-          <w:color w:val="000000"/>
-          <w:kern w:val="0"/>
-          <w:sz w:val="36"/>
-          <w:szCs w:val="36"/>
-          <w:shd w:fill="auto" w:val="clear"/>
-          <w:lang w:val="en-US" w:eastAsia="zh-CN" w:bidi="hi-IN"/>
-        </w:rPr>
-        <w:t>Você captou um ponto essencial:</w:t>
-      </w:r>
-    </w:p>
-    <w:p>
-      <w:pPr>
-        <w:pStyle w:val="Normal"/>
-        <w:jc w:val="both"/>
-        <w:rPr>
-          <w:sz w:val="36"/>
-          <w:szCs w:val="36"/>
-        </w:rPr>
-      </w:pPr>
-      <w:r>
-        <w:rPr/>
-      </w:r>
-    </w:p>
-    <w:p>
-      <w:pPr>
-        <w:pStyle w:val="Normal"/>
-        <w:jc w:val="both"/>
-        <w:rPr>
-          <w:sz w:val="36"/>
-          <w:szCs w:val="36"/>
-        </w:rPr>
-      </w:pPr>
-      <w:r>
-        <w:rPr>
-          <w:rFonts w:eastAsia="Times New Roman" w:cs="Times New Roman" w:ascii="Garamond" w:hAnsi="Garamond"/>
-          <w:color w:val="000000"/>
-          <w:kern w:val="0"/>
-          <w:sz w:val="36"/>
-          <w:szCs w:val="36"/>
-          <w:shd w:fill="auto" w:val="clear"/>
-          <w:lang w:val="en-US" w:eastAsia="zh-CN" w:bidi="hi-IN"/>
-        </w:rPr>
-        <w:t>No Sermão do Monte (Mateus 7), Jesus fala à multidão → usa frases diretas, curtas, de forte impacto moral:</w:t>
-      </w:r>
-    </w:p>
-    <w:p>
-      <w:pPr>
-        <w:pStyle w:val="Normal"/>
-        <w:jc w:val="both"/>
-        <w:rPr>
-          <w:sz w:val="36"/>
-          <w:szCs w:val="36"/>
-        </w:rPr>
-      </w:pPr>
-      <w:r>
-        <w:rPr>
-          <w:rFonts w:eastAsia="Times New Roman" w:cs="Times New Roman" w:ascii="Garamond" w:hAnsi="Garamond"/>
-          <w:color w:val="000000"/>
-          <w:kern w:val="0"/>
-          <w:sz w:val="36"/>
-          <w:szCs w:val="36"/>
-          <w:shd w:fill="auto" w:val="clear"/>
-          <w:lang w:val="en-US" w:eastAsia="zh-CN" w:bidi="hi-IN"/>
-        </w:rPr>
-        <w:t>“</w:t>
-      </w:r>
-      <w:r>
-        <w:rPr>
-          <w:rFonts w:eastAsia="Times New Roman" w:cs="Times New Roman" w:ascii="Garamond" w:hAnsi="Garamond"/>
-          <w:color w:val="000000"/>
-          <w:kern w:val="0"/>
-          <w:sz w:val="36"/>
-          <w:szCs w:val="36"/>
-          <w:shd w:fill="auto" w:val="clear"/>
-          <w:lang w:val="en-US" w:eastAsia="zh-CN" w:bidi="hi-IN"/>
-        </w:rPr>
-        <w:t>Pedi, buscai, batei.”</w:t>
-      </w:r>
-    </w:p>
-    <w:p>
-      <w:pPr>
-        <w:pStyle w:val="Normal"/>
-        <w:jc w:val="both"/>
-        <w:rPr>
-          <w:sz w:val="36"/>
-          <w:szCs w:val="36"/>
-        </w:rPr>
-      </w:pPr>
-      <w:r>
-        <w:rPr/>
-      </w:r>
-    </w:p>
-    <w:p>
-      <w:pPr>
-        <w:pStyle w:val="Normal"/>
-        <w:jc w:val="both"/>
-        <w:rPr>
-          <w:sz w:val="36"/>
-          <w:szCs w:val="36"/>
-        </w:rPr>
-      </w:pPr>
-      <w:r>
-        <w:rPr>
-          <w:rFonts w:eastAsia="Times New Roman" w:cs="Times New Roman" w:ascii="Garamond" w:hAnsi="Garamond"/>
-          <w:color w:val="000000"/>
-          <w:kern w:val="0"/>
-          <w:sz w:val="36"/>
-          <w:szCs w:val="36"/>
-          <w:shd w:fill="auto" w:val="clear"/>
-          <w:lang w:val="en-US" w:eastAsia="zh-CN" w:bidi="hi-IN"/>
-        </w:rPr>
-        <w:t>Em Lucas 11, Ele fala aos discípulos, após eles pedirem:</w:t>
-      </w:r>
-    </w:p>
-    <w:p>
-      <w:pPr>
-        <w:pStyle w:val="Normal"/>
-        <w:jc w:val="both"/>
-        <w:rPr>
-          <w:sz w:val="36"/>
-          <w:szCs w:val="36"/>
-        </w:rPr>
-      </w:pPr>
-      <w:r>
-        <w:rPr>
-          <w:rFonts w:eastAsia="Times New Roman" w:cs="Times New Roman" w:ascii="Garamond" w:hAnsi="Garamond"/>
-          <w:color w:val="000000"/>
-          <w:kern w:val="0"/>
-          <w:sz w:val="36"/>
-          <w:szCs w:val="36"/>
-          <w:shd w:fill="auto" w:val="clear"/>
-          <w:lang w:val="en-US" w:eastAsia="zh-CN" w:bidi="hi-IN"/>
-        </w:rPr>
-        <w:t>“</w:t>
-      </w:r>
-      <w:r>
-        <w:rPr>
-          <w:rFonts w:eastAsia="Times New Roman" w:cs="Times New Roman" w:ascii="Garamond" w:hAnsi="Garamond"/>
-          <w:color w:val="000000"/>
-          <w:kern w:val="0"/>
-          <w:sz w:val="36"/>
-          <w:szCs w:val="36"/>
-          <w:shd w:fill="auto" w:val="clear"/>
-          <w:lang w:val="en-US" w:eastAsia="zh-CN" w:bidi="hi-IN"/>
-        </w:rPr>
-        <w:t>Senhor, ensina-nos a orar.”</w:t>
-      </w:r>
-    </w:p>
-    <w:p>
-      <w:pPr>
-        <w:pStyle w:val="Normal"/>
-        <w:jc w:val="both"/>
-        <w:rPr>
-          <w:sz w:val="36"/>
-          <w:szCs w:val="36"/>
-        </w:rPr>
-      </w:pPr>
-      <w:r>
-        <w:rPr/>
-      </w:r>
-    </w:p>
-    <w:p>
-      <w:pPr>
-        <w:pStyle w:val="Normal"/>
-        <w:jc w:val="both"/>
-        <w:rPr>
-          <w:sz w:val="36"/>
-          <w:szCs w:val="36"/>
-        </w:rPr>
-      </w:pPr>
-      <w:r>
-        <w:rPr>
-          <w:rFonts w:eastAsia="Times New Roman" w:cs="Times New Roman" w:ascii="Garamond" w:hAnsi="Garamond"/>
-          <w:color w:val="000000"/>
-          <w:kern w:val="0"/>
-          <w:sz w:val="36"/>
-          <w:szCs w:val="36"/>
-          <w:shd w:fill="auto" w:val="clear"/>
-          <w:lang w:val="en-US" w:eastAsia="zh-CN" w:bidi="hi-IN"/>
-        </w:rPr>
-        <w:t>Aqui, Jesus não apenas afirma — Ele explica.</w:t>
-      </w:r>
-    </w:p>
-    <w:p>
-      <w:pPr>
-        <w:pStyle w:val="Normal"/>
-        <w:jc w:val="both"/>
-        <w:rPr>
-          <w:sz w:val="36"/>
-          <w:szCs w:val="36"/>
-        </w:rPr>
-      </w:pPr>
-      <w:r>
-        <w:rPr/>
-      </w:r>
-    </w:p>
-    <w:p>
-      <w:pPr>
-        <w:pStyle w:val="Normal"/>
-        <w:jc w:val="both"/>
-        <w:rPr>
-          <w:sz w:val="36"/>
-          <w:szCs w:val="36"/>
-        </w:rPr>
-      </w:pPr>
-      <w:r>
-        <w:rPr>
-          <w:rFonts w:eastAsia="Times New Roman" w:cs="Times New Roman" w:ascii="Garamond" w:hAnsi="Garamond"/>
-          <w:color w:val="000000"/>
-          <w:kern w:val="0"/>
-          <w:sz w:val="36"/>
-          <w:szCs w:val="36"/>
-          <w:shd w:fill="auto" w:val="clear"/>
-          <w:lang w:val="en-US" w:eastAsia="zh-CN" w:bidi="hi-IN"/>
-        </w:rPr>
-        <w:t>E Ele explica por meio de uma pequena parábola, justamente porque os discípulos já tinham vivência com Ele suficiente para ir além da letra.</w:t>
-      </w:r>
-    </w:p>
-    <w:p>
-      <w:pPr>
-        <w:pStyle w:val="Normal"/>
-        <w:jc w:val="both"/>
-        <w:rPr>
-          <w:sz w:val="36"/>
-          <w:szCs w:val="36"/>
-        </w:rPr>
-      </w:pPr>
-      <w:r>
-        <w:rPr/>
-      </w:r>
-    </w:p>
-    <w:p>
-      <w:pPr>
-        <w:pStyle w:val="Normal"/>
-        <w:jc w:val="both"/>
-        <w:rPr>
-          <w:sz w:val="36"/>
-          <w:szCs w:val="36"/>
-        </w:rPr>
-      </w:pPr>
-      <w:r>
-        <w:rPr>
-          <w:rFonts w:eastAsia="Times New Roman" w:cs="Times New Roman" w:ascii="Garamond" w:hAnsi="Garamond"/>
-          <w:color w:val="000000"/>
-          <w:kern w:val="0"/>
-          <w:sz w:val="36"/>
-          <w:szCs w:val="36"/>
-          <w:shd w:fill="auto" w:val="clear"/>
-          <w:lang w:val="en-US" w:eastAsia="zh-CN" w:bidi="hi-IN"/>
-        </w:rPr>
-        <w:t>2. A parábola do amigo importuno: por que ela aparece aqui?</w:t>
-      </w:r>
-    </w:p>
-    <w:p>
-      <w:pPr>
-        <w:pStyle w:val="Normal"/>
-        <w:jc w:val="both"/>
-        <w:rPr>
-          <w:sz w:val="36"/>
-          <w:szCs w:val="36"/>
-        </w:rPr>
-      </w:pPr>
-      <w:r>
-        <w:rPr/>
-      </w:r>
-    </w:p>
-    <w:p>
-      <w:pPr>
-        <w:pStyle w:val="Normal"/>
-        <w:jc w:val="both"/>
-        <w:rPr>
-          <w:sz w:val="36"/>
-          <w:szCs w:val="36"/>
-        </w:rPr>
-      </w:pPr>
-      <w:r>
-        <w:rPr>
-          <w:rFonts w:eastAsia="Times New Roman" w:cs="Times New Roman" w:ascii="Garamond" w:hAnsi="Garamond"/>
-          <w:color w:val="000000"/>
-          <w:kern w:val="0"/>
-          <w:sz w:val="36"/>
-          <w:szCs w:val="36"/>
-          <w:shd w:fill="auto" w:val="clear"/>
-          <w:lang w:val="en-US" w:eastAsia="zh-CN" w:bidi="hi-IN"/>
-        </w:rPr>
-        <w:t>A parábola do homem que bate à porta do amigo à meia-noite pedindo três pães não é um enfeite narrativo. Ela cumpre três funções claras:</w:t>
-      </w:r>
-    </w:p>
-    <w:p>
-      <w:pPr>
-        <w:pStyle w:val="Normal"/>
-        <w:jc w:val="both"/>
-        <w:rPr>
-          <w:sz w:val="36"/>
-          <w:szCs w:val="36"/>
-        </w:rPr>
-      </w:pPr>
-      <w:r>
-        <w:rPr/>
-      </w:r>
-    </w:p>
-    <w:p>
-      <w:pPr>
-        <w:pStyle w:val="Normal"/>
-        <w:jc w:val="both"/>
-        <w:rPr>
-          <w:sz w:val="36"/>
-          <w:szCs w:val="36"/>
-        </w:rPr>
-      </w:pPr>
-      <w:r>
-        <w:rPr>
-          <w:rFonts w:eastAsia="Times New Roman" w:cs="Times New Roman" w:ascii="Garamond" w:hAnsi="Garamond"/>
-          <w:color w:val="000000"/>
-          <w:kern w:val="0"/>
-          <w:sz w:val="36"/>
-          <w:szCs w:val="36"/>
-          <w:shd w:fill="auto" w:val="clear"/>
-          <w:lang w:val="en-US" w:eastAsia="zh-CN" w:bidi="hi-IN"/>
-        </w:rPr>
-        <w:t xml:space="preserve">🔹 </w:t>
-      </w:r>
-      <w:r>
-        <w:rPr>
-          <w:rFonts w:eastAsia="Times New Roman" w:cs="Times New Roman" w:ascii="Garamond" w:hAnsi="Garamond"/>
-          <w:color w:val="000000"/>
-          <w:kern w:val="0"/>
-          <w:sz w:val="36"/>
-          <w:szCs w:val="36"/>
-          <w:shd w:fill="auto" w:val="clear"/>
-          <w:lang w:val="en-US" w:eastAsia="zh-CN" w:bidi="hi-IN"/>
-        </w:rPr>
-        <w:t>a) Ensinar perseverança consciente</w:t>
-      </w:r>
-    </w:p>
-    <w:p>
-      <w:pPr>
-        <w:pStyle w:val="Normal"/>
-        <w:jc w:val="both"/>
-        <w:rPr>
-          <w:sz w:val="36"/>
-          <w:szCs w:val="36"/>
-        </w:rPr>
-      </w:pPr>
-      <w:r>
-        <w:rPr/>
-      </w:r>
-    </w:p>
-    <w:p>
-      <w:pPr>
-        <w:pStyle w:val="Normal"/>
-        <w:jc w:val="both"/>
-        <w:rPr>
-          <w:sz w:val="36"/>
-          <w:szCs w:val="36"/>
-        </w:rPr>
-      </w:pPr>
-      <w:r>
-        <w:rPr>
-          <w:rFonts w:eastAsia="Times New Roman" w:cs="Times New Roman" w:ascii="Garamond" w:hAnsi="Garamond"/>
-          <w:color w:val="000000"/>
-          <w:kern w:val="0"/>
-          <w:sz w:val="36"/>
-          <w:szCs w:val="36"/>
-          <w:shd w:fill="auto" w:val="clear"/>
-          <w:lang w:val="en-US" w:eastAsia="zh-CN" w:bidi="hi-IN"/>
-        </w:rPr>
-        <w:t>O amigo atende não por amizade, mas por causa da insistência.</w:t>
-      </w:r>
-    </w:p>
-    <w:p>
-      <w:pPr>
-        <w:pStyle w:val="Normal"/>
-        <w:jc w:val="both"/>
-        <w:rPr>
-          <w:sz w:val="36"/>
-          <w:szCs w:val="36"/>
-        </w:rPr>
-      </w:pPr>
-      <w:r>
-        <w:rPr>
-          <w:rFonts w:eastAsia="Times New Roman" w:cs="Times New Roman" w:ascii="Garamond" w:hAnsi="Garamond"/>
-          <w:color w:val="000000"/>
-          <w:kern w:val="0"/>
-          <w:sz w:val="36"/>
-          <w:szCs w:val="36"/>
-          <w:shd w:fill="auto" w:val="clear"/>
-          <w:lang w:val="en-US" w:eastAsia="zh-CN" w:bidi="hi-IN"/>
-        </w:rPr>
-        <w:t>Jesus não está dizendo que Deus é relutante — está ensinando que a prece verdadeira não é desistente, nem superficial.</w:t>
-      </w:r>
-    </w:p>
-    <w:p>
-      <w:pPr>
-        <w:pStyle w:val="Normal"/>
-        <w:jc w:val="both"/>
-        <w:rPr>
-          <w:sz w:val="36"/>
-          <w:szCs w:val="36"/>
-        </w:rPr>
-      </w:pPr>
-      <w:r>
-        <w:rPr/>
-      </w:r>
-    </w:p>
-    <w:p>
-      <w:pPr>
-        <w:pStyle w:val="Normal"/>
-        <w:jc w:val="both"/>
-        <w:rPr>
-          <w:sz w:val="36"/>
-          <w:szCs w:val="36"/>
-        </w:rPr>
-      </w:pPr>
-      <w:r>
-        <w:rPr>
-          <w:rFonts w:eastAsia="Times New Roman" w:cs="Times New Roman" w:ascii="Garamond" w:hAnsi="Garamond"/>
-          <w:color w:val="000000"/>
-          <w:kern w:val="0"/>
-          <w:sz w:val="36"/>
-          <w:szCs w:val="36"/>
-          <w:shd w:fill="auto" w:val="clear"/>
-          <w:lang w:val="en-US" w:eastAsia="zh-CN" w:bidi="hi-IN"/>
-        </w:rPr>
-        <w:t xml:space="preserve">🔹 </w:t>
-      </w:r>
-      <w:r>
-        <w:rPr>
-          <w:rFonts w:eastAsia="Times New Roman" w:cs="Times New Roman" w:ascii="Garamond" w:hAnsi="Garamond"/>
-          <w:color w:val="000000"/>
-          <w:kern w:val="0"/>
-          <w:sz w:val="36"/>
-          <w:szCs w:val="36"/>
-          <w:shd w:fill="auto" w:val="clear"/>
-          <w:lang w:val="en-US" w:eastAsia="zh-CN" w:bidi="hi-IN"/>
-        </w:rPr>
-        <w:t>b) Mostrar que pedir envolve responsabilidade</w:t>
-      </w:r>
-    </w:p>
-    <w:p>
-      <w:pPr>
-        <w:pStyle w:val="Normal"/>
-        <w:jc w:val="both"/>
-        <w:rPr>
-          <w:sz w:val="36"/>
-          <w:szCs w:val="36"/>
-        </w:rPr>
-      </w:pPr>
-      <w:r>
-        <w:rPr/>
-      </w:r>
-    </w:p>
-    <w:p>
-      <w:pPr>
-        <w:pStyle w:val="Normal"/>
-        <w:jc w:val="both"/>
-        <w:rPr>
-          <w:sz w:val="36"/>
-          <w:szCs w:val="36"/>
-        </w:rPr>
-      </w:pPr>
-      <w:r>
-        <w:rPr>
-          <w:rFonts w:eastAsia="Times New Roman" w:cs="Times New Roman" w:ascii="Garamond" w:hAnsi="Garamond"/>
-          <w:color w:val="000000"/>
-          <w:kern w:val="0"/>
-          <w:sz w:val="36"/>
-          <w:szCs w:val="36"/>
-          <w:shd w:fill="auto" w:val="clear"/>
-          <w:lang w:val="en-US" w:eastAsia="zh-CN" w:bidi="hi-IN"/>
-        </w:rPr>
-        <w:t>O pedido não é egoísta:</w:t>
-      </w:r>
-    </w:p>
-    <w:p>
-      <w:pPr>
-        <w:pStyle w:val="Normal"/>
-        <w:jc w:val="both"/>
-        <w:rPr>
-          <w:sz w:val="36"/>
-          <w:szCs w:val="36"/>
-        </w:rPr>
-      </w:pPr>
-      <w:r>
-        <w:rPr/>
-      </w:r>
-    </w:p>
-    <w:p>
-      <w:pPr>
-        <w:pStyle w:val="Normal"/>
-        <w:jc w:val="both"/>
-        <w:rPr>
-          <w:sz w:val="36"/>
-          <w:szCs w:val="36"/>
-        </w:rPr>
-      </w:pPr>
-      <w:r>
-        <w:rPr>
-          <w:rFonts w:eastAsia="Times New Roman" w:cs="Times New Roman" w:ascii="Garamond" w:hAnsi="Garamond"/>
-          <w:color w:val="000000"/>
-          <w:kern w:val="0"/>
-          <w:sz w:val="36"/>
-          <w:szCs w:val="36"/>
-          <w:shd w:fill="auto" w:val="clear"/>
-          <w:lang w:val="en-US" w:eastAsia="zh-CN" w:bidi="hi-IN"/>
-        </w:rPr>
-        <w:t>os pães não são para quem pede,</w:t>
-      </w:r>
-    </w:p>
-    <w:p>
-      <w:pPr>
-        <w:pStyle w:val="Normal"/>
-        <w:jc w:val="both"/>
-        <w:rPr>
-          <w:sz w:val="36"/>
-          <w:szCs w:val="36"/>
-        </w:rPr>
-      </w:pPr>
-      <w:r>
-        <w:rPr/>
-      </w:r>
-    </w:p>
-    <w:p>
-      <w:pPr>
-        <w:pStyle w:val="Normal"/>
-        <w:jc w:val="both"/>
-        <w:rPr>
-          <w:sz w:val="36"/>
-          <w:szCs w:val="36"/>
-        </w:rPr>
-      </w:pPr>
-      <w:r>
-        <w:rPr>
-          <w:rFonts w:eastAsia="Times New Roman" w:cs="Times New Roman" w:ascii="Garamond" w:hAnsi="Garamond"/>
-          <w:color w:val="000000"/>
-          <w:kern w:val="0"/>
-          <w:sz w:val="36"/>
-          <w:szCs w:val="36"/>
-          <w:shd w:fill="auto" w:val="clear"/>
-          <w:lang w:val="en-US" w:eastAsia="zh-CN" w:bidi="hi-IN"/>
-        </w:rPr>
-        <w:t>são para atender outro amigo.</w:t>
-      </w:r>
-    </w:p>
-    <w:p>
-      <w:pPr>
-        <w:pStyle w:val="Normal"/>
-        <w:jc w:val="both"/>
-        <w:rPr>
-          <w:sz w:val="36"/>
-          <w:szCs w:val="36"/>
-        </w:rPr>
-      </w:pPr>
-      <w:r>
-        <w:rPr/>
-      </w:r>
-    </w:p>
-    <w:p>
-      <w:pPr>
-        <w:pStyle w:val="Normal"/>
-        <w:jc w:val="both"/>
-        <w:rPr>
-          <w:sz w:val="36"/>
-          <w:szCs w:val="36"/>
-        </w:rPr>
-      </w:pPr>
-      <w:r>
-        <w:rPr>
-          <w:rFonts w:eastAsia="Times New Roman" w:cs="Times New Roman" w:ascii="Garamond" w:hAnsi="Garamond"/>
-          <w:color w:val="000000"/>
-          <w:kern w:val="0"/>
-          <w:sz w:val="36"/>
-          <w:szCs w:val="36"/>
-          <w:shd w:fill="auto" w:val="clear"/>
-          <w:lang w:val="en-US" w:eastAsia="zh-CN" w:bidi="hi-IN"/>
-        </w:rPr>
-        <w:t>Isso é muito significativo e se alinha perfeitamente com Emmanuel:</w:t>
-      </w:r>
-    </w:p>
-    <w:p>
-      <w:pPr>
-        <w:pStyle w:val="Normal"/>
-        <w:jc w:val="both"/>
-        <w:rPr>
-          <w:sz w:val="36"/>
-          <w:szCs w:val="36"/>
-        </w:rPr>
-      </w:pPr>
-      <w:r>
-        <w:rPr/>
-      </w:r>
-    </w:p>
-    <w:p>
-      <w:pPr>
-        <w:pStyle w:val="Normal"/>
-        <w:jc w:val="both"/>
-        <w:rPr>
-          <w:sz w:val="36"/>
-          <w:szCs w:val="36"/>
-        </w:rPr>
-      </w:pPr>
-      <w:r>
-        <w:rPr>
-          <w:rFonts w:eastAsia="Times New Roman" w:cs="Times New Roman" w:ascii="Garamond" w:hAnsi="Garamond"/>
-          <w:color w:val="000000"/>
-          <w:kern w:val="0"/>
-          <w:sz w:val="36"/>
-          <w:szCs w:val="36"/>
-          <w:shd w:fill="auto" w:val="clear"/>
-          <w:lang w:val="en-US" w:eastAsia="zh-CN" w:bidi="hi-IN"/>
-        </w:rPr>
-        <w:t>o pedido legítimo nasce de uma necessidade real e justa.</w:t>
-      </w:r>
-    </w:p>
-    <w:p>
-      <w:pPr>
-        <w:pStyle w:val="Normal"/>
-        <w:jc w:val="both"/>
-        <w:rPr>
-          <w:sz w:val="36"/>
-          <w:szCs w:val="36"/>
-        </w:rPr>
-      </w:pPr>
-      <w:r>
-        <w:rPr/>
-      </w:r>
-    </w:p>
-    <w:p>
-      <w:pPr>
-        <w:pStyle w:val="Normal"/>
-        <w:jc w:val="both"/>
-        <w:rPr>
-          <w:sz w:val="36"/>
-          <w:szCs w:val="36"/>
-        </w:rPr>
-      </w:pPr>
-      <w:r>
-        <w:rPr>
-          <w:rFonts w:eastAsia="Times New Roman" w:cs="Times New Roman" w:ascii="Garamond" w:hAnsi="Garamond"/>
-          <w:color w:val="000000"/>
-          <w:kern w:val="0"/>
-          <w:sz w:val="36"/>
-          <w:szCs w:val="36"/>
-          <w:shd w:fill="auto" w:val="clear"/>
-          <w:lang w:val="en-US" w:eastAsia="zh-CN" w:bidi="hi-IN"/>
-        </w:rPr>
-        <w:t xml:space="preserve">🔹 </w:t>
-      </w:r>
-      <w:r>
-        <w:rPr>
-          <w:rFonts w:eastAsia="Times New Roman" w:cs="Times New Roman" w:ascii="Garamond" w:hAnsi="Garamond"/>
-          <w:color w:val="000000"/>
-          <w:kern w:val="0"/>
-          <w:sz w:val="36"/>
-          <w:szCs w:val="36"/>
-          <w:shd w:fill="auto" w:val="clear"/>
-          <w:lang w:val="en-US" w:eastAsia="zh-CN" w:bidi="hi-IN"/>
-        </w:rPr>
-        <w:t>c) Preparar o discípulo para a ação</w:t>
-      </w:r>
-    </w:p>
-    <w:p>
-      <w:pPr>
-        <w:pStyle w:val="Normal"/>
-        <w:jc w:val="both"/>
-        <w:rPr>
-          <w:sz w:val="36"/>
-          <w:szCs w:val="36"/>
-        </w:rPr>
-      </w:pPr>
-      <w:r>
-        <w:rPr/>
-      </w:r>
-    </w:p>
-    <w:p>
-      <w:pPr>
-        <w:pStyle w:val="Normal"/>
-        <w:jc w:val="both"/>
-        <w:rPr>
-          <w:sz w:val="36"/>
-          <w:szCs w:val="36"/>
-        </w:rPr>
-      </w:pPr>
-      <w:r>
-        <w:rPr>
-          <w:rFonts w:eastAsia="Times New Roman" w:cs="Times New Roman" w:ascii="Garamond" w:hAnsi="Garamond"/>
-          <w:color w:val="000000"/>
-          <w:kern w:val="0"/>
-          <w:sz w:val="36"/>
-          <w:szCs w:val="36"/>
-          <w:shd w:fill="auto" w:val="clear"/>
-          <w:lang w:val="en-US" w:eastAsia="zh-CN" w:bidi="hi-IN"/>
-        </w:rPr>
-        <w:t>O homem:</w:t>
-      </w:r>
-    </w:p>
-    <w:p>
-      <w:pPr>
-        <w:pStyle w:val="Normal"/>
-        <w:jc w:val="both"/>
-        <w:rPr>
-          <w:sz w:val="36"/>
-          <w:szCs w:val="36"/>
-        </w:rPr>
-      </w:pPr>
-      <w:r>
-        <w:rPr/>
-      </w:r>
-    </w:p>
-    <w:p>
-      <w:pPr>
-        <w:pStyle w:val="Normal"/>
-        <w:jc w:val="both"/>
-        <w:rPr>
-          <w:sz w:val="36"/>
-          <w:szCs w:val="36"/>
-        </w:rPr>
-      </w:pPr>
-      <w:r>
-        <w:rPr>
-          <w:rFonts w:eastAsia="Times New Roman" w:cs="Times New Roman" w:ascii="Garamond" w:hAnsi="Garamond"/>
-          <w:color w:val="000000"/>
-          <w:kern w:val="0"/>
-          <w:sz w:val="36"/>
-          <w:szCs w:val="36"/>
-          <w:shd w:fill="auto" w:val="clear"/>
-          <w:lang w:val="en-US" w:eastAsia="zh-CN" w:bidi="hi-IN"/>
-        </w:rPr>
-        <w:t>levanta-se,</w:t>
-      </w:r>
-    </w:p>
-    <w:p>
-      <w:pPr>
-        <w:pStyle w:val="Normal"/>
-        <w:jc w:val="both"/>
-        <w:rPr>
-          <w:sz w:val="36"/>
-          <w:szCs w:val="36"/>
-        </w:rPr>
-      </w:pPr>
-      <w:r>
-        <w:rPr/>
-      </w:r>
-    </w:p>
-    <w:p>
-      <w:pPr>
-        <w:pStyle w:val="Normal"/>
-        <w:jc w:val="both"/>
-        <w:rPr>
-          <w:sz w:val="36"/>
-          <w:szCs w:val="36"/>
-        </w:rPr>
-      </w:pPr>
-      <w:r>
-        <w:rPr>
-          <w:rFonts w:eastAsia="Times New Roman" w:cs="Times New Roman" w:ascii="Garamond" w:hAnsi="Garamond"/>
-          <w:color w:val="000000"/>
-          <w:kern w:val="0"/>
-          <w:sz w:val="36"/>
-          <w:szCs w:val="36"/>
-          <w:shd w:fill="auto" w:val="clear"/>
-          <w:lang w:val="en-US" w:eastAsia="zh-CN" w:bidi="hi-IN"/>
-        </w:rPr>
-        <w:t>atravessa a noite,</w:t>
-      </w:r>
-    </w:p>
-    <w:p>
-      <w:pPr>
-        <w:pStyle w:val="Normal"/>
-        <w:jc w:val="both"/>
-        <w:rPr>
-          <w:sz w:val="36"/>
-          <w:szCs w:val="36"/>
-        </w:rPr>
-      </w:pPr>
-      <w:r>
-        <w:rPr/>
-      </w:r>
-    </w:p>
-    <w:p>
-      <w:pPr>
-        <w:pStyle w:val="Normal"/>
-        <w:jc w:val="both"/>
-        <w:rPr>
-          <w:sz w:val="36"/>
-          <w:szCs w:val="36"/>
-        </w:rPr>
-      </w:pPr>
-      <w:r>
-        <w:rPr>
-          <w:rFonts w:eastAsia="Times New Roman" w:cs="Times New Roman" w:ascii="Garamond" w:hAnsi="Garamond"/>
-          <w:color w:val="000000"/>
-          <w:kern w:val="0"/>
-          <w:sz w:val="36"/>
-          <w:szCs w:val="36"/>
-          <w:shd w:fill="auto" w:val="clear"/>
-          <w:lang w:val="en-US" w:eastAsia="zh-CN" w:bidi="hi-IN"/>
-        </w:rPr>
-        <w:t>bate à porta,</w:t>
-      </w:r>
-    </w:p>
-    <w:p>
-      <w:pPr>
-        <w:pStyle w:val="Normal"/>
-        <w:jc w:val="both"/>
-        <w:rPr>
-          <w:sz w:val="36"/>
-          <w:szCs w:val="36"/>
-        </w:rPr>
-      </w:pPr>
-      <w:r>
-        <w:rPr/>
-      </w:r>
-    </w:p>
-    <w:p>
-      <w:pPr>
-        <w:pStyle w:val="Normal"/>
-        <w:jc w:val="both"/>
-        <w:rPr>
-          <w:sz w:val="36"/>
-          <w:szCs w:val="36"/>
-        </w:rPr>
-      </w:pPr>
-      <w:r>
-        <w:rPr>
-          <w:rFonts w:eastAsia="Times New Roman" w:cs="Times New Roman" w:ascii="Garamond" w:hAnsi="Garamond"/>
-          <w:color w:val="000000"/>
-          <w:kern w:val="0"/>
-          <w:sz w:val="36"/>
-          <w:szCs w:val="36"/>
-          <w:shd w:fill="auto" w:val="clear"/>
-          <w:lang w:val="en-US" w:eastAsia="zh-CN" w:bidi="hi-IN"/>
-        </w:rPr>
-        <w:t>insiste.</w:t>
-      </w:r>
-    </w:p>
-    <w:p>
-      <w:pPr>
-        <w:pStyle w:val="Normal"/>
-        <w:jc w:val="both"/>
-        <w:rPr>
-          <w:sz w:val="36"/>
-          <w:szCs w:val="36"/>
-        </w:rPr>
-      </w:pPr>
-      <w:r>
-        <w:rPr/>
-      </w:r>
-    </w:p>
-    <w:p>
-      <w:pPr>
-        <w:pStyle w:val="Normal"/>
-        <w:jc w:val="both"/>
-        <w:rPr>
-          <w:sz w:val="36"/>
-          <w:szCs w:val="36"/>
-        </w:rPr>
-      </w:pPr>
-      <w:r>
-        <w:rPr>
-          <w:rFonts w:eastAsia="Times New Roman" w:cs="Times New Roman" w:ascii="Garamond" w:hAnsi="Garamond"/>
-          <w:color w:val="000000"/>
-          <w:kern w:val="0"/>
-          <w:sz w:val="36"/>
-          <w:szCs w:val="36"/>
-          <w:shd w:fill="auto" w:val="clear"/>
-          <w:lang w:val="en-US" w:eastAsia="zh-CN" w:bidi="hi-IN"/>
-        </w:rPr>
-        <w:t>Ou seja: ele age.</w:t>
-      </w:r>
-    </w:p>
-    <w:p>
-      <w:pPr>
-        <w:pStyle w:val="Normal"/>
-        <w:jc w:val="both"/>
-        <w:rPr>
-          <w:sz w:val="36"/>
-          <w:szCs w:val="36"/>
-        </w:rPr>
-      </w:pPr>
-      <w:r>
-        <w:rPr/>
-      </w:r>
-    </w:p>
-    <w:p>
-      <w:pPr>
-        <w:pStyle w:val="Normal"/>
-        <w:jc w:val="both"/>
-        <w:rPr>
-          <w:sz w:val="36"/>
-          <w:szCs w:val="36"/>
-        </w:rPr>
-      </w:pPr>
-      <w:r>
-        <w:rPr>
-          <w:rFonts w:eastAsia="Times New Roman" w:cs="Times New Roman" w:ascii="Garamond" w:hAnsi="Garamond"/>
-          <w:color w:val="000000"/>
-          <w:kern w:val="0"/>
-          <w:sz w:val="36"/>
-          <w:szCs w:val="36"/>
-          <w:shd w:fill="auto" w:val="clear"/>
-          <w:lang w:val="en-US" w:eastAsia="zh-CN" w:bidi="hi-IN"/>
-        </w:rPr>
-        <w:t>Jesus ensina, de forma indireta, que a oração não substitui o movimento da alma — ela o impulsiona.</w:t>
-      </w:r>
-    </w:p>
-    <w:p>
-      <w:pPr>
-        <w:pStyle w:val="Normal"/>
-        <w:jc w:val="both"/>
-        <w:rPr>
-          <w:sz w:val="36"/>
-          <w:szCs w:val="36"/>
-        </w:rPr>
-      </w:pPr>
-      <w:r>
-        <w:rPr/>
-      </w:r>
-    </w:p>
-    <w:p>
-      <w:pPr>
-        <w:pStyle w:val="Normal"/>
-        <w:jc w:val="both"/>
-        <w:rPr>
-          <w:sz w:val="36"/>
-          <w:szCs w:val="36"/>
-        </w:rPr>
-      </w:pPr>
-      <w:r>
-        <w:rPr/>
-      </w:r>
-    </w:p>
-    <w:p>
-      <w:pPr>
-        <w:pStyle w:val="Normal"/>
-        <w:jc w:val="both"/>
-        <w:rPr>
-          <w:color w:val="1C99E0"/>
-        </w:rPr>
-      </w:pPr>
-      <w:r>
-        <w:rPr>
-          <w:rFonts w:eastAsia="Times New Roman" w:cs="Times New Roman" w:ascii="Garamond" w:hAnsi="Garamond"/>
-          <w:color w:val="1C99E0"/>
-          <w:kern w:val="0"/>
-          <w:sz w:val="36"/>
-          <w:szCs w:val="36"/>
-          <w:shd w:fill="auto" w:val="clear"/>
-          <w:lang w:val="en-US" w:eastAsia="zh-CN" w:bidi="hi-IN"/>
-        </w:rPr>
-        <w:t>[ Término de tópico a ser desenvolvido ]</w:t>
-      </w:r>
-    </w:p>
-    <w:p>
-      <w:pPr>
-        <w:pStyle w:val="Normal"/>
-        <w:jc w:val="both"/>
-        <w:rPr>
-          <w:rFonts w:ascii="Garamond" w:hAnsi="Garamond" w:eastAsia="Times New Roman" w:cs="Times New Roman"/>
-          <w:kern w:val="0"/>
-          <w:sz w:val="36"/>
-          <w:szCs w:val="36"/>
-          <w:shd w:fill="auto" w:val="clear"/>
-          <w:lang w:val="en-US" w:eastAsia="zh-CN" w:bidi="hi-IN"/>
-        </w:rPr>
-      </w:pPr>
-      <w:r>
-        <w:rPr>
-          <w:color w:val="0369A3"/>
-        </w:rPr>
-      </w:r>
-    </w:p>
-    <w:p>
-      <w:pPr>
-        <w:pStyle w:val="Normal"/>
-        <w:jc w:val="both"/>
-        <w:rPr>
-          <w:sz w:val="36"/>
-          <w:szCs w:val="36"/>
-        </w:rPr>
-      </w:pPr>
-      <w:r>
-        <w:rPr>
-          <w:sz w:val="36"/>
-          <w:szCs w:val="36"/>
-          <w:shd w:fill="auto" w:val="clear"/>
+          <w:kern w:val="0"/>
+          <w:sz w:val="36"/>
+          <w:szCs w:val="36"/>
+          <w:shd w:fill="auto" w:val="clear"/>
+          <w:lang w:val="en-US" w:eastAsia="zh-CN" w:bidi="hi-IN"/>
+        </w:rPr>
+        <w:t>[ Término Prece refratada ]</w:t>
+      </w:r>
+    </w:p>
+    <w:p>
+      <w:pPr>
+        <w:pStyle w:val="Normal"/>
+        <w:jc w:val="both"/>
+        <w:rPr>
+          <w:sz w:val="36"/>
+          <w:szCs w:val="36"/>
+        </w:rPr>
+      </w:pPr>
+      <w:r>
+        <w:rPr>
+          <w:rFonts w:eastAsia="Times New Roman" w:cs="Times New Roman" w:ascii="Garamond" w:hAnsi="Garamond"/>
+          <w:kern w:val="0"/>
+          <w:sz w:val="36"/>
+          <w:szCs w:val="36"/>
+          <w:shd w:fill="auto" w:val="clear"/>
+          <w:lang w:val="en-US" w:eastAsia="zh-CN" w:bidi="hi-IN"/>
+        </w:rPr>
+      </w:r>
+    </w:p>
+    <w:p>
+      <w:pPr>
+        <w:pStyle w:val="Normal"/>
+        <w:jc w:val="both"/>
+        <w:rPr>
+          <w:sz w:val="36"/>
+          <w:szCs w:val="36"/>
+        </w:rPr>
+      </w:pPr>
+      <w:r>
+        <w:rPr>
+          <w:sz w:val="36"/>
+          <w:szCs w:val="36"/>
         </w:rPr>
       </w:r>
     </w:p>
@@ -5289,124 +4857,7 @@
         </w:rPr>
       </w:pPr>
       <w:r>
-        <w:rPr>
-          <w:rFonts w:eastAsia="Times New Roman" w:cs="Times New Roman" w:ascii="Garamond" w:hAnsi="Garamond"/>
-          <w:kern w:val="0"/>
-          <w:sz w:val="36"/>
-          <w:szCs w:val="36"/>
-          <w:lang w:val="en-US" w:eastAsia="zh-CN" w:bidi="hi-IN"/>
-        </w:rPr>
-      </w:r>
-    </w:p>
-    <w:p>
-      <w:pPr>
-        <w:pStyle w:val="Normal"/>
-        <w:jc w:val="both"/>
-        <w:rPr>
-          <w:rFonts w:ascii="Garamond" w:hAnsi="Garamond" w:eastAsia="Times New Roman" w:cs="Times New Roman"/>
-          <w:color w:val="000000"/>
-          <w:kern w:val="0"/>
-          <w:sz w:val="36"/>
-          <w:szCs w:val="36"/>
-          <w:lang w:val="en-US" w:eastAsia="zh-CN" w:bidi="hi-IN"/>
-        </w:rPr>
-      </w:pPr>
-      <w:r>
-        <w:rPr>
-          <w:rFonts w:eastAsia="Times New Roman" w:cs="Times New Roman" w:ascii="Garamond" w:hAnsi="Garamond"/>
-          <w:color w:val="000000"/>
-          <w:kern w:val="0"/>
-          <w:sz w:val="36"/>
-          <w:szCs w:val="36"/>
-          <w:lang w:val="en-US" w:eastAsia="zh-CN" w:bidi="hi-IN"/>
-        </w:rPr>
-      </w:r>
-    </w:p>
-    <w:p>
-      <w:pPr>
-        <w:pStyle w:val="Normal"/>
-        <w:jc w:val="both"/>
-        <w:rPr>
-          <w:rFonts w:ascii="Garamond" w:hAnsi="Garamond" w:eastAsia="Times New Roman" w:cs="Times New Roman"/>
-          <w:color w:val="000000"/>
-          <w:kern w:val="0"/>
-          <w:sz w:val="36"/>
-          <w:szCs w:val="36"/>
-          <w:lang w:val="en-US" w:eastAsia="zh-CN" w:bidi="hi-IN"/>
-        </w:rPr>
-      </w:pPr>
-      <w:r>
-        <w:rPr>
-          <w:rFonts w:eastAsia="Times New Roman" w:cs="Times New Roman" w:ascii="Garamond" w:hAnsi="Garamond"/>
-          <w:color w:val="000000"/>
-          <w:kern w:val="0"/>
-          <w:sz w:val="36"/>
-          <w:szCs w:val="36"/>
-          <w:lang w:val="en-US" w:eastAsia="zh-CN" w:bidi="hi-IN"/>
-        </w:rPr>
-      </w:r>
-    </w:p>
-    <w:p>
-      <w:pPr>
-        <w:pStyle w:val="Normal"/>
-        <w:jc w:val="both"/>
-        <w:rPr>
-          <w:highlight w:val="none"/>
-          <w:shd w:fill="auto" w:val="clear"/>
-        </w:rPr>
-      </w:pPr>
-      <w:r>
-        <w:rPr>
-          <w:rFonts w:eastAsia="Times New Roman" w:cs="Times New Roman" w:ascii="Garamond" w:hAnsi="Garamond"/>
-          <w:color w:val="000000"/>
-          <w:kern w:val="0"/>
-          <w:sz w:val="36"/>
-          <w:szCs w:val="36"/>
-          <w:shd w:fill="auto" w:val="clear"/>
-          <w:lang w:val="en-US" w:eastAsia="zh-CN" w:bidi="hi-IN"/>
-        </w:rPr>
-        <w:t xml:space="preserve">lém disso, Fariseus e saduceus viviam fazendo perguntas maliciosas tentando colocar Jesus em contradição consigo mesmo para ser desmoralizado diante do povo. </w:t>
-      </w:r>
-    </w:p>
-    <w:p>
-      <w:pPr>
-        <w:pStyle w:val="Normal"/>
-        <w:jc w:val="both"/>
-        <w:rPr>
-          <w:sz w:val="36"/>
-          <w:szCs w:val="36"/>
-          <w:highlight w:val="none"/>
-          <w:shd w:fill="auto" w:val="clear"/>
-        </w:rPr>
-      </w:pPr>
-      <w:r>
-        <w:rPr>
-          <w:sz w:val="36"/>
-          <w:szCs w:val="36"/>
-          <w:shd w:fill="auto" w:val="clear"/>
-        </w:rPr>
-      </w:r>
-    </w:p>
-    <w:p>
-      <w:pPr>
-        <w:pStyle w:val="Normal"/>
-        <w:jc w:val="both"/>
-        <w:rPr>
-          <w:highlight w:val="none"/>
-          <w:shd w:fill="auto" w:val="clear"/>
-        </w:rPr>
-      </w:pPr>
-      <w:r>
-        <w:rPr>
-          <w:rFonts w:eastAsia="Times New Roman" w:cs="Times New Roman" w:ascii="Garamond" w:hAnsi="Garamond"/>
-          <w:color w:val="000000"/>
-          <w:kern w:val="0"/>
-          <w:sz w:val="36"/>
-          <w:szCs w:val="36"/>
-          <w:shd w:fill="auto" w:val="clear"/>
-          <w:lang w:val="en-US" w:eastAsia="zh-CN" w:bidi="hi-IN"/>
-        </w:rPr>
-        <w:t xml:space="preserve">Diferentemente dos saduceus, os fariseus tinham uma crença mais próxima daquilo que Jesus ensinava. Eram estudiosos e muito dedicados ao cumprimento da Lei, mas com o passar do tempo a maioria deles passou a cumprir as leis mais para serem vistos e admirados do que por fidelidade às escrituras sagradas. </w:t>
+        <w:rPr/>
       </w:r>
     </w:p>
     <w:p>
@@ -5491,7 +4942,7 @@
         <w:bCs/>
         <w:rFonts w:ascii="Garamond" w:hAnsi="Garamond"/>
       </w:rPr>
-      <w:t>29</w:t>
+      <w:t>26</w:t>
     </w:r>
     <w:r>
       <w:rPr>

</xml_diff>

<commit_message>
22/02/206 - 19:13 h
</commit_message>
<xml_diff>
--- a/Pedi e obtereis/Pedi e obtereis.docx
+++ b/Pedi e obtereis/Pedi e obtereis.docx
@@ -153,55 +153,31 @@
           <w:shd w:fill="auto" w:val="clear"/>
           <w:lang w:val="en-US" w:eastAsia="zh-CN" w:bidi="hi-IN"/>
         </w:rPr>
-        <w:t>Quando Jesus falou sobre odiar pai e mãe, deixar aos mortos o cuidado de enterrar seus mortos ou ainda abandonar pai, mãe e filhos, Ele causou grande estranheza. Isso acontece</w:t>
-      </w:r>
-      <w:r>
-        <w:rPr>
-          <w:rFonts w:eastAsia="Times New Roman" w:cs="Times New Roman" w:ascii="Garamond" w:hAnsi="Garamond"/>
-          <w:color w:val="000000"/>
-          <w:kern w:val="0"/>
-          <w:sz w:val="36"/>
-          <w:szCs w:val="36"/>
-          <w:shd w:fill="auto" w:val="clear"/>
-          <w:lang w:val="en-US" w:eastAsia="zh-CN" w:bidi="hi-IN"/>
-        </w:rPr>
-        <w:t>u e ainda acontece</w:t>
-      </w:r>
-      <w:r>
-        <w:rPr>
-          <w:rFonts w:eastAsia="Times New Roman" w:cs="Times New Roman" w:ascii="Garamond" w:hAnsi="Garamond"/>
-          <w:color w:val="000000"/>
-          <w:kern w:val="0"/>
-          <w:sz w:val="36"/>
-          <w:szCs w:val="36"/>
-          <w:shd w:fill="auto" w:val="clear"/>
-          <w:lang w:val="en-US" w:eastAsia="zh-CN" w:bidi="hi-IN"/>
-        </w:rPr>
-        <w:t xml:space="preserve"> porque, quando esses ensinamentos são interpretados de forma superficial, passam a impressão de que Jesus estaria contrariando tudo aquilo que </w:t>
-      </w:r>
-      <w:r>
-        <w:rPr>
-          <w:rFonts w:eastAsia="Times New Roman" w:cs="Times New Roman" w:ascii="Garamond" w:hAnsi="Garamond"/>
-          <w:color w:val="000000"/>
-          <w:kern w:val="0"/>
-          <w:sz w:val="36"/>
-          <w:szCs w:val="36"/>
-          <w:shd w:fill="auto" w:val="clear"/>
-          <w:lang w:val="en-US" w:eastAsia="zh-CN" w:bidi="hi-IN"/>
-        </w:rPr>
-        <w:t xml:space="preserve">Ele </w:t>
-      </w:r>
-      <w:r>
-        <w:rPr>
-          <w:rFonts w:eastAsia="Times New Roman" w:cs="Times New Roman" w:ascii="Garamond" w:hAnsi="Garamond"/>
-          <w:color w:val="000000"/>
-          <w:kern w:val="0"/>
-          <w:sz w:val="36"/>
-          <w:szCs w:val="36"/>
-          <w:shd w:fill="auto" w:val="clear"/>
-          <w:lang w:val="en-US" w:eastAsia="zh-CN" w:bidi="hi-IN"/>
-        </w:rPr>
-        <w:t>ensinou anteriormente sobre amor, caridade e responsabilidade.</w:t>
+        <w:t xml:space="preserve">Quando Jesus falou sobre odiar pai e mãe, deixar aos mortos o cuidado de enterrar seus mortos ou ainda abandonar pai, mãe e filhos, Ele causou grande estranheza. Isso aconteceu e ainda acontece porque, quando esses ensinamentos são interpretados de </w:t>
+      </w:r>
+      <w:r>
+        <w:rPr>
+          <w:rFonts w:eastAsia="Times New Roman" w:cs="Times New Roman" w:ascii="Garamond" w:hAnsi="Garamond"/>
+          <w:color w:val="000000"/>
+          <w:kern w:val="0"/>
+          <w:sz w:val="36"/>
+          <w:szCs w:val="36"/>
+          <w:shd w:fill="auto" w:val="clear"/>
+          <w:lang w:val="en-US" w:eastAsia="zh-CN" w:bidi="hi-IN"/>
+        </w:rPr>
+        <w:t>maneira</w:t>
+      </w:r>
+      <w:r>
+        <w:rPr>
+          <w:rFonts w:eastAsia="Times New Roman" w:cs="Times New Roman" w:ascii="Garamond" w:hAnsi="Garamond"/>
+          <w:color w:val="000000"/>
+          <w:kern w:val="0"/>
+          <w:sz w:val="36"/>
+          <w:szCs w:val="36"/>
+          <w:shd w:fill="auto" w:val="clear"/>
+          <w:lang w:val="en-US" w:eastAsia="zh-CN" w:bidi="hi-IN"/>
+        </w:rPr>
+        <w:t xml:space="preserve"> superficial, passam a impressão de que Jesus estaria contrariando tudo aquilo que Ele ensinou sobre amor, caridade e responsabilidade.</w:t>
       </w:r>
     </w:p>
     <w:p>
@@ -329,80 +305,179 @@
           <w:shd w:fill="auto" w:val="clear"/>
           <w:lang w:val="en-US" w:eastAsia="zh-CN" w:bidi="hi-IN"/>
         </w:rPr>
-        <w:t>De modo geral, costumamos interpretar esses ensinamentos como se nenhum esforço fosse exigido de nossa parte, como se bastasse apenas pedir, ou simplesmente esperar, para que Deus nos conceda tudo aquilo que desejamos.</w:t>
-      </w:r>
-    </w:p>
-    <w:p>
-      <w:pPr>
-        <w:pStyle w:val="Normal"/>
-        <w:jc w:val="both"/>
-        <w:rPr>
-          <w:sz w:val="36"/>
-          <w:szCs w:val="36"/>
-        </w:rPr>
-      </w:pPr>
-      <w:r>
-        <w:rPr>
-          <w:sz w:val="36"/>
-          <w:szCs w:val="36"/>
-        </w:rPr>
-      </w:r>
-    </w:p>
-    <w:p>
-      <w:pPr>
-        <w:pStyle w:val="Normal"/>
-        <w:jc w:val="both"/>
-        <w:rPr>
-          <w:sz w:val="36"/>
-          <w:szCs w:val="36"/>
-        </w:rPr>
-      </w:pPr>
-      <w:r>
-        <w:rPr>
-          <w:rFonts w:eastAsia="Times New Roman" w:cs="Times New Roman" w:ascii="Garamond" w:hAnsi="Garamond"/>
-          <w:color w:val="000000"/>
-          <w:kern w:val="0"/>
-          <w:sz w:val="36"/>
-          <w:szCs w:val="36"/>
-          <w:shd w:fill="auto" w:val="clear"/>
-          <w:lang w:val="en-US" w:eastAsia="zh-CN" w:bidi="hi-IN"/>
-        </w:rPr>
-        <w:t xml:space="preserve">Talvez essas interpretações equivocadas persistam porque, no fundo, elas nos parecem mais cômodas. É mais confortável imaginar um Deus que concede tudo sem exigir esforço, transformação ou compromisso de nossa parte. </w:t>
-      </w:r>
-    </w:p>
-    <w:p>
-      <w:pPr>
-        <w:pStyle w:val="Normal"/>
-        <w:jc w:val="both"/>
-        <w:rPr>
-          <w:sz w:val="36"/>
-          <w:szCs w:val="36"/>
-        </w:rPr>
-      </w:pPr>
-      <w:r>
-        <w:rPr/>
-      </w:r>
-    </w:p>
-    <w:p>
-      <w:pPr>
-        <w:pStyle w:val="Normal"/>
-        <w:jc w:val="both"/>
-        <w:rPr>
-          <w:sz w:val="36"/>
-          <w:szCs w:val="36"/>
-        </w:rPr>
-      </w:pPr>
-      <w:r>
-        <w:rPr>
-          <w:rFonts w:eastAsia="Times New Roman" w:cs="Times New Roman" w:ascii="Garamond" w:hAnsi="Garamond"/>
-          <w:color w:val="000000"/>
-          <w:kern w:val="0"/>
-          <w:sz w:val="36"/>
-          <w:szCs w:val="36"/>
-          <w:shd w:fill="auto" w:val="clear"/>
-          <w:lang w:val="en-US" w:eastAsia="zh-CN" w:bidi="hi-IN"/>
-        </w:rPr>
-        <w:t>Assim, transformamos ensinamentos profundos de Jesus em promessas de facilidade, quando na verdade eles nos convidam à responsabilidade, à confiança ativa e ao trabalho no bem.</w:t>
+        <w:t xml:space="preserve">De modo geral, costumamos interpretar esses ensinamentos como se </w:t>
+      </w:r>
+      <w:r>
+        <w:rPr>
+          <w:rFonts w:eastAsia="Times New Roman" w:cs="Times New Roman" w:ascii="Garamond" w:hAnsi="Garamond"/>
+          <w:color w:val="000000"/>
+          <w:kern w:val="0"/>
+          <w:sz w:val="36"/>
+          <w:szCs w:val="36"/>
+          <w:shd w:fill="auto" w:val="clear"/>
+          <w:lang w:val="en-US" w:eastAsia="zh-CN" w:bidi="hi-IN"/>
+        </w:rPr>
+        <w:t xml:space="preserve">não fosse necessário </w:t>
+      </w:r>
+      <w:r>
+        <w:rPr>
+          <w:rFonts w:eastAsia="Times New Roman" w:cs="Times New Roman" w:ascii="Garamond" w:hAnsi="Garamond"/>
+          <w:color w:val="000000"/>
+          <w:kern w:val="0"/>
+          <w:sz w:val="36"/>
+          <w:szCs w:val="36"/>
+          <w:shd w:fill="auto" w:val="clear"/>
+          <w:lang w:val="en-US" w:eastAsia="zh-CN" w:bidi="hi-IN"/>
+        </w:rPr>
+        <w:t>nenhum esforço  de nossa parte, como se bastasse apenas pedir, ou simplesmente esperar, para que Deus nos conceda tudo aquilo que desejamos.</w:t>
+      </w:r>
+    </w:p>
+    <w:p>
+      <w:pPr>
+        <w:pStyle w:val="Normal"/>
+        <w:jc w:val="both"/>
+        <w:rPr>
+          <w:sz w:val="36"/>
+          <w:szCs w:val="36"/>
+        </w:rPr>
+      </w:pPr>
+      <w:r>
+        <w:rPr>
+          <w:sz w:val="36"/>
+          <w:szCs w:val="36"/>
+        </w:rPr>
+      </w:r>
+    </w:p>
+    <w:p>
+      <w:pPr>
+        <w:pStyle w:val="Normal"/>
+        <w:jc w:val="both"/>
+        <w:rPr>
+          <w:sz w:val="36"/>
+          <w:szCs w:val="36"/>
+        </w:rPr>
+      </w:pPr>
+      <w:r>
+        <w:rPr>
+          <w:rFonts w:eastAsia="Times New Roman" w:cs="Times New Roman" w:ascii="Garamond" w:hAnsi="Garamond"/>
+          <w:color w:val="000000"/>
+          <w:kern w:val="0"/>
+          <w:sz w:val="36"/>
+          <w:szCs w:val="36"/>
+          <w:shd w:fill="auto" w:val="clear"/>
+          <w:lang w:val="en-US" w:eastAsia="zh-CN" w:bidi="hi-IN"/>
+        </w:rPr>
+        <w:t xml:space="preserve">Talvez essas interpretações equivocadas continuem existindo porque, no fundo, elas são mais fáceis para nós. É bem mais confortável pensar em um Deus que resolve tudo sozinho, sem que </w:t>
+      </w:r>
+      <w:r>
+        <w:rPr>
+          <w:rFonts w:eastAsia="Times New Roman" w:cs="Times New Roman" w:ascii="Garamond" w:hAnsi="Garamond"/>
+          <w:color w:val="000000"/>
+          <w:kern w:val="0"/>
+          <w:sz w:val="36"/>
+          <w:szCs w:val="36"/>
+          <w:shd w:fill="auto" w:val="clear"/>
+          <w:lang w:val="en-US" w:eastAsia="zh-CN" w:bidi="hi-IN"/>
+        </w:rPr>
+        <w:t>precisemos</w:t>
+      </w:r>
+      <w:r>
+        <w:rPr>
+          <w:rFonts w:eastAsia="Times New Roman" w:cs="Times New Roman" w:ascii="Garamond" w:hAnsi="Garamond"/>
+          <w:color w:val="000000"/>
+          <w:kern w:val="0"/>
+          <w:sz w:val="36"/>
+          <w:szCs w:val="36"/>
+          <w:shd w:fill="auto" w:val="clear"/>
+          <w:lang w:val="en-US" w:eastAsia="zh-CN" w:bidi="hi-IN"/>
+        </w:rPr>
+        <w:t xml:space="preserve">  mudar, colaborar ou assumir compromisso</w:t>
+      </w:r>
+      <w:r>
+        <w:rPr>
+          <w:rFonts w:eastAsia="Times New Roman" w:cs="Times New Roman" w:ascii="Garamond" w:hAnsi="Garamond"/>
+          <w:color w:val="000000"/>
+          <w:kern w:val="0"/>
+          <w:sz w:val="36"/>
+          <w:szCs w:val="36"/>
+          <w:shd w:fill="auto" w:val="clear"/>
+          <w:lang w:val="en-US" w:eastAsia="zh-CN" w:bidi="hi-IN"/>
+        </w:rPr>
+        <w:t>s</w:t>
+      </w:r>
+      <w:r>
+        <w:rPr>
+          <w:rFonts w:eastAsia="Times New Roman" w:cs="Times New Roman" w:ascii="Garamond" w:hAnsi="Garamond"/>
+          <w:color w:val="000000"/>
+          <w:kern w:val="0"/>
+          <w:sz w:val="36"/>
+          <w:szCs w:val="36"/>
+          <w:shd w:fill="auto" w:val="clear"/>
+          <w:lang w:val="en-US" w:eastAsia="zh-CN" w:bidi="hi-IN"/>
+        </w:rPr>
+        <w:t>.</w:t>
+      </w:r>
+    </w:p>
+    <w:p>
+      <w:pPr>
+        <w:pStyle w:val="Normal"/>
+        <w:jc w:val="both"/>
+        <w:rPr>
+          <w:sz w:val="36"/>
+          <w:szCs w:val="36"/>
+        </w:rPr>
+      </w:pPr>
+      <w:r>
+        <w:rPr>
+          <w:sz w:val="36"/>
+          <w:szCs w:val="36"/>
+        </w:rPr>
+      </w:r>
+    </w:p>
+    <w:p>
+      <w:pPr>
+        <w:pStyle w:val="Normal"/>
+        <w:jc w:val="both"/>
+        <w:rPr>
+          <w:sz w:val="36"/>
+          <w:szCs w:val="36"/>
+        </w:rPr>
+      </w:pPr>
+      <w:r>
+        <w:rPr>
+          <w:rFonts w:eastAsia="Times New Roman" w:cs="Times New Roman" w:ascii="Garamond" w:hAnsi="Garamond"/>
+          <w:color w:val="000000"/>
+          <w:kern w:val="0"/>
+          <w:sz w:val="36"/>
+          <w:szCs w:val="36"/>
+          <w:shd w:fill="auto" w:val="clear"/>
+          <w:lang w:val="en-US" w:eastAsia="zh-CN" w:bidi="hi-IN"/>
+        </w:rPr>
+        <w:t>Assim, transformamos ensinamentos profundos de Jesus em promessas de facilidade, quando na verdade e</w:t>
+      </w:r>
+      <w:r>
+        <w:rPr>
+          <w:rFonts w:eastAsia="Times New Roman" w:cs="Times New Roman" w:ascii="Garamond" w:hAnsi="Garamond"/>
+          <w:color w:val="000000"/>
+          <w:kern w:val="0"/>
+          <w:sz w:val="36"/>
+          <w:szCs w:val="36"/>
+          <w:shd w:fill="auto" w:val="clear"/>
+          <w:lang w:val="en-US" w:eastAsia="zh-CN" w:bidi="hi-IN"/>
+        </w:rPr>
+        <w:t>sses ensinamentos</w:t>
+      </w:r>
+      <w:r>
+        <w:rPr>
+          <w:rFonts w:eastAsia="Times New Roman" w:cs="Times New Roman" w:ascii="Garamond" w:hAnsi="Garamond"/>
+          <w:color w:val="000000"/>
+          <w:kern w:val="0"/>
+          <w:sz w:val="36"/>
+          <w:szCs w:val="36"/>
+          <w:shd w:fill="auto" w:val="clear"/>
+          <w:lang w:val="en-US" w:eastAsia="zh-CN" w:bidi="hi-IN"/>
+        </w:rPr>
+        <w:t xml:space="preserve"> nos convidam à responsabilidade, à confiança ativa e ao trabalho no bem.</w:t>
       </w:r>
     </w:p>
     <w:p>
@@ -454,12 +529,8 @@
       </w:pPr>
       <w:r>
         <w:rPr>
-          <w:rFonts w:eastAsia="Times New Roman" w:cs="Times New Roman" w:ascii="Garamond" w:hAnsi="Garamond"/>
-          <w:kern w:val="0"/>
-          <w:sz w:val="36"/>
-          <w:szCs w:val="36"/>
-          <w:shd w:fill="auto" w:val="clear"/>
-          <w:lang w:val="en-US" w:eastAsia="zh-CN" w:bidi="hi-IN"/>
+          <w:sz w:val="36"/>
+          <w:szCs w:val="36"/>
         </w:rPr>
       </w:r>
     </w:p>
@@ -495,140 +566,112 @@
           <w:shd w:fill="auto" w:val="clear"/>
           <w:lang w:val="en-US" w:eastAsia="zh-CN" w:bidi="hi-IN"/>
         </w:rPr>
-        <w:t>"</w:t>
-      </w:r>
-      <w:r>
-        <w:rPr>
-          <w:rFonts w:eastAsia="Times New Roman" w:cs="Times New Roman" w:ascii="Garamond" w:hAnsi="Garamond"/>
-          <w:i/>
-          <w:iCs/>
-          <w:color w:val="000000"/>
-          <w:kern w:val="0"/>
-          <w:sz w:val="36"/>
-          <w:szCs w:val="36"/>
-          <w:shd w:fill="auto" w:val="clear"/>
-          <w:lang w:val="en-US" w:eastAsia="zh-CN" w:bidi="hi-IN"/>
-        </w:rPr>
-        <w:t>Pedi e Obtereis</w:t>
-      </w:r>
-      <w:r>
-        <w:rPr>
-          <w:rFonts w:eastAsia="Times New Roman" w:cs="Times New Roman" w:ascii="Garamond" w:hAnsi="Garamond"/>
-          <w:i/>
-          <w:iCs/>
-          <w:color w:val="000000"/>
-          <w:kern w:val="0"/>
-          <w:sz w:val="36"/>
-          <w:szCs w:val="36"/>
-          <w:shd w:fill="auto" w:val="clear"/>
-          <w:lang w:val="en-US" w:eastAsia="zh-CN" w:bidi="hi-IN"/>
-        </w:rPr>
-        <w:t>"</w:t>
-      </w:r>
-      <w:r>
-        <w:rPr>
-          <w:rFonts w:eastAsia="Times New Roman" w:cs="Times New Roman" w:ascii="Garamond" w:hAnsi="Garamond"/>
-          <w:color w:val="000000"/>
-          <w:kern w:val="0"/>
-          <w:sz w:val="36"/>
-          <w:szCs w:val="36"/>
-          <w:shd w:fill="auto" w:val="clear"/>
-          <w:lang w:val="en-US" w:eastAsia="zh-CN" w:bidi="hi-IN"/>
-        </w:rPr>
-        <w:t xml:space="preserve"> é ensinado por Jesus em duas </w:t>
-      </w:r>
-      <w:r>
-        <w:rPr>
-          <w:rFonts w:eastAsia="Times New Roman" w:cs="Times New Roman" w:ascii="Garamond" w:hAnsi="Garamond"/>
-          <w:color w:val="000000"/>
-          <w:kern w:val="0"/>
-          <w:sz w:val="36"/>
-          <w:szCs w:val="36"/>
-          <w:shd w:fill="auto" w:val="clear"/>
-          <w:lang w:val="en-US" w:eastAsia="zh-CN" w:bidi="hi-IN"/>
-        </w:rPr>
-        <w:t>passagens</w:t>
-      </w:r>
-      <w:r>
-        <w:rPr>
-          <w:rFonts w:eastAsia="Times New Roman" w:cs="Times New Roman" w:ascii="Garamond" w:hAnsi="Garamond"/>
-          <w:color w:val="000000"/>
-          <w:kern w:val="0"/>
-          <w:sz w:val="36"/>
-          <w:szCs w:val="36"/>
-          <w:shd w:fill="auto" w:val="clear"/>
-          <w:lang w:val="en-US" w:eastAsia="zh-CN" w:bidi="hi-IN"/>
-        </w:rPr>
-        <w:t xml:space="preserve">: a primeira está em Mateus 7:7-8 durante o sermão do monte quando Jesus fala à multidão. </w:t>
-      </w:r>
-    </w:p>
-    <w:p>
-      <w:pPr>
-        <w:pStyle w:val="Normal"/>
-        <w:jc w:val="both"/>
-        <w:rPr>
-          <w:color w:val="auto"/>
-        </w:rPr>
-      </w:pPr>
-      <w:r>
-        <w:rPr>
-          <w:rFonts w:eastAsia="Times New Roman" w:cs="Times New Roman" w:ascii="Garamond" w:hAnsi="Garamond"/>
-          <w:color w:val="000000"/>
-          <w:kern w:val="0"/>
-          <w:sz w:val="36"/>
-          <w:szCs w:val="36"/>
-          <w:shd w:fill="auto" w:val="clear"/>
-          <w:lang w:val="en-US" w:eastAsia="zh-CN" w:bidi="hi-IN"/>
-        </w:rPr>
-        <w:t xml:space="preserve">A segunda está em Lucas 11:9-11 logo </w:t>
-      </w:r>
-      <w:r>
-        <w:rPr>
-          <w:rFonts w:eastAsia="Times New Roman" w:cs="Times New Roman" w:ascii="Garamond" w:hAnsi="Garamond"/>
-          <w:color w:val="000000"/>
-          <w:kern w:val="0"/>
-          <w:sz w:val="36"/>
-          <w:szCs w:val="36"/>
-          <w:shd w:fill="auto" w:val="clear"/>
-          <w:lang w:val="en-US" w:eastAsia="zh-CN" w:bidi="hi-IN"/>
-        </w:rPr>
-        <w:t>após</w:t>
-      </w:r>
-      <w:r>
-        <w:rPr>
-          <w:rFonts w:eastAsia="Times New Roman" w:cs="Times New Roman" w:ascii="Garamond" w:hAnsi="Garamond"/>
-          <w:color w:val="000000"/>
-          <w:kern w:val="0"/>
-          <w:sz w:val="36"/>
-          <w:szCs w:val="36"/>
-          <w:shd w:fill="auto" w:val="clear"/>
-          <w:lang w:val="en-US" w:eastAsia="zh-CN" w:bidi="hi-IN"/>
-        </w:rPr>
-        <w:t xml:space="preserve"> Jesus ensina</w:t>
-      </w:r>
-      <w:r>
-        <w:rPr>
-          <w:rFonts w:eastAsia="Times New Roman" w:cs="Times New Roman" w:ascii="Garamond" w:hAnsi="Garamond"/>
-          <w:color w:val="000000"/>
-          <w:kern w:val="0"/>
-          <w:sz w:val="36"/>
-          <w:szCs w:val="36"/>
-          <w:shd w:fill="auto" w:val="clear"/>
-          <w:lang w:val="en-US" w:eastAsia="zh-CN" w:bidi="hi-IN"/>
-        </w:rPr>
-        <w:t>r</w:t>
-      </w:r>
-      <w:r>
-        <w:rPr>
-          <w:rFonts w:eastAsia="Times New Roman" w:cs="Times New Roman" w:ascii="Garamond" w:hAnsi="Garamond"/>
-          <w:color w:val="000000"/>
-          <w:kern w:val="0"/>
-          <w:sz w:val="36"/>
-          <w:szCs w:val="36"/>
-          <w:shd w:fill="auto" w:val="clear"/>
-          <w:lang w:val="en-US" w:eastAsia="zh-CN" w:bidi="hi-IN"/>
-        </w:rPr>
-        <w:t xml:space="preserve"> aos discípulos a oração do Pai-Nosso. Jesus apresenta uma pequena parábola, conhecida como a Parábola do Amigo Importuno.</w:t>
+        <w:t>"Pedi e Obtereis"</w:t>
+      </w:r>
+      <w:r>
+        <w:rPr>
+          <w:rFonts w:eastAsia="Times New Roman" w:cs="Times New Roman" w:ascii="Garamond" w:hAnsi="Garamond"/>
+          <w:color w:val="000000"/>
+          <w:kern w:val="0"/>
+          <w:sz w:val="36"/>
+          <w:szCs w:val="36"/>
+          <w:shd w:fill="auto" w:val="clear"/>
+          <w:lang w:val="en-US" w:eastAsia="zh-CN" w:bidi="hi-IN"/>
+        </w:rPr>
+        <w:t xml:space="preserve"> é ensinado por Jesus em duas passagens: a primeira está em Mateus 7:7-8 durante o sermão do monte quando Jesus fala à multidão. </w:t>
+      </w:r>
+    </w:p>
+    <w:p>
+      <w:pPr>
+        <w:pStyle w:val="Normal"/>
+        <w:jc w:val="both"/>
+        <w:rPr>
+          <w:color w:val="auto"/>
+        </w:rPr>
+      </w:pPr>
+      <w:r>
+        <w:rPr>
+          <w:rFonts w:eastAsia="Times New Roman" w:cs="Times New Roman" w:ascii="Garamond" w:hAnsi="Garamond"/>
+          <w:color w:val="000000"/>
+          <w:kern w:val="0"/>
+          <w:sz w:val="36"/>
+          <w:szCs w:val="36"/>
+          <w:shd w:fill="auto" w:val="clear"/>
+          <w:lang w:val="en-US" w:eastAsia="zh-CN" w:bidi="hi-IN"/>
+        </w:rPr>
+        <w:t>A segunda está em Lucas 11:9-11</w:t>
+      </w:r>
+      <w:r>
+        <w:rPr>
+          <w:rFonts w:eastAsia="Times New Roman" w:cs="Times New Roman" w:ascii="Garamond" w:hAnsi="Garamond"/>
+          <w:color w:val="000000"/>
+          <w:kern w:val="0"/>
+          <w:sz w:val="36"/>
+          <w:szCs w:val="36"/>
+          <w:shd w:fill="auto" w:val="clear"/>
+          <w:lang w:val="en-US" w:eastAsia="zh-CN" w:bidi="hi-IN"/>
+        </w:rPr>
+        <w:t>.</w:t>
+      </w:r>
+      <w:r>
+        <w:rPr>
+          <w:rFonts w:eastAsia="Times New Roman" w:cs="Times New Roman" w:ascii="Garamond" w:hAnsi="Garamond"/>
+          <w:color w:val="000000"/>
+          <w:kern w:val="0"/>
+          <w:sz w:val="36"/>
+          <w:szCs w:val="36"/>
+          <w:shd w:fill="auto" w:val="clear"/>
+          <w:lang w:val="en-US" w:eastAsia="zh-CN" w:bidi="hi-IN"/>
+        </w:rPr>
+        <w:t xml:space="preserve"> </w:t>
+      </w:r>
+      <w:r>
+        <w:rPr>
+          <w:rFonts w:eastAsia="Times New Roman" w:cs="Times New Roman" w:ascii="Garamond" w:hAnsi="Garamond"/>
+          <w:color w:val="000000"/>
+          <w:kern w:val="0"/>
+          <w:sz w:val="36"/>
+          <w:szCs w:val="36"/>
+          <w:shd w:fill="auto" w:val="clear"/>
+          <w:lang w:val="en-US" w:eastAsia="zh-CN" w:bidi="hi-IN"/>
+        </w:rPr>
+        <w:t>L</w:t>
+      </w:r>
+      <w:r>
+        <w:rPr>
+          <w:rFonts w:eastAsia="Times New Roman" w:cs="Times New Roman" w:ascii="Garamond" w:hAnsi="Garamond"/>
+          <w:color w:val="000000"/>
+          <w:kern w:val="0"/>
+          <w:sz w:val="36"/>
+          <w:szCs w:val="36"/>
+          <w:shd w:fill="auto" w:val="clear"/>
+          <w:lang w:val="en-US" w:eastAsia="zh-CN" w:bidi="hi-IN"/>
+        </w:rPr>
+        <w:t>ogo após ensinar aos discípulos a oração do Pai-Nosso</w:t>
+      </w:r>
+      <w:r>
+        <w:rPr>
+          <w:rFonts w:eastAsia="Times New Roman" w:cs="Times New Roman" w:ascii="Garamond" w:hAnsi="Garamond"/>
+          <w:color w:val="000000"/>
+          <w:kern w:val="0"/>
+          <w:sz w:val="36"/>
+          <w:szCs w:val="36"/>
+          <w:shd w:fill="auto" w:val="clear"/>
+          <w:lang w:val="en-US" w:eastAsia="zh-CN" w:bidi="hi-IN"/>
+        </w:rPr>
+        <w:t>,</w:t>
+      </w:r>
+      <w:r>
+        <w:rPr>
+          <w:rFonts w:eastAsia="Times New Roman" w:cs="Times New Roman" w:ascii="Garamond" w:hAnsi="Garamond"/>
+          <w:color w:val="000000"/>
+          <w:kern w:val="0"/>
+          <w:sz w:val="36"/>
+          <w:szCs w:val="36"/>
+          <w:shd w:fill="auto" w:val="clear"/>
+          <w:lang w:val="en-US" w:eastAsia="zh-CN" w:bidi="hi-IN"/>
+        </w:rPr>
+        <w:t xml:space="preserve"> Jesus apresenta uma pequena parábola, conhecida como a Parábola do Amigo Importuno.</w:t>
       </w:r>
     </w:p>
     <w:p>
@@ -673,31 +716,21 @@
           <w:shd w:fill="auto" w:val="clear"/>
           <w:lang w:val="en-US" w:eastAsia="zh-CN" w:bidi="hi-IN"/>
         </w:rPr>
-        <w:t>O Mestre</w:t>
-      </w:r>
-      <w:r>
-        <w:rPr>
-          <w:rFonts w:eastAsia="Times New Roman" w:cs="Times New Roman" w:ascii="Garamond" w:hAnsi="Garamond"/>
-          <w:color w:val="000000"/>
-          <w:kern w:val="0"/>
-          <w:sz w:val="36"/>
-          <w:szCs w:val="36"/>
-          <w:shd w:fill="auto" w:val="clear"/>
-          <w:lang w:val="en-US" w:eastAsia="zh-CN" w:bidi="hi-IN"/>
-        </w:rPr>
-        <w:t xml:space="preserve"> conta que um homem recebe, à meia-noite, a visita inesperada de um amigo e não tem nada para lhe oferecer. Então ele vai até a casa de um vizinho, bate à porta e diz: “Amigo, empresta-me três pães, pois chegou uma visita em minha casa, e eu não tenho o que colocar à mesa”.</w:t>
-      </w:r>
-    </w:p>
-    <w:p>
-      <w:pPr>
-        <w:pStyle w:val="Normal"/>
-        <w:jc w:val="both"/>
-        <w:rPr>
-          <w:color w:val="auto"/>
-        </w:rPr>
-      </w:pPr>
-      <w:r>
-        <w:rPr/>
+        <w:t>O Mestre conta que um homem recebe, à meia-noite, a visita inesperada de um amigo e não tem nada para lhe oferecer. Então ele vai até a casa de um vizinho, bate à porta e diz: “Amigo, empresta-me três pães, pois chegou uma visita em minha casa, e eu não tenho o que colocar à mesa”.</w:t>
+      </w:r>
+    </w:p>
+    <w:p>
+      <w:pPr>
+        <w:pStyle w:val="Normal"/>
+        <w:jc w:val="both"/>
+        <w:rPr>
+          <w:color w:val="auto"/>
+        </w:rPr>
+      </w:pPr>
+      <w:r>
+        <w:rPr>
+          <w:color w:val="auto"/>
+        </w:rPr>
       </w:r>
     </w:p>
     <w:p>
@@ -730,133 +763,79 @@
         </w:rPr>
       </w:pPr>
       <w:r>
-        <w:rPr/>
-      </w:r>
-    </w:p>
-    <w:p>
-      <w:pPr>
-        <w:pStyle w:val="Normal"/>
-        <w:jc w:val="both"/>
-        <w:rPr>
-          <w:color w:val="auto"/>
-        </w:rPr>
-      </w:pPr>
-      <w:r>
-        <w:rPr>
-          <w:rFonts w:eastAsia="Times New Roman" w:cs="Times New Roman" w:ascii="Garamond" w:hAnsi="Garamond"/>
-          <w:color w:val="000000"/>
-          <w:kern w:val="0"/>
-          <w:sz w:val="36"/>
-          <w:szCs w:val="36"/>
-          <w:shd w:fill="auto" w:val="clear"/>
-          <w:lang w:val="en-US" w:eastAsia="zh-CN" w:bidi="hi-IN"/>
-        </w:rPr>
-        <w:t xml:space="preserve">Jesus </w:t>
-      </w:r>
-      <w:r>
-        <w:rPr>
-          <w:rFonts w:eastAsia="Times New Roman" w:cs="Times New Roman" w:ascii="Garamond" w:hAnsi="Garamond"/>
-          <w:color w:val="000000"/>
-          <w:kern w:val="0"/>
-          <w:sz w:val="36"/>
-          <w:szCs w:val="36"/>
-          <w:shd w:fill="auto" w:val="clear"/>
-          <w:lang w:val="en-US" w:eastAsia="zh-CN" w:bidi="hi-IN"/>
-        </w:rPr>
-        <w:t>diz</w:t>
-      </w:r>
-      <w:r>
-        <w:rPr>
-          <w:rFonts w:eastAsia="Times New Roman" w:cs="Times New Roman" w:ascii="Garamond" w:hAnsi="Garamond"/>
-          <w:color w:val="000000"/>
-          <w:kern w:val="0"/>
-          <w:sz w:val="36"/>
-          <w:szCs w:val="36"/>
-          <w:shd w:fill="auto" w:val="clear"/>
-          <w:lang w:val="en-US" w:eastAsia="zh-CN" w:bidi="hi-IN"/>
-        </w:rPr>
-        <w:t xml:space="preserve"> que, mesmo que </w:t>
-      </w:r>
-      <w:r>
-        <w:rPr>
-          <w:rFonts w:eastAsia="Times New Roman" w:cs="Times New Roman" w:ascii="Garamond" w:hAnsi="Garamond"/>
-          <w:color w:val="000000"/>
-          <w:kern w:val="0"/>
-          <w:sz w:val="36"/>
-          <w:szCs w:val="36"/>
-          <w:shd w:fill="auto" w:val="clear"/>
-          <w:lang w:val="en-US" w:eastAsia="zh-CN" w:bidi="hi-IN"/>
-        </w:rPr>
-        <w:t>aquele homem</w:t>
-      </w:r>
-      <w:r>
-        <w:rPr>
-          <w:rFonts w:eastAsia="Times New Roman" w:cs="Times New Roman" w:ascii="Garamond" w:hAnsi="Garamond"/>
-          <w:color w:val="000000"/>
-          <w:kern w:val="0"/>
-          <w:sz w:val="36"/>
-          <w:szCs w:val="36"/>
-          <w:shd w:fill="auto" w:val="clear"/>
-          <w:lang w:val="en-US" w:eastAsia="zh-CN" w:bidi="hi-IN"/>
-        </w:rPr>
-        <w:t xml:space="preserve"> não se levante por amizade, acabará se levantando por causa da insistência daquele que pede e lhe dará tudo o que for necessário.</w:t>
-      </w:r>
-    </w:p>
-    <w:p>
-      <w:pPr>
-        <w:pStyle w:val="Normal"/>
-        <w:jc w:val="both"/>
-        <w:rPr>
-          <w:color w:val="auto"/>
-        </w:rPr>
-      </w:pPr>
-      <w:r>
-        <w:rPr/>
-      </w:r>
-    </w:p>
-    <w:p>
-      <w:pPr>
-        <w:pStyle w:val="Normal"/>
-        <w:jc w:val="both"/>
-        <w:rPr>
-          <w:color w:val="auto"/>
-        </w:rPr>
-      </w:pPr>
-      <w:r>
-        <w:rPr>
-          <w:rFonts w:eastAsia="Times New Roman" w:cs="Times New Roman" w:ascii="Garamond" w:hAnsi="Garamond"/>
-          <w:color w:val="000000"/>
-          <w:kern w:val="0"/>
-          <w:sz w:val="36"/>
-          <w:szCs w:val="36"/>
-          <w:shd w:fill="auto" w:val="clear"/>
-          <w:lang w:val="en-US" w:eastAsia="zh-CN" w:bidi="hi-IN"/>
-        </w:rPr>
-        <w:t xml:space="preserve">Logo </w:t>
-      </w:r>
-      <w:r>
-        <w:rPr>
-          <w:rFonts w:eastAsia="Times New Roman" w:cs="Times New Roman" w:ascii="Garamond" w:hAnsi="Garamond"/>
-          <w:color w:val="000000"/>
-          <w:kern w:val="0"/>
-          <w:sz w:val="36"/>
-          <w:szCs w:val="36"/>
-          <w:shd w:fill="auto" w:val="clear"/>
-          <w:lang w:val="en-US" w:eastAsia="zh-CN" w:bidi="hi-IN"/>
-        </w:rPr>
-        <w:t>em seguida o Mestre diz:</w:t>
-      </w:r>
-    </w:p>
-    <w:p>
-      <w:pPr>
-        <w:pStyle w:val="Normal"/>
-        <w:jc w:val="both"/>
-        <w:rPr>
-          <w:color w:val="auto"/>
-        </w:rPr>
-      </w:pPr>
-      <w:r>
-        <w:rPr/>
+        <w:rPr>
+          <w:color w:val="auto"/>
+        </w:rPr>
+      </w:r>
+    </w:p>
+    <w:p>
+      <w:pPr>
+        <w:pStyle w:val="Normal"/>
+        <w:jc w:val="both"/>
+        <w:rPr>
+          <w:color w:val="auto"/>
+        </w:rPr>
+      </w:pPr>
+      <w:r>
+        <w:rPr>
+          <w:rFonts w:eastAsia="Times New Roman" w:cs="Times New Roman" w:ascii="Garamond" w:hAnsi="Garamond"/>
+          <w:color w:val="000000"/>
+          <w:kern w:val="0"/>
+          <w:sz w:val="36"/>
+          <w:szCs w:val="36"/>
+          <w:shd w:fill="auto" w:val="clear"/>
+          <w:lang w:val="en-US" w:eastAsia="zh-CN" w:bidi="hi-IN"/>
+        </w:rPr>
+        <w:t>Jesus diz que, mesmo que aquele homem não se levante por amizade, acabará se levantando por causa da insistência daquele que pede e lhe dará tudo o que for necessário.</w:t>
+      </w:r>
+    </w:p>
+    <w:p>
+      <w:pPr>
+        <w:pStyle w:val="Normal"/>
+        <w:jc w:val="both"/>
+        <w:rPr>
+          <w:color w:val="auto"/>
+        </w:rPr>
+      </w:pPr>
+      <w:r>
+        <w:rPr>
+          <w:color w:val="auto"/>
+        </w:rPr>
+      </w:r>
+    </w:p>
+    <w:p>
+      <w:pPr>
+        <w:pStyle w:val="Normal"/>
+        <w:jc w:val="both"/>
+        <w:rPr>
+          <w:color w:val="auto"/>
+        </w:rPr>
+      </w:pPr>
+      <w:r>
+        <w:rPr>
+          <w:rFonts w:eastAsia="Times New Roman" w:cs="Times New Roman" w:ascii="Garamond" w:hAnsi="Garamond"/>
+          <w:color w:val="000000"/>
+          <w:kern w:val="0"/>
+          <w:sz w:val="36"/>
+          <w:szCs w:val="36"/>
+          <w:shd w:fill="auto" w:val="clear"/>
+          <w:lang w:val="en-US" w:eastAsia="zh-CN" w:bidi="hi-IN"/>
+        </w:rPr>
+        <w:t>Logo em seguida o Mestre diz:</w:t>
+      </w:r>
+    </w:p>
+    <w:p>
+      <w:pPr>
+        <w:pStyle w:val="Normal"/>
+        <w:jc w:val="both"/>
+        <w:rPr>
+          <w:color w:val="auto"/>
+        </w:rPr>
+      </w:pPr>
+      <w:r>
+        <w:rPr>
+          <w:color w:val="auto"/>
+        </w:rPr>
       </w:r>
     </w:p>
     <w:p>
@@ -908,7 +887,9 @@
         </w:rPr>
       </w:pPr>
       <w:r>
-        <w:rPr/>
+        <w:rPr>
+          <w:color w:val="auto"/>
+        </w:rPr>
       </w:r>
     </w:p>
     <w:p>
@@ -965,7 +946,9 @@
         </w:rPr>
       </w:pPr>
       <w:r>
-        <w:rPr/>
+        <w:rPr>
+          <w:color w:val="auto"/>
+        </w:rPr>
       </w:r>
     </w:p>
     <w:p>
@@ -1031,55 +1014,7 @@
           <w:shd w:fill="auto" w:val="clear"/>
           <w:lang w:val="en-US" w:eastAsia="zh-CN" w:bidi="hi-IN"/>
         </w:rPr>
-        <w:t xml:space="preserve">O amigo que está dentro da casa </w:t>
-      </w:r>
-      <w:r>
-        <w:rPr>
-          <w:rFonts w:eastAsia="Times New Roman" w:cs="Times New Roman" w:ascii="Garamond" w:hAnsi="Garamond"/>
-          <w:color w:val="000000"/>
-          <w:kern w:val="0"/>
-          <w:sz w:val="36"/>
-          <w:szCs w:val="36"/>
-          <w:shd w:fill="auto" w:val="clear"/>
-          <w:lang w:val="en-US" w:eastAsia="zh-CN" w:bidi="hi-IN"/>
-        </w:rPr>
-        <w:t>representa</w:t>
-      </w:r>
-      <w:r>
-        <w:rPr>
-          <w:rFonts w:eastAsia="Times New Roman" w:cs="Times New Roman" w:ascii="Garamond" w:hAnsi="Garamond"/>
-          <w:color w:val="000000"/>
-          <w:kern w:val="0"/>
-          <w:sz w:val="36"/>
-          <w:szCs w:val="36"/>
-          <w:shd w:fill="auto" w:val="clear"/>
-          <w:lang w:val="en-US" w:eastAsia="zh-CN" w:bidi="hi-IN"/>
-        </w:rPr>
-        <w:t xml:space="preserve"> os valores superiores que já existem em nós, mas que muitas vezes preferimos manter adormecidos. </w:t>
-      </w:r>
-      <w:r>
-        <w:rPr>
-          <w:rFonts w:eastAsia="Times New Roman" w:cs="Times New Roman" w:ascii="Garamond" w:hAnsi="Garamond"/>
-          <w:color w:val="000000"/>
-          <w:kern w:val="0"/>
-          <w:sz w:val="36"/>
-          <w:szCs w:val="36"/>
-          <w:shd w:fill="auto" w:val="clear"/>
-          <w:lang w:val="en-US" w:eastAsia="zh-CN" w:bidi="hi-IN"/>
-        </w:rPr>
-        <w:t>O homem</w:t>
-      </w:r>
-      <w:r>
-        <w:rPr>
-          <w:rFonts w:eastAsia="Times New Roman" w:cs="Times New Roman" w:ascii="Garamond" w:hAnsi="Garamond"/>
-          <w:color w:val="000000"/>
-          <w:kern w:val="0"/>
-          <w:sz w:val="36"/>
-          <w:szCs w:val="36"/>
-          <w:shd w:fill="auto" w:val="clear"/>
-          <w:lang w:val="en-US" w:eastAsia="zh-CN" w:bidi="hi-IN"/>
-        </w:rPr>
-        <w:t xml:space="preserve"> diz que está deitado e não quer se levantar, o que simboliza nossa resistência em sair da zona de conforto. Sabemos, intuitivamente, que despertar esses valores implicará esforço, mudança e compromisso com o bem.</w:t>
+        <w:t>O amigo que está dentro da casa representa os valores superiores que já existem em nós, mas que muitas vezes preferimos manter adormecidos. O homem diz que está deitado e não quer se levantar, o que simboliza nossa resistência em sair da zona de conforto. Sabemos, intuitivamente, que despertar esses valores implicará esforço, mudança e compromisso com o bem.</w:t>
       </w:r>
     </w:p>
     <w:p>
@@ -1226,7 +1161,9 @@
         </w:rPr>
       </w:pPr>
       <w:r>
-        <w:rPr/>
+        <w:rPr>
+          <w:color w:val="auto"/>
+        </w:rPr>
       </w:r>
     </w:p>
     <w:p>
@@ -1296,28 +1233,42 @@
         </w:rPr>
       </w:pPr>
       <w:r>
-        <w:rPr/>
-      </w:r>
-    </w:p>
-    <w:p>
-      <w:pPr>
-        <w:pStyle w:val="Normal"/>
-        <w:jc w:val="both"/>
-        <w:rPr>
-          <w:color w:val="auto"/>
-        </w:rPr>
-      </w:pPr>
-      <w:r>
-        <w:rPr>
-          <w:rFonts w:eastAsia="Times New Roman" w:cs="Times New Roman" w:ascii="Garamond" w:hAnsi="Garamond"/>
-          <w:color w:val="000000"/>
-          <w:kern w:val="0"/>
-          <w:sz w:val="36"/>
-          <w:szCs w:val="36"/>
-          <w:shd w:fill="auto" w:val="clear"/>
-          <w:lang w:val="en-US" w:eastAsia="zh-CN" w:bidi="hi-IN"/>
-        </w:rPr>
-        <w:t>A resposta é simples e profunda: a oração não tem por finalidade informar a Deus sobre nossas necessidades, mas transformar a nós mesmos. Orar é criar em nosso íntimo as condições necessárias para receber aquilo que a Providência pode nos oferecer.</w:t>
+        <w:rPr>
+          <w:color w:val="auto"/>
+        </w:rPr>
+      </w:r>
+    </w:p>
+    <w:p>
+      <w:pPr>
+        <w:pStyle w:val="Normal"/>
+        <w:jc w:val="both"/>
+        <w:rPr>
+          <w:color w:val="auto"/>
+        </w:rPr>
+      </w:pPr>
+      <w:r>
+        <w:rPr>
+          <w:rFonts w:eastAsia="Times New Roman" w:cs="Times New Roman" w:ascii="Garamond" w:hAnsi="Garamond"/>
+          <w:color w:val="000000"/>
+          <w:kern w:val="0"/>
+          <w:sz w:val="36"/>
+          <w:szCs w:val="36"/>
+          <w:shd w:fill="auto" w:val="clear"/>
+          <w:lang w:val="en-US" w:eastAsia="zh-CN" w:bidi="hi-IN"/>
+        </w:rPr>
+        <w:t xml:space="preserve">Porque </w:t>
+      </w:r>
+      <w:r>
+        <w:rPr>
+          <w:rFonts w:eastAsia="Times New Roman" w:cs="Times New Roman" w:ascii="Garamond" w:hAnsi="Garamond"/>
+          <w:color w:val="000000"/>
+          <w:kern w:val="0"/>
+          <w:sz w:val="36"/>
+          <w:szCs w:val="36"/>
+          <w:shd w:fill="auto" w:val="clear"/>
+          <w:lang w:val="en-US" w:eastAsia="zh-CN" w:bidi="hi-IN"/>
+        </w:rPr>
+        <w:t>a oração não tem por finalidade informar a Deus sobre nossas necessidades, mas transformar a nós mesmos. Orar é criar em nosso íntimo as condições necessárias para receber aquilo que a Providência pode nos oferecer.</w:t>
       </w:r>
     </w:p>
     <w:p>
@@ -1407,175 +1358,150 @@
           <w:shd w:fill="auto" w:val="clear"/>
           <w:lang w:val="en-US" w:eastAsia="zh-CN" w:bidi="hi-IN"/>
         </w:rPr>
-        <w:t xml:space="preserve">Podemos comparar, de forma simples, aquilo que Deus tem a nos oferecer a uma fonte. Quem vai à fonte com um copo recolhe um copo; quem vai com um </w:t>
-      </w:r>
-      <w:r>
-        <w:rPr>
-          <w:rFonts w:eastAsia="Times New Roman" w:cs="Times New Roman" w:ascii="Garamond" w:hAnsi="Garamond"/>
-          <w:color w:val="000000"/>
-          <w:kern w:val="0"/>
-          <w:sz w:val="36"/>
-          <w:szCs w:val="36"/>
-          <w:shd w:fill="auto" w:val="clear"/>
-          <w:lang w:val="en-US" w:eastAsia="zh-CN" w:bidi="hi-IN"/>
-        </w:rPr>
-        <w:t>vaso, recolhe um vaso e</w:t>
-      </w:r>
-      <w:r>
-        <w:rPr>
-          <w:rFonts w:eastAsia="Times New Roman" w:cs="Times New Roman" w:ascii="Garamond" w:hAnsi="Garamond"/>
-          <w:color w:val="000000"/>
-          <w:kern w:val="0"/>
-          <w:sz w:val="36"/>
-          <w:szCs w:val="36"/>
-          <w:shd w:fill="auto" w:val="clear"/>
-          <w:lang w:val="en-US" w:eastAsia="zh-CN" w:bidi="hi-IN"/>
-        </w:rPr>
-        <w:t xml:space="preserve"> quem vai com um balde recolhe um balde. </w:t>
-      </w:r>
-      <w:r>
-        <w:rPr>
-          <w:rFonts w:eastAsia="Times New Roman" w:cs="Times New Roman" w:ascii="Garamond" w:hAnsi="Garamond"/>
-          <w:color w:val="000000"/>
-          <w:kern w:val="0"/>
-          <w:sz w:val="36"/>
-          <w:szCs w:val="36"/>
-          <w:shd w:fill="auto" w:val="clear"/>
-          <w:lang w:val="en-US" w:eastAsia="zh-CN" w:bidi="hi-IN"/>
-        </w:rPr>
-        <w:t>A</w:t>
-      </w:r>
-      <w:r>
-        <w:rPr>
-          <w:rFonts w:eastAsia="Times New Roman" w:cs="Times New Roman" w:ascii="Garamond" w:hAnsi="Garamond"/>
-          <w:color w:val="000000"/>
-          <w:kern w:val="0"/>
-          <w:sz w:val="36"/>
-          <w:szCs w:val="36"/>
-          <w:shd w:fill="auto" w:val="clear"/>
-          <w:lang w:val="en-US" w:eastAsia="zh-CN" w:bidi="hi-IN"/>
-        </w:rPr>
-        <w:t xml:space="preserve"> fonte </w:t>
-      </w:r>
-      <w:r>
-        <w:rPr>
-          <w:rFonts w:eastAsia="Times New Roman" w:cs="Times New Roman" w:ascii="Garamond" w:hAnsi="Garamond"/>
-          <w:color w:val="000000"/>
-          <w:kern w:val="0"/>
-          <w:sz w:val="36"/>
-          <w:szCs w:val="36"/>
-          <w:shd w:fill="auto" w:val="clear"/>
-          <w:lang w:val="en-US" w:eastAsia="zh-CN" w:bidi="hi-IN"/>
-        </w:rPr>
-        <w:t xml:space="preserve">não </w:t>
-      </w:r>
-      <w:r>
-        <w:rPr>
-          <w:rFonts w:eastAsia="Times New Roman" w:cs="Times New Roman" w:ascii="Garamond" w:hAnsi="Garamond"/>
-          <w:color w:val="000000"/>
-          <w:kern w:val="0"/>
-          <w:sz w:val="36"/>
-          <w:szCs w:val="36"/>
-          <w:shd w:fill="auto" w:val="clear"/>
-          <w:lang w:val="en-US" w:eastAsia="zh-CN" w:bidi="hi-IN"/>
-        </w:rPr>
-        <w:t>se modifica</w:t>
-      </w:r>
-      <w:r>
-        <w:rPr>
-          <w:rFonts w:eastAsia="Times New Roman" w:cs="Times New Roman" w:ascii="Garamond" w:hAnsi="Garamond"/>
-          <w:color w:val="000000"/>
-          <w:kern w:val="0"/>
-          <w:sz w:val="36"/>
-          <w:szCs w:val="36"/>
-          <w:shd w:fill="auto" w:val="clear"/>
-          <w:lang w:val="en-US" w:eastAsia="zh-CN" w:bidi="hi-IN"/>
-        </w:rPr>
-        <w:t xml:space="preserve"> em função do recepiente que cada um leva; ela permanece a mesma</w:t>
-      </w:r>
-      <w:r>
-        <w:rPr>
-          <w:rFonts w:eastAsia="Times New Roman" w:cs="Times New Roman" w:ascii="Garamond" w:hAnsi="Garamond"/>
-          <w:color w:val="000000"/>
-          <w:kern w:val="0"/>
-          <w:sz w:val="36"/>
-          <w:szCs w:val="36"/>
-          <w:shd w:fill="auto" w:val="clear"/>
-          <w:lang w:val="en-US" w:eastAsia="zh-CN" w:bidi="hi-IN"/>
-        </w:rPr>
-        <w:t xml:space="preserve">. </w:t>
-      </w:r>
-    </w:p>
-    <w:p>
-      <w:pPr>
-        <w:pStyle w:val="Normal"/>
-        <w:jc w:val="both"/>
-        <w:rPr>
-          <w:color w:val="auto"/>
-        </w:rPr>
-      </w:pPr>
-      <w:r>
-        <w:rPr>
-          <w:sz w:val="36"/>
-          <w:szCs w:val="36"/>
-        </w:rPr>
-      </w:r>
-    </w:p>
-    <w:p>
-      <w:pPr>
-        <w:pStyle w:val="Normal"/>
-        <w:jc w:val="both"/>
-        <w:rPr>
-          <w:color w:val="auto"/>
-        </w:rPr>
-      </w:pPr>
-      <w:r>
-        <w:rPr>
-          <w:rFonts w:eastAsia="Times New Roman" w:cs="Times New Roman" w:ascii="Garamond" w:hAnsi="Garamond"/>
-          <w:color w:val="000000"/>
-          <w:kern w:val="0"/>
-          <w:sz w:val="36"/>
-          <w:szCs w:val="36"/>
-          <w:shd w:fill="auto" w:val="clear"/>
-          <w:lang w:val="en-US" w:eastAsia="zh-CN" w:bidi="hi-IN"/>
-        </w:rPr>
-        <w:t xml:space="preserve">De igual maneira, a capacidade de doação divina também não se altera em função da </w:t>
-      </w:r>
-      <w:r>
-        <w:rPr>
-          <w:rFonts w:eastAsia="Times New Roman" w:cs="Times New Roman" w:ascii="Garamond" w:hAnsi="Garamond"/>
-          <w:color w:val="000000"/>
-          <w:kern w:val="0"/>
-          <w:sz w:val="36"/>
-          <w:szCs w:val="36"/>
-          <w:shd w:fill="auto" w:val="clear"/>
-          <w:lang w:val="en-US" w:eastAsia="zh-CN" w:bidi="hi-IN"/>
-        </w:rPr>
-        <w:t>nossa capacidade de receber</w:t>
-      </w:r>
-      <w:r>
-        <w:rPr>
-          <w:rFonts w:eastAsia="Times New Roman" w:cs="Times New Roman" w:ascii="Garamond" w:hAnsi="Garamond"/>
-          <w:color w:val="000000"/>
-          <w:kern w:val="0"/>
-          <w:sz w:val="36"/>
-          <w:szCs w:val="36"/>
-          <w:shd w:fill="auto" w:val="clear"/>
-          <w:lang w:val="en-US" w:eastAsia="zh-CN" w:bidi="hi-IN"/>
-        </w:rPr>
-        <w:t xml:space="preserve">. </w:t>
-      </w:r>
-      <w:r>
-        <w:rPr>
-          <w:rFonts w:eastAsia="Times New Roman" w:cs="Times New Roman" w:ascii="Garamond" w:hAnsi="Garamond"/>
-          <w:color w:val="000000"/>
-          <w:kern w:val="0"/>
-          <w:sz w:val="36"/>
-          <w:szCs w:val="36"/>
-          <w:shd w:fill="auto" w:val="clear"/>
-          <w:lang w:val="en-US" w:eastAsia="zh-CN" w:bidi="hi-IN"/>
-        </w:rPr>
-        <w:t xml:space="preserve"> </w:t>
+        <w:t>Podemos comparar, de forma simples, aquilo que Deus tem a nos oferecer a uma fonte. Quem vai à fonte com um copo recolhe um copo; quem vai com um</w:t>
+      </w:r>
+      <w:r>
+        <w:rPr>
+          <w:rFonts w:eastAsia="Times New Roman" w:cs="Times New Roman" w:ascii="Garamond" w:hAnsi="Garamond"/>
+          <w:color w:val="000000"/>
+          <w:kern w:val="0"/>
+          <w:sz w:val="36"/>
+          <w:szCs w:val="36"/>
+          <w:shd w:fill="auto" w:val="clear"/>
+          <w:lang w:val="en-US" w:eastAsia="zh-CN" w:bidi="hi-IN"/>
+        </w:rPr>
+        <w:t>a jarra</w:t>
+      </w:r>
+      <w:r>
+        <w:rPr>
+          <w:rFonts w:eastAsia="Times New Roman" w:cs="Times New Roman" w:ascii="Garamond" w:hAnsi="Garamond"/>
+          <w:color w:val="000000"/>
+          <w:kern w:val="0"/>
+          <w:sz w:val="36"/>
+          <w:szCs w:val="36"/>
+          <w:shd w:fill="auto" w:val="clear"/>
+          <w:lang w:val="en-US" w:eastAsia="zh-CN" w:bidi="hi-IN"/>
+        </w:rPr>
+        <w:t>, recolhe um</w:t>
+      </w:r>
+      <w:r>
+        <w:rPr>
+          <w:rFonts w:eastAsia="Times New Roman" w:cs="Times New Roman" w:ascii="Garamond" w:hAnsi="Garamond"/>
+          <w:color w:val="000000"/>
+          <w:kern w:val="0"/>
+          <w:sz w:val="36"/>
+          <w:szCs w:val="36"/>
+          <w:shd w:fill="auto" w:val="clear"/>
+          <w:lang w:val="en-US" w:eastAsia="zh-CN" w:bidi="hi-IN"/>
+        </w:rPr>
+        <w:t>a jarra</w:t>
+      </w:r>
+      <w:r>
+        <w:rPr>
+          <w:rFonts w:eastAsia="Times New Roman" w:cs="Times New Roman" w:ascii="Garamond" w:hAnsi="Garamond"/>
+          <w:color w:val="000000"/>
+          <w:kern w:val="0"/>
+          <w:sz w:val="36"/>
+          <w:szCs w:val="36"/>
+          <w:shd w:fill="auto" w:val="clear"/>
+          <w:lang w:val="en-US" w:eastAsia="zh-CN" w:bidi="hi-IN"/>
+        </w:rPr>
+        <w:t xml:space="preserve"> e quem vai com um </w:t>
+      </w:r>
+      <w:r>
+        <w:rPr>
+          <w:rFonts w:eastAsia="Times New Roman" w:cs="Times New Roman" w:ascii="Garamond" w:hAnsi="Garamond"/>
+          <w:color w:val="000000"/>
+          <w:kern w:val="0"/>
+          <w:sz w:val="36"/>
+          <w:szCs w:val="36"/>
+          <w:shd w:fill="auto" w:val="clear"/>
+          <w:lang w:val="en-US" w:eastAsia="zh-CN" w:bidi="hi-IN"/>
+        </w:rPr>
+        <w:t>tambor</w:t>
+      </w:r>
+      <w:r>
+        <w:rPr>
+          <w:rFonts w:eastAsia="Times New Roman" w:cs="Times New Roman" w:ascii="Garamond" w:hAnsi="Garamond"/>
+          <w:color w:val="000000"/>
+          <w:kern w:val="0"/>
+          <w:sz w:val="36"/>
+          <w:szCs w:val="36"/>
+          <w:shd w:fill="auto" w:val="clear"/>
+          <w:lang w:val="en-US" w:eastAsia="zh-CN" w:bidi="hi-IN"/>
+        </w:rPr>
+        <w:t xml:space="preserve"> recolhe um </w:t>
+      </w:r>
+      <w:r>
+        <w:rPr>
+          <w:rFonts w:eastAsia="Times New Roman" w:cs="Times New Roman" w:ascii="Garamond" w:hAnsi="Garamond"/>
+          <w:color w:val="000000"/>
+          <w:kern w:val="0"/>
+          <w:sz w:val="36"/>
+          <w:szCs w:val="36"/>
+          <w:shd w:fill="auto" w:val="clear"/>
+          <w:lang w:val="en-US" w:eastAsia="zh-CN" w:bidi="hi-IN"/>
+        </w:rPr>
+        <w:t>tambor</w:t>
+      </w:r>
+      <w:r>
+        <w:rPr>
+          <w:rFonts w:eastAsia="Times New Roman" w:cs="Times New Roman" w:ascii="Garamond" w:hAnsi="Garamond"/>
+          <w:color w:val="000000"/>
+          <w:kern w:val="0"/>
+          <w:sz w:val="36"/>
+          <w:szCs w:val="36"/>
+          <w:shd w:fill="auto" w:val="clear"/>
+          <w:lang w:val="en-US" w:eastAsia="zh-CN" w:bidi="hi-IN"/>
+        </w:rPr>
+        <w:t xml:space="preserve">. A fonte não se modifica em função do recepiente que cada um leva; ela permanece a mesma. </w:t>
+      </w:r>
+    </w:p>
+    <w:p>
+      <w:pPr>
+        <w:pStyle w:val="Normal"/>
+        <w:jc w:val="both"/>
+        <w:rPr>
+          <w:color w:val="auto"/>
+        </w:rPr>
+      </w:pPr>
+      <w:r>
+        <w:rPr>
+          <w:color w:val="auto"/>
+        </w:rPr>
+      </w:r>
+    </w:p>
+    <w:p>
+      <w:pPr>
+        <w:pStyle w:val="Normal"/>
+        <w:jc w:val="both"/>
+        <w:rPr>
+          <w:color w:val="auto"/>
+        </w:rPr>
+      </w:pPr>
+      <w:r>
+        <w:rPr>
+          <w:rFonts w:eastAsia="Times New Roman" w:cs="Times New Roman" w:ascii="Garamond" w:hAnsi="Garamond"/>
+          <w:color w:val="000000"/>
+          <w:kern w:val="0"/>
+          <w:sz w:val="36"/>
+          <w:szCs w:val="36"/>
+          <w:shd w:fill="auto" w:val="clear"/>
+          <w:lang w:val="en-US" w:eastAsia="zh-CN" w:bidi="hi-IN"/>
+        </w:rPr>
+        <w:t>Da mesma form</w:t>
+      </w:r>
+      <w:r>
+        <w:rPr>
+          <w:rFonts w:eastAsia="Times New Roman" w:cs="Times New Roman" w:ascii="Garamond" w:hAnsi="Garamond"/>
+          <w:color w:val="000000"/>
+          <w:kern w:val="0"/>
+          <w:sz w:val="36"/>
+          <w:szCs w:val="36"/>
+          <w:shd w:fill="auto" w:val="clear"/>
+          <w:lang w:val="en-US" w:eastAsia="zh-CN" w:bidi="hi-IN"/>
+        </w:rPr>
+        <w:t xml:space="preserve">a, a capacidade de doação divina também não se altera em função da nossa capacidade de receber.  </w:t>
       </w:r>
     </w:p>
     <w:p>
@@ -1587,35 +1513,37 @@
         </w:rPr>
       </w:pPr>
       <w:r>
-        <w:rPr/>
-      </w:r>
-    </w:p>
-    <w:p>
-      <w:pPr>
-        <w:pStyle w:val="Normal"/>
-        <w:jc w:val="both"/>
         <w:rPr>
           <w:color w:val="1C99E0"/>
         </w:rPr>
-      </w:pPr>
-      <w:r>
+      </w:r>
+    </w:p>
+    <w:p>
+      <w:pPr>
+        <w:pStyle w:val="Normal"/>
+        <w:jc w:val="both"/>
         <w:rPr>
           <w:color w:val="1C99E0"/>
         </w:rPr>
-      </w:r>
-    </w:p>
-    <w:p>
-      <w:pPr>
-        <w:pStyle w:val="Normal"/>
-        <w:jc w:val="both"/>
+      </w:pPr>
+      <w:r>
         <w:rPr>
           <w:color w:val="1C99E0"/>
         </w:rPr>
-      </w:pPr>
-      <w:r>
-        <w:rPr>
-          <w:rFonts w:eastAsia="Times New Roman" w:cs="Times New Roman" w:ascii="Garamond" w:hAnsi="Garamond"/>
+      </w:r>
+    </w:p>
+    <w:p>
+      <w:pPr>
+        <w:pStyle w:val="Normal"/>
+        <w:jc w:val="both"/>
+        <w:rPr>
           <w:color w:val="1C99E0"/>
+        </w:rPr>
+      </w:pPr>
+      <w:r>
+        <w:rPr>
+          <w:rFonts w:eastAsia="Times New Roman" w:cs="Times New Roman" w:ascii="Garamond" w:hAnsi="Garamond"/>
+          <w:color w:val="1C99E0"/>
           <w:kern w:val="0"/>
           <w:sz w:val="36"/>
           <w:szCs w:val="36"/>
@@ -2256,12 +2184,8 @@
       </w:pPr>
       <w:r>
         <w:rPr>
-          <w:rFonts w:eastAsia="Times New Roman" w:cs="Times New Roman" w:ascii="Garamond" w:hAnsi="Garamond"/>
-          <w:kern w:val="0"/>
-          <w:sz w:val="36"/>
-          <w:szCs w:val="36"/>
-          <w:shd w:fill="auto" w:val="clear"/>
-          <w:lang w:val="en-US" w:eastAsia="zh-CN" w:bidi="hi-IN"/>
+          <w:sz w:val="36"/>
+          <w:szCs w:val="36"/>
         </w:rPr>
       </w:r>
     </w:p>
@@ -4857,7 +4781,13 @@
         </w:rPr>
       </w:pPr>
       <w:r>
-        <w:rPr/>
+        <w:rPr>
+          <w:rFonts w:eastAsia="Times New Roman" w:cs="Times New Roman" w:ascii="Garamond" w:hAnsi="Garamond"/>
+          <w:kern w:val="0"/>
+          <w:sz w:val="36"/>
+          <w:szCs w:val="36"/>
+          <w:lang w:val="en-US" w:eastAsia="zh-CN" w:bidi="hi-IN"/>
+        </w:rPr>
       </w:r>
     </w:p>
     <w:p>
@@ -4942,7 +4872,7 @@
         <w:bCs/>
         <w:rFonts w:ascii="Garamond" w:hAnsi="Garamond"/>
       </w:rPr>
-      <w:t>26</w:t>
+      <w:t>27</w:t>
     </w:r>
     <w:r>
       <w:rPr>

</xml_diff>

<commit_message>
26/02/2026 - 21:24 h
</commit_message>
<xml_diff>
--- a/Pedi e obtereis/Pedi e obtereis.docx
+++ b/Pedi e obtereis/Pedi e obtereis.docx
@@ -153,31 +153,7 @@
           <w:shd w:fill="auto" w:val="clear"/>
           <w:lang w:val="en-US" w:eastAsia="zh-CN" w:bidi="hi-IN"/>
         </w:rPr>
-        <w:t xml:space="preserve">Quando Jesus falou sobre odiar pai e mãe, deixar aos mortos o cuidado de enterrar seus mortos ou ainda abandonar pai, mãe e filhos, Ele causou grande estranheza. Isso aconteceu e ainda acontece porque, quando esses ensinamentos são interpretados de </w:t>
-      </w:r>
-      <w:r>
-        <w:rPr>
-          <w:rFonts w:eastAsia="Times New Roman" w:cs="Times New Roman" w:ascii="Garamond" w:hAnsi="Garamond"/>
-          <w:color w:val="000000"/>
-          <w:kern w:val="0"/>
-          <w:sz w:val="36"/>
-          <w:szCs w:val="36"/>
-          <w:shd w:fill="auto" w:val="clear"/>
-          <w:lang w:val="en-US" w:eastAsia="zh-CN" w:bidi="hi-IN"/>
-        </w:rPr>
-        <w:t>maneira</w:t>
-      </w:r>
-      <w:r>
-        <w:rPr>
-          <w:rFonts w:eastAsia="Times New Roman" w:cs="Times New Roman" w:ascii="Garamond" w:hAnsi="Garamond"/>
-          <w:color w:val="000000"/>
-          <w:kern w:val="0"/>
-          <w:sz w:val="36"/>
-          <w:szCs w:val="36"/>
-          <w:shd w:fill="auto" w:val="clear"/>
-          <w:lang w:val="en-US" w:eastAsia="zh-CN" w:bidi="hi-IN"/>
-        </w:rPr>
-        <w:t xml:space="preserve"> superficial, passam a impressão de que Jesus estaria contrariando tudo aquilo que Ele ensinou sobre amor, caridade e responsabilidade.</w:t>
+        <w:t>Quando Jesus falou sobre odiar pai e mãe, deixar aos mortos o cuidado de enterrar seus mortos ou ainda abandonar pai, mãe e filhos, Ele causou grande estranheza. Isso aconteceu e ainda acontece porque, quando esses ensinamentos são interpretados de maneira superficial, passam a impressão de que Jesus estaria contrariando tudo aquilo que Ele ensinou sobre amor, caridade e responsabilidade.</w:t>
       </w:r>
     </w:p>
     <w:p>
@@ -305,179 +281,83 @@
           <w:shd w:fill="auto" w:val="clear"/>
           <w:lang w:val="en-US" w:eastAsia="zh-CN" w:bidi="hi-IN"/>
         </w:rPr>
-        <w:t xml:space="preserve">De modo geral, costumamos interpretar esses ensinamentos como se </w:t>
-      </w:r>
-      <w:r>
-        <w:rPr>
-          <w:rFonts w:eastAsia="Times New Roman" w:cs="Times New Roman" w:ascii="Garamond" w:hAnsi="Garamond"/>
-          <w:color w:val="000000"/>
-          <w:kern w:val="0"/>
-          <w:sz w:val="36"/>
-          <w:szCs w:val="36"/>
-          <w:shd w:fill="auto" w:val="clear"/>
-          <w:lang w:val="en-US" w:eastAsia="zh-CN" w:bidi="hi-IN"/>
-        </w:rPr>
-        <w:t xml:space="preserve">não fosse necessário </w:t>
-      </w:r>
-      <w:r>
-        <w:rPr>
-          <w:rFonts w:eastAsia="Times New Roman" w:cs="Times New Roman" w:ascii="Garamond" w:hAnsi="Garamond"/>
-          <w:color w:val="000000"/>
-          <w:kern w:val="0"/>
-          <w:sz w:val="36"/>
-          <w:szCs w:val="36"/>
-          <w:shd w:fill="auto" w:val="clear"/>
-          <w:lang w:val="en-US" w:eastAsia="zh-CN" w:bidi="hi-IN"/>
-        </w:rPr>
-        <w:t>nenhum esforço  de nossa parte, como se bastasse apenas pedir, ou simplesmente esperar, para que Deus nos conceda tudo aquilo que desejamos.</w:t>
-      </w:r>
-    </w:p>
-    <w:p>
-      <w:pPr>
-        <w:pStyle w:val="Normal"/>
-        <w:jc w:val="both"/>
-        <w:rPr>
-          <w:sz w:val="36"/>
-          <w:szCs w:val="36"/>
-        </w:rPr>
-      </w:pPr>
-      <w:r>
-        <w:rPr>
-          <w:sz w:val="36"/>
-          <w:szCs w:val="36"/>
-        </w:rPr>
-      </w:r>
-    </w:p>
-    <w:p>
-      <w:pPr>
-        <w:pStyle w:val="Normal"/>
-        <w:jc w:val="both"/>
-        <w:rPr>
-          <w:sz w:val="36"/>
-          <w:szCs w:val="36"/>
-        </w:rPr>
-      </w:pPr>
-      <w:r>
-        <w:rPr>
-          <w:rFonts w:eastAsia="Times New Roman" w:cs="Times New Roman" w:ascii="Garamond" w:hAnsi="Garamond"/>
-          <w:color w:val="000000"/>
-          <w:kern w:val="0"/>
-          <w:sz w:val="36"/>
-          <w:szCs w:val="36"/>
-          <w:shd w:fill="auto" w:val="clear"/>
-          <w:lang w:val="en-US" w:eastAsia="zh-CN" w:bidi="hi-IN"/>
-        </w:rPr>
-        <w:t xml:space="preserve">Talvez essas interpretações equivocadas continuem existindo porque, no fundo, elas são mais fáceis para nós. É bem mais confortável pensar em um Deus que resolve tudo sozinho, sem que </w:t>
-      </w:r>
-      <w:r>
-        <w:rPr>
-          <w:rFonts w:eastAsia="Times New Roman" w:cs="Times New Roman" w:ascii="Garamond" w:hAnsi="Garamond"/>
-          <w:color w:val="000000"/>
-          <w:kern w:val="0"/>
-          <w:sz w:val="36"/>
-          <w:szCs w:val="36"/>
-          <w:shd w:fill="auto" w:val="clear"/>
-          <w:lang w:val="en-US" w:eastAsia="zh-CN" w:bidi="hi-IN"/>
-        </w:rPr>
-        <w:t>precisemos</w:t>
-      </w:r>
-      <w:r>
-        <w:rPr>
-          <w:rFonts w:eastAsia="Times New Roman" w:cs="Times New Roman" w:ascii="Garamond" w:hAnsi="Garamond"/>
-          <w:color w:val="000000"/>
-          <w:kern w:val="0"/>
-          <w:sz w:val="36"/>
-          <w:szCs w:val="36"/>
-          <w:shd w:fill="auto" w:val="clear"/>
-          <w:lang w:val="en-US" w:eastAsia="zh-CN" w:bidi="hi-IN"/>
-        </w:rPr>
-        <w:t xml:space="preserve">  mudar, colaborar ou assumir compromisso</w:t>
-      </w:r>
-      <w:r>
-        <w:rPr>
-          <w:rFonts w:eastAsia="Times New Roman" w:cs="Times New Roman" w:ascii="Garamond" w:hAnsi="Garamond"/>
-          <w:color w:val="000000"/>
-          <w:kern w:val="0"/>
-          <w:sz w:val="36"/>
-          <w:szCs w:val="36"/>
-          <w:shd w:fill="auto" w:val="clear"/>
-          <w:lang w:val="en-US" w:eastAsia="zh-CN" w:bidi="hi-IN"/>
-        </w:rPr>
-        <w:t>s</w:t>
-      </w:r>
-      <w:r>
-        <w:rPr>
-          <w:rFonts w:eastAsia="Times New Roman" w:cs="Times New Roman" w:ascii="Garamond" w:hAnsi="Garamond"/>
-          <w:color w:val="000000"/>
-          <w:kern w:val="0"/>
-          <w:sz w:val="36"/>
-          <w:szCs w:val="36"/>
-          <w:shd w:fill="auto" w:val="clear"/>
-          <w:lang w:val="en-US" w:eastAsia="zh-CN" w:bidi="hi-IN"/>
-        </w:rPr>
-        <w:t>.</w:t>
-      </w:r>
-    </w:p>
-    <w:p>
-      <w:pPr>
-        <w:pStyle w:val="Normal"/>
-        <w:jc w:val="both"/>
-        <w:rPr>
-          <w:sz w:val="36"/>
-          <w:szCs w:val="36"/>
-        </w:rPr>
-      </w:pPr>
-      <w:r>
-        <w:rPr>
-          <w:sz w:val="36"/>
-          <w:szCs w:val="36"/>
-        </w:rPr>
-      </w:r>
-    </w:p>
-    <w:p>
-      <w:pPr>
-        <w:pStyle w:val="Normal"/>
-        <w:jc w:val="both"/>
-        <w:rPr>
-          <w:sz w:val="36"/>
-          <w:szCs w:val="36"/>
-        </w:rPr>
-      </w:pPr>
-      <w:r>
-        <w:rPr>
-          <w:rFonts w:eastAsia="Times New Roman" w:cs="Times New Roman" w:ascii="Garamond" w:hAnsi="Garamond"/>
-          <w:color w:val="000000"/>
-          <w:kern w:val="0"/>
-          <w:sz w:val="36"/>
-          <w:szCs w:val="36"/>
-          <w:shd w:fill="auto" w:val="clear"/>
-          <w:lang w:val="en-US" w:eastAsia="zh-CN" w:bidi="hi-IN"/>
-        </w:rPr>
-        <w:t>Assim, transformamos ensinamentos profundos de Jesus em promessas de facilidade, quando na verdade e</w:t>
-      </w:r>
-      <w:r>
-        <w:rPr>
-          <w:rFonts w:eastAsia="Times New Roman" w:cs="Times New Roman" w:ascii="Garamond" w:hAnsi="Garamond"/>
-          <w:color w:val="000000"/>
-          <w:kern w:val="0"/>
-          <w:sz w:val="36"/>
-          <w:szCs w:val="36"/>
-          <w:shd w:fill="auto" w:val="clear"/>
-          <w:lang w:val="en-US" w:eastAsia="zh-CN" w:bidi="hi-IN"/>
-        </w:rPr>
-        <w:t>sses ensinamentos</w:t>
-      </w:r>
-      <w:r>
-        <w:rPr>
-          <w:rFonts w:eastAsia="Times New Roman" w:cs="Times New Roman" w:ascii="Garamond" w:hAnsi="Garamond"/>
-          <w:color w:val="000000"/>
-          <w:kern w:val="0"/>
-          <w:sz w:val="36"/>
-          <w:szCs w:val="36"/>
-          <w:shd w:fill="auto" w:val="clear"/>
-          <w:lang w:val="en-US" w:eastAsia="zh-CN" w:bidi="hi-IN"/>
-        </w:rPr>
-        <w:t xml:space="preserve"> nos convidam à responsabilidade, à confiança ativa e ao trabalho no bem.</w:t>
+        <w:t>De modo geral, costumamos interpretar esses ensinamentos como se não fosse necessário nenhum esforço  de nossa parte, como se bastasse apenas pedir, ou simplesmente esperar, para que Deus nos conceda tudo aquilo que desejamos.</w:t>
+      </w:r>
+    </w:p>
+    <w:p>
+      <w:pPr>
+        <w:pStyle w:val="Normal"/>
+        <w:jc w:val="both"/>
+        <w:rPr>
+          <w:sz w:val="36"/>
+          <w:szCs w:val="36"/>
+        </w:rPr>
+      </w:pPr>
+      <w:r>
+        <w:rPr>
+          <w:sz w:val="36"/>
+          <w:szCs w:val="36"/>
+        </w:rPr>
+      </w:r>
+    </w:p>
+    <w:p>
+      <w:pPr>
+        <w:pStyle w:val="Normal"/>
+        <w:jc w:val="both"/>
+        <w:rPr>
+          <w:sz w:val="36"/>
+          <w:szCs w:val="36"/>
+        </w:rPr>
+      </w:pPr>
+      <w:r>
+        <w:rPr>
+          <w:rFonts w:eastAsia="Times New Roman" w:cs="Times New Roman" w:ascii="Garamond" w:hAnsi="Garamond"/>
+          <w:color w:val="000000"/>
+          <w:kern w:val="0"/>
+          <w:sz w:val="36"/>
+          <w:szCs w:val="36"/>
+          <w:shd w:fill="auto" w:val="clear"/>
+          <w:lang w:val="en-US" w:eastAsia="zh-CN" w:bidi="hi-IN"/>
+        </w:rPr>
+        <w:t>Digamos que essas interpretações equivocadas são propositais, porque é mais cômodo para nós imaginarmos um Deus que nos dá tudo, sem que precisemos  mudar, colaborar ou assumir compromissos.</w:t>
+      </w:r>
+    </w:p>
+    <w:p>
+      <w:pPr>
+        <w:pStyle w:val="Normal"/>
+        <w:jc w:val="both"/>
+        <w:rPr>
+          <w:sz w:val="36"/>
+          <w:szCs w:val="36"/>
+        </w:rPr>
+      </w:pPr>
+      <w:r>
+        <w:rPr>
+          <w:sz w:val="36"/>
+          <w:szCs w:val="36"/>
+        </w:rPr>
+      </w:r>
+    </w:p>
+    <w:p>
+      <w:pPr>
+        <w:pStyle w:val="Normal"/>
+        <w:jc w:val="both"/>
+        <w:rPr>
+          <w:sz w:val="36"/>
+          <w:szCs w:val="36"/>
+        </w:rPr>
+      </w:pPr>
+      <w:r>
+        <w:rPr>
+          <w:rFonts w:eastAsia="Times New Roman" w:cs="Times New Roman" w:ascii="Garamond" w:hAnsi="Garamond"/>
+          <w:color w:val="000000"/>
+          <w:kern w:val="0"/>
+          <w:sz w:val="36"/>
+          <w:szCs w:val="36"/>
+          <w:shd w:fill="auto" w:val="clear"/>
+          <w:lang w:val="en-US" w:eastAsia="zh-CN" w:bidi="hi-IN"/>
+        </w:rPr>
+        <w:t>Com esse comportamento transformamos ensinamentos profundos de Jesus em promessas de facilidade, quando na verdade esses ensinamentos nos convidam à responsabilidade, à confiança ativa e ao trabalho no bem.</w:t>
       </w:r>
     </w:p>
     <w:p>
@@ -599,79 +479,7 @@
           <w:shd w:fill="auto" w:val="clear"/>
           <w:lang w:val="en-US" w:eastAsia="zh-CN" w:bidi="hi-IN"/>
         </w:rPr>
-        <w:t>A segunda está em Lucas 11:9-11</w:t>
-      </w:r>
-      <w:r>
-        <w:rPr>
-          <w:rFonts w:eastAsia="Times New Roman" w:cs="Times New Roman" w:ascii="Garamond" w:hAnsi="Garamond"/>
-          <w:color w:val="000000"/>
-          <w:kern w:val="0"/>
-          <w:sz w:val="36"/>
-          <w:szCs w:val="36"/>
-          <w:shd w:fill="auto" w:val="clear"/>
-          <w:lang w:val="en-US" w:eastAsia="zh-CN" w:bidi="hi-IN"/>
-        </w:rPr>
-        <w:t>.</w:t>
-      </w:r>
-      <w:r>
-        <w:rPr>
-          <w:rFonts w:eastAsia="Times New Roman" w:cs="Times New Roman" w:ascii="Garamond" w:hAnsi="Garamond"/>
-          <w:color w:val="000000"/>
-          <w:kern w:val="0"/>
-          <w:sz w:val="36"/>
-          <w:szCs w:val="36"/>
-          <w:shd w:fill="auto" w:val="clear"/>
-          <w:lang w:val="en-US" w:eastAsia="zh-CN" w:bidi="hi-IN"/>
-        </w:rPr>
-        <w:t xml:space="preserve"> </w:t>
-      </w:r>
-      <w:r>
-        <w:rPr>
-          <w:rFonts w:eastAsia="Times New Roman" w:cs="Times New Roman" w:ascii="Garamond" w:hAnsi="Garamond"/>
-          <w:color w:val="000000"/>
-          <w:kern w:val="0"/>
-          <w:sz w:val="36"/>
-          <w:szCs w:val="36"/>
-          <w:shd w:fill="auto" w:val="clear"/>
-          <w:lang w:val="en-US" w:eastAsia="zh-CN" w:bidi="hi-IN"/>
-        </w:rPr>
-        <w:t>L</w:t>
-      </w:r>
-      <w:r>
-        <w:rPr>
-          <w:rFonts w:eastAsia="Times New Roman" w:cs="Times New Roman" w:ascii="Garamond" w:hAnsi="Garamond"/>
-          <w:color w:val="000000"/>
-          <w:kern w:val="0"/>
-          <w:sz w:val="36"/>
-          <w:szCs w:val="36"/>
-          <w:shd w:fill="auto" w:val="clear"/>
-          <w:lang w:val="en-US" w:eastAsia="zh-CN" w:bidi="hi-IN"/>
-        </w:rPr>
-        <w:t>ogo após ensinar aos discípulos a oração do Pai-Nosso</w:t>
-      </w:r>
-      <w:r>
-        <w:rPr>
-          <w:rFonts w:eastAsia="Times New Roman" w:cs="Times New Roman" w:ascii="Garamond" w:hAnsi="Garamond"/>
-          <w:color w:val="000000"/>
-          <w:kern w:val="0"/>
-          <w:sz w:val="36"/>
-          <w:szCs w:val="36"/>
-          <w:shd w:fill="auto" w:val="clear"/>
-          <w:lang w:val="en-US" w:eastAsia="zh-CN" w:bidi="hi-IN"/>
-        </w:rPr>
-        <w:t>,</w:t>
-      </w:r>
-      <w:r>
-        <w:rPr>
-          <w:rFonts w:eastAsia="Times New Roman" w:cs="Times New Roman" w:ascii="Garamond" w:hAnsi="Garamond"/>
-          <w:color w:val="000000"/>
-          <w:kern w:val="0"/>
-          <w:sz w:val="36"/>
-          <w:szCs w:val="36"/>
-          <w:shd w:fill="auto" w:val="clear"/>
-          <w:lang w:val="en-US" w:eastAsia="zh-CN" w:bidi="hi-IN"/>
-        </w:rPr>
-        <w:t xml:space="preserve"> Jesus apresenta uma pequena parábola, conhecida como a Parábola do Amigo Importuno.</w:t>
+        <w:t>A segunda está em Lucas 11:9-11. Logo após ensinar aos discípulos a oração do Pai-Nosso, Jesus apresenta uma pequena parábola, conhecida como a Parábola do Amigo Importuno.</w:t>
       </w:r>
     </w:p>
     <w:p>
@@ -934,7 +742,7 @@
           <w:shd w:fill="auto" w:val="clear"/>
           <w:lang w:val="en-US" w:eastAsia="zh-CN" w:bidi="hi-IN"/>
         </w:rPr>
-        <w:t xml:space="preserve">Observando alguns elementos simbólicos da parábola, encontramos ensinamentos ainda mais profundos. Jesus menciona que o homem procura o amigo à meia-noite, horário que aparece com frequência no Evangelho como símbolo de crise, de dificuldade e de escuridão interior. </w:t>
+        <w:t xml:space="preserve">Existem alguns elementos simbólicos nessa parábola. Jesus menciona que o homem procura o amigo à meia-noite, horário que aparece com frequência no Evangelho como símbolo de crise, de dificuldade e de escuridão interior. </w:t>
       </w:r>
     </w:p>
     <w:p>
@@ -1014,7 +822,7 @@
           <w:shd w:fill="auto" w:val="clear"/>
           <w:lang w:val="en-US" w:eastAsia="zh-CN" w:bidi="hi-IN"/>
         </w:rPr>
-        <w:t>O amigo que está dentro da casa representa os valores superiores que já existem em nós, mas que muitas vezes preferimos manter adormecidos. O homem diz que está deitado e não quer se levantar, o que simboliza nossa resistência em sair da zona de conforto. Sabemos, intuitivamente, que despertar esses valores implicará esforço, mudança e compromisso com o bem.</w:t>
+        <w:t>O amigo que está dentro da casa representa os valores superiores que já existem em nós, mas que muitas vezes preferimos manter adormecidos. O homem diz que está deitado e não quer se levantar, o que simboliza nossa resistência em sair da zona de conforto. Sabemos, intuitivamente, que despertar esses valores implicará esforço, trabalho e mudanças no nosso ser.</w:t>
       </w:r>
     </w:p>
     <w:p>
@@ -1104,7 +912,7 @@
           <w:shd w:fill="auto" w:val="clear"/>
           <w:lang w:val="en-US" w:eastAsia="zh-CN" w:bidi="hi-IN"/>
         </w:rPr>
-        <w:t>Por fim, há um ponto central nessa parábola: por maior que fosse a necessidade do homem que pedia os pães, ele não podia abrir a porta da casa. A porta só se abre pelo lado de dentro. Assim também acontece com a porta do nosso coração. Somente nós podemos abri-la, quando decidimos atender aos apelos da própria consciência, muitas vezes manifestados através da dor, do desequilíbrio, da doença ou da fome de sentido espiritual.</w:t>
+        <w:t>Por fim, há um ponto central nessa parábola: por maior que fosse a necessidade do homem que pedia os pães, ele não podia abrir a porta da casa. A porta só poderia ser aberta pelo lado de dentro. Assim também acontece com a porta do nosso coração. Somente nós podemos abri-la e faremos isso quando decidirmos atender aos apelos da própria consciência, que chegam através da dor, do desequilíbrio, da doença ou da fome de pão espiritual.</w:t>
       </w:r>
     </w:p>
     <w:p>
@@ -1149,126 +957,114 @@
           <w:shd w:fill="auto" w:val="clear"/>
           <w:lang w:val="en-US" w:eastAsia="zh-CN" w:bidi="hi-IN"/>
         </w:rPr>
-        <w:t xml:space="preserve">A Parábola do Amigo Importuno nos ensina, portanto, a necessidade da prece constante — não uma prece mecânica, repetitiva ou interesseira, mas uma oração sincera, consciente e transformadora. </w:t>
-      </w:r>
-    </w:p>
-    <w:p>
-      <w:pPr>
-        <w:pStyle w:val="Normal"/>
-        <w:jc w:val="both"/>
-        <w:rPr>
-          <w:color w:val="auto"/>
-        </w:rPr>
-      </w:pPr>
-      <w:r>
-        <w:rPr>
-          <w:color w:val="auto"/>
-        </w:rPr>
-      </w:r>
-    </w:p>
-    <w:p>
-      <w:pPr>
-        <w:pStyle w:val="Normal"/>
-        <w:jc w:val="both"/>
-        <w:rPr>
-          <w:color w:val="auto"/>
-        </w:rPr>
-      </w:pPr>
-      <w:r>
-        <w:rPr>
-          <w:rFonts w:eastAsia="Times New Roman" w:cs="Times New Roman" w:ascii="Garamond" w:hAnsi="Garamond"/>
-          <w:color w:val="000000"/>
-          <w:kern w:val="0"/>
-          <w:sz w:val="36"/>
-          <w:szCs w:val="36"/>
-          <w:shd w:fill="auto" w:val="clear"/>
-          <w:lang w:val="en-US" w:eastAsia="zh-CN" w:bidi="hi-IN"/>
-        </w:rPr>
-        <w:t>Uma prece que não apenas pede, mas que prepara o coração para receber, agir e crescer. É essa oração viva que se torna a chave capaz de abrir as portas do nosso mundo interior para tudo aquilo que pode promover nossa evolução espiritual.</w:t>
-      </w:r>
-    </w:p>
-    <w:p>
-      <w:pPr>
-        <w:pStyle w:val="Normal"/>
-        <w:jc w:val="both"/>
-        <w:rPr>
-          <w:sz w:val="36"/>
-          <w:szCs w:val="36"/>
-        </w:rPr>
-      </w:pPr>
-      <w:r>
-        <w:rPr>
-          <w:sz w:val="36"/>
-          <w:szCs w:val="36"/>
-        </w:rPr>
-      </w:r>
-    </w:p>
-    <w:p>
-      <w:pPr>
-        <w:pStyle w:val="Normal"/>
-        <w:jc w:val="both"/>
-        <w:rPr>
-          <w:color w:val="auto"/>
-        </w:rPr>
-      </w:pPr>
-      <w:r>
-        <w:rPr>
-          <w:rFonts w:eastAsia="Times New Roman" w:cs="Times New Roman" w:ascii="Garamond" w:hAnsi="Garamond"/>
-          <w:color w:val="000000"/>
-          <w:kern w:val="0"/>
-          <w:sz w:val="36"/>
-          <w:szCs w:val="36"/>
-          <w:shd w:fill="auto" w:val="clear"/>
-          <w:lang w:val="en-US" w:eastAsia="zh-CN" w:bidi="hi-IN"/>
-        </w:rPr>
-        <w:t xml:space="preserve">Muitos podem questionar: se Deus conhece perfeitamente tudo aquilo de que necessitamos antes mesmo de pedirmos, por que então precisamos orar? </w:t>
-      </w:r>
-    </w:p>
-    <w:p>
-      <w:pPr>
-        <w:pStyle w:val="Normal"/>
-        <w:jc w:val="both"/>
-        <w:rPr>
-          <w:color w:val="auto"/>
-        </w:rPr>
-      </w:pPr>
-      <w:r>
-        <w:rPr>
-          <w:color w:val="auto"/>
-        </w:rPr>
-      </w:r>
-    </w:p>
-    <w:p>
-      <w:pPr>
-        <w:pStyle w:val="Normal"/>
-        <w:jc w:val="both"/>
-        <w:rPr>
-          <w:color w:val="auto"/>
-        </w:rPr>
-      </w:pPr>
-      <w:r>
-        <w:rPr>
-          <w:rFonts w:eastAsia="Times New Roman" w:cs="Times New Roman" w:ascii="Garamond" w:hAnsi="Garamond"/>
-          <w:color w:val="000000"/>
-          <w:kern w:val="0"/>
-          <w:sz w:val="36"/>
-          <w:szCs w:val="36"/>
-          <w:shd w:fill="auto" w:val="clear"/>
-          <w:lang w:val="en-US" w:eastAsia="zh-CN" w:bidi="hi-IN"/>
-        </w:rPr>
-        <w:t xml:space="preserve">Porque </w:t>
-      </w:r>
-      <w:r>
-        <w:rPr>
-          <w:rFonts w:eastAsia="Times New Roman" w:cs="Times New Roman" w:ascii="Garamond" w:hAnsi="Garamond"/>
-          <w:color w:val="000000"/>
-          <w:kern w:val="0"/>
-          <w:sz w:val="36"/>
-          <w:szCs w:val="36"/>
-          <w:shd w:fill="auto" w:val="clear"/>
-          <w:lang w:val="en-US" w:eastAsia="zh-CN" w:bidi="hi-IN"/>
-        </w:rPr>
-        <w:t>a oração não tem por finalidade informar a Deus sobre nossas necessidades, mas transformar a nós mesmos. Orar é criar em nosso íntimo as condições necessárias para receber aquilo que a Providência pode nos oferecer.</w:t>
+        <w:t xml:space="preserve">A Parábola do Amigo Importuno nos ensina, portanto, a necessidade da prece constante — não uma prece mecânica, repetitiva ou interesseira, mas sincera, consciente e transformadora. </w:t>
+      </w:r>
+    </w:p>
+    <w:p>
+      <w:pPr>
+        <w:pStyle w:val="Normal"/>
+        <w:jc w:val="both"/>
+        <w:rPr>
+          <w:color w:val="auto"/>
+        </w:rPr>
+      </w:pPr>
+      <w:r>
+        <w:rPr>
+          <w:color w:val="auto"/>
+        </w:rPr>
+      </w:r>
+    </w:p>
+    <w:p>
+      <w:pPr>
+        <w:pStyle w:val="Normal"/>
+        <w:jc w:val="both"/>
+        <w:rPr>
+          <w:color w:val="auto"/>
+        </w:rPr>
+      </w:pPr>
+      <w:r>
+        <w:rPr>
+          <w:rFonts w:eastAsia="Times New Roman" w:cs="Times New Roman" w:ascii="Garamond" w:hAnsi="Garamond"/>
+          <w:color w:val="000000"/>
+          <w:kern w:val="0"/>
+          <w:sz w:val="36"/>
+          <w:szCs w:val="36"/>
+          <w:shd w:fill="auto" w:val="clear"/>
+          <w:lang w:val="en-US" w:eastAsia="zh-CN" w:bidi="hi-IN"/>
+        </w:rPr>
+        <w:t>Uma prece que não apenas pede, mas que prepara o coração para receber, agir e crescer. É essa oração viva que se torna a chave capaz de abrir as portas do nosso mundo interior para os tesouros  espirituais.</w:t>
+      </w:r>
+    </w:p>
+    <w:p>
+      <w:pPr>
+        <w:pStyle w:val="Normal"/>
+        <w:jc w:val="both"/>
+        <w:rPr>
+          <w:sz w:val="36"/>
+          <w:szCs w:val="36"/>
+        </w:rPr>
+      </w:pPr>
+      <w:r>
+        <w:rPr>
+          <w:sz w:val="36"/>
+          <w:szCs w:val="36"/>
+        </w:rPr>
+      </w:r>
+    </w:p>
+    <w:p>
+      <w:pPr>
+        <w:pStyle w:val="Normal"/>
+        <w:jc w:val="both"/>
+        <w:rPr>
+          <w:color w:val="auto"/>
+        </w:rPr>
+      </w:pPr>
+      <w:r>
+        <w:rPr>
+          <w:rFonts w:eastAsia="Times New Roman" w:cs="Times New Roman" w:ascii="Garamond" w:hAnsi="Garamond"/>
+          <w:color w:val="000000"/>
+          <w:kern w:val="0"/>
+          <w:sz w:val="36"/>
+          <w:szCs w:val="36"/>
+          <w:shd w:fill="auto" w:val="clear"/>
+          <w:lang w:val="en-US" w:eastAsia="zh-CN" w:bidi="hi-IN"/>
+        </w:rPr>
+        <w:t xml:space="preserve">Os mais incrédulos frequentemente perguntam: se Deus conhece tudo aquilo de que necessitamos antes mesmo de pedirmos, por que devemos então orar? </w:t>
+      </w:r>
+    </w:p>
+    <w:p>
+      <w:pPr>
+        <w:pStyle w:val="Normal"/>
+        <w:jc w:val="both"/>
+        <w:rPr>
+          <w:color w:val="auto"/>
+        </w:rPr>
+      </w:pPr>
+      <w:r>
+        <w:rPr>
+          <w:color w:val="auto"/>
+        </w:rPr>
+      </w:r>
+    </w:p>
+    <w:p>
+      <w:pPr>
+        <w:pStyle w:val="Normal"/>
+        <w:jc w:val="both"/>
+        <w:rPr>
+          <w:color w:val="auto"/>
+        </w:rPr>
+      </w:pPr>
+      <w:r>
+        <w:rPr>
+          <w:rFonts w:eastAsia="Times New Roman" w:cs="Times New Roman" w:ascii="Garamond" w:hAnsi="Garamond"/>
+          <w:color w:val="000000"/>
+          <w:kern w:val="0"/>
+          <w:sz w:val="36"/>
+          <w:szCs w:val="36"/>
+          <w:shd w:fill="auto" w:val="clear"/>
+          <w:lang w:val="en-US" w:eastAsia="zh-CN" w:bidi="hi-IN"/>
+        </w:rPr>
+        <w:t>A resposta é simples: a oração não existe para informar a Deus sobre aquilo de que precisamos, mas para nos transformar. Orar é criar, dentro de nós, as condições necessárias para receber aquilo que a Providência já pode nos oferecer.</w:t>
       </w:r>
     </w:p>
     <w:p>
@@ -1313,7 +1109,7 @@
           <w:shd w:fill="auto" w:val="clear"/>
           <w:lang w:val="en-US" w:eastAsia="zh-CN" w:bidi="hi-IN"/>
         </w:rPr>
-        <w:t>Através do livre-arbítrio, podemos ampliar ou reduzir nossa capacidade de recepção dos dons divinos. O pedir, o buscar e o bater não existem para convencer Deus, mas para alargar, pouco a pouco, o nosso recipiente interior. É nesse sentido que a oração se torna um exercício de crescimento espiritual.</w:t>
+        <w:t>A oração não muda Deus. Muda quem ora. Quebra o nosso orgulho, abre o nosso coração e nos prepara para receber aquilo que Deus sempre esteve disposto a nos dar.</w:t>
       </w:r>
     </w:p>
     <w:p>
@@ -1358,150 +1154,42 @@
           <w:shd w:fill="auto" w:val="clear"/>
           <w:lang w:val="en-US" w:eastAsia="zh-CN" w:bidi="hi-IN"/>
         </w:rPr>
-        <w:t>Podemos comparar, de forma simples, aquilo que Deus tem a nos oferecer a uma fonte. Quem vai à fonte com um copo recolhe um copo; quem vai com um</w:t>
-      </w:r>
-      <w:r>
-        <w:rPr>
-          <w:rFonts w:eastAsia="Times New Roman" w:cs="Times New Roman" w:ascii="Garamond" w:hAnsi="Garamond"/>
-          <w:color w:val="000000"/>
-          <w:kern w:val="0"/>
-          <w:sz w:val="36"/>
-          <w:szCs w:val="36"/>
-          <w:shd w:fill="auto" w:val="clear"/>
-          <w:lang w:val="en-US" w:eastAsia="zh-CN" w:bidi="hi-IN"/>
-        </w:rPr>
-        <w:t>a jarra</w:t>
-      </w:r>
-      <w:r>
-        <w:rPr>
-          <w:rFonts w:eastAsia="Times New Roman" w:cs="Times New Roman" w:ascii="Garamond" w:hAnsi="Garamond"/>
-          <w:color w:val="000000"/>
-          <w:kern w:val="0"/>
-          <w:sz w:val="36"/>
-          <w:szCs w:val="36"/>
-          <w:shd w:fill="auto" w:val="clear"/>
-          <w:lang w:val="en-US" w:eastAsia="zh-CN" w:bidi="hi-IN"/>
-        </w:rPr>
-        <w:t>, recolhe um</w:t>
-      </w:r>
-      <w:r>
-        <w:rPr>
-          <w:rFonts w:eastAsia="Times New Roman" w:cs="Times New Roman" w:ascii="Garamond" w:hAnsi="Garamond"/>
-          <w:color w:val="000000"/>
-          <w:kern w:val="0"/>
-          <w:sz w:val="36"/>
-          <w:szCs w:val="36"/>
-          <w:shd w:fill="auto" w:val="clear"/>
-          <w:lang w:val="en-US" w:eastAsia="zh-CN" w:bidi="hi-IN"/>
-        </w:rPr>
-        <w:t>a jarra</w:t>
-      </w:r>
-      <w:r>
-        <w:rPr>
-          <w:rFonts w:eastAsia="Times New Roman" w:cs="Times New Roman" w:ascii="Garamond" w:hAnsi="Garamond"/>
-          <w:color w:val="000000"/>
-          <w:kern w:val="0"/>
-          <w:sz w:val="36"/>
-          <w:szCs w:val="36"/>
-          <w:shd w:fill="auto" w:val="clear"/>
-          <w:lang w:val="en-US" w:eastAsia="zh-CN" w:bidi="hi-IN"/>
-        </w:rPr>
-        <w:t xml:space="preserve"> e quem vai com um </w:t>
-      </w:r>
-      <w:r>
-        <w:rPr>
-          <w:rFonts w:eastAsia="Times New Roman" w:cs="Times New Roman" w:ascii="Garamond" w:hAnsi="Garamond"/>
-          <w:color w:val="000000"/>
-          <w:kern w:val="0"/>
-          <w:sz w:val="36"/>
-          <w:szCs w:val="36"/>
-          <w:shd w:fill="auto" w:val="clear"/>
-          <w:lang w:val="en-US" w:eastAsia="zh-CN" w:bidi="hi-IN"/>
-        </w:rPr>
-        <w:t>tambor</w:t>
-      </w:r>
-      <w:r>
-        <w:rPr>
-          <w:rFonts w:eastAsia="Times New Roman" w:cs="Times New Roman" w:ascii="Garamond" w:hAnsi="Garamond"/>
-          <w:color w:val="000000"/>
-          <w:kern w:val="0"/>
-          <w:sz w:val="36"/>
-          <w:szCs w:val="36"/>
-          <w:shd w:fill="auto" w:val="clear"/>
-          <w:lang w:val="en-US" w:eastAsia="zh-CN" w:bidi="hi-IN"/>
-        </w:rPr>
-        <w:t xml:space="preserve"> recolhe um </w:t>
-      </w:r>
-      <w:r>
-        <w:rPr>
-          <w:rFonts w:eastAsia="Times New Roman" w:cs="Times New Roman" w:ascii="Garamond" w:hAnsi="Garamond"/>
-          <w:color w:val="000000"/>
-          <w:kern w:val="0"/>
-          <w:sz w:val="36"/>
-          <w:szCs w:val="36"/>
-          <w:shd w:fill="auto" w:val="clear"/>
-          <w:lang w:val="en-US" w:eastAsia="zh-CN" w:bidi="hi-IN"/>
-        </w:rPr>
-        <w:t>tambor</w:t>
-      </w:r>
-      <w:r>
-        <w:rPr>
-          <w:rFonts w:eastAsia="Times New Roman" w:cs="Times New Roman" w:ascii="Garamond" w:hAnsi="Garamond"/>
-          <w:color w:val="000000"/>
-          <w:kern w:val="0"/>
-          <w:sz w:val="36"/>
-          <w:szCs w:val="36"/>
-          <w:shd w:fill="auto" w:val="clear"/>
-          <w:lang w:val="en-US" w:eastAsia="zh-CN" w:bidi="hi-IN"/>
-        </w:rPr>
-        <w:t xml:space="preserve">. A fonte não se modifica em função do recepiente que cada um leva; ela permanece a mesma. </w:t>
-      </w:r>
-    </w:p>
-    <w:p>
-      <w:pPr>
-        <w:pStyle w:val="Normal"/>
-        <w:jc w:val="both"/>
-        <w:rPr>
-          <w:color w:val="auto"/>
-        </w:rPr>
-      </w:pPr>
-      <w:r>
-        <w:rPr>
-          <w:color w:val="auto"/>
-        </w:rPr>
-      </w:r>
-    </w:p>
-    <w:p>
-      <w:pPr>
-        <w:pStyle w:val="Normal"/>
-        <w:jc w:val="both"/>
-        <w:rPr>
-          <w:color w:val="auto"/>
-        </w:rPr>
-      </w:pPr>
-      <w:r>
-        <w:rPr>
-          <w:rFonts w:eastAsia="Times New Roman" w:cs="Times New Roman" w:ascii="Garamond" w:hAnsi="Garamond"/>
-          <w:color w:val="000000"/>
-          <w:kern w:val="0"/>
-          <w:sz w:val="36"/>
-          <w:szCs w:val="36"/>
-          <w:shd w:fill="auto" w:val="clear"/>
-          <w:lang w:val="en-US" w:eastAsia="zh-CN" w:bidi="hi-IN"/>
-        </w:rPr>
-        <w:t>Da mesma form</w:t>
-      </w:r>
-      <w:r>
-        <w:rPr>
-          <w:rFonts w:eastAsia="Times New Roman" w:cs="Times New Roman" w:ascii="Garamond" w:hAnsi="Garamond"/>
-          <w:color w:val="000000"/>
-          <w:kern w:val="0"/>
-          <w:sz w:val="36"/>
-          <w:szCs w:val="36"/>
-          <w:shd w:fill="auto" w:val="clear"/>
-          <w:lang w:val="en-US" w:eastAsia="zh-CN" w:bidi="hi-IN"/>
-        </w:rPr>
-        <w:t xml:space="preserve">a, a capacidade de doação divina também não se altera em função da nossa capacidade de receber.  </w:t>
+        <w:t xml:space="preserve">Podemos comparar aquilo que Deus nos oferece a uma fonte de água: quem vai até ela com um copo recolhe um copo; quem leva uma jarra recolhe uma jarra; quem leva um barril recolhe um barril. A fonte não muda — continua a mesma. O que muda é  a capacidade de cada um de receber. </w:t>
+      </w:r>
+    </w:p>
+    <w:p>
+      <w:pPr>
+        <w:pStyle w:val="Normal"/>
+        <w:jc w:val="both"/>
+        <w:rPr>
+          <w:color w:val="auto"/>
+        </w:rPr>
+      </w:pPr>
+      <w:r>
+        <w:rPr>
+          <w:color w:val="auto"/>
+        </w:rPr>
+      </w:r>
+    </w:p>
+    <w:p>
+      <w:pPr>
+        <w:pStyle w:val="Normal"/>
+        <w:jc w:val="both"/>
+        <w:rPr>
+          <w:color w:val="auto"/>
+        </w:rPr>
+      </w:pPr>
+      <w:r>
+        <w:rPr>
+          <w:rFonts w:eastAsia="Times New Roman" w:cs="Times New Roman" w:ascii="Garamond" w:hAnsi="Garamond"/>
+          <w:color w:val="000000"/>
+          <w:kern w:val="0"/>
+          <w:sz w:val="36"/>
+          <w:szCs w:val="36"/>
+          <w:shd w:fill="auto" w:val="clear"/>
+          <w:lang w:val="en-US" w:eastAsia="zh-CN" w:bidi="hi-IN"/>
+        </w:rPr>
+        <w:t xml:space="preserve">Então agora nós já sabemos que uma parte importantíssima do Pedi e obtereis está na oração. </w:t>
       </w:r>
     </w:p>
     <w:p>
@@ -1537,13 +1225,910 @@
         <w:pStyle w:val="Normal"/>
         <w:jc w:val="both"/>
         <w:rPr>
+          <w:b/>
+          <w:b/>
+          <w:bCs/>
+          <w:color w:val="C9211E"/>
+        </w:rPr>
+      </w:pPr>
+      <w:r>
+        <w:rPr>
+          <w:rFonts w:eastAsia="Times New Roman" w:cs="Times New Roman" w:ascii="Garamond" w:hAnsi="Garamond"/>
+          <w:b/>
+          <w:bCs/>
+          <w:color w:val="C9211E"/>
+          <w:kern w:val="0"/>
+          <w:sz w:val="36"/>
+          <w:szCs w:val="36"/>
+          <w:shd w:fill="auto" w:val="clear"/>
+          <w:lang w:val="en-US" w:eastAsia="zh-CN" w:bidi="hi-IN"/>
+        </w:rPr>
+        <w:t>[ Não alterar mais o texto que já está escrito até aqui ]</w:t>
+      </w:r>
+    </w:p>
+    <w:p>
+      <w:pPr>
+        <w:pStyle w:val="Normal"/>
+        <w:jc w:val="both"/>
+        <w:rPr>
           <w:color w:val="1C99E0"/>
         </w:rPr>
       </w:pPr>
       <w:r>
         <w:rPr>
-          <w:rFonts w:eastAsia="Times New Roman" w:cs="Times New Roman" w:ascii="Garamond" w:hAnsi="Garamond"/>
           <w:color w:val="1C99E0"/>
+        </w:rPr>
+      </w:r>
+    </w:p>
+    <w:p>
+      <w:pPr>
+        <w:pStyle w:val="Normal"/>
+        <w:jc w:val="both"/>
+        <w:rPr>
+          <w:color w:val="1C99E0"/>
+        </w:rPr>
+      </w:pPr>
+      <w:r>
+        <w:rPr>
+          <w:color w:val="1C99E0"/>
+        </w:rPr>
+      </w:r>
+    </w:p>
+    <w:p>
+      <w:pPr>
+        <w:pStyle w:val="Normal"/>
+        <w:jc w:val="both"/>
+        <w:rPr>
+          <w:color w:val="1C99E0"/>
+        </w:rPr>
+      </w:pPr>
+      <w:r>
+        <w:rPr>
+          <w:rFonts w:eastAsia="Times New Roman" w:cs="Times New Roman" w:ascii="Garamond" w:hAnsi="Garamond"/>
+          <w:color w:val="1C99E0"/>
+          <w:kern w:val="0"/>
+          <w:sz w:val="36"/>
+          <w:szCs w:val="36"/>
+          <w:shd w:fill="auto" w:val="clear"/>
+          <w:lang w:val="en-US" w:eastAsia="zh-CN" w:bidi="hi-IN"/>
+        </w:rPr>
+        <w:t>[ Início do parágrafo de ligação entre a oração e outros elementos do Pedi e obtereis ]</w:t>
+      </w:r>
+    </w:p>
+    <w:p>
+      <w:pPr>
+        <w:pStyle w:val="Normal"/>
+        <w:jc w:val="both"/>
+        <w:rPr>
+          <w:color w:val="auto"/>
+        </w:rPr>
+      </w:pPr>
+      <w:r>
+        <w:rPr>
+          <w:rFonts w:eastAsia="Times New Roman" w:cs="Times New Roman" w:ascii="Garamond" w:hAnsi="Garamond"/>
+          <w:color w:val="000000"/>
+          <w:kern w:val="0"/>
+          <w:sz w:val="36"/>
+          <w:szCs w:val="36"/>
+          <w:shd w:fill="auto" w:val="clear"/>
+          <w:lang w:val="en-US" w:eastAsia="zh-CN" w:bidi="hi-IN"/>
+        </w:rPr>
+        <w:t xml:space="preserve">Até aqui falamos sobre a força da oração, </w:t>
+      </w:r>
+      <w:r>
+        <w:rPr>
+          <w:rFonts w:eastAsia="Times New Roman" w:cs="Times New Roman" w:ascii="Garamond" w:hAnsi="Garamond"/>
+          <w:color w:val="000000"/>
+          <w:kern w:val="0"/>
+          <w:sz w:val="36"/>
+          <w:szCs w:val="36"/>
+          <w:shd w:fill="auto" w:val="clear"/>
+          <w:lang w:val="en-US" w:eastAsia="zh-CN" w:bidi="hi-IN"/>
+        </w:rPr>
+        <w:t xml:space="preserve">sobrea maneira correta de se orar, </w:t>
+      </w:r>
+      <w:r>
+        <w:rPr>
+          <w:rFonts w:eastAsia="Times New Roman" w:cs="Times New Roman" w:ascii="Garamond" w:hAnsi="Garamond"/>
+          <w:color w:val="000000"/>
+          <w:kern w:val="0"/>
+          <w:sz w:val="36"/>
+          <w:szCs w:val="36"/>
+          <w:shd w:fill="auto" w:val="clear"/>
+          <w:lang w:val="en-US" w:eastAsia="zh-CN" w:bidi="hi-IN"/>
+        </w:rPr>
+        <w:t>sobre a necessidade de pedir com sinceridade, fé e perseverança. Mas existe um ponto essencial que não podemos ignorar.</w:t>
+      </w:r>
+    </w:p>
+    <w:p>
+      <w:pPr>
+        <w:pStyle w:val="Normal"/>
+        <w:jc w:val="both"/>
+        <w:rPr>
+          <w:color w:val="auto"/>
+        </w:rPr>
+      </w:pPr>
+      <w:r>
+        <w:rPr/>
+      </w:r>
+    </w:p>
+    <w:p>
+      <w:pPr>
+        <w:pStyle w:val="Normal"/>
+        <w:jc w:val="both"/>
+        <w:rPr>
+          <w:color w:val="auto"/>
+        </w:rPr>
+      </w:pPr>
+      <w:r>
+        <w:rPr>
+          <w:rFonts w:eastAsia="Times New Roman" w:cs="Times New Roman" w:ascii="Garamond" w:hAnsi="Garamond"/>
+          <w:color w:val="000000"/>
+          <w:kern w:val="0"/>
+          <w:sz w:val="36"/>
+          <w:szCs w:val="36"/>
+          <w:shd w:fill="auto" w:val="clear"/>
+          <w:lang w:val="en-US" w:eastAsia="zh-CN" w:bidi="hi-IN"/>
+        </w:rPr>
+        <w:t>O apóstolo Tiago nos deixou uma advertência muito clara em sua epístola: “A fé sem obras é morta.”</w:t>
+      </w:r>
+    </w:p>
+    <w:p>
+      <w:pPr>
+        <w:pStyle w:val="Normal"/>
+        <w:jc w:val="both"/>
+        <w:rPr>
+          <w:color w:val="auto"/>
+        </w:rPr>
+      </w:pPr>
+      <w:r>
+        <w:rPr/>
+      </w:r>
+    </w:p>
+    <w:p>
+      <w:pPr>
+        <w:pStyle w:val="Normal"/>
+        <w:jc w:val="both"/>
+        <w:rPr>
+          <w:color w:val="auto"/>
+        </w:rPr>
+      </w:pPr>
+      <w:r>
+        <w:rPr>
+          <w:rFonts w:eastAsia="Times New Roman" w:cs="Times New Roman" w:ascii="Garamond" w:hAnsi="Garamond"/>
+          <w:color w:val="000000"/>
+          <w:kern w:val="0"/>
+          <w:sz w:val="36"/>
+          <w:szCs w:val="36"/>
+          <w:shd w:fill="auto" w:val="clear"/>
+          <w:lang w:val="en-US" w:eastAsia="zh-CN" w:bidi="hi-IN"/>
+        </w:rPr>
+        <w:t xml:space="preserve">Por mais sinceras que sejam nossas orações, por maior que seja a nossa fé, não basta apenas nós pedirmos; é indispensável que ofereçamos algo a Deus. </w:t>
+      </w:r>
+    </w:p>
+    <w:p>
+      <w:pPr>
+        <w:pStyle w:val="Normal"/>
+        <w:jc w:val="both"/>
+        <w:rPr>
+          <w:color w:val="auto"/>
+        </w:rPr>
+      </w:pPr>
+      <w:r>
+        <w:rPr>
+          <w:color w:val="auto"/>
+        </w:rPr>
+      </w:r>
+    </w:p>
+    <w:p>
+      <w:pPr>
+        <w:pStyle w:val="Normal"/>
+        <w:jc w:val="both"/>
+        <w:rPr>
+          <w:color w:val="auto"/>
+        </w:rPr>
+      </w:pPr>
+      <w:r>
+        <w:rPr>
+          <w:rFonts w:eastAsia="Times New Roman" w:cs="Times New Roman" w:ascii="Garamond" w:hAnsi="Garamond"/>
+          <w:color w:val="000000"/>
+          <w:kern w:val="0"/>
+          <w:sz w:val="36"/>
+          <w:szCs w:val="36"/>
+          <w:shd w:fill="auto" w:val="clear"/>
+          <w:lang w:val="en-US" w:eastAsia="zh-CN" w:bidi="hi-IN"/>
+        </w:rPr>
+        <w:t xml:space="preserve">Afinal de contas, não é justo que sejamos eternos pedintes sem jamais oferecer algo de nossa parte. </w:t>
+      </w:r>
+    </w:p>
+    <w:p>
+      <w:pPr>
+        <w:pStyle w:val="Normal"/>
+        <w:jc w:val="both"/>
+        <w:rPr>
+          <w:color w:val="auto"/>
+        </w:rPr>
+      </w:pPr>
+      <w:r>
+        <w:rPr/>
+      </w:r>
+    </w:p>
+    <w:p>
+      <w:pPr>
+        <w:pStyle w:val="Normal"/>
+        <w:jc w:val="both"/>
+        <w:rPr>
+          <w:color w:val="auto"/>
+        </w:rPr>
+      </w:pPr>
+      <w:r>
+        <w:rPr>
+          <w:rFonts w:eastAsia="Times New Roman" w:cs="Times New Roman" w:ascii="Garamond" w:hAnsi="Garamond"/>
+          <w:color w:val="000000"/>
+          <w:kern w:val="0"/>
+          <w:sz w:val="36"/>
+          <w:szCs w:val="36"/>
+          <w:shd w:fill="auto" w:val="clear"/>
+          <w:lang w:val="en-US" w:eastAsia="zh-CN" w:bidi="hi-IN"/>
+        </w:rPr>
+        <w:t>Emmanuel, na obra Palavras de Vida Eterna, lição número 9 — Socorro e Concurso — aborda uma questão cuja compreensão é de grande importância para todos nós.</w:t>
+      </w:r>
+    </w:p>
+    <w:p>
+      <w:pPr>
+        <w:pStyle w:val="Normal"/>
+        <w:jc w:val="both"/>
+        <w:rPr>
+          <w:color w:val="auto"/>
+        </w:rPr>
+      </w:pPr>
+      <w:r>
+        <w:rPr>
+          <w:color w:val="auto"/>
+        </w:rPr>
+      </w:r>
+    </w:p>
+    <w:p>
+      <w:pPr>
+        <w:pStyle w:val="Normal"/>
+        <w:jc w:val="both"/>
+        <w:rPr>
+          <w:color w:val="auto"/>
+        </w:rPr>
+      </w:pPr>
+      <w:r>
+        <w:rPr>
+          <w:rFonts w:eastAsia="Times New Roman" w:cs="Times New Roman" w:ascii="Garamond" w:hAnsi="Garamond"/>
+          <w:color w:val="000000"/>
+          <w:kern w:val="0"/>
+          <w:sz w:val="36"/>
+          <w:szCs w:val="36"/>
+          <w:shd w:fill="auto" w:val="clear"/>
+          <w:lang w:val="en-US" w:eastAsia="zh-CN" w:bidi="hi-IN"/>
+        </w:rPr>
+        <w:t>Jesus realizou duas multiplicações de pães e peixes.</w:t>
+      </w:r>
+    </w:p>
+    <w:p>
+      <w:pPr>
+        <w:pStyle w:val="Normal"/>
+        <w:jc w:val="both"/>
+        <w:rPr>
+          <w:color w:val="auto"/>
+        </w:rPr>
+      </w:pPr>
+      <w:r>
+        <w:rPr>
+          <w:color w:val="auto"/>
+        </w:rPr>
+      </w:r>
+    </w:p>
+    <w:p>
+      <w:pPr>
+        <w:pStyle w:val="Normal"/>
+        <w:jc w:val="both"/>
+        <w:rPr>
+          <w:color w:val="auto"/>
+        </w:rPr>
+      </w:pPr>
+      <w:r>
+        <w:rPr>
+          <w:rFonts w:eastAsia="Times New Roman" w:cs="Times New Roman" w:ascii="Garamond" w:hAnsi="Garamond"/>
+          <w:color w:val="000000"/>
+          <w:kern w:val="0"/>
+          <w:sz w:val="36"/>
+          <w:szCs w:val="36"/>
+          <w:shd w:fill="auto" w:val="clear"/>
+          <w:lang w:val="en-US" w:eastAsia="zh-CN" w:bidi="hi-IN"/>
+        </w:rPr>
+        <w:t>A primeira está narrada nos quatro Evangelhos — Mateus, Marcos, Lucas e João. Nela, os discípulos dispunham de cinco pães e dois peixes. Jesus os multiplica de tal forma que são alimentados cinco mil homens, sem contar mulheres e crianças, e com as sobras enchem-se doze cestos de vime.</w:t>
+      </w:r>
+    </w:p>
+    <w:p>
+      <w:pPr>
+        <w:pStyle w:val="Normal"/>
+        <w:jc w:val="both"/>
+        <w:rPr>
+          <w:color w:val="auto"/>
+        </w:rPr>
+      </w:pPr>
+      <w:r>
+        <w:rPr>
+          <w:color w:val="auto"/>
+        </w:rPr>
+      </w:r>
+    </w:p>
+    <w:p>
+      <w:pPr>
+        <w:pStyle w:val="Normal"/>
+        <w:jc w:val="both"/>
+        <w:rPr>
+          <w:color w:val="auto"/>
+        </w:rPr>
+      </w:pPr>
+      <w:r>
+        <w:rPr>
+          <w:rFonts w:eastAsia="Times New Roman" w:cs="Times New Roman" w:ascii="Garamond" w:hAnsi="Garamond"/>
+          <w:color w:val="000000"/>
+          <w:kern w:val="0"/>
+          <w:sz w:val="36"/>
+          <w:szCs w:val="36"/>
+          <w:shd w:fill="auto" w:val="clear"/>
+          <w:lang w:val="en-US" w:eastAsia="zh-CN" w:bidi="hi-IN"/>
+        </w:rPr>
+        <w:t>A segunda multiplicação está narrada apenas nos Evangelhos de Mateus e Marcos. Nessa ocasião, os discípulos tinham sete pães e alguns peixinhos, conforme está registrado. Após a multiplicação, foram alimentados quatro mil homens, além de mulheres e crianças, e sete cestos foram preenchidos com as sobras.</w:t>
+      </w:r>
+    </w:p>
+    <w:p>
+      <w:pPr>
+        <w:pStyle w:val="Normal"/>
+        <w:jc w:val="both"/>
+        <w:rPr>
+          <w:color w:val="auto"/>
+        </w:rPr>
+      </w:pPr>
+      <w:r>
+        <w:rPr>
+          <w:color w:val="auto"/>
+        </w:rPr>
+      </w:r>
+    </w:p>
+    <w:p>
+      <w:pPr>
+        <w:pStyle w:val="Normal"/>
+        <w:jc w:val="both"/>
+        <w:rPr>
+          <w:color w:val="auto"/>
+        </w:rPr>
+      </w:pPr>
+      <w:r>
+        <w:rPr>
+          <w:rFonts w:eastAsia="Times New Roman" w:cs="Times New Roman" w:ascii="Garamond" w:hAnsi="Garamond"/>
+          <w:color w:val="000000"/>
+          <w:kern w:val="0"/>
+          <w:sz w:val="36"/>
+          <w:szCs w:val="36"/>
+          <w:shd w:fill="auto" w:val="clear"/>
+          <w:lang w:val="en-US" w:eastAsia="zh-CN" w:bidi="hi-IN"/>
+        </w:rPr>
+        <w:t>Na lição Socorro e Concurso, Emmanuel se utiliza da passagem que narra a segunda multiplicação dos pães e peixes. Existe um ensinamento implícito nessa escolha, mas falaremos disso um pouco mais adiante.</w:t>
+      </w:r>
+    </w:p>
+    <w:p>
+      <w:pPr>
+        <w:pStyle w:val="Normal"/>
+        <w:jc w:val="both"/>
+        <w:rPr>
+          <w:color w:val="auto"/>
+        </w:rPr>
+      </w:pPr>
+      <w:r>
+        <w:rPr>
+          <w:color w:val="auto"/>
+        </w:rPr>
+      </w:r>
+    </w:p>
+    <w:p>
+      <w:pPr>
+        <w:pStyle w:val="Normal"/>
+        <w:jc w:val="both"/>
+        <w:rPr>
+          <w:color w:val="auto"/>
+        </w:rPr>
+      </w:pPr>
+      <w:r>
+        <w:rPr>
+          <w:rFonts w:eastAsia="Times New Roman" w:cs="Times New Roman" w:ascii="Garamond" w:hAnsi="Garamond"/>
+          <w:color w:val="000000"/>
+          <w:kern w:val="0"/>
+          <w:sz w:val="36"/>
+          <w:szCs w:val="36"/>
+          <w:shd w:fill="auto" w:val="clear"/>
+          <w:lang w:val="en-US" w:eastAsia="zh-CN" w:bidi="hi-IN"/>
+        </w:rPr>
+        <w:t>Emmanuel destaca que Jesus não pergunta aos discípulos de quantos pães eles precisariam para alimentar a multidão; Ele pergunta quantos pães eles tinham. Com essa pergunta, o Mestre deixa claro a necessidade de oferecermos algo de nossa parte quando solicitamos socorro. Nas duas multiplicações, Jesus alimentou milhares de pessoas, havendo inclusive sobras significativas. Entretanto, em ambas as ocasiões, Ele precisou das “migalhas” oferecidas pelos discípulos.</w:t>
+      </w:r>
+    </w:p>
+    <w:p>
+      <w:pPr>
+        <w:pStyle w:val="Normal"/>
+        <w:jc w:val="both"/>
+        <w:rPr>
+          <w:color w:val="auto"/>
+        </w:rPr>
+      </w:pPr>
+      <w:r>
+        <w:rPr>
+          <w:color w:val="auto"/>
+        </w:rPr>
+      </w:r>
+    </w:p>
+    <w:p>
+      <w:pPr>
+        <w:pStyle w:val="Normal"/>
+        <w:jc w:val="both"/>
+        <w:rPr>
+          <w:color w:val="auto"/>
+        </w:rPr>
+      </w:pPr>
+      <w:r>
+        <w:rPr>
+          <w:rFonts w:eastAsia="Times New Roman" w:cs="Times New Roman" w:ascii="Garamond" w:hAnsi="Garamond"/>
+          <w:color w:val="000000"/>
+          <w:kern w:val="0"/>
+          <w:sz w:val="36"/>
+          <w:szCs w:val="36"/>
+          <w:shd w:fill="auto" w:val="clear"/>
+          <w:lang w:val="en-US" w:eastAsia="zh-CN" w:bidi="hi-IN"/>
+        </w:rPr>
+        <w:t>Emmanuel traz esse ensinamento para o campo da oração e nos diz que não é justo solicitarmos o amparo do Mais Alto estendendo sempre as mãos vazias. De que adianta fazermos preces belas e comoventes se nada oferecemos em troca? Se desejamos ser merecedores da proteção e do auxílio dos Céus, é indispensável que apresentemos algo de nossa parte.</w:t>
+      </w:r>
+    </w:p>
+    <w:p>
+      <w:pPr>
+        <w:pStyle w:val="Normal"/>
+        <w:jc w:val="both"/>
+        <w:rPr>
+          <w:color w:val="auto"/>
+        </w:rPr>
+      </w:pPr>
+      <w:r>
+        <w:rPr>
+          <w:color w:val="auto"/>
+        </w:rPr>
+      </w:r>
+    </w:p>
+    <w:p>
+      <w:pPr>
+        <w:pStyle w:val="Normal"/>
+        <w:jc w:val="both"/>
+        <w:rPr>
+          <w:color w:val="auto"/>
+        </w:rPr>
+      </w:pPr>
+      <w:r>
+        <w:rPr>
+          <w:rFonts w:eastAsia="Times New Roman" w:cs="Times New Roman" w:ascii="Garamond" w:hAnsi="Garamond"/>
+          <w:color w:val="000000"/>
+          <w:kern w:val="0"/>
+          <w:sz w:val="36"/>
+          <w:szCs w:val="36"/>
+          <w:shd w:fill="auto" w:val="clear"/>
+          <w:lang w:val="en-US" w:eastAsia="zh-CN" w:bidi="hi-IN"/>
+        </w:rPr>
+        <w:t>Quase todos nós aqui presentes hoje, em pelo menos uma ocasião, já colocamos um nome na urna ou no livro de irradiação. Concordam comigo? Já pedimos à Espiritualidade desta Casa amparo para nós mesmos, para alguém que amamos ou até mesmo para um desconhecido. É uma prática comum. Muitas vezes a pessoa nem nos pede esse auxílio; somos nós que o oferecemos.</w:t>
+      </w:r>
+    </w:p>
+    <w:p>
+      <w:pPr>
+        <w:pStyle w:val="Normal"/>
+        <w:jc w:val="both"/>
+        <w:rPr>
+          <w:color w:val="auto"/>
+        </w:rPr>
+      </w:pPr>
+      <w:r>
+        <w:rPr>
+          <w:color w:val="auto"/>
+        </w:rPr>
+      </w:r>
+    </w:p>
+    <w:p>
+      <w:pPr>
+        <w:pStyle w:val="Normal"/>
+        <w:jc w:val="both"/>
+        <w:rPr>
+          <w:color w:val="auto"/>
+        </w:rPr>
+      </w:pPr>
+      <w:r>
+        <w:rPr>
+          <w:rFonts w:eastAsia="Times New Roman" w:cs="Times New Roman" w:ascii="Garamond" w:hAnsi="Garamond"/>
+          <w:color w:val="000000"/>
+          <w:kern w:val="0"/>
+          <w:sz w:val="36"/>
+          <w:szCs w:val="36"/>
+          <w:shd w:fill="auto" w:val="clear"/>
+          <w:lang w:val="en-US" w:eastAsia="zh-CN" w:bidi="hi-IN"/>
+        </w:rPr>
+        <w:t>Alguém comenta conosco que tem um familiar internado em estado grave, e logo dizemos: “Passe o nome completo e o endereço do hospital que eu vou levar lá no Glacus”. É uma atitude bonita, porque revela nossa vontade de ajudar. Mas será que, a cada pedido que fazemos, também oferecemos algo em troca? Ou será que apenas acrescentamos trabalho à Espiritualidade?</w:t>
+      </w:r>
+    </w:p>
+    <w:p>
+      <w:pPr>
+        <w:pStyle w:val="Normal"/>
+        <w:jc w:val="both"/>
+        <w:rPr>
+          <w:color w:val="auto"/>
+        </w:rPr>
+      </w:pPr>
+      <w:r>
+        <w:rPr>
+          <w:color w:val="auto"/>
+        </w:rPr>
+      </w:r>
+    </w:p>
+    <w:p>
+      <w:pPr>
+        <w:pStyle w:val="Normal"/>
+        <w:jc w:val="both"/>
+        <w:rPr>
+          <w:color w:val="auto"/>
+        </w:rPr>
+      </w:pPr>
+      <w:r>
+        <w:rPr>
+          <w:rFonts w:eastAsia="Times New Roman" w:cs="Times New Roman" w:ascii="Garamond" w:hAnsi="Garamond"/>
+          <w:color w:val="000000"/>
+          <w:kern w:val="0"/>
+          <w:sz w:val="36"/>
+          <w:szCs w:val="36"/>
+          <w:shd w:fill="auto" w:val="clear"/>
+          <w:lang w:val="en-US" w:eastAsia="zh-CN" w:bidi="hi-IN"/>
+        </w:rPr>
+        <w:t>É justamente para isso que Emmanuel chama nossa atenção. Não podemos agir de maneira injusta, pedindo sempre, sem nunca oferecer. Pedir é legítimo, confiar é necessário, mas agir no bem é indispensável para que o pedido encontre resposta útil e educativa.</w:t>
+      </w:r>
+    </w:p>
+    <w:p>
+      <w:pPr>
+        <w:pStyle w:val="Normal"/>
+        <w:jc w:val="both"/>
+        <w:rPr>
+          <w:color w:val="auto"/>
+        </w:rPr>
+      </w:pPr>
+      <w:r>
+        <w:rPr>
+          <w:color w:val="auto"/>
+        </w:rPr>
+      </w:r>
+    </w:p>
+    <w:p>
+      <w:pPr>
+        <w:pStyle w:val="Normal"/>
+        <w:jc w:val="both"/>
+        <w:rPr>
+          <w:color w:val="auto"/>
+        </w:rPr>
+      </w:pPr>
+      <w:r>
+        <w:rPr>
+          <w:rFonts w:eastAsia="Times New Roman" w:cs="Times New Roman" w:ascii="Garamond" w:hAnsi="Garamond"/>
+          <w:color w:val="000000"/>
+          <w:kern w:val="0"/>
+          <w:sz w:val="36"/>
+          <w:szCs w:val="36"/>
+          <w:shd w:fill="auto" w:val="clear"/>
+          <w:lang w:val="en-US" w:eastAsia="zh-CN" w:bidi="hi-IN"/>
+        </w:rPr>
+        <w:t>E quando falamos em agir no bem, não estamos nos referindo apenas a uma tarefa aqui na Casa de Glacus. Se pudermos abraçar uma ou mais das inúmeras tarefas abençoadas que esta Casa nos oferece, melhor ainda. Mas, se no momento isso não for possível, façamos o bem com o tempo e os recursos que temos à disposição. Não importa onde, nem a quem. Importa, sim, trabalhar no bem, porque assim — e somente assim — nossas orações ganharão força para serem ouvidas e respondidas pelos planos mais altos da vida.</w:t>
+      </w:r>
+    </w:p>
+    <w:p>
+      <w:pPr>
+        <w:pStyle w:val="Normal"/>
+        <w:jc w:val="both"/>
+        <w:rPr>
+          <w:color w:val="auto"/>
+        </w:rPr>
+      </w:pPr>
+      <w:r>
+        <w:rPr>
+          <w:color w:val="auto"/>
+        </w:rPr>
+      </w:r>
+    </w:p>
+    <w:p>
+      <w:pPr>
+        <w:pStyle w:val="Normal"/>
+        <w:jc w:val="both"/>
+        <w:rPr>
+          <w:color w:val="auto"/>
+        </w:rPr>
+      </w:pPr>
+      <w:r>
+        <w:rPr>
+          <w:rFonts w:eastAsia="Times New Roman" w:cs="Times New Roman" w:ascii="Garamond" w:hAnsi="Garamond"/>
+          <w:color w:val="000000"/>
+          <w:kern w:val="0"/>
+          <w:sz w:val="36"/>
+          <w:szCs w:val="36"/>
+          <w:shd w:fill="auto" w:val="clear"/>
+          <w:lang w:val="en-US" w:eastAsia="zh-CN" w:bidi="hi-IN"/>
+        </w:rPr>
+        <w:t>Eu disse anteriormente que há um ensinamento implícito na escolha de Emmanuel ao utilizar a passagem da segunda multiplicação dos pães. Vamos identificá-lo.</w:t>
+      </w:r>
+    </w:p>
+    <w:p>
+      <w:pPr>
+        <w:pStyle w:val="Normal"/>
+        <w:jc w:val="both"/>
+        <w:rPr>
+          <w:color w:val="auto"/>
+        </w:rPr>
+      </w:pPr>
+      <w:r>
+        <w:rPr>
+          <w:color w:val="auto"/>
+        </w:rPr>
+      </w:r>
+    </w:p>
+    <w:p>
+      <w:pPr>
+        <w:pStyle w:val="Normal"/>
+        <w:jc w:val="both"/>
+        <w:rPr>
+          <w:color w:val="auto"/>
+        </w:rPr>
+      </w:pPr>
+      <w:r>
+        <w:rPr>
+          <w:rFonts w:eastAsia="Times New Roman" w:cs="Times New Roman" w:ascii="Garamond" w:hAnsi="Garamond"/>
+          <w:color w:val="000000"/>
+          <w:kern w:val="0"/>
+          <w:sz w:val="36"/>
+          <w:szCs w:val="36"/>
+          <w:shd w:fill="auto" w:val="clear"/>
+          <w:lang w:val="en-US" w:eastAsia="zh-CN" w:bidi="hi-IN"/>
+        </w:rPr>
+        <w:t>Em Marcos 8:14–21, logo após a segunda multiplicação, Jesus entra no barco com os discípulos para atravessar o mar da Galileia. No meio da travessia, eles demonstram preocupação por terem levado apenas um pão. Jesus os adverte a se guardarem do fermento dos fariseus e de Herodes, mas eles interpretam suas palavras apenas no sentido material, pensando na falta de alimento.</w:t>
+      </w:r>
+    </w:p>
+    <w:p>
+      <w:pPr>
+        <w:pStyle w:val="Normal"/>
+        <w:jc w:val="both"/>
+        <w:rPr>
+          <w:color w:val="auto"/>
+        </w:rPr>
+      </w:pPr>
+      <w:r>
+        <w:rPr>
+          <w:color w:val="auto"/>
+        </w:rPr>
+      </w:r>
+    </w:p>
+    <w:p>
+      <w:pPr>
+        <w:pStyle w:val="Normal"/>
+        <w:jc w:val="both"/>
+        <w:rPr>
+          <w:color w:val="auto"/>
+        </w:rPr>
+      </w:pPr>
+      <w:r>
+        <w:rPr>
+          <w:rFonts w:eastAsia="Times New Roman" w:cs="Times New Roman" w:ascii="Garamond" w:hAnsi="Garamond"/>
+          <w:color w:val="000000"/>
+          <w:kern w:val="0"/>
+          <w:sz w:val="36"/>
+          <w:szCs w:val="36"/>
+          <w:shd w:fill="auto" w:val="clear"/>
+          <w:lang w:val="en-US" w:eastAsia="zh-CN" w:bidi="hi-IN"/>
+        </w:rPr>
+        <w:t>Jesus então pergunta: quantos cestos sobraram na primeira multiplicação? Eles respondem: doze. E quantos cestos sobraram na segunda? Eles dizem: sete. Então Jesus os adverte: “Têm olhos e não veem? Têm ouvidos e não ouvem? Depois de tudo o que foi feito, ainda não compreendeis?”</w:t>
+      </w:r>
+    </w:p>
+    <w:p>
+      <w:pPr>
+        <w:pStyle w:val="Normal"/>
+        <w:jc w:val="both"/>
+        <w:rPr>
+          <w:color w:val="auto"/>
+        </w:rPr>
+      </w:pPr>
+      <w:r>
+        <w:rPr>
+          <w:color w:val="auto"/>
+        </w:rPr>
+      </w:r>
+    </w:p>
+    <w:p>
+      <w:pPr>
+        <w:pStyle w:val="Normal"/>
+        <w:jc w:val="both"/>
+        <w:rPr>
+          <w:color w:val="auto"/>
+        </w:rPr>
+      </w:pPr>
+      <w:r>
+        <w:rPr>
+          <w:rFonts w:eastAsia="Times New Roman" w:cs="Times New Roman" w:ascii="Garamond" w:hAnsi="Garamond"/>
+          <w:color w:val="000000"/>
+          <w:kern w:val="0"/>
+          <w:sz w:val="36"/>
+          <w:szCs w:val="36"/>
+          <w:shd w:fill="auto" w:val="clear"/>
+          <w:lang w:val="en-US" w:eastAsia="zh-CN" w:bidi="hi-IN"/>
+        </w:rPr>
+        <w:t>Com isso, Jesus mostra que, apesar das experiências vividas, os discípulos ainda não haviam adquirido plena confiança no Mestre.</w:t>
+      </w:r>
+    </w:p>
+    <w:p>
+      <w:pPr>
+        <w:pStyle w:val="Normal"/>
+        <w:jc w:val="both"/>
+        <w:rPr>
+          <w:color w:val="auto"/>
+        </w:rPr>
+      </w:pPr>
+      <w:r>
+        <w:rPr>
+          <w:color w:val="auto"/>
+        </w:rPr>
+      </w:r>
+    </w:p>
+    <w:p>
+      <w:pPr>
+        <w:pStyle w:val="Normal"/>
+        <w:jc w:val="both"/>
+        <w:rPr>
+          <w:color w:val="auto"/>
+        </w:rPr>
+      </w:pPr>
+      <w:r>
+        <w:rPr>
+          <w:rFonts w:eastAsia="Times New Roman" w:cs="Times New Roman" w:ascii="Garamond" w:hAnsi="Garamond"/>
+          <w:color w:val="000000"/>
+          <w:kern w:val="0"/>
+          <w:sz w:val="36"/>
+          <w:szCs w:val="36"/>
+          <w:shd w:fill="auto" w:val="clear"/>
+          <w:lang w:val="en-US" w:eastAsia="zh-CN" w:bidi="hi-IN"/>
+        </w:rPr>
+        <w:t>Aqui entra, com muita clareza, o ensinamento de Emmanuel: nós também, apesar de já termos recebido inúmeras provas do amor e da misericórdia de Jesus em resposta às nossas rogativas, ainda não confiamos plenamente no Mestre.</w:t>
+      </w:r>
+    </w:p>
+    <w:p>
+      <w:pPr>
+        <w:pStyle w:val="Normal"/>
+        <w:jc w:val="both"/>
+        <w:rPr>
+          <w:rFonts w:ascii="Garamond" w:hAnsi="Garamond" w:eastAsia="Times New Roman" w:cs="Times New Roman"/>
+          <w:kern w:val="0"/>
+          <w:sz w:val="36"/>
+          <w:szCs w:val="36"/>
+          <w:shd w:fill="auto" w:val="clear"/>
+          <w:lang w:val="en-US" w:eastAsia="zh-CN" w:bidi="hi-IN"/>
+        </w:rPr>
+      </w:pPr>
+      <w:r>
+        <w:rPr>
+          <w:rFonts w:eastAsia="Times New Roman" w:cs="Times New Roman" w:ascii="Garamond" w:hAnsi="Garamond"/>
+          <w:kern w:val="0"/>
+          <w:sz w:val="36"/>
+          <w:szCs w:val="36"/>
+          <w:shd w:fill="auto" w:val="clear"/>
+          <w:lang w:val="en-US" w:eastAsia="zh-CN" w:bidi="hi-IN"/>
+        </w:rPr>
+      </w:r>
+    </w:p>
+    <w:p>
+      <w:pPr>
+        <w:pStyle w:val="Normal"/>
+        <w:jc w:val="both"/>
+        <w:rPr>
+          <w:color w:val="auto"/>
+        </w:rPr>
+      </w:pPr>
+      <w:r>
+        <w:rPr>
+          <w:rFonts w:eastAsia="Times New Roman" w:cs="Times New Roman" w:ascii="Garamond" w:hAnsi="Garamond"/>
+          <w:color w:val="000000"/>
+          <w:kern w:val="0"/>
+          <w:sz w:val="36"/>
+          <w:szCs w:val="36"/>
+          <w:shd w:fill="auto" w:val="clear"/>
+          <w:lang w:val="en-US" w:eastAsia="zh-CN" w:bidi="hi-IN"/>
+        </w:rPr>
+        <w:t>Jesus continua confiando em nós, mas espera que aprendamos com aquilo que já recebemos; não para pedir mais, e sim para confiar mais e trabalhar melhor.</w:t>
+      </w:r>
+    </w:p>
+    <w:p>
+      <w:pPr>
+        <w:pStyle w:val="Normal"/>
+        <w:jc w:val="both"/>
+        <w:rPr>
+          <w:color w:val="auto"/>
+        </w:rPr>
+      </w:pPr>
+      <w:r>
+        <w:rPr/>
+      </w:r>
+    </w:p>
+    <w:p>
+      <w:pPr>
+        <w:pStyle w:val="Normal"/>
+        <w:jc w:val="both"/>
+        <w:rPr>
+          <w:b/>
+          <w:b/>
+          <w:bCs/>
+          <w:color w:val="C9211E"/>
+        </w:rPr>
+      </w:pPr>
+      <w:r>
+        <w:rPr>
+          <w:rFonts w:eastAsia="Times New Roman" w:cs="Times New Roman" w:ascii="Garamond" w:hAnsi="Garamond"/>
+          <w:b/>
+          <w:bCs/>
+          <w:color w:val="C9211E"/>
+          <w:kern w:val="0"/>
+          <w:sz w:val="36"/>
+          <w:szCs w:val="36"/>
+          <w:shd w:fill="auto" w:val="clear"/>
+          <w:lang w:val="en-US" w:eastAsia="zh-CN" w:bidi="hi-IN"/>
+        </w:rPr>
+        <w:t>Continuar desenvolvendo o raciocínio a partir daqui.</w:t>
+      </w:r>
+    </w:p>
+    <w:p>
+      <w:pPr>
+        <w:pStyle w:val="Normal"/>
+        <w:jc w:val="both"/>
+        <w:rPr>
+          <w:color w:val="1C99E0"/>
+        </w:rPr>
+      </w:pPr>
+      <w:r>
+        <w:rPr>
+          <w:rFonts w:eastAsia="Times New Roman" w:cs="Times New Roman" w:ascii="Garamond" w:hAnsi="Garamond"/>
+          <w:color w:val="1C99E0"/>
+          <w:kern w:val="0"/>
+          <w:sz w:val="36"/>
+          <w:szCs w:val="36"/>
+          <w:shd w:fill="auto" w:val="clear"/>
+          <w:lang w:val="en-US" w:eastAsia="zh-CN" w:bidi="hi-IN"/>
+        </w:rPr>
+        <w:t>[ Término do parágrafo de ligação entre a oração e outros elementos do Pedi e obtereis ]</w:t>
+      </w:r>
+    </w:p>
+    <w:p>
+      <w:pPr>
+        <w:pStyle w:val="Normal"/>
+        <w:jc w:val="both"/>
+        <w:rPr>
+          <w:color w:val="1C99E0"/>
+        </w:rPr>
+      </w:pPr>
+      <w:r>
+        <w:rPr>
+          <w:color w:val="1C99E0"/>
+        </w:rPr>
+      </w:r>
+    </w:p>
+    <w:p>
+      <w:pPr>
+        <w:pStyle w:val="Normal"/>
+        <w:jc w:val="both"/>
+        <w:rPr>
+          <w:color w:val="1C99E0"/>
+        </w:rPr>
+      </w:pPr>
+      <w:r>
+        <w:rPr>
+          <w:rFonts w:eastAsia="Times New Roman" w:cs="Times New Roman" w:ascii="Garamond" w:hAnsi="Garamond"/>
+          <w:color w:val="1C99E0"/>
           <w:kern w:val="0"/>
           <w:sz w:val="36"/>
           <w:szCs w:val="36"/>
@@ -2216,317 +2801,7 @@
         </w:rPr>
       </w:pPr>
       <w:r>
-        <w:rPr>
-          <w:rFonts w:eastAsia="Times New Roman" w:cs="Times New Roman" w:ascii="Garamond" w:hAnsi="Garamond"/>
-          <w:color w:val="1C99E0"/>
-          <w:kern w:val="0"/>
-          <w:sz w:val="36"/>
-          <w:szCs w:val="36"/>
-          <w:shd w:fill="auto" w:val="clear"/>
-          <w:lang w:val="en-US" w:eastAsia="zh-CN" w:bidi="hi-IN"/>
-        </w:rPr>
-        <w:t>[ Início do tópico a ser utilizado como referência para explicar a propagação da oração ]</w:t>
-      </w:r>
-    </w:p>
-    <w:p>
-      <w:pPr>
-        <w:pStyle w:val="Normal"/>
-        <w:jc w:val="both"/>
-        <w:rPr>
-          <w:rFonts w:ascii="Garamond" w:hAnsi="Garamond" w:eastAsia="Times New Roman" w:cs="Times New Roman"/>
-          <w:color w:val="000000"/>
-          <w:kern w:val="0"/>
-          <w:sz w:val="36"/>
-          <w:szCs w:val="36"/>
-          <w:lang w:val="en-US" w:eastAsia="zh-CN" w:bidi="hi-IN"/>
-        </w:rPr>
-      </w:pPr>
-      <w:r>
-        <w:rPr>
-          <w:rFonts w:eastAsia="Times New Roman" w:cs="Times New Roman" w:ascii="Garamond" w:hAnsi="Garamond"/>
-          <w:color w:val="000000"/>
-          <w:kern w:val="0"/>
-          <w:sz w:val="36"/>
-          <w:szCs w:val="36"/>
-          <w:lang w:val="en-US" w:eastAsia="zh-CN" w:bidi="hi-IN"/>
-        </w:rPr>
-      </w:r>
-    </w:p>
-    <w:p>
-      <w:pPr>
-        <w:pStyle w:val="Normal"/>
-        <w:jc w:val="both"/>
-        <w:rPr>
-          <w:rFonts w:ascii="Garamond" w:hAnsi="Garamond" w:eastAsia="Times New Roman" w:cs="Times New Roman"/>
-          <w:color w:val="000000"/>
-          <w:kern w:val="0"/>
-          <w:sz w:val="36"/>
-          <w:szCs w:val="36"/>
-          <w:lang w:val="en-US" w:eastAsia="zh-CN" w:bidi="hi-IN"/>
-        </w:rPr>
-      </w:pPr>
-      <w:r>
-        <w:rPr>
-          <w:rFonts w:eastAsia="Times New Roman" w:cs="Times New Roman" w:ascii="Garamond" w:hAnsi="Garamond"/>
-          <w:color w:val="000000"/>
-          <w:kern w:val="0"/>
-          <w:sz w:val="36"/>
-          <w:szCs w:val="36"/>
-          <w:lang w:val="en-US" w:eastAsia="zh-CN" w:bidi="hi-IN"/>
-        </w:rPr>
-      </w:r>
-    </w:p>
-    <w:p>
-      <w:pPr>
-        <w:pStyle w:val="Normal"/>
-        <w:jc w:val="both"/>
-        <w:rPr>
-          <w:highlight w:val="none"/>
-          <w:shd w:fill="auto" w:val="clear"/>
-        </w:rPr>
-      </w:pPr>
-      <w:r>
-        <w:rPr>
-          <w:rFonts w:eastAsia="Times New Roman" w:cs="Times New Roman" w:ascii="Garamond" w:hAnsi="Garamond"/>
-          <w:color w:val="000000"/>
-          <w:kern w:val="0"/>
-          <w:sz w:val="36"/>
-          <w:szCs w:val="36"/>
-          <w:shd w:fill="auto" w:val="clear"/>
-          <w:lang w:val="en-US" w:eastAsia="zh-CN" w:bidi="hi-IN"/>
-        </w:rPr>
-        <w:t>O som, do ponto de vista da ciência, não é algo que se possa pegar ou ver, mas sim um tipo de vibração. Sempre que algo vibra — como as cordas vocais ao falar, uma corda de violão ao ser tocada ou mesmo as mãos ao bater palmas — essa vibração provoca um movimento no ar ao redor. É desse movimento que nasce o som. Sem vibração, não há som; e sem um meio como o ar, o som não consegue se propagar.</w:t>
-      </w:r>
-    </w:p>
-    <w:p>
-      <w:pPr>
-        <w:pStyle w:val="Normal"/>
-        <w:jc w:val="both"/>
-        <w:rPr>
-          <w:rFonts w:ascii="Garamond" w:hAnsi="Garamond" w:eastAsia="Times New Roman" w:cs="Times New Roman"/>
-          <w:color w:val="000000"/>
-          <w:kern w:val="0"/>
-          <w:sz w:val="36"/>
-          <w:szCs w:val="36"/>
-          <w:lang w:val="en-US" w:eastAsia="zh-CN" w:bidi="hi-IN"/>
-        </w:rPr>
-      </w:pPr>
-      <w:r>
-        <w:rPr>
-          <w:rFonts w:eastAsia="Times New Roman" w:cs="Times New Roman" w:ascii="Garamond" w:hAnsi="Garamond"/>
-          <w:color w:val="000000"/>
-          <w:kern w:val="0"/>
-          <w:sz w:val="36"/>
-          <w:szCs w:val="36"/>
-          <w:lang w:val="en-US" w:eastAsia="zh-CN" w:bidi="hi-IN"/>
-        </w:rPr>
-      </w:r>
-    </w:p>
-    <w:p>
-      <w:pPr>
-        <w:pStyle w:val="Normal"/>
-        <w:jc w:val="both"/>
-        <w:rPr>
-          <w:highlight w:val="none"/>
-          <w:shd w:fill="auto" w:val="clear"/>
-        </w:rPr>
-      </w:pPr>
-      <w:r>
-        <w:rPr>
-          <w:rFonts w:eastAsia="Times New Roman" w:cs="Times New Roman" w:ascii="Garamond" w:hAnsi="Garamond"/>
-          <w:color w:val="000000"/>
-          <w:kern w:val="0"/>
-          <w:sz w:val="36"/>
-          <w:szCs w:val="36"/>
-          <w:shd w:fill="auto" w:val="clear"/>
-          <w:lang w:val="en-US" w:eastAsia="zh-CN" w:bidi="hi-IN"/>
-        </w:rPr>
-        <w:t>O ar que nos envolve é formado por pequenas partículas invisíveis, chamadas moléculas. Quando uma fonte sonora vibra, ela empurra essas moléculas, aproximando-as umas das outras. Logo em seguida, ao retornar ao seu estado normal, cria um pequeno afastamento entre elas. Esse processo de aproximação e afastamento acontece repetidamente, formando uma espécie de “onda” que se espalha pelo ar. Cada molécula não sai do lugar, mas transmite o movimento à próxima, levando adiante a vibração sonora.</w:t>
-      </w:r>
-    </w:p>
-    <w:p>
-      <w:pPr>
-        <w:pStyle w:val="Normal"/>
-        <w:jc w:val="both"/>
-        <w:rPr>
-          <w:rFonts w:ascii="Garamond" w:hAnsi="Garamond" w:eastAsia="Times New Roman" w:cs="Times New Roman"/>
-          <w:color w:val="000000"/>
-          <w:kern w:val="0"/>
-          <w:sz w:val="36"/>
-          <w:szCs w:val="36"/>
-          <w:lang w:val="en-US" w:eastAsia="zh-CN" w:bidi="hi-IN"/>
-        </w:rPr>
-      </w:pPr>
-      <w:r>
-        <w:rPr>
-          <w:rFonts w:eastAsia="Times New Roman" w:cs="Times New Roman" w:ascii="Garamond" w:hAnsi="Garamond"/>
-          <w:color w:val="000000"/>
-          <w:kern w:val="0"/>
-          <w:sz w:val="36"/>
-          <w:szCs w:val="36"/>
-          <w:lang w:val="en-US" w:eastAsia="zh-CN" w:bidi="hi-IN"/>
-        </w:rPr>
-      </w:r>
-    </w:p>
-    <w:p>
-      <w:pPr>
-        <w:pStyle w:val="Normal"/>
-        <w:jc w:val="both"/>
-        <w:rPr>
-          <w:highlight w:val="none"/>
-          <w:shd w:fill="auto" w:val="clear"/>
-        </w:rPr>
-      </w:pPr>
-      <w:r>
-        <w:rPr>
-          <w:rFonts w:eastAsia="Times New Roman" w:cs="Times New Roman" w:ascii="Garamond" w:hAnsi="Garamond"/>
-          <w:color w:val="000000"/>
-          <w:kern w:val="0"/>
-          <w:sz w:val="36"/>
-          <w:szCs w:val="36"/>
-          <w:shd w:fill="auto" w:val="clear"/>
-          <w:lang w:val="en-US" w:eastAsia="zh-CN" w:bidi="hi-IN"/>
-        </w:rPr>
-        <w:t>A força do som depende de quanta energia é colocada nessa vibração inicial. Quando a vibração é fraca, o som é baixo e se perde rapidamente. Quando a vibração é mais intensa, o som se torna mais forte e consegue alcançar distâncias maiores. É por isso que um sussurro quase não ultrapassa alguns metros, enquanto um grito pode ser ouvido de muito longe. Não é apenas a voz em si que importa, mas a energia com que ela é emitida.</w:t>
-      </w:r>
-    </w:p>
-    <w:p>
-      <w:pPr>
-        <w:pStyle w:val="Normal"/>
-        <w:jc w:val="both"/>
-        <w:rPr>
-          <w:rFonts w:ascii="Garamond" w:hAnsi="Garamond" w:eastAsia="Times New Roman" w:cs="Times New Roman"/>
-          <w:color w:val="000000"/>
-          <w:kern w:val="0"/>
-          <w:sz w:val="36"/>
-          <w:szCs w:val="36"/>
-          <w:lang w:val="en-US" w:eastAsia="zh-CN" w:bidi="hi-IN"/>
-        </w:rPr>
-      </w:pPr>
-      <w:r>
-        <w:rPr>
-          <w:rFonts w:eastAsia="Times New Roman" w:cs="Times New Roman" w:ascii="Garamond" w:hAnsi="Garamond"/>
-          <w:color w:val="000000"/>
-          <w:kern w:val="0"/>
-          <w:sz w:val="36"/>
-          <w:szCs w:val="36"/>
-          <w:lang w:val="en-US" w:eastAsia="zh-CN" w:bidi="hi-IN"/>
-        </w:rPr>
-      </w:r>
-    </w:p>
-    <w:p>
-      <w:pPr>
-        <w:pStyle w:val="Normal"/>
-        <w:jc w:val="both"/>
-        <w:rPr>
-          <w:highlight w:val="none"/>
-          <w:shd w:fill="auto" w:val="clear"/>
-        </w:rPr>
-      </w:pPr>
-      <w:r>
-        <w:rPr>
-          <w:rFonts w:eastAsia="Times New Roman" w:cs="Times New Roman" w:ascii="Garamond" w:hAnsi="Garamond"/>
-          <w:color w:val="000000"/>
-          <w:kern w:val="0"/>
-          <w:sz w:val="36"/>
-          <w:szCs w:val="36"/>
-          <w:shd w:fill="auto" w:val="clear"/>
-          <w:lang w:val="en-US" w:eastAsia="zh-CN" w:bidi="hi-IN"/>
-        </w:rPr>
-        <w:t>À medida que o som se afasta da fonte que o produziu, ele vai se espalhando pelo ambiente. Com isso, sua força vai diminuindo pouco a pouco, pois a mesma energia passa a ocupar um espaço cada vez maior. Além disso, o som pode encontrar obstáculos pelo caminho, como paredes, objetos ou outros ruídos, que também contribuem para enfraquecê-lo. Mesmo assim, um som que nasce forte e bem sustentado consegue vencer melhor essas dificuldades.</w:t>
-      </w:r>
-    </w:p>
-    <w:p>
-      <w:pPr>
-        <w:pStyle w:val="Normal"/>
-        <w:jc w:val="both"/>
-        <w:rPr>
-          <w:rFonts w:ascii="Garamond" w:hAnsi="Garamond" w:eastAsia="Times New Roman" w:cs="Times New Roman"/>
-          <w:color w:val="000000"/>
-          <w:kern w:val="0"/>
-          <w:sz w:val="36"/>
-          <w:szCs w:val="36"/>
-          <w:lang w:val="en-US" w:eastAsia="zh-CN" w:bidi="hi-IN"/>
-        </w:rPr>
-      </w:pPr>
-      <w:r>
-        <w:rPr>
-          <w:rFonts w:eastAsia="Times New Roman" w:cs="Times New Roman" w:ascii="Garamond" w:hAnsi="Garamond"/>
-          <w:color w:val="000000"/>
-          <w:kern w:val="0"/>
-          <w:sz w:val="36"/>
-          <w:szCs w:val="36"/>
-          <w:lang w:val="en-US" w:eastAsia="zh-CN" w:bidi="hi-IN"/>
-        </w:rPr>
-      </w:r>
-    </w:p>
-    <w:p>
-      <w:pPr>
-        <w:pStyle w:val="Normal"/>
-        <w:jc w:val="both"/>
-        <w:rPr>
-          <w:highlight w:val="none"/>
-          <w:shd w:fill="auto" w:val="clear"/>
-        </w:rPr>
-      </w:pPr>
-      <w:r>
-        <w:rPr>
-          <w:rFonts w:eastAsia="Times New Roman" w:cs="Times New Roman" w:ascii="Garamond" w:hAnsi="Garamond"/>
-          <w:color w:val="000000"/>
-          <w:kern w:val="0"/>
-          <w:sz w:val="36"/>
-          <w:szCs w:val="36"/>
-          <w:shd w:fill="auto" w:val="clear"/>
-          <w:lang w:val="en-US" w:eastAsia="zh-CN" w:bidi="hi-IN"/>
-        </w:rPr>
-        <w:t>Assim, na ciência, o som só alcança grandes distâncias quando nasce de uma vibração firme, sustentada e carregada de energia. Um sussurro, mesmo correto em palavras, se dissipa rapidamente. Assim também ocorre com o pensamento e a oração. Não é o volume das palavras que determina o alcance, mas a energia espiritual que nelas colocamos: a fé viva, a vontade firme e o sentimento sincero.</w:t>
-      </w:r>
-    </w:p>
-    <w:p>
-      <w:pPr>
-        <w:pStyle w:val="Normal"/>
-        <w:jc w:val="both"/>
-        <w:rPr>
-          <w:rFonts w:ascii="Garamond" w:hAnsi="Garamond" w:eastAsia="Times New Roman" w:cs="Times New Roman"/>
-          <w:color w:val="000000"/>
-          <w:kern w:val="0"/>
-          <w:sz w:val="36"/>
-          <w:szCs w:val="36"/>
-          <w:lang w:val="en-US" w:eastAsia="zh-CN" w:bidi="hi-IN"/>
-        </w:rPr>
-      </w:pPr>
-      <w:r>
-        <w:rPr>
-          <w:rFonts w:eastAsia="Times New Roman" w:cs="Times New Roman" w:ascii="Garamond" w:hAnsi="Garamond"/>
-          <w:color w:val="000000"/>
-          <w:kern w:val="0"/>
-          <w:sz w:val="36"/>
-          <w:szCs w:val="36"/>
-          <w:lang w:val="en-US" w:eastAsia="zh-CN" w:bidi="hi-IN"/>
-        </w:rPr>
-      </w:r>
-    </w:p>
-    <w:p>
-      <w:pPr>
-        <w:pStyle w:val="Normal"/>
-        <w:jc w:val="both"/>
-        <w:rPr>
-          <w:color w:val="1C99E0"/>
-          <w:highlight w:val="none"/>
-          <w:shd w:fill="auto" w:val="clear"/>
-        </w:rPr>
-      </w:pPr>
-      <w:r>
-        <w:rPr>
-          <w:rFonts w:eastAsia="Times New Roman" w:cs="Times New Roman" w:ascii="Garamond" w:hAnsi="Garamond"/>
-          <w:color w:val="1C99E0"/>
-          <w:kern w:val="0"/>
-          <w:sz w:val="36"/>
-          <w:szCs w:val="36"/>
-          <w:shd w:fill="auto" w:val="clear"/>
-          <w:lang w:val="en-US" w:eastAsia="zh-CN" w:bidi="hi-IN"/>
-        </w:rPr>
-        <w:t>[ Término do tópico a ser utilizado como referência para explicar a propagação da oração ]</w:t>
+        <w:rPr/>
       </w:r>
     </w:p>
     <w:p>
@@ -2568,29 +2843,6 @@
           <w:shd w:fill="auto" w:val="clear"/>
           <w:lang w:val="en-US" w:eastAsia="zh-CN" w:bidi="hi-IN"/>
         </w:rPr>
-        <w:t>falar sobre prece refratária (identificar obra de André Luiz);</w:t>
-      </w:r>
-    </w:p>
-    <w:p>
-      <w:pPr>
-        <w:pStyle w:val="Normal"/>
-        <w:numPr>
-          <w:ilvl w:val="0"/>
-          <w:numId w:val="1"/>
-        </w:numPr>
-        <w:jc w:val="both"/>
-        <w:rPr/>
-      </w:pPr>
-      <w:r>
-        <w:rPr>
-          <w:rFonts w:eastAsia="Times New Roman" w:cs="Times New Roman" w:ascii="Garamond" w:hAnsi="Garamond"/>
-          <w:color w:val="000000"/>
-          <w:kern w:val="0"/>
-          <w:sz w:val="36"/>
-          <w:szCs w:val="36"/>
-          <w:shd w:fill="auto" w:val="clear"/>
-          <w:lang w:val="en-US" w:eastAsia="zh-CN" w:bidi="hi-IN"/>
-        </w:rPr>
         <w:t>os fluidos espirituais, que constituem um dos estados do fluido cósmico universal, são a atmosfera dos seres espirituais. O fluido espiritual é o veículo do pensamento, assim como o ar é o veículo do som.</w:t>
       </w:r>
     </w:p>
@@ -2618,694 +2870,6 @@
           <w:szCs w:val="36"/>
           <w:shd w:fill="auto" w:val="clear"/>
           <w:lang w:val="en-US" w:eastAsia="zh-CN" w:bidi="hi-IN"/>
-        </w:rPr>
-      </w:r>
-    </w:p>
-    <w:p>
-      <w:pPr>
-        <w:pStyle w:val="Normal"/>
-        <w:jc w:val="both"/>
-        <w:rPr>
-          <w:color w:val="1C99E0"/>
-          <w:highlight w:val="none"/>
-          <w:shd w:fill="auto" w:val="clear"/>
-        </w:rPr>
-      </w:pPr>
-      <w:r>
-        <w:rPr>
-          <w:rFonts w:eastAsia="Times New Roman" w:cs="Times New Roman" w:ascii="Garamond" w:hAnsi="Garamond"/>
-          <w:color w:val="1C99E0"/>
-          <w:kern w:val="0"/>
-          <w:sz w:val="36"/>
-          <w:szCs w:val="36"/>
-          <w:shd w:fill="auto" w:val="clear"/>
-          <w:lang w:val="en-US" w:eastAsia="zh-CN" w:bidi="hi-IN"/>
-        </w:rPr>
-        <w:t>[ Início do bloco que usa a lição Socorro e Concurso ]</w:t>
-      </w:r>
-    </w:p>
-    <w:p>
-      <w:pPr>
-        <w:pStyle w:val="Normal"/>
-        <w:jc w:val="both"/>
-        <w:rPr>
-          <w:color w:val="1C99E0"/>
-          <w:highlight w:val="none"/>
-          <w:shd w:fill="auto" w:val="clear"/>
-        </w:rPr>
-      </w:pPr>
-      <w:r>
-        <w:rPr>
-          <w:color w:val="1C99E0"/>
-          <w:shd w:fill="auto" w:val="clear"/>
-        </w:rPr>
-      </w:r>
-    </w:p>
-    <w:p>
-      <w:pPr>
-        <w:pStyle w:val="Normal"/>
-        <w:jc w:val="both"/>
-        <w:rPr>
-          <w:color w:val="auto"/>
-        </w:rPr>
-      </w:pPr>
-      <w:r>
-        <w:rPr>
-          <w:rFonts w:eastAsia="Times New Roman" w:cs="Times New Roman" w:ascii="Garamond" w:hAnsi="Garamond"/>
-          <w:color w:val="000000"/>
-          <w:kern w:val="0"/>
-          <w:sz w:val="36"/>
-          <w:szCs w:val="36"/>
-          <w:shd w:fill="auto" w:val="clear"/>
-          <w:lang w:val="en-US" w:eastAsia="zh-CN" w:bidi="hi-IN"/>
-        </w:rPr>
-        <w:t>Emmanuel, na obra Palavras de Vida Eterna, lição número 9 — Socorro e Concurso — aborda uma questão cuja compreensão é de grande importância para todos nós.</w:t>
-      </w:r>
-    </w:p>
-    <w:p>
-      <w:pPr>
-        <w:pStyle w:val="Normal"/>
-        <w:jc w:val="both"/>
-        <w:rPr>
-          <w:color w:val="auto"/>
-        </w:rPr>
-      </w:pPr>
-      <w:r>
-        <w:rPr>
-          <w:color w:val="auto"/>
-        </w:rPr>
-      </w:r>
-    </w:p>
-    <w:p>
-      <w:pPr>
-        <w:pStyle w:val="Normal"/>
-        <w:jc w:val="both"/>
-        <w:rPr>
-          <w:color w:val="auto"/>
-        </w:rPr>
-      </w:pPr>
-      <w:r>
-        <w:rPr>
-          <w:rFonts w:eastAsia="Times New Roman" w:cs="Times New Roman" w:ascii="Garamond" w:hAnsi="Garamond"/>
-          <w:color w:val="000000"/>
-          <w:kern w:val="0"/>
-          <w:sz w:val="36"/>
-          <w:szCs w:val="36"/>
-          <w:shd w:fill="auto" w:val="clear"/>
-          <w:lang w:val="en-US" w:eastAsia="zh-CN" w:bidi="hi-IN"/>
-        </w:rPr>
-        <w:t>Jesus realizou duas multiplicações de pães e peixes.</w:t>
-      </w:r>
-    </w:p>
-    <w:p>
-      <w:pPr>
-        <w:pStyle w:val="Normal"/>
-        <w:jc w:val="both"/>
-        <w:rPr>
-          <w:color w:val="auto"/>
-        </w:rPr>
-      </w:pPr>
-      <w:r>
-        <w:rPr>
-          <w:color w:val="auto"/>
-        </w:rPr>
-      </w:r>
-    </w:p>
-    <w:p>
-      <w:pPr>
-        <w:pStyle w:val="Normal"/>
-        <w:jc w:val="both"/>
-        <w:rPr>
-          <w:color w:val="auto"/>
-        </w:rPr>
-      </w:pPr>
-      <w:r>
-        <w:rPr>
-          <w:rFonts w:eastAsia="Times New Roman" w:cs="Times New Roman" w:ascii="Garamond" w:hAnsi="Garamond"/>
-          <w:color w:val="000000"/>
-          <w:kern w:val="0"/>
-          <w:sz w:val="36"/>
-          <w:szCs w:val="36"/>
-          <w:shd w:fill="auto" w:val="clear"/>
-          <w:lang w:val="en-US" w:eastAsia="zh-CN" w:bidi="hi-IN"/>
-        </w:rPr>
-        <w:t>A primeira está narrada nos quatro Evangelhos — Mateus, Marcos, Lucas e João. Nela, os discípulos dispunham de cinco pães e dois peixes. Jesus os multiplica de tal forma que são alimentados cinco mil homens, sem contar mulheres e crianças, e com as sobras enchem-se doze cestos de vime.</w:t>
-      </w:r>
-    </w:p>
-    <w:p>
-      <w:pPr>
-        <w:pStyle w:val="Normal"/>
-        <w:jc w:val="both"/>
-        <w:rPr>
-          <w:color w:val="auto"/>
-        </w:rPr>
-      </w:pPr>
-      <w:r>
-        <w:rPr>
-          <w:color w:val="auto"/>
-        </w:rPr>
-      </w:r>
-    </w:p>
-    <w:p>
-      <w:pPr>
-        <w:pStyle w:val="Normal"/>
-        <w:jc w:val="both"/>
-        <w:rPr>
-          <w:color w:val="auto"/>
-        </w:rPr>
-      </w:pPr>
-      <w:r>
-        <w:rPr>
-          <w:rFonts w:eastAsia="Times New Roman" w:cs="Times New Roman" w:ascii="Garamond" w:hAnsi="Garamond"/>
-          <w:color w:val="000000"/>
-          <w:kern w:val="0"/>
-          <w:sz w:val="36"/>
-          <w:szCs w:val="36"/>
-          <w:shd w:fill="auto" w:val="clear"/>
-          <w:lang w:val="en-US" w:eastAsia="zh-CN" w:bidi="hi-IN"/>
-        </w:rPr>
-        <w:t>A segunda multiplicação está narrada apenas nos Evangelhos de Mateus e Marcos. Nessa ocasião, os discípulos tinham sete pães e alguns peixinhos, conforme está registrado. Após a multiplicação, foram alimentados quatro mil homens, além de mulheres e crianças, e sete cestos foram preenchidos com as sobras.</w:t>
-      </w:r>
-    </w:p>
-    <w:p>
-      <w:pPr>
-        <w:pStyle w:val="Normal"/>
-        <w:jc w:val="both"/>
-        <w:rPr>
-          <w:color w:val="auto"/>
-        </w:rPr>
-      </w:pPr>
-      <w:r>
-        <w:rPr>
-          <w:color w:val="auto"/>
-        </w:rPr>
-      </w:r>
-    </w:p>
-    <w:p>
-      <w:pPr>
-        <w:pStyle w:val="Normal"/>
-        <w:jc w:val="both"/>
-        <w:rPr>
-          <w:color w:val="auto"/>
-        </w:rPr>
-      </w:pPr>
-      <w:r>
-        <w:rPr>
-          <w:rFonts w:eastAsia="Times New Roman" w:cs="Times New Roman" w:ascii="Garamond" w:hAnsi="Garamond"/>
-          <w:color w:val="000000"/>
-          <w:kern w:val="0"/>
-          <w:sz w:val="36"/>
-          <w:szCs w:val="36"/>
-          <w:shd w:fill="auto" w:val="clear"/>
-          <w:lang w:val="en-US" w:eastAsia="zh-CN" w:bidi="hi-IN"/>
-        </w:rPr>
-        <w:t>Na lição Socorro e Concurso, Emmanuel se utiliza da passagem que narra a segunda multiplicação dos pães e peixes. Existe um ensinamento implícito nessa escolha, mas falaremos disso um pouco mais adiante.</w:t>
-      </w:r>
-    </w:p>
-    <w:p>
-      <w:pPr>
-        <w:pStyle w:val="Normal"/>
-        <w:jc w:val="both"/>
-        <w:rPr>
-          <w:color w:val="auto"/>
-        </w:rPr>
-      </w:pPr>
-      <w:r>
-        <w:rPr>
-          <w:color w:val="auto"/>
-        </w:rPr>
-      </w:r>
-    </w:p>
-    <w:p>
-      <w:pPr>
-        <w:pStyle w:val="Normal"/>
-        <w:jc w:val="both"/>
-        <w:rPr>
-          <w:color w:val="auto"/>
-        </w:rPr>
-      </w:pPr>
-      <w:r>
-        <w:rPr>
-          <w:rFonts w:eastAsia="Times New Roman" w:cs="Times New Roman" w:ascii="Garamond" w:hAnsi="Garamond"/>
-          <w:color w:val="000000"/>
-          <w:kern w:val="0"/>
-          <w:sz w:val="36"/>
-          <w:szCs w:val="36"/>
-          <w:shd w:fill="auto" w:val="clear"/>
-          <w:lang w:val="en-US" w:eastAsia="zh-CN" w:bidi="hi-IN"/>
-        </w:rPr>
-        <w:t>Emmanuel destaca que Jesus não pergunta aos discípulos de quantos pães eles precisariam para alimentar a multidão; Ele pergunta quantos pães eles tinham. Com essa pergunta, o Mestre deixa claro a necessidade de oferecermos algo de nossa parte quando solicitamos socorro. Nas duas multiplicações, Jesus alimentou milhares de pessoas, havendo inclusive sobras significativas. Entretanto, em ambas as ocasiões, Ele precisou das “migalhas” oferecidas pelos discípulos.</w:t>
-      </w:r>
-    </w:p>
-    <w:p>
-      <w:pPr>
-        <w:pStyle w:val="Normal"/>
-        <w:jc w:val="both"/>
-        <w:rPr>
-          <w:color w:val="auto"/>
-        </w:rPr>
-      </w:pPr>
-      <w:r>
-        <w:rPr>
-          <w:color w:val="auto"/>
-        </w:rPr>
-      </w:r>
-    </w:p>
-    <w:p>
-      <w:pPr>
-        <w:pStyle w:val="Normal"/>
-        <w:jc w:val="both"/>
-        <w:rPr>
-          <w:color w:val="auto"/>
-        </w:rPr>
-      </w:pPr>
-      <w:r>
-        <w:rPr>
-          <w:rFonts w:eastAsia="Times New Roman" w:cs="Times New Roman" w:ascii="Garamond" w:hAnsi="Garamond"/>
-          <w:color w:val="000000"/>
-          <w:kern w:val="0"/>
-          <w:sz w:val="36"/>
-          <w:szCs w:val="36"/>
-          <w:shd w:fill="auto" w:val="clear"/>
-          <w:lang w:val="en-US" w:eastAsia="zh-CN" w:bidi="hi-IN"/>
-        </w:rPr>
-        <w:t>Emmanuel traz esse ensinamento para o campo da oração e nos diz que não é justo solicitarmos o amparo do Mais Alto estendendo sempre as mãos vazias. De que adianta fazermos preces belas e comoventes se nada oferecemos em troca? Se desejamos ser merecedores da proteção e do auxílio dos Céus, é indispensável que apresentemos algo de nossa parte.</w:t>
-      </w:r>
-    </w:p>
-    <w:p>
-      <w:pPr>
-        <w:pStyle w:val="Normal"/>
-        <w:jc w:val="both"/>
-        <w:rPr>
-          <w:color w:val="auto"/>
-        </w:rPr>
-      </w:pPr>
-      <w:r>
-        <w:rPr>
-          <w:color w:val="auto"/>
-        </w:rPr>
-      </w:r>
-    </w:p>
-    <w:p>
-      <w:pPr>
-        <w:pStyle w:val="Normal"/>
-        <w:jc w:val="both"/>
-        <w:rPr>
-          <w:color w:val="auto"/>
-        </w:rPr>
-      </w:pPr>
-      <w:r>
-        <w:rPr>
-          <w:rFonts w:eastAsia="Times New Roman" w:cs="Times New Roman" w:ascii="Garamond" w:hAnsi="Garamond"/>
-          <w:color w:val="000000"/>
-          <w:kern w:val="0"/>
-          <w:sz w:val="36"/>
-          <w:szCs w:val="36"/>
-          <w:shd w:fill="auto" w:val="clear"/>
-          <w:lang w:val="en-US" w:eastAsia="zh-CN" w:bidi="hi-IN"/>
-        </w:rPr>
-        <w:t>Quase todos nós aqui presentes hoje, em pelo menos uma ocasião, já colocamos um nome na urna ou no livro de irradiação. Concordam comigo? Já pedimos à Espiritualidade desta Casa amparo para nós mesmos, para alguém que amamos ou até mesmo para um desconhecido. É uma prática comum. Muitas vezes a pessoa nem nos pede esse auxílio; somos nós que o oferecemos.</w:t>
-      </w:r>
-    </w:p>
-    <w:p>
-      <w:pPr>
-        <w:pStyle w:val="Normal"/>
-        <w:jc w:val="both"/>
-        <w:rPr>
-          <w:color w:val="auto"/>
-        </w:rPr>
-      </w:pPr>
-      <w:r>
-        <w:rPr>
-          <w:color w:val="auto"/>
-        </w:rPr>
-      </w:r>
-    </w:p>
-    <w:p>
-      <w:pPr>
-        <w:pStyle w:val="Normal"/>
-        <w:jc w:val="both"/>
-        <w:rPr>
-          <w:color w:val="auto"/>
-        </w:rPr>
-      </w:pPr>
-      <w:r>
-        <w:rPr>
-          <w:rFonts w:eastAsia="Times New Roman" w:cs="Times New Roman" w:ascii="Garamond" w:hAnsi="Garamond"/>
-          <w:color w:val="000000"/>
-          <w:kern w:val="0"/>
-          <w:sz w:val="36"/>
-          <w:szCs w:val="36"/>
-          <w:shd w:fill="auto" w:val="clear"/>
-          <w:lang w:val="en-US" w:eastAsia="zh-CN" w:bidi="hi-IN"/>
-        </w:rPr>
-        <w:t>Alguém comenta conosco que tem um familiar internado em estado grave, e logo dizemos: “Passe o nome completo e o endereço do hospital que eu vou levar lá no Glacus”. É uma atitude bonita, porque revela nossa vontade de ajudar. Mas será que, a cada pedido que fazemos, também oferecemos algo em troca? Ou será que apenas acrescentamos trabalho à Espiritualidade?</w:t>
-      </w:r>
-    </w:p>
-    <w:p>
-      <w:pPr>
-        <w:pStyle w:val="Normal"/>
-        <w:jc w:val="both"/>
-        <w:rPr>
-          <w:color w:val="auto"/>
-        </w:rPr>
-      </w:pPr>
-      <w:r>
-        <w:rPr>
-          <w:color w:val="auto"/>
-        </w:rPr>
-      </w:r>
-    </w:p>
-    <w:p>
-      <w:pPr>
-        <w:pStyle w:val="Normal"/>
-        <w:jc w:val="both"/>
-        <w:rPr>
-          <w:color w:val="auto"/>
-        </w:rPr>
-      </w:pPr>
-      <w:r>
-        <w:rPr>
-          <w:rFonts w:eastAsia="Times New Roman" w:cs="Times New Roman" w:ascii="Garamond" w:hAnsi="Garamond"/>
-          <w:color w:val="000000"/>
-          <w:kern w:val="0"/>
-          <w:sz w:val="36"/>
-          <w:szCs w:val="36"/>
-          <w:shd w:fill="auto" w:val="clear"/>
-          <w:lang w:val="en-US" w:eastAsia="zh-CN" w:bidi="hi-IN"/>
-        </w:rPr>
-        <w:t>É justamente para isso que Emmanuel chama nossa atenção. Não podemos agir de maneira injusta, pedindo sempre, sem nunca oferecer. Pedir é legítimo, confiar é necessário, mas agir no bem é indispensável para que o pedido encontre resposta útil e educativa.</w:t>
-      </w:r>
-    </w:p>
-    <w:p>
-      <w:pPr>
-        <w:pStyle w:val="Normal"/>
-        <w:jc w:val="both"/>
-        <w:rPr>
-          <w:color w:val="auto"/>
-        </w:rPr>
-      </w:pPr>
-      <w:r>
-        <w:rPr>
-          <w:color w:val="auto"/>
-        </w:rPr>
-      </w:r>
-    </w:p>
-    <w:p>
-      <w:pPr>
-        <w:pStyle w:val="Normal"/>
-        <w:jc w:val="both"/>
-        <w:rPr>
-          <w:color w:val="auto"/>
-        </w:rPr>
-      </w:pPr>
-      <w:r>
-        <w:rPr>
-          <w:rFonts w:eastAsia="Times New Roman" w:cs="Times New Roman" w:ascii="Garamond" w:hAnsi="Garamond"/>
-          <w:color w:val="000000"/>
-          <w:kern w:val="0"/>
-          <w:sz w:val="36"/>
-          <w:szCs w:val="36"/>
-          <w:shd w:fill="auto" w:val="clear"/>
-          <w:lang w:val="en-US" w:eastAsia="zh-CN" w:bidi="hi-IN"/>
-        </w:rPr>
-        <w:t>E quando falamos em agir no bem, não estamos nos referindo apenas a uma tarefa aqui na Casa de Glacus. Se pudermos abraçar uma ou mais das inúmeras tarefas abençoadas que esta Casa nos oferece, melhor ainda. Mas, se no momento isso não for possível, façamos o bem com o tempo e os recursos que temos à disposição. Não importa onde, nem a quem. Importa, sim, trabalhar no bem, porque assim — e somente assim — nossas orações ganharão força para serem ouvidas e respondidas pelos planos mais altos da vida.</w:t>
-      </w:r>
-    </w:p>
-    <w:p>
-      <w:pPr>
-        <w:pStyle w:val="Normal"/>
-        <w:jc w:val="both"/>
-        <w:rPr>
-          <w:color w:val="auto"/>
-        </w:rPr>
-      </w:pPr>
-      <w:r>
-        <w:rPr>
-          <w:color w:val="auto"/>
-        </w:rPr>
-      </w:r>
-    </w:p>
-    <w:p>
-      <w:pPr>
-        <w:pStyle w:val="Normal"/>
-        <w:jc w:val="both"/>
-        <w:rPr>
-          <w:color w:val="auto"/>
-        </w:rPr>
-      </w:pPr>
-      <w:r>
-        <w:rPr>
-          <w:rFonts w:eastAsia="Times New Roman" w:cs="Times New Roman" w:ascii="Garamond" w:hAnsi="Garamond"/>
-          <w:color w:val="000000"/>
-          <w:kern w:val="0"/>
-          <w:sz w:val="36"/>
-          <w:szCs w:val="36"/>
-          <w:shd w:fill="auto" w:val="clear"/>
-          <w:lang w:val="en-US" w:eastAsia="zh-CN" w:bidi="hi-IN"/>
-        </w:rPr>
-        <w:t>Eu disse anteriormente que há um ensinamento implícito na escolha de Emmanuel ao utilizar a passagem da segunda multiplicação dos pães. Vamos identificá-lo.</w:t>
-      </w:r>
-    </w:p>
-    <w:p>
-      <w:pPr>
-        <w:pStyle w:val="Normal"/>
-        <w:jc w:val="both"/>
-        <w:rPr>
-          <w:color w:val="auto"/>
-        </w:rPr>
-      </w:pPr>
-      <w:r>
-        <w:rPr>
-          <w:color w:val="auto"/>
-        </w:rPr>
-      </w:r>
-    </w:p>
-    <w:p>
-      <w:pPr>
-        <w:pStyle w:val="Normal"/>
-        <w:jc w:val="both"/>
-        <w:rPr>
-          <w:color w:val="auto"/>
-        </w:rPr>
-      </w:pPr>
-      <w:r>
-        <w:rPr>
-          <w:rFonts w:eastAsia="Times New Roman" w:cs="Times New Roman" w:ascii="Garamond" w:hAnsi="Garamond"/>
-          <w:color w:val="000000"/>
-          <w:kern w:val="0"/>
-          <w:sz w:val="36"/>
-          <w:szCs w:val="36"/>
-          <w:shd w:fill="auto" w:val="clear"/>
-          <w:lang w:val="en-US" w:eastAsia="zh-CN" w:bidi="hi-IN"/>
-        </w:rPr>
-        <w:t>Em Marcos 8:14–21, logo após a segunda multiplicação, Jesus entra no barco com os discípulos para atravessar o mar da Galileia. No meio da travessia, eles demonstram preocupação por terem levado apenas um pão. Jesus os adverte a se guardarem do fermento dos fariseus e de Herodes, mas eles interpretam suas palavras apenas no sentido material, pensando na falta de alimento.</w:t>
-      </w:r>
-    </w:p>
-    <w:p>
-      <w:pPr>
-        <w:pStyle w:val="Normal"/>
-        <w:jc w:val="both"/>
-        <w:rPr>
-          <w:color w:val="auto"/>
-        </w:rPr>
-      </w:pPr>
-      <w:r>
-        <w:rPr>
-          <w:color w:val="auto"/>
-        </w:rPr>
-      </w:r>
-    </w:p>
-    <w:p>
-      <w:pPr>
-        <w:pStyle w:val="Normal"/>
-        <w:jc w:val="both"/>
-        <w:rPr>
-          <w:color w:val="auto"/>
-        </w:rPr>
-      </w:pPr>
-      <w:r>
-        <w:rPr>
-          <w:rFonts w:eastAsia="Times New Roman" w:cs="Times New Roman" w:ascii="Garamond" w:hAnsi="Garamond"/>
-          <w:color w:val="000000"/>
-          <w:kern w:val="0"/>
-          <w:sz w:val="36"/>
-          <w:szCs w:val="36"/>
-          <w:shd w:fill="auto" w:val="clear"/>
-          <w:lang w:val="en-US" w:eastAsia="zh-CN" w:bidi="hi-IN"/>
-        </w:rPr>
-        <w:t>Jesus então pergunta: quantos cestos sobraram na primeira multiplicação? Eles respondem: doze. E quantos cestos sobraram na segunda? Eles dizem: sete. Então Jesus os adverte: “Têm olhos e não veem? Têm ouvidos e não ouvem? Depois de tudo o que foi feito, ainda não compreendeis?”</w:t>
-      </w:r>
-    </w:p>
-    <w:p>
-      <w:pPr>
-        <w:pStyle w:val="Normal"/>
-        <w:jc w:val="both"/>
-        <w:rPr>
-          <w:color w:val="auto"/>
-        </w:rPr>
-      </w:pPr>
-      <w:r>
-        <w:rPr>
-          <w:color w:val="auto"/>
-        </w:rPr>
-      </w:r>
-    </w:p>
-    <w:p>
-      <w:pPr>
-        <w:pStyle w:val="Normal"/>
-        <w:jc w:val="both"/>
-        <w:rPr>
-          <w:color w:val="auto"/>
-        </w:rPr>
-      </w:pPr>
-      <w:r>
-        <w:rPr>
-          <w:rFonts w:eastAsia="Times New Roman" w:cs="Times New Roman" w:ascii="Garamond" w:hAnsi="Garamond"/>
-          <w:color w:val="000000"/>
-          <w:kern w:val="0"/>
-          <w:sz w:val="36"/>
-          <w:szCs w:val="36"/>
-          <w:shd w:fill="auto" w:val="clear"/>
-          <w:lang w:val="en-US" w:eastAsia="zh-CN" w:bidi="hi-IN"/>
-        </w:rPr>
-        <w:t>Com isso, Jesus mostra que, apesar das experiências vividas, os discípulos ainda não haviam adquirido plena confiança no Mestre.</w:t>
-      </w:r>
-    </w:p>
-    <w:p>
-      <w:pPr>
-        <w:pStyle w:val="Normal"/>
-        <w:jc w:val="both"/>
-        <w:rPr>
-          <w:color w:val="auto"/>
-        </w:rPr>
-      </w:pPr>
-      <w:r>
-        <w:rPr>
-          <w:color w:val="auto"/>
-        </w:rPr>
-      </w:r>
-    </w:p>
-    <w:p>
-      <w:pPr>
-        <w:pStyle w:val="Normal"/>
-        <w:jc w:val="both"/>
-        <w:rPr>
-          <w:color w:val="auto"/>
-        </w:rPr>
-      </w:pPr>
-      <w:r>
-        <w:rPr>
-          <w:rFonts w:eastAsia="Times New Roman" w:cs="Times New Roman" w:ascii="Garamond" w:hAnsi="Garamond"/>
-          <w:color w:val="000000"/>
-          <w:kern w:val="0"/>
-          <w:sz w:val="36"/>
-          <w:szCs w:val="36"/>
-          <w:shd w:fill="auto" w:val="clear"/>
-          <w:lang w:val="en-US" w:eastAsia="zh-CN" w:bidi="hi-IN"/>
-        </w:rPr>
-        <w:t>Aqui entra, com muita clareza, o ensinamento de Emmanuel: nós também, apesar de já termos recebido inúmeras provas do amor e da misericórdia de Jesus em resposta às nossas rogativas, ainda não confiamos plenamente no Mestre.</w:t>
-      </w:r>
-    </w:p>
-    <w:p>
-      <w:pPr>
-        <w:pStyle w:val="Normal"/>
-        <w:jc w:val="both"/>
-        <w:rPr>
-          <w:rFonts w:ascii="Garamond" w:hAnsi="Garamond" w:eastAsia="Times New Roman" w:cs="Times New Roman"/>
-          <w:kern w:val="0"/>
-          <w:sz w:val="36"/>
-          <w:szCs w:val="36"/>
-          <w:shd w:fill="auto" w:val="clear"/>
-          <w:lang w:val="en-US" w:eastAsia="zh-CN" w:bidi="hi-IN"/>
-        </w:rPr>
-      </w:pPr>
-      <w:r>
-        <w:rPr>
-          <w:rFonts w:eastAsia="Times New Roman" w:cs="Times New Roman" w:ascii="Garamond" w:hAnsi="Garamond"/>
-          <w:kern w:val="0"/>
-          <w:sz w:val="36"/>
-          <w:szCs w:val="36"/>
-          <w:shd w:fill="auto" w:val="clear"/>
-          <w:lang w:val="en-US" w:eastAsia="zh-CN" w:bidi="hi-IN"/>
-        </w:rPr>
-      </w:r>
-    </w:p>
-    <w:p>
-      <w:pPr>
-        <w:pStyle w:val="Normal"/>
-        <w:jc w:val="both"/>
-        <w:rPr>
-          <w:color w:val="auto"/>
-        </w:rPr>
-      </w:pPr>
-      <w:r>
-        <w:rPr>
-          <w:rFonts w:eastAsia="Times New Roman" w:cs="Times New Roman" w:ascii="Garamond" w:hAnsi="Garamond"/>
-          <w:color w:val="000000"/>
-          <w:kern w:val="0"/>
-          <w:sz w:val="36"/>
-          <w:szCs w:val="36"/>
-          <w:shd w:fill="auto" w:val="clear"/>
-          <w:lang w:val="en-US" w:eastAsia="zh-CN" w:bidi="hi-IN"/>
-        </w:rPr>
-        <w:t>Jesus continua confiando em nós, mas espera que aprendamos com aquilo que já recebemos; não para pedir mais, e sim para confiar mais e trabalhar melhor.</w:t>
-      </w:r>
-    </w:p>
-    <w:p>
-      <w:pPr>
-        <w:pStyle w:val="Normal"/>
-        <w:jc w:val="both"/>
-        <w:rPr>
-          <w:color w:val="1C99E0"/>
-          <w:highlight w:val="none"/>
-          <w:shd w:fill="auto" w:val="clear"/>
-        </w:rPr>
-      </w:pPr>
-      <w:r>
-        <w:rPr>
-          <w:rFonts w:eastAsia="Times New Roman" w:cs="Times New Roman" w:ascii="Garamond" w:hAnsi="Garamond"/>
-          <w:color w:val="1C99E0"/>
-          <w:kern w:val="0"/>
-          <w:sz w:val="36"/>
-          <w:szCs w:val="36"/>
-          <w:shd w:fill="auto" w:val="clear"/>
-          <w:lang w:val="en-US" w:eastAsia="zh-CN" w:bidi="hi-IN"/>
-        </w:rPr>
-        <w:t>[ Término do bloco que usa a lição Socorro e Concurso]</w:t>
-      </w:r>
-    </w:p>
-    <w:p>
-      <w:pPr>
-        <w:pStyle w:val="Normal"/>
-        <w:jc w:val="both"/>
-        <w:rPr>
-          <w:color w:val="1C99E0"/>
-          <w:highlight w:val="none"/>
-          <w:shd w:fill="auto" w:val="clear"/>
-        </w:rPr>
-      </w:pPr>
-      <w:r>
-        <w:rPr>
-          <w:color w:val="1C99E0"/>
-          <w:shd w:fill="auto" w:val="clear"/>
-        </w:rPr>
-      </w:r>
-    </w:p>
-    <w:p>
-      <w:pPr>
-        <w:pStyle w:val="Normal"/>
-        <w:jc w:val="both"/>
-        <w:rPr>
-          <w:color w:val="1C99E0"/>
-          <w:highlight w:val="none"/>
-          <w:shd w:fill="auto" w:val="clear"/>
-        </w:rPr>
-      </w:pPr>
-      <w:r>
-        <w:rPr>
-          <w:color w:val="1C99E0"/>
-          <w:shd w:fill="auto" w:val="clear"/>
         </w:rPr>
       </w:r>
     </w:p>
@@ -4872,7 +4436,7 @@
         <w:bCs/>
         <w:rFonts w:ascii="Garamond" w:hAnsi="Garamond"/>
       </w:rPr>
-      <w:t>27</w:t>
+      <w:t>25</w:t>
     </w:r>
     <w:r>
       <w:rPr>

</xml_diff>

<commit_message>
01/03/2026 - 20:36 h
</commit_message>
<xml_diff>
--- a/Pedi e obtereis/Pedi e obtereis.docx
+++ b/Pedi e obtereis/Pedi e obtereis.docx
@@ -1189,7 +1189,33 @@
           <w:shd w:fill="auto" w:val="clear"/>
           <w:lang w:val="en-US" w:eastAsia="zh-CN" w:bidi="hi-IN"/>
         </w:rPr>
-        <w:t xml:space="preserve">Então agora nós já sabemos que uma parte importantíssima do Pedi e obtereis está na oração. </w:t>
+        <w:t xml:space="preserve">Então agora nós já sabemos que uma parte importantíssima do </w:t>
+      </w:r>
+      <w:r>
+        <w:rPr>
+          <w:rFonts w:eastAsia="Times New Roman" w:cs="Times New Roman" w:ascii="Garamond" w:hAnsi="Garamond"/>
+          <w:i/>
+          <w:iCs/>
+          <w:color w:val="000000"/>
+          <w:kern w:val="0"/>
+          <w:sz w:val="36"/>
+          <w:szCs w:val="36"/>
+          <w:shd w:fill="auto" w:val="clear"/>
+          <w:lang w:val="en-US" w:eastAsia="zh-CN" w:bidi="hi-IN"/>
+        </w:rPr>
+        <w:t>Pedi e obtereis</w:t>
+      </w:r>
+      <w:r>
+        <w:rPr>
+          <w:rFonts w:eastAsia="Times New Roman" w:cs="Times New Roman" w:ascii="Garamond" w:hAnsi="Garamond"/>
+          <w:color w:val="000000"/>
+          <w:kern w:val="0"/>
+          <w:sz w:val="36"/>
+          <w:szCs w:val="36"/>
+          <w:shd w:fill="auto" w:val="clear"/>
+          <w:lang w:val="en-US" w:eastAsia="zh-CN" w:bidi="hi-IN"/>
+        </w:rPr>
+        <w:t xml:space="preserve"> está na oração. </w:t>
       </w:r>
     </w:p>
     <w:p>
@@ -1265,6 +1291,536 @@
         <w:pStyle w:val="Normal"/>
         <w:jc w:val="both"/>
         <w:rPr>
+          <w:color w:val="auto"/>
+        </w:rPr>
+      </w:pPr>
+      <w:r>
+        <w:rPr>
+          <w:rFonts w:eastAsia="Times New Roman" w:cs="Times New Roman" w:ascii="Garamond" w:hAnsi="Garamond"/>
+          <w:color w:val="000000"/>
+          <w:kern w:val="0"/>
+          <w:sz w:val="36"/>
+          <w:szCs w:val="36"/>
+          <w:shd w:fill="auto" w:val="clear"/>
+          <w:lang w:val="en-US" w:eastAsia="zh-CN" w:bidi="hi-IN"/>
+        </w:rPr>
+        <w:t xml:space="preserve">Mas como deve ser a nossa oração? De que maneira  conseguimos efetivamente nos colocar em contato com o Pai? Deus sempre ouve nossas preces? Podemos pedir qualquer coisa? </w:t>
+      </w:r>
+    </w:p>
+    <w:p>
+      <w:pPr>
+        <w:pStyle w:val="Normal"/>
+        <w:jc w:val="both"/>
+        <w:rPr>
+          <w:color w:val="auto"/>
+        </w:rPr>
+      </w:pPr>
+      <w:r>
+        <w:rPr>
+          <w:color w:val="auto"/>
+        </w:rPr>
+      </w:r>
+    </w:p>
+    <w:p>
+      <w:pPr>
+        <w:pStyle w:val="Normal"/>
+        <w:jc w:val="both"/>
+        <w:rPr>
+          <w:color w:val="auto"/>
+        </w:rPr>
+      </w:pPr>
+      <w:r>
+        <w:rPr>
+          <w:rFonts w:eastAsia="Times New Roman" w:cs="Times New Roman" w:ascii="Garamond" w:hAnsi="Garamond"/>
+          <w:color w:val="000000"/>
+          <w:kern w:val="0"/>
+          <w:sz w:val="36"/>
+          <w:szCs w:val="36"/>
+          <w:shd w:fill="auto" w:val="clear"/>
+          <w:lang w:val="en-US" w:eastAsia="zh-CN" w:bidi="hi-IN"/>
+        </w:rPr>
+        <w:t>As respostas para essas perguntas nós encontramos em O Evangelho Segundo o Espiritismo, no capítulo X</w:t>
+      </w:r>
+      <w:r>
+        <w:rPr>
+          <w:rFonts w:eastAsia="Times New Roman" w:cs="Times New Roman" w:ascii="Garamond" w:hAnsi="Garamond"/>
+          <w:color w:val="000000"/>
+          <w:kern w:val="0"/>
+          <w:sz w:val="36"/>
+          <w:szCs w:val="36"/>
+          <w:shd w:fill="auto" w:val="clear"/>
+          <w:lang w:val="en-US" w:eastAsia="zh-CN" w:bidi="hi-IN"/>
+        </w:rPr>
+        <w:t>X</w:t>
+      </w:r>
+      <w:r>
+        <w:rPr>
+          <w:rFonts w:eastAsia="Times New Roman" w:cs="Times New Roman" w:ascii="Garamond" w:hAnsi="Garamond"/>
+          <w:color w:val="000000"/>
+          <w:kern w:val="0"/>
+          <w:sz w:val="36"/>
+          <w:szCs w:val="36"/>
+          <w:shd w:fill="auto" w:val="clear"/>
+          <w:lang w:val="en-US" w:eastAsia="zh-CN" w:bidi="hi-IN"/>
+        </w:rPr>
+        <w:t>VII, cujo título é exatamente Pedi e Obtereis.</w:t>
+      </w:r>
+    </w:p>
+    <w:p>
+      <w:pPr>
+        <w:pStyle w:val="Normal"/>
+        <w:jc w:val="both"/>
+        <w:rPr>
+          <w:color w:val="auto"/>
+        </w:rPr>
+      </w:pPr>
+      <w:r>
+        <w:rPr/>
+      </w:r>
+    </w:p>
+    <w:p>
+      <w:pPr>
+        <w:pStyle w:val="Normal"/>
+        <w:jc w:val="both"/>
+        <w:rPr>
+          <w:color w:val="auto"/>
+        </w:rPr>
+      </w:pPr>
+      <w:r>
+        <w:rPr>
+          <w:rFonts w:eastAsia="Times New Roman" w:cs="Times New Roman" w:ascii="Garamond" w:hAnsi="Garamond"/>
+          <w:color w:val="000000"/>
+          <w:kern w:val="0"/>
+          <w:sz w:val="36"/>
+          <w:szCs w:val="36"/>
+          <w:shd w:fill="auto" w:val="clear"/>
+          <w:lang w:val="en-US" w:eastAsia="zh-CN" w:bidi="hi-IN"/>
+        </w:rPr>
+        <w:t>No início desse capítulo, Allan Kardec nos fala sobre a qualidade que nossa prece deve ter. E para isso ele apresenta algumas passagens evangélicas que vamos analisar aqui.</w:t>
+      </w:r>
+    </w:p>
+    <w:p>
+      <w:pPr>
+        <w:pStyle w:val="Normal"/>
+        <w:jc w:val="both"/>
+        <w:rPr>
+          <w:color w:val="auto"/>
+        </w:rPr>
+      </w:pPr>
+      <w:r>
+        <w:rPr/>
+      </w:r>
+    </w:p>
+    <w:p>
+      <w:pPr>
+        <w:pStyle w:val="Normal"/>
+        <w:jc w:val="both"/>
+        <w:rPr>
+          <w:color w:val="auto"/>
+        </w:rPr>
+      </w:pPr>
+      <w:r>
+        <w:rPr>
+          <w:rFonts w:eastAsia="Times New Roman" w:cs="Times New Roman" w:ascii="Garamond" w:hAnsi="Garamond"/>
+          <w:color w:val="000000"/>
+          <w:kern w:val="0"/>
+          <w:sz w:val="36"/>
+          <w:szCs w:val="36"/>
+          <w:shd w:fill="auto" w:val="clear"/>
+          <w:lang w:val="en-US" w:eastAsia="zh-CN" w:bidi="hi-IN"/>
+        </w:rPr>
+        <w:t>Primeiro ele nos apresenta o que Jesus diz em Mateus 6:5-8:</w:t>
+      </w:r>
+    </w:p>
+    <w:p>
+      <w:pPr>
+        <w:pStyle w:val="Normal"/>
+        <w:jc w:val="both"/>
+        <w:rPr>
+          <w:color w:val="auto"/>
+        </w:rPr>
+      </w:pPr>
+      <w:r>
+        <w:rPr/>
+      </w:r>
+    </w:p>
+    <w:p>
+      <w:pPr>
+        <w:pStyle w:val="Normal"/>
+        <w:ind w:left="720" w:hanging="0"/>
+        <w:jc w:val="both"/>
+        <w:rPr>
+          <w:color w:val="auto"/>
+        </w:rPr>
+      </w:pPr>
+      <w:r>
+        <w:rPr>
+          <w:rFonts w:eastAsia="Times New Roman" w:cs="Times New Roman" w:ascii="Garamond" w:hAnsi="Garamond"/>
+          <w:i/>
+          <w:iCs/>
+          <w:color w:val="000000"/>
+          <w:kern w:val="0"/>
+          <w:sz w:val="36"/>
+          <w:szCs w:val="36"/>
+          <w:shd w:fill="auto" w:val="clear"/>
+          <w:lang w:val="en-US" w:eastAsia="zh-CN" w:bidi="hi-IN"/>
+        </w:rPr>
+        <w:t>Quando orardes, não vos assemelheis aos hipócritas, que, afetadamente, oram de pé nas sinagogas e nos cantos das ruas para serem vistos pelos homens. –</w:t>
+      </w:r>
+      <w:r>
+        <w:rPr>
+          <w:rFonts w:eastAsia="Times New Roman" w:cs="Times New Roman" w:ascii="Garamond" w:hAnsi="Garamond"/>
+          <w:color w:val="000000"/>
+          <w:kern w:val="0"/>
+          <w:sz w:val="36"/>
+          <w:szCs w:val="36"/>
+          <w:shd w:fill="auto" w:val="clear"/>
+          <w:lang w:val="en-US" w:eastAsia="zh-CN" w:bidi="hi-IN"/>
+        </w:rPr>
+        <w:t xml:space="preserve"> </w:t>
+      </w:r>
+      <w:r>
+        <w:rPr>
+          <w:rFonts w:eastAsia="Times New Roman" w:cs="Times New Roman" w:ascii="Garamond" w:hAnsi="Garamond"/>
+          <w:i/>
+          <w:iCs/>
+          <w:color w:val="000000"/>
+          <w:kern w:val="0"/>
+          <w:sz w:val="36"/>
+          <w:szCs w:val="36"/>
+          <w:shd w:fill="auto" w:val="clear"/>
+          <w:lang w:val="en-US" w:eastAsia="zh-CN" w:bidi="hi-IN"/>
+        </w:rPr>
+        <w:t xml:space="preserve">Digo-vos, em verdade, que eles já receberam sua recompensa. – Quando quiserdes orar, entrai para o vosso quarto e, fechada a porta, orai a vosso Pai em secreto; e vosso Pai, que vê o que se passa em secreto, vos dará a recompensa. </w:t>
+      </w:r>
+    </w:p>
+    <w:p>
+      <w:pPr>
+        <w:pStyle w:val="Normal"/>
+        <w:ind w:left="720" w:hanging="0"/>
+        <w:jc w:val="both"/>
+        <w:rPr>
+          <w:color w:val="auto"/>
+        </w:rPr>
+      </w:pPr>
+      <w:r>
+        <w:rPr/>
+      </w:r>
+    </w:p>
+    <w:p>
+      <w:pPr>
+        <w:pStyle w:val="Normal"/>
+        <w:ind w:left="720" w:hanging="0"/>
+        <w:jc w:val="both"/>
+        <w:rPr>
+          <w:i/>
+          <w:i/>
+          <w:iCs/>
+        </w:rPr>
+      </w:pPr>
+      <w:r>
+        <w:rPr>
+          <w:rFonts w:eastAsia="Times New Roman" w:cs="Times New Roman" w:ascii="Garamond" w:hAnsi="Garamond"/>
+          <w:i/>
+          <w:iCs/>
+          <w:color w:val="000000"/>
+          <w:kern w:val="0"/>
+          <w:sz w:val="36"/>
+          <w:szCs w:val="36"/>
+          <w:shd w:fill="auto" w:val="clear"/>
+          <w:lang w:val="en-US" w:eastAsia="zh-CN" w:bidi="hi-IN"/>
+        </w:rPr>
+        <w:t>Não cuideis de pedir muito nas vossas preces, como fazem os pagãos, os quais imaginam que pela multiplicidade das palavras é que serão atendidos. Não v</w:t>
+      </w:r>
+      <w:r>
+        <w:rPr>
+          <w:rFonts w:eastAsia="Times New Roman" w:cs="Times New Roman" w:ascii="Garamond" w:hAnsi="Garamond"/>
+          <w:i/>
+          <w:iCs/>
+          <w:color w:val="000000"/>
+          <w:kern w:val="0"/>
+          <w:sz w:val="36"/>
+          <w:szCs w:val="36"/>
+          <w:shd w:fill="auto" w:val="clear"/>
+          <w:lang w:val="en-US" w:eastAsia="zh-CN" w:bidi="hi-IN"/>
+        </w:rPr>
+        <w:t>o</w:t>
+      </w:r>
+      <w:r>
+        <w:rPr>
+          <w:rFonts w:eastAsia="Times New Roman" w:cs="Times New Roman" w:ascii="Garamond" w:hAnsi="Garamond"/>
+          <w:i/>
+          <w:iCs/>
+          <w:color w:val="000000"/>
+          <w:kern w:val="0"/>
+          <w:sz w:val="36"/>
+          <w:szCs w:val="36"/>
+          <w:shd w:fill="auto" w:val="clear"/>
+          <w:lang w:val="en-US" w:eastAsia="zh-CN" w:bidi="hi-IN"/>
+        </w:rPr>
+        <w:t xml:space="preserve">s torneis semelhantes a eles, porque vosso Pai sabe do que é que tendes necessidade, antes que lho peçais. </w:t>
+      </w:r>
+    </w:p>
+    <w:p>
+      <w:pPr>
+        <w:pStyle w:val="Normal"/>
+        <w:jc w:val="both"/>
+        <w:rPr>
+          <w:color w:val="auto"/>
+        </w:rPr>
+      </w:pPr>
+      <w:r>
+        <w:rPr/>
+      </w:r>
+    </w:p>
+    <w:p>
+      <w:pPr>
+        <w:pStyle w:val="Normal"/>
+        <w:jc w:val="both"/>
+        <w:rPr>
+          <w:color w:val="auto"/>
+        </w:rPr>
+      </w:pPr>
+      <w:r>
+        <w:rPr/>
+      </w:r>
+    </w:p>
+    <w:p>
+      <w:pPr>
+        <w:pStyle w:val="Normal"/>
+        <w:jc w:val="both"/>
+        <w:rPr>
+          <w:color w:val="auto"/>
+        </w:rPr>
+      </w:pPr>
+      <w:r>
+        <w:rPr>
+          <w:rFonts w:eastAsia="Times New Roman" w:cs="Times New Roman" w:ascii="Garamond" w:hAnsi="Garamond"/>
+          <w:color w:val="000000"/>
+          <w:kern w:val="0"/>
+          <w:sz w:val="36"/>
+          <w:szCs w:val="36"/>
+          <w:shd w:fill="auto" w:val="clear"/>
+          <w:lang w:val="en-US" w:eastAsia="zh-CN" w:bidi="hi-IN"/>
+        </w:rPr>
+        <w:t>Quando Jesus diz que, para orarmos, devemos entrar para nosso quarto, fechar a porta e orar em secreto, Ele estava se utilizando de uma simbologia. Claro que um ambiente silencioso e calmo favorece a oração, mas se condicionarmos nossas preces somente a locais e momentos tranquilos. Se assim fosse, seria impossível alcançar qualquer paz interior estando longe desses redutos de tranquilidade.</w:t>
+      </w:r>
+    </w:p>
+    <w:p>
+      <w:pPr>
+        <w:pStyle w:val="Normal"/>
+        <w:jc w:val="both"/>
+        <w:rPr>
+          <w:color w:val="auto"/>
+        </w:rPr>
+      </w:pPr>
+      <w:r>
+        <w:rPr/>
+      </w:r>
+    </w:p>
+    <w:p>
+      <w:pPr>
+        <w:pStyle w:val="Normal"/>
+        <w:jc w:val="both"/>
+        <w:rPr>
+          <w:color w:val="auto"/>
+        </w:rPr>
+      </w:pPr>
+      <w:r>
+        <w:rPr>
+          <w:rFonts w:eastAsia="Times New Roman" w:cs="Times New Roman" w:ascii="Garamond" w:hAnsi="Garamond"/>
+          <w:color w:val="000000"/>
+          <w:kern w:val="0"/>
+          <w:sz w:val="36"/>
+          <w:szCs w:val="36"/>
+          <w:shd w:fill="auto" w:val="clear"/>
+          <w:lang w:val="en-US" w:eastAsia="zh-CN" w:bidi="hi-IN"/>
+        </w:rPr>
+        <w:t>O que Jesus quis dizer é que somente na mais plena intimidade do nosso ser, imbuídos dos mais sinceros sentimentos é que estaremos em condição de entrar em contato com Ele e com o Pai Celestial.</w:t>
+      </w:r>
+    </w:p>
+    <w:p>
+      <w:pPr>
+        <w:pStyle w:val="Normal"/>
+        <w:jc w:val="both"/>
+        <w:rPr>
+          <w:color w:val="auto"/>
+        </w:rPr>
+      </w:pPr>
+      <w:r>
+        <w:rPr/>
+      </w:r>
+    </w:p>
+    <w:p>
+      <w:pPr>
+        <w:pStyle w:val="Normal"/>
+        <w:jc w:val="both"/>
+        <w:rPr>
+          <w:color w:val="auto"/>
+        </w:rPr>
+      </w:pPr>
+      <w:r>
+        <w:rPr/>
+      </w:r>
+    </w:p>
+    <w:p>
+      <w:pPr>
+        <w:pStyle w:val="Normal"/>
+        <w:numPr>
+          <w:ilvl w:val="0"/>
+          <w:numId w:val="2"/>
+        </w:numPr>
+        <w:jc w:val="both"/>
+        <w:rPr>
+          <w:color w:val="auto"/>
+        </w:rPr>
+      </w:pPr>
+      <w:r>
+        <w:rPr>
+          <w:rFonts w:eastAsia="Times New Roman" w:cs="Times New Roman" w:ascii="Garamond" w:hAnsi="Garamond"/>
+          <w:color w:val="000000"/>
+          <w:kern w:val="0"/>
+          <w:sz w:val="36"/>
+          <w:szCs w:val="36"/>
+          <w:shd w:fill="auto" w:val="clear"/>
+          <w:lang w:val="en-US" w:eastAsia="zh-CN" w:bidi="hi-IN"/>
+        </w:rPr>
+        <w:t>Entrar para o quarto para orar é uma simbologia. Não precisamos disso para orar. Ver se dá para encaixar o texto da lição Lugar Deserto aqui;</w:t>
+      </w:r>
+    </w:p>
+    <w:p>
+      <w:pPr>
+        <w:pStyle w:val="Normal"/>
+        <w:numPr>
+          <w:ilvl w:val="0"/>
+          <w:numId w:val="2"/>
+        </w:numPr>
+        <w:jc w:val="both"/>
+        <w:rPr>
+          <w:color w:val="auto"/>
+        </w:rPr>
+      </w:pPr>
+      <w:r>
+        <w:rPr>
+          <w:rFonts w:eastAsia="Times New Roman" w:cs="Times New Roman" w:ascii="Garamond" w:hAnsi="Garamond"/>
+          <w:color w:val="000000"/>
+          <w:kern w:val="0"/>
+          <w:sz w:val="36"/>
+          <w:szCs w:val="36"/>
+          <w:shd w:fill="auto" w:val="clear"/>
+          <w:lang w:val="en-US" w:eastAsia="zh-CN" w:bidi="hi-IN"/>
+        </w:rPr>
+        <w:t>Podemos orar em qualquer lugar, inclusive nos mais tumultuados. Por quê deveríamos deixar de orar simplesmente porque estamos na multidão, no coletivo lotado ou na via pública tumultuada;</w:t>
+      </w:r>
+    </w:p>
+    <w:p>
+      <w:pPr>
+        <w:pStyle w:val="Normal"/>
+        <w:numPr>
+          <w:ilvl w:val="0"/>
+          <w:numId w:val="2"/>
+        </w:numPr>
+        <w:jc w:val="both"/>
+        <w:rPr>
+          <w:color w:val="auto"/>
+        </w:rPr>
+      </w:pPr>
+      <w:r>
+        <w:rPr>
+          <w:rFonts w:eastAsia="Times New Roman" w:cs="Times New Roman" w:ascii="Garamond" w:hAnsi="Garamond"/>
+          <w:color w:val="000000"/>
+          <w:kern w:val="0"/>
+          <w:sz w:val="36"/>
+          <w:szCs w:val="36"/>
+          <w:shd w:fill="auto" w:val="clear"/>
+          <w:lang w:val="en-US" w:eastAsia="zh-CN" w:bidi="hi-IN"/>
+        </w:rPr>
+        <w:t xml:space="preserve">Nossa oração pode ser útil a alguém acidentado na via pública. </w:t>
+      </w:r>
+    </w:p>
+    <w:p>
+      <w:pPr>
+        <w:pStyle w:val="Normal"/>
+        <w:numPr>
+          <w:ilvl w:val="0"/>
+          <w:numId w:val="2"/>
+        </w:numPr>
+        <w:jc w:val="both"/>
+        <w:rPr>
+          <w:color w:val="auto"/>
+        </w:rPr>
+      </w:pPr>
+      <w:r>
+        <w:rPr>
+          <w:rFonts w:eastAsia="Times New Roman" w:cs="Times New Roman" w:ascii="Garamond" w:hAnsi="Garamond"/>
+          <w:color w:val="000000"/>
+          <w:kern w:val="0"/>
+          <w:sz w:val="36"/>
+          <w:szCs w:val="36"/>
+          <w:shd w:fill="auto" w:val="clear"/>
+          <w:lang w:val="en-US" w:eastAsia="zh-CN" w:bidi="hi-IN"/>
+        </w:rPr>
+        <w:t>Sugerir mudança de postura diante das tragédias cotidianas: em vez da curiosidade mórbida e inútil, oremos por aqueles que virmos acidentados ou desencarnados nos acidentes;</w:t>
+      </w:r>
+    </w:p>
+    <w:p>
+      <w:pPr>
+        <w:pStyle w:val="Normal"/>
+        <w:numPr>
+          <w:ilvl w:val="0"/>
+          <w:numId w:val="2"/>
+        </w:numPr>
+        <w:jc w:val="both"/>
+        <w:rPr>
+          <w:color w:val="auto"/>
+        </w:rPr>
+      </w:pPr>
+      <w:r>
+        <w:rPr>
+          <w:rFonts w:eastAsia="Times New Roman" w:cs="Times New Roman" w:ascii="Garamond" w:hAnsi="Garamond"/>
+          <w:color w:val="000000"/>
+          <w:kern w:val="0"/>
+          <w:sz w:val="36"/>
+          <w:szCs w:val="36"/>
+          <w:shd w:fill="auto" w:val="clear"/>
+          <w:lang w:val="en-US" w:eastAsia="zh-CN" w:bidi="hi-IN"/>
+        </w:rPr>
+        <w:t xml:space="preserve">Não vós torneis semelhantes a eles, porque vosso Pai sabe do que é que tendes necessidade, antes que lho peçais. </w:t>
+      </w:r>
+    </w:p>
+    <w:p>
+      <w:pPr>
+        <w:pStyle w:val="Normal"/>
+        <w:jc w:val="both"/>
+        <w:rPr>
+          <w:color w:val="auto"/>
+        </w:rPr>
+      </w:pPr>
+      <w:r>
+        <w:rPr>
+          <w:color w:val="auto"/>
+        </w:rPr>
+      </w:r>
+    </w:p>
+    <w:p>
+      <w:pPr>
+        <w:pStyle w:val="Normal"/>
+        <w:jc w:val="both"/>
+        <w:rPr>
+          <w:color w:val="auto"/>
+        </w:rPr>
+      </w:pPr>
+      <w:r>
+        <w:rPr>
+          <w:color w:val="auto"/>
+        </w:rPr>
+      </w:r>
+    </w:p>
+    <w:p>
+      <w:pPr>
+        <w:pStyle w:val="Normal"/>
+        <w:jc w:val="both"/>
+        <w:rPr>
           <w:color w:val="1C99E0"/>
         </w:rPr>
       </w:pPr>
@@ -1313,43 +1869,21 @@
           <w:shd w:fill="auto" w:val="clear"/>
           <w:lang w:val="en-US" w:eastAsia="zh-CN" w:bidi="hi-IN"/>
         </w:rPr>
-        <w:t xml:space="preserve">Até aqui falamos sobre a força da oração, </w:t>
-      </w:r>
-      <w:r>
-        <w:rPr>
-          <w:rFonts w:eastAsia="Times New Roman" w:cs="Times New Roman" w:ascii="Garamond" w:hAnsi="Garamond"/>
-          <w:color w:val="000000"/>
-          <w:kern w:val="0"/>
-          <w:sz w:val="36"/>
-          <w:szCs w:val="36"/>
-          <w:shd w:fill="auto" w:val="clear"/>
-          <w:lang w:val="en-US" w:eastAsia="zh-CN" w:bidi="hi-IN"/>
-        </w:rPr>
-        <w:t xml:space="preserve">sobrea maneira correta de se orar, </w:t>
-      </w:r>
-      <w:r>
-        <w:rPr>
-          <w:rFonts w:eastAsia="Times New Roman" w:cs="Times New Roman" w:ascii="Garamond" w:hAnsi="Garamond"/>
-          <w:color w:val="000000"/>
-          <w:kern w:val="0"/>
-          <w:sz w:val="36"/>
-          <w:szCs w:val="36"/>
-          <w:shd w:fill="auto" w:val="clear"/>
-          <w:lang w:val="en-US" w:eastAsia="zh-CN" w:bidi="hi-IN"/>
-        </w:rPr>
-        <w:t>sobre a necessidade de pedir com sinceridade, fé e perseverança. Mas existe um ponto essencial que não podemos ignorar.</w:t>
-      </w:r>
-    </w:p>
-    <w:p>
-      <w:pPr>
-        <w:pStyle w:val="Normal"/>
-        <w:jc w:val="both"/>
-        <w:rPr>
-          <w:color w:val="auto"/>
-        </w:rPr>
-      </w:pPr>
-      <w:r>
-        <w:rPr/>
+        <w:t>Até aqui falamos sobre a força da oração, sobre a maneira correta de se orar, sobre a necessidade de pedir com sinceridade, fé e perseverança. Mas existe um ponto essencial que não podemos ignorar.</w:t>
+      </w:r>
+    </w:p>
+    <w:p>
+      <w:pPr>
+        <w:pStyle w:val="Normal"/>
+        <w:jc w:val="both"/>
+        <w:rPr>
+          <w:color w:val="auto"/>
+        </w:rPr>
+      </w:pPr>
+      <w:r>
+        <w:rPr>
+          <w:color w:val="auto"/>
+        </w:rPr>
       </w:r>
     </w:p>
     <w:p>
@@ -1382,7 +1916,9 @@
         </w:rPr>
       </w:pPr>
       <w:r>
-        <w:rPr/>
+        <w:rPr>
+          <w:color w:val="auto"/>
+        </w:rPr>
       </w:r>
     </w:p>
     <w:p>
@@ -1450,7 +1986,9 @@
         </w:rPr>
       </w:pPr>
       <w:r>
-        <w:rPr/>
+        <w:rPr>
+          <w:color w:val="auto"/>
+        </w:rPr>
       </w:r>
     </w:p>
     <w:p>
@@ -2053,7 +2591,9 @@
         </w:rPr>
       </w:pPr>
       <w:r>
-        <w:rPr/>
+        <w:rPr>
+          <w:color w:val="auto"/>
+        </w:rPr>
       </w:r>
     </w:p>
     <w:p>
@@ -2801,7 +3341,10 @@
         </w:rPr>
       </w:pPr>
       <w:r>
-        <w:rPr/>
+        <w:rPr>
+          <w:color w:val="1C99E0"/>
+          <w:shd w:fill="auto" w:val="clear"/>
+        </w:rPr>
       </w:r>
     </w:p>
     <w:p>
@@ -4436,7 +4979,7 @@
         <w:bCs/>
         <w:rFonts w:ascii="Garamond" w:hAnsi="Garamond"/>
       </w:rPr>
-      <w:t>25</w:t>
+      <w:t>28</w:t>
     </w:r>
     <w:r>
       <w:rPr>
@@ -4595,6 +5138,143 @@
   <w:abstractNum w:abstractNumId="2">
     <w:lvl w:ilvl="0">
       <w:start w:val="1"/>
+      <w:numFmt w:val="bullet"/>
+      <w:lvlText w:val=""/>
+      <w:lvlJc w:val="left"/>
+      <w:pPr>
+        <w:tabs>
+          <w:tab w:val="num" w:pos="720"/>
+        </w:tabs>
+        <w:ind w:left="720" w:hanging="360"/>
+      </w:pPr>
+      <w:rPr>
+        <w:rFonts w:ascii="Symbol" w:hAnsi="Symbol" w:cs="Symbol" w:hint="default"/>
+      </w:rPr>
+    </w:lvl>
+    <w:lvl w:ilvl="1">
+      <w:start w:val="1"/>
+      <w:numFmt w:val="bullet"/>
+      <w:lvlText w:val="◦"/>
+      <w:lvlJc w:val="left"/>
+      <w:pPr>
+        <w:tabs>
+          <w:tab w:val="num" w:pos="1080"/>
+        </w:tabs>
+        <w:ind w:left="1080" w:hanging="360"/>
+      </w:pPr>
+      <w:rPr>
+        <w:rFonts w:ascii="OpenSymbol" w:hAnsi="OpenSymbol" w:cs="OpenSymbol" w:hint="default"/>
+      </w:rPr>
+    </w:lvl>
+    <w:lvl w:ilvl="2">
+      <w:start w:val="1"/>
+      <w:numFmt w:val="bullet"/>
+      <w:lvlText w:val="▪"/>
+      <w:lvlJc w:val="left"/>
+      <w:pPr>
+        <w:tabs>
+          <w:tab w:val="num" w:pos="1440"/>
+        </w:tabs>
+        <w:ind w:left="1440" w:hanging="360"/>
+      </w:pPr>
+      <w:rPr>
+        <w:rFonts w:ascii="OpenSymbol" w:hAnsi="OpenSymbol" w:cs="OpenSymbol" w:hint="default"/>
+      </w:rPr>
+    </w:lvl>
+    <w:lvl w:ilvl="3">
+      <w:start w:val="1"/>
+      <w:numFmt w:val="bullet"/>
+      <w:lvlText w:val=""/>
+      <w:lvlJc w:val="left"/>
+      <w:pPr>
+        <w:tabs>
+          <w:tab w:val="num" w:pos="1800"/>
+        </w:tabs>
+        <w:ind w:left="1800" w:hanging="360"/>
+      </w:pPr>
+      <w:rPr>
+        <w:rFonts w:ascii="Symbol" w:hAnsi="Symbol" w:cs="Symbol" w:hint="default"/>
+      </w:rPr>
+    </w:lvl>
+    <w:lvl w:ilvl="4">
+      <w:start w:val="1"/>
+      <w:numFmt w:val="bullet"/>
+      <w:lvlText w:val="◦"/>
+      <w:lvlJc w:val="left"/>
+      <w:pPr>
+        <w:tabs>
+          <w:tab w:val="num" w:pos="2160"/>
+        </w:tabs>
+        <w:ind w:left="2160" w:hanging="360"/>
+      </w:pPr>
+      <w:rPr>
+        <w:rFonts w:ascii="OpenSymbol" w:hAnsi="OpenSymbol" w:cs="OpenSymbol" w:hint="default"/>
+      </w:rPr>
+    </w:lvl>
+    <w:lvl w:ilvl="5">
+      <w:start w:val="1"/>
+      <w:numFmt w:val="bullet"/>
+      <w:lvlText w:val="▪"/>
+      <w:lvlJc w:val="left"/>
+      <w:pPr>
+        <w:tabs>
+          <w:tab w:val="num" w:pos="2520"/>
+        </w:tabs>
+        <w:ind w:left="2520" w:hanging="360"/>
+      </w:pPr>
+      <w:rPr>
+        <w:rFonts w:ascii="OpenSymbol" w:hAnsi="OpenSymbol" w:cs="OpenSymbol" w:hint="default"/>
+      </w:rPr>
+    </w:lvl>
+    <w:lvl w:ilvl="6">
+      <w:start w:val="1"/>
+      <w:numFmt w:val="bullet"/>
+      <w:lvlText w:val=""/>
+      <w:lvlJc w:val="left"/>
+      <w:pPr>
+        <w:tabs>
+          <w:tab w:val="num" w:pos="2880"/>
+        </w:tabs>
+        <w:ind w:left="2880" w:hanging="360"/>
+      </w:pPr>
+      <w:rPr>
+        <w:rFonts w:ascii="Symbol" w:hAnsi="Symbol" w:cs="Symbol" w:hint="default"/>
+      </w:rPr>
+    </w:lvl>
+    <w:lvl w:ilvl="7">
+      <w:start w:val="1"/>
+      <w:numFmt w:val="bullet"/>
+      <w:lvlText w:val="◦"/>
+      <w:lvlJc w:val="left"/>
+      <w:pPr>
+        <w:tabs>
+          <w:tab w:val="num" w:pos="3240"/>
+        </w:tabs>
+        <w:ind w:left="3240" w:hanging="360"/>
+      </w:pPr>
+      <w:rPr>
+        <w:rFonts w:ascii="OpenSymbol" w:hAnsi="OpenSymbol" w:cs="OpenSymbol" w:hint="default"/>
+      </w:rPr>
+    </w:lvl>
+    <w:lvl w:ilvl="8">
+      <w:start w:val="1"/>
+      <w:numFmt w:val="bullet"/>
+      <w:lvlText w:val="▪"/>
+      <w:lvlJc w:val="left"/>
+      <w:pPr>
+        <w:tabs>
+          <w:tab w:val="num" w:pos="3600"/>
+        </w:tabs>
+        <w:ind w:left="3600" w:hanging="360"/>
+      </w:pPr>
+      <w:rPr>
+        <w:rFonts w:ascii="OpenSymbol" w:hAnsi="OpenSymbol" w:cs="OpenSymbol" w:hint="default"/>
+      </w:rPr>
+    </w:lvl>
+  </w:abstractNum>
+  <w:abstractNum w:abstractNumId="3">
+    <w:lvl w:ilvl="0">
+      <w:start w:val="1"/>
       <w:numFmt w:val="none"/>
       <w:suff w:val="nothing"/>
       <w:lvlText w:val=""/>
@@ -4716,6 +5396,9 @@
   </w:num>
   <w:num w:numId="2">
     <w:abstractNumId w:val="2"/>
+  </w:num>
+  <w:num w:numId="3">
+    <w:abstractNumId w:val="3"/>
   </w:num>
 </w:numbering>
 </file>

</xml_diff>

<commit_message>
02/03/2026 - 21:05 h
</commit_message>
<xml_diff>
--- a/Pedi e obtereis/Pedi e obtereis.docx
+++ b/Pedi e obtereis/Pedi e obtereis.docx
@@ -1339,109 +1339,139 @@
           <w:shd w:fill="auto" w:val="clear"/>
           <w:lang w:val="en-US" w:eastAsia="zh-CN" w:bidi="hi-IN"/>
         </w:rPr>
-        <w:t>As respostas para essas perguntas nós encontramos em O Evangelho Segundo o Espiritismo, no capítulo X</w:t>
-      </w:r>
-      <w:r>
-        <w:rPr>
-          <w:rFonts w:eastAsia="Times New Roman" w:cs="Times New Roman" w:ascii="Garamond" w:hAnsi="Garamond"/>
-          <w:color w:val="000000"/>
-          <w:kern w:val="0"/>
-          <w:sz w:val="36"/>
-          <w:szCs w:val="36"/>
-          <w:shd w:fill="auto" w:val="clear"/>
-          <w:lang w:val="en-US" w:eastAsia="zh-CN" w:bidi="hi-IN"/>
-        </w:rPr>
-        <w:t>X</w:t>
-      </w:r>
-      <w:r>
-        <w:rPr>
-          <w:rFonts w:eastAsia="Times New Roman" w:cs="Times New Roman" w:ascii="Garamond" w:hAnsi="Garamond"/>
-          <w:color w:val="000000"/>
-          <w:kern w:val="0"/>
-          <w:sz w:val="36"/>
-          <w:szCs w:val="36"/>
-          <w:shd w:fill="auto" w:val="clear"/>
-          <w:lang w:val="en-US" w:eastAsia="zh-CN" w:bidi="hi-IN"/>
-        </w:rPr>
-        <w:t>VII, cujo título é exatamente Pedi e Obtereis.</w:t>
-      </w:r>
-    </w:p>
-    <w:p>
-      <w:pPr>
-        <w:pStyle w:val="Normal"/>
-        <w:jc w:val="both"/>
-        <w:rPr>
-          <w:color w:val="auto"/>
-        </w:rPr>
-      </w:pPr>
-      <w:r>
-        <w:rPr/>
-      </w:r>
-    </w:p>
-    <w:p>
-      <w:pPr>
-        <w:pStyle w:val="Normal"/>
-        <w:jc w:val="both"/>
-        <w:rPr>
-          <w:color w:val="auto"/>
-        </w:rPr>
-      </w:pPr>
-      <w:r>
-        <w:rPr>
-          <w:rFonts w:eastAsia="Times New Roman" w:cs="Times New Roman" w:ascii="Garamond" w:hAnsi="Garamond"/>
-          <w:color w:val="000000"/>
-          <w:kern w:val="0"/>
-          <w:sz w:val="36"/>
-          <w:szCs w:val="36"/>
-          <w:shd w:fill="auto" w:val="clear"/>
-          <w:lang w:val="en-US" w:eastAsia="zh-CN" w:bidi="hi-IN"/>
-        </w:rPr>
-        <w:t>No início desse capítulo, Allan Kardec nos fala sobre a qualidade que nossa prece deve ter. E para isso ele apresenta algumas passagens evangélicas que vamos analisar aqui.</w:t>
-      </w:r>
-    </w:p>
-    <w:p>
-      <w:pPr>
-        <w:pStyle w:val="Normal"/>
-        <w:jc w:val="both"/>
-        <w:rPr>
-          <w:color w:val="auto"/>
-        </w:rPr>
-      </w:pPr>
-      <w:r>
-        <w:rPr/>
-      </w:r>
-    </w:p>
-    <w:p>
-      <w:pPr>
-        <w:pStyle w:val="Normal"/>
-        <w:jc w:val="both"/>
-        <w:rPr>
-          <w:color w:val="auto"/>
-        </w:rPr>
-      </w:pPr>
-      <w:r>
-        <w:rPr>
-          <w:rFonts w:eastAsia="Times New Roman" w:cs="Times New Roman" w:ascii="Garamond" w:hAnsi="Garamond"/>
-          <w:color w:val="000000"/>
-          <w:kern w:val="0"/>
-          <w:sz w:val="36"/>
-          <w:szCs w:val="36"/>
-          <w:shd w:fill="auto" w:val="clear"/>
-          <w:lang w:val="en-US" w:eastAsia="zh-CN" w:bidi="hi-IN"/>
-        </w:rPr>
-        <w:t>Primeiro ele nos apresenta o que Jesus diz em Mateus 6:5-8:</w:t>
-      </w:r>
-    </w:p>
-    <w:p>
-      <w:pPr>
-        <w:pStyle w:val="Normal"/>
-        <w:jc w:val="both"/>
-        <w:rPr>
-          <w:color w:val="auto"/>
-        </w:rPr>
-      </w:pPr>
-      <w:r>
-        <w:rPr/>
+        <w:t>As respostas para essas perguntas nós encontramos em O Evangelho Segundo o Espiritismo, no capítulo XXVII, cujo título é exatamente Pedi e Obtereis.</w:t>
+      </w:r>
+    </w:p>
+    <w:p>
+      <w:pPr>
+        <w:pStyle w:val="Normal"/>
+        <w:jc w:val="both"/>
+        <w:rPr>
+          <w:color w:val="auto"/>
+        </w:rPr>
+      </w:pPr>
+      <w:r>
+        <w:rPr>
+          <w:color w:val="auto"/>
+        </w:rPr>
+      </w:r>
+    </w:p>
+    <w:p>
+      <w:pPr>
+        <w:pStyle w:val="Normal"/>
+        <w:jc w:val="both"/>
+        <w:rPr>
+          <w:color w:val="auto"/>
+        </w:rPr>
+      </w:pPr>
+      <w:r>
+        <w:rPr>
+          <w:rFonts w:eastAsia="Times New Roman" w:cs="Times New Roman" w:ascii="Garamond" w:hAnsi="Garamond"/>
+          <w:color w:val="000000"/>
+          <w:kern w:val="0"/>
+          <w:sz w:val="36"/>
+          <w:szCs w:val="36"/>
+          <w:shd w:fill="auto" w:val="clear"/>
+          <w:lang w:val="en-US" w:eastAsia="zh-CN" w:bidi="hi-IN"/>
+        </w:rPr>
+        <w:t xml:space="preserve">No início desse capítulo, Allan Kardec nos fala sobre a qualidade que </w:t>
+      </w:r>
+      <w:r>
+        <w:rPr>
+          <w:rFonts w:eastAsia="Times New Roman" w:cs="Times New Roman" w:ascii="Garamond" w:hAnsi="Garamond"/>
+          <w:color w:val="000000"/>
+          <w:kern w:val="0"/>
+          <w:sz w:val="36"/>
+          <w:szCs w:val="36"/>
+          <w:shd w:fill="auto" w:val="clear"/>
+          <w:lang w:val="en-US" w:eastAsia="zh-CN" w:bidi="hi-IN"/>
+        </w:rPr>
+        <w:t>a</w:t>
+      </w:r>
+      <w:r>
+        <w:rPr>
+          <w:rFonts w:eastAsia="Times New Roman" w:cs="Times New Roman" w:ascii="Garamond" w:hAnsi="Garamond"/>
+          <w:color w:val="000000"/>
+          <w:kern w:val="0"/>
+          <w:sz w:val="36"/>
+          <w:szCs w:val="36"/>
+          <w:shd w:fill="auto" w:val="clear"/>
+          <w:lang w:val="en-US" w:eastAsia="zh-CN" w:bidi="hi-IN"/>
+        </w:rPr>
+        <w:t xml:space="preserve"> prece deve ter. E para isso ele apresenta algumas passagens evangélicas que vamos analisar aqui.</w:t>
+      </w:r>
+    </w:p>
+    <w:p>
+      <w:pPr>
+        <w:pStyle w:val="Normal"/>
+        <w:jc w:val="both"/>
+        <w:rPr>
+          <w:color w:val="auto"/>
+        </w:rPr>
+      </w:pPr>
+      <w:r>
+        <w:rPr>
+          <w:color w:val="auto"/>
+        </w:rPr>
+      </w:r>
+    </w:p>
+    <w:p>
+      <w:pPr>
+        <w:pStyle w:val="Normal"/>
+        <w:jc w:val="both"/>
+        <w:rPr>
+          <w:color w:val="auto"/>
+        </w:rPr>
+      </w:pPr>
+      <w:r>
+        <w:rPr>
+          <w:rFonts w:eastAsia="Times New Roman" w:cs="Times New Roman" w:ascii="Garamond" w:hAnsi="Garamond"/>
+          <w:color w:val="000000"/>
+          <w:kern w:val="0"/>
+          <w:sz w:val="36"/>
+          <w:szCs w:val="36"/>
+          <w:shd w:fill="auto" w:val="clear"/>
+          <w:lang w:val="en-US" w:eastAsia="zh-CN" w:bidi="hi-IN"/>
+        </w:rPr>
+        <w:t xml:space="preserve">Primeiro ele nos </w:t>
+      </w:r>
+      <w:r>
+        <w:rPr>
+          <w:rFonts w:eastAsia="Times New Roman" w:cs="Times New Roman" w:ascii="Garamond" w:hAnsi="Garamond"/>
+          <w:color w:val="000000"/>
+          <w:kern w:val="0"/>
+          <w:sz w:val="36"/>
+          <w:szCs w:val="36"/>
+          <w:shd w:fill="auto" w:val="clear"/>
+          <w:lang w:val="en-US" w:eastAsia="zh-CN" w:bidi="hi-IN"/>
+        </w:rPr>
+        <w:t>traz</w:t>
+      </w:r>
+      <w:r>
+        <w:rPr>
+          <w:rFonts w:eastAsia="Times New Roman" w:cs="Times New Roman" w:ascii="Garamond" w:hAnsi="Garamond"/>
+          <w:color w:val="000000"/>
+          <w:kern w:val="0"/>
+          <w:sz w:val="36"/>
+          <w:szCs w:val="36"/>
+          <w:shd w:fill="auto" w:val="clear"/>
+          <w:lang w:val="en-US" w:eastAsia="zh-CN" w:bidi="hi-IN"/>
+        </w:rPr>
+        <w:t xml:space="preserve"> o que Jesus diz em Mateus 6:5-8:</w:t>
+      </w:r>
+    </w:p>
+    <w:p>
+      <w:pPr>
+        <w:pStyle w:val="Normal"/>
+        <w:jc w:val="both"/>
+        <w:rPr>
+          <w:color w:val="auto"/>
+        </w:rPr>
+      </w:pPr>
+      <w:r>
+        <w:rPr>
+          <w:color w:val="auto"/>
+        </w:rPr>
       </w:r>
     </w:p>
     <w:p>
@@ -1504,7 +1534,9 @@
         </w:rPr>
       </w:pPr>
       <w:r>
-        <w:rPr/>
+        <w:rPr>
+          <w:color w:val="auto"/>
+        </w:rPr>
       </w:r>
     </w:p>
     <w:p>
@@ -1530,35 +1562,56 @@
           <w:shd w:fill="auto" w:val="clear"/>
           <w:lang w:val="en-US" w:eastAsia="zh-CN" w:bidi="hi-IN"/>
         </w:rPr>
-        <w:t>Não cuideis de pedir muito nas vossas preces, como fazem os pagãos, os quais imaginam que pela multiplicidade das palavras é que serão atendidos. Não v</w:t>
-      </w:r>
-      <w:r>
-        <w:rPr>
-          <w:rFonts w:eastAsia="Times New Roman" w:cs="Times New Roman" w:ascii="Garamond" w:hAnsi="Garamond"/>
-          <w:i/>
-          <w:iCs/>
-          <w:color w:val="000000"/>
-          <w:kern w:val="0"/>
-          <w:sz w:val="36"/>
-          <w:szCs w:val="36"/>
-          <w:shd w:fill="auto" w:val="clear"/>
-          <w:lang w:val="en-US" w:eastAsia="zh-CN" w:bidi="hi-IN"/>
-        </w:rPr>
-        <w:t>o</w:t>
-      </w:r>
-      <w:r>
-        <w:rPr>
-          <w:rFonts w:eastAsia="Times New Roman" w:cs="Times New Roman" w:ascii="Garamond" w:hAnsi="Garamond"/>
-          <w:i/>
-          <w:iCs/>
-          <w:color w:val="000000"/>
-          <w:kern w:val="0"/>
-          <w:sz w:val="36"/>
-          <w:szCs w:val="36"/>
-          <w:shd w:fill="auto" w:val="clear"/>
-          <w:lang w:val="en-US" w:eastAsia="zh-CN" w:bidi="hi-IN"/>
-        </w:rPr>
-        <w:t xml:space="preserve">s torneis semelhantes a eles, porque vosso Pai sabe do que é que tendes necessidade, antes que lho peçais. </w:t>
+        <w:t xml:space="preserve">Não cuideis de pedir muito nas vossas preces, como fazem os pagãos, os quais imaginam que pela multiplicidade das palavras é que serão atendidos. Não vos torneis semelhantes a eles, porque vosso Pai sabe do que é que tendes necessidade, antes que lho peçais. </w:t>
+      </w:r>
+    </w:p>
+    <w:p>
+      <w:pPr>
+        <w:pStyle w:val="Normal"/>
+        <w:jc w:val="both"/>
+        <w:rPr>
+          <w:color w:val="auto"/>
+        </w:rPr>
+      </w:pPr>
+      <w:r>
+        <w:rPr>
+          <w:color w:val="auto"/>
+        </w:rPr>
+      </w:r>
+    </w:p>
+    <w:p>
+      <w:pPr>
+        <w:pStyle w:val="Normal"/>
+        <w:jc w:val="both"/>
+        <w:rPr>
+          <w:color w:val="auto"/>
+        </w:rPr>
+      </w:pPr>
+      <w:r>
+        <w:rPr>
+          <w:color w:val="auto"/>
+        </w:rPr>
+      </w:r>
+    </w:p>
+    <w:p>
+      <w:pPr>
+        <w:pStyle w:val="Normal"/>
+        <w:jc w:val="both"/>
+        <w:rPr>
+          <w:color w:val="auto"/>
+        </w:rPr>
+      </w:pPr>
+      <w:r>
+        <w:rPr>
+          <w:rFonts w:eastAsia="Times New Roman" w:cs="Times New Roman" w:ascii="Garamond" w:hAnsi="Garamond"/>
+          <w:color w:val="000000"/>
+          <w:kern w:val="0"/>
+          <w:sz w:val="36"/>
+          <w:szCs w:val="36"/>
+          <w:shd w:fill="auto" w:val="clear"/>
+          <w:lang w:val="en-US" w:eastAsia="zh-CN" w:bidi="hi-IN"/>
+        </w:rPr>
+        <w:t>Quando Jesus diz que, para orarmos, devemos entrar para nosso quarto, fechar a porta e orar em secreto, Ele estava se utilizando de uma simbologia.</w:t>
       </w:r>
     </w:p>
     <w:p>
@@ -1582,6 +1635,51 @@
         </w:rPr>
       </w:pPr>
       <w:r>
+        <w:rPr>
+          <w:rFonts w:eastAsia="Times New Roman" w:cs="Times New Roman" w:ascii="Garamond" w:hAnsi="Garamond"/>
+          <w:color w:val="000000"/>
+          <w:kern w:val="0"/>
+          <w:sz w:val="36"/>
+          <w:szCs w:val="36"/>
+          <w:shd w:fill="auto" w:val="clear"/>
+          <w:lang w:val="en-US" w:eastAsia="zh-CN" w:bidi="hi-IN"/>
+        </w:rPr>
+        <w:t>Ninguém duvida que</w:t>
+      </w:r>
+      <w:r>
+        <w:rPr>
+          <w:rFonts w:eastAsia="Times New Roman" w:cs="Times New Roman" w:ascii="Garamond" w:hAnsi="Garamond"/>
+          <w:color w:val="000000"/>
+          <w:kern w:val="0"/>
+          <w:sz w:val="36"/>
+          <w:szCs w:val="36"/>
+          <w:shd w:fill="auto" w:val="clear"/>
+          <w:lang w:val="en-US" w:eastAsia="zh-CN" w:bidi="hi-IN"/>
+        </w:rPr>
+        <w:t xml:space="preserve"> um ambiente silencioso e calmo favorece a oração, mas </w:t>
+      </w:r>
+      <w:r>
+        <w:rPr>
+          <w:rFonts w:eastAsia="Times New Roman" w:cs="Times New Roman" w:ascii="Garamond" w:hAnsi="Garamond"/>
+          <w:color w:val="000000"/>
+          <w:kern w:val="0"/>
+          <w:sz w:val="36"/>
+          <w:szCs w:val="36"/>
+          <w:shd w:fill="auto" w:val="clear"/>
+          <w:lang w:val="en-US" w:eastAsia="zh-CN" w:bidi="hi-IN"/>
+        </w:rPr>
+        <w:t>isso não quer dizer que estamos impossibilitados de alcançar a paz interior estando longe dos redutos de tranquilidade. Se assim fosse, nossos momentos de oração seriam escassos.</w:t>
+      </w:r>
+    </w:p>
+    <w:p>
+      <w:pPr>
+        <w:pStyle w:val="Normal"/>
+        <w:jc w:val="both"/>
+        <w:rPr>
+          <w:color w:val="auto"/>
+        </w:rPr>
+      </w:pPr>
+      <w:r>
         <w:rPr/>
       </w:r>
     </w:p>
@@ -1594,27 +1692,6 @@
         </w:rPr>
       </w:pPr>
       <w:r>
-        <w:rPr>
-          <w:rFonts w:eastAsia="Times New Roman" w:cs="Times New Roman" w:ascii="Garamond" w:hAnsi="Garamond"/>
-          <w:color w:val="000000"/>
-          <w:kern w:val="0"/>
-          <w:sz w:val="36"/>
-          <w:szCs w:val="36"/>
-          <w:shd w:fill="auto" w:val="clear"/>
-          <w:lang w:val="en-US" w:eastAsia="zh-CN" w:bidi="hi-IN"/>
-        </w:rPr>
-        <w:t>Quando Jesus diz que, para orarmos, devemos entrar para nosso quarto, fechar a porta e orar em secreto, Ele estava se utilizando de uma simbologia. Claro que um ambiente silencioso e calmo favorece a oração, mas se condicionarmos nossas preces somente a locais e momentos tranquilos. Se assim fosse, seria impossível alcançar qualquer paz interior estando longe desses redutos de tranquilidade.</w:t>
-      </w:r>
-    </w:p>
-    <w:p>
-      <w:pPr>
-        <w:pStyle w:val="Normal"/>
-        <w:jc w:val="both"/>
-        <w:rPr>
-          <w:color w:val="auto"/>
-        </w:rPr>
-      </w:pPr>
-      <w:r>
         <w:rPr/>
       </w:r>
     </w:p>
@@ -1636,7 +1713,7 @@
           <w:shd w:fill="auto" w:val="clear"/>
           <w:lang w:val="en-US" w:eastAsia="zh-CN" w:bidi="hi-IN"/>
         </w:rPr>
-        <w:t>O que Jesus quis dizer é que somente na mais plena intimidade do nosso ser, imbuídos dos mais sinceros sentimentos é que estaremos em condição de entrar em contato com Ele e com o Pai Celestial.</w:t>
+        <w:t>Imaginem a seguinte situação: suponham que eu esteja no ônibus lotado, em pé, voltando para casa depois de um dia de trabalho difícil, em meio a um trânsito barulhento e caótico.</w:t>
       </w:r>
     </w:p>
     <w:p>
@@ -1660,107 +1737,319 @@
         </w:rPr>
       </w:pPr>
       <w:r>
+        <w:rPr>
+          <w:rFonts w:eastAsia="Times New Roman" w:cs="Times New Roman" w:ascii="Garamond" w:hAnsi="Garamond"/>
+          <w:color w:val="000000"/>
+          <w:kern w:val="0"/>
+          <w:sz w:val="36"/>
+          <w:szCs w:val="36"/>
+          <w:shd w:fill="auto" w:val="clear"/>
+          <w:lang w:val="en-US" w:eastAsia="zh-CN" w:bidi="hi-IN"/>
+        </w:rPr>
+        <w:t>De repente alguém me manda uma mensagem no WhatsApp informando que um amigo querido sofreu um acidente grave e está internado correndo risco de morrer. A pessoa diz que depois me dá mais informações sobre o acontecido.</w:t>
+      </w:r>
+    </w:p>
+    <w:p>
+      <w:pPr>
+        <w:pStyle w:val="Normal"/>
+        <w:jc w:val="both"/>
+        <w:rPr>
+          <w:color w:val="auto"/>
+        </w:rPr>
+      </w:pPr>
+      <w:r>
         <w:rPr/>
       </w:r>
     </w:p>
     <w:p>
       <w:pPr>
         <w:pStyle w:val="Normal"/>
-        <w:numPr>
-          <w:ilvl w:val="0"/>
-          <w:numId w:val="2"/>
-        </w:numPr>
-        <w:jc w:val="both"/>
-        <w:rPr>
-          <w:color w:val="auto"/>
-        </w:rPr>
-      </w:pPr>
-      <w:r>
-        <w:rPr>
-          <w:rFonts w:eastAsia="Times New Roman" w:cs="Times New Roman" w:ascii="Garamond" w:hAnsi="Garamond"/>
-          <w:color w:val="000000"/>
-          <w:kern w:val="0"/>
-          <w:sz w:val="36"/>
-          <w:szCs w:val="36"/>
-          <w:shd w:fill="auto" w:val="clear"/>
-          <w:lang w:val="en-US" w:eastAsia="zh-CN" w:bidi="hi-IN"/>
-        </w:rPr>
-        <w:t>Entrar para o quarto para orar é uma simbologia. Não precisamos disso para orar. Ver se dá para encaixar o texto da lição Lugar Deserto aqui;</w:t>
-      </w:r>
-    </w:p>
-    <w:p>
-      <w:pPr>
-        <w:pStyle w:val="Normal"/>
-        <w:numPr>
-          <w:ilvl w:val="0"/>
-          <w:numId w:val="2"/>
-        </w:numPr>
-        <w:jc w:val="both"/>
-        <w:rPr>
-          <w:color w:val="auto"/>
-        </w:rPr>
-      </w:pPr>
-      <w:r>
-        <w:rPr>
-          <w:rFonts w:eastAsia="Times New Roman" w:cs="Times New Roman" w:ascii="Garamond" w:hAnsi="Garamond"/>
-          <w:color w:val="000000"/>
-          <w:kern w:val="0"/>
-          <w:sz w:val="36"/>
-          <w:szCs w:val="36"/>
-          <w:shd w:fill="auto" w:val="clear"/>
-          <w:lang w:val="en-US" w:eastAsia="zh-CN" w:bidi="hi-IN"/>
-        </w:rPr>
-        <w:t>Podemos orar em qualquer lugar, inclusive nos mais tumultuados. Por quê deveríamos deixar de orar simplesmente porque estamos na multidão, no coletivo lotado ou na via pública tumultuada;</w:t>
-      </w:r>
-    </w:p>
-    <w:p>
-      <w:pPr>
-        <w:pStyle w:val="Normal"/>
-        <w:numPr>
-          <w:ilvl w:val="0"/>
-          <w:numId w:val="2"/>
-        </w:numPr>
-        <w:jc w:val="both"/>
-        <w:rPr>
-          <w:color w:val="auto"/>
-        </w:rPr>
-      </w:pPr>
-      <w:r>
-        <w:rPr>
-          <w:rFonts w:eastAsia="Times New Roman" w:cs="Times New Roman" w:ascii="Garamond" w:hAnsi="Garamond"/>
-          <w:color w:val="000000"/>
-          <w:kern w:val="0"/>
-          <w:sz w:val="36"/>
-          <w:szCs w:val="36"/>
-          <w:shd w:fill="auto" w:val="clear"/>
-          <w:lang w:val="en-US" w:eastAsia="zh-CN" w:bidi="hi-IN"/>
-        </w:rPr>
-        <w:t xml:space="preserve">Nossa oração pode ser útil a alguém acidentado na via pública. </w:t>
-      </w:r>
-    </w:p>
-    <w:p>
-      <w:pPr>
-        <w:pStyle w:val="Normal"/>
-        <w:numPr>
-          <w:ilvl w:val="0"/>
-          <w:numId w:val="2"/>
-        </w:numPr>
-        <w:jc w:val="both"/>
-        <w:rPr>
-          <w:color w:val="auto"/>
-        </w:rPr>
-      </w:pPr>
-      <w:r>
-        <w:rPr>
-          <w:rFonts w:eastAsia="Times New Roman" w:cs="Times New Roman" w:ascii="Garamond" w:hAnsi="Garamond"/>
-          <w:color w:val="000000"/>
-          <w:kern w:val="0"/>
-          <w:sz w:val="36"/>
-          <w:szCs w:val="36"/>
-          <w:shd w:fill="auto" w:val="clear"/>
-          <w:lang w:val="en-US" w:eastAsia="zh-CN" w:bidi="hi-IN"/>
-        </w:rPr>
-        <w:t>Sugerir mudança de postura diante das tragédias cotidianas: em vez da curiosidade mórbida e inútil, oremos por aqueles que virmos acidentados ou desencarnados nos acidentes;</w:t>
+        <w:jc w:val="both"/>
+        <w:rPr>
+          <w:color w:val="auto"/>
+        </w:rPr>
+      </w:pPr>
+      <w:r>
+        <w:rPr>
+          <w:rFonts w:eastAsia="Times New Roman" w:cs="Times New Roman" w:ascii="Garamond" w:hAnsi="Garamond"/>
+          <w:color w:val="000000"/>
+          <w:kern w:val="0"/>
+          <w:sz w:val="36"/>
+          <w:szCs w:val="36"/>
+          <w:shd w:fill="auto" w:val="clear"/>
+          <w:lang w:val="en-US" w:eastAsia="zh-CN" w:bidi="hi-IN"/>
+        </w:rPr>
+        <w:t xml:space="preserve">O lugar e a hora em que me encontro são os mais adequados para a prece? Claro que não. Mas vou deixar de orar por meu amigo só porque não estou em um ambiente favorável à oração? De maneira alguma. </w:t>
+      </w:r>
+    </w:p>
+    <w:p>
+      <w:pPr>
+        <w:pStyle w:val="Normal"/>
+        <w:jc w:val="both"/>
+        <w:rPr>
+          <w:color w:val="auto"/>
+        </w:rPr>
+      </w:pPr>
+      <w:r>
+        <w:rPr/>
+      </w:r>
+    </w:p>
+    <w:p>
+      <w:pPr>
+        <w:pStyle w:val="Normal"/>
+        <w:jc w:val="both"/>
+        <w:rPr>
+          <w:color w:val="auto"/>
+        </w:rPr>
+      </w:pPr>
+      <w:r>
+        <w:rPr>
+          <w:rFonts w:eastAsia="Times New Roman" w:cs="Times New Roman" w:ascii="Garamond" w:hAnsi="Garamond"/>
+          <w:color w:val="000000"/>
+          <w:kern w:val="0"/>
+          <w:sz w:val="36"/>
+          <w:szCs w:val="36"/>
+          <w:shd w:fill="auto" w:val="clear"/>
+          <w:lang w:val="en-US" w:eastAsia="zh-CN" w:bidi="hi-IN"/>
+        </w:rPr>
+        <w:t>Eu posso e devo orar por meu amigo ali mesmo, naquelas condições. Com algum esforço da minha parte consigo me abstrair do tumulto à minha volta e elevar a Deus, a Jesus e aos Espíritos amigos minhas rogativas em favor do amigo acidentado.</w:t>
+      </w:r>
+    </w:p>
+    <w:p>
+      <w:pPr>
+        <w:pStyle w:val="Normal"/>
+        <w:jc w:val="both"/>
+        <w:rPr>
+          <w:color w:val="auto"/>
+        </w:rPr>
+      </w:pPr>
+      <w:r>
+        <w:rPr/>
+      </w:r>
+    </w:p>
+    <w:p>
+      <w:pPr>
+        <w:pStyle w:val="Normal"/>
+        <w:jc w:val="both"/>
+        <w:rPr>
+          <w:color w:val="auto"/>
+        </w:rPr>
+      </w:pPr>
+      <w:r>
+        <w:rPr>
+          <w:rFonts w:eastAsia="Times New Roman" w:cs="Times New Roman" w:ascii="Garamond" w:hAnsi="Garamond"/>
+          <w:color w:val="000000"/>
+          <w:kern w:val="0"/>
+          <w:sz w:val="36"/>
+          <w:szCs w:val="36"/>
+          <w:shd w:fill="auto" w:val="clear"/>
+          <w:lang w:val="en-US" w:eastAsia="zh-CN" w:bidi="hi-IN"/>
+        </w:rPr>
+        <w:t>Depois, quando eu estiver na tranquilidade do meu lar, eu oro novamente em condições mais adequadas, mas não devo prescindir da prece enquanto eu ainda estou no ônibus.</w:t>
+      </w:r>
+    </w:p>
+    <w:p>
+      <w:pPr>
+        <w:pStyle w:val="Normal"/>
+        <w:jc w:val="both"/>
+        <w:rPr>
+          <w:color w:val="auto"/>
+        </w:rPr>
+      </w:pPr>
+      <w:r>
+        <w:rPr/>
+      </w:r>
+    </w:p>
+    <w:p>
+      <w:pPr>
+        <w:pStyle w:val="Normal"/>
+        <w:jc w:val="both"/>
+        <w:rPr>
+          <w:color w:val="auto"/>
+        </w:rPr>
+      </w:pPr>
+      <w:r>
+        <w:rPr>
+          <w:rFonts w:eastAsia="Times New Roman" w:cs="Times New Roman" w:ascii="Garamond" w:hAnsi="Garamond"/>
+          <w:color w:val="000000"/>
+          <w:kern w:val="0"/>
+          <w:sz w:val="36"/>
+          <w:szCs w:val="36"/>
+          <w:shd w:fill="auto" w:val="clear"/>
+          <w:lang w:val="en-US" w:eastAsia="zh-CN" w:bidi="hi-IN"/>
+        </w:rPr>
+        <w:t xml:space="preserve">Então, ao dizer que devemos orar em secreto no nosso quarto, Jesus está nos dando </w:t>
+      </w:r>
+      <w:r>
+        <w:rPr>
+          <w:rFonts w:eastAsia="Times New Roman" w:cs="Times New Roman" w:ascii="Garamond" w:hAnsi="Garamond"/>
+          <w:color w:val="000000"/>
+          <w:kern w:val="0"/>
+          <w:sz w:val="36"/>
+          <w:szCs w:val="36"/>
+          <w:shd w:fill="auto" w:val="clear"/>
+          <w:lang w:val="en-US" w:eastAsia="zh-CN" w:bidi="hi-IN"/>
+        </w:rPr>
+        <w:t>uma recomendação clara e direta</w:t>
+      </w:r>
+      <w:r>
+        <w:rPr>
+          <w:rFonts w:eastAsia="Times New Roman" w:cs="Times New Roman" w:ascii="Garamond" w:hAnsi="Garamond"/>
+          <w:color w:val="000000"/>
+          <w:kern w:val="0"/>
+          <w:sz w:val="36"/>
+          <w:szCs w:val="36"/>
+          <w:shd w:fill="auto" w:val="clear"/>
+          <w:lang w:val="en-US" w:eastAsia="zh-CN" w:bidi="hi-IN"/>
+        </w:rPr>
+        <w:t xml:space="preserve"> </w:t>
+      </w:r>
+      <w:r>
+        <w:rPr>
+          <w:rFonts w:eastAsia="Times New Roman" w:cs="Times New Roman" w:ascii="Garamond" w:hAnsi="Garamond"/>
+          <w:color w:val="000000"/>
+          <w:kern w:val="0"/>
+          <w:sz w:val="36"/>
+          <w:szCs w:val="36"/>
+          <w:shd w:fill="auto" w:val="clear"/>
+          <w:lang w:val="en-US" w:eastAsia="zh-CN" w:bidi="hi-IN"/>
+        </w:rPr>
+        <w:t>com relação à sinceridade e ao recolhimento que devem existir naqueles que desejam se colocar em sintonia com os planos mais altos da vida</w:t>
+      </w:r>
+      <w:r>
+        <w:rPr>
+          <w:rFonts w:eastAsia="Times New Roman" w:cs="Times New Roman" w:ascii="Garamond" w:hAnsi="Garamond"/>
+          <w:color w:val="000000"/>
+          <w:kern w:val="0"/>
+          <w:sz w:val="36"/>
+          <w:szCs w:val="36"/>
+          <w:shd w:fill="auto" w:val="clear"/>
+          <w:lang w:val="en-US" w:eastAsia="zh-CN" w:bidi="hi-IN"/>
+        </w:rPr>
+        <w:t>, embora isso não necessariamente exija um lugar silencioso e isolado.</w:t>
+      </w:r>
+    </w:p>
+    <w:p>
+      <w:pPr>
+        <w:pStyle w:val="Normal"/>
+        <w:jc w:val="both"/>
+        <w:rPr>
+          <w:color w:val="auto"/>
+        </w:rPr>
+      </w:pPr>
+      <w:r>
+        <w:rPr/>
+      </w:r>
+    </w:p>
+    <w:p>
+      <w:pPr>
+        <w:pStyle w:val="Normal"/>
+        <w:jc w:val="both"/>
+        <w:rPr>
+          <w:color w:val="auto"/>
+        </w:rPr>
+      </w:pPr>
+      <w:r>
+        <w:rPr>
+          <w:rFonts w:eastAsia="Times New Roman" w:cs="Times New Roman" w:ascii="Garamond" w:hAnsi="Garamond"/>
+          <w:color w:val="000000"/>
+          <w:kern w:val="0"/>
+          <w:sz w:val="36"/>
+          <w:szCs w:val="36"/>
+          <w:shd w:fill="auto" w:val="clear"/>
+          <w:lang w:val="en-US" w:eastAsia="zh-CN" w:bidi="hi-IN"/>
+        </w:rPr>
+        <w:t>Quando tomamos consciência disso, a oração passa a ser um recurso ainda mais valioso para nós. Podemos, por exemplo, orar por um irmão embriagado ou drogado caído na calçada ao passarmos por ele; podemos também orar por alguém acidentado na via pública.</w:t>
+      </w:r>
+    </w:p>
+    <w:p>
+      <w:pPr>
+        <w:pStyle w:val="Normal"/>
+        <w:jc w:val="both"/>
+        <w:rPr>
+          <w:color w:val="auto"/>
+        </w:rPr>
+      </w:pPr>
+      <w:r>
+        <w:rPr/>
+      </w:r>
+    </w:p>
+    <w:p>
+      <w:pPr>
+        <w:pStyle w:val="Normal"/>
+        <w:jc w:val="both"/>
+        <w:rPr>
+          <w:color w:val="auto"/>
+        </w:rPr>
+      </w:pPr>
+      <w:r>
+        <w:rPr>
+          <w:rFonts w:eastAsia="Times New Roman" w:cs="Times New Roman" w:ascii="Garamond" w:hAnsi="Garamond"/>
+          <w:color w:val="000000"/>
+          <w:kern w:val="0"/>
+          <w:sz w:val="36"/>
+          <w:szCs w:val="36"/>
+          <w:shd w:fill="auto" w:val="clear"/>
+          <w:lang w:val="en-US" w:eastAsia="zh-CN" w:bidi="hi-IN"/>
+        </w:rPr>
+        <w:t>Diga-se de passagem, é difícil compreender a curiosidade mórbida que muitos têm em ver vítimas feridas ou mortas em acidentes. Já repararam que quando acontece um acidente de trânsito em uma pista, a outra também fica com o trânsito lento? É porque as pessoas dirigindo em sentido contrário reduzem a velocidade para ver o que aconteceu.</w:t>
+      </w:r>
+    </w:p>
+    <w:p>
+      <w:pPr>
+        <w:pStyle w:val="Normal"/>
+        <w:jc w:val="both"/>
+        <w:rPr>
+          <w:color w:val="auto"/>
+        </w:rPr>
+      </w:pPr>
+      <w:r>
+        <w:rPr/>
+      </w:r>
+    </w:p>
+    <w:p>
+      <w:pPr>
+        <w:pStyle w:val="Normal"/>
+        <w:jc w:val="both"/>
+        <w:rPr>
+          <w:color w:val="auto"/>
+        </w:rPr>
+      </w:pPr>
+      <w:r>
+        <w:rPr>
+          <w:rFonts w:eastAsia="Times New Roman" w:cs="Times New Roman" w:ascii="Garamond" w:hAnsi="Garamond"/>
+          <w:color w:val="000000"/>
+          <w:kern w:val="0"/>
+          <w:sz w:val="36"/>
+          <w:szCs w:val="36"/>
+          <w:shd w:fill="auto" w:val="clear"/>
+          <w:lang w:val="en-US" w:eastAsia="zh-CN" w:bidi="hi-IN"/>
+        </w:rPr>
+        <w:t>Se ainda carregamos esse tipo de curiosidade conosco, vamos mudar de postura. Em vez de querer ver o que aconteceu, elevemos um pensamento a Deus, pedindo socorro para os feridos e amparo aos que desencarnaram. Fazemos essa oração e seguimos nosso caminho Podemos e devemos seguir nosso caminho,</w:t>
+      </w:r>
+    </w:p>
+    <w:p>
+      <w:pPr>
+        <w:pStyle w:val="Normal"/>
+        <w:jc w:val="both"/>
+        <w:rPr>
+          <w:color w:val="auto"/>
+        </w:rPr>
+      </w:pPr>
+      <w:r>
+        <w:rPr/>
+      </w:r>
+    </w:p>
+    <w:p>
+      <w:pPr>
+        <w:pStyle w:val="Normal"/>
+        <w:jc w:val="both"/>
+        <w:rPr>
+          <w:color w:val="auto"/>
+        </w:rPr>
+      </w:pPr>
+      <w:r>
+        <w:rPr/>
       </w:r>
     </w:p>
     <w:p>
@@ -4979,7 +5268,7 @@
         <w:bCs/>
         <w:rFonts w:ascii="Garamond" w:hAnsi="Garamond"/>
       </w:rPr>
-      <w:t>28</w:t>
+      <w:t>29</w:t>
     </w:r>
     <w:r>
       <w:rPr>

</xml_diff>

<commit_message>
04/03/2026 - 23:21 h
</commit_message>
<xml_diff>
--- a/Pedi e obtereis/Pedi e obtereis.docx
+++ b/Pedi e obtereis/Pedi e obtereis.docx
@@ -1304,7 +1304,79 @@
           <w:shd w:fill="auto" w:val="clear"/>
           <w:lang w:val="en-US" w:eastAsia="zh-CN" w:bidi="hi-IN"/>
         </w:rPr>
-        <w:t xml:space="preserve">Mas como deve ser a nossa oração? De que maneira  conseguimos efetivamente nos colocar em contato com o Pai? Deus sempre ouve nossas preces? Podemos pedir qualquer coisa? </w:t>
+        <w:t xml:space="preserve">Mas como deve ser a nossa oração? De que maneira  conseguimos efetivamente nos colocar em contato com </w:t>
+      </w:r>
+      <w:r>
+        <w:rPr>
+          <w:rFonts w:eastAsia="Times New Roman" w:cs="Times New Roman" w:ascii="Garamond" w:hAnsi="Garamond"/>
+          <w:color w:val="000000"/>
+          <w:kern w:val="0"/>
+          <w:sz w:val="36"/>
+          <w:szCs w:val="36"/>
+          <w:shd w:fill="auto" w:val="clear"/>
+          <w:lang w:val="en-US" w:eastAsia="zh-CN" w:bidi="hi-IN"/>
+        </w:rPr>
+        <w:t>Deus e Jesus</w:t>
+      </w:r>
+      <w:r>
+        <w:rPr>
+          <w:rFonts w:eastAsia="Times New Roman" w:cs="Times New Roman" w:ascii="Garamond" w:hAnsi="Garamond"/>
+          <w:color w:val="000000"/>
+          <w:kern w:val="0"/>
+          <w:sz w:val="36"/>
+          <w:szCs w:val="36"/>
+          <w:shd w:fill="auto" w:val="clear"/>
+          <w:lang w:val="en-US" w:eastAsia="zh-CN" w:bidi="hi-IN"/>
+        </w:rPr>
+        <w:t xml:space="preserve">? </w:t>
+      </w:r>
+      <w:r>
+        <w:rPr>
+          <w:rFonts w:eastAsia="Times New Roman" w:cs="Times New Roman" w:ascii="Garamond" w:hAnsi="Garamond"/>
+          <w:color w:val="000000"/>
+          <w:kern w:val="0"/>
+          <w:sz w:val="36"/>
+          <w:szCs w:val="36"/>
+          <w:shd w:fill="auto" w:val="clear"/>
+          <w:lang w:val="en-US" w:eastAsia="zh-CN" w:bidi="hi-IN"/>
+        </w:rPr>
+        <w:t>Eles</w:t>
+      </w:r>
+      <w:r>
+        <w:rPr>
+          <w:rFonts w:eastAsia="Times New Roman" w:cs="Times New Roman" w:ascii="Garamond" w:hAnsi="Garamond"/>
+          <w:color w:val="000000"/>
+          <w:kern w:val="0"/>
+          <w:sz w:val="36"/>
+          <w:szCs w:val="36"/>
+          <w:shd w:fill="auto" w:val="clear"/>
+          <w:lang w:val="en-US" w:eastAsia="zh-CN" w:bidi="hi-IN"/>
+        </w:rPr>
+        <w:t xml:space="preserve"> sempre ouve</w:t>
+      </w:r>
+      <w:r>
+        <w:rPr>
+          <w:rFonts w:eastAsia="Times New Roman" w:cs="Times New Roman" w:ascii="Garamond" w:hAnsi="Garamond"/>
+          <w:color w:val="000000"/>
+          <w:kern w:val="0"/>
+          <w:sz w:val="36"/>
+          <w:szCs w:val="36"/>
+          <w:shd w:fill="auto" w:val="clear"/>
+          <w:lang w:val="en-US" w:eastAsia="zh-CN" w:bidi="hi-IN"/>
+        </w:rPr>
+        <w:t>m</w:t>
+      </w:r>
+      <w:r>
+        <w:rPr>
+          <w:rFonts w:eastAsia="Times New Roman" w:cs="Times New Roman" w:ascii="Garamond" w:hAnsi="Garamond"/>
+          <w:color w:val="000000"/>
+          <w:kern w:val="0"/>
+          <w:sz w:val="36"/>
+          <w:szCs w:val="36"/>
+          <w:shd w:fill="auto" w:val="clear"/>
+          <w:lang w:val="en-US" w:eastAsia="zh-CN" w:bidi="hi-IN"/>
+        </w:rPr>
+        <w:t xml:space="preserve"> nossas preces? Podemos pedir qualquer coisa? </w:t>
       </w:r>
     </w:p>
     <w:p>
@@ -1374,90 +1446,42 @@
           <w:shd w:fill="auto" w:val="clear"/>
           <w:lang w:val="en-US" w:eastAsia="zh-CN" w:bidi="hi-IN"/>
         </w:rPr>
-        <w:t xml:space="preserve">No início desse capítulo, Allan Kardec nos fala sobre a qualidade que </w:t>
-      </w:r>
-      <w:r>
-        <w:rPr>
-          <w:rFonts w:eastAsia="Times New Roman" w:cs="Times New Roman" w:ascii="Garamond" w:hAnsi="Garamond"/>
-          <w:color w:val="000000"/>
-          <w:kern w:val="0"/>
-          <w:sz w:val="36"/>
-          <w:szCs w:val="36"/>
-          <w:shd w:fill="auto" w:val="clear"/>
-          <w:lang w:val="en-US" w:eastAsia="zh-CN" w:bidi="hi-IN"/>
-        </w:rPr>
-        <w:t>a</w:t>
-      </w:r>
-      <w:r>
-        <w:rPr>
-          <w:rFonts w:eastAsia="Times New Roman" w:cs="Times New Roman" w:ascii="Garamond" w:hAnsi="Garamond"/>
-          <w:color w:val="000000"/>
-          <w:kern w:val="0"/>
-          <w:sz w:val="36"/>
-          <w:szCs w:val="36"/>
-          <w:shd w:fill="auto" w:val="clear"/>
-          <w:lang w:val="en-US" w:eastAsia="zh-CN" w:bidi="hi-IN"/>
-        </w:rPr>
-        <w:t xml:space="preserve"> prece deve ter. E para isso ele apresenta algumas passagens evangélicas que vamos analisar aqui.</w:t>
-      </w:r>
-    </w:p>
-    <w:p>
-      <w:pPr>
-        <w:pStyle w:val="Normal"/>
-        <w:jc w:val="both"/>
-        <w:rPr>
-          <w:color w:val="auto"/>
-        </w:rPr>
-      </w:pPr>
-      <w:r>
-        <w:rPr>
-          <w:color w:val="auto"/>
-        </w:rPr>
-      </w:r>
-    </w:p>
-    <w:p>
-      <w:pPr>
-        <w:pStyle w:val="Normal"/>
-        <w:jc w:val="both"/>
-        <w:rPr>
-          <w:color w:val="auto"/>
-        </w:rPr>
-      </w:pPr>
-      <w:r>
-        <w:rPr>
-          <w:rFonts w:eastAsia="Times New Roman" w:cs="Times New Roman" w:ascii="Garamond" w:hAnsi="Garamond"/>
-          <w:color w:val="000000"/>
-          <w:kern w:val="0"/>
-          <w:sz w:val="36"/>
-          <w:szCs w:val="36"/>
-          <w:shd w:fill="auto" w:val="clear"/>
-          <w:lang w:val="en-US" w:eastAsia="zh-CN" w:bidi="hi-IN"/>
-        </w:rPr>
-        <w:t xml:space="preserve">Primeiro ele nos </w:t>
-      </w:r>
-      <w:r>
-        <w:rPr>
-          <w:rFonts w:eastAsia="Times New Roman" w:cs="Times New Roman" w:ascii="Garamond" w:hAnsi="Garamond"/>
-          <w:color w:val="000000"/>
-          <w:kern w:val="0"/>
-          <w:sz w:val="36"/>
-          <w:szCs w:val="36"/>
-          <w:shd w:fill="auto" w:val="clear"/>
-          <w:lang w:val="en-US" w:eastAsia="zh-CN" w:bidi="hi-IN"/>
-        </w:rPr>
-        <w:t>traz</w:t>
-      </w:r>
-      <w:r>
-        <w:rPr>
-          <w:rFonts w:eastAsia="Times New Roman" w:cs="Times New Roman" w:ascii="Garamond" w:hAnsi="Garamond"/>
-          <w:color w:val="000000"/>
-          <w:kern w:val="0"/>
-          <w:sz w:val="36"/>
-          <w:szCs w:val="36"/>
-          <w:shd w:fill="auto" w:val="clear"/>
-          <w:lang w:val="en-US" w:eastAsia="zh-CN" w:bidi="hi-IN"/>
-        </w:rPr>
-        <w:t xml:space="preserve"> o que Jesus diz em Mateus 6:5-8:</w:t>
+        <w:t>No início desse capítulo, Allan Kardec nos fala sobre a qualidade que a prece deve ter. E para isso ele apresenta algumas passagens evangélicas que vamos analisar aqui.</w:t>
+      </w:r>
+    </w:p>
+    <w:p>
+      <w:pPr>
+        <w:pStyle w:val="Normal"/>
+        <w:jc w:val="both"/>
+        <w:rPr>
+          <w:color w:val="auto"/>
+        </w:rPr>
+      </w:pPr>
+      <w:r>
+        <w:rPr>
+          <w:color w:val="auto"/>
+        </w:rPr>
+      </w:r>
+    </w:p>
+    <w:p>
+      <w:pPr>
+        <w:pStyle w:val="Normal"/>
+        <w:jc w:val="both"/>
+        <w:rPr>
+          <w:color w:val="auto"/>
+        </w:rPr>
+      </w:pPr>
+      <w:r>
+        <w:rPr>
+          <w:rFonts w:eastAsia="Times New Roman" w:cs="Times New Roman" w:ascii="Garamond" w:hAnsi="Garamond"/>
+          <w:color w:val="000000"/>
+          <w:kern w:val="0"/>
+          <w:sz w:val="36"/>
+          <w:szCs w:val="36"/>
+          <w:shd w:fill="auto" w:val="clear"/>
+          <w:lang w:val="en-US" w:eastAsia="zh-CN" w:bidi="hi-IN"/>
+        </w:rPr>
+        <w:t>Primeiro ele nos traz o que Jesus diz em Mateus 6:5-8:</w:t>
       </w:r>
     </w:p>
     <w:p>
@@ -1623,6 +1647,636 @@
         </w:rPr>
       </w:pPr>
       <w:r>
+        <w:rPr>
+          <w:color w:val="auto"/>
+        </w:rPr>
+      </w:r>
+    </w:p>
+    <w:p>
+      <w:pPr>
+        <w:pStyle w:val="Normal"/>
+        <w:jc w:val="both"/>
+        <w:rPr>
+          <w:color w:val="auto"/>
+        </w:rPr>
+      </w:pPr>
+      <w:r>
+        <w:rPr>
+          <w:rFonts w:eastAsia="Times New Roman" w:cs="Times New Roman" w:ascii="Garamond" w:hAnsi="Garamond"/>
+          <w:color w:val="000000"/>
+          <w:kern w:val="0"/>
+          <w:sz w:val="36"/>
+          <w:szCs w:val="36"/>
+          <w:shd w:fill="auto" w:val="clear"/>
+          <w:lang w:val="en-US" w:eastAsia="zh-CN" w:bidi="hi-IN"/>
+        </w:rPr>
+        <w:t>Naturalmente</w:t>
+      </w:r>
+      <w:r>
+        <w:rPr>
+          <w:rFonts w:eastAsia="Times New Roman" w:cs="Times New Roman" w:ascii="Garamond" w:hAnsi="Garamond"/>
+          <w:color w:val="000000"/>
+          <w:kern w:val="0"/>
+          <w:sz w:val="36"/>
+          <w:szCs w:val="36"/>
+          <w:shd w:fill="auto" w:val="clear"/>
+          <w:lang w:val="en-US" w:eastAsia="zh-CN" w:bidi="hi-IN"/>
+        </w:rPr>
+        <w:t xml:space="preserve"> que um ambiente silencioso e calmo favorece a oração, mas isso não </w:t>
+      </w:r>
+      <w:r>
+        <w:rPr>
+          <w:rFonts w:eastAsia="Times New Roman" w:cs="Times New Roman" w:ascii="Garamond" w:hAnsi="Garamond"/>
+          <w:color w:val="000000"/>
+          <w:kern w:val="0"/>
+          <w:sz w:val="36"/>
+          <w:szCs w:val="36"/>
+          <w:shd w:fill="auto" w:val="clear"/>
+          <w:lang w:val="en-US" w:eastAsia="zh-CN" w:bidi="hi-IN"/>
+        </w:rPr>
+        <w:t>significa</w:t>
+      </w:r>
+      <w:r>
+        <w:rPr>
+          <w:rFonts w:eastAsia="Times New Roman" w:cs="Times New Roman" w:ascii="Garamond" w:hAnsi="Garamond"/>
+          <w:color w:val="000000"/>
+          <w:kern w:val="0"/>
+          <w:sz w:val="36"/>
+          <w:szCs w:val="36"/>
+          <w:shd w:fill="auto" w:val="clear"/>
+          <w:lang w:val="en-US" w:eastAsia="zh-CN" w:bidi="hi-IN"/>
+        </w:rPr>
+        <w:t xml:space="preserve"> que estamos impossibilitados de alcançar a paz interior estando longe dos redutos de tranquilidade. Se assim fosse, nossos momentos de oração seriam </w:t>
+      </w:r>
+      <w:r>
+        <w:rPr>
+          <w:rFonts w:eastAsia="Times New Roman" w:cs="Times New Roman" w:ascii="Garamond" w:hAnsi="Garamond"/>
+          <w:color w:val="000000"/>
+          <w:kern w:val="0"/>
+          <w:sz w:val="36"/>
+          <w:szCs w:val="36"/>
+          <w:shd w:fill="auto" w:val="clear"/>
+          <w:lang w:val="en-US" w:eastAsia="zh-CN" w:bidi="hi-IN"/>
+        </w:rPr>
+        <w:t>muito limitados</w:t>
+      </w:r>
+      <w:r>
+        <w:rPr>
+          <w:rFonts w:eastAsia="Times New Roman" w:cs="Times New Roman" w:ascii="Garamond" w:hAnsi="Garamond"/>
+          <w:color w:val="000000"/>
+          <w:kern w:val="0"/>
+          <w:sz w:val="36"/>
+          <w:szCs w:val="36"/>
+          <w:shd w:fill="auto" w:val="clear"/>
+          <w:lang w:val="en-US" w:eastAsia="zh-CN" w:bidi="hi-IN"/>
+        </w:rPr>
+        <w:t>.</w:t>
+      </w:r>
+    </w:p>
+    <w:p>
+      <w:pPr>
+        <w:pStyle w:val="Normal"/>
+        <w:jc w:val="both"/>
+        <w:rPr>
+          <w:color w:val="auto"/>
+        </w:rPr>
+      </w:pPr>
+      <w:r>
+        <w:rPr>
+          <w:color w:val="auto"/>
+        </w:rPr>
+      </w:r>
+    </w:p>
+    <w:p>
+      <w:pPr>
+        <w:pStyle w:val="Normal"/>
+        <w:jc w:val="both"/>
+        <w:rPr>
+          <w:color w:val="auto"/>
+        </w:rPr>
+      </w:pPr>
+      <w:r>
+        <w:rPr>
+          <w:color w:val="auto"/>
+        </w:rPr>
+      </w:r>
+    </w:p>
+    <w:p>
+      <w:pPr>
+        <w:pStyle w:val="Normal"/>
+        <w:jc w:val="both"/>
+        <w:rPr>
+          <w:color w:val="auto"/>
+        </w:rPr>
+      </w:pPr>
+      <w:r>
+        <w:rPr>
+          <w:rFonts w:eastAsia="Times New Roman" w:cs="Times New Roman" w:ascii="Garamond" w:hAnsi="Garamond"/>
+          <w:color w:val="000000"/>
+          <w:kern w:val="0"/>
+          <w:sz w:val="36"/>
+          <w:szCs w:val="36"/>
+          <w:shd w:fill="auto" w:val="clear"/>
+          <w:lang w:val="en-US" w:eastAsia="zh-CN" w:bidi="hi-IN"/>
+        </w:rPr>
+        <w:t>Vamos supor</w:t>
+      </w:r>
+      <w:r>
+        <w:rPr>
+          <w:rFonts w:eastAsia="Times New Roman" w:cs="Times New Roman" w:ascii="Garamond" w:hAnsi="Garamond"/>
+          <w:color w:val="000000"/>
+          <w:kern w:val="0"/>
+          <w:sz w:val="36"/>
+          <w:szCs w:val="36"/>
+          <w:shd w:fill="auto" w:val="clear"/>
+          <w:lang w:val="en-US" w:eastAsia="zh-CN" w:bidi="hi-IN"/>
+        </w:rPr>
+        <w:t xml:space="preserve"> a seguinte situação: eu </w:t>
+      </w:r>
+      <w:r>
+        <w:rPr>
+          <w:rFonts w:eastAsia="Times New Roman" w:cs="Times New Roman" w:ascii="Garamond" w:hAnsi="Garamond"/>
+          <w:color w:val="000000"/>
+          <w:kern w:val="0"/>
+          <w:sz w:val="36"/>
+          <w:szCs w:val="36"/>
+          <w:shd w:fill="auto" w:val="clear"/>
+          <w:lang w:val="en-US" w:eastAsia="zh-CN" w:bidi="hi-IN"/>
+        </w:rPr>
+        <w:t>estou</w:t>
+      </w:r>
+      <w:r>
+        <w:rPr>
+          <w:rFonts w:eastAsia="Times New Roman" w:cs="Times New Roman" w:ascii="Garamond" w:hAnsi="Garamond"/>
+          <w:color w:val="000000"/>
+          <w:kern w:val="0"/>
+          <w:sz w:val="36"/>
+          <w:szCs w:val="36"/>
+          <w:shd w:fill="auto" w:val="clear"/>
+          <w:lang w:val="en-US" w:eastAsia="zh-CN" w:bidi="hi-IN"/>
+        </w:rPr>
+        <w:t xml:space="preserve"> no ônibus lotado, em pé, voltando para casa depois de um dia de trabalho difícil</w:t>
+      </w:r>
+      <w:r>
+        <w:rPr>
+          <w:rFonts w:eastAsia="Times New Roman" w:cs="Times New Roman" w:ascii="Garamond" w:hAnsi="Garamond"/>
+          <w:color w:val="000000"/>
+          <w:kern w:val="0"/>
+          <w:sz w:val="36"/>
+          <w:szCs w:val="36"/>
+          <w:shd w:fill="auto" w:val="clear"/>
+          <w:lang w:val="en-US" w:eastAsia="zh-CN" w:bidi="hi-IN"/>
+        </w:rPr>
+        <w:t>. O trânsito, como de costume, está barulhento e caótico.</w:t>
+      </w:r>
+    </w:p>
+    <w:p>
+      <w:pPr>
+        <w:pStyle w:val="Normal"/>
+        <w:jc w:val="both"/>
+        <w:rPr>
+          <w:color w:val="auto"/>
+        </w:rPr>
+      </w:pPr>
+      <w:r>
+        <w:rPr>
+          <w:color w:val="auto"/>
+        </w:rPr>
+      </w:r>
+    </w:p>
+    <w:p>
+      <w:pPr>
+        <w:pStyle w:val="Normal"/>
+        <w:jc w:val="both"/>
+        <w:rPr>
+          <w:color w:val="auto"/>
+        </w:rPr>
+      </w:pPr>
+      <w:r>
+        <w:rPr>
+          <w:rFonts w:eastAsia="Times New Roman" w:cs="Times New Roman" w:ascii="Garamond" w:hAnsi="Garamond"/>
+          <w:color w:val="000000"/>
+          <w:kern w:val="0"/>
+          <w:sz w:val="36"/>
+          <w:szCs w:val="36"/>
+          <w:shd w:fill="auto" w:val="clear"/>
+          <w:lang w:val="en-US" w:eastAsia="zh-CN" w:bidi="hi-IN"/>
+        </w:rPr>
+        <w:t xml:space="preserve">De repente </w:t>
+      </w:r>
+      <w:r>
+        <w:rPr>
+          <w:rFonts w:eastAsia="Times New Roman" w:cs="Times New Roman" w:ascii="Garamond" w:hAnsi="Garamond"/>
+          <w:color w:val="000000"/>
+          <w:kern w:val="0"/>
+          <w:sz w:val="36"/>
+          <w:szCs w:val="36"/>
+          <w:shd w:fill="auto" w:val="clear"/>
+          <w:lang w:val="en-US" w:eastAsia="zh-CN" w:bidi="hi-IN"/>
+        </w:rPr>
+        <w:t>um amigo</w:t>
+      </w:r>
+      <w:r>
+        <w:rPr>
+          <w:rFonts w:eastAsia="Times New Roman" w:cs="Times New Roman" w:ascii="Garamond" w:hAnsi="Garamond"/>
+          <w:color w:val="000000"/>
+          <w:kern w:val="0"/>
+          <w:sz w:val="36"/>
+          <w:szCs w:val="36"/>
+          <w:shd w:fill="auto" w:val="clear"/>
+          <w:lang w:val="en-US" w:eastAsia="zh-CN" w:bidi="hi-IN"/>
+        </w:rPr>
+        <w:t xml:space="preserve"> me manda uma mensagem no WhatsApp informando que </w:t>
+      </w:r>
+      <w:r>
+        <w:rPr>
+          <w:rFonts w:eastAsia="Times New Roman" w:cs="Times New Roman" w:ascii="Garamond" w:hAnsi="Garamond"/>
+          <w:color w:val="000000"/>
+          <w:kern w:val="0"/>
+          <w:sz w:val="36"/>
+          <w:szCs w:val="36"/>
+          <w:shd w:fill="auto" w:val="clear"/>
+          <w:lang w:val="en-US" w:eastAsia="zh-CN" w:bidi="hi-IN"/>
+        </w:rPr>
+        <w:t>uma pessoa muito querida por nós dois</w:t>
+      </w:r>
+      <w:r>
+        <w:rPr>
+          <w:rFonts w:eastAsia="Times New Roman" w:cs="Times New Roman" w:ascii="Garamond" w:hAnsi="Garamond"/>
+          <w:color w:val="000000"/>
+          <w:kern w:val="0"/>
+          <w:sz w:val="36"/>
+          <w:szCs w:val="36"/>
+          <w:shd w:fill="auto" w:val="clear"/>
+          <w:lang w:val="en-US" w:eastAsia="zh-CN" w:bidi="hi-IN"/>
+        </w:rPr>
+        <w:t xml:space="preserve"> sofreu um acidente grave e </w:t>
+      </w:r>
+      <w:r>
+        <w:rPr>
+          <w:rFonts w:eastAsia="Times New Roman" w:cs="Times New Roman" w:ascii="Garamond" w:hAnsi="Garamond"/>
+          <w:color w:val="000000"/>
+          <w:kern w:val="0"/>
+          <w:sz w:val="36"/>
+          <w:szCs w:val="36"/>
+          <w:shd w:fill="auto" w:val="clear"/>
+          <w:lang w:val="en-US" w:eastAsia="zh-CN" w:bidi="hi-IN"/>
+        </w:rPr>
+        <w:t>corre risco de morte</w:t>
+      </w:r>
+      <w:r>
+        <w:rPr>
+          <w:rFonts w:eastAsia="Times New Roman" w:cs="Times New Roman" w:ascii="Garamond" w:hAnsi="Garamond"/>
+          <w:color w:val="000000"/>
+          <w:kern w:val="0"/>
+          <w:sz w:val="36"/>
+          <w:szCs w:val="36"/>
+          <w:shd w:fill="auto" w:val="clear"/>
+          <w:lang w:val="en-US" w:eastAsia="zh-CN" w:bidi="hi-IN"/>
+        </w:rPr>
+        <w:t xml:space="preserve">. </w:t>
+      </w:r>
+      <w:r>
+        <w:rPr>
+          <w:rFonts w:eastAsia="Times New Roman" w:cs="Times New Roman" w:ascii="Garamond" w:hAnsi="Garamond"/>
+          <w:color w:val="000000"/>
+          <w:kern w:val="0"/>
+          <w:sz w:val="36"/>
+          <w:szCs w:val="36"/>
+          <w:shd w:fill="auto" w:val="clear"/>
+          <w:lang w:val="en-US" w:eastAsia="zh-CN" w:bidi="hi-IN"/>
+        </w:rPr>
+        <w:t>Meu amigo me</w:t>
+      </w:r>
+      <w:r>
+        <w:rPr>
+          <w:rFonts w:eastAsia="Times New Roman" w:cs="Times New Roman" w:ascii="Garamond" w:hAnsi="Garamond"/>
+          <w:color w:val="000000"/>
+          <w:kern w:val="0"/>
+          <w:sz w:val="36"/>
+          <w:szCs w:val="36"/>
+          <w:shd w:fill="auto" w:val="clear"/>
+          <w:lang w:val="en-US" w:eastAsia="zh-CN" w:bidi="hi-IN"/>
+        </w:rPr>
+        <w:t xml:space="preserve"> diz que depois me dá mais informações sobre o acontecido.</w:t>
+      </w:r>
+    </w:p>
+    <w:p>
+      <w:pPr>
+        <w:pStyle w:val="Normal"/>
+        <w:jc w:val="both"/>
+        <w:rPr>
+          <w:color w:val="auto"/>
+        </w:rPr>
+      </w:pPr>
+      <w:r>
+        <w:rPr>
+          <w:color w:val="auto"/>
+        </w:rPr>
+      </w:r>
+    </w:p>
+    <w:p>
+      <w:pPr>
+        <w:pStyle w:val="Normal"/>
+        <w:jc w:val="both"/>
+        <w:rPr>
+          <w:color w:val="auto"/>
+        </w:rPr>
+      </w:pPr>
+      <w:r>
+        <w:rPr>
+          <w:rFonts w:eastAsia="Times New Roman" w:cs="Times New Roman" w:ascii="Garamond" w:hAnsi="Garamond"/>
+          <w:color w:val="000000"/>
+          <w:kern w:val="0"/>
+          <w:sz w:val="36"/>
+          <w:szCs w:val="36"/>
+          <w:shd w:fill="auto" w:val="clear"/>
+          <w:lang w:val="en-US" w:eastAsia="zh-CN" w:bidi="hi-IN"/>
+        </w:rPr>
+        <w:t xml:space="preserve">O lugar e a hora em que me encontro são os mais adequados para a prece? </w:t>
+      </w:r>
+      <w:r>
+        <w:rPr>
+          <w:rFonts w:eastAsia="Times New Roman" w:cs="Times New Roman" w:ascii="Garamond" w:hAnsi="Garamond"/>
+          <w:color w:val="000000"/>
+          <w:kern w:val="0"/>
+          <w:sz w:val="36"/>
+          <w:szCs w:val="36"/>
+          <w:shd w:fill="auto" w:val="clear"/>
+          <w:lang w:val="en-US" w:eastAsia="zh-CN" w:bidi="hi-IN"/>
+        </w:rPr>
+        <w:t>Definitivamente</w:t>
+      </w:r>
+      <w:r>
+        <w:rPr>
+          <w:rFonts w:eastAsia="Times New Roman" w:cs="Times New Roman" w:ascii="Garamond" w:hAnsi="Garamond"/>
+          <w:color w:val="000000"/>
+          <w:kern w:val="0"/>
+          <w:sz w:val="36"/>
+          <w:szCs w:val="36"/>
+          <w:shd w:fill="auto" w:val="clear"/>
+          <w:lang w:val="en-US" w:eastAsia="zh-CN" w:bidi="hi-IN"/>
+        </w:rPr>
+        <w:t xml:space="preserve"> que não. Mas vou deixar de orar </w:t>
+      </w:r>
+      <w:r>
+        <w:rPr>
+          <w:rFonts w:eastAsia="Times New Roman" w:cs="Times New Roman" w:ascii="Garamond" w:hAnsi="Garamond"/>
+          <w:color w:val="000000"/>
+          <w:kern w:val="0"/>
+          <w:sz w:val="36"/>
+          <w:szCs w:val="36"/>
+          <w:shd w:fill="auto" w:val="clear"/>
+          <w:lang w:val="en-US" w:eastAsia="zh-CN" w:bidi="hi-IN"/>
+        </w:rPr>
+        <w:t>por aquela pessoa querida</w:t>
+      </w:r>
+      <w:r>
+        <w:rPr>
+          <w:rFonts w:eastAsia="Times New Roman" w:cs="Times New Roman" w:ascii="Garamond" w:hAnsi="Garamond"/>
+          <w:color w:val="000000"/>
+          <w:kern w:val="0"/>
+          <w:sz w:val="36"/>
+          <w:szCs w:val="36"/>
+          <w:shd w:fill="auto" w:val="clear"/>
+          <w:lang w:val="en-US" w:eastAsia="zh-CN" w:bidi="hi-IN"/>
+        </w:rPr>
+        <w:t xml:space="preserve"> só porque não estou em um ambiente favorável à oração? De maneira alguma. </w:t>
+      </w:r>
+    </w:p>
+    <w:p>
+      <w:pPr>
+        <w:pStyle w:val="Normal"/>
+        <w:jc w:val="both"/>
+        <w:rPr>
+          <w:color w:val="auto"/>
+        </w:rPr>
+      </w:pPr>
+      <w:r>
+        <w:rPr>
+          <w:color w:val="auto"/>
+        </w:rPr>
+      </w:r>
+    </w:p>
+    <w:p>
+      <w:pPr>
+        <w:pStyle w:val="Normal"/>
+        <w:jc w:val="both"/>
+        <w:rPr>
+          <w:color w:val="auto"/>
+        </w:rPr>
+      </w:pPr>
+      <w:r>
+        <w:rPr>
+          <w:rFonts w:eastAsia="Times New Roman" w:cs="Times New Roman" w:ascii="Garamond" w:hAnsi="Garamond"/>
+          <w:color w:val="000000"/>
+          <w:kern w:val="0"/>
+          <w:sz w:val="36"/>
+          <w:szCs w:val="36"/>
+          <w:shd w:fill="auto" w:val="clear"/>
+          <w:lang w:val="en-US" w:eastAsia="zh-CN" w:bidi="hi-IN"/>
+        </w:rPr>
+        <w:t>Eu posso e devo orar ali mesmo, naquelas condições. Com algum esforço da minha parte consigo me abstrair do tumulto à minha volta e elevar a Deus, a Jesus e aos Espíritos amigos minhas rogativas em favor do amigo acidentado.</w:t>
+      </w:r>
+    </w:p>
+    <w:p>
+      <w:pPr>
+        <w:pStyle w:val="Normal"/>
+        <w:jc w:val="both"/>
+        <w:rPr>
+          <w:color w:val="auto"/>
+        </w:rPr>
+      </w:pPr>
+      <w:r>
+        <w:rPr>
+          <w:color w:val="auto"/>
+        </w:rPr>
+      </w:r>
+    </w:p>
+    <w:p>
+      <w:pPr>
+        <w:pStyle w:val="Normal"/>
+        <w:jc w:val="both"/>
+        <w:rPr>
+          <w:color w:val="auto"/>
+        </w:rPr>
+      </w:pPr>
+      <w:r>
+        <w:rPr>
+          <w:rFonts w:eastAsia="Times New Roman" w:cs="Times New Roman" w:ascii="Garamond" w:hAnsi="Garamond"/>
+          <w:color w:val="000000"/>
+          <w:kern w:val="0"/>
+          <w:sz w:val="36"/>
+          <w:szCs w:val="36"/>
+          <w:shd w:fill="auto" w:val="clear"/>
+          <w:lang w:val="en-US" w:eastAsia="zh-CN" w:bidi="hi-IN"/>
+        </w:rPr>
+        <w:t>Mais tarde</w:t>
+      </w:r>
+      <w:r>
+        <w:rPr>
+          <w:rFonts w:eastAsia="Times New Roman" w:cs="Times New Roman" w:ascii="Garamond" w:hAnsi="Garamond"/>
+          <w:color w:val="000000"/>
+          <w:kern w:val="0"/>
+          <w:sz w:val="36"/>
+          <w:szCs w:val="36"/>
+          <w:shd w:fill="auto" w:val="clear"/>
+          <w:lang w:val="en-US" w:eastAsia="zh-CN" w:bidi="hi-IN"/>
+        </w:rPr>
+        <w:t xml:space="preserve">, quando eu </w:t>
+      </w:r>
+      <w:r>
+        <w:rPr>
+          <w:rFonts w:eastAsia="Times New Roman" w:cs="Times New Roman" w:ascii="Garamond" w:hAnsi="Garamond"/>
+          <w:color w:val="000000"/>
+          <w:kern w:val="0"/>
+          <w:sz w:val="36"/>
+          <w:szCs w:val="36"/>
+          <w:shd w:fill="auto" w:val="clear"/>
+          <w:lang w:val="en-US" w:eastAsia="zh-CN" w:bidi="hi-IN"/>
+        </w:rPr>
+        <w:t xml:space="preserve">já </w:t>
+      </w:r>
+      <w:r>
+        <w:rPr>
+          <w:rFonts w:eastAsia="Times New Roman" w:cs="Times New Roman" w:ascii="Garamond" w:hAnsi="Garamond"/>
+          <w:color w:val="000000"/>
+          <w:kern w:val="0"/>
+          <w:sz w:val="36"/>
+          <w:szCs w:val="36"/>
+          <w:shd w:fill="auto" w:val="clear"/>
+          <w:lang w:val="en-US" w:eastAsia="zh-CN" w:bidi="hi-IN"/>
+        </w:rPr>
+        <w:t>estiver na tranquilidade do meu lar, eu oro novamente em condições mais adequadas, mas não devo prescindir da prece enquanto eu ainda estou no ônibus.</w:t>
+      </w:r>
+    </w:p>
+    <w:p>
+      <w:pPr>
+        <w:pStyle w:val="Normal"/>
+        <w:jc w:val="both"/>
+        <w:rPr>
+          <w:color w:val="auto"/>
+        </w:rPr>
+      </w:pPr>
+      <w:r>
+        <w:rPr>
+          <w:color w:val="auto"/>
+        </w:rPr>
+      </w:r>
+    </w:p>
+    <w:p>
+      <w:pPr>
+        <w:pStyle w:val="Normal"/>
+        <w:jc w:val="both"/>
+        <w:rPr>
+          <w:color w:val="auto"/>
+        </w:rPr>
+      </w:pPr>
+      <w:r>
+        <w:rPr>
+          <w:rFonts w:eastAsia="Times New Roman" w:cs="Times New Roman" w:ascii="Garamond" w:hAnsi="Garamond"/>
+          <w:color w:val="000000"/>
+          <w:kern w:val="0"/>
+          <w:sz w:val="36"/>
+          <w:szCs w:val="36"/>
+          <w:shd w:fill="auto" w:val="clear"/>
+          <w:lang w:val="en-US" w:eastAsia="zh-CN" w:bidi="hi-IN"/>
+        </w:rPr>
+        <w:t>Então, ao dizer que devemos orar em secreto no nosso quarto, Jesus está nos dando uma recomendação clara e direta com relação à sinceridade e ao recolhimento que devem existir naqueles que desejam se colocar em sintonia com os planos mais altos da vida, embora isso não necessariamente exija um lugar silencioso e isolado.</w:t>
+      </w:r>
+    </w:p>
+    <w:p>
+      <w:pPr>
+        <w:pStyle w:val="Normal"/>
+        <w:jc w:val="both"/>
+        <w:rPr>
+          <w:color w:val="auto"/>
+        </w:rPr>
+      </w:pPr>
+      <w:r>
+        <w:rPr>
+          <w:color w:val="auto"/>
+        </w:rPr>
+      </w:r>
+    </w:p>
+    <w:p>
+      <w:pPr>
+        <w:pStyle w:val="Normal"/>
+        <w:jc w:val="both"/>
+        <w:rPr>
+          <w:color w:val="auto"/>
+        </w:rPr>
+      </w:pPr>
+      <w:r>
+        <w:rPr>
+          <w:rFonts w:eastAsia="Times New Roman" w:cs="Times New Roman" w:ascii="Garamond" w:hAnsi="Garamond"/>
+          <w:color w:val="000000"/>
+          <w:kern w:val="0"/>
+          <w:sz w:val="36"/>
+          <w:szCs w:val="36"/>
+          <w:shd w:fill="auto" w:val="clear"/>
+          <w:lang w:val="en-US" w:eastAsia="zh-CN" w:bidi="hi-IN"/>
+        </w:rPr>
+        <w:t>A partir do momento em que</w:t>
+      </w:r>
+      <w:r>
+        <w:rPr>
+          <w:rFonts w:eastAsia="Times New Roman" w:cs="Times New Roman" w:ascii="Garamond" w:hAnsi="Garamond"/>
+          <w:color w:val="000000"/>
+          <w:kern w:val="0"/>
+          <w:sz w:val="36"/>
+          <w:szCs w:val="36"/>
+          <w:shd w:fill="auto" w:val="clear"/>
+          <w:lang w:val="en-US" w:eastAsia="zh-CN" w:bidi="hi-IN"/>
+        </w:rPr>
+        <w:t xml:space="preserve"> tomamos consciência disso, a oração passa a ser um recurso ainda mais valioso para nós. </w:t>
+      </w:r>
+      <w:r>
+        <w:rPr>
+          <w:rFonts w:eastAsia="Times New Roman" w:cs="Times New Roman" w:ascii="Garamond" w:hAnsi="Garamond"/>
+          <w:color w:val="000000"/>
+          <w:kern w:val="0"/>
+          <w:sz w:val="36"/>
+          <w:szCs w:val="36"/>
+          <w:shd w:fill="auto" w:val="clear"/>
+          <w:lang w:val="en-US" w:eastAsia="zh-CN" w:bidi="hi-IN"/>
+        </w:rPr>
+        <w:t>Quando passarmos por</w:t>
+      </w:r>
+      <w:r>
+        <w:rPr>
+          <w:rFonts w:eastAsia="Times New Roman" w:cs="Times New Roman" w:ascii="Garamond" w:hAnsi="Garamond"/>
+          <w:color w:val="000000"/>
+          <w:kern w:val="0"/>
+          <w:sz w:val="36"/>
+          <w:szCs w:val="36"/>
+          <w:shd w:fill="auto" w:val="clear"/>
+          <w:lang w:val="en-US" w:eastAsia="zh-CN" w:bidi="hi-IN"/>
+        </w:rPr>
+        <w:t xml:space="preserve"> um irmão embriagado ou drogado caído na calçada</w:t>
+      </w:r>
+      <w:r>
+        <w:rPr>
+          <w:rFonts w:eastAsia="Times New Roman" w:cs="Times New Roman" w:ascii="Garamond" w:hAnsi="Garamond"/>
+          <w:color w:val="000000"/>
+          <w:kern w:val="0"/>
+          <w:sz w:val="36"/>
+          <w:szCs w:val="36"/>
+          <w:shd w:fill="auto" w:val="clear"/>
+          <w:lang w:val="en-US" w:eastAsia="zh-CN" w:bidi="hi-IN"/>
+        </w:rPr>
+        <w:t>, podemos orar por ele pedindo, por exemplo, que Deus dê forças àquele irmão para superar seus vícios e mudar sua conduta de vida.</w:t>
+      </w:r>
+    </w:p>
+    <w:p>
+      <w:pPr>
+        <w:pStyle w:val="Normal"/>
+        <w:jc w:val="both"/>
+        <w:rPr>
+          <w:color w:val="auto"/>
+        </w:rPr>
+      </w:pPr>
+      <w:r>
         <w:rPr/>
       </w:r>
     </w:p>
@@ -1644,31 +2298,161 @@
           <w:shd w:fill="auto" w:val="clear"/>
           <w:lang w:val="en-US" w:eastAsia="zh-CN" w:bidi="hi-IN"/>
         </w:rPr>
-        <w:t>Ninguém duvida que</w:t>
-      </w:r>
-      <w:r>
-        <w:rPr>
-          <w:rFonts w:eastAsia="Times New Roman" w:cs="Times New Roman" w:ascii="Garamond" w:hAnsi="Garamond"/>
-          <w:color w:val="000000"/>
-          <w:kern w:val="0"/>
-          <w:sz w:val="36"/>
-          <w:szCs w:val="36"/>
-          <w:shd w:fill="auto" w:val="clear"/>
-          <w:lang w:val="en-US" w:eastAsia="zh-CN" w:bidi="hi-IN"/>
-        </w:rPr>
-        <w:t xml:space="preserve"> um ambiente silencioso e calmo favorece a oração, mas </w:t>
-      </w:r>
-      <w:r>
-        <w:rPr>
-          <w:rFonts w:eastAsia="Times New Roman" w:cs="Times New Roman" w:ascii="Garamond" w:hAnsi="Garamond"/>
-          <w:color w:val="000000"/>
-          <w:kern w:val="0"/>
-          <w:sz w:val="36"/>
-          <w:szCs w:val="36"/>
-          <w:shd w:fill="auto" w:val="clear"/>
-          <w:lang w:val="en-US" w:eastAsia="zh-CN" w:bidi="hi-IN"/>
-        </w:rPr>
-        <w:t>isso não quer dizer que estamos impossibilitados de alcançar a paz interior estando longe dos redutos de tranquilidade. Se assim fosse, nossos momentos de oração seriam escassos.</w:t>
+        <w:t>Quando estivermos dirigindo e presenciarmos um acidente,</w:t>
+      </w:r>
+      <w:r>
+        <w:rPr>
+          <w:rFonts w:eastAsia="Times New Roman" w:cs="Times New Roman" w:ascii="Garamond" w:hAnsi="Garamond"/>
+          <w:color w:val="000000"/>
+          <w:kern w:val="0"/>
+          <w:sz w:val="36"/>
+          <w:szCs w:val="36"/>
+          <w:shd w:fill="auto" w:val="clear"/>
+          <w:lang w:val="en-US" w:eastAsia="zh-CN" w:bidi="hi-IN"/>
+        </w:rPr>
+        <w:t xml:space="preserve"> também </w:t>
+      </w:r>
+      <w:r>
+        <w:rPr>
+          <w:rFonts w:eastAsia="Times New Roman" w:cs="Times New Roman" w:ascii="Garamond" w:hAnsi="Garamond"/>
+          <w:color w:val="000000"/>
+          <w:kern w:val="0"/>
+          <w:sz w:val="36"/>
+          <w:szCs w:val="36"/>
+          <w:shd w:fill="auto" w:val="clear"/>
+          <w:lang w:val="en-US" w:eastAsia="zh-CN" w:bidi="hi-IN"/>
+        </w:rPr>
+        <w:t xml:space="preserve">podemos </w:t>
+      </w:r>
+      <w:r>
+        <w:rPr>
+          <w:rFonts w:eastAsia="Times New Roman" w:cs="Times New Roman" w:ascii="Garamond" w:hAnsi="Garamond"/>
+          <w:color w:val="000000"/>
+          <w:kern w:val="0"/>
+          <w:sz w:val="36"/>
+          <w:szCs w:val="36"/>
+          <w:shd w:fill="auto" w:val="clear"/>
+          <w:lang w:val="en-US" w:eastAsia="zh-CN" w:bidi="hi-IN"/>
+        </w:rPr>
+        <w:t xml:space="preserve">orar </w:t>
+      </w:r>
+      <w:r>
+        <w:rPr>
+          <w:rFonts w:eastAsia="Times New Roman" w:cs="Times New Roman" w:ascii="Garamond" w:hAnsi="Garamond"/>
+          <w:color w:val="000000"/>
+          <w:kern w:val="0"/>
+          <w:sz w:val="36"/>
+          <w:szCs w:val="36"/>
+          <w:shd w:fill="auto" w:val="clear"/>
+          <w:lang w:val="en-US" w:eastAsia="zh-CN" w:bidi="hi-IN"/>
+        </w:rPr>
+        <w:t>pelas pessoas envolvidas naquele acidente</w:t>
+      </w:r>
+      <w:r>
+        <w:rPr>
+          <w:rFonts w:eastAsia="Times New Roman" w:cs="Times New Roman" w:ascii="Garamond" w:hAnsi="Garamond"/>
+          <w:color w:val="000000"/>
+          <w:kern w:val="0"/>
+          <w:sz w:val="36"/>
+          <w:szCs w:val="36"/>
+          <w:shd w:fill="auto" w:val="clear"/>
+          <w:lang w:val="en-US" w:eastAsia="zh-CN" w:bidi="hi-IN"/>
+        </w:rPr>
+        <w:t>.</w:t>
+      </w:r>
+    </w:p>
+    <w:p>
+      <w:pPr>
+        <w:pStyle w:val="Normal"/>
+        <w:jc w:val="both"/>
+        <w:rPr>
+          <w:color w:val="auto"/>
+        </w:rPr>
+      </w:pPr>
+      <w:r>
+        <w:rPr>
+          <w:color w:val="auto"/>
+        </w:rPr>
+      </w:r>
+    </w:p>
+    <w:p>
+      <w:pPr>
+        <w:pStyle w:val="Normal"/>
+        <w:jc w:val="both"/>
+        <w:rPr>
+          <w:color w:val="auto"/>
+        </w:rPr>
+      </w:pPr>
+      <w:r>
+        <w:rPr>
+          <w:rFonts w:eastAsia="Times New Roman" w:cs="Times New Roman" w:ascii="Garamond" w:hAnsi="Garamond"/>
+          <w:color w:val="000000"/>
+          <w:kern w:val="0"/>
+          <w:sz w:val="36"/>
+          <w:szCs w:val="36"/>
+          <w:shd w:fill="auto" w:val="clear"/>
+          <w:lang w:val="en-US" w:eastAsia="zh-CN" w:bidi="hi-IN"/>
+        </w:rPr>
+        <w:t>Eu tenho muita dificuldade em</w:t>
+      </w:r>
+      <w:r>
+        <w:rPr>
+          <w:rFonts w:eastAsia="Times New Roman" w:cs="Times New Roman" w:ascii="Garamond" w:hAnsi="Garamond"/>
+          <w:color w:val="000000"/>
+          <w:kern w:val="0"/>
+          <w:sz w:val="36"/>
+          <w:szCs w:val="36"/>
+          <w:shd w:fill="auto" w:val="clear"/>
+          <w:lang w:val="en-US" w:eastAsia="zh-CN" w:bidi="hi-IN"/>
+        </w:rPr>
+        <w:t xml:space="preserve"> compreender a curiosidade mórbida que muitos têm em ver vítimas feridas ou mortas em acidentes. Já repararam que quando acontece um acidente de trânsito em uma pista, a outra também fica com o trânsito lento? É porque as pessoas dirigindo em sentido contrário reduzem a velocidade para ver o que aconteceu.</w:t>
+      </w:r>
+    </w:p>
+    <w:p>
+      <w:pPr>
+        <w:pStyle w:val="Normal"/>
+        <w:jc w:val="both"/>
+        <w:rPr>
+          <w:color w:val="auto"/>
+        </w:rPr>
+      </w:pPr>
+      <w:r>
+        <w:rPr>
+          <w:color w:val="auto"/>
+        </w:rPr>
+      </w:r>
+    </w:p>
+    <w:p>
+      <w:pPr>
+        <w:pStyle w:val="Normal"/>
+        <w:jc w:val="both"/>
+        <w:rPr>
+          <w:color w:val="auto"/>
+        </w:rPr>
+      </w:pPr>
+      <w:r>
+        <w:rPr>
+          <w:rFonts w:eastAsia="Times New Roman" w:cs="Times New Roman" w:ascii="Garamond" w:hAnsi="Garamond"/>
+          <w:color w:val="000000"/>
+          <w:kern w:val="0"/>
+          <w:sz w:val="36"/>
+          <w:szCs w:val="36"/>
+          <w:shd w:fill="auto" w:val="clear"/>
+          <w:lang w:val="en-US" w:eastAsia="zh-CN" w:bidi="hi-IN"/>
+        </w:rPr>
+        <w:t>Se ainda carregamos esse tipo de curiosidade conosco, vamos mudar de postura. Em vez de querer ver o que aconteceu, elevemos um pensamento a Deus, pedindo socorro para os feridos e amparo aos que desencarnaram. Fazemos essa oração e seguimos nosso caminho</w:t>
+      </w:r>
+      <w:r>
+        <w:rPr>
+          <w:rFonts w:eastAsia="Times New Roman" w:cs="Times New Roman" w:ascii="Garamond" w:hAnsi="Garamond"/>
+          <w:color w:val="000000"/>
+          <w:kern w:val="0"/>
+          <w:sz w:val="36"/>
+          <w:szCs w:val="36"/>
+          <w:shd w:fill="auto" w:val="clear"/>
+          <w:lang w:val="en-US" w:eastAsia="zh-CN" w:bidi="hi-IN"/>
+        </w:rPr>
+        <w:t>.</w:t>
       </w:r>
     </w:p>
     <w:p>
@@ -1692,6 +2476,87 @@
         </w:rPr>
       </w:pPr>
       <w:r>
+        <w:rPr>
+          <w:rFonts w:eastAsia="Times New Roman" w:cs="Times New Roman" w:ascii="Garamond" w:hAnsi="Garamond"/>
+          <w:color w:val="000000"/>
+          <w:kern w:val="0"/>
+          <w:sz w:val="36"/>
+          <w:szCs w:val="36"/>
+          <w:shd w:fill="auto" w:val="clear"/>
+          <w:lang w:val="en-US" w:eastAsia="zh-CN" w:bidi="hi-IN"/>
+        </w:rPr>
+        <w:t>Retornando à passagem evangélica que estamos analisando, Jesus nos diz para não orarmos como os pagãos, que pensam que é pela quantidade de palavras que suas preces serão ouvidas</w:t>
+      </w:r>
+      <w:r>
+        <w:rPr>
+          <w:rFonts w:eastAsia="Times New Roman" w:cs="Times New Roman" w:ascii="Garamond" w:hAnsi="Garamond"/>
+          <w:color w:val="000000"/>
+          <w:kern w:val="0"/>
+          <w:sz w:val="36"/>
+          <w:szCs w:val="36"/>
+          <w:shd w:fill="auto" w:val="clear"/>
+          <w:lang w:val="en-US" w:eastAsia="zh-CN" w:bidi="hi-IN"/>
+        </w:rPr>
+        <w:t xml:space="preserve">. </w:t>
+      </w:r>
+      <w:r>
+        <w:rPr>
+          <w:rFonts w:eastAsia="Times New Roman" w:cs="Times New Roman" w:ascii="Garamond" w:hAnsi="Garamond"/>
+          <w:color w:val="C9211E"/>
+          <w:kern w:val="0"/>
+          <w:sz w:val="36"/>
+          <w:szCs w:val="36"/>
+          <w:shd w:fill="auto" w:val="clear"/>
+          <w:lang w:val="en-US" w:eastAsia="zh-CN" w:bidi="hi-IN"/>
+        </w:rPr>
+        <w:t>O Mestre diz ainda</w:t>
+      </w:r>
+      <w:r>
+        <w:rPr>
+          <w:rFonts w:eastAsia="Times New Roman" w:cs="Times New Roman" w:ascii="Garamond" w:hAnsi="Garamond"/>
+          <w:color w:val="C9211E"/>
+          <w:kern w:val="0"/>
+          <w:sz w:val="36"/>
+          <w:szCs w:val="36"/>
+          <w:shd w:fill="auto" w:val="clear"/>
+          <w:lang w:val="en-US" w:eastAsia="zh-CN" w:bidi="hi-IN"/>
+        </w:rPr>
+        <w:t xml:space="preserve"> </w:t>
+      </w:r>
+      <w:r>
+        <w:rPr>
+          <w:rFonts w:eastAsia="Times New Roman" w:cs="Times New Roman" w:ascii="Garamond" w:hAnsi="Garamond"/>
+          <w:color w:val="C9211E"/>
+          <w:kern w:val="0"/>
+          <w:sz w:val="36"/>
+          <w:szCs w:val="36"/>
+          <w:shd w:fill="auto" w:val="clear"/>
+          <w:lang w:val="en-US" w:eastAsia="zh-CN" w:bidi="hi-IN"/>
+        </w:rPr>
+        <w:t>que Deus</w:t>
+      </w:r>
+      <w:r>
+        <w:rPr>
+          <w:rFonts w:eastAsia="Times New Roman" w:cs="Times New Roman" w:ascii="Garamond" w:hAnsi="Garamond"/>
+          <w:color w:val="C9211E"/>
+          <w:kern w:val="0"/>
+          <w:sz w:val="36"/>
+          <w:szCs w:val="36"/>
+          <w:shd w:fill="auto" w:val="clear"/>
+          <w:lang w:val="en-US" w:eastAsia="zh-CN" w:bidi="hi-IN"/>
+        </w:rPr>
+        <w:t xml:space="preserve"> sabe do que precisamos antes mesmo de o perdirmos (verificar se essa parte já foi comentada anteriormente. Agora não me lembro).</w:t>
+      </w:r>
+    </w:p>
+    <w:p>
+      <w:pPr>
+        <w:pStyle w:val="Normal"/>
+        <w:jc w:val="both"/>
+        <w:rPr>
+          <w:color w:val="auto"/>
+        </w:rPr>
+      </w:pPr>
+      <w:r>
         <w:rPr/>
       </w:r>
     </w:p>
@@ -1713,7 +2578,19 @@
           <w:shd w:fill="auto" w:val="clear"/>
           <w:lang w:val="en-US" w:eastAsia="zh-CN" w:bidi="hi-IN"/>
         </w:rPr>
-        <w:t>Imaginem a seguinte situação: suponham que eu esteja no ônibus lotado, em pé, voltando para casa depois de um dia de trabalho difícil, em meio a um trânsito barulhento e caótico.</w:t>
+        <w:t xml:space="preserve">Quem eram os pagãos a quem Jesus se refere? Eles eram </w:t>
+      </w:r>
+      <w:r>
+        <w:rPr>
+          <w:rFonts w:eastAsia="Times New Roman" w:cs="Times New Roman" w:ascii="Garamond" w:hAnsi="Garamond"/>
+          <w:color w:val="000000"/>
+          <w:kern w:val="0"/>
+          <w:sz w:val="36"/>
+          <w:szCs w:val="36"/>
+          <w:shd w:fill="auto" w:val="clear"/>
+          <w:lang w:val="en-US" w:eastAsia="zh-CN" w:bidi="hi-IN"/>
+        </w:rPr>
+        <w:t>principalmente os povos gentios do mundo greco-romano — isto é, aqueles que não pertenciam à tradição judaica e seguiam religiões politeístas comuns no Império Romano. Nessas práticas religiosas, era frequente a repetição longa de fórmulas e invocações, porque muitos acreditavam que a divindade poderia ser convencida ou constrangida pela multiplicidade das palavras, como se o poder estivesse na quantidade ou na exatidão da expressão verbal.</w:t>
       </w:r>
     </w:p>
     <w:p>
@@ -1746,7 +2623,7 @@
           <w:shd w:fill="auto" w:val="clear"/>
           <w:lang w:val="en-US" w:eastAsia="zh-CN" w:bidi="hi-IN"/>
         </w:rPr>
-        <w:t>De repente alguém me manda uma mensagem no WhatsApp informando que um amigo querido sofreu um acidente grave e está internado correndo risco de morrer. A pessoa diz que depois me dá mais informações sobre o acontecido.</w:t>
+        <w:t xml:space="preserve">Ao fazer essa advertência, Jesus não condena a perseverança na prece, mas corrige a mentalidade mágica e mecânica. Ele nos recorda que o Pai já sabe do que necessitamos antes mesmo que peçamos. A oração, portanto, não é instrumento de pressão sobre Deus, mas caminho de transformação interior. </w:t>
       </w:r>
     </w:p>
     <w:p>
@@ -1779,7 +2656,19 @@
           <w:shd w:fill="auto" w:val="clear"/>
           <w:lang w:val="en-US" w:eastAsia="zh-CN" w:bidi="hi-IN"/>
         </w:rPr>
-        <w:t xml:space="preserve">O lugar e a hora em que me encontro são os mais adequados para a prece? Claro que não. Mas vou deixar de orar por meu amigo só porque não estou em um ambiente favorável à oração? De maneira alguma. </w:t>
+        <w:t>Quando Jesus nos alerta contra as vãs repetições, Ele nos convida a substituir o automatismo pela sinceridade, a quantidade pela qualidade e a palavra vazia pelo sentimento</w:t>
+      </w:r>
+      <w:r>
+        <w:rPr>
+          <w:rFonts w:eastAsia="Times New Roman" w:cs="Times New Roman" w:ascii="Garamond" w:hAnsi="Garamond"/>
+          <w:color w:val="000000"/>
+          <w:kern w:val="0"/>
+          <w:sz w:val="36"/>
+          <w:szCs w:val="36"/>
+          <w:shd w:fill="auto" w:val="clear"/>
+          <w:lang w:val="en-US" w:eastAsia="zh-CN" w:bidi="hi-IN"/>
+        </w:rPr>
+        <w:t xml:space="preserve"> verdadeiro.</w:t>
       </w:r>
     </w:p>
     <w:p>
@@ -1812,7 +2701,7 @@
           <w:shd w:fill="auto" w:val="clear"/>
           <w:lang w:val="en-US" w:eastAsia="zh-CN" w:bidi="hi-IN"/>
         </w:rPr>
-        <w:t>Eu posso e devo orar por meu amigo ali mesmo, naquelas condições. Com algum esforço da minha parte consigo me abstrair do tumulto à minha volta e elevar a Deus, a Jesus e aos Espíritos amigos minhas rogativas em favor do amigo acidentado.</w:t>
+        <w:t xml:space="preserve">Essa prática desaconselhada por Jesus, acabou se tornando comum na Igreja Católica e é algo que vemos ainda nos dias de hoje. Como nossa intenção não é criticar quaisquer escolas religiosas, vamos entender a fundamentação dessa prática. </w:t>
       </w:r>
     </w:p>
     <w:p>
@@ -1845,7 +2734,19 @@
           <w:shd w:fill="auto" w:val="clear"/>
           <w:lang w:val="en-US" w:eastAsia="zh-CN" w:bidi="hi-IN"/>
         </w:rPr>
-        <w:t>Depois, quando eu estiver na tranquilidade do meu lar, eu oro novamente em condições mais adequadas, mas não devo prescindir da prece enquanto eu ainda estou no ônibus.</w:t>
+        <w:t xml:space="preserve">Ao longo da história do cristianismo, especialmente a partir da Idade Média, desenvolveu-se na Igreja Católica a prática da penitência associada ao sacramento da confissão. </w:t>
+      </w:r>
+      <w:r>
+        <w:rPr>
+          <w:rFonts w:eastAsia="Times New Roman" w:cs="Times New Roman" w:ascii="Garamond" w:hAnsi="Garamond"/>
+          <w:color w:val="000000"/>
+          <w:kern w:val="0"/>
+          <w:sz w:val="36"/>
+          <w:szCs w:val="36"/>
+          <w:shd w:fill="auto" w:val="clear"/>
+          <w:lang w:val="en-US" w:eastAsia="zh-CN" w:bidi="hi-IN"/>
+        </w:rPr>
+        <w:t>Ou seja: a pessoa se confessava e recebia uma penitência a ser cumprida.</w:t>
       </w:r>
     </w:p>
     <w:p>
@@ -1878,19 +2779,181 @@
           <w:shd w:fill="auto" w:val="clear"/>
           <w:lang w:val="en-US" w:eastAsia="zh-CN" w:bidi="hi-IN"/>
         </w:rPr>
-        <w:t xml:space="preserve">Então, ao dizer que devemos orar em secreto no nosso quarto, Jesus está nos dando </w:t>
-      </w:r>
-      <w:r>
-        <w:rPr>
-          <w:rFonts w:eastAsia="Times New Roman" w:cs="Times New Roman" w:ascii="Garamond" w:hAnsi="Garamond"/>
-          <w:color w:val="000000"/>
-          <w:kern w:val="0"/>
-          <w:sz w:val="36"/>
-          <w:szCs w:val="36"/>
-          <w:shd w:fill="auto" w:val="clear"/>
-          <w:lang w:val="en-US" w:eastAsia="zh-CN" w:bidi="hi-IN"/>
-        </w:rPr>
-        <w:t>uma recomendação clara e direta</w:t>
+        <w:t>Nos primeiros séculos, as penitências eram públicas e, à</w:t>
+      </w:r>
+      <w:r>
+        <w:rPr>
+          <w:rFonts w:eastAsia="Times New Roman" w:cs="Times New Roman" w:ascii="Garamond" w:hAnsi="Garamond"/>
+          <w:color w:val="000000"/>
+          <w:kern w:val="0"/>
+          <w:sz w:val="36"/>
+          <w:szCs w:val="36"/>
+          <w:shd w:fill="auto" w:val="clear"/>
+          <w:lang w:val="en-US" w:eastAsia="zh-CN" w:bidi="hi-IN"/>
+        </w:rPr>
+        <w:t>s</w:t>
+      </w:r>
+      <w:r>
+        <w:rPr>
+          <w:rFonts w:eastAsia="Times New Roman" w:cs="Times New Roman" w:ascii="Garamond" w:hAnsi="Garamond"/>
+          <w:color w:val="000000"/>
+          <w:kern w:val="0"/>
+          <w:sz w:val="36"/>
+          <w:szCs w:val="36"/>
+          <w:shd w:fill="auto" w:val="clear"/>
+          <w:lang w:val="en-US" w:eastAsia="zh-CN" w:bidi="hi-IN"/>
+        </w:rPr>
+        <w:t xml:space="preserve"> vezes, bastante rigorosas. </w:t>
+      </w:r>
+      <w:r>
+        <w:rPr>
+          <w:rFonts w:eastAsia="Times New Roman" w:cs="Times New Roman" w:ascii="Garamond" w:hAnsi="Garamond"/>
+          <w:color w:val="000000"/>
+          <w:kern w:val="0"/>
+          <w:sz w:val="36"/>
+          <w:szCs w:val="36"/>
+          <w:shd w:fill="auto" w:val="clear"/>
+          <w:lang w:val="en-US" w:eastAsia="zh-CN" w:bidi="hi-IN"/>
+        </w:rPr>
+        <w:t xml:space="preserve">Por volta dos séculos VI e VII, surgiu a prática das confissões individuais e mais frequentes. </w:t>
+      </w:r>
+    </w:p>
+    <w:p>
+      <w:pPr>
+        <w:pStyle w:val="Normal"/>
+        <w:jc w:val="both"/>
+        <w:rPr>
+          <w:color w:val="auto"/>
+        </w:rPr>
+      </w:pPr>
+      <w:r>
+        <w:rPr/>
+      </w:r>
+    </w:p>
+    <w:p>
+      <w:pPr>
+        <w:pStyle w:val="Normal"/>
+        <w:jc w:val="both"/>
+        <w:rPr>
+          <w:color w:val="auto"/>
+        </w:rPr>
+      </w:pPr>
+      <w:r>
+        <w:rPr>
+          <w:rFonts w:eastAsia="Times New Roman" w:cs="Times New Roman" w:ascii="Garamond" w:hAnsi="Garamond"/>
+          <w:color w:val="000000"/>
+          <w:kern w:val="0"/>
+          <w:sz w:val="36"/>
+          <w:szCs w:val="36"/>
+          <w:shd w:fill="auto" w:val="clear"/>
+          <w:lang w:val="en-US" w:eastAsia="zh-CN" w:bidi="hi-IN"/>
+        </w:rPr>
+        <w:t xml:space="preserve">Surgiram então os chamados “penitenciais”, </w:t>
+      </w:r>
+      <w:r>
+        <w:rPr>
+          <w:rFonts w:eastAsia="Times New Roman" w:cs="Times New Roman" w:ascii="Garamond" w:hAnsi="Garamond"/>
+          <w:color w:val="000000"/>
+          <w:kern w:val="0"/>
+          <w:sz w:val="36"/>
+          <w:szCs w:val="36"/>
+          <w:shd w:fill="auto" w:val="clear"/>
+          <w:lang w:val="en-US" w:eastAsia="zh-CN" w:bidi="hi-IN"/>
+        </w:rPr>
+        <w:t xml:space="preserve">livros </w:t>
+      </w:r>
+      <w:r>
+        <w:rPr>
+          <w:rFonts w:eastAsia="Times New Roman" w:cs="Times New Roman" w:ascii="Garamond" w:hAnsi="Garamond"/>
+          <w:color w:val="000000"/>
+          <w:kern w:val="0"/>
+          <w:sz w:val="36"/>
+          <w:szCs w:val="36"/>
+          <w:shd w:fill="auto" w:val="clear"/>
+          <w:lang w:val="en-US" w:eastAsia="zh-CN" w:bidi="hi-IN"/>
+        </w:rPr>
+        <w:t xml:space="preserve">que indicavam orientações espirituais para cada </w:t>
+      </w:r>
+      <w:r>
+        <w:rPr>
+          <w:rFonts w:eastAsia="Times New Roman" w:cs="Times New Roman" w:ascii="Garamond" w:hAnsi="Garamond"/>
+          <w:color w:val="000000"/>
+          <w:kern w:val="0"/>
+          <w:sz w:val="36"/>
+          <w:szCs w:val="36"/>
+          <w:shd w:fill="auto" w:val="clear"/>
+          <w:lang w:val="en-US" w:eastAsia="zh-CN" w:bidi="hi-IN"/>
+        </w:rPr>
+        <w:t>pecado</w:t>
+      </w:r>
+      <w:r>
+        <w:rPr>
+          <w:rFonts w:eastAsia="Times New Roman" w:cs="Times New Roman" w:ascii="Garamond" w:hAnsi="Garamond"/>
+          <w:color w:val="000000"/>
+          <w:kern w:val="0"/>
+          <w:sz w:val="36"/>
+          <w:szCs w:val="36"/>
+          <w:shd w:fill="auto" w:val="clear"/>
+          <w:lang w:val="en-US" w:eastAsia="zh-CN" w:bidi="hi-IN"/>
+        </w:rPr>
+        <w:t>, incluindo jejuns, obras de caridade e também a recitação de determinado número de salmos ou orações.</w:t>
+      </w:r>
+    </w:p>
+    <w:p>
+      <w:pPr>
+        <w:pStyle w:val="Normal"/>
+        <w:jc w:val="both"/>
+        <w:rPr>
+          <w:color w:val="auto"/>
+        </w:rPr>
+      </w:pPr>
+      <w:r>
+        <w:rPr/>
+      </w:r>
+    </w:p>
+    <w:p>
+      <w:pPr>
+        <w:pStyle w:val="Normal"/>
+        <w:jc w:val="both"/>
+        <w:rPr>
+          <w:color w:val="auto"/>
+        </w:rPr>
+      </w:pPr>
+      <w:r>
+        <w:rPr>
+          <w:rFonts w:eastAsia="Times New Roman" w:cs="Times New Roman" w:ascii="Garamond" w:hAnsi="Garamond"/>
+          <w:color w:val="000000"/>
+          <w:kern w:val="0"/>
+          <w:sz w:val="36"/>
+          <w:szCs w:val="36"/>
+          <w:shd w:fill="auto" w:val="clear"/>
+          <w:lang w:val="en-US" w:eastAsia="zh-CN" w:bidi="hi-IN"/>
+        </w:rPr>
+        <w:t>Foi nesse contexto que surgiu a</w:t>
+      </w:r>
+      <w:r>
+        <w:rPr>
+          <w:rFonts w:eastAsia="Times New Roman" w:cs="Times New Roman" w:ascii="Garamond" w:hAnsi="Garamond"/>
+          <w:color w:val="000000"/>
+          <w:kern w:val="0"/>
+          <w:sz w:val="36"/>
+          <w:szCs w:val="36"/>
+          <w:shd w:fill="auto" w:val="clear"/>
+          <w:lang w:val="en-US" w:eastAsia="zh-CN" w:bidi="hi-IN"/>
+        </w:rPr>
+        <w:t xml:space="preserve"> repetição do Pai-Nosso e da Ave-Maria como parte da penitência</w:t>
+      </w:r>
+      <w:r>
+        <w:rPr>
+          <w:rFonts w:eastAsia="Times New Roman" w:cs="Times New Roman" w:ascii="Garamond" w:hAnsi="Garamond"/>
+          <w:color w:val="000000"/>
+          <w:kern w:val="0"/>
+          <w:sz w:val="36"/>
+          <w:szCs w:val="36"/>
+          <w:shd w:fill="auto" w:val="clear"/>
+          <w:lang w:val="en-US" w:eastAsia="zh-CN" w:bidi="hi-IN"/>
+        </w:rPr>
+        <w:t>.</w:t>
       </w:r>
       <w:r>
         <w:rPr>
@@ -1914,19 +2977,43 @@
           <w:shd w:fill="auto" w:val="clear"/>
           <w:lang w:val="en-US" w:eastAsia="zh-CN" w:bidi="hi-IN"/>
         </w:rPr>
-        <w:t>com relação à sinceridade e ao recolhimento que devem existir naqueles que desejam se colocar em sintonia com os planos mais altos da vida</w:t>
-      </w:r>
-      <w:r>
-        <w:rPr>
-          <w:rFonts w:eastAsia="Times New Roman" w:cs="Times New Roman" w:ascii="Garamond" w:hAnsi="Garamond"/>
-          <w:color w:val="000000"/>
-          <w:kern w:val="0"/>
-          <w:sz w:val="36"/>
-          <w:szCs w:val="36"/>
-          <w:shd w:fill="auto" w:val="clear"/>
-          <w:lang w:val="en-US" w:eastAsia="zh-CN" w:bidi="hi-IN"/>
-        </w:rPr>
-        <w:t>, embora isso não necessariamente exija um lugar silencioso e isolado.</w:t>
+        <w:t>O objetivo não era comprar o perdão, até porque, de acordo com a teologia católica, isso não é possível; o perdão só pode ser concedido por Deus .</w:t>
+      </w:r>
+      <w:r>
+        <w:rPr>
+          <w:rFonts w:eastAsia="Times New Roman" w:cs="Times New Roman" w:ascii="Garamond" w:hAnsi="Garamond"/>
+          <w:color w:val="000000"/>
+          <w:kern w:val="0"/>
+          <w:sz w:val="36"/>
+          <w:szCs w:val="36"/>
+          <w:shd w:fill="auto" w:val="clear"/>
+          <w:lang w:val="en-US" w:eastAsia="zh-CN" w:bidi="hi-IN"/>
+        </w:rPr>
+        <w:t>no momento da absolvição</w:t>
+      </w:r>
+      <w:r>
+        <w:rPr>
+          <w:rFonts w:eastAsia="Times New Roman" w:cs="Times New Roman" w:ascii="Garamond" w:hAnsi="Garamond"/>
+          <w:color w:val="000000"/>
+          <w:kern w:val="0"/>
+          <w:sz w:val="36"/>
+          <w:szCs w:val="36"/>
+          <w:shd w:fill="auto" w:val="clear"/>
+          <w:lang w:val="en-US" w:eastAsia="zh-CN" w:bidi="hi-IN"/>
+        </w:rPr>
+        <w:t xml:space="preserve">. A intenção era </w:t>
+      </w:r>
+      <w:r>
+        <w:rPr>
+          <w:rFonts w:eastAsia="Times New Roman" w:cs="Times New Roman" w:ascii="Garamond" w:hAnsi="Garamond"/>
+          <w:color w:val="000000"/>
+          <w:kern w:val="0"/>
+          <w:sz w:val="36"/>
+          <w:szCs w:val="36"/>
+          <w:shd w:fill="auto" w:val="clear"/>
+          <w:lang w:val="en-US" w:eastAsia="zh-CN" w:bidi="hi-IN"/>
+        </w:rPr>
+        <w:t xml:space="preserve">propor um exercício espiritual de reparação, disciplina e recolhimento. </w:t>
       </w:r>
     </w:p>
     <w:p>
@@ -1959,7 +3046,19 @@
           <w:shd w:fill="auto" w:val="clear"/>
           <w:lang w:val="en-US" w:eastAsia="zh-CN" w:bidi="hi-IN"/>
         </w:rPr>
-        <w:t>Quando tomamos consciência disso, a oração passa a ser um recurso ainda mais valioso para nós. Podemos, por exemplo, orar por um irmão embriagado ou drogado caído na calçada ao passarmos por ele; podemos também orar por alguém acidentado na via pública.</w:t>
+        <w:t>Ao mesmo tempo, começava a se desenvolver</w:t>
+      </w:r>
+      <w:r>
+        <w:rPr>
+          <w:rFonts w:eastAsia="Times New Roman" w:cs="Times New Roman" w:ascii="Garamond" w:hAnsi="Garamond"/>
+          <w:color w:val="000000"/>
+          <w:kern w:val="0"/>
+          <w:sz w:val="36"/>
+          <w:szCs w:val="36"/>
+          <w:shd w:fill="auto" w:val="clear"/>
+          <w:lang w:val="en-US" w:eastAsia="zh-CN" w:bidi="hi-IN"/>
+        </w:rPr>
+        <w:t xml:space="preserve"> a tradição do Rosário, em que a repetição das orações assume caráter meditativo e contemplativo. Assim, a fixação de um número de preces nasceu dentro de uma pedagogia espiritual, como forma de educar a alma na perseverança e na reflexão.</w:t>
       </w:r>
     </w:p>
     <w:p>
@@ -1992,7 +3091,7 @@
           <w:shd w:fill="auto" w:val="clear"/>
           <w:lang w:val="en-US" w:eastAsia="zh-CN" w:bidi="hi-IN"/>
         </w:rPr>
-        <w:t>Diga-se de passagem, é difícil compreender a curiosidade mórbida que muitos têm em ver vítimas feridas ou mortas em acidentes. Já repararam que quando acontece um acidente de trânsito em uma pista, a outra também fica com o trânsito lento? É porque as pessoas dirigindo em sentido contrário reduzem a velocidade para ver o que aconteceu.</w:t>
+        <w:t>[ Parei aqui em 04/03/2026 ]</w:t>
       </w:r>
     </w:p>
     <w:p>
@@ -2025,7 +3124,7 @@
           <w:shd w:fill="auto" w:val="clear"/>
           <w:lang w:val="en-US" w:eastAsia="zh-CN" w:bidi="hi-IN"/>
         </w:rPr>
-        <w:t>Se ainda carregamos esse tipo de curiosidade conosco, vamos mudar de postura. Em vez de querer ver o que aconteceu, elevemos um pensamento a Deus, pedindo socorro para os feridos e amparo aos que desencarnaram. Fazemos essa oração e seguimos nosso caminho Podemos e devemos seguir nosso caminho,</w:t>
+        <w:t>À luz do ensinamento de Jesus, podemos compreender essa prática histórica sem espírito de crítica, mas com discernimento. Quando Ele nos alerta para não orarmos como os pagãos, que acreditavam ser ouvidos pela multiplicidade das palavras, não está condenando a repetição em si, mas a ideia de que Deus possa ser convencido pela quantidade. A repetição pode ser instrumento de concentração e disciplina; o que o Evangelho nos convida a evitar é o automatismo vazio. A eficácia da prece não está no número de vezes que pronunciamos determinadas palavras, mas na sinceridade do coração que ora e na disposição interior de transformar-se para o bem.</w:t>
       </w:r>
     </w:p>
     <w:p>
@@ -2049,7 +3148,44 @@
         </w:rPr>
       </w:pPr>
       <w:r>
-        <w:rPr/>
+        <w:rPr>
+          <w:rFonts w:eastAsia="Times New Roman" w:cs="Times New Roman" w:ascii="Garamond" w:hAnsi="Garamond"/>
+          <w:color w:val="000000"/>
+          <w:kern w:val="0"/>
+          <w:sz w:val="36"/>
+          <w:szCs w:val="36"/>
+          <w:shd w:fill="auto" w:val="clear"/>
+          <w:lang w:val="en-US" w:eastAsia="zh-CN" w:bidi="hi-IN"/>
+        </w:rPr>
+        <w:t xml:space="preserve">Deus não se importa com as palavras que utilizamos em nossas orações e muito menos com a quantidade delas. Há pessoas que ainda hoje acham que, quanto mais longas forem suas orações, maiores as chances de que Deus as ouça. </w:t>
+      </w:r>
+    </w:p>
+    <w:p>
+      <w:pPr>
+        <w:pStyle w:val="Normal"/>
+        <w:jc w:val="both"/>
+        <w:rPr>
+          <w:color w:val="auto"/>
+        </w:rPr>
+      </w:pPr>
+      <w:r>
+        <w:rPr>
+          <w:color w:val="auto"/>
+        </w:rPr>
+      </w:r>
+    </w:p>
+    <w:p>
+      <w:pPr>
+        <w:pStyle w:val="Normal"/>
+        <w:jc w:val="both"/>
+        <w:rPr>
+          <w:color w:val="auto"/>
+        </w:rPr>
+      </w:pPr>
+      <w:r>
+        <w:rPr>
+          <w:color w:val="auto"/>
+        </w:rPr>
       </w:r>
     </w:p>
     <w:p>
@@ -2080,28 +3216,184 @@
     <w:p>
       <w:pPr>
         <w:pStyle w:val="Normal"/>
-        <w:jc w:val="both"/>
-        <w:rPr>
-          <w:color w:val="auto"/>
-        </w:rPr>
-      </w:pPr>
-      <w:r>
-        <w:rPr>
-          <w:color w:val="auto"/>
-        </w:rPr>
-      </w:r>
-    </w:p>
-    <w:p>
-      <w:pPr>
-        <w:pStyle w:val="Normal"/>
-        <w:jc w:val="both"/>
-        <w:rPr>
-          <w:color w:val="auto"/>
-        </w:rPr>
-      </w:pPr>
-      <w:r>
-        <w:rPr>
-          <w:color w:val="auto"/>
+        <w:numPr>
+          <w:ilvl w:val="0"/>
+          <w:numId w:val="2"/>
+        </w:numPr>
+        <w:jc w:val="both"/>
+        <w:rPr>
+          <w:color w:val="auto"/>
+        </w:rPr>
+      </w:pPr>
+      <w:r>
+        <w:rPr>
+          <w:rFonts w:eastAsia="Times New Roman" w:cs="Times New Roman" w:ascii="Garamond" w:hAnsi="Garamond"/>
+          <w:color w:val="000000"/>
+          <w:kern w:val="0"/>
+          <w:sz w:val="36"/>
+          <w:szCs w:val="36"/>
+          <w:shd w:fill="auto" w:val="clear"/>
+          <w:lang w:val="en-US" w:eastAsia="zh-CN" w:bidi="hi-IN"/>
+        </w:rPr>
+        <w:t>Quando for falar do que podemos pedir em nossas orações, citar a lição 29 - Contentar-se do livro Caminho, Verdade e Vida. Reler a lição e trazer o conteúdo relevante;</w:t>
+      </w:r>
+    </w:p>
+    <w:p>
+      <w:pPr>
+        <w:pStyle w:val="Normal"/>
+        <w:jc w:val="both"/>
+        <w:rPr>
+          <w:color w:val="auto"/>
+        </w:rPr>
+      </w:pPr>
+      <w:r>
+        <w:rPr>
+          <w:color w:val="auto"/>
+        </w:rPr>
+      </w:r>
+    </w:p>
+    <w:p>
+      <w:pPr>
+        <w:pStyle w:val="Normal"/>
+        <w:jc w:val="both"/>
+        <w:rPr>
+          <w:color w:val="auto"/>
+        </w:rPr>
+      </w:pPr>
+      <w:r>
+        <w:rPr>
+          <w:color w:val="auto"/>
+        </w:rPr>
+      </w:r>
+    </w:p>
+    <w:p>
+      <w:pPr>
+        <w:pStyle w:val="Normal"/>
+        <w:jc w:val="both"/>
+        <w:rPr>
+          <w:color w:val="1C99E0"/>
+        </w:rPr>
+      </w:pPr>
+      <w:r>
+        <w:rPr>
+          <w:rFonts w:eastAsia="Times New Roman" w:cs="Times New Roman" w:ascii="Garamond" w:hAnsi="Garamond"/>
+          <w:color w:val="1C99E0"/>
+          <w:kern w:val="0"/>
+          <w:sz w:val="36"/>
+          <w:szCs w:val="36"/>
+          <w:shd w:fill="auto" w:val="clear"/>
+          <w:lang w:val="en-US" w:eastAsia="zh-CN" w:bidi="hi-IN"/>
+        </w:rPr>
+        <w:t>[ Início do resumo das obras do roteiro de estudos ]</w:t>
+      </w:r>
+    </w:p>
+    <w:p>
+      <w:pPr>
+        <w:pStyle w:val="Normal"/>
+        <w:numPr>
+          <w:ilvl w:val="0"/>
+          <w:numId w:val="2"/>
+        </w:numPr>
+        <w:jc w:val="both"/>
+        <w:rPr>
+          <w:color w:val="auto"/>
+        </w:rPr>
+      </w:pPr>
+      <w:r>
+        <w:rPr>
+          <w:rFonts w:eastAsia="Times New Roman" w:cs="Times New Roman" w:ascii="Garamond" w:hAnsi="Garamond"/>
+          <w:color w:val="000000"/>
+          <w:kern w:val="0"/>
+          <w:sz w:val="36"/>
+          <w:szCs w:val="36"/>
+          <w:shd w:fill="auto" w:val="clear"/>
+          <w:lang w:val="en-US" w:eastAsia="zh-CN" w:bidi="hi-IN"/>
+        </w:rPr>
+        <w:t>Pão Nosso - Lição 45: necessidade de termos o coração o mais puro possível ao orarmos. Vai de encontro com Marcos 11:25-26;</w:t>
+      </w:r>
+    </w:p>
+    <w:p>
+      <w:pPr>
+        <w:pStyle w:val="Normal"/>
+        <w:numPr>
+          <w:ilvl w:val="0"/>
+          <w:numId w:val="2"/>
+        </w:numPr>
+        <w:jc w:val="both"/>
+        <w:rPr>
+          <w:color w:val="auto"/>
+        </w:rPr>
+      </w:pPr>
+      <w:r>
+        <w:rPr>
+          <w:rFonts w:eastAsia="Times New Roman" w:cs="Times New Roman" w:ascii="Garamond" w:hAnsi="Garamond"/>
+          <w:color w:val="000000"/>
+          <w:kern w:val="0"/>
+          <w:sz w:val="36"/>
+          <w:szCs w:val="36"/>
+          <w:shd w:fill="auto" w:val="clear"/>
+          <w:lang w:val="en-US" w:eastAsia="zh-CN" w:bidi="hi-IN"/>
+        </w:rPr>
+        <w:t>Livro Ideal Espirita, cap.90: reforça a necessidade de perdoar antes da oração, mas também fala de sentimentos contrastantes em nossas orações. Não devemos pedir nunca o mal;</w:t>
+      </w:r>
+    </w:p>
+    <w:p>
+      <w:pPr>
+        <w:pStyle w:val="Normal"/>
+        <w:numPr>
+          <w:ilvl w:val="0"/>
+          <w:numId w:val="2"/>
+        </w:numPr>
+        <w:jc w:val="both"/>
+        <w:rPr>
+          <w:color w:val="auto"/>
+        </w:rPr>
+      </w:pPr>
+      <w:r>
+        <w:rPr>
+          <w:rFonts w:eastAsia="Times New Roman" w:cs="Times New Roman" w:ascii="Garamond" w:hAnsi="Garamond"/>
+          <w:color w:val="000000"/>
+          <w:kern w:val="0"/>
+          <w:sz w:val="36"/>
+          <w:szCs w:val="36"/>
+          <w:shd w:fill="auto" w:val="clear"/>
+          <w:lang w:val="en-US" w:eastAsia="zh-CN" w:bidi="hi-IN"/>
+        </w:rPr>
+        <w:t>Parábola do fariseu e do publicano: orar com humildade reconhecendo  nossa pequenez espiritual e nossas fraquezas</w:t>
+      </w:r>
+    </w:p>
+    <w:p>
+      <w:pPr>
+        <w:pStyle w:val="Normal"/>
+        <w:jc w:val="both"/>
+        <w:rPr>
+          <w:color w:val="1C99E0"/>
+        </w:rPr>
+      </w:pPr>
+      <w:r>
+        <w:rPr>
+          <w:rFonts w:eastAsia="Times New Roman" w:cs="Times New Roman" w:ascii="Garamond" w:hAnsi="Garamond"/>
+          <w:color w:val="1C99E0"/>
+          <w:kern w:val="0"/>
+          <w:sz w:val="36"/>
+          <w:szCs w:val="36"/>
+          <w:shd w:fill="auto" w:val="clear"/>
+          <w:lang w:val="en-US" w:eastAsia="zh-CN" w:bidi="hi-IN"/>
+        </w:rPr>
+        <w:t>[ Término do resumo das obras do roteiro de estudos ]</w:t>
+      </w:r>
+    </w:p>
+    <w:p>
+      <w:pPr>
+        <w:pStyle w:val="Normal"/>
+        <w:jc w:val="both"/>
+        <w:rPr>
+          <w:color w:val="1C99E0"/>
+        </w:rPr>
+      </w:pPr>
+      <w:r>
+        <w:rPr>
+          <w:color w:val="1C99E0"/>
         </w:rPr>
       </w:r>
     </w:p>
@@ -5268,7 +6560,7 @@
         <w:bCs/>
         <w:rFonts w:ascii="Garamond" w:hAnsi="Garamond"/>
       </w:rPr>
-      <w:t>29</w:t>
+      <w:t>34</w:t>
     </w:r>
     <w:r>
       <w:rPr>

</xml_diff>

<commit_message>
05/03/2026 - 21:24 h
</commit_message>
<xml_diff>
--- a/Pedi e obtereis/Pedi e obtereis.docx
+++ b/Pedi e obtereis/Pedi e obtereis.docx
@@ -1304,79 +1304,7 @@
           <w:shd w:fill="auto" w:val="clear"/>
           <w:lang w:val="en-US" w:eastAsia="zh-CN" w:bidi="hi-IN"/>
         </w:rPr>
-        <w:t xml:space="preserve">Mas como deve ser a nossa oração? De que maneira  conseguimos efetivamente nos colocar em contato com </w:t>
-      </w:r>
-      <w:r>
-        <w:rPr>
-          <w:rFonts w:eastAsia="Times New Roman" w:cs="Times New Roman" w:ascii="Garamond" w:hAnsi="Garamond"/>
-          <w:color w:val="000000"/>
-          <w:kern w:val="0"/>
-          <w:sz w:val="36"/>
-          <w:szCs w:val="36"/>
-          <w:shd w:fill="auto" w:val="clear"/>
-          <w:lang w:val="en-US" w:eastAsia="zh-CN" w:bidi="hi-IN"/>
-        </w:rPr>
-        <w:t>Deus e Jesus</w:t>
-      </w:r>
-      <w:r>
-        <w:rPr>
-          <w:rFonts w:eastAsia="Times New Roman" w:cs="Times New Roman" w:ascii="Garamond" w:hAnsi="Garamond"/>
-          <w:color w:val="000000"/>
-          <w:kern w:val="0"/>
-          <w:sz w:val="36"/>
-          <w:szCs w:val="36"/>
-          <w:shd w:fill="auto" w:val="clear"/>
-          <w:lang w:val="en-US" w:eastAsia="zh-CN" w:bidi="hi-IN"/>
-        </w:rPr>
-        <w:t xml:space="preserve">? </w:t>
-      </w:r>
-      <w:r>
-        <w:rPr>
-          <w:rFonts w:eastAsia="Times New Roman" w:cs="Times New Roman" w:ascii="Garamond" w:hAnsi="Garamond"/>
-          <w:color w:val="000000"/>
-          <w:kern w:val="0"/>
-          <w:sz w:val="36"/>
-          <w:szCs w:val="36"/>
-          <w:shd w:fill="auto" w:val="clear"/>
-          <w:lang w:val="en-US" w:eastAsia="zh-CN" w:bidi="hi-IN"/>
-        </w:rPr>
-        <w:t>Eles</w:t>
-      </w:r>
-      <w:r>
-        <w:rPr>
-          <w:rFonts w:eastAsia="Times New Roman" w:cs="Times New Roman" w:ascii="Garamond" w:hAnsi="Garamond"/>
-          <w:color w:val="000000"/>
-          <w:kern w:val="0"/>
-          <w:sz w:val="36"/>
-          <w:szCs w:val="36"/>
-          <w:shd w:fill="auto" w:val="clear"/>
-          <w:lang w:val="en-US" w:eastAsia="zh-CN" w:bidi="hi-IN"/>
-        </w:rPr>
-        <w:t xml:space="preserve"> sempre ouve</w:t>
-      </w:r>
-      <w:r>
-        <w:rPr>
-          <w:rFonts w:eastAsia="Times New Roman" w:cs="Times New Roman" w:ascii="Garamond" w:hAnsi="Garamond"/>
-          <w:color w:val="000000"/>
-          <w:kern w:val="0"/>
-          <w:sz w:val="36"/>
-          <w:szCs w:val="36"/>
-          <w:shd w:fill="auto" w:val="clear"/>
-          <w:lang w:val="en-US" w:eastAsia="zh-CN" w:bidi="hi-IN"/>
-        </w:rPr>
-        <w:t>m</w:t>
-      </w:r>
-      <w:r>
-        <w:rPr>
-          <w:rFonts w:eastAsia="Times New Roman" w:cs="Times New Roman" w:ascii="Garamond" w:hAnsi="Garamond"/>
-          <w:color w:val="000000"/>
-          <w:kern w:val="0"/>
-          <w:sz w:val="36"/>
-          <w:szCs w:val="36"/>
-          <w:shd w:fill="auto" w:val="clear"/>
-          <w:lang w:val="en-US" w:eastAsia="zh-CN" w:bidi="hi-IN"/>
-        </w:rPr>
-        <w:t xml:space="preserve"> nossas preces? Podemos pedir qualquer coisa? </w:t>
+        <w:t xml:space="preserve">Mas como deve ser a nossa oração? De que maneira  conseguimos efetivamente nos colocar em contato com Deus e Jesus? Eles sempre ouvem nossas preces? Podemos pedir qualquer coisa? </w:t>
       </w:r>
     </w:p>
     <w:p>
@@ -1592,29 +1520,16 @@
     <w:p>
       <w:pPr>
         <w:pStyle w:val="Normal"/>
-        <w:jc w:val="both"/>
-        <w:rPr>
-          <w:color w:val="auto"/>
-        </w:rPr>
-      </w:pPr>
-      <w:r>
-        <w:rPr>
-          <w:color w:val="auto"/>
-        </w:rPr>
-      </w:r>
-    </w:p>
-    <w:p>
-      <w:pPr>
-        <w:pStyle w:val="Normal"/>
-        <w:jc w:val="both"/>
-        <w:rPr>
-          <w:color w:val="auto"/>
-        </w:rPr>
-      </w:pPr>
-      <w:r>
-        <w:rPr>
-          <w:color w:val="auto"/>
-        </w:rPr>
+        <w:ind w:left="720" w:hanging="0"/>
+        <w:jc w:val="both"/>
+        <w:rPr>
+          <w:i/>
+          <w:i/>
+          <w:iCs/>
+        </w:rPr>
+      </w:pPr>
+      <w:r>
+        <w:rPr/>
       </w:r>
     </w:p>
     <w:p>
@@ -1670,259 +1585,1026 @@
           <w:shd w:fill="auto" w:val="clear"/>
           <w:lang w:val="en-US" w:eastAsia="zh-CN" w:bidi="hi-IN"/>
         </w:rPr>
-        <w:t>Naturalmente</w:t>
-      </w:r>
-      <w:r>
-        <w:rPr>
-          <w:rFonts w:eastAsia="Times New Roman" w:cs="Times New Roman" w:ascii="Garamond" w:hAnsi="Garamond"/>
-          <w:color w:val="000000"/>
-          <w:kern w:val="0"/>
-          <w:sz w:val="36"/>
-          <w:szCs w:val="36"/>
-          <w:shd w:fill="auto" w:val="clear"/>
-          <w:lang w:val="en-US" w:eastAsia="zh-CN" w:bidi="hi-IN"/>
-        </w:rPr>
-        <w:t xml:space="preserve"> que um ambiente silencioso e calmo favorece a oração, mas isso não </w:t>
-      </w:r>
-      <w:r>
-        <w:rPr>
-          <w:rFonts w:eastAsia="Times New Roman" w:cs="Times New Roman" w:ascii="Garamond" w:hAnsi="Garamond"/>
-          <w:color w:val="000000"/>
-          <w:kern w:val="0"/>
-          <w:sz w:val="36"/>
-          <w:szCs w:val="36"/>
-          <w:shd w:fill="auto" w:val="clear"/>
-          <w:lang w:val="en-US" w:eastAsia="zh-CN" w:bidi="hi-IN"/>
-        </w:rPr>
-        <w:t>significa</w:t>
-      </w:r>
-      <w:r>
-        <w:rPr>
-          <w:rFonts w:eastAsia="Times New Roman" w:cs="Times New Roman" w:ascii="Garamond" w:hAnsi="Garamond"/>
-          <w:color w:val="000000"/>
-          <w:kern w:val="0"/>
-          <w:sz w:val="36"/>
-          <w:szCs w:val="36"/>
-          <w:shd w:fill="auto" w:val="clear"/>
-          <w:lang w:val="en-US" w:eastAsia="zh-CN" w:bidi="hi-IN"/>
-        </w:rPr>
-        <w:t xml:space="preserve"> que estamos impossibilitados de alcançar a paz interior estando longe dos redutos de tranquilidade. Se assim fosse, nossos momentos de oração seriam </w:t>
-      </w:r>
-      <w:r>
-        <w:rPr>
-          <w:rFonts w:eastAsia="Times New Roman" w:cs="Times New Roman" w:ascii="Garamond" w:hAnsi="Garamond"/>
-          <w:color w:val="000000"/>
-          <w:kern w:val="0"/>
-          <w:sz w:val="36"/>
-          <w:szCs w:val="36"/>
-          <w:shd w:fill="auto" w:val="clear"/>
-          <w:lang w:val="en-US" w:eastAsia="zh-CN" w:bidi="hi-IN"/>
-        </w:rPr>
-        <w:t>muito limitados</w:t>
-      </w:r>
-      <w:r>
-        <w:rPr>
-          <w:rFonts w:eastAsia="Times New Roman" w:cs="Times New Roman" w:ascii="Garamond" w:hAnsi="Garamond"/>
-          <w:color w:val="000000"/>
-          <w:kern w:val="0"/>
-          <w:sz w:val="36"/>
-          <w:szCs w:val="36"/>
-          <w:shd w:fill="auto" w:val="clear"/>
-          <w:lang w:val="en-US" w:eastAsia="zh-CN" w:bidi="hi-IN"/>
-        </w:rPr>
-        <w:t>.</w:t>
-      </w:r>
-    </w:p>
-    <w:p>
-      <w:pPr>
-        <w:pStyle w:val="Normal"/>
-        <w:jc w:val="both"/>
-        <w:rPr>
-          <w:color w:val="auto"/>
-        </w:rPr>
-      </w:pPr>
-      <w:r>
-        <w:rPr>
-          <w:color w:val="auto"/>
-        </w:rPr>
-      </w:r>
-    </w:p>
-    <w:p>
-      <w:pPr>
-        <w:pStyle w:val="Normal"/>
-        <w:jc w:val="both"/>
-        <w:rPr>
-          <w:color w:val="auto"/>
-        </w:rPr>
-      </w:pPr>
-      <w:r>
-        <w:rPr>
-          <w:color w:val="auto"/>
-        </w:rPr>
-      </w:r>
-    </w:p>
-    <w:p>
-      <w:pPr>
-        <w:pStyle w:val="Normal"/>
-        <w:jc w:val="both"/>
-        <w:rPr>
-          <w:color w:val="auto"/>
-        </w:rPr>
-      </w:pPr>
-      <w:r>
-        <w:rPr>
-          <w:rFonts w:eastAsia="Times New Roman" w:cs="Times New Roman" w:ascii="Garamond" w:hAnsi="Garamond"/>
-          <w:color w:val="000000"/>
-          <w:kern w:val="0"/>
-          <w:sz w:val="36"/>
-          <w:szCs w:val="36"/>
-          <w:shd w:fill="auto" w:val="clear"/>
-          <w:lang w:val="en-US" w:eastAsia="zh-CN" w:bidi="hi-IN"/>
-        </w:rPr>
-        <w:t>Vamos supor</w:t>
-      </w:r>
-      <w:r>
-        <w:rPr>
-          <w:rFonts w:eastAsia="Times New Roman" w:cs="Times New Roman" w:ascii="Garamond" w:hAnsi="Garamond"/>
-          <w:color w:val="000000"/>
-          <w:kern w:val="0"/>
-          <w:sz w:val="36"/>
-          <w:szCs w:val="36"/>
-          <w:shd w:fill="auto" w:val="clear"/>
-          <w:lang w:val="en-US" w:eastAsia="zh-CN" w:bidi="hi-IN"/>
-        </w:rPr>
-        <w:t xml:space="preserve"> a seguinte situação: eu </w:t>
-      </w:r>
-      <w:r>
-        <w:rPr>
-          <w:rFonts w:eastAsia="Times New Roman" w:cs="Times New Roman" w:ascii="Garamond" w:hAnsi="Garamond"/>
-          <w:color w:val="000000"/>
-          <w:kern w:val="0"/>
-          <w:sz w:val="36"/>
-          <w:szCs w:val="36"/>
-          <w:shd w:fill="auto" w:val="clear"/>
-          <w:lang w:val="en-US" w:eastAsia="zh-CN" w:bidi="hi-IN"/>
-        </w:rPr>
-        <w:t>estou</w:t>
-      </w:r>
-      <w:r>
-        <w:rPr>
-          <w:rFonts w:eastAsia="Times New Roman" w:cs="Times New Roman" w:ascii="Garamond" w:hAnsi="Garamond"/>
-          <w:color w:val="000000"/>
-          <w:kern w:val="0"/>
-          <w:sz w:val="36"/>
-          <w:szCs w:val="36"/>
-          <w:shd w:fill="auto" w:val="clear"/>
-          <w:lang w:val="en-US" w:eastAsia="zh-CN" w:bidi="hi-IN"/>
-        </w:rPr>
-        <w:t xml:space="preserve"> no ônibus lotado, em pé, voltando para casa depois de um dia de trabalho difícil</w:t>
-      </w:r>
-      <w:r>
-        <w:rPr>
-          <w:rFonts w:eastAsia="Times New Roman" w:cs="Times New Roman" w:ascii="Garamond" w:hAnsi="Garamond"/>
-          <w:color w:val="000000"/>
-          <w:kern w:val="0"/>
-          <w:sz w:val="36"/>
-          <w:szCs w:val="36"/>
-          <w:shd w:fill="auto" w:val="clear"/>
-          <w:lang w:val="en-US" w:eastAsia="zh-CN" w:bidi="hi-IN"/>
-        </w:rPr>
-        <w:t>. O trânsito, como de costume, está barulhento e caótico.</w:t>
-      </w:r>
-    </w:p>
-    <w:p>
-      <w:pPr>
-        <w:pStyle w:val="Normal"/>
-        <w:jc w:val="both"/>
-        <w:rPr>
-          <w:color w:val="auto"/>
-        </w:rPr>
-      </w:pPr>
-      <w:r>
-        <w:rPr>
-          <w:color w:val="auto"/>
-        </w:rPr>
-      </w:r>
-    </w:p>
-    <w:p>
-      <w:pPr>
-        <w:pStyle w:val="Normal"/>
-        <w:jc w:val="both"/>
-        <w:rPr>
-          <w:color w:val="auto"/>
-        </w:rPr>
-      </w:pPr>
-      <w:r>
-        <w:rPr>
-          <w:rFonts w:eastAsia="Times New Roman" w:cs="Times New Roman" w:ascii="Garamond" w:hAnsi="Garamond"/>
-          <w:color w:val="000000"/>
-          <w:kern w:val="0"/>
-          <w:sz w:val="36"/>
-          <w:szCs w:val="36"/>
-          <w:shd w:fill="auto" w:val="clear"/>
-          <w:lang w:val="en-US" w:eastAsia="zh-CN" w:bidi="hi-IN"/>
-        </w:rPr>
-        <w:t xml:space="preserve">De repente </w:t>
-      </w:r>
-      <w:r>
-        <w:rPr>
-          <w:rFonts w:eastAsia="Times New Roman" w:cs="Times New Roman" w:ascii="Garamond" w:hAnsi="Garamond"/>
-          <w:color w:val="000000"/>
-          <w:kern w:val="0"/>
-          <w:sz w:val="36"/>
-          <w:szCs w:val="36"/>
-          <w:shd w:fill="auto" w:val="clear"/>
-          <w:lang w:val="en-US" w:eastAsia="zh-CN" w:bidi="hi-IN"/>
-        </w:rPr>
-        <w:t>um amigo</w:t>
-      </w:r>
-      <w:r>
-        <w:rPr>
-          <w:rFonts w:eastAsia="Times New Roman" w:cs="Times New Roman" w:ascii="Garamond" w:hAnsi="Garamond"/>
-          <w:color w:val="000000"/>
-          <w:kern w:val="0"/>
-          <w:sz w:val="36"/>
-          <w:szCs w:val="36"/>
-          <w:shd w:fill="auto" w:val="clear"/>
-          <w:lang w:val="en-US" w:eastAsia="zh-CN" w:bidi="hi-IN"/>
-        </w:rPr>
-        <w:t xml:space="preserve"> me manda uma mensagem no WhatsApp informando que </w:t>
-      </w:r>
-      <w:r>
-        <w:rPr>
-          <w:rFonts w:eastAsia="Times New Roman" w:cs="Times New Roman" w:ascii="Garamond" w:hAnsi="Garamond"/>
-          <w:color w:val="000000"/>
-          <w:kern w:val="0"/>
-          <w:sz w:val="36"/>
-          <w:szCs w:val="36"/>
-          <w:shd w:fill="auto" w:val="clear"/>
-          <w:lang w:val="en-US" w:eastAsia="zh-CN" w:bidi="hi-IN"/>
-        </w:rPr>
-        <w:t>uma pessoa muito querida por nós dois</w:t>
-      </w:r>
-      <w:r>
-        <w:rPr>
-          <w:rFonts w:eastAsia="Times New Roman" w:cs="Times New Roman" w:ascii="Garamond" w:hAnsi="Garamond"/>
-          <w:color w:val="000000"/>
-          <w:kern w:val="0"/>
-          <w:sz w:val="36"/>
-          <w:szCs w:val="36"/>
-          <w:shd w:fill="auto" w:val="clear"/>
-          <w:lang w:val="en-US" w:eastAsia="zh-CN" w:bidi="hi-IN"/>
-        </w:rPr>
-        <w:t xml:space="preserve"> sofreu um acidente grave e </w:t>
-      </w:r>
-      <w:r>
-        <w:rPr>
-          <w:rFonts w:eastAsia="Times New Roman" w:cs="Times New Roman" w:ascii="Garamond" w:hAnsi="Garamond"/>
-          <w:color w:val="000000"/>
-          <w:kern w:val="0"/>
-          <w:sz w:val="36"/>
-          <w:szCs w:val="36"/>
-          <w:shd w:fill="auto" w:val="clear"/>
-          <w:lang w:val="en-US" w:eastAsia="zh-CN" w:bidi="hi-IN"/>
-        </w:rPr>
-        <w:t>corre risco de morte</w:t>
+        <w:t>Naturalmente que um ambiente silencioso e calmo favorece a oração, mas isso não significa que estamos impossibilitados de alcançar a paz interior estando longe dos redutos de tranquilidade. Se assim fosse, nossos momentos de oração seriam muito limitados.</w:t>
+      </w:r>
+    </w:p>
+    <w:p>
+      <w:pPr>
+        <w:pStyle w:val="Normal"/>
+        <w:jc w:val="both"/>
+        <w:rPr>
+          <w:color w:val="auto"/>
+        </w:rPr>
+      </w:pPr>
+      <w:r>
+        <w:rPr>
+          <w:color w:val="auto"/>
+        </w:rPr>
+      </w:r>
+    </w:p>
+    <w:p>
+      <w:pPr>
+        <w:pStyle w:val="Normal"/>
+        <w:jc w:val="both"/>
+        <w:rPr>
+          <w:color w:val="auto"/>
+        </w:rPr>
+      </w:pPr>
+      <w:r>
+        <w:rPr>
+          <w:color w:val="auto"/>
+        </w:rPr>
+      </w:r>
+    </w:p>
+    <w:p>
+      <w:pPr>
+        <w:pStyle w:val="Normal"/>
+        <w:jc w:val="both"/>
+        <w:rPr>
+          <w:color w:val="auto"/>
+        </w:rPr>
+      </w:pPr>
+      <w:r>
+        <w:rPr>
+          <w:rFonts w:eastAsia="Times New Roman" w:cs="Times New Roman" w:ascii="Garamond" w:hAnsi="Garamond"/>
+          <w:color w:val="000000"/>
+          <w:kern w:val="0"/>
+          <w:sz w:val="36"/>
+          <w:szCs w:val="36"/>
+          <w:shd w:fill="auto" w:val="clear"/>
+          <w:lang w:val="en-US" w:eastAsia="zh-CN" w:bidi="hi-IN"/>
+        </w:rPr>
+        <w:t>Vamos supor a seguinte situação: eu estou no ônibus lotado, em pé, voltando para casa depois de um dia de trabalho difícil. O trânsito, como de costume, está barulhento e caótico.</w:t>
+      </w:r>
+    </w:p>
+    <w:p>
+      <w:pPr>
+        <w:pStyle w:val="Normal"/>
+        <w:jc w:val="both"/>
+        <w:rPr>
+          <w:color w:val="auto"/>
+        </w:rPr>
+      </w:pPr>
+      <w:r>
+        <w:rPr>
+          <w:color w:val="auto"/>
+        </w:rPr>
+      </w:r>
+    </w:p>
+    <w:p>
+      <w:pPr>
+        <w:pStyle w:val="Normal"/>
+        <w:jc w:val="both"/>
+        <w:rPr>
+          <w:color w:val="auto"/>
+        </w:rPr>
+      </w:pPr>
+      <w:r>
+        <w:rPr>
+          <w:rFonts w:eastAsia="Times New Roman" w:cs="Times New Roman" w:ascii="Garamond" w:hAnsi="Garamond"/>
+          <w:color w:val="000000"/>
+          <w:kern w:val="0"/>
+          <w:sz w:val="36"/>
+          <w:szCs w:val="36"/>
+          <w:shd w:fill="auto" w:val="clear"/>
+          <w:lang w:val="en-US" w:eastAsia="zh-CN" w:bidi="hi-IN"/>
+        </w:rPr>
+        <w:t>De repente um amigo me manda uma mensagem no WhatsApp informando que uma pessoa muito querida por nós dois sofreu um acidente grave e corre risco de morte. Meu amigo me diz que depois me dá mais informações sobre o acontecido.</w:t>
+      </w:r>
+    </w:p>
+    <w:p>
+      <w:pPr>
+        <w:pStyle w:val="Normal"/>
+        <w:jc w:val="both"/>
+        <w:rPr>
+          <w:color w:val="auto"/>
+        </w:rPr>
+      </w:pPr>
+      <w:r>
+        <w:rPr>
+          <w:color w:val="auto"/>
+        </w:rPr>
+      </w:r>
+    </w:p>
+    <w:p>
+      <w:pPr>
+        <w:pStyle w:val="Normal"/>
+        <w:jc w:val="both"/>
+        <w:rPr>
+          <w:color w:val="auto"/>
+        </w:rPr>
+      </w:pPr>
+      <w:r>
+        <w:rPr>
+          <w:rFonts w:eastAsia="Times New Roman" w:cs="Times New Roman" w:ascii="Garamond" w:hAnsi="Garamond"/>
+          <w:color w:val="000000"/>
+          <w:kern w:val="0"/>
+          <w:sz w:val="36"/>
+          <w:szCs w:val="36"/>
+          <w:shd w:fill="auto" w:val="clear"/>
+          <w:lang w:val="en-US" w:eastAsia="zh-CN" w:bidi="hi-IN"/>
+        </w:rPr>
+        <w:t xml:space="preserve">O lugar e a hora em que me encontro são os mais adequados para a prece? Definitivamente que não. Mas vou deixar de orar por aquela pessoa querida só porque não estou em um ambiente favorável à oração? De maneira alguma. </w:t>
+      </w:r>
+    </w:p>
+    <w:p>
+      <w:pPr>
+        <w:pStyle w:val="Normal"/>
+        <w:jc w:val="both"/>
+        <w:rPr>
+          <w:color w:val="auto"/>
+        </w:rPr>
+      </w:pPr>
+      <w:r>
+        <w:rPr>
+          <w:color w:val="auto"/>
+        </w:rPr>
+      </w:r>
+    </w:p>
+    <w:p>
+      <w:pPr>
+        <w:pStyle w:val="Normal"/>
+        <w:jc w:val="both"/>
+        <w:rPr>
+          <w:color w:val="auto"/>
+        </w:rPr>
+      </w:pPr>
+      <w:r>
+        <w:rPr>
+          <w:rFonts w:eastAsia="Times New Roman" w:cs="Times New Roman" w:ascii="Garamond" w:hAnsi="Garamond"/>
+          <w:color w:val="000000"/>
+          <w:kern w:val="0"/>
+          <w:sz w:val="36"/>
+          <w:szCs w:val="36"/>
+          <w:shd w:fill="auto" w:val="clear"/>
+          <w:lang w:val="en-US" w:eastAsia="zh-CN" w:bidi="hi-IN"/>
+        </w:rPr>
+        <w:t>Eu posso e devo orar ali mesmo, naquelas condições. Com algum esforço da minha parte consigo me abstrair do tumulto à minha volta e elevar a Deus, a Jesus e aos Espíritos amigos minhas rogativas em favor do amigo acidentado.</w:t>
+      </w:r>
+    </w:p>
+    <w:p>
+      <w:pPr>
+        <w:pStyle w:val="Normal"/>
+        <w:jc w:val="both"/>
+        <w:rPr>
+          <w:color w:val="auto"/>
+        </w:rPr>
+      </w:pPr>
+      <w:r>
+        <w:rPr>
+          <w:color w:val="auto"/>
+        </w:rPr>
+      </w:r>
+    </w:p>
+    <w:p>
+      <w:pPr>
+        <w:pStyle w:val="Normal"/>
+        <w:jc w:val="both"/>
+        <w:rPr>
+          <w:color w:val="auto"/>
+        </w:rPr>
+      </w:pPr>
+      <w:r>
+        <w:rPr>
+          <w:rFonts w:eastAsia="Times New Roman" w:cs="Times New Roman" w:ascii="Garamond" w:hAnsi="Garamond"/>
+          <w:color w:val="000000"/>
+          <w:kern w:val="0"/>
+          <w:sz w:val="36"/>
+          <w:szCs w:val="36"/>
+          <w:shd w:fill="auto" w:val="clear"/>
+          <w:lang w:val="en-US" w:eastAsia="zh-CN" w:bidi="hi-IN"/>
+        </w:rPr>
+        <w:t>Mais tarde, quando eu já estiver na tranquilidade do meu lar, eu oro novamente em condições mais adequadas, mas não devo prescindir da prece enquanto eu ainda estou no ônibus.</w:t>
+      </w:r>
+    </w:p>
+    <w:p>
+      <w:pPr>
+        <w:pStyle w:val="Normal"/>
+        <w:jc w:val="both"/>
+        <w:rPr>
+          <w:color w:val="auto"/>
+        </w:rPr>
+      </w:pPr>
+      <w:r>
+        <w:rPr>
+          <w:color w:val="auto"/>
+        </w:rPr>
+      </w:r>
+    </w:p>
+    <w:p>
+      <w:pPr>
+        <w:pStyle w:val="Normal"/>
+        <w:jc w:val="both"/>
+        <w:rPr>
+          <w:color w:val="auto"/>
+        </w:rPr>
+      </w:pPr>
+      <w:r>
+        <w:rPr>
+          <w:rFonts w:eastAsia="Times New Roman" w:cs="Times New Roman" w:ascii="Garamond" w:hAnsi="Garamond"/>
+          <w:color w:val="000000"/>
+          <w:kern w:val="0"/>
+          <w:sz w:val="36"/>
+          <w:szCs w:val="36"/>
+          <w:shd w:fill="auto" w:val="clear"/>
+          <w:lang w:val="en-US" w:eastAsia="zh-CN" w:bidi="hi-IN"/>
+        </w:rPr>
+        <w:t>Então, ao dizer que devemos orar em secreto no nosso quarto, Jesus está nos dando uma recomendação clara e direta com relação à sinceridade e ao recolhimento que devem existir naqueles que desejam se colocar em sintonia com os planos mais altos da vida, embora isso não necessariamente exija um lugar silencioso e isolado.</w:t>
+      </w:r>
+    </w:p>
+    <w:p>
+      <w:pPr>
+        <w:pStyle w:val="Normal"/>
+        <w:jc w:val="both"/>
+        <w:rPr>
+          <w:color w:val="auto"/>
+        </w:rPr>
+      </w:pPr>
+      <w:r>
+        <w:rPr>
+          <w:color w:val="auto"/>
+        </w:rPr>
+      </w:r>
+    </w:p>
+    <w:p>
+      <w:pPr>
+        <w:pStyle w:val="Normal"/>
+        <w:jc w:val="both"/>
+        <w:rPr>
+          <w:color w:val="auto"/>
+        </w:rPr>
+      </w:pPr>
+      <w:r>
+        <w:rPr>
+          <w:rFonts w:eastAsia="Times New Roman" w:cs="Times New Roman" w:ascii="Garamond" w:hAnsi="Garamond"/>
+          <w:color w:val="000000"/>
+          <w:kern w:val="0"/>
+          <w:sz w:val="36"/>
+          <w:szCs w:val="36"/>
+          <w:shd w:fill="auto" w:val="clear"/>
+          <w:lang w:val="en-US" w:eastAsia="zh-CN" w:bidi="hi-IN"/>
+        </w:rPr>
+        <w:t>A partir do momento em que tomamos consciência disso, a oração passa a ser um recurso ainda mais valioso para nós. Quando passarmos por um irmão embriagado ou drogado caído na calçada, podemos orar por ele pedindo, por exemplo, que Deus dê forças àquele irmão para superar seus vícios e mudar sua conduta de vida.</w:t>
+      </w:r>
+    </w:p>
+    <w:p>
+      <w:pPr>
+        <w:pStyle w:val="Normal"/>
+        <w:jc w:val="both"/>
+        <w:rPr>
+          <w:color w:val="auto"/>
+        </w:rPr>
+      </w:pPr>
+      <w:r>
+        <w:rPr>
+          <w:color w:val="auto"/>
+        </w:rPr>
+      </w:r>
+    </w:p>
+    <w:p>
+      <w:pPr>
+        <w:pStyle w:val="Normal"/>
+        <w:jc w:val="both"/>
+        <w:rPr>
+          <w:color w:val="auto"/>
+        </w:rPr>
+      </w:pPr>
+      <w:r>
+        <w:rPr>
+          <w:rFonts w:eastAsia="Times New Roman" w:cs="Times New Roman" w:ascii="Garamond" w:hAnsi="Garamond"/>
+          <w:color w:val="000000"/>
+          <w:kern w:val="0"/>
+          <w:sz w:val="36"/>
+          <w:szCs w:val="36"/>
+          <w:shd w:fill="auto" w:val="clear"/>
+          <w:lang w:val="en-US" w:eastAsia="zh-CN" w:bidi="hi-IN"/>
+        </w:rPr>
+        <w:t>Quando estivermos dirigindo e presenciarmos um acidente, também podemos orar pelas pessoas envolvidas naquele acidente.</w:t>
+      </w:r>
+    </w:p>
+    <w:p>
+      <w:pPr>
+        <w:pStyle w:val="Normal"/>
+        <w:jc w:val="both"/>
+        <w:rPr>
+          <w:color w:val="auto"/>
+        </w:rPr>
+      </w:pPr>
+      <w:r>
+        <w:rPr>
+          <w:color w:val="auto"/>
+        </w:rPr>
+      </w:r>
+    </w:p>
+    <w:p>
+      <w:pPr>
+        <w:pStyle w:val="Normal"/>
+        <w:jc w:val="both"/>
+        <w:rPr>
+          <w:color w:val="auto"/>
+        </w:rPr>
+      </w:pPr>
+      <w:r>
+        <w:rPr>
+          <w:rFonts w:eastAsia="Times New Roman" w:cs="Times New Roman" w:ascii="Garamond" w:hAnsi="Garamond"/>
+          <w:color w:val="000000"/>
+          <w:kern w:val="0"/>
+          <w:sz w:val="36"/>
+          <w:szCs w:val="36"/>
+          <w:shd w:fill="auto" w:val="clear"/>
+          <w:lang w:val="en-US" w:eastAsia="zh-CN" w:bidi="hi-IN"/>
+        </w:rPr>
+        <w:t>Eu tenho muita dificuldade em compreender a curiosidade mórbida que muitos têm em ver vítimas feridas ou mortas em acidentes. Já repararam que quando acontece um acidente de trânsito em uma pista, a outra também fica com o trânsito lento? É porque as pessoas dirigindo em sentido contrário reduzem a velocidade para ver o que aconteceu.</w:t>
+      </w:r>
+    </w:p>
+    <w:p>
+      <w:pPr>
+        <w:pStyle w:val="Normal"/>
+        <w:jc w:val="both"/>
+        <w:rPr>
+          <w:color w:val="auto"/>
+        </w:rPr>
+      </w:pPr>
+      <w:r>
+        <w:rPr>
+          <w:color w:val="auto"/>
+        </w:rPr>
+      </w:r>
+    </w:p>
+    <w:p>
+      <w:pPr>
+        <w:pStyle w:val="Normal"/>
+        <w:jc w:val="both"/>
+        <w:rPr>
+          <w:color w:val="auto"/>
+        </w:rPr>
+      </w:pPr>
+      <w:r>
+        <w:rPr>
+          <w:rFonts w:eastAsia="Times New Roman" w:cs="Times New Roman" w:ascii="Garamond" w:hAnsi="Garamond"/>
+          <w:color w:val="000000"/>
+          <w:kern w:val="0"/>
+          <w:sz w:val="36"/>
+          <w:szCs w:val="36"/>
+          <w:shd w:fill="auto" w:val="clear"/>
+          <w:lang w:val="en-US" w:eastAsia="zh-CN" w:bidi="hi-IN"/>
+        </w:rPr>
+        <w:t>Se ainda carregamos esse tipo de curiosidade conosco, vamos mudar de postura. Em vez de querer ver o que aconteceu, elevemos um pensamento a Deus, pedindo socorro para os feridos e amparo aos que desencarnaram. Fazemos essa oração e seguimos nosso caminho.</w:t>
+      </w:r>
+    </w:p>
+    <w:p>
+      <w:pPr>
+        <w:pStyle w:val="Normal"/>
+        <w:jc w:val="both"/>
+        <w:rPr>
+          <w:color w:val="auto"/>
+        </w:rPr>
+      </w:pPr>
+      <w:r>
+        <w:rPr>
+          <w:color w:val="auto"/>
+        </w:rPr>
+      </w:r>
+    </w:p>
+    <w:p>
+      <w:pPr>
+        <w:pStyle w:val="Normal"/>
+        <w:jc w:val="both"/>
+        <w:rPr>
+          <w:color w:val="auto"/>
+        </w:rPr>
+      </w:pPr>
+      <w:r>
+        <w:rPr>
+          <w:rFonts w:eastAsia="Times New Roman" w:cs="Times New Roman" w:ascii="Garamond" w:hAnsi="Garamond"/>
+          <w:color w:val="000000"/>
+          <w:kern w:val="0"/>
+          <w:sz w:val="36"/>
+          <w:szCs w:val="36"/>
+          <w:shd w:fill="auto" w:val="clear"/>
+          <w:lang w:val="en-US" w:eastAsia="zh-CN" w:bidi="hi-IN"/>
+        </w:rPr>
+        <w:t xml:space="preserve">Retornando à passagem evangélica que estamos analisando, Jesus nos diz para não orarmos como os pagãos, que pensam que é pela quantidade de palavras que suas preces serão ouvidas. </w:t>
+      </w:r>
+      <w:r>
+        <w:rPr>
+          <w:rFonts w:eastAsia="Times New Roman" w:cs="Times New Roman" w:ascii="Garamond" w:hAnsi="Garamond"/>
+          <w:color w:val="C9211E"/>
+          <w:kern w:val="0"/>
+          <w:sz w:val="36"/>
+          <w:szCs w:val="36"/>
+          <w:shd w:fill="auto" w:val="clear"/>
+          <w:lang w:val="en-US" w:eastAsia="zh-CN" w:bidi="hi-IN"/>
+        </w:rPr>
+        <w:t>O Mestre diz ainda que Deus sabe do que precisamos antes mesmo de o perdirmos (verificar se essa parte já foi comentada anteriormente. Agora não me lembro).</w:t>
+      </w:r>
+    </w:p>
+    <w:p>
+      <w:pPr>
+        <w:pStyle w:val="Normal"/>
+        <w:jc w:val="both"/>
+        <w:rPr>
+          <w:color w:val="auto"/>
+        </w:rPr>
+      </w:pPr>
+      <w:r>
+        <w:rPr>
+          <w:color w:val="auto"/>
+        </w:rPr>
+      </w:r>
+    </w:p>
+    <w:p>
+      <w:pPr>
+        <w:pStyle w:val="Normal"/>
+        <w:jc w:val="both"/>
+        <w:rPr>
+          <w:color w:val="auto"/>
+        </w:rPr>
+      </w:pPr>
+      <w:r>
+        <w:rPr>
+          <w:rFonts w:eastAsia="Times New Roman" w:cs="Times New Roman" w:ascii="Garamond" w:hAnsi="Garamond"/>
+          <w:color w:val="000000"/>
+          <w:kern w:val="0"/>
+          <w:sz w:val="36"/>
+          <w:szCs w:val="36"/>
+          <w:shd w:fill="auto" w:val="clear"/>
+          <w:lang w:val="en-US" w:eastAsia="zh-CN" w:bidi="hi-IN"/>
+        </w:rPr>
+        <w:t>Quem eram os pagãos a quem Jesus se refere? Eles eram principalmente os povos gentios do mundo greco-romano — isto é, aqueles que não pertenciam à tradição judaica e seguiam religiões politeístas comuns no Império Romano. Nessas práticas religiosas, era frequente a repetição longa de fórmulas e invocações, porque muitos acreditavam que a divindade poderia ser convencida ou constrangida pela multiplicidade das palavras, como se o poder estivesse na quantidade ou na exatidão da expressão verbal.</w:t>
+      </w:r>
+    </w:p>
+    <w:p>
+      <w:pPr>
+        <w:pStyle w:val="Normal"/>
+        <w:jc w:val="both"/>
+        <w:rPr>
+          <w:color w:val="auto"/>
+        </w:rPr>
+      </w:pPr>
+      <w:r>
+        <w:rPr>
+          <w:color w:val="auto"/>
+        </w:rPr>
+      </w:r>
+    </w:p>
+    <w:p>
+      <w:pPr>
+        <w:pStyle w:val="Normal"/>
+        <w:jc w:val="both"/>
+        <w:rPr>
+          <w:color w:val="auto"/>
+        </w:rPr>
+      </w:pPr>
+      <w:r>
+        <w:rPr>
+          <w:rFonts w:eastAsia="Times New Roman" w:cs="Times New Roman" w:ascii="Garamond" w:hAnsi="Garamond"/>
+          <w:color w:val="000000"/>
+          <w:kern w:val="0"/>
+          <w:sz w:val="36"/>
+          <w:szCs w:val="36"/>
+          <w:shd w:fill="auto" w:val="clear"/>
+          <w:lang w:val="en-US" w:eastAsia="zh-CN" w:bidi="hi-IN"/>
+        </w:rPr>
+        <w:t xml:space="preserve">Ao fazer essa advertência, Jesus não condena a perseverança na prece, mas corrige a mentalidade mágica e mecânica. Ele nos recorda que o Pai já sabe do que necessitamos antes mesmo que peçamos. A oração, portanto, não é instrumento de pressão sobre Deus, mas caminho de transformação interior. </w:t>
+      </w:r>
+    </w:p>
+    <w:p>
+      <w:pPr>
+        <w:pStyle w:val="Normal"/>
+        <w:jc w:val="both"/>
+        <w:rPr>
+          <w:color w:val="auto"/>
+        </w:rPr>
+      </w:pPr>
+      <w:r>
+        <w:rPr>
+          <w:color w:val="auto"/>
+        </w:rPr>
+      </w:r>
+    </w:p>
+    <w:p>
+      <w:pPr>
+        <w:pStyle w:val="Normal"/>
+        <w:jc w:val="both"/>
+        <w:rPr>
+          <w:color w:val="auto"/>
+        </w:rPr>
+      </w:pPr>
+      <w:r>
+        <w:rPr>
+          <w:rFonts w:eastAsia="Times New Roman" w:cs="Times New Roman" w:ascii="Garamond" w:hAnsi="Garamond"/>
+          <w:color w:val="000000"/>
+          <w:kern w:val="0"/>
+          <w:sz w:val="36"/>
+          <w:szCs w:val="36"/>
+          <w:shd w:fill="auto" w:val="clear"/>
+          <w:lang w:val="en-US" w:eastAsia="zh-CN" w:bidi="hi-IN"/>
+        </w:rPr>
+        <w:t>Quando Jesus nos alerta contra as vãs repetições, Ele nos convida a substituir o automatismo pela sinceridade, a quantidade pela qualidade e a palavra vazia pelo sentimento verdadeiro.</w:t>
+      </w:r>
+    </w:p>
+    <w:p>
+      <w:pPr>
+        <w:pStyle w:val="Normal"/>
+        <w:jc w:val="both"/>
+        <w:rPr>
+          <w:color w:val="auto"/>
+        </w:rPr>
+      </w:pPr>
+      <w:r>
+        <w:rPr>
+          <w:color w:val="auto"/>
+        </w:rPr>
+      </w:r>
+    </w:p>
+    <w:p>
+      <w:pPr>
+        <w:pStyle w:val="Normal"/>
+        <w:jc w:val="both"/>
+        <w:rPr>
+          <w:color w:val="auto"/>
+        </w:rPr>
+      </w:pPr>
+      <w:r>
+        <w:rPr>
+          <w:rFonts w:eastAsia="Times New Roman" w:cs="Times New Roman" w:ascii="Garamond" w:hAnsi="Garamond"/>
+          <w:color w:val="000000"/>
+          <w:kern w:val="0"/>
+          <w:sz w:val="36"/>
+          <w:szCs w:val="36"/>
+          <w:shd w:fill="auto" w:val="clear"/>
+          <w:lang w:val="en-US" w:eastAsia="zh-CN" w:bidi="hi-IN"/>
+        </w:rPr>
+        <w:t xml:space="preserve">Essa prática desaconselhada por Jesus, acabou se tornando comum na Igreja Católica e é algo que vemos ainda nos dias de hoje. Como nossa intenção não é criticar quaisquer escolas religiosas, vamos entender a fundamentação dessa prática. </w:t>
+      </w:r>
+    </w:p>
+    <w:p>
+      <w:pPr>
+        <w:pStyle w:val="Normal"/>
+        <w:jc w:val="both"/>
+        <w:rPr>
+          <w:color w:val="auto"/>
+        </w:rPr>
+      </w:pPr>
+      <w:r>
+        <w:rPr>
+          <w:color w:val="auto"/>
+        </w:rPr>
+      </w:r>
+    </w:p>
+    <w:p>
+      <w:pPr>
+        <w:pStyle w:val="Normal"/>
+        <w:jc w:val="both"/>
+        <w:rPr>
+          <w:color w:val="auto"/>
+        </w:rPr>
+      </w:pPr>
+      <w:r>
+        <w:rPr>
+          <w:rFonts w:eastAsia="Times New Roman" w:cs="Times New Roman" w:ascii="Garamond" w:hAnsi="Garamond"/>
+          <w:color w:val="000000"/>
+          <w:kern w:val="0"/>
+          <w:sz w:val="36"/>
+          <w:szCs w:val="36"/>
+          <w:shd w:fill="auto" w:val="clear"/>
+          <w:lang w:val="en-US" w:eastAsia="zh-CN" w:bidi="hi-IN"/>
+        </w:rPr>
+        <w:t>Ao longo da história do cristianismo, especialmente a partir da Idade Média, desenvolveu-se na Igreja Católica a prática da penitência associada ao sacramento da confissão. Ou seja: a pessoa se confessava e recebia uma penitência a ser cumprida.</w:t>
+      </w:r>
+    </w:p>
+    <w:p>
+      <w:pPr>
+        <w:pStyle w:val="Normal"/>
+        <w:jc w:val="both"/>
+        <w:rPr>
+          <w:color w:val="auto"/>
+        </w:rPr>
+      </w:pPr>
+      <w:r>
+        <w:rPr>
+          <w:color w:val="auto"/>
+        </w:rPr>
+      </w:r>
+    </w:p>
+    <w:p>
+      <w:pPr>
+        <w:pStyle w:val="Normal"/>
+        <w:jc w:val="both"/>
+        <w:rPr>
+          <w:color w:val="auto"/>
+        </w:rPr>
+      </w:pPr>
+      <w:r>
+        <w:rPr>
+          <w:rFonts w:eastAsia="Times New Roman" w:cs="Times New Roman" w:ascii="Garamond" w:hAnsi="Garamond"/>
+          <w:color w:val="000000"/>
+          <w:kern w:val="0"/>
+          <w:sz w:val="36"/>
+          <w:szCs w:val="36"/>
+          <w:shd w:fill="auto" w:val="clear"/>
+          <w:lang w:val="en-US" w:eastAsia="zh-CN" w:bidi="hi-IN"/>
+        </w:rPr>
+        <w:t xml:space="preserve">Nos primeiros séculos, as penitências eram públicas e, às vezes, bastante rigorosas. Por volta dos séculos VI e VII, surgiu a prática das confissões individuais e mais frequentes. </w:t>
+      </w:r>
+    </w:p>
+    <w:p>
+      <w:pPr>
+        <w:pStyle w:val="Normal"/>
+        <w:jc w:val="both"/>
+        <w:rPr>
+          <w:color w:val="auto"/>
+        </w:rPr>
+      </w:pPr>
+      <w:r>
+        <w:rPr>
+          <w:color w:val="auto"/>
+        </w:rPr>
+      </w:r>
+    </w:p>
+    <w:p>
+      <w:pPr>
+        <w:pStyle w:val="Normal"/>
+        <w:jc w:val="both"/>
+        <w:rPr>
+          <w:color w:val="auto"/>
+        </w:rPr>
+      </w:pPr>
+      <w:r>
+        <w:rPr>
+          <w:rFonts w:eastAsia="Times New Roman" w:cs="Times New Roman" w:ascii="Garamond" w:hAnsi="Garamond"/>
+          <w:color w:val="000000"/>
+          <w:kern w:val="0"/>
+          <w:sz w:val="36"/>
+          <w:szCs w:val="36"/>
+          <w:shd w:fill="auto" w:val="clear"/>
+          <w:lang w:val="en-US" w:eastAsia="zh-CN" w:bidi="hi-IN"/>
+        </w:rPr>
+        <w:t>Surgiram então os chamados “penitenciais”, livros que indicavam orientações espirituais para cada pecado, incluindo jejuns, obras de caridade e também a recitação de determinado número de salmos ou orações.</w:t>
+      </w:r>
+    </w:p>
+    <w:p>
+      <w:pPr>
+        <w:pStyle w:val="Normal"/>
+        <w:jc w:val="both"/>
+        <w:rPr>
+          <w:color w:val="auto"/>
+        </w:rPr>
+      </w:pPr>
+      <w:r>
+        <w:rPr>
+          <w:color w:val="auto"/>
+        </w:rPr>
+      </w:r>
+    </w:p>
+    <w:p>
+      <w:pPr>
+        <w:pStyle w:val="Normal"/>
+        <w:jc w:val="both"/>
+        <w:rPr>
+          <w:color w:val="auto"/>
+        </w:rPr>
+      </w:pPr>
+      <w:r>
+        <w:rPr>
+          <w:rFonts w:eastAsia="Times New Roman" w:cs="Times New Roman" w:ascii="Garamond" w:hAnsi="Garamond"/>
+          <w:color w:val="000000"/>
+          <w:kern w:val="0"/>
+          <w:sz w:val="36"/>
+          <w:szCs w:val="36"/>
+          <w:shd w:fill="auto" w:val="clear"/>
+          <w:lang w:val="en-US" w:eastAsia="zh-CN" w:bidi="hi-IN"/>
+        </w:rPr>
+        <w:t xml:space="preserve">Foi nesse contexto que surgiu a repetição do Pai-Nosso e da Ave-Maria como parte da penitência. O objetivo não era comprar o perdão, até porque, de acordo com a teologia católica, isso não é possível; o perdão só pode ser concedido por Deus .no momento da absolvição. A intenção era propor um exercício espiritual de reparação, disciplina e recolhimento. </w:t>
+      </w:r>
+    </w:p>
+    <w:p>
+      <w:pPr>
+        <w:pStyle w:val="Normal"/>
+        <w:jc w:val="both"/>
+        <w:rPr>
+          <w:color w:val="auto"/>
+        </w:rPr>
+      </w:pPr>
+      <w:r>
+        <w:rPr>
+          <w:color w:val="auto"/>
+        </w:rPr>
+      </w:r>
+    </w:p>
+    <w:p>
+      <w:pPr>
+        <w:pStyle w:val="Normal"/>
+        <w:jc w:val="both"/>
+        <w:rPr>
+          <w:color w:val="auto"/>
+        </w:rPr>
+      </w:pPr>
+      <w:r>
+        <w:rPr>
+          <w:rFonts w:eastAsia="Times New Roman" w:cs="Times New Roman" w:ascii="Garamond" w:hAnsi="Garamond"/>
+          <w:color w:val="000000"/>
+          <w:kern w:val="0"/>
+          <w:sz w:val="36"/>
+          <w:szCs w:val="36"/>
+          <w:shd w:fill="auto" w:val="clear"/>
+          <w:lang w:val="en-US" w:eastAsia="zh-CN" w:bidi="hi-IN"/>
+        </w:rPr>
+        <w:t>Na mesma época surgiu</w:t>
+      </w:r>
+      <w:r>
+        <w:rPr>
+          <w:rFonts w:eastAsia="Times New Roman" w:cs="Times New Roman" w:ascii="Garamond" w:hAnsi="Garamond"/>
+          <w:color w:val="000000"/>
+          <w:kern w:val="0"/>
+          <w:sz w:val="36"/>
+          <w:szCs w:val="36"/>
+          <w:shd w:fill="auto" w:val="clear"/>
+          <w:lang w:val="en-US" w:eastAsia="zh-CN" w:bidi="hi-IN"/>
+        </w:rPr>
+        <w:t xml:space="preserve"> a tradição do Rosário, em que a repetição das orações </w:t>
+      </w:r>
+      <w:r>
+        <w:rPr>
+          <w:rFonts w:eastAsia="Times New Roman" w:cs="Times New Roman" w:ascii="Garamond" w:hAnsi="Garamond"/>
+          <w:color w:val="000000"/>
+          <w:kern w:val="0"/>
+          <w:sz w:val="36"/>
+          <w:szCs w:val="36"/>
+          <w:shd w:fill="auto" w:val="clear"/>
+          <w:lang w:val="en-US" w:eastAsia="zh-CN" w:bidi="hi-IN"/>
+        </w:rPr>
+        <w:t>adquire um ar</w:t>
+      </w:r>
+      <w:r>
+        <w:rPr>
+          <w:rFonts w:eastAsia="Times New Roman" w:cs="Times New Roman" w:ascii="Garamond" w:hAnsi="Garamond"/>
+          <w:color w:val="000000"/>
+          <w:kern w:val="0"/>
+          <w:sz w:val="36"/>
+          <w:szCs w:val="36"/>
+          <w:shd w:fill="auto" w:val="clear"/>
+          <w:lang w:val="en-US" w:eastAsia="zh-CN" w:bidi="hi-IN"/>
+        </w:rPr>
+        <w:t xml:space="preserve"> meditativo e contemplativo. Assim, a fixação de um número de preces nasceu dentro de uma pedagogia espiritual, como </w:t>
+      </w:r>
+      <w:r>
+        <w:rPr>
+          <w:rFonts w:eastAsia="Times New Roman" w:cs="Times New Roman" w:ascii="Garamond" w:hAnsi="Garamond"/>
+          <w:color w:val="000000"/>
+          <w:kern w:val="0"/>
+          <w:sz w:val="36"/>
+          <w:szCs w:val="36"/>
+          <w:shd w:fill="auto" w:val="clear"/>
+          <w:lang w:val="en-US" w:eastAsia="zh-CN" w:bidi="hi-IN"/>
+        </w:rPr>
+        <w:t>maneira</w:t>
+      </w:r>
+      <w:r>
+        <w:rPr>
+          <w:rFonts w:eastAsia="Times New Roman" w:cs="Times New Roman" w:ascii="Garamond" w:hAnsi="Garamond"/>
+          <w:color w:val="000000"/>
+          <w:kern w:val="0"/>
+          <w:sz w:val="36"/>
+          <w:szCs w:val="36"/>
+          <w:shd w:fill="auto" w:val="clear"/>
+          <w:lang w:val="en-US" w:eastAsia="zh-CN" w:bidi="hi-IN"/>
+        </w:rPr>
+        <w:t xml:space="preserve"> de educar a alma na perseverança e na reflexão.</w:t>
+      </w:r>
+    </w:p>
+    <w:p>
+      <w:pPr>
+        <w:pStyle w:val="Normal"/>
+        <w:jc w:val="both"/>
+        <w:rPr>
+          <w:color w:val="auto"/>
+        </w:rPr>
+      </w:pPr>
+      <w:r>
+        <w:rPr/>
+      </w:r>
+    </w:p>
+    <w:p>
+      <w:pPr>
+        <w:pStyle w:val="Normal"/>
+        <w:jc w:val="both"/>
+        <w:rPr>
+          <w:color w:val="auto"/>
+        </w:rPr>
+      </w:pPr>
+      <w:r>
+        <w:rPr>
+          <w:rFonts w:eastAsia="Times New Roman" w:cs="Times New Roman" w:ascii="Garamond" w:hAnsi="Garamond"/>
+          <w:color w:val="000000"/>
+          <w:kern w:val="0"/>
+          <w:sz w:val="36"/>
+          <w:szCs w:val="36"/>
+          <w:shd w:fill="auto" w:val="clear"/>
+          <w:lang w:val="en-US" w:eastAsia="zh-CN" w:bidi="hi-IN"/>
+        </w:rPr>
+        <w:t>Então, q</w:t>
+      </w:r>
+      <w:r>
+        <w:rPr>
+          <w:rFonts w:eastAsia="Times New Roman" w:cs="Times New Roman" w:ascii="Garamond" w:hAnsi="Garamond"/>
+          <w:color w:val="000000"/>
+          <w:kern w:val="0"/>
+          <w:sz w:val="36"/>
+          <w:szCs w:val="36"/>
+          <w:shd w:fill="auto" w:val="clear"/>
+          <w:lang w:val="en-US" w:eastAsia="zh-CN" w:bidi="hi-IN"/>
+        </w:rPr>
+        <w:t xml:space="preserve">uando </w:t>
+      </w:r>
+      <w:r>
+        <w:rPr>
+          <w:rFonts w:eastAsia="Times New Roman" w:cs="Times New Roman" w:ascii="Garamond" w:hAnsi="Garamond"/>
+          <w:color w:val="000000"/>
+          <w:kern w:val="0"/>
+          <w:sz w:val="36"/>
+          <w:szCs w:val="36"/>
+          <w:shd w:fill="auto" w:val="clear"/>
+          <w:lang w:val="en-US" w:eastAsia="zh-CN" w:bidi="hi-IN"/>
+        </w:rPr>
+        <w:t>Jesus</w:t>
+      </w:r>
+      <w:r>
+        <w:rPr>
+          <w:rFonts w:eastAsia="Times New Roman" w:cs="Times New Roman" w:ascii="Garamond" w:hAnsi="Garamond"/>
+          <w:color w:val="000000"/>
+          <w:kern w:val="0"/>
+          <w:sz w:val="36"/>
+          <w:szCs w:val="36"/>
+          <w:shd w:fill="auto" w:val="clear"/>
+          <w:lang w:val="en-US" w:eastAsia="zh-CN" w:bidi="hi-IN"/>
+        </w:rPr>
+        <w:t xml:space="preserve"> nos alerta para não orarmos como os pagãos, que acreditavam ser ouvidos pela multiplicidade das palavras, </w:t>
+      </w:r>
+      <w:r>
+        <w:rPr>
+          <w:rFonts w:eastAsia="Times New Roman" w:cs="Times New Roman" w:ascii="Garamond" w:hAnsi="Garamond"/>
+          <w:color w:val="000000"/>
+          <w:kern w:val="0"/>
+          <w:sz w:val="36"/>
+          <w:szCs w:val="36"/>
+          <w:shd w:fill="auto" w:val="clear"/>
+          <w:lang w:val="en-US" w:eastAsia="zh-CN" w:bidi="hi-IN"/>
+        </w:rPr>
+        <w:t xml:space="preserve">Ele </w:t>
+      </w:r>
+      <w:r>
+        <w:rPr>
+          <w:rFonts w:eastAsia="Times New Roman" w:cs="Times New Roman" w:ascii="Garamond" w:hAnsi="Garamond"/>
+          <w:color w:val="000000"/>
+          <w:kern w:val="0"/>
+          <w:sz w:val="36"/>
+          <w:szCs w:val="36"/>
+          <w:shd w:fill="auto" w:val="clear"/>
+          <w:lang w:val="en-US" w:eastAsia="zh-CN" w:bidi="hi-IN"/>
+        </w:rPr>
+        <w:t xml:space="preserve">não está condenando a repetição em si, mas a ideia de que Deus possa ser convencido pela quantidade. </w:t>
+      </w:r>
+    </w:p>
+    <w:p>
+      <w:pPr>
+        <w:pStyle w:val="Normal"/>
+        <w:jc w:val="both"/>
+        <w:rPr>
+          <w:color w:val="auto"/>
+        </w:rPr>
+      </w:pPr>
+      <w:r>
+        <w:rPr/>
+      </w:r>
+    </w:p>
+    <w:p>
+      <w:pPr>
+        <w:pStyle w:val="Normal"/>
+        <w:jc w:val="both"/>
+        <w:rPr>
+          <w:color w:val="auto"/>
+        </w:rPr>
+      </w:pPr>
+      <w:r>
+        <w:rPr>
+          <w:rFonts w:eastAsia="Times New Roman" w:cs="Times New Roman" w:ascii="Garamond" w:hAnsi="Garamond"/>
+          <w:color w:val="000000"/>
+          <w:kern w:val="0"/>
+          <w:sz w:val="36"/>
+          <w:szCs w:val="36"/>
+          <w:shd w:fill="auto" w:val="clear"/>
+          <w:lang w:val="en-US" w:eastAsia="zh-CN" w:bidi="hi-IN"/>
+        </w:rPr>
+        <w:t xml:space="preserve">A repetição </w:t>
+      </w:r>
+      <w:r>
+        <w:rPr>
+          <w:rFonts w:eastAsia="Times New Roman" w:cs="Times New Roman" w:ascii="Garamond" w:hAnsi="Garamond"/>
+          <w:color w:val="000000"/>
+          <w:kern w:val="0"/>
+          <w:sz w:val="36"/>
+          <w:szCs w:val="36"/>
+          <w:shd w:fill="auto" w:val="clear"/>
+          <w:lang w:val="en-US" w:eastAsia="zh-CN" w:bidi="hi-IN"/>
+        </w:rPr>
+        <w:t>funciona como um</w:t>
+      </w:r>
+      <w:r>
+        <w:rPr>
+          <w:rFonts w:eastAsia="Times New Roman" w:cs="Times New Roman" w:ascii="Garamond" w:hAnsi="Garamond"/>
+          <w:color w:val="000000"/>
+          <w:kern w:val="0"/>
+          <w:sz w:val="36"/>
+          <w:szCs w:val="36"/>
+          <w:shd w:fill="auto" w:val="clear"/>
+          <w:lang w:val="en-US" w:eastAsia="zh-CN" w:bidi="hi-IN"/>
+        </w:rPr>
+        <w:t xml:space="preserve"> instrumento de concentração e disciplina; o que o Evangelho nos convida a evitar é o automatismo vazio. </w:t>
+      </w:r>
+    </w:p>
+    <w:p>
+      <w:pPr>
+        <w:pStyle w:val="Normal"/>
+        <w:jc w:val="both"/>
+        <w:rPr>
+          <w:color w:val="auto"/>
+        </w:rPr>
+      </w:pPr>
+      <w:r>
+        <w:rPr>
+          <w:color w:val="auto"/>
+        </w:rPr>
+      </w:r>
+    </w:p>
+    <w:p>
+      <w:pPr>
+        <w:pStyle w:val="Normal"/>
+        <w:jc w:val="both"/>
+        <w:rPr>
+          <w:color w:val="auto"/>
+        </w:rPr>
+      </w:pPr>
+      <w:r>
+        <w:rPr>
+          <w:rFonts w:eastAsia="Times New Roman" w:cs="Times New Roman" w:ascii="Garamond" w:hAnsi="Garamond"/>
+          <w:color w:val="000000"/>
+          <w:kern w:val="0"/>
+          <w:sz w:val="36"/>
+          <w:szCs w:val="36"/>
+          <w:shd w:fill="auto" w:val="clear"/>
+          <w:lang w:val="en-US" w:eastAsia="zh-CN" w:bidi="hi-IN"/>
+        </w:rPr>
+        <w:t xml:space="preserve">A bem da verdade, para </w:t>
+      </w:r>
+      <w:r>
+        <w:rPr>
+          <w:rFonts w:eastAsia="Times New Roman" w:cs="Times New Roman" w:ascii="Garamond" w:hAnsi="Garamond"/>
+          <w:color w:val="000000"/>
+          <w:kern w:val="0"/>
+          <w:sz w:val="36"/>
+          <w:szCs w:val="36"/>
+          <w:shd w:fill="auto" w:val="clear"/>
+          <w:lang w:val="en-US" w:eastAsia="zh-CN" w:bidi="hi-IN"/>
+        </w:rPr>
+        <w:t xml:space="preserve">Deus </w:t>
+      </w:r>
+      <w:r>
+        <w:rPr>
+          <w:rFonts w:eastAsia="Times New Roman" w:cs="Times New Roman" w:ascii="Garamond" w:hAnsi="Garamond"/>
+          <w:color w:val="000000"/>
+          <w:kern w:val="0"/>
+          <w:sz w:val="36"/>
+          <w:szCs w:val="36"/>
+          <w:shd w:fill="auto" w:val="clear"/>
+          <w:lang w:val="en-US" w:eastAsia="zh-CN" w:bidi="hi-IN"/>
+        </w:rPr>
+        <w:t>e Jesus nem mesmo as</w:t>
+      </w:r>
+      <w:r>
+        <w:rPr>
+          <w:rFonts w:eastAsia="Times New Roman" w:cs="Times New Roman" w:ascii="Garamond" w:hAnsi="Garamond"/>
+          <w:color w:val="000000"/>
+          <w:kern w:val="0"/>
+          <w:sz w:val="36"/>
+          <w:szCs w:val="36"/>
+          <w:shd w:fill="auto" w:val="clear"/>
+          <w:lang w:val="en-US" w:eastAsia="zh-CN" w:bidi="hi-IN"/>
+        </w:rPr>
+        <w:t xml:space="preserve"> palavras que utilizamos em nossas </w:t>
+      </w:r>
+      <w:r>
+        <w:rPr>
+          <w:rFonts w:eastAsia="Times New Roman" w:cs="Times New Roman" w:ascii="Garamond" w:hAnsi="Garamond"/>
+          <w:color w:val="000000"/>
+          <w:kern w:val="0"/>
+          <w:sz w:val="36"/>
+          <w:szCs w:val="36"/>
+          <w:shd w:fill="auto" w:val="clear"/>
+          <w:lang w:val="en-US" w:eastAsia="zh-CN" w:bidi="hi-IN"/>
+        </w:rPr>
+        <w:t>preces importam</w:t>
       </w:r>
       <w:r>
         <w:rPr>
@@ -1946,326 +2628,19 @@
           <w:shd w:fill="auto" w:val="clear"/>
           <w:lang w:val="en-US" w:eastAsia="zh-CN" w:bidi="hi-IN"/>
         </w:rPr>
-        <w:t>Meu amigo me</w:t>
-      </w:r>
-      <w:r>
-        <w:rPr>
-          <w:rFonts w:eastAsia="Times New Roman" w:cs="Times New Roman" w:ascii="Garamond" w:hAnsi="Garamond"/>
-          <w:color w:val="000000"/>
-          <w:kern w:val="0"/>
-          <w:sz w:val="36"/>
-          <w:szCs w:val="36"/>
-          <w:shd w:fill="auto" w:val="clear"/>
-          <w:lang w:val="en-US" w:eastAsia="zh-CN" w:bidi="hi-IN"/>
-        </w:rPr>
-        <w:t xml:space="preserve"> diz que depois me dá mais informações sobre o acontecido.</w:t>
-      </w:r>
-    </w:p>
-    <w:p>
-      <w:pPr>
-        <w:pStyle w:val="Normal"/>
-        <w:jc w:val="both"/>
-        <w:rPr>
-          <w:color w:val="auto"/>
-        </w:rPr>
-      </w:pPr>
-      <w:r>
-        <w:rPr>
-          <w:color w:val="auto"/>
-        </w:rPr>
-      </w:r>
-    </w:p>
-    <w:p>
-      <w:pPr>
-        <w:pStyle w:val="Normal"/>
-        <w:jc w:val="both"/>
-        <w:rPr>
-          <w:color w:val="auto"/>
-        </w:rPr>
-      </w:pPr>
-      <w:r>
-        <w:rPr>
-          <w:rFonts w:eastAsia="Times New Roman" w:cs="Times New Roman" w:ascii="Garamond" w:hAnsi="Garamond"/>
-          <w:color w:val="000000"/>
-          <w:kern w:val="0"/>
-          <w:sz w:val="36"/>
-          <w:szCs w:val="36"/>
-          <w:shd w:fill="auto" w:val="clear"/>
-          <w:lang w:val="en-US" w:eastAsia="zh-CN" w:bidi="hi-IN"/>
-        </w:rPr>
-        <w:t xml:space="preserve">O lugar e a hora em que me encontro são os mais adequados para a prece? </w:t>
-      </w:r>
-      <w:r>
-        <w:rPr>
-          <w:rFonts w:eastAsia="Times New Roman" w:cs="Times New Roman" w:ascii="Garamond" w:hAnsi="Garamond"/>
-          <w:color w:val="000000"/>
-          <w:kern w:val="0"/>
-          <w:sz w:val="36"/>
-          <w:szCs w:val="36"/>
-          <w:shd w:fill="auto" w:val="clear"/>
-          <w:lang w:val="en-US" w:eastAsia="zh-CN" w:bidi="hi-IN"/>
-        </w:rPr>
-        <w:t>Definitivamente</w:t>
-      </w:r>
-      <w:r>
-        <w:rPr>
-          <w:rFonts w:eastAsia="Times New Roman" w:cs="Times New Roman" w:ascii="Garamond" w:hAnsi="Garamond"/>
-          <w:color w:val="000000"/>
-          <w:kern w:val="0"/>
-          <w:sz w:val="36"/>
-          <w:szCs w:val="36"/>
-          <w:shd w:fill="auto" w:val="clear"/>
-          <w:lang w:val="en-US" w:eastAsia="zh-CN" w:bidi="hi-IN"/>
-        </w:rPr>
-        <w:t xml:space="preserve"> que não. Mas vou deixar de orar </w:t>
-      </w:r>
-      <w:r>
-        <w:rPr>
-          <w:rFonts w:eastAsia="Times New Roman" w:cs="Times New Roman" w:ascii="Garamond" w:hAnsi="Garamond"/>
-          <w:color w:val="000000"/>
-          <w:kern w:val="0"/>
-          <w:sz w:val="36"/>
-          <w:szCs w:val="36"/>
-          <w:shd w:fill="auto" w:val="clear"/>
-          <w:lang w:val="en-US" w:eastAsia="zh-CN" w:bidi="hi-IN"/>
-        </w:rPr>
-        <w:t>por aquela pessoa querida</w:t>
-      </w:r>
-      <w:r>
-        <w:rPr>
-          <w:rFonts w:eastAsia="Times New Roman" w:cs="Times New Roman" w:ascii="Garamond" w:hAnsi="Garamond"/>
-          <w:color w:val="000000"/>
-          <w:kern w:val="0"/>
-          <w:sz w:val="36"/>
-          <w:szCs w:val="36"/>
-          <w:shd w:fill="auto" w:val="clear"/>
-          <w:lang w:val="en-US" w:eastAsia="zh-CN" w:bidi="hi-IN"/>
-        </w:rPr>
-        <w:t xml:space="preserve"> só porque não estou em um ambiente favorável à oração? De maneira alguma. </w:t>
-      </w:r>
-    </w:p>
-    <w:p>
-      <w:pPr>
-        <w:pStyle w:val="Normal"/>
-        <w:jc w:val="both"/>
-        <w:rPr>
-          <w:color w:val="auto"/>
-        </w:rPr>
-      </w:pPr>
-      <w:r>
-        <w:rPr>
-          <w:color w:val="auto"/>
-        </w:rPr>
-      </w:r>
-    </w:p>
-    <w:p>
-      <w:pPr>
-        <w:pStyle w:val="Normal"/>
-        <w:jc w:val="both"/>
-        <w:rPr>
-          <w:color w:val="auto"/>
-        </w:rPr>
-      </w:pPr>
-      <w:r>
-        <w:rPr>
-          <w:rFonts w:eastAsia="Times New Roman" w:cs="Times New Roman" w:ascii="Garamond" w:hAnsi="Garamond"/>
-          <w:color w:val="000000"/>
-          <w:kern w:val="0"/>
-          <w:sz w:val="36"/>
-          <w:szCs w:val="36"/>
-          <w:shd w:fill="auto" w:val="clear"/>
-          <w:lang w:val="en-US" w:eastAsia="zh-CN" w:bidi="hi-IN"/>
-        </w:rPr>
-        <w:t>Eu posso e devo orar ali mesmo, naquelas condições. Com algum esforço da minha parte consigo me abstrair do tumulto à minha volta e elevar a Deus, a Jesus e aos Espíritos amigos minhas rogativas em favor do amigo acidentado.</w:t>
-      </w:r>
-    </w:p>
-    <w:p>
-      <w:pPr>
-        <w:pStyle w:val="Normal"/>
-        <w:jc w:val="both"/>
-        <w:rPr>
-          <w:color w:val="auto"/>
-        </w:rPr>
-      </w:pPr>
-      <w:r>
-        <w:rPr>
-          <w:color w:val="auto"/>
-        </w:rPr>
-      </w:r>
-    </w:p>
-    <w:p>
-      <w:pPr>
-        <w:pStyle w:val="Normal"/>
-        <w:jc w:val="both"/>
-        <w:rPr>
-          <w:color w:val="auto"/>
-        </w:rPr>
-      </w:pPr>
-      <w:r>
-        <w:rPr>
-          <w:rFonts w:eastAsia="Times New Roman" w:cs="Times New Roman" w:ascii="Garamond" w:hAnsi="Garamond"/>
-          <w:color w:val="000000"/>
-          <w:kern w:val="0"/>
-          <w:sz w:val="36"/>
-          <w:szCs w:val="36"/>
-          <w:shd w:fill="auto" w:val="clear"/>
-          <w:lang w:val="en-US" w:eastAsia="zh-CN" w:bidi="hi-IN"/>
-        </w:rPr>
-        <w:t>Mais tarde</w:t>
-      </w:r>
-      <w:r>
-        <w:rPr>
-          <w:rFonts w:eastAsia="Times New Roman" w:cs="Times New Roman" w:ascii="Garamond" w:hAnsi="Garamond"/>
-          <w:color w:val="000000"/>
-          <w:kern w:val="0"/>
-          <w:sz w:val="36"/>
-          <w:szCs w:val="36"/>
-          <w:shd w:fill="auto" w:val="clear"/>
-          <w:lang w:val="en-US" w:eastAsia="zh-CN" w:bidi="hi-IN"/>
-        </w:rPr>
-        <w:t xml:space="preserve">, quando eu </w:t>
-      </w:r>
-      <w:r>
-        <w:rPr>
-          <w:rFonts w:eastAsia="Times New Roman" w:cs="Times New Roman" w:ascii="Garamond" w:hAnsi="Garamond"/>
-          <w:color w:val="000000"/>
-          <w:kern w:val="0"/>
-          <w:sz w:val="36"/>
-          <w:szCs w:val="36"/>
-          <w:shd w:fill="auto" w:val="clear"/>
-          <w:lang w:val="en-US" w:eastAsia="zh-CN" w:bidi="hi-IN"/>
-        </w:rPr>
-        <w:t xml:space="preserve">já </w:t>
-      </w:r>
-      <w:r>
-        <w:rPr>
-          <w:rFonts w:eastAsia="Times New Roman" w:cs="Times New Roman" w:ascii="Garamond" w:hAnsi="Garamond"/>
-          <w:color w:val="000000"/>
-          <w:kern w:val="0"/>
-          <w:sz w:val="36"/>
-          <w:szCs w:val="36"/>
-          <w:shd w:fill="auto" w:val="clear"/>
-          <w:lang w:val="en-US" w:eastAsia="zh-CN" w:bidi="hi-IN"/>
-        </w:rPr>
-        <w:t>estiver na tranquilidade do meu lar, eu oro novamente em condições mais adequadas, mas não devo prescindir da prece enquanto eu ainda estou no ônibus.</w:t>
-      </w:r>
-    </w:p>
-    <w:p>
-      <w:pPr>
-        <w:pStyle w:val="Normal"/>
-        <w:jc w:val="both"/>
-        <w:rPr>
-          <w:color w:val="auto"/>
-        </w:rPr>
-      </w:pPr>
-      <w:r>
-        <w:rPr>
-          <w:color w:val="auto"/>
-        </w:rPr>
-      </w:r>
-    </w:p>
-    <w:p>
-      <w:pPr>
-        <w:pStyle w:val="Normal"/>
-        <w:jc w:val="both"/>
-        <w:rPr>
-          <w:color w:val="auto"/>
-        </w:rPr>
-      </w:pPr>
-      <w:r>
-        <w:rPr>
-          <w:rFonts w:eastAsia="Times New Roman" w:cs="Times New Roman" w:ascii="Garamond" w:hAnsi="Garamond"/>
-          <w:color w:val="000000"/>
-          <w:kern w:val="0"/>
-          <w:sz w:val="36"/>
-          <w:szCs w:val="36"/>
-          <w:shd w:fill="auto" w:val="clear"/>
-          <w:lang w:val="en-US" w:eastAsia="zh-CN" w:bidi="hi-IN"/>
-        </w:rPr>
-        <w:t>Então, ao dizer que devemos orar em secreto no nosso quarto, Jesus está nos dando uma recomendação clara e direta com relação à sinceridade e ao recolhimento que devem existir naqueles que desejam se colocar em sintonia com os planos mais altos da vida, embora isso não necessariamente exija um lugar silencioso e isolado.</w:t>
-      </w:r>
-    </w:p>
-    <w:p>
-      <w:pPr>
-        <w:pStyle w:val="Normal"/>
-        <w:jc w:val="both"/>
-        <w:rPr>
-          <w:color w:val="auto"/>
-        </w:rPr>
-      </w:pPr>
-      <w:r>
-        <w:rPr>
-          <w:color w:val="auto"/>
-        </w:rPr>
-      </w:r>
-    </w:p>
-    <w:p>
-      <w:pPr>
-        <w:pStyle w:val="Normal"/>
-        <w:jc w:val="both"/>
-        <w:rPr>
-          <w:color w:val="auto"/>
-        </w:rPr>
-      </w:pPr>
-      <w:r>
-        <w:rPr>
-          <w:rFonts w:eastAsia="Times New Roman" w:cs="Times New Roman" w:ascii="Garamond" w:hAnsi="Garamond"/>
-          <w:color w:val="000000"/>
-          <w:kern w:val="0"/>
-          <w:sz w:val="36"/>
-          <w:szCs w:val="36"/>
-          <w:shd w:fill="auto" w:val="clear"/>
-          <w:lang w:val="en-US" w:eastAsia="zh-CN" w:bidi="hi-IN"/>
-        </w:rPr>
-        <w:t>A partir do momento em que</w:t>
-      </w:r>
-      <w:r>
-        <w:rPr>
-          <w:rFonts w:eastAsia="Times New Roman" w:cs="Times New Roman" w:ascii="Garamond" w:hAnsi="Garamond"/>
-          <w:color w:val="000000"/>
-          <w:kern w:val="0"/>
-          <w:sz w:val="36"/>
-          <w:szCs w:val="36"/>
-          <w:shd w:fill="auto" w:val="clear"/>
-          <w:lang w:val="en-US" w:eastAsia="zh-CN" w:bidi="hi-IN"/>
-        </w:rPr>
-        <w:t xml:space="preserve"> tomamos consciência disso, a oração passa a ser um recurso ainda mais valioso para nós. </w:t>
-      </w:r>
-      <w:r>
-        <w:rPr>
-          <w:rFonts w:eastAsia="Times New Roman" w:cs="Times New Roman" w:ascii="Garamond" w:hAnsi="Garamond"/>
-          <w:color w:val="000000"/>
-          <w:kern w:val="0"/>
-          <w:sz w:val="36"/>
-          <w:szCs w:val="36"/>
-          <w:shd w:fill="auto" w:val="clear"/>
-          <w:lang w:val="en-US" w:eastAsia="zh-CN" w:bidi="hi-IN"/>
-        </w:rPr>
-        <w:t>Quando passarmos por</w:t>
-      </w:r>
-      <w:r>
-        <w:rPr>
-          <w:rFonts w:eastAsia="Times New Roman" w:cs="Times New Roman" w:ascii="Garamond" w:hAnsi="Garamond"/>
-          <w:color w:val="000000"/>
-          <w:kern w:val="0"/>
-          <w:sz w:val="36"/>
-          <w:szCs w:val="36"/>
-          <w:shd w:fill="auto" w:val="clear"/>
-          <w:lang w:val="en-US" w:eastAsia="zh-CN" w:bidi="hi-IN"/>
-        </w:rPr>
-        <w:t xml:space="preserve"> um irmão embriagado ou drogado caído na calçada</w:t>
-      </w:r>
-      <w:r>
-        <w:rPr>
-          <w:rFonts w:eastAsia="Times New Roman" w:cs="Times New Roman" w:ascii="Garamond" w:hAnsi="Garamond"/>
-          <w:color w:val="000000"/>
-          <w:kern w:val="0"/>
-          <w:sz w:val="36"/>
-          <w:szCs w:val="36"/>
-          <w:shd w:fill="auto" w:val="clear"/>
-          <w:lang w:val="en-US" w:eastAsia="zh-CN" w:bidi="hi-IN"/>
-        </w:rPr>
-        <w:t>, podemos orar por ele pedindo, por exemplo, que Deus dê forças àquele irmão para superar seus vícios e mudar sua conduta de vida.</w:t>
+        <w:t>Embora o</w:t>
+      </w:r>
+      <w:r>
+        <w:rPr>
+          <w:rFonts w:eastAsia="Times New Roman" w:cs="Times New Roman" w:ascii="Garamond" w:hAnsi="Garamond"/>
+          <w:color w:val="000000"/>
+          <w:kern w:val="0"/>
+          <w:sz w:val="36"/>
+          <w:szCs w:val="36"/>
+          <w:shd w:fill="auto" w:val="clear"/>
+          <w:lang w:val="en-US" w:eastAsia="zh-CN" w:bidi="hi-IN"/>
+        </w:rPr>
+        <w:t xml:space="preserve"> Pai Nosso e a Ave Maria sejam orações belíssimas, podemos orar utilizando nossas próprias palavras.</w:t>
       </w:r>
     </w:p>
     <w:p>
@@ -2298,161 +2673,7 @@
           <w:shd w:fill="auto" w:val="clear"/>
           <w:lang w:val="en-US" w:eastAsia="zh-CN" w:bidi="hi-IN"/>
         </w:rPr>
-        <w:t>Quando estivermos dirigindo e presenciarmos um acidente,</w:t>
-      </w:r>
-      <w:r>
-        <w:rPr>
-          <w:rFonts w:eastAsia="Times New Roman" w:cs="Times New Roman" w:ascii="Garamond" w:hAnsi="Garamond"/>
-          <w:color w:val="000000"/>
-          <w:kern w:val="0"/>
-          <w:sz w:val="36"/>
-          <w:szCs w:val="36"/>
-          <w:shd w:fill="auto" w:val="clear"/>
-          <w:lang w:val="en-US" w:eastAsia="zh-CN" w:bidi="hi-IN"/>
-        </w:rPr>
-        <w:t xml:space="preserve"> também </w:t>
-      </w:r>
-      <w:r>
-        <w:rPr>
-          <w:rFonts w:eastAsia="Times New Roman" w:cs="Times New Roman" w:ascii="Garamond" w:hAnsi="Garamond"/>
-          <w:color w:val="000000"/>
-          <w:kern w:val="0"/>
-          <w:sz w:val="36"/>
-          <w:szCs w:val="36"/>
-          <w:shd w:fill="auto" w:val="clear"/>
-          <w:lang w:val="en-US" w:eastAsia="zh-CN" w:bidi="hi-IN"/>
-        </w:rPr>
-        <w:t xml:space="preserve">podemos </w:t>
-      </w:r>
-      <w:r>
-        <w:rPr>
-          <w:rFonts w:eastAsia="Times New Roman" w:cs="Times New Roman" w:ascii="Garamond" w:hAnsi="Garamond"/>
-          <w:color w:val="000000"/>
-          <w:kern w:val="0"/>
-          <w:sz w:val="36"/>
-          <w:szCs w:val="36"/>
-          <w:shd w:fill="auto" w:val="clear"/>
-          <w:lang w:val="en-US" w:eastAsia="zh-CN" w:bidi="hi-IN"/>
-        </w:rPr>
-        <w:t xml:space="preserve">orar </w:t>
-      </w:r>
-      <w:r>
-        <w:rPr>
-          <w:rFonts w:eastAsia="Times New Roman" w:cs="Times New Roman" w:ascii="Garamond" w:hAnsi="Garamond"/>
-          <w:color w:val="000000"/>
-          <w:kern w:val="0"/>
-          <w:sz w:val="36"/>
-          <w:szCs w:val="36"/>
-          <w:shd w:fill="auto" w:val="clear"/>
-          <w:lang w:val="en-US" w:eastAsia="zh-CN" w:bidi="hi-IN"/>
-        </w:rPr>
-        <w:t>pelas pessoas envolvidas naquele acidente</w:t>
-      </w:r>
-      <w:r>
-        <w:rPr>
-          <w:rFonts w:eastAsia="Times New Roman" w:cs="Times New Roman" w:ascii="Garamond" w:hAnsi="Garamond"/>
-          <w:color w:val="000000"/>
-          <w:kern w:val="0"/>
-          <w:sz w:val="36"/>
-          <w:szCs w:val="36"/>
-          <w:shd w:fill="auto" w:val="clear"/>
-          <w:lang w:val="en-US" w:eastAsia="zh-CN" w:bidi="hi-IN"/>
-        </w:rPr>
-        <w:t>.</w:t>
-      </w:r>
-    </w:p>
-    <w:p>
-      <w:pPr>
-        <w:pStyle w:val="Normal"/>
-        <w:jc w:val="both"/>
-        <w:rPr>
-          <w:color w:val="auto"/>
-        </w:rPr>
-      </w:pPr>
-      <w:r>
-        <w:rPr>
-          <w:color w:val="auto"/>
-        </w:rPr>
-      </w:r>
-    </w:p>
-    <w:p>
-      <w:pPr>
-        <w:pStyle w:val="Normal"/>
-        <w:jc w:val="both"/>
-        <w:rPr>
-          <w:color w:val="auto"/>
-        </w:rPr>
-      </w:pPr>
-      <w:r>
-        <w:rPr>
-          <w:rFonts w:eastAsia="Times New Roman" w:cs="Times New Roman" w:ascii="Garamond" w:hAnsi="Garamond"/>
-          <w:color w:val="000000"/>
-          <w:kern w:val="0"/>
-          <w:sz w:val="36"/>
-          <w:szCs w:val="36"/>
-          <w:shd w:fill="auto" w:val="clear"/>
-          <w:lang w:val="en-US" w:eastAsia="zh-CN" w:bidi="hi-IN"/>
-        </w:rPr>
-        <w:t>Eu tenho muita dificuldade em</w:t>
-      </w:r>
-      <w:r>
-        <w:rPr>
-          <w:rFonts w:eastAsia="Times New Roman" w:cs="Times New Roman" w:ascii="Garamond" w:hAnsi="Garamond"/>
-          <w:color w:val="000000"/>
-          <w:kern w:val="0"/>
-          <w:sz w:val="36"/>
-          <w:szCs w:val="36"/>
-          <w:shd w:fill="auto" w:val="clear"/>
-          <w:lang w:val="en-US" w:eastAsia="zh-CN" w:bidi="hi-IN"/>
-        </w:rPr>
-        <w:t xml:space="preserve"> compreender a curiosidade mórbida que muitos têm em ver vítimas feridas ou mortas em acidentes. Já repararam que quando acontece um acidente de trânsito em uma pista, a outra também fica com o trânsito lento? É porque as pessoas dirigindo em sentido contrário reduzem a velocidade para ver o que aconteceu.</w:t>
-      </w:r>
-    </w:p>
-    <w:p>
-      <w:pPr>
-        <w:pStyle w:val="Normal"/>
-        <w:jc w:val="both"/>
-        <w:rPr>
-          <w:color w:val="auto"/>
-        </w:rPr>
-      </w:pPr>
-      <w:r>
-        <w:rPr>
-          <w:color w:val="auto"/>
-        </w:rPr>
-      </w:r>
-    </w:p>
-    <w:p>
-      <w:pPr>
-        <w:pStyle w:val="Normal"/>
-        <w:jc w:val="both"/>
-        <w:rPr>
-          <w:color w:val="auto"/>
-        </w:rPr>
-      </w:pPr>
-      <w:r>
-        <w:rPr>
-          <w:rFonts w:eastAsia="Times New Roman" w:cs="Times New Roman" w:ascii="Garamond" w:hAnsi="Garamond"/>
-          <w:color w:val="000000"/>
-          <w:kern w:val="0"/>
-          <w:sz w:val="36"/>
-          <w:szCs w:val="36"/>
-          <w:shd w:fill="auto" w:val="clear"/>
-          <w:lang w:val="en-US" w:eastAsia="zh-CN" w:bidi="hi-IN"/>
-        </w:rPr>
-        <w:t>Se ainda carregamos esse tipo de curiosidade conosco, vamos mudar de postura. Em vez de querer ver o que aconteceu, elevemos um pensamento a Deus, pedindo socorro para os feridos e amparo aos que desencarnaram. Fazemos essa oração e seguimos nosso caminho</w:t>
-      </w:r>
-      <w:r>
-        <w:rPr>
-          <w:rFonts w:eastAsia="Times New Roman" w:cs="Times New Roman" w:ascii="Garamond" w:hAnsi="Garamond"/>
-          <w:color w:val="000000"/>
-          <w:kern w:val="0"/>
-          <w:sz w:val="36"/>
-          <w:szCs w:val="36"/>
-          <w:shd w:fill="auto" w:val="clear"/>
-          <w:lang w:val="en-US" w:eastAsia="zh-CN" w:bidi="hi-IN"/>
-        </w:rPr>
-        <w:t>.</w:t>
+        <w:t>O que é fundamental é que nossas preces carreguem consigo humildade, sinceridade e fé. Quais palavras utilizamos para nos expressarmos dessa forma, pouco importa.</w:t>
       </w:r>
     </w:p>
     <w:p>
@@ -2472,36 +2693,389 @@
         <w:pStyle w:val="Normal"/>
         <w:jc w:val="both"/>
         <w:rPr>
-          <w:color w:val="auto"/>
-        </w:rPr>
-      </w:pPr>
-      <w:r>
-        <w:rPr>
-          <w:rFonts w:eastAsia="Times New Roman" w:cs="Times New Roman" w:ascii="Garamond" w:hAnsi="Garamond"/>
-          <w:color w:val="000000"/>
-          <w:kern w:val="0"/>
-          <w:sz w:val="36"/>
-          <w:szCs w:val="36"/>
-          <w:shd w:fill="auto" w:val="clear"/>
-          <w:lang w:val="en-US" w:eastAsia="zh-CN" w:bidi="hi-IN"/>
-        </w:rPr>
-        <w:t>Retornando à passagem evangélica que estamos analisando, Jesus nos diz para não orarmos como os pagãos, que pensam que é pela quantidade de palavras que suas preces serão ouvidas</w:t>
-      </w:r>
-      <w:r>
-        <w:rPr>
-          <w:rFonts w:eastAsia="Times New Roman" w:cs="Times New Roman" w:ascii="Garamond" w:hAnsi="Garamond"/>
-          <w:color w:val="000000"/>
-          <w:kern w:val="0"/>
-          <w:sz w:val="36"/>
-          <w:szCs w:val="36"/>
-          <w:shd w:fill="auto" w:val="clear"/>
-          <w:lang w:val="en-US" w:eastAsia="zh-CN" w:bidi="hi-IN"/>
-        </w:rPr>
-        <w:t xml:space="preserve">. </w:t>
-      </w:r>
-      <w:r>
-        <w:rPr>
-          <w:rFonts w:eastAsia="Times New Roman" w:cs="Times New Roman" w:ascii="Garamond" w:hAnsi="Garamond"/>
+          <w:color w:val="1C99E0"/>
+        </w:rPr>
+      </w:pPr>
+      <w:r>
+        <w:rPr>
+          <w:rFonts w:eastAsia="Times New Roman" w:cs="Times New Roman" w:ascii="Garamond" w:hAnsi="Garamond"/>
+          <w:color w:val="1C99E0"/>
+          <w:kern w:val="0"/>
+          <w:sz w:val="36"/>
+          <w:szCs w:val="36"/>
+          <w:shd w:fill="auto" w:val="clear"/>
+          <w:lang w:val="en-US" w:eastAsia="zh-CN" w:bidi="hi-IN"/>
+        </w:rPr>
+        <w:t>[ Ver se aqui é realmente o melhor ponto para a explicação da transmissão do pensamento.]</w:t>
+      </w:r>
+    </w:p>
+    <w:p>
+      <w:pPr>
+        <w:pStyle w:val="Normal"/>
+        <w:jc w:val="both"/>
+        <w:rPr>
+          <w:color w:val="auto"/>
+        </w:rPr>
+      </w:pPr>
+      <w:r>
+        <w:rPr/>
+      </w:r>
+    </w:p>
+    <w:p>
+      <w:pPr>
+        <w:pStyle w:val="Normal"/>
+        <w:jc w:val="both"/>
+        <w:rPr>
+          <w:color w:val="auto"/>
+        </w:rPr>
+      </w:pPr>
+      <w:r>
+        <w:rPr>
+          <w:rFonts w:eastAsia="Times New Roman" w:cs="Times New Roman" w:ascii="Garamond" w:hAnsi="Garamond"/>
+          <w:color w:val="000000"/>
+          <w:kern w:val="0"/>
+          <w:sz w:val="36"/>
+          <w:szCs w:val="36"/>
+          <w:shd w:fill="auto" w:val="clear"/>
+          <w:lang w:val="en-US" w:eastAsia="zh-CN" w:bidi="hi-IN"/>
+        </w:rPr>
+        <w:t>Mas por quê deve ser assim? Bom, antes de mais nada é preciso relembrar que o pensamento é a voz do Espírito. Espíritos desencarnados não se utilizam da palavra falada para se comunicarem. Isso é uma necessidade nossa, Espíritos encarnados.</w:t>
+      </w:r>
+    </w:p>
+    <w:p>
+      <w:pPr>
+        <w:pStyle w:val="Normal"/>
+        <w:jc w:val="both"/>
+        <w:rPr>
+          <w:color w:val="auto"/>
+        </w:rPr>
+      </w:pPr>
+      <w:r>
+        <w:rPr/>
+      </w:r>
+    </w:p>
+    <w:p>
+      <w:pPr>
+        <w:pStyle w:val="Normal"/>
+        <w:jc w:val="both"/>
+        <w:rPr>
+          <w:color w:val="auto"/>
+        </w:rPr>
+      </w:pPr>
+      <w:r>
+        <w:rPr>
+          <w:rFonts w:eastAsia="Times New Roman" w:cs="Times New Roman" w:ascii="Garamond" w:hAnsi="Garamond"/>
+          <w:color w:val="000000"/>
+          <w:kern w:val="0"/>
+          <w:sz w:val="36"/>
+          <w:szCs w:val="36"/>
+          <w:shd w:fill="auto" w:val="clear"/>
+          <w:lang w:val="en-US" w:eastAsia="zh-CN" w:bidi="hi-IN"/>
+        </w:rPr>
+        <w:t>Pelo pensamento o Espírito vai aos lugares que lhe agradam e que  lhe seja permitido estar; pelo pensamento ele cria formas, se comunica com outros Espíritos e  se vincula àqueles que estão na mesma faixa vibratória que ele.</w:t>
+      </w:r>
+    </w:p>
+    <w:p>
+      <w:pPr>
+        <w:pStyle w:val="Normal"/>
+        <w:jc w:val="both"/>
+        <w:rPr>
+          <w:color w:val="auto"/>
+        </w:rPr>
+      </w:pPr>
+      <w:r>
+        <w:rPr/>
+      </w:r>
+    </w:p>
+    <w:p>
+      <w:pPr>
+        <w:pStyle w:val="Normal"/>
+        <w:jc w:val="both"/>
+        <w:rPr>
+          <w:color w:val="auto"/>
+        </w:rPr>
+      </w:pPr>
+      <w:r>
+        <w:rPr>
+          <w:rFonts w:eastAsia="Times New Roman" w:cs="Times New Roman" w:ascii="Garamond" w:hAnsi="Garamond"/>
+          <w:color w:val="000000"/>
+          <w:kern w:val="0"/>
+          <w:sz w:val="36"/>
+          <w:szCs w:val="36"/>
+          <w:shd w:fill="auto" w:val="clear"/>
+          <w:lang w:val="en-US" w:eastAsia="zh-CN" w:bidi="hi-IN"/>
+        </w:rPr>
+        <w:t>Para entender o que acontece na oração, podemos imaginar que todos nós — encarnados e desencarnados — estamos mergulhados em um tipo de “atmosfera espiritual”, conhecido como fluido cósmico universal.</w:t>
+      </w:r>
+    </w:p>
+    <w:p>
+      <w:pPr>
+        <w:pStyle w:val="Normal"/>
+        <w:jc w:val="both"/>
+        <w:rPr>
+          <w:color w:val="auto"/>
+        </w:rPr>
+      </w:pPr>
+      <w:r>
+        <w:rPr/>
+      </w:r>
+    </w:p>
+    <w:p>
+      <w:pPr>
+        <w:pStyle w:val="Normal"/>
+        <w:jc w:val="both"/>
+        <w:rPr>
+          <w:color w:val="auto"/>
+        </w:rPr>
+      </w:pPr>
+      <w:r>
+        <w:rPr>
+          <w:rFonts w:eastAsia="Times New Roman" w:cs="Times New Roman" w:ascii="Garamond" w:hAnsi="Garamond"/>
+          <w:color w:val="000000"/>
+          <w:kern w:val="0"/>
+          <w:sz w:val="36"/>
+          <w:szCs w:val="36"/>
+          <w:shd w:fill="auto" w:val="clear"/>
+          <w:lang w:val="en-US" w:eastAsia="zh-CN" w:bidi="hi-IN"/>
+        </w:rPr>
+        <w:t xml:space="preserve">Assim como vivemos dentro da atmosfera da Terra, respirando o ar, também estamos envolvidos por esse fluido que preenche todo o universo. </w:t>
+      </w:r>
+    </w:p>
+    <w:p>
+      <w:pPr>
+        <w:pStyle w:val="Normal"/>
+        <w:jc w:val="both"/>
+        <w:rPr>
+          <w:color w:val="auto"/>
+        </w:rPr>
+      </w:pPr>
+      <w:r>
+        <w:rPr/>
+      </w:r>
+    </w:p>
+    <w:p>
+      <w:pPr>
+        <w:pStyle w:val="Normal"/>
+        <w:jc w:val="both"/>
+        <w:rPr>
+          <w:color w:val="auto"/>
+        </w:rPr>
+      </w:pPr>
+      <w:r>
+        <w:rPr>
+          <w:rFonts w:eastAsia="Times New Roman" w:cs="Times New Roman" w:ascii="Garamond" w:hAnsi="Garamond"/>
+          <w:color w:val="000000"/>
+          <w:kern w:val="0"/>
+          <w:sz w:val="36"/>
+          <w:szCs w:val="36"/>
+          <w:shd w:fill="auto" w:val="clear"/>
+          <w:lang w:val="en-US" w:eastAsia="zh-CN" w:bidi="hi-IN"/>
+        </w:rPr>
+        <w:t xml:space="preserve">Então, quando nós pensamos ou oramos, nossa vontade coloca esse fluido em movimento. Ele funciona como um veículo do pensamento, da mesma forma que o ar é o veículo do som. </w:t>
+      </w:r>
+    </w:p>
+    <w:p>
+      <w:pPr>
+        <w:pStyle w:val="Normal"/>
+        <w:jc w:val="both"/>
+        <w:rPr>
+          <w:color w:val="auto"/>
+        </w:rPr>
+      </w:pPr>
+      <w:r>
+        <w:rPr/>
+      </w:r>
+    </w:p>
+    <w:p>
+      <w:pPr>
+        <w:pStyle w:val="Normal"/>
+        <w:jc w:val="both"/>
+        <w:rPr>
+          <w:color w:val="auto"/>
+        </w:rPr>
+      </w:pPr>
+      <w:r>
+        <w:rPr>
+          <w:rFonts w:eastAsia="Times New Roman" w:cs="Times New Roman" w:ascii="Garamond" w:hAnsi="Garamond"/>
+          <w:color w:val="000000"/>
+          <w:kern w:val="0"/>
+          <w:sz w:val="36"/>
+          <w:szCs w:val="36"/>
+          <w:shd w:fill="auto" w:val="clear"/>
+          <w:lang w:val="en-US" w:eastAsia="zh-CN" w:bidi="hi-IN"/>
+        </w:rPr>
+        <w:t>A diferença é que o som só viaja por curtas distâncias, já que ele depende do ar para se propagar. O som não pode ir aonde não existe o ar - como, por exemplo, no espaço. Já o pensamento pode viajar por todo o universo já que seu meio de propagação é o Fluido Cósmico Universal.</w:t>
+      </w:r>
+    </w:p>
+    <w:p>
+      <w:pPr>
+        <w:pStyle w:val="Normal"/>
+        <w:jc w:val="both"/>
+        <w:rPr>
+          <w:color w:val="auto"/>
+        </w:rPr>
+      </w:pPr>
+      <w:r>
+        <w:rPr/>
+      </w:r>
+    </w:p>
+    <w:p>
+      <w:pPr>
+        <w:pStyle w:val="Normal"/>
+        <w:jc w:val="both"/>
+        <w:rPr>
+          <w:color w:val="auto"/>
+        </w:rPr>
+      </w:pPr>
+      <w:r>
+        <w:rPr>
+          <w:rFonts w:eastAsia="Times New Roman" w:cs="Times New Roman" w:ascii="Garamond" w:hAnsi="Garamond"/>
+          <w:color w:val="000000"/>
+          <w:kern w:val="0"/>
+          <w:sz w:val="36"/>
+          <w:szCs w:val="36"/>
+          <w:shd w:fill="auto" w:val="clear"/>
+          <w:lang w:val="en-US" w:eastAsia="zh-CN" w:bidi="hi-IN"/>
+        </w:rPr>
+        <w:t xml:space="preserve">Quando dirigimos um pensamento a alguém — seja encarnado ou desencarnado — estabelece-se uma corrente no FCU que nos liga àquele a quem endereçamos nosso pensamento. Isso permite que nosso pensamento seja transmitido, assim como o ar transmite o som. </w:t>
+      </w:r>
+    </w:p>
+    <w:p>
+      <w:pPr>
+        <w:pStyle w:val="Normal"/>
+        <w:jc w:val="both"/>
+        <w:rPr>
+          <w:color w:val="auto"/>
+        </w:rPr>
+      </w:pPr>
+      <w:r>
+        <w:rPr/>
+      </w:r>
+    </w:p>
+    <w:p>
+      <w:pPr>
+        <w:pStyle w:val="Normal"/>
+        <w:jc w:val="both"/>
+        <w:rPr>
+          <w:color w:val="auto"/>
+        </w:rPr>
+      </w:pPr>
+      <w:r>
+        <w:rPr>
+          <w:rFonts w:eastAsia="Times New Roman" w:cs="Times New Roman" w:ascii="Garamond" w:hAnsi="Garamond"/>
+          <w:color w:val="000000"/>
+          <w:kern w:val="0"/>
+          <w:sz w:val="36"/>
+          <w:szCs w:val="36"/>
+          <w:shd w:fill="auto" w:val="clear"/>
+          <w:lang w:val="en-US" w:eastAsia="zh-CN" w:bidi="hi-IN"/>
+        </w:rPr>
+        <w:t>Em se tratando da oração, a força dessa corrente depende da intensidade e da qualidade do pensamento e da vontade de quem ora. É por isso que os Espíritos podem ouvir as preces que lhes são dirigidas, onde quer que estejam. É por essa mesma razão que os Espíritos podem nos inspirar e estabelecer relações espirituais mesmo à distância.</w:t>
+      </w:r>
+    </w:p>
+    <w:p>
+      <w:pPr>
+        <w:pStyle w:val="Normal"/>
+        <w:jc w:val="both"/>
+        <w:rPr>
+          <w:color w:val="auto"/>
+        </w:rPr>
+      </w:pPr>
+      <w:r>
+        <w:rPr/>
+      </w:r>
+    </w:p>
+    <w:p>
+      <w:pPr>
+        <w:pStyle w:val="Normal"/>
+        <w:jc w:val="both"/>
+        <w:rPr>
+          <w:color w:val="auto"/>
+        </w:rPr>
+      </w:pPr>
+      <w:r>
+        <w:rPr>
+          <w:rFonts w:eastAsia="Times New Roman" w:cs="Times New Roman" w:ascii="Garamond" w:hAnsi="Garamond"/>
+          <w:color w:val="000000"/>
+          <w:kern w:val="0"/>
+          <w:sz w:val="36"/>
+          <w:szCs w:val="36"/>
+          <w:shd w:fill="auto" w:val="clear"/>
+          <w:lang w:val="en-US" w:eastAsia="zh-CN" w:bidi="hi-IN"/>
+        </w:rPr>
+        <w:t>Podemos fazer uma comparação para compreender essa dinâmica. As pessoas que estão mais ao fundo do auditório só conseguem ouvir o que estou dizendo porque o som da minha voz foi captado pelo microfone, passou por um amplificador e foi enviado para as caixas de som que estão nas laterais do salão.</w:t>
+      </w:r>
+    </w:p>
+    <w:p>
+      <w:pPr>
+        <w:pStyle w:val="Normal"/>
+        <w:jc w:val="both"/>
+        <w:rPr>
+          <w:color w:val="auto"/>
+        </w:rPr>
+      </w:pPr>
+      <w:r>
+        <w:rPr/>
+      </w:r>
+    </w:p>
+    <w:p>
+      <w:pPr>
+        <w:pStyle w:val="Normal"/>
+        <w:jc w:val="both"/>
+        <w:rPr>
+          <w:color w:val="auto"/>
+        </w:rPr>
+      </w:pPr>
+      <w:r>
+        <w:rPr>
+          <w:rFonts w:eastAsia="Times New Roman" w:cs="Times New Roman" w:ascii="Garamond" w:hAnsi="Garamond"/>
+          <w:color w:val="000000"/>
+          <w:kern w:val="0"/>
+          <w:sz w:val="36"/>
+          <w:szCs w:val="36"/>
+          <w:shd w:fill="auto" w:val="clear"/>
+          <w:lang w:val="en-US" w:eastAsia="zh-CN" w:bidi="hi-IN"/>
+        </w:rPr>
+        <w:t>Sem esse processo de amplificação, quem está mais distante de mim não conseguiria me ouvir, a menos que eu falasse muito alto.</w:t>
+      </w:r>
+    </w:p>
+    <w:p>
+      <w:pPr>
+        <w:pStyle w:val="Normal"/>
+        <w:jc w:val="both"/>
+        <w:rPr>
+          <w:color w:val="auto"/>
+        </w:rPr>
+      </w:pPr>
+      <w:r>
+        <w:rPr/>
+      </w:r>
+    </w:p>
+    <w:p>
+      <w:pPr>
+        <w:pStyle w:val="Normal"/>
+        <w:jc w:val="both"/>
+        <w:rPr>
+          <w:color w:val="auto"/>
+        </w:rPr>
+      </w:pPr>
+      <w:r>
+        <w:rPr>
+          <w:rFonts w:eastAsia="Times New Roman" w:cs="Times New Roman" w:ascii="Garamond" w:hAnsi="Garamond"/>
+          <w:color w:val="000000"/>
+          <w:kern w:val="0"/>
+          <w:sz w:val="36"/>
+          <w:szCs w:val="36"/>
+          <w:shd w:fill="auto" w:val="clear"/>
+          <w:lang w:val="en-US" w:eastAsia="zh-CN" w:bidi="hi-IN"/>
+        </w:rPr>
+        <w:t xml:space="preserve">O mesmo se dá com a oração. Quanto mais amplificada ela estiver, vamos dizer mais, mais longe ela poderá ir. </w:t>
+      </w:r>
+      <w:r>
+        <w:rPr>
+          <w:rFonts w:eastAsia="Times New Roman" w:cs="Times New Roman" w:ascii="Garamond" w:hAnsi="Garamond"/>
+          <w:b/>
+          <w:bCs/>
           <w:color w:val="C9211E"/>
           <w:kern w:val="0"/>
           <w:sz w:val="36"/>
@@ -2509,43 +3083,19 @@
           <w:shd w:fill="auto" w:val="clear"/>
           <w:lang w:val="en-US" w:eastAsia="zh-CN" w:bidi="hi-IN"/>
         </w:rPr>
-        <w:t>O Mestre diz ainda</w:t>
-      </w:r>
-      <w:r>
-        <w:rPr>
-          <w:rFonts w:eastAsia="Times New Roman" w:cs="Times New Roman" w:ascii="Garamond" w:hAnsi="Garamond"/>
-          <w:color w:val="C9211E"/>
-          <w:kern w:val="0"/>
-          <w:sz w:val="36"/>
-          <w:szCs w:val="36"/>
-          <w:shd w:fill="auto" w:val="clear"/>
-          <w:lang w:val="en-US" w:eastAsia="zh-CN" w:bidi="hi-IN"/>
-        </w:rPr>
-        <w:t xml:space="preserve"> </w:t>
-      </w:r>
-      <w:r>
-        <w:rPr>
-          <w:rFonts w:eastAsia="Times New Roman" w:cs="Times New Roman" w:ascii="Garamond" w:hAnsi="Garamond"/>
-          <w:color w:val="C9211E"/>
-          <w:kern w:val="0"/>
-          <w:sz w:val="36"/>
-          <w:szCs w:val="36"/>
-          <w:shd w:fill="auto" w:val="clear"/>
-          <w:lang w:val="en-US" w:eastAsia="zh-CN" w:bidi="hi-IN"/>
-        </w:rPr>
-        <w:t>que Deus</w:t>
-      </w:r>
-      <w:r>
-        <w:rPr>
-          <w:rFonts w:eastAsia="Times New Roman" w:cs="Times New Roman" w:ascii="Garamond" w:hAnsi="Garamond"/>
-          <w:color w:val="C9211E"/>
-          <w:kern w:val="0"/>
-          <w:sz w:val="36"/>
-          <w:szCs w:val="36"/>
-          <w:shd w:fill="auto" w:val="clear"/>
-          <w:lang w:val="en-US" w:eastAsia="zh-CN" w:bidi="hi-IN"/>
-        </w:rPr>
-        <w:t xml:space="preserve"> sabe do que precisamos antes mesmo de o perdirmos (verificar se essa parte já foi comentada anteriormente. Agora não me lembro).</w:t>
+        <w:t>[ Prosseguir exatamente a partir desse ponto. Concluir o raciocínio. ]</w:t>
+      </w:r>
+      <w:r>
+        <w:rPr>
+          <w:rFonts w:eastAsia="Times New Roman" w:cs="Times New Roman" w:ascii="Garamond" w:hAnsi="Garamond"/>
+          <w:color w:val="000000"/>
+          <w:kern w:val="0"/>
+          <w:sz w:val="36"/>
+          <w:szCs w:val="36"/>
+          <w:shd w:fill="auto" w:val="clear"/>
+          <w:lang w:val="en-US" w:eastAsia="zh-CN" w:bidi="hi-IN"/>
+        </w:rPr>
+        <w:t xml:space="preserve"> Só que os amplificadores da nossa oração são os bons pensamentos, os bons sentimentos, o desejo de algo realmente útil e bom</w:t>
       </w:r>
     </w:p>
     <w:p>
@@ -2578,19 +3128,7 @@
           <w:shd w:fill="auto" w:val="clear"/>
           <w:lang w:val="en-US" w:eastAsia="zh-CN" w:bidi="hi-IN"/>
         </w:rPr>
-        <w:t xml:space="preserve">Quem eram os pagãos a quem Jesus se refere? Eles eram </w:t>
-      </w:r>
-      <w:r>
-        <w:rPr>
-          <w:rFonts w:eastAsia="Times New Roman" w:cs="Times New Roman" w:ascii="Garamond" w:hAnsi="Garamond"/>
-          <w:color w:val="000000"/>
-          <w:kern w:val="0"/>
-          <w:sz w:val="36"/>
-          <w:szCs w:val="36"/>
-          <w:shd w:fill="auto" w:val="clear"/>
-          <w:lang w:val="en-US" w:eastAsia="zh-CN" w:bidi="hi-IN"/>
-        </w:rPr>
-        <w:t>principalmente os povos gentios do mundo greco-romano — isto é, aqueles que não pertenciam à tradição judaica e seguiam religiões politeístas comuns no Império Romano. Nessas práticas religiosas, era frequente a repetição longa de fórmulas e invocações, porque muitos acreditavam que a divindade poderia ser convencida ou constrangida pela multiplicidade das palavras, como se o poder estivesse na quantidade ou na exatidão da expressão verbal.</w:t>
+        <w:t>Essa explicação ajuda especialmente quem tem dificuldade em compreender a utilidade da oração. Ela não pretende transformar a prece em algo material, mas mostrar que a oração pode produzir efeitos reais. Ainda assim, esses efeitos não dependem apenas de nós: tudo está sempre subordinado à vontade de Deus, que é a autoridade suprema e quem, em última instância, decide se aquela prece poderá ou não produzir os resultados desejados.</w:t>
       </w:r>
     </w:p>
     <w:p>
@@ -2614,550 +3152,7 @@
         </w:rPr>
       </w:pPr>
       <w:r>
-        <w:rPr>
-          <w:rFonts w:eastAsia="Times New Roman" w:cs="Times New Roman" w:ascii="Garamond" w:hAnsi="Garamond"/>
-          <w:color w:val="000000"/>
-          <w:kern w:val="0"/>
-          <w:sz w:val="36"/>
-          <w:szCs w:val="36"/>
-          <w:shd w:fill="auto" w:val="clear"/>
-          <w:lang w:val="en-US" w:eastAsia="zh-CN" w:bidi="hi-IN"/>
-        </w:rPr>
-        <w:t xml:space="preserve">Ao fazer essa advertência, Jesus não condena a perseverança na prece, mas corrige a mentalidade mágica e mecânica. Ele nos recorda que o Pai já sabe do que necessitamos antes mesmo que peçamos. A oração, portanto, não é instrumento de pressão sobre Deus, mas caminho de transformação interior. </w:t>
-      </w:r>
-    </w:p>
-    <w:p>
-      <w:pPr>
-        <w:pStyle w:val="Normal"/>
-        <w:jc w:val="both"/>
-        <w:rPr>
-          <w:color w:val="auto"/>
-        </w:rPr>
-      </w:pPr>
-      <w:r>
         <w:rPr/>
-      </w:r>
-    </w:p>
-    <w:p>
-      <w:pPr>
-        <w:pStyle w:val="Normal"/>
-        <w:jc w:val="both"/>
-        <w:rPr>
-          <w:color w:val="auto"/>
-        </w:rPr>
-      </w:pPr>
-      <w:r>
-        <w:rPr>
-          <w:rFonts w:eastAsia="Times New Roman" w:cs="Times New Roman" w:ascii="Garamond" w:hAnsi="Garamond"/>
-          <w:color w:val="000000"/>
-          <w:kern w:val="0"/>
-          <w:sz w:val="36"/>
-          <w:szCs w:val="36"/>
-          <w:shd w:fill="auto" w:val="clear"/>
-          <w:lang w:val="en-US" w:eastAsia="zh-CN" w:bidi="hi-IN"/>
-        </w:rPr>
-        <w:t>Quando Jesus nos alerta contra as vãs repetições, Ele nos convida a substituir o automatismo pela sinceridade, a quantidade pela qualidade e a palavra vazia pelo sentimento</w:t>
-      </w:r>
-      <w:r>
-        <w:rPr>
-          <w:rFonts w:eastAsia="Times New Roman" w:cs="Times New Roman" w:ascii="Garamond" w:hAnsi="Garamond"/>
-          <w:color w:val="000000"/>
-          <w:kern w:val="0"/>
-          <w:sz w:val="36"/>
-          <w:szCs w:val="36"/>
-          <w:shd w:fill="auto" w:val="clear"/>
-          <w:lang w:val="en-US" w:eastAsia="zh-CN" w:bidi="hi-IN"/>
-        </w:rPr>
-        <w:t xml:space="preserve"> verdadeiro.</w:t>
-      </w:r>
-    </w:p>
-    <w:p>
-      <w:pPr>
-        <w:pStyle w:val="Normal"/>
-        <w:jc w:val="both"/>
-        <w:rPr>
-          <w:color w:val="auto"/>
-        </w:rPr>
-      </w:pPr>
-      <w:r>
-        <w:rPr/>
-      </w:r>
-    </w:p>
-    <w:p>
-      <w:pPr>
-        <w:pStyle w:val="Normal"/>
-        <w:jc w:val="both"/>
-        <w:rPr>
-          <w:color w:val="auto"/>
-        </w:rPr>
-      </w:pPr>
-      <w:r>
-        <w:rPr>
-          <w:rFonts w:eastAsia="Times New Roman" w:cs="Times New Roman" w:ascii="Garamond" w:hAnsi="Garamond"/>
-          <w:color w:val="000000"/>
-          <w:kern w:val="0"/>
-          <w:sz w:val="36"/>
-          <w:szCs w:val="36"/>
-          <w:shd w:fill="auto" w:val="clear"/>
-          <w:lang w:val="en-US" w:eastAsia="zh-CN" w:bidi="hi-IN"/>
-        </w:rPr>
-        <w:t xml:space="preserve">Essa prática desaconselhada por Jesus, acabou se tornando comum na Igreja Católica e é algo que vemos ainda nos dias de hoje. Como nossa intenção não é criticar quaisquer escolas religiosas, vamos entender a fundamentação dessa prática. </w:t>
-      </w:r>
-    </w:p>
-    <w:p>
-      <w:pPr>
-        <w:pStyle w:val="Normal"/>
-        <w:jc w:val="both"/>
-        <w:rPr>
-          <w:color w:val="auto"/>
-        </w:rPr>
-      </w:pPr>
-      <w:r>
-        <w:rPr/>
-      </w:r>
-    </w:p>
-    <w:p>
-      <w:pPr>
-        <w:pStyle w:val="Normal"/>
-        <w:jc w:val="both"/>
-        <w:rPr>
-          <w:color w:val="auto"/>
-        </w:rPr>
-      </w:pPr>
-      <w:r>
-        <w:rPr>
-          <w:rFonts w:eastAsia="Times New Roman" w:cs="Times New Roman" w:ascii="Garamond" w:hAnsi="Garamond"/>
-          <w:color w:val="000000"/>
-          <w:kern w:val="0"/>
-          <w:sz w:val="36"/>
-          <w:szCs w:val="36"/>
-          <w:shd w:fill="auto" w:val="clear"/>
-          <w:lang w:val="en-US" w:eastAsia="zh-CN" w:bidi="hi-IN"/>
-        </w:rPr>
-        <w:t xml:space="preserve">Ao longo da história do cristianismo, especialmente a partir da Idade Média, desenvolveu-se na Igreja Católica a prática da penitência associada ao sacramento da confissão. </w:t>
-      </w:r>
-      <w:r>
-        <w:rPr>
-          <w:rFonts w:eastAsia="Times New Roman" w:cs="Times New Roman" w:ascii="Garamond" w:hAnsi="Garamond"/>
-          <w:color w:val="000000"/>
-          <w:kern w:val="0"/>
-          <w:sz w:val="36"/>
-          <w:szCs w:val="36"/>
-          <w:shd w:fill="auto" w:val="clear"/>
-          <w:lang w:val="en-US" w:eastAsia="zh-CN" w:bidi="hi-IN"/>
-        </w:rPr>
-        <w:t>Ou seja: a pessoa se confessava e recebia uma penitência a ser cumprida.</w:t>
-      </w:r>
-    </w:p>
-    <w:p>
-      <w:pPr>
-        <w:pStyle w:val="Normal"/>
-        <w:jc w:val="both"/>
-        <w:rPr>
-          <w:color w:val="auto"/>
-        </w:rPr>
-      </w:pPr>
-      <w:r>
-        <w:rPr/>
-      </w:r>
-    </w:p>
-    <w:p>
-      <w:pPr>
-        <w:pStyle w:val="Normal"/>
-        <w:jc w:val="both"/>
-        <w:rPr>
-          <w:color w:val="auto"/>
-        </w:rPr>
-      </w:pPr>
-      <w:r>
-        <w:rPr>
-          <w:rFonts w:eastAsia="Times New Roman" w:cs="Times New Roman" w:ascii="Garamond" w:hAnsi="Garamond"/>
-          <w:color w:val="000000"/>
-          <w:kern w:val="0"/>
-          <w:sz w:val="36"/>
-          <w:szCs w:val="36"/>
-          <w:shd w:fill="auto" w:val="clear"/>
-          <w:lang w:val="en-US" w:eastAsia="zh-CN" w:bidi="hi-IN"/>
-        </w:rPr>
-        <w:t>Nos primeiros séculos, as penitências eram públicas e, à</w:t>
-      </w:r>
-      <w:r>
-        <w:rPr>
-          <w:rFonts w:eastAsia="Times New Roman" w:cs="Times New Roman" w:ascii="Garamond" w:hAnsi="Garamond"/>
-          <w:color w:val="000000"/>
-          <w:kern w:val="0"/>
-          <w:sz w:val="36"/>
-          <w:szCs w:val="36"/>
-          <w:shd w:fill="auto" w:val="clear"/>
-          <w:lang w:val="en-US" w:eastAsia="zh-CN" w:bidi="hi-IN"/>
-        </w:rPr>
-        <w:t>s</w:t>
-      </w:r>
-      <w:r>
-        <w:rPr>
-          <w:rFonts w:eastAsia="Times New Roman" w:cs="Times New Roman" w:ascii="Garamond" w:hAnsi="Garamond"/>
-          <w:color w:val="000000"/>
-          <w:kern w:val="0"/>
-          <w:sz w:val="36"/>
-          <w:szCs w:val="36"/>
-          <w:shd w:fill="auto" w:val="clear"/>
-          <w:lang w:val="en-US" w:eastAsia="zh-CN" w:bidi="hi-IN"/>
-        </w:rPr>
-        <w:t xml:space="preserve"> vezes, bastante rigorosas. </w:t>
-      </w:r>
-      <w:r>
-        <w:rPr>
-          <w:rFonts w:eastAsia="Times New Roman" w:cs="Times New Roman" w:ascii="Garamond" w:hAnsi="Garamond"/>
-          <w:color w:val="000000"/>
-          <w:kern w:val="0"/>
-          <w:sz w:val="36"/>
-          <w:szCs w:val="36"/>
-          <w:shd w:fill="auto" w:val="clear"/>
-          <w:lang w:val="en-US" w:eastAsia="zh-CN" w:bidi="hi-IN"/>
-        </w:rPr>
-        <w:t xml:space="preserve">Por volta dos séculos VI e VII, surgiu a prática das confissões individuais e mais frequentes. </w:t>
-      </w:r>
-    </w:p>
-    <w:p>
-      <w:pPr>
-        <w:pStyle w:val="Normal"/>
-        <w:jc w:val="both"/>
-        <w:rPr>
-          <w:color w:val="auto"/>
-        </w:rPr>
-      </w:pPr>
-      <w:r>
-        <w:rPr/>
-      </w:r>
-    </w:p>
-    <w:p>
-      <w:pPr>
-        <w:pStyle w:val="Normal"/>
-        <w:jc w:val="both"/>
-        <w:rPr>
-          <w:color w:val="auto"/>
-        </w:rPr>
-      </w:pPr>
-      <w:r>
-        <w:rPr>
-          <w:rFonts w:eastAsia="Times New Roman" w:cs="Times New Roman" w:ascii="Garamond" w:hAnsi="Garamond"/>
-          <w:color w:val="000000"/>
-          <w:kern w:val="0"/>
-          <w:sz w:val="36"/>
-          <w:szCs w:val="36"/>
-          <w:shd w:fill="auto" w:val="clear"/>
-          <w:lang w:val="en-US" w:eastAsia="zh-CN" w:bidi="hi-IN"/>
-        </w:rPr>
-        <w:t xml:space="preserve">Surgiram então os chamados “penitenciais”, </w:t>
-      </w:r>
-      <w:r>
-        <w:rPr>
-          <w:rFonts w:eastAsia="Times New Roman" w:cs="Times New Roman" w:ascii="Garamond" w:hAnsi="Garamond"/>
-          <w:color w:val="000000"/>
-          <w:kern w:val="0"/>
-          <w:sz w:val="36"/>
-          <w:szCs w:val="36"/>
-          <w:shd w:fill="auto" w:val="clear"/>
-          <w:lang w:val="en-US" w:eastAsia="zh-CN" w:bidi="hi-IN"/>
-        </w:rPr>
-        <w:t xml:space="preserve">livros </w:t>
-      </w:r>
-      <w:r>
-        <w:rPr>
-          <w:rFonts w:eastAsia="Times New Roman" w:cs="Times New Roman" w:ascii="Garamond" w:hAnsi="Garamond"/>
-          <w:color w:val="000000"/>
-          <w:kern w:val="0"/>
-          <w:sz w:val="36"/>
-          <w:szCs w:val="36"/>
-          <w:shd w:fill="auto" w:val="clear"/>
-          <w:lang w:val="en-US" w:eastAsia="zh-CN" w:bidi="hi-IN"/>
-        </w:rPr>
-        <w:t xml:space="preserve">que indicavam orientações espirituais para cada </w:t>
-      </w:r>
-      <w:r>
-        <w:rPr>
-          <w:rFonts w:eastAsia="Times New Roman" w:cs="Times New Roman" w:ascii="Garamond" w:hAnsi="Garamond"/>
-          <w:color w:val="000000"/>
-          <w:kern w:val="0"/>
-          <w:sz w:val="36"/>
-          <w:szCs w:val="36"/>
-          <w:shd w:fill="auto" w:val="clear"/>
-          <w:lang w:val="en-US" w:eastAsia="zh-CN" w:bidi="hi-IN"/>
-        </w:rPr>
-        <w:t>pecado</w:t>
-      </w:r>
-      <w:r>
-        <w:rPr>
-          <w:rFonts w:eastAsia="Times New Roman" w:cs="Times New Roman" w:ascii="Garamond" w:hAnsi="Garamond"/>
-          <w:color w:val="000000"/>
-          <w:kern w:val="0"/>
-          <w:sz w:val="36"/>
-          <w:szCs w:val="36"/>
-          <w:shd w:fill="auto" w:val="clear"/>
-          <w:lang w:val="en-US" w:eastAsia="zh-CN" w:bidi="hi-IN"/>
-        </w:rPr>
-        <w:t>, incluindo jejuns, obras de caridade e também a recitação de determinado número de salmos ou orações.</w:t>
-      </w:r>
-    </w:p>
-    <w:p>
-      <w:pPr>
-        <w:pStyle w:val="Normal"/>
-        <w:jc w:val="both"/>
-        <w:rPr>
-          <w:color w:val="auto"/>
-        </w:rPr>
-      </w:pPr>
-      <w:r>
-        <w:rPr/>
-      </w:r>
-    </w:p>
-    <w:p>
-      <w:pPr>
-        <w:pStyle w:val="Normal"/>
-        <w:jc w:val="both"/>
-        <w:rPr>
-          <w:color w:val="auto"/>
-        </w:rPr>
-      </w:pPr>
-      <w:r>
-        <w:rPr>
-          <w:rFonts w:eastAsia="Times New Roman" w:cs="Times New Roman" w:ascii="Garamond" w:hAnsi="Garamond"/>
-          <w:color w:val="000000"/>
-          <w:kern w:val="0"/>
-          <w:sz w:val="36"/>
-          <w:szCs w:val="36"/>
-          <w:shd w:fill="auto" w:val="clear"/>
-          <w:lang w:val="en-US" w:eastAsia="zh-CN" w:bidi="hi-IN"/>
-        </w:rPr>
-        <w:t>Foi nesse contexto que surgiu a</w:t>
-      </w:r>
-      <w:r>
-        <w:rPr>
-          <w:rFonts w:eastAsia="Times New Roman" w:cs="Times New Roman" w:ascii="Garamond" w:hAnsi="Garamond"/>
-          <w:color w:val="000000"/>
-          <w:kern w:val="0"/>
-          <w:sz w:val="36"/>
-          <w:szCs w:val="36"/>
-          <w:shd w:fill="auto" w:val="clear"/>
-          <w:lang w:val="en-US" w:eastAsia="zh-CN" w:bidi="hi-IN"/>
-        </w:rPr>
-        <w:t xml:space="preserve"> repetição do Pai-Nosso e da Ave-Maria como parte da penitência</w:t>
-      </w:r>
-      <w:r>
-        <w:rPr>
-          <w:rFonts w:eastAsia="Times New Roman" w:cs="Times New Roman" w:ascii="Garamond" w:hAnsi="Garamond"/>
-          <w:color w:val="000000"/>
-          <w:kern w:val="0"/>
-          <w:sz w:val="36"/>
-          <w:szCs w:val="36"/>
-          <w:shd w:fill="auto" w:val="clear"/>
-          <w:lang w:val="en-US" w:eastAsia="zh-CN" w:bidi="hi-IN"/>
-        </w:rPr>
-        <w:t>.</w:t>
-      </w:r>
-      <w:r>
-        <w:rPr>
-          <w:rFonts w:eastAsia="Times New Roman" w:cs="Times New Roman" w:ascii="Garamond" w:hAnsi="Garamond"/>
-          <w:color w:val="000000"/>
-          <w:kern w:val="0"/>
-          <w:sz w:val="36"/>
-          <w:szCs w:val="36"/>
-          <w:shd w:fill="auto" w:val="clear"/>
-          <w:lang w:val="en-US" w:eastAsia="zh-CN" w:bidi="hi-IN"/>
-        </w:rPr>
-        <w:t xml:space="preserve"> </w:t>
-      </w:r>
-      <w:r>
-        <w:rPr>
-          <w:rFonts w:eastAsia="Times New Roman" w:cs="Times New Roman" w:ascii="Garamond" w:hAnsi="Garamond"/>
-          <w:color w:val="000000"/>
-          <w:kern w:val="0"/>
-          <w:sz w:val="36"/>
-          <w:szCs w:val="36"/>
-          <w:shd w:fill="auto" w:val="clear"/>
-          <w:lang w:val="en-US" w:eastAsia="zh-CN" w:bidi="hi-IN"/>
-        </w:rPr>
-        <w:t>O objetivo não era comprar o perdão, até porque, de acordo com a teologia católica, isso não é possível; o perdão só pode ser concedido por Deus .</w:t>
-      </w:r>
-      <w:r>
-        <w:rPr>
-          <w:rFonts w:eastAsia="Times New Roman" w:cs="Times New Roman" w:ascii="Garamond" w:hAnsi="Garamond"/>
-          <w:color w:val="000000"/>
-          <w:kern w:val="0"/>
-          <w:sz w:val="36"/>
-          <w:szCs w:val="36"/>
-          <w:shd w:fill="auto" w:val="clear"/>
-          <w:lang w:val="en-US" w:eastAsia="zh-CN" w:bidi="hi-IN"/>
-        </w:rPr>
-        <w:t>no momento da absolvição</w:t>
-      </w:r>
-      <w:r>
-        <w:rPr>
-          <w:rFonts w:eastAsia="Times New Roman" w:cs="Times New Roman" w:ascii="Garamond" w:hAnsi="Garamond"/>
-          <w:color w:val="000000"/>
-          <w:kern w:val="0"/>
-          <w:sz w:val="36"/>
-          <w:szCs w:val="36"/>
-          <w:shd w:fill="auto" w:val="clear"/>
-          <w:lang w:val="en-US" w:eastAsia="zh-CN" w:bidi="hi-IN"/>
-        </w:rPr>
-        <w:t xml:space="preserve">. A intenção era </w:t>
-      </w:r>
-      <w:r>
-        <w:rPr>
-          <w:rFonts w:eastAsia="Times New Roman" w:cs="Times New Roman" w:ascii="Garamond" w:hAnsi="Garamond"/>
-          <w:color w:val="000000"/>
-          <w:kern w:val="0"/>
-          <w:sz w:val="36"/>
-          <w:szCs w:val="36"/>
-          <w:shd w:fill="auto" w:val="clear"/>
-          <w:lang w:val="en-US" w:eastAsia="zh-CN" w:bidi="hi-IN"/>
-        </w:rPr>
-        <w:t xml:space="preserve">propor um exercício espiritual de reparação, disciplina e recolhimento. </w:t>
-      </w:r>
-    </w:p>
-    <w:p>
-      <w:pPr>
-        <w:pStyle w:val="Normal"/>
-        <w:jc w:val="both"/>
-        <w:rPr>
-          <w:color w:val="auto"/>
-        </w:rPr>
-      </w:pPr>
-      <w:r>
-        <w:rPr/>
-      </w:r>
-    </w:p>
-    <w:p>
-      <w:pPr>
-        <w:pStyle w:val="Normal"/>
-        <w:jc w:val="both"/>
-        <w:rPr>
-          <w:color w:val="auto"/>
-        </w:rPr>
-      </w:pPr>
-      <w:r>
-        <w:rPr>
-          <w:rFonts w:eastAsia="Times New Roman" w:cs="Times New Roman" w:ascii="Garamond" w:hAnsi="Garamond"/>
-          <w:color w:val="000000"/>
-          <w:kern w:val="0"/>
-          <w:sz w:val="36"/>
-          <w:szCs w:val="36"/>
-          <w:shd w:fill="auto" w:val="clear"/>
-          <w:lang w:val="en-US" w:eastAsia="zh-CN" w:bidi="hi-IN"/>
-        </w:rPr>
-        <w:t>Ao mesmo tempo, começava a se desenvolver</w:t>
-      </w:r>
-      <w:r>
-        <w:rPr>
-          <w:rFonts w:eastAsia="Times New Roman" w:cs="Times New Roman" w:ascii="Garamond" w:hAnsi="Garamond"/>
-          <w:color w:val="000000"/>
-          <w:kern w:val="0"/>
-          <w:sz w:val="36"/>
-          <w:szCs w:val="36"/>
-          <w:shd w:fill="auto" w:val="clear"/>
-          <w:lang w:val="en-US" w:eastAsia="zh-CN" w:bidi="hi-IN"/>
-        </w:rPr>
-        <w:t xml:space="preserve"> a tradição do Rosário, em que a repetição das orações assume caráter meditativo e contemplativo. Assim, a fixação de um número de preces nasceu dentro de uma pedagogia espiritual, como forma de educar a alma na perseverança e na reflexão.</w:t>
-      </w:r>
-    </w:p>
-    <w:p>
-      <w:pPr>
-        <w:pStyle w:val="Normal"/>
-        <w:jc w:val="both"/>
-        <w:rPr>
-          <w:color w:val="auto"/>
-        </w:rPr>
-      </w:pPr>
-      <w:r>
-        <w:rPr/>
-      </w:r>
-    </w:p>
-    <w:p>
-      <w:pPr>
-        <w:pStyle w:val="Normal"/>
-        <w:jc w:val="both"/>
-        <w:rPr>
-          <w:color w:val="auto"/>
-        </w:rPr>
-      </w:pPr>
-      <w:r>
-        <w:rPr>
-          <w:rFonts w:eastAsia="Times New Roman" w:cs="Times New Roman" w:ascii="Garamond" w:hAnsi="Garamond"/>
-          <w:color w:val="000000"/>
-          <w:kern w:val="0"/>
-          <w:sz w:val="36"/>
-          <w:szCs w:val="36"/>
-          <w:shd w:fill="auto" w:val="clear"/>
-          <w:lang w:val="en-US" w:eastAsia="zh-CN" w:bidi="hi-IN"/>
-        </w:rPr>
-        <w:t>[ Parei aqui em 04/03/2026 ]</w:t>
-      </w:r>
-    </w:p>
-    <w:p>
-      <w:pPr>
-        <w:pStyle w:val="Normal"/>
-        <w:jc w:val="both"/>
-        <w:rPr>
-          <w:color w:val="auto"/>
-        </w:rPr>
-      </w:pPr>
-      <w:r>
-        <w:rPr/>
-      </w:r>
-    </w:p>
-    <w:p>
-      <w:pPr>
-        <w:pStyle w:val="Normal"/>
-        <w:jc w:val="both"/>
-        <w:rPr>
-          <w:color w:val="auto"/>
-        </w:rPr>
-      </w:pPr>
-      <w:r>
-        <w:rPr>
-          <w:rFonts w:eastAsia="Times New Roman" w:cs="Times New Roman" w:ascii="Garamond" w:hAnsi="Garamond"/>
-          <w:color w:val="000000"/>
-          <w:kern w:val="0"/>
-          <w:sz w:val="36"/>
-          <w:szCs w:val="36"/>
-          <w:shd w:fill="auto" w:val="clear"/>
-          <w:lang w:val="en-US" w:eastAsia="zh-CN" w:bidi="hi-IN"/>
-        </w:rPr>
-        <w:t>À luz do ensinamento de Jesus, podemos compreender essa prática histórica sem espírito de crítica, mas com discernimento. Quando Ele nos alerta para não orarmos como os pagãos, que acreditavam ser ouvidos pela multiplicidade das palavras, não está condenando a repetição em si, mas a ideia de que Deus possa ser convencido pela quantidade. A repetição pode ser instrumento de concentração e disciplina; o que o Evangelho nos convida a evitar é o automatismo vazio. A eficácia da prece não está no número de vezes que pronunciamos determinadas palavras, mas na sinceridade do coração que ora e na disposição interior de transformar-se para o bem.</w:t>
-      </w:r>
-    </w:p>
-    <w:p>
-      <w:pPr>
-        <w:pStyle w:val="Normal"/>
-        <w:jc w:val="both"/>
-        <w:rPr>
-          <w:color w:val="auto"/>
-        </w:rPr>
-      </w:pPr>
-      <w:r>
-        <w:rPr/>
-      </w:r>
-    </w:p>
-    <w:p>
-      <w:pPr>
-        <w:pStyle w:val="Normal"/>
-        <w:jc w:val="both"/>
-        <w:rPr>
-          <w:color w:val="auto"/>
-        </w:rPr>
-      </w:pPr>
-      <w:r>
-        <w:rPr>
-          <w:rFonts w:eastAsia="Times New Roman" w:cs="Times New Roman" w:ascii="Garamond" w:hAnsi="Garamond"/>
-          <w:color w:val="000000"/>
-          <w:kern w:val="0"/>
-          <w:sz w:val="36"/>
-          <w:szCs w:val="36"/>
-          <w:shd w:fill="auto" w:val="clear"/>
-          <w:lang w:val="en-US" w:eastAsia="zh-CN" w:bidi="hi-IN"/>
-        </w:rPr>
-        <w:t xml:space="preserve">Deus não se importa com as palavras que utilizamos em nossas orações e muito menos com a quantidade delas. Há pessoas que ainda hoje acham que, quanto mais longas forem suas orações, maiores as chances de que Deus as ouça. </w:t>
       </w:r>
     </w:p>
     <w:p>
@@ -6560,7 +6555,7 @@
         <w:bCs/>
         <w:rFonts w:ascii="Garamond" w:hAnsi="Garamond"/>
       </w:rPr>
-      <w:t>34</w:t>
+      <w:t>37</w:t>
     </w:r>
     <w:r>
       <w:rPr>

</xml_diff>

<commit_message>
08/03/2026 - 21:23 h
</commit_message>
<xml_diff>
--- a/Pedi e obtereis/Pedi e obtereis.docx
+++ b/Pedi e obtereis/Pedi e obtereis.docx
@@ -153,19 +153,7 @@
           <w:shd w:fill="auto" w:val="clear"/>
           <w:lang w:val="en-US" w:eastAsia="zh-CN" w:bidi="hi-IN"/>
         </w:rPr>
-        <w:t>Quando Jesus falou sobre odiar pai e mãe, deixar aos mortos o cuidado de enterrar seus mortos ou ainda abandonar pai, mãe e filhos, Ele causou grande estranheza. Isso aconteceu e ainda acontece porque, quando esses ensinamentos são interpretados de maneira superficial, passam a impressão de que Jesus estaria contrariando tudo aquilo que Ele ensinou sobre amor</w:t>
-      </w:r>
-      <w:r>
-        <w:rPr>
-          <w:rFonts w:eastAsia="Times New Roman" w:cs="Times New Roman" w:ascii="Garamond" w:hAnsi="Garamond"/>
-          <w:color w:val="000000"/>
-          <w:kern w:val="0"/>
-          <w:sz w:val="36"/>
-          <w:szCs w:val="36"/>
-          <w:shd w:fill="auto" w:val="clear"/>
-          <w:lang w:val="en-US" w:eastAsia="zh-CN" w:bidi="hi-IN"/>
-        </w:rPr>
-        <w:t>.</w:t>
+        <w:t>Quando Jesus falou sobre odiar pai e mãe, deixar aos mortos o cuidado de enterrar seus mortos ou ainda abandonar pai, mãe e filhos, Ele causou grande estranheza. Isso aconteceu e ainda acontece porque, quando esses ensinamentos são interpretados de maneira superficial, passam a impressão de que Jesus estaria contrariando tudo aquilo que Ele ensinou sobre amor.</w:t>
       </w:r>
     </w:p>
     <w:p>
@@ -369,69 +357,45 @@
           <w:shd w:fill="auto" w:val="clear"/>
           <w:lang w:val="en-US" w:eastAsia="zh-CN" w:bidi="hi-IN"/>
         </w:rPr>
-        <w:t xml:space="preserve">Com esse comportamento transformamos ensinamentos profundos de Jesus em promessas de facilidade, quando na verdade </w:t>
-      </w:r>
-      <w:r>
-        <w:rPr>
-          <w:rFonts w:eastAsia="Times New Roman" w:cs="Times New Roman" w:ascii="Garamond" w:hAnsi="Garamond"/>
-          <w:color w:val="000000"/>
-          <w:kern w:val="0"/>
-          <w:sz w:val="36"/>
-          <w:szCs w:val="36"/>
-          <w:shd w:fill="auto" w:val="clear"/>
-          <w:lang w:val="en-US" w:eastAsia="zh-CN" w:bidi="hi-IN"/>
-        </w:rPr>
-        <w:t>eles</w:t>
-      </w:r>
-      <w:r>
-        <w:rPr>
-          <w:rFonts w:eastAsia="Times New Roman" w:cs="Times New Roman" w:ascii="Garamond" w:hAnsi="Garamond"/>
-          <w:color w:val="000000"/>
-          <w:kern w:val="0"/>
-          <w:sz w:val="36"/>
-          <w:szCs w:val="36"/>
-          <w:shd w:fill="auto" w:val="clear"/>
-          <w:lang w:val="en-US" w:eastAsia="zh-CN" w:bidi="hi-IN"/>
-        </w:rPr>
-        <w:t xml:space="preserve"> nos convidam à responsabilidade, à confiança ativa e ao trabalho no bem.</w:t>
-      </w:r>
-    </w:p>
-    <w:p>
-      <w:pPr>
-        <w:pStyle w:val="Normal"/>
-        <w:jc w:val="both"/>
-        <w:rPr>
-          <w:sz w:val="36"/>
-          <w:szCs w:val="36"/>
-        </w:rPr>
-      </w:pPr>
-      <w:r>
-        <w:rPr>
-          <w:sz w:val="36"/>
-          <w:szCs w:val="36"/>
-        </w:rPr>
-      </w:r>
-    </w:p>
-    <w:p>
-      <w:pPr>
-        <w:pStyle w:val="Normal"/>
-        <w:jc w:val="both"/>
-        <w:rPr>
-          <w:sz w:val="36"/>
-          <w:szCs w:val="36"/>
-        </w:rPr>
-      </w:pPr>
-      <w:r>
-        <w:rPr>
-          <w:rFonts w:eastAsia="Times New Roman" w:cs="Times New Roman" w:ascii="Garamond" w:hAnsi="Garamond"/>
-          <w:color w:val="000000"/>
-          <w:kern w:val="0"/>
-          <w:sz w:val="36"/>
-          <w:szCs w:val="36"/>
-          <w:shd w:fill="auto" w:val="clear"/>
-          <w:lang w:val="en-US" w:eastAsia="zh-CN" w:bidi="hi-IN"/>
-        </w:rPr>
-        <w:t>E é justamente isso que veremos ao longo de nossas reflexões.</w:t>
+        <w:t>Com esse comportamento transformamos ensinamentos profundos de Jesus em promessas de facilidade, quando na verdade eles nos convidam à responsabilidade, à confiança ativa e ao trabalho no bem.</w:t>
+      </w:r>
+    </w:p>
+    <w:p>
+      <w:pPr>
+        <w:pStyle w:val="Normal"/>
+        <w:jc w:val="both"/>
+        <w:rPr>
+          <w:sz w:val="36"/>
+          <w:szCs w:val="36"/>
+        </w:rPr>
+      </w:pPr>
+      <w:r>
+        <w:rPr>
+          <w:sz w:val="36"/>
+          <w:szCs w:val="36"/>
+        </w:rPr>
+      </w:r>
+    </w:p>
+    <w:p>
+      <w:pPr>
+        <w:pStyle w:val="Normal"/>
+        <w:jc w:val="both"/>
+        <w:rPr>
+          <w:sz w:val="36"/>
+          <w:szCs w:val="36"/>
+        </w:rPr>
+      </w:pPr>
+      <w:r>
+        <w:rPr>
+          <w:rFonts w:eastAsia="Times New Roman" w:cs="Times New Roman" w:ascii="Garamond" w:hAnsi="Garamond"/>
+          <w:color w:val="000000"/>
+          <w:kern w:val="0"/>
+          <w:sz w:val="36"/>
+          <w:szCs w:val="36"/>
+          <w:shd w:fill="auto" w:val="clear"/>
+          <w:lang w:val="en-US" w:eastAsia="zh-CN" w:bidi="hi-IN"/>
+        </w:rPr>
+        <w:t>E é exatamente isso que veremos ao longo de nossas reflexões.</w:t>
       </w:r>
     </w:p>
     <w:p>
@@ -560,7 +524,7 @@
           <w:shd w:fill="auto" w:val="clear"/>
           <w:lang w:val="en-US" w:eastAsia="zh-CN" w:bidi="hi-IN"/>
         </w:rPr>
-        <w:t>O Mestre conta que um homem recebe, à meia-noite, a visita inesperada de um amigo e não tem nada para lhe oferecer. Então ele vai até a casa de um vizinho, bate à porta e diz: “Amigo, empresta-me três pães, pois chegou uma visita em minha casa, e eu não tenho o que colocar à mesa”.</w:t>
+        <w:t>O Mestre conta que um homem recebe, à meia-noite, a visita inesperada de um amigo a quem não tem nada para oferecer. Então ele vai até a casa de um vizinho, bate à porta e diz: “Amigo, empresta-me três pães, pois chegou uma visita em minha casa, e eu não tenho o que colocar à mesa”.</w:t>
       </w:r>
     </w:p>
     <w:p>
@@ -741,6 +705,146 @@
         <w:pStyle w:val="Normal"/>
         <w:jc w:val="both"/>
         <w:rPr>
+          <w:color w:val="auto"/>
+        </w:rPr>
+      </w:pPr>
+      <w:r>
+        <w:rPr>
+          <w:rFonts w:eastAsia="Times New Roman" w:cs="Times New Roman" w:ascii="Garamond" w:hAnsi="Garamond"/>
+          <w:color w:val="000000"/>
+          <w:kern w:val="0"/>
+          <w:sz w:val="36"/>
+          <w:szCs w:val="36"/>
+          <w:shd w:fill="auto" w:val="clear"/>
+          <w:lang w:val="en-US" w:eastAsia="zh-CN" w:bidi="hi-IN"/>
+        </w:rPr>
+        <w:t xml:space="preserve">Existem alguns elementos simbólicos nessa parábola. Jesus menciona que o homem procura o amigo à meia-noite, horário que aparece com frequência no Evangelho como símbolo de crise, de dificuldade e de escuridão interior. </w:t>
+      </w:r>
+    </w:p>
+    <w:p>
+      <w:pPr>
+        <w:pStyle w:val="Normal"/>
+        <w:jc w:val="both"/>
+        <w:rPr>
+          <w:color w:val="auto"/>
+        </w:rPr>
+      </w:pPr>
+      <w:r>
+        <w:rPr>
+          <w:color w:val="auto"/>
+        </w:rPr>
+      </w:r>
+    </w:p>
+    <w:p>
+      <w:pPr>
+        <w:pStyle w:val="Normal"/>
+        <w:jc w:val="both"/>
+        <w:rPr>
+          <w:color w:val="auto"/>
+        </w:rPr>
+      </w:pPr>
+      <w:r>
+        <w:rPr>
+          <w:rFonts w:eastAsia="Times New Roman" w:cs="Times New Roman" w:ascii="Garamond" w:hAnsi="Garamond"/>
+          <w:color w:val="000000"/>
+          <w:kern w:val="0"/>
+          <w:sz w:val="36"/>
+          <w:szCs w:val="36"/>
+          <w:shd w:fill="auto" w:val="clear"/>
+          <w:lang w:val="en-US" w:eastAsia="zh-CN" w:bidi="hi-IN"/>
+        </w:rPr>
+        <w:t>Muitas vezes desperdiçamos as oportunidades durante a “luz do dia” e só buscamos auxílio quando a dor, o sofrimento ou a aflição já se instalaram em nós. A “noite”, nesse contexto, simboliza justamente esse momento difícil, em que as dificuldades nos fazem perceber a necessidade de buscar luz e orientação espiritual.</w:t>
+      </w:r>
+    </w:p>
+    <w:p>
+      <w:pPr>
+        <w:pStyle w:val="Normal"/>
+        <w:jc w:val="both"/>
+        <w:rPr>
+          <w:color w:val="auto"/>
+        </w:rPr>
+      </w:pPr>
+      <w:r>
+        <w:rPr>
+          <w:color w:val="auto"/>
+        </w:rPr>
+      </w:r>
+    </w:p>
+    <w:p>
+      <w:pPr>
+        <w:pStyle w:val="Normal"/>
+        <w:jc w:val="both"/>
+        <w:rPr>
+          <w:color w:val="auto"/>
+        </w:rPr>
+      </w:pPr>
+      <w:r>
+        <w:rPr>
+          <w:rFonts w:eastAsia="Times New Roman" w:cs="Times New Roman" w:ascii="Garamond" w:hAnsi="Garamond"/>
+          <w:color w:val="000000"/>
+          <w:kern w:val="0"/>
+          <w:sz w:val="36"/>
+          <w:szCs w:val="36"/>
+          <w:shd w:fill="auto" w:val="clear"/>
+          <w:lang w:val="en-US" w:eastAsia="zh-CN" w:bidi="hi-IN"/>
+        </w:rPr>
+        <w:t xml:space="preserve">O amigo que está dentro da casa representa os valores superiores que já possuímos, porém ainda adormecidos. Quando o homem diz que está deitado e não quer se levantar, isso simboliza nossa própria resistência em sair da zona de conforto. </w:t>
+      </w:r>
+    </w:p>
+    <w:p>
+      <w:pPr>
+        <w:pStyle w:val="Normal"/>
+        <w:jc w:val="both"/>
+        <w:rPr>
+          <w:color w:val="auto"/>
+        </w:rPr>
+      </w:pPr>
+      <w:r>
+        <w:rPr>
+          <w:color w:val="auto"/>
+        </w:rPr>
+      </w:r>
+    </w:p>
+    <w:p>
+      <w:pPr>
+        <w:pStyle w:val="Normal"/>
+        <w:jc w:val="both"/>
+        <w:rPr>
+          <w:color w:val="auto"/>
+        </w:rPr>
+      </w:pPr>
+      <w:r>
+        <w:rPr>
+          <w:rFonts w:eastAsia="Times New Roman" w:cs="Times New Roman" w:ascii="Garamond" w:hAnsi="Garamond"/>
+          <w:color w:val="000000"/>
+          <w:kern w:val="0"/>
+          <w:sz w:val="36"/>
+          <w:szCs w:val="36"/>
+          <w:shd w:fill="auto" w:val="clear"/>
+          <w:lang w:val="en-US" w:eastAsia="zh-CN" w:bidi="hi-IN"/>
+        </w:rPr>
+        <w:t>No momento em que esses valores despertarem, eles exigirão esforço, dedicação e reforma íntima — compromissos que, muitas vezes, ainda não queremos assumir.</w:t>
+      </w:r>
+    </w:p>
+    <w:p>
+      <w:pPr>
+        <w:pStyle w:val="Normal"/>
+        <w:jc w:val="both"/>
+        <w:rPr>
+          <w:color w:val="auto"/>
+        </w:rPr>
+      </w:pPr>
+      <w:r>
+        <w:rPr>
+          <w:color w:val="auto"/>
+        </w:rPr>
+      </w:r>
+    </w:p>
+    <w:p>
+      <w:pPr>
+        <w:pStyle w:val="Normal"/>
+        <w:jc w:val="both"/>
+        <w:rPr>
           <w:rFonts w:ascii="Garamond" w:hAnsi="Garamond" w:eastAsia="Times New Roman" w:cs="Times New Roman"/>
           <w:kern w:val="0"/>
           <w:sz w:val="36"/>
@@ -758,186 +862,99 @@
           <w:shd w:fill="auto" w:val="clear"/>
           <w:lang w:val="en-US" w:eastAsia="zh-CN" w:bidi="hi-IN"/>
         </w:rPr>
-      </w:r>
-    </w:p>
-    <w:p>
-      <w:pPr>
-        <w:pStyle w:val="Normal"/>
-        <w:jc w:val="both"/>
-        <w:rPr>
-          <w:color w:val="auto"/>
-        </w:rPr>
-      </w:pPr>
-      <w:r>
-        <w:rPr>
-          <w:rFonts w:eastAsia="Times New Roman" w:cs="Times New Roman" w:ascii="Garamond" w:hAnsi="Garamond"/>
-          <w:color w:val="000000"/>
-          <w:kern w:val="0"/>
-          <w:sz w:val="36"/>
-          <w:szCs w:val="36"/>
-          <w:shd w:fill="auto" w:val="clear"/>
-          <w:lang w:val="en-US" w:eastAsia="zh-CN" w:bidi="hi-IN"/>
-        </w:rPr>
-        <w:t xml:space="preserve">Existem alguns elementos simbólicos nessa parábola. Jesus menciona que o homem procura o amigo à meia-noite, horário que aparece com frequência no Evangelho como símbolo de crise, de dificuldade e de escuridão interior. </w:t>
-      </w:r>
-    </w:p>
-    <w:p>
-      <w:pPr>
-        <w:pStyle w:val="Normal"/>
-        <w:jc w:val="both"/>
-        <w:rPr>
-          <w:color w:val="auto"/>
-        </w:rPr>
-      </w:pPr>
-      <w:r>
-        <w:rPr>
-          <w:color w:val="auto"/>
-        </w:rPr>
-      </w:r>
-    </w:p>
-    <w:p>
-      <w:pPr>
-        <w:pStyle w:val="Normal"/>
-        <w:jc w:val="both"/>
-        <w:rPr>
-          <w:color w:val="auto"/>
-        </w:rPr>
-      </w:pPr>
-      <w:r>
-        <w:rPr>
-          <w:rFonts w:eastAsia="Times New Roman" w:cs="Times New Roman" w:ascii="Garamond" w:hAnsi="Garamond"/>
-          <w:color w:val="000000"/>
-          <w:kern w:val="0"/>
-          <w:sz w:val="36"/>
-          <w:szCs w:val="36"/>
-          <w:shd w:fill="auto" w:val="clear"/>
-          <w:lang w:val="en-US" w:eastAsia="zh-CN" w:bidi="hi-IN"/>
-        </w:rPr>
-        <w:t xml:space="preserve">Muitas vezes desperdiçamos as oportunidades durante a “luz do dia” e só buscamos auxílio quando a dor, o sofrimento ou a aflição já </w:t>
-      </w:r>
-      <w:r>
-        <w:rPr>
-          <w:rFonts w:eastAsia="Times New Roman" w:cs="Times New Roman" w:ascii="Garamond" w:hAnsi="Garamond"/>
-          <w:color w:val="000000"/>
-          <w:kern w:val="0"/>
-          <w:sz w:val="36"/>
-          <w:szCs w:val="36"/>
-          <w:shd w:fill="auto" w:val="clear"/>
-          <w:lang w:val="en-US" w:eastAsia="zh-CN" w:bidi="hi-IN"/>
-        </w:rPr>
-        <w:t>estão presentes</w:t>
-      </w:r>
-      <w:r>
-        <w:rPr>
-          <w:rFonts w:eastAsia="Times New Roman" w:cs="Times New Roman" w:ascii="Garamond" w:hAnsi="Garamond"/>
-          <w:color w:val="000000"/>
-          <w:kern w:val="0"/>
-          <w:sz w:val="36"/>
-          <w:szCs w:val="36"/>
-          <w:shd w:fill="auto" w:val="clear"/>
-          <w:lang w:val="en-US" w:eastAsia="zh-CN" w:bidi="hi-IN"/>
-        </w:rPr>
-        <w:t xml:space="preserve">. </w:t>
-      </w:r>
-      <w:r>
-        <w:rPr>
-          <w:rFonts w:eastAsia="Times New Roman" w:cs="Times New Roman" w:ascii="Garamond" w:hAnsi="Garamond"/>
-          <w:color w:val="000000"/>
-          <w:kern w:val="0"/>
-          <w:sz w:val="36"/>
-          <w:szCs w:val="36"/>
-          <w:shd w:fill="auto" w:val="clear"/>
-          <w:lang w:val="en-US" w:eastAsia="zh-CN" w:bidi="hi-IN"/>
-        </w:rPr>
-        <w:t xml:space="preserve">A “noite”, nesse contexto, simboliza justamente esse momento difícil, em que as dificuldades nos fazem perceber a necessidade de </w:t>
-      </w:r>
-      <w:r>
-        <w:rPr>
-          <w:rFonts w:eastAsia="Times New Roman" w:cs="Times New Roman" w:ascii="Garamond" w:hAnsi="Garamond"/>
-          <w:color w:val="000000"/>
-          <w:kern w:val="0"/>
-          <w:sz w:val="36"/>
-          <w:szCs w:val="36"/>
-          <w:shd w:fill="auto" w:val="clear"/>
-          <w:lang w:val="en-US" w:eastAsia="zh-CN" w:bidi="hi-IN"/>
-        </w:rPr>
-        <w:t>buscar</w:t>
-      </w:r>
-      <w:r>
-        <w:rPr>
-          <w:rFonts w:eastAsia="Times New Roman" w:cs="Times New Roman" w:ascii="Garamond" w:hAnsi="Garamond"/>
-          <w:color w:val="000000"/>
-          <w:kern w:val="0"/>
-          <w:sz w:val="36"/>
-          <w:szCs w:val="36"/>
-          <w:shd w:fill="auto" w:val="clear"/>
-          <w:lang w:val="en-US" w:eastAsia="zh-CN" w:bidi="hi-IN"/>
-        </w:rPr>
-        <w:t xml:space="preserve"> luz e orientação espiritual.</w:t>
-      </w:r>
-    </w:p>
-    <w:p>
-      <w:pPr>
-        <w:pStyle w:val="Normal"/>
-        <w:jc w:val="both"/>
-        <w:rPr>
-          <w:color w:val="auto"/>
-        </w:rPr>
-      </w:pPr>
-      <w:r>
-        <w:rPr>
-          <w:rFonts w:eastAsia="Times New Roman" w:cs="Times New Roman" w:ascii="Garamond" w:hAnsi="Garamond"/>
-          <w:kern w:val="0"/>
-          <w:sz w:val="36"/>
-          <w:szCs w:val="36"/>
-          <w:shd w:fill="auto" w:val="clear"/>
-          <w:lang w:val="en-US" w:eastAsia="zh-CN" w:bidi="hi-IN"/>
-        </w:rPr>
-      </w:r>
-    </w:p>
-    <w:p>
-      <w:pPr>
-        <w:pStyle w:val="Normal"/>
-        <w:jc w:val="both"/>
-        <w:rPr>
-          <w:color w:val="auto"/>
-        </w:rPr>
-      </w:pPr>
-      <w:r>
-        <w:rPr>
-          <w:rFonts w:eastAsia="Times New Roman" w:cs="Times New Roman" w:ascii="Garamond" w:hAnsi="Garamond"/>
-          <w:color w:val="000000"/>
-          <w:kern w:val="0"/>
-          <w:sz w:val="36"/>
-          <w:szCs w:val="36"/>
-          <w:shd w:fill="auto" w:val="clear"/>
-          <w:lang w:val="en-US" w:eastAsia="zh-CN" w:bidi="hi-IN"/>
-        </w:rPr>
-        <w:t xml:space="preserve">O amigo que está dentro da casa </w:t>
-      </w:r>
-      <w:r>
-        <w:rPr>
-          <w:rFonts w:eastAsia="Times New Roman" w:cs="Times New Roman" w:ascii="Garamond" w:hAnsi="Garamond"/>
-          <w:color w:val="000000"/>
-          <w:kern w:val="0"/>
-          <w:sz w:val="36"/>
-          <w:szCs w:val="36"/>
-          <w:shd w:fill="auto" w:val="clear"/>
-          <w:lang w:val="en-US" w:eastAsia="zh-CN" w:bidi="hi-IN"/>
-        </w:rPr>
-        <w:t>representa</w:t>
-      </w:r>
-      <w:r>
-        <w:rPr>
-          <w:rFonts w:eastAsia="Times New Roman" w:cs="Times New Roman" w:ascii="Garamond" w:hAnsi="Garamond"/>
-          <w:color w:val="000000"/>
-          <w:kern w:val="0"/>
-          <w:sz w:val="36"/>
-          <w:szCs w:val="36"/>
-          <w:shd w:fill="auto" w:val="clear"/>
-          <w:lang w:val="en-US" w:eastAsia="zh-CN" w:bidi="hi-IN"/>
-        </w:rPr>
-        <w:t xml:space="preserve"> os valores superiores que já existem em nós, mas que muitas vezes deixamos adormecidos. Quando ele diz que está deitado e não quer se levantar, isso simboliza nossa própria resistência em sair da zona de conforto. No fundo, percebemos que despertar esses valores exige esforço, dedicação e mudanças reais em nossa maneira de agir e de viver.</w:t>
+        <w:t xml:space="preserve">O </w:t>
+      </w:r>
+      <w:r>
+        <w:rPr>
+          <w:rFonts w:eastAsia="Times New Roman" w:cs="Times New Roman" w:ascii="Garamond" w:hAnsi="Garamond"/>
+          <w:color w:val="000000"/>
+          <w:kern w:val="0"/>
+          <w:sz w:val="36"/>
+          <w:szCs w:val="36"/>
+          <w:shd w:fill="auto" w:val="clear"/>
+          <w:lang w:val="en-US" w:eastAsia="zh-CN" w:bidi="hi-IN"/>
+        </w:rPr>
+        <w:t>homem</w:t>
+      </w:r>
+      <w:r>
+        <w:rPr>
+          <w:rFonts w:eastAsia="Times New Roman" w:cs="Times New Roman" w:ascii="Garamond" w:hAnsi="Garamond"/>
+          <w:kern w:val="0"/>
+          <w:sz w:val="36"/>
+          <w:szCs w:val="36"/>
+          <w:shd w:fill="auto" w:val="clear"/>
+          <w:lang w:val="en-US" w:eastAsia="zh-CN" w:bidi="hi-IN"/>
+        </w:rPr>
+        <w:t xml:space="preserve"> que bate à porta </w:t>
+      </w:r>
+      <w:r>
+        <w:rPr>
+          <w:rFonts w:eastAsia="Times New Roman" w:cs="Times New Roman" w:ascii="Garamond" w:hAnsi="Garamond"/>
+          <w:color w:val="000000"/>
+          <w:kern w:val="0"/>
+          <w:sz w:val="36"/>
+          <w:szCs w:val="36"/>
+          <w:shd w:fill="auto" w:val="clear"/>
+          <w:lang w:val="en-US" w:eastAsia="zh-CN" w:bidi="hi-IN"/>
+        </w:rPr>
+        <w:t>são</w:t>
+      </w:r>
+      <w:r>
+        <w:rPr>
+          <w:rFonts w:eastAsia="Times New Roman" w:cs="Times New Roman" w:ascii="Garamond" w:hAnsi="Garamond"/>
+          <w:kern w:val="0"/>
+          <w:sz w:val="36"/>
+          <w:szCs w:val="36"/>
+          <w:shd w:fill="auto" w:val="clear"/>
+          <w:lang w:val="en-US" w:eastAsia="zh-CN" w:bidi="hi-IN"/>
+        </w:rPr>
+        <w:t xml:space="preserve"> os estímulos — nem sempre agradáveis — que recebemos da vida. São as experiências, os desafios</w:t>
+      </w:r>
+      <w:r>
+        <w:rPr>
+          <w:rFonts w:eastAsia="Times New Roman" w:cs="Times New Roman" w:ascii="Garamond" w:hAnsi="Garamond"/>
+          <w:color w:val="000000"/>
+          <w:kern w:val="0"/>
+          <w:sz w:val="36"/>
+          <w:szCs w:val="36"/>
+          <w:shd w:fill="auto" w:val="clear"/>
+          <w:lang w:val="en-US" w:eastAsia="zh-CN" w:bidi="hi-IN"/>
+        </w:rPr>
+        <w:t xml:space="preserve">, </w:t>
+      </w:r>
+      <w:r>
+        <w:rPr>
+          <w:rFonts w:eastAsia="Times New Roman" w:cs="Times New Roman" w:ascii="Garamond" w:hAnsi="Garamond"/>
+          <w:kern w:val="0"/>
+          <w:sz w:val="36"/>
+          <w:szCs w:val="36"/>
+          <w:shd w:fill="auto" w:val="clear"/>
+          <w:lang w:val="en-US" w:eastAsia="zh-CN" w:bidi="hi-IN"/>
+        </w:rPr>
+        <w:t xml:space="preserve">as dificuldades que nos levam a refletir, a olhar para dentro e a </w:t>
+      </w:r>
+      <w:r>
+        <w:rPr>
+          <w:rFonts w:eastAsia="Times New Roman" w:cs="Times New Roman" w:ascii="Garamond" w:hAnsi="Garamond"/>
+          <w:color w:val="000000"/>
+          <w:kern w:val="0"/>
+          <w:sz w:val="36"/>
+          <w:szCs w:val="36"/>
+          <w:shd w:fill="auto" w:val="clear"/>
+          <w:lang w:val="en-US" w:eastAsia="zh-CN" w:bidi="hi-IN"/>
+        </w:rPr>
+        <w:t>identificar</w:t>
+      </w:r>
+      <w:r>
+        <w:rPr>
+          <w:rFonts w:eastAsia="Times New Roman" w:cs="Times New Roman" w:ascii="Garamond" w:hAnsi="Garamond"/>
+          <w:kern w:val="0"/>
+          <w:sz w:val="36"/>
+          <w:szCs w:val="36"/>
+          <w:shd w:fill="auto" w:val="clear"/>
+          <w:lang w:val="en-US" w:eastAsia="zh-CN" w:bidi="hi-IN"/>
+        </w:rPr>
+        <w:t xml:space="preserve"> aquilo que precisa mudar em nós.</w:t>
       </w:r>
     </w:p>
     <w:p>
@@ -969,6 +986,62 @@
         <w:pStyle w:val="Normal"/>
         <w:jc w:val="both"/>
         <w:rPr>
+          <w:color w:val="auto"/>
+        </w:rPr>
+      </w:pPr>
+      <w:r>
+        <w:rPr>
+          <w:rFonts w:eastAsia="Times New Roman" w:cs="Times New Roman" w:ascii="Garamond" w:hAnsi="Garamond"/>
+          <w:color w:val="000000"/>
+          <w:kern w:val="0"/>
+          <w:sz w:val="36"/>
+          <w:szCs w:val="36"/>
+          <w:shd w:fill="auto" w:val="clear"/>
+          <w:lang w:val="en-US" w:eastAsia="zh-CN" w:bidi="hi-IN"/>
+        </w:rPr>
+        <w:t xml:space="preserve">Por fim, há um ponto central nessa parábola: por maior que fosse a necessidade do homem que pedia os pães, ele não podia abrir a porta da casa: ela só poderia ser aberta pelo lado de dentro. </w:t>
+      </w:r>
+    </w:p>
+    <w:p>
+      <w:pPr>
+        <w:pStyle w:val="Normal"/>
+        <w:jc w:val="both"/>
+        <w:rPr>
+          <w:color w:val="auto"/>
+        </w:rPr>
+      </w:pPr>
+      <w:r>
+        <w:rPr>
+          <w:color w:val="auto"/>
+        </w:rPr>
+      </w:r>
+    </w:p>
+    <w:p>
+      <w:pPr>
+        <w:pStyle w:val="Normal"/>
+        <w:jc w:val="both"/>
+        <w:rPr>
+          <w:color w:val="auto"/>
+        </w:rPr>
+      </w:pPr>
+      <w:r>
+        <w:rPr>
+          <w:rFonts w:eastAsia="Times New Roman" w:cs="Times New Roman" w:ascii="Garamond" w:hAnsi="Garamond"/>
+          <w:color w:val="000000"/>
+          <w:kern w:val="0"/>
+          <w:sz w:val="36"/>
+          <w:szCs w:val="36"/>
+          <w:shd w:fill="auto" w:val="clear"/>
+          <w:lang w:val="en-US" w:eastAsia="zh-CN" w:bidi="hi-IN"/>
+        </w:rPr>
+        <w:t>Assim também acontece com a porta do coração. Somente nós podemos abri-la; ninguém mais. E vamos abri-la quando ouvirmos o chamado da nossa consciência, que chega através da dor, da doença ou da fome de pão espiritual.</w:t>
+      </w:r>
+    </w:p>
+    <w:p>
+      <w:pPr>
+        <w:pStyle w:val="Normal"/>
+        <w:jc w:val="both"/>
+        <w:rPr>
           <w:rFonts w:ascii="Garamond" w:hAnsi="Garamond" w:eastAsia="Times New Roman" w:cs="Times New Roman"/>
           <w:kern w:val="0"/>
           <w:sz w:val="36"/>
@@ -986,213 +1059,27 @@
           <w:shd w:fill="auto" w:val="clear"/>
           <w:lang w:val="en-US" w:eastAsia="zh-CN" w:bidi="hi-IN"/>
         </w:rPr>
-        <w:t xml:space="preserve">O amigo que bate à porta </w:t>
-      </w:r>
-      <w:r>
-        <w:rPr>
-          <w:rFonts w:eastAsia="Times New Roman" w:cs="Times New Roman" w:ascii="Garamond" w:hAnsi="Garamond"/>
-          <w:color w:val="000000"/>
-          <w:kern w:val="0"/>
-          <w:sz w:val="36"/>
-          <w:szCs w:val="36"/>
-          <w:shd w:fill="auto" w:val="clear"/>
-          <w:lang w:val="en-US" w:eastAsia="zh-CN" w:bidi="hi-IN"/>
-        </w:rPr>
-        <w:t>representa</w:t>
-      </w:r>
-      <w:r>
-        <w:rPr>
-          <w:rFonts w:eastAsia="Times New Roman" w:cs="Times New Roman" w:ascii="Garamond" w:hAnsi="Garamond"/>
-          <w:kern w:val="0"/>
-          <w:sz w:val="36"/>
-          <w:szCs w:val="36"/>
-          <w:shd w:fill="auto" w:val="clear"/>
-          <w:lang w:val="en-US" w:eastAsia="zh-CN" w:bidi="hi-IN"/>
-        </w:rPr>
-        <w:t xml:space="preserve"> os estímulos que recebemos da vida — nem sempre agradáveis — e que acabam nos impulsionando a buscar, dentro de nós mesmos, valores mais elevados. São as experiências, os desafios e até as dificuldades que nos levam a refletir, a olhar para dentro e a perceber aquilo que precisa mudar em nós.</w:t>
-      </w:r>
-    </w:p>
-    <w:p>
-      <w:pPr>
-        <w:pStyle w:val="Normal"/>
-        <w:jc w:val="both"/>
-        <w:rPr>
-          <w:rFonts w:ascii="Garamond" w:hAnsi="Garamond" w:eastAsia="Times New Roman" w:cs="Times New Roman"/>
-          <w:kern w:val="0"/>
-          <w:sz w:val="36"/>
-          <w:szCs w:val="36"/>
-          <w:shd w:fill="auto" w:val="clear"/>
-          <w:lang w:val="en-US" w:eastAsia="zh-CN" w:bidi="hi-IN"/>
-        </w:rPr>
-      </w:pPr>
-      <w:r>
-        <w:rPr>
-          <w:rFonts w:eastAsia="Times New Roman" w:cs="Times New Roman" w:ascii="Garamond" w:hAnsi="Garamond"/>
-          <w:kern w:val="0"/>
-          <w:sz w:val="36"/>
-          <w:szCs w:val="36"/>
-          <w:shd w:fill="auto" w:val="clear"/>
-          <w:lang w:val="en-US" w:eastAsia="zh-CN" w:bidi="hi-IN"/>
-        </w:rPr>
-      </w:r>
-    </w:p>
-    <w:p>
-      <w:pPr>
-        <w:pStyle w:val="Normal"/>
-        <w:jc w:val="both"/>
-        <w:rPr>
-          <w:color w:val="auto"/>
-        </w:rPr>
-      </w:pPr>
-      <w:r>
-        <w:rPr>
-          <w:rFonts w:eastAsia="Times New Roman" w:cs="Times New Roman" w:ascii="Garamond" w:hAnsi="Garamond"/>
-          <w:color w:val="000000"/>
-          <w:kern w:val="0"/>
-          <w:sz w:val="36"/>
-          <w:szCs w:val="36"/>
-          <w:shd w:fill="auto" w:val="clear"/>
-          <w:lang w:val="en-US" w:eastAsia="zh-CN" w:bidi="hi-IN"/>
-        </w:rPr>
-        <w:t>Por fim, há um ponto central nessa parábola: por maior que fosse a necessidade do homem que pedia os pães, ele não podia abrir a porta da casa</w:t>
-      </w:r>
-      <w:r>
-        <w:rPr>
-          <w:rFonts w:eastAsia="Times New Roman" w:cs="Times New Roman" w:ascii="Garamond" w:hAnsi="Garamond"/>
-          <w:color w:val="000000"/>
-          <w:kern w:val="0"/>
-          <w:sz w:val="36"/>
-          <w:szCs w:val="36"/>
-          <w:shd w:fill="auto" w:val="clear"/>
-          <w:lang w:val="en-US" w:eastAsia="zh-CN" w:bidi="hi-IN"/>
-        </w:rPr>
-        <w:t>: ela</w:t>
-      </w:r>
-      <w:r>
-        <w:rPr>
-          <w:rFonts w:eastAsia="Times New Roman" w:cs="Times New Roman" w:ascii="Garamond" w:hAnsi="Garamond"/>
-          <w:color w:val="000000"/>
-          <w:kern w:val="0"/>
-          <w:sz w:val="36"/>
-          <w:szCs w:val="36"/>
-          <w:shd w:fill="auto" w:val="clear"/>
-          <w:lang w:val="en-US" w:eastAsia="zh-CN" w:bidi="hi-IN"/>
-        </w:rPr>
-        <w:t xml:space="preserve"> só poderia ser aberta pelo lado de dentro. </w:t>
-      </w:r>
-    </w:p>
-    <w:p>
-      <w:pPr>
-        <w:pStyle w:val="Normal"/>
-        <w:jc w:val="both"/>
-        <w:rPr>
-          <w:color w:val="auto"/>
-        </w:rPr>
-      </w:pPr>
-      <w:r>
-        <w:rPr/>
-      </w:r>
-    </w:p>
-    <w:p>
-      <w:pPr>
-        <w:pStyle w:val="Normal"/>
-        <w:jc w:val="both"/>
-        <w:rPr>
-          <w:color w:val="auto"/>
-        </w:rPr>
-      </w:pPr>
-      <w:r>
-        <w:rPr>
-          <w:rFonts w:eastAsia="Times New Roman" w:cs="Times New Roman" w:ascii="Garamond" w:hAnsi="Garamond"/>
-          <w:color w:val="000000"/>
-          <w:kern w:val="0"/>
-          <w:sz w:val="36"/>
-          <w:szCs w:val="36"/>
-          <w:shd w:fill="auto" w:val="clear"/>
-          <w:lang w:val="en-US" w:eastAsia="zh-CN" w:bidi="hi-IN"/>
-        </w:rPr>
-        <w:t xml:space="preserve">Assim também acontece com a porta do nosso coração. Somente nós podemos abri-la e faremos isso quando decidirmos </w:t>
-      </w:r>
-      <w:r>
-        <w:rPr>
-          <w:rFonts w:eastAsia="Times New Roman" w:cs="Times New Roman" w:ascii="Garamond" w:hAnsi="Garamond"/>
-          <w:color w:val="000000"/>
-          <w:kern w:val="0"/>
-          <w:sz w:val="36"/>
-          <w:szCs w:val="36"/>
-          <w:shd w:fill="auto" w:val="clear"/>
-          <w:lang w:val="en-US" w:eastAsia="zh-CN" w:bidi="hi-IN"/>
-        </w:rPr>
-        <w:t>o chamado da nossa</w:t>
-      </w:r>
-      <w:r>
-        <w:rPr>
-          <w:rFonts w:eastAsia="Times New Roman" w:cs="Times New Roman" w:ascii="Garamond" w:hAnsi="Garamond"/>
-          <w:color w:val="000000"/>
-          <w:kern w:val="0"/>
-          <w:sz w:val="36"/>
-          <w:szCs w:val="36"/>
-          <w:shd w:fill="auto" w:val="clear"/>
-          <w:lang w:val="en-US" w:eastAsia="zh-CN" w:bidi="hi-IN"/>
-        </w:rPr>
-        <w:t xml:space="preserve"> consciência, que chega através da dor, do desequilíbrio, da doença ou da fome de pão espiritual.</w:t>
-      </w:r>
-    </w:p>
-    <w:p>
-      <w:pPr>
-        <w:pStyle w:val="Normal"/>
-        <w:jc w:val="both"/>
-        <w:rPr>
-          <w:rFonts w:ascii="Garamond" w:hAnsi="Garamond" w:eastAsia="Times New Roman" w:cs="Times New Roman"/>
-          <w:kern w:val="0"/>
-          <w:sz w:val="36"/>
-          <w:szCs w:val="36"/>
-          <w:shd w:fill="auto" w:val="clear"/>
-          <w:lang w:val="en-US" w:eastAsia="zh-CN" w:bidi="hi-IN"/>
-        </w:rPr>
-      </w:pPr>
-      <w:r>
-        <w:rPr>
-          <w:rFonts w:eastAsia="Times New Roman" w:cs="Times New Roman" w:ascii="Garamond" w:hAnsi="Garamond"/>
-          <w:kern w:val="0"/>
-          <w:sz w:val="36"/>
-          <w:szCs w:val="36"/>
-          <w:shd w:fill="auto" w:val="clear"/>
-          <w:lang w:val="en-US" w:eastAsia="zh-CN" w:bidi="hi-IN"/>
-        </w:rPr>
-      </w:r>
-    </w:p>
-    <w:p>
-      <w:pPr>
-        <w:pStyle w:val="Normal"/>
-        <w:jc w:val="both"/>
-        <w:rPr>
-          <w:color w:val="auto"/>
-        </w:rPr>
-      </w:pPr>
-      <w:r>
-        <w:rPr>
-          <w:rFonts w:eastAsia="Times New Roman" w:cs="Times New Roman" w:ascii="Garamond" w:hAnsi="Garamond"/>
-          <w:color w:val="000000"/>
-          <w:kern w:val="0"/>
-          <w:sz w:val="36"/>
-          <w:szCs w:val="36"/>
-          <w:shd w:fill="auto" w:val="clear"/>
-          <w:lang w:val="en-US" w:eastAsia="zh-CN" w:bidi="hi-IN"/>
-        </w:rPr>
-        <w:t xml:space="preserve">Portanto, essa parábola nos ensina </w:t>
-      </w:r>
-      <w:r>
-        <w:rPr>
-          <w:rFonts w:eastAsia="Times New Roman" w:cs="Times New Roman" w:ascii="Garamond" w:hAnsi="Garamond"/>
-          <w:color w:val="000000"/>
-          <w:kern w:val="0"/>
-          <w:sz w:val="36"/>
-          <w:szCs w:val="36"/>
-          <w:shd w:fill="auto" w:val="clear"/>
-          <w:lang w:val="en-US" w:eastAsia="zh-CN" w:bidi="hi-IN"/>
-        </w:rPr>
-        <w:t xml:space="preserve">a necessidade da prece constante — não uma prece mecânica, repetitiva ou interesseira, mas sincera, consciente e transformadora. </w:t>
+      </w:r>
+    </w:p>
+    <w:p>
+      <w:pPr>
+        <w:pStyle w:val="Normal"/>
+        <w:jc w:val="both"/>
+        <w:rPr>
+          <w:color w:val="auto"/>
+        </w:rPr>
+      </w:pPr>
+      <w:r>
+        <w:rPr>
+          <w:rFonts w:eastAsia="Times New Roman" w:cs="Times New Roman" w:ascii="Garamond" w:hAnsi="Garamond"/>
+          <w:color w:val="000000"/>
+          <w:kern w:val="0"/>
+          <w:sz w:val="36"/>
+          <w:szCs w:val="36"/>
+          <w:shd w:fill="auto" w:val="clear"/>
+          <w:lang w:val="en-US" w:eastAsia="zh-CN" w:bidi="hi-IN"/>
+        </w:rPr>
+        <w:t xml:space="preserve">Portanto, essa parábola nos ensina a necessidade da prece constante — não uma prece mecânica, repetitiva ou interesseira, mas sincera, consciente e transformadora. </w:t>
       </w:r>
     </w:p>
     <w:p>
@@ -1253,66 +1140,42 @@
           <w:shd w:fill="auto" w:val="clear"/>
           <w:lang w:val="en-US" w:eastAsia="zh-CN" w:bidi="hi-IN"/>
         </w:rPr>
-        <w:t xml:space="preserve"> está </w:t>
-      </w:r>
-      <w:r>
-        <w:rPr>
-          <w:rFonts w:eastAsia="Times New Roman" w:cs="Times New Roman" w:ascii="Garamond" w:hAnsi="Garamond"/>
-          <w:color w:val="000000"/>
-          <w:kern w:val="0"/>
-          <w:sz w:val="36"/>
-          <w:szCs w:val="36"/>
-          <w:shd w:fill="auto" w:val="clear"/>
-          <w:lang w:val="en-US" w:eastAsia="zh-CN" w:bidi="hi-IN"/>
-        </w:rPr>
-        <w:t xml:space="preserve">justamente </w:t>
-      </w:r>
-      <w:r>
-        <w:rPr>
-          <w:rFonts w:eastAsia="Times New Roman" w:cs="Times New Roman" w:ascii="Garamond" w:hAnsi="Garamond"/>
-          <w:color w:val="000000"/>
-          <w:kern w:val="0"/>
-          <w:sz w:val="36"/>
-          <w:szCs w:val="36"/>
-          <w:shd w:fill="auto" w:val="clear"/>
-          <w:lang w:val="en-US" w:eastAsia="zh-CN" w:bidi="hi-IN"/>
-        </w:rPr>
-        <w:t xml:space="preserve">na oração. </w:t>
-      </w:r>
-    </w:p>
-    <w:p>
-      <w:pPr>
-        <w:pStyle w:val="Normal"/>
-        <w:jc w:val="both"/>
-        <w:rPr>
-          <w:color w:val="1C99E0"/>
-        </w:rPr>
-      </w:pPr>
-      <w:r>
-        <w:rPr>
-          <w:color w:val="1C99E0"/>
-        </w:rPr>
-      </w:r>
-    </w:p>
-    <w:p>
-      <w:pPr>
-        <w:pStyle w:val="Normal"/>
-        <w:jc w:val="both"/>
-        <w:rPr>
-          <w:color w:val="auto"/>
-        </w:rPr>
-      </w:pPr>
-      <w:r>
-        <w:rPr>
-          <w:rFonts w:eastAsia="Times New Roman" w:cs="Times New Roman" w:ascii="Garamond" w:hAnsi="Garamond"/>
-          <w:color w:val="000000"/>
-          <w:kern w:val="0"/>
-          <w:sz w:val="36"/>
-          <w:szCs w:val="36"/>
-          <w:shd w:fill="auto" w:val="clear"/>
-          <w:lang w:val="en-US" w:eastAsia="zh-CN" w:bidi="hi-IN"/>
-        </w:rPr>
-        <w:t xml:space="preserve">Mas como deve ser a nossa oração? De que maneira  conseguimos efetivamente nos colocar em contato com Deus e Jesus? Eles sempre ouvem nossas preces? Podemos pedir qualquer coisa? </w:t>
+        <w:t xml:space="preserve"> está justamente na oração. </w:t>
+      </w:r>
+    </w:p>
+    <w:p>
+      <w:pPr>
+        <w:pStyle w:val="Normal"/>
+        <w:jc w:val="both"/>
+        <w:rPr>
+          <w:color w:val="auto"/>
+        </w:rPr>
+      </w:pPr>
+      <w:r>
+        <w:rPr>
+          <w:color w:val="auto"/>
+        </w:rPr>
+      </w:r>
+    </w:p>
+    <w:p>
+      <w:pPr>
+        <w:pStyle w:val="Normal"/>
+        <w:jc w:val="both"/>
+        <w:rPr>
+          <w:color w:val="auto"/>
+        </w:rPr>
+      </w:pPr>
+      <w:r>
+        <w:rPr>
+          <w:rFonts w:eastAsia="Times New Roman" w:cs="Times New Roman" w:ascii="Garamond" w:hAnsi="Garamond"/>
+          <w:color w:val="000000"/>
+          <w:kern w:val="0"/>
+          <w:sz w:val="36"/>
+          <w:szCs w:val="36"/>
+          <w:shd w:fill="auto" w:val="clear"/>
+          <w:lang w:val="en-US" w:eastAsia="zh-CN" w:bidi="hi-IN"/>
+        </w:rPr>
+        <w:t xml:space="preserve">E como deve ser a nossa oração? De que maneira  conseguimos efetivamente nos colocar em contato com Deus, Jesus e os planos mais altos da vida? Nossas preces sempre são ouvidas? Podemos pedir qualquer coisa? </w:t>
       </w:r>
     </w:p>
     <w:p>
@@ -1359,39 +1222,6 @@
         </w:rPr>
       </w:pPr>
       <w:r>
-        <w:rPr/>
-      </w:r>
-    </w:p>
-    <w:p>
-      <w:pPr>
-        <w:pStyle w:val="Normal"/>
-        <w:jc w:val="both"/>
-        <w:rPr>
-          <w:color w:val="C9211E"/>
-        </w:rPr>
-      </w:pPr>
-      <w:r>
-        <w:rPr>
-          <w:rFonts w:eastAsia="Times New Roman" w:cs="Times New Roman" w:ascii="Garamond" w:hAnsi="Garamond"/>
-          <w:color w:val="C9211E"/>
-          <w:kern w:val="0"/>
-          <w:sz w:val="36"/>
-          <w:szCs w:val="36"/>
-          <w:shd w:fill="auto" w:val="clear"/>
-          <w:lang w:val="en-US" w:eastAsia="zh-CN" w:bidi="hi-IN"/>
-        </w:rPr>
-        <w:t>[ Parei a revisão aqui em 06/03/2026 ]</w:t>
-      </w:r>
-    </w:p>
-    <w:p>
-      <w:pPr>
-        <w:pStyle w:val="Normal"/>
-        <w:jc w:val="both"/>
-        <w:rPr>
-          <w:color w:val="auto"/>
-        </w:rPr>
-      </w:pPr>
-      <w:r>
         <w:rPr>
           <w:color w:val="auto"/>
         </w:rPr>
@@ -1450,7 +1280,7 @@
           <w:shd w:fill="auto" w:val="clear"/>
           <w:lang w:val="en-US" w:eastAsia="zh-CN" w:bidi="hi-IN"/>
         </w:rPr>
-        <w:t>Primeiro ele nos traz o que Jesus diz em Mateus 6:5-8:</w:t>
+        <w:t>A primeira está em Mateus 6:5-8:</w:t>
       </w:r>
     </w:p>
     <w:p>
@@ -1629,93 +1459,7 @@
           <w:shd w:fill="auto" w:val="clear"/>
           <w:lang w:val="en-US" w:eastAsia="zh-CN" w:bidi="hi-IN"/>
         </w:rPr>
-        <w:t xml:space="preserve">Naturalmente que um ambiente silencioso e calmo favorece a oração, mas isso não significa que </w:t>
-      </w:r>
-      <w:r>
-        <w:rPr>
-          <w:rFonts w:eastAsia="Times New Roman" w:cs="Times New Roman" w:ascii="Garamond" w:hAnsi="Garamond"/>
-          <w:color w:val="000000"/>
-          <w:kern w:val="0"/>
-          <w:sz w:val="36"/>
-          <w:szCs w:val="36"/>
-          <w:shd w:fill="auto" w:val="clear"/>
-          <w:lang w:val="en-US" w:eastAsia="zh-CN" w:bidi="hi-IN"/>
-        </w:rPr>
-        <w:t>não podemos</w:t>
-      </w:r>
-      <w:r>
-        <w:rPr>
-          <w:rFonts w:eastAsia="Times New Roman" w:cs="Times New Roman" w:ascii="Garamond" w:hAnsi="Garamond"/>
-          <w:color w:val="000000"/>
-          <w:kern w:val="0"/>
-          <w:sz w:val="36"/>
-          <w:szCs w:val="36"/>
-          <w:shd w:fill="auto" w:val="clear"/>
-          <w:lang w:val="en-US" w:eastAsia="zh-CN" w:bidi="hi-IN"/>
-        </w:rPr>
-        <w:t xml:space="preserve"> alcançar a paz interior </w:t>
-      </w:r>
-      <w:r>
-        <w:rPr>
-          <w:rFonts w:eastAsia="Times New Roman" w:cs="Times New Roman" w:ascii="Garamond" w:hAnsi="Garamond"/>
-          <w:color w:val="000000"/>
-          <w:kern w:val="0"/>
-          <w:sz w:val="36"/>
-          <w:szCs w:val="36"/>
-          <w:shd w:fill="auto" w:val="clear"/>
-          <w:lang w:val="en-US" w:eastAsia="zh-CN" w:bidi="hi-IN"/>
-        </w:rPr>
-        <w:t>quando estamos</w:t>
-      </w:r>
-      <w:r>
-        <w:rPr>
-          <w:rFonts w:eastAsia="Times New Roman" w:cs="Times New Roman" w:ascii="Garamond" w:hAnsi="Garamond"/>
-          <w:color w:val="000000"/>
-          <w:kern w:val="0"/>
-          <w:sz w:val="36"/>
-          <w:szCs w:val="36"/>
-          <w:shd w:fill="auto" w:val="clear"/>
-          <w:lang w:val="en-US" w:eastAsia="zh-CN" w:bidi="hi-IN"/>
-        </w:rPr>
-        <w:t xml:space="preserve"> longe dos redutos de tranquilidade. Se fosse</w:t>
-      </w:r>
-      <w:r>
-        <w:rPr>
-          <w:rFonts w:eastAsia="Times New Roman" w:cs="Times New Roman" w:ascii="Garamond" w:hAnsi="Garamond"/>
-          <w:color w:val="000000"/>
-          <w:kern w:val="0"/>
-          <w:sz w:val="36"/>
-          <w:szCs w:val="36"/>
-          <w:shd w:fill="auto" w:val="clear"/>
-          <w:lang w:val="en-US" w:eastAsia="zh-CN" w:bidi="hi-IN"/>
-        </w:rPr>
-        <w:t xml:space="preserve"> assim</w:t>
-      </w:r>
-      <w:r>
-        <w:rPr>
-          <w:rFonts w:eastAsia="Times New Roman" w:cs="Times New Roman" w:ascii="Garamond" w:hAnsi="Garamond"/>
-          <w:color w:val="000000"/>
-          <w:kern w:val="0"/>
-          <w:sz w:val="36"/>
-          <w:szCs w:val="36"/>
-          <w:shd w:fill="auto" w:val="clear"/>
-          <w:lang w:val="en-US" w:eastAsia="zh-CN" w:bidi="hi-IN"/>
-        </w:rPr>
-        <w:t>, nossos momentos de oração seriam muito limitados.</w:t>
-      </w:r>
-    </w:p>
-    <w:p>
-      <w:pPr>
-        <w:pStyle w:val="Normal"/>
-        <w:jc w:val="both"/>
-        <w:rPr>
-          <w:color w:val="auto"/>
-        </w:rPr>
-      </w:pPr>
-      <w:r>
-        <w:rPr>
-          <w:color w:val="auto"/>
-        </w:rPr>
+        <w:t>Naturalmente que um ambiente silencioso e calmo favorece a oração, mas isso não significa que não podemos alcançar a paz interior quando estamos longe dos redutos de tranquilidade. Se fosse assim, nossos momentos de oração seriam muito limitados.</w:t>
       </w:r>
     </w:p>
     <w:p>
@@ -1785,374 +1529,147 @@
           <w:shd w:fill="auto" w:val="clear"/>
           <w:lang w:val="en-US" w:eastAsia="zh-CN" w:bidi="hi-IN"/>
         </w:rPr>
-        <w:t>De repente</w:t>
-      </w:r>
-      <w:r>
-        <w:rPr>
-          <w:rFonts w:eastAsia="Times New Roman" w:cs="Times New Roman" w:ascii="Garamond" w:hAnsi="Garamond"/>
-          <w:color w:val="000000"/>
-          <w:kern w:val="0"/>
-          <w:sz w:val="36"/>
-          <w:szCs w:val="36"/>
-          <w:shd w:fill="auto" w:val="clear"/>
-          <w:lang w:val="en-US" w:eastAsia="zh-CN" w:bidi="hi-IN"/>
-        </w:rPr>
-        <w:t>, recebo uma mensagem</w:t>
-      </w:r>
-      <w:r>
-        <w:rPr>
-          <w:rFonts w:eastAsia="Times New Roman" w:cs="Times New Roman" w:ascii="Garamond" w:hAnsi="Garamond"/>
-          <w:color w:val="000000"/>
-          <w:kern w:val="0"/>
-          <w:sz w:val="36"/>
-          <w:szCs w:val="36"/>
-          <w:shd w:fill="auto" w:val="clear"/>
-          <w:lang w:val="en-US" w:eastAsia="zh-CN" w:bidi="hi-IN"/>
-        </w:rPr>
-        <w:t xml:space="preserve"> informando que </w:t>
-      </w:r>
-      <w:r>
-        <w:rPr>
-          <w:rFonts w:eastAsia="Times New Roman" w:cs="Times New Roman" w:ascii="Garamond" w:hAnsi="Garamond"/>
-          <w:color w:val="000000"/>
-          <w:kern w:val="0"/>
-          <w:sz w:val="36"/>
-          <w:szCs w:val="36"/>
-          <w:shd w:fill="auto" w:val="clear"/>
-          <w:lang w:val="en-US" w:eastAsia="zh-CN" w:bidi="hi-IN"/>
-        </w:rPr>
-        <w:t>um grande amigo</w:t>
-      </w:r>
-      <w:r>
-        <w:rPr>
-          <w:rFonts w:eastAsia="Times New Roman" w:cs="Times New Roman" w:ascii="Garamond" w:hAnsi="Garamond"/>
-          <w:color w:val="000000"/>
-          <w:kern w:val="0"/>
-          <w:sz w:val="36"/>
-          <w:szCs w:val="36"/>
-          <w:shd w:fill="auto" w:val="clear"/>
-          <w:lang w:val="en-US" w:eastAsia="zh-CN" w:bidi="hi-IN"/>
-        </w:rPr>
-        <w:t xml:space="preserve"> sofreu um acidente grave e corre risco de morte. </w:t>
-      </w:r>
-    </w:p>
-    <w:p>
-      <w:pPr>
-        <w:pStyle w:val="Normal"/>
-        <w:jc w:val="both"/>
-        <w:rPr>
-          <w:color w:val="auto"/>
-        </w:rPr>
-      </w:pPr>
-      <w:r>
-        <w:rPr>
-          <w:color w:val="auto"/>
-        </w:rPr>
-      </w:r>
-    </w:p>
-    <w:p>
-      <w:pPr>
-        <w:pStyle w:val="Normal"/>
-        <w:jc w:val="both"/>
-        <w:rPr>
-          <w:color w:val="auto"/>
-        </w:rPr>
-      </w:pPr>
-      <w:r>
-        <w:rPr>
-          <w:rFonts w:eastAsia="Times New Roman" w:cs="Times New Roman" w:ascii="Garamond" w:hAnsi="Garamond"/>
-          <w:color w:val="000000"/>
-          <w:kern w:val="0"/>
-          <w:sz w:val="36"/>
-          <w:szCs w:val="36"/>
-          <w:shd w:fill="auto" w:val="clear"/>
-          <w:lang w:val="en-US" w:eastAsia="zh-CN" w:bidi="hi-IN"/>
-        </w:rPr>
-        <w:t>O lugar e a hora em que me encontro são os mais adequados para a prece? Definitivamente que não. Mas vou deixar de orar por aquel</w:t>
-      </w:r>
-      <w:r>
-        <w:rPr>
-          <w:rFonts w:eastAsia="Times New Roman" w:cs="Times New Roman" w:ascii="Garamond" w:hAnsi="Garamond"/>
-          <w:color w:val="000000"/>
-          <w:kern w:val="0"/>
-          <w:sz w:val="36"/>
-          <w:szCs w:val="36"/>
-          <w:shd w:fill="auto" w:val="clear"/>
-          <w:lang w:val="en-US" w:eastAsia="zh-CN" w:bidi="hi-IN"/>
-        </w:rPr>
-        <w:t>e amigo</w:t>
-      </w:r>
-      <w:r>
-        <w:rPr>
-          <w:rFonts w:eastAsia="Times New Roman" w:cs="Times New Roman" w:ascii="Garamond" w:hAnsi="Garamond"/>
-          <w:color w:val="000000"/>
-          <w:kern w:val="0"/>
-          <w:sz w:val="36"/>
-          <w:szCs w:val="36"/>
-          <w:shd w:fill="auto" w:val="clear"/>
-          <w:lang w:val="en-US" w:eastAsia="zh-CN" w:bidi="hi-IN"/>
-        </w:rPr>
-        <w:t xml:space="preserve"> querid</w:t>
-      </w:r>
-      <w:r>
-        <w:rPr>
-          <w:rFonts w:eastAsia="Times New Roman" w:cs="Times New Roman" w:ascii="Garamond" w:hAnsi="Garamond"/>
-          <w:color w:val="000000"/>
-          <w:kern w:val="0"/>
-          <w:sz w:val="36"/>
-          <w:szCs w:val="36"/>
-          <w:shd w:fill="auto" w:val="clear"/>
-          <w:lang w:val="en-US" w:eastAsia="zh-CN" w:bidi="hi-IN"/>
-        </w:rPr>
-        <w:t>o</w:t>
-      </w:r>
-      <w:r>
-        <w:rPr>
-          <w:rFonts w:eastAsia="Times New Roman" w:cs="Times New Roman" w:ascii="Garamond" w:hAnsi="Garamond"/>
-          <w:color w:val="000000"/>
-          <w:kern w:val="0"/>
-          <w:sz w:val="36"/>
-          <w:szCs w:val="36"/>
-          <w:shd w:fill="auto" w:val="clear"/>
-          <w:lang w:val="en-US" w:eastAsia="zh-CN" w:bidi="hi-IN"/>
-        </w:rPr>
-        <w:t xml:space="preserve"> só porque não estou em um ambiente </w:t>
-      </w:r>
-      <w:r>
-        <w:rPr>
-          <w:rFonts w:eastAsia="Times New Roman" w:cs="Times New Roman" w:ascii="Garamond" w:hAnsi="Garamond"/>
-          <w:color w:val="000000"/>
-          <w:kern w:val="0"/>
-          <w:sz w:val="36"/>
-          <w:szCs w:val="36"/>
-          <w:shd w:fill="auto" w:val="clear"/>
-          <w:lang w:val="en-US" w:eastAsia="zh-CN" w:bidi="hi-IN"/>
-        </w:rPr>
-        <w:t>adequado</w:t>
-      </w:r>
-      <w:r>
-        <w:rPr>
-          <w:rFonts w:eastAsia="Times New Roman" w:cs="Times New Roman" w:ascii="Garamond" w:hAnsi="Garamond"/>
-          <w:color w:val="000000"/>
-          <w:kern w:val="0"/>
-          <w:sz w:val="36"/>
-          <w:szCs w:val="36"/>
-          <w:shd w:fill="auto" w:val="clear"/>
-          <w:lang w:val="en-US" w:eastAsia="zh-CN" w:bidi="hi-IN"/>
-        </w:rPr>
-        <w:t xml:space="preserve"> à oração? De maneira alguma. </w:t>
-      </w:r>
-    </w:p>
-    <w:p>
-      <w:pPr>
-        <w:pStyle w:val="Normal"/>
-        <w:jc w:val="both"/>
-        <w:rPr>
-          <w:color w:val="auto"/>
-        </w:rPr>
-      </w:pPr>
-      <w:r>
-        <w:rPr>
-          <w:color w:val="auto"/>
-        </w:rPr>
-      </w:r>
-    </w:p>
-    <w:p>
-      <w:pPr>
-        <w:pStyle w:val="Normal"/>
-        <w:jc w:val="both"/>
-        <w:rPr>
-          <w:color w:val="auto"/>
-        </w:rPr>
-      </w:pPr>
-      <w:r>
-        <w:rPr>
-          <w:rFonts w:eastAsia="Times New Roman" w:cs="Times New Roman" w:ascii="Garamond" w:hAnsi="Garamond"/>
-          <w:color w:val="000000"/>
-          <w:kern w:val="0"/>
-          <w:sz w:val="36"/>
-          <w:szCs w:val="36"/>
-          <w:shd w:fill="auto" w:val="clear"/>
-          <w:lang w:val="en-US" w:eastAsia="zh-CN" w:bidi="hi-IN"/>
-        </w:rPr>
-        <w:t>Eu posso e devo orar ali mesmo, naquelas condições. Com algum esforço da minha parte consigo me abstrair do tumulto à minha volta e elevar a Deus, a Jesus e à</w:t>
-      </w:r>
-      <w:r>
-        <w:rPr>
-          <w:rFonts w:eastAsia="Times New Roman" w:cs="Times New Roman" w:ascii="Garamond" w:hAnsi="Garamond"/>
-          <w:color w:val="000000"/>
-          <w:kern w:val="0"/>
-          <w:sz w:val="36"/>
-          <w:szCs w:val="36"/>
-          <w:shd w:fill="auto" w:val="clear"/>
-          <w:lang w:val="en-US" w:eastAsia="zh-CN" w:bidi="hi-IN"/>
-        </w:rPr>
-        <w:t xml:space="preserve"> Espiritualidade amiga</w:t>
-      </w:r>
-      <w:r>
-        <w:rPr>
-          <w:rFonts w:eastAsia="Times New Roman" w:cs="Times New Roman" w:ascii="Garamond" w:hAnsi="Garamond"/>
-          <w:color w:val="000000"/>
-          <w:kern w:val="0"/>
-          <w:sz w:val="36"/>
-          <w:szCs w:val="36"/>
-          <w:shd w:fill="auto" w:val="clear"/>
-          <w:lang w:val="en-US" w:eastAsia="zh-CN" w:bidi="hi-IN"/>
-        </w:rPr>
-        <w:t xml:space="preserve"> minhas rogativas em favor do amigo acidentado.</w:t>
-      </w:r>
-    </w:p>
-    <w:p>
-      <w:pPr>
-        <w:pStyle w:val="Normal"/>
-        <w:jc w:val="both"/>
-        <w:rPr>
-          <w:color w:val="auto"/>
-        </w:rPr>
-      </w:pPr>
-      <w:r>
-        <w:rPr>
-          <w:color w:val="auto"/>
-        </w:rPr>
-      </w:r>
-    </w:p>
-    <w:p>
-      <w:pPr>
-        <w:pStyle w:val="Normal"/>
-        <w:jc w:val="both"/>
-        <w:rPr>
-          <w:color w:val="auto"/>
-        </w:rPr>
-      </w:pPr>
-      <w:r>
-        <w:rPr>
-          <w:rFonts w:eastAsia="Times New Roman" w:cs="Times New Roman" w:ascii="Garamond" w:hAnsi="Garamond"/>
-          <w:color w:val="000000"/>
-          <w:kern w:val="0"/>
-          <w:sz w:val="36"/>
-          <w:szCs w:val="36"/>
-          <w:shd w:fill="auto" w:val="clear"/>
-          <w:lang w:val="en-US" w:eastAsia="zh-CN" w:bidi="hi-IN"/>
-        </w:rPr>
-        <w:t>Mais tarde, quando eu já estiver na tranquilidade do meu lar, eu oro novamente em condições mais adequadas, mas não devo prescindir da prece enquanto eu ainda estou no ônibus.</w:t>
-      </w:r>
-    </w:p>
-    <w:p>
-      <w:pPr>
-        <w:pStyle w:val="Normal"/>
-        <w:jc w:val="both"/>
-        <w:rPr>
-          <w:color w:val="auto"/>
-        </w:rPr>
-      </w:pPr>
-      <w:r>
-        <w:rPr>
-          <w:color w:val="auto"/>
-        </w:rPr>
-      </w:r>
-    </w:p>
-    <w:p>
-      <w:pPr>
-        <w:pStyle w:val="Normal"/>
-        <w:jc w:val="both"/>
-        <w:rPr>
-          <w:color w:val="auto"/>
-        </w:rPr>
-      </w:pPr>
-      <w:r>
-        <w:rPr>
-          <w:rFonts w:eastAsia="Times New Roman" w:cs="Times New Roman" w:ascii="Garamond" w:hAnsi="Garamond"/>
-          <w:color w:val="000000"/>
-          <w:kern w:val="0"/>
-          <w:sz w:val="36"/>
-          <w:szCs w:val="36"/>
-          <w:shd w:fill="auto" w:val="clear"/>
-          <w:lang w:val="en-US" w:eastAsia="zh-CN" w:bidi="hi-IN"/>
-        </w:rPr>
-        <w:t xml:space="preserve">Então, ao dizer que devemos orar em secreto no nosso quarto, Jesus está nos dando uma recomendação clara e direta com relação à sinceridade e ao recolhimento que devem existir </w:t>
-      </w:r>
-      <w:r>
-        <w:rPr>
-          <w:rFonts w:eastAsia="Times New Roman" w:cs="Times New Roman" w:ascii="Garamond" w:hAnsi="Garamond"/>
-          <w:color w:val="000000"/>
-          <w:kern w:val="0"/>
-          <w:sz w:val="36"/>
-          <w:szCs w:val="36"/>
-          <w:shd w:fill="auto" w:val="clear"/>
-          <w:lang w:val="en-US" w:eastAsia="zh-CN" w:bidi="hi-IN"/>
-        </w:rPr>
-        <w:t xml:space="preserve">em todos os que querem </w:t>
-      </w:r>
-      <w:r>
-        <w:rPr>
-          <w:rFonts w:eastAsia="Times New Roman" w:cs="Times New Roman" w:ascii="Garamond" w:hAnsi="Garamond"/>
-          <w:color w:val="000000"/>
-          <w:kern w:val="0"/>
-          <w:sz w:val="36"/>
-          <w:szCs w:val="36"/>
-          <w:shd w:fill="auto" w:val="clear"/>
-          <w:lang w:val="en-US" w:eastAsia="zh-CN" w:bidi="hi-IN"/>
-        </w:rPr>
-        <w:t xml:space="preserve">se colocar em sintonia com os planos mais altos da vida, </w:t>
-      </w:r>
-      <w:r>
-        <w:rPr>
-          <w:rFonts w:eastAsia="Times New Roman" w:cs="Times New Roman" w:ascii="Garamond" w:hAnsi="Garamond"/>
-          <w:color w:val="000000"/>
-          <w:kern w:val="0"/>
-          <w:sz w:val="36"/>
-          <w:szCs w:val="36"/>
-          <w:shd w:fill="auto" w:val="clear"/>
-          <w:lang w:val="en-US" w:eastAsia="zh-CN" w:bidi="hi-IN"/>
-        </w:rPr>
-        <w:t>sem que para isso estejamos em</w:t>
-      </w:r>
-      <w:r>
-        <w:rPr>
-          <w:rFonts w:eastAsia="Times New Roman" w:cs="Times New Roman" w:ascii="Garamond" w:hAnsi="Garamond"/>
-          <w:color w:val="000000"/>
-          <w:kern w:val="0"/>
-          <w:sz w:val="36"/>
-          <w:szCs w:val="36"/>
-          <w:shd w:fill="auto" w:val="clear"/>
-          <w:lang w:val="en-US" w:eastAsia="zh-CN" w:bidi="hi-IN"/>
-        </w:rPr>
-        <w:t xml:space="preserve"> um lugar silencioso e isolado.</w:t>
-      </w:r>
-    </w:p>
-    <w:p>
-      <w:pPr>
-        <w:pStyle w:val="Normal"/>
-        <w:jc w:val="both"/>
-        <w:rPr>
-          <w:color w:val="auto"/>
-        </w:rPr>
-      </w:pPr>
-      <w:r>
-        <w:rPr>
-          <w:color w:val="auto"/>
-        </w:rPr>
-      </w:r>
-    </w:p>
-    <w:p>
-      <w:pPr>
-        <w:pStyle w:val="Normal"/>
-        <w:jc w:val="both"/>
-        <w:rPr>
-          <w:color w:val="auto"/>
-        </w:rPr>
-      </w:pPr>
-      <w:r>
-        <w:rPr>
-          <w:rFonts w:eastAsia="Times New Roman" w:cs="Times New Roman" w:ascii="Garamond" w:hAnsi="Garamond"/>
-          <w:color w:val="000000"/>
-          <w:kern w:val="0"/>
-          <w:sz w:val="36"/>
-          <w:szCs w:val="36"/>
-          <w:shd w:fill="auto" w:val="clear"/>
-          <w:lang w:val="en-US" w:eastAsia="zh-CN" w:bidi="hi-IN"/>
-        </w:rPr>
-        <w:t xml:space="preserve">A partir do momento em que tomamos consciência disso, a oração passa a ser um recurso ainda mais valioso para nós. </w:t>
+        <w:t xml:space="preserve">De repente, recebo uma mensagem informando que um grande amigo sofreu um acidente grave e corre risco de morte. </w:t>
+      </w:r>
+    </w:p>
+    <w:p>
+      <w:pPr>
+        <w:pStyle w:val="Normal"/>
+        <w:jc w:val="both"/>
+        <w:rPr>
+          <w:color w:val="auto"/>
+        </w:rPr>
+      </w:pPr>
+      <w:r>
+        <w:rPr>
+          <w:color w:val="auto"/>
+        </w:rPr>
+      </w:r>
+    </w:p>
+    <w:p>
+      <w:pPr>
+        <w:pStyle w:val="Normal"/>
+        <w:jc w:val="both"/>
+        <w:rPr>
+          <w:color w:val="auto"/>
+        </w:rPr>
+      </w:pPr>
+      <w:r>
+        <w:rPr>
+          <w:rFonts w:eastAsia="Times New Roman" w:cs="Times New Roman" w:ascii="Garamond" w:hAnsi="Garamond"/>
+          <w:color w:val="000000"/>
+          <w:kern w:val="0"/>
+          <w:sz w:val="36"/>
+          <w:szCs w:val="36"/>
+          <w:shd w:fill="auto" w:val="clear"/>
+          <w:lang w:val="en-US" w:eastAsia="zh-CN" w:bidi="hi-IN"/>
+        </w:rPr>
+        <w:t xml:space="preserve">O lugar e a hora em que me encontro são os mais adequados para a prece? Definitivamente que não. Mas vou deixar de orar por aquele amigo querido só porque não estou em um ambiente adequado à oração? De maneira alguma. </w:t>
+      </w:r>
+    </w:p>
+    <w:p>
+      <w:pPr>
+        <w:pStyle w:val="Normal"/>
+        <w:jc w:val="both"/>
+        <w:rPr>
+          <w:color w:val="auto"/>
+        </w:rPr>
+      </w:pPr>
+      <w:r>
+        <w:rPr>
+          <w:color w:val="auto"/>
+        </w:rPr>
+      </w:r>
+    </w:p>
+    <w:p>
+      <w:pPr>
+        <w:pStyle w:val="Normal"/>
+        <w:jc w:val="both"/>
+        <w:rPr>
+          <w:color w:val="auto"/>
+        </w:rPr>
+      </w:pPr>
+      <w:r>
+        <w:rPr>
+          <w:rFonts w:eastAsia="Times New Roman" w:cs="Times New Roman" w:ascii="Garamond" w:hAnsi="Garamond"/>
+          <w:color w:val="000000"/>
+          <w:kern w:val="0"/>
+          <w:sz w:val="36"/>
+          <w:szCs w:val="36"/>
+          <w:shd w:fill="auto" w:val="clear"/>
+          <w:lang w:val="en-US" w:eastAsia="zh-CN" w:bidi="hi-IN"/>
+        </w:rPr>
+        <w:t>Eu posso e devo orar ali mesmo, naquelas condições. Com algum esforço da minha parte consigo me abstrair do tumulto à minha volta e elevar a Deus, a Jesus e à Espiritualidade amiga minhas rogativas em favor do amigo acidentado.</w:t>
+      </w:r>
+    </w:p>
+    <w:p>
+      <w:pPr>
+        <w:pStyle w:val="Normal"/>
+        <w:jc w:val="both"/>
+        <w:rPr>
+          <w:color w:val="auto"/>
+        </w:rPr>
+      </w:pPr>
+      <w:r>
+        <w:rPr>
+          <w:color w:val="auto"/>
+        </w:rPr>
+      </w:r>
+    </w:p>
+    <w:p>
+      <w:pPr>
+        <w:pStyle w:val="Normal"/>
+        <w:jc w:val="both"/>
+        <w:rPr>
+          <w:color w:val="auto"/>
+        </w:rPr>
+      </w:pPr>
+      <w:r>
+        <w:rPr>
+          <w:rFonts w:eastAsia="Times New Roman" w:cs="Times New Roman" w:ascii="Garamond" w:hAnsi="Garamond"/>
+          <w:color w:val="000000"/>
+          <w:kern w:val="0"/>
+          <w:sz w:val="36"/>
+          <w:szCs w:val="36"/>
+          <w:shd w:fill="auto" w:val="clear"/>
+          <w:lang w:val="en-US" w:eastAsia="zh-CN" w:bidi="hi-IN"/>
+        </w:rPr>
+        <w:t>Mais tarde, quando eu já estiver na tranquilidade do meu lar, eu oro novamente em condições mais favoráveis, mas não devo prescindir da prece enquanto eu ainda estou no ônibus.</w:t>
+      </w:r>
+    </w:p>
+    <w:p>
+      <w:pPr>
+        <w:pStyle w:val="Normal"/>
+        <w:jc w:val="both"/>
+        <w:rPr>
+          <w:color w:val="auto"/>
+        </w:rPr>
+      </w:pPr>
+      <w:r>
+        <w:rPr>
+          <w:color w:val="auto"/>
+        </w:rPr>
+      </w:r>
+    </w:p>
+    <w:p>
+      <w:pPr>
+        <w:pStyle w:val="Normal"/>
+        <w:jc w:val="both"/>
+        <w:rPr>
+          <w:color w:val="auto"/>
+        </w:rPr>
+      </w:pPr>
+      <w:r>
+        <w:rPr>
+          <w:rFonts w:eastAsia="Times New Roman" w:cs="Times New Roman" w:ascii="Garamond" w:hAnsi="Garamond"/>
+          <w:color w:val="000000"/>
+          <w:kern w:val="0"/>
+          <w:sz w:val="36"/>
+          <w:szCs w:val="36"/>
+          <w:shd w:fill="auto" w:val="clear"/>
+          <w:lang w:val="en-US" w:eastAsia="zh-CN" w:bidi="hi-IN"/>
+        </w:rPr>
+        <w:t>Então, ao dizer que devemos orar em secreto no nosso quarto, Jesus está se referindo à sinceridade e ao recolhimento necessários para nos colocarmos em sintonia com os planos mais altos da vida, sem que obrigatoriamente estejamos em um local silencioso e isolado.</w:t>
       </w:r>
     </w:p>
     <w:p>
@@ -2172,6 +1689,39 @@
         <w:pStyle w:val="Normal"/>
         <w:jc w:val="both"/>
         <w:rPr>
+          <w:color w:val="auto"/>
+        </w:rPr>
+      </w:pPr>
+      <w:r>
+        <w:rPr>
+          <w:rFonts w:eastAsia="Times New Roman" w:cs="Times New Roman" w:ascii="Garamond" w:hAnsi="Garamond"/>
+          <w:color w:val="000000"/>
+          <w:kern w:val="0"/>
+          <w:sz w:val="36"/>
+          <w:szCs w:val="36"/>
+          <w:shd w:fill="auto" w:val="clear"/>
+          <w:lang w:val="en-US" w:eastAsia="zh-CN" w:bidi="hi-IN"/>
+        </w:rPr>
+        <w:t xml:space="preserve">Quando tomamos consciência disso, a oração passa a ser um valioso recurso que podemos utilizar a toda hora e em qualquer lugar. </w:t>
+      </w:r>
+    </w:p>
+    <w:p>
+      <w:pPr>
+        <w:pStyle w:val="Normal"/>
+        <w:jc w:val="both"/>
+        <w:rPr>
+          <w:color w:val="auto"/>
+        </w:rPr>
+      </w:pPr>
+      <w:r>
+        <w:rPr/>
+      </w:r>
+    </w:p>
+    <w:p>
+      <w:pPr>
+        <w:pStyle w:val="Normal"/>
+        <w:jc w:val="both"/>
+        <w:rPr>
           <w:highlight w:val="none"/>
           <w:shd w:fill="auto" w:val="clear"/>
         </w:rPr>
@@ -2186,839 +1736,856 @@
           <w:shd w:fill="auto" w:val="clear"/>
           <w:lang w:val="en-US" w:eastAsia="zh-CN" w:bidi="hi-IN"/>
         </w:rPr>
-        <w:t>Então, quando nós nos depararmos com aquele irmão caído nas calçadas sob o efeito de álcool ou drogas, em vez de lançar sobre ele um olhar de condenação, podemos orar por ele pedindo, por exemplo, que Deus dê forças àquele irmão para superar seus vícios</w:t>
-      </w:r>
-      <w:r>
-        <w:rPr>
-          <w:rFonts w:eastAsia="Times New Roman" w:cs="Times New Roman" w:ascii="Garamond" w:hAnsi="Garamond"/>
-          <w:color w:val="000000"/>
-          <w:kern w:val="0"/>
-          <w:sz w:val="36"/>
-          <w:szCs w:val="36"/>
-          <w:shd w:fill="auto" w:val="clear"/>
-          <w:lang w:val="en-US" w:eastAsia="zh-CN" w:bidi="hi-IN"/>
-        </w:rPr>
-        <w:t>, suas dificuldades</w:t>
-      </w:r>
-      <w:r>
-        <w:rPr>
-          <w:rFonts w:eastAsia="Times New Roman" w:cs="Times New Roman" w:ascii="Garamond" w:hAnsi="Garamond"/>
-          <w:color w:val="000000"/>
-          <w:kern w:val="0"/>
-          <w:sz w:val="36"/>
-          <w:szCs w:val="36"/>
-          <w:shd w:fill="auto" w:val="clear"/>
-          <w:lang w:val="en-US" w:eastAsia="zh-CN" w:bidi="hi-IN"/>
-        </w:rPr>
-        <w:t xml:space="preserve"> e mudar sua conduta de vida.</w:t>
-      </w:r>
-    </w:p>
-    <w:p>
-      <w:pPr>
-        <w:pStyle w:val="Normal"/>
-        <w:jc w:val="both"/>
-        <w:rPr>
-          <w:color w:val="auto"/>
-        </w:rPr>
-      </w:pPr>
-      <w:r>
-        <w:rPr>
-          <w:color w:val="auto"/>
-        </w:rPr>
-      </w:r>
-    </w:p>
-    <w:p>
-      <w:pPr>
-        <w:pStyle w:val="Normal"/>
-        <w:jc w:val="both"/>
-        <w:rPr>
-          <w:color w:val="auto"/>
-        </w:rPr>
-      </w:pPr>
-      <w:r>
-        <w:rPr>
-          <w:rFonts w:eastAsia="Times New Roman" w:cs="Times New Roman" w:ascii="Garamond" w:hAnsi="Garamond"/>
-          <w:color w:val="000000"/>
-          <w:kern w:val="0"/>
-          <w:sz w:val="36"/>
-          <w:szCs w:val="36"/>
-          <w:shd w:fill="auto" w:val="clear"/>
-          <w:lang w:val="en-US" w:eastAsia="zh-CN" w:bidi="hi-IN"/>
-        </w:rPr>
-        <w:t>Quando estivermos dirigindo e presenciarmos um acidente, também podemos orar pelas pessoas envolvidas naquele acidente.</w:t>
-      </w:r>
-    </w:p>
-    <w:p>
-      <w:pPr>
-        <w:pStyle w:val="Normal"/>
-        <w:jc w:val="both"/>
-        <w:rPr>
-          <w:color w:val="auto"/>
-        </w:rPr>
-      </w:pPr>
-      <w:r>
-        <w:rPr>
-          <w:color w:val="auto"/>
-        </w:rPr>
-      </w:r>
-    </w:p>
-    <w:p>
-      <w:pPr>
-        <w:pStyle w:val="Normal"/>
-        <w:jc w:val="both"/>
-        <w:rPr>
-          <w:color w:val="auto"/>
-        </w:rPr>
-      </w:pPr>
-      <w:r>
-        <w:rPr>
-          <w:rFonts w:eastAsia="Times New Roman" w:cs="Times New Roman" w:ascii="Garamond" w:hAnsi="Garamond"/>
-          <w:color w:val="000000"/>
-          <w:kern w:val="0"/>
-          <w:sz w:val="36"/>
-          <w:szCs w:val="36"/>
-          <w:shd w:fill="auto" w:val="clear"/>
-          <w:lang w:val="en-US" w:eastAsia="zh-CN" w:bidi="hi-IN"/>
-        </w:rPr>
-        <w:t>Eu tenho muita dificuldade em compreender a curiosidade mórbida que muitos têm em ver vítimas feridas ou mortas em acidentes. Já repararam que quando acontece um acidente de trânsito em uma pista, a outra também fica com o trânsito lento? É porque as pessoas dirigindo em sentido contrário reduzem a velocidade para ver o que aconteceu.</w:t>
-      </w:r>
-    </w:p>
-    <w:p>
-      <w:pPr>
-        <w:pStyle w:val="Normal"/>
-        <w:jc w:val="both"/>
-        <w:rPr>
-          <w:color w:val="auto"/>
-        </w:rPr>
-      </w:pPr>
-      <w:r>
-        <w:rPr>
-          <w:color w:val="auto"/>
-        </w:rPr>
-      </w:r>
-    </w:p>
-    <w:p>
-      <w:pPr>
-        <w:pStyle w:val="Normal"/>
-        <w:jc w:val="both"/>
-        <w:rPr>
-          <w:color w:val="auto"/>
-        </w:rPr>
-      </w:pPr>
-      <w:r>
-        <w:rPr>
-          <w:rFonts w:eastAsia="Times New Roman" w:cs="Times New Roman" w:ascii="Garamond" w:hAnsi="Garamond"/>
-          <w:color w:val="000000"/>
-          <w:kern w:val="0"/>
-          <w:sz w:val="36"/>
-          <w:szCs w:val="36"/>
-          <w:shd w:fill="auto" w:val="clear"/>
-          <w:lang w:val="en-US" w:eastAsia="zh-CN" w:bidi="hi-IN"/>
-        </w:rPr>
-        <w:t>Se ainda carregamos esse tipo de curiosidade conosco, vamos mudar de postura. Em vez de querer ver o que aconteceu, elevemos um pensamento a Deus, pedindo socorro para os feridos e amparo aos que desencarnaram. Fazemos essa oração e seguimos nosso caminho.</w:t>
-      </w:r>
-    </w:p>
-    <w:p>
-      <w:pPr>
-        <w:pStyle w:val="Normal"/>
-        <w:jc w:val="both"/>
-        <w:rPr>
-          <w:color w:val="auto"/>
-        </w:rPr>
-      </w:pPr>
-      <w:r>
-        <w:rPr>
-          <w:color w:val="auto"/>
-        </w:rPr>
-      </w:r>
-    </w:p>
-    <w:p>
-      <w:pPr>
-        <w:pStyle w:val="Normal"/>
-        <w:jc w:val="both"/>
-        <w:rPr>
-          <w:color w:val="auto"/>
-        </w:rPr>
-      </w:pPr>
-      <w:r>
-        <w:rPr>
-          <w:rFonts w:eastAsia="Times New Roman" w:cs="Times New Roman" w:ascii="Garamond" w:hAnsi="Garamond"/>
-          <w:color w:val="000000"/>
-          <w:kern w:val="0"/>
-          <w:sz w:val="36"/>
-          <w:szCs w:val="36"/>
-          <w:shd w:fill="auto" w:val="clear"/>
-          <w:lang w:val="en-US" w:eastAsia="zh-CN" w:bidi="hi-IN"/>
-        </w:rPr>
-        <w:t>Retornando à passagem evangélica que estamos analisando, Jesus nos diz para não orarmos como os pagãos, que pensam que é pela quantidade de palavras que suas preces serão ouvidas.</w:t>
-      </w:r>
-      <w:r>
-        <w:rPr>
-          <w:rFonts w:eastAsia="Times New Roman" w:cs="Times New Roman" w:ascii="Garamond" w:hAnsi="Garamond"/>
-          <w:color w:val="000000"/>
-          <w:kern w:val="0"/>
-          <w:sz w:val="36"/>
-          <w:szCs w:val="36"/>
-          <w:shd w:fill="auto" w:val="clear"/>
-          <w:lang w:val="en-US" w:eastAsia="zh-CN" w:bidi="hi-IN"/>
-        </w:rPr>
-        <w:t xml:space="preserve"> </w:t>
-      </w:r>
-      <w:r>
-        <w:rPr>
-          <w:rFonts w:eastAsia="Times New Roman" w:cs="Times New Roman" w:ascii="Garamond" w:hAnsi="Garamond"/>
-          <w:color w:val="000000"/>
-          <w:kern w:val="0"/>
-          <w:sz w:val="36"/>
-          <w:szCs w:val="36"/>
-          <w:shd w:fill="auto" w:val="clear"/>
-          <w:lang w:val="en-US" w:eastAsia="zh-CN" w:bidi="hi-IN"/>
-        </w:rPr>
-        <w:t>O Mestre diz ainda que Deus sabe do que precisamos antes mesmo de o perdirmos.</w:t>
-      </w:r>
-    </w:p>
-    <w:p>
-      <w:pPr>
-        <w:pStyle w:val="Normal"/>
-        <w:jc w:val="both"/>
-        <w:rPr>
-          <w:color w:val="auto"/>
-        </w:rPr>
-      </w:pPr>
-      <w:r>
-        <w:rPr>
-          <w:color w:val="auto"/>
-        </w:rPr>
-      </w:r>
-    </w:p>
-    <w:p>
-      <w:pPr>
-        <w:pStyle w:val="Normal"/>
-        <w:jc w:val="both"/>
-        <w:rPr>
-          <w:color w:val="auto"/>
-        </w:rPr>
-      </w:pPr>
-      <w:r>
-        <w:rPr>
-          <w:rFonts w:eastAsia="Times New Roman" w:cs="Times New Roman" w:ascii="Garamond" w:hAnsi="Garamond"/>
-          <w:color w:val="000000"/>
-          <w:kern w:val="0"/>
-          <w:sz w:val="36"/>
-          <w:szCs w:val="36"/>
-          <w:shd w:fill="auto" w:val="clear"/>
-          <w:lang w:val="en-US" w:eastAsia="zh-CN" w:bidi="hi-IN"/>
-        </w:rPr>
-        <w:t>Quem eram os pagãos a quem Jesus se refere? Eles eram principalmente os povos gentios do mundo greco-romano — isto é, aqueles que não pertenciam à tradição judaica e seguiam religiões politeístas comuns no Império Romano. Nessas práticas religiosas, era frequente a repetição longa de fórmulas e invocações, porque muitos acreditavam que a divindade poderia ser convencida ou constrangida pela multiplicidade das palavras, como se o poder estivesse na quantidade ou na exatidão da expressão verbal.</w:t>
-      </w:r>
-    </w:p>
-    <w:p>
-      <w:pPr>
-        <w:pStyle w:val="Normal"/>
-        <w:jc w:val="both"/>
-        <w:rPr>
-          <w:color w:val="auto"/>
-        </w:rPr>
-      </w:pPr>
-      <w:r>
-        <w:rPr>
-          <w:color w:val="auto"/>
-        </w:rPr>
-      </w:r>
-    </w:p>
-    <w:p>
-      <w:pPr>
-        <w:pStyle w:val="Normal"/>
-        <w:jc w:val="both"/>
-        <w:rPr>
-          <w:color w:val="auto"/>
-        </w:rPr>
-      </w:pPr>
-      <w:r>
-        <w:rPr>
-          <w:rFonts w:eastAsia="Times New Roman" w:cs="Times New Roman" w:ascii="Garamond" w:hAnsi="Garamond"/>
-          <w:color w:val="000000"/>
-          <w:kern w:val="0"/>
-          <w:sz w:val="36"/>
-          <w:szCs w:val="36"/>
-          <w:shd w:fill="auto" w:val="clear"/>
-          <w:lang w:val="en-US" w:eastAsia="zh-CN" w:bidi="hi-IN"/>
-        </w:rPr>
-        <w:t xml:space="preserve">Ao fazer essa advertência, Jesus não condena a perseverança na prece, mas corrige a mentalidade mágica e mecânica. Ele nos recorda que o Pai já sabe do que necessitamos antes mesmo que peçamos. A oração, portanto, não é instrumento de pressão sobre Deus, mas caminho de transformação interior. </w:t>
-      </w:r>
-    </w:p>
-    <w:p>
-      <w:pPr>
-        <w:pStyle w:val="Normal"/>
-        <w:jc w:val="both"/>
-        <w:rPr>
-          <w:color w:val="auto"/>
-        </w:rPr>
-      </w:pPr>
-      <w:r>
-        <w:rPr>
-          <w:color w:val="auto"/>
-        </w:rPr>
-      </w:r>
-    </w:p>
-    <w:p>
-      <w:pPr>
-        <w:pStyle w:val="Normal"/>
-        <w:jc w:val="both"/>
-        <w:rPr>
-          <w:color w:val="auto"/>
-        </w:rPr>
-      </w:pPr>
-      <w:r>
-        <w:rPr>
-          <w:rFonts w:eastAsia="Times New Roman" w:cs="Times New Roman" w:ascii="Garamond" w:hAnsi="Garamond"/>
-          <w:color w:val="000000"/>
-          <w:kern w:val="0"/>
-          <w:sz w:val="36"/>
-          <w:szCs w:val="36"/>
-          <w:shd w:fill="auto" w:val="clear"/>
-          <w:lang w:val="en-US" w:eastAsia="zh-CN" w:bidi="hi-IN"/>
-        </w:rPr>
-        <w:t>Quando Jesus nos alerta contra as vãs repetições, Ele nos convida a substituir o automatismo pela sinceridade, a quantidade pela qualidade e a palavra vazia pelo sentimento verdadeiro.</w:t>
-      </w:r>
-    </w:p>
-    <w:p>
-      <w:pPr>
-        <w:pStyle w:val="Normal"/>
-        <w:jc w:val="both"/>
-        <w:rPr>
-          <w:color w:val="auto"/>
-        </w:rPr>
-      </w:pPr>
-      <w:r>
-        <w:rPr>
-          <w:color w:val="auto"/>
-        </w:rPr>
-      </w:r>
-    </w:p>
-    <w:p>
-      <w:pPr>
-        <w:pStyle w:val="Normal"/>
-        <w:jc w:val="both"/>
-        <w:rPr>
-          <w:color w:val="auto"/>
-        </w:rPr>
-      </w:pPr>
-      <w:r>
-        <w:rPr>
-          <w:rFonts w:eastAsia="Times New Roman" w:cs="Times New Roman" w:ascii="Garamond" w:hAnsi="Garamond"/>
-          <w:color w:val="000000"/>
-          <w:kern w:val="0"/>
-          <w:sz w:val="36"/>
-          <w:szCs w:val="36"/>
-          <w:shd w:fill="auto" w:val="clear"/>
-          <w:lang w:val="en-US" w:eastAsia="zh-CN" w:bidi="hi-IN"/>
-        </w:rPr>
-        <w:t xml:space="preserve">Essa prática desaconselhada por Jesus, acabou se tornando comum na Igreja Católica e é algo que vemos ainda nos dias de hoje. Como nossa intenção não é criticar quaisquer escolas religiosas, vamos entender a fundamentação dessa prática. </w:t>
-      </w:r>
-    </w:p>
-    <w:p>
-      <w:pPr>
-        <w:pStyle w:val="Normal"/>
-        <w:jc w:val="both"/>
-        <w:rPr>
-          <w:color w:val="auto"/>
-        </w:rPr>
-      </w:pPr>
-      <w:r>
-        <w:rPr>
-          <w:color w:val="auto"/>
-        </w:rPr>
-      </w:r>
-    </w:p>
-    <w:p>
-      <w:pPr>
-        <w:pStyle w:val="Normal"/>
-        <w:jc w:val="both"/>
-        <w:rPr>
-          <w:color w:val="auto"/>
-        </w:rPr>
-      </w:pPr>
-      <w:r>
-        <w:rPr>
-          <w:rFonts w:eastAsia="Times New Roman" w:cs="Times New Roman" w:ascii="Garamond" w:hAnsi="Garamond"/>
-          <w:color w:val="000000"/>
-          <w:kern w:val="0"/>
-          <w:sz w:val="36"/>
-          <w:szCs w:val="36"/>
-          <w:shd w:fill="auto" w:val="clear"/>
-          <w:lang w:val="en-US" w:eastAsia="zh-CN" w:bidi="hi-IN"/>
-        </w:rPr>
-        <w:t>Ao longo da história do cristianismo, especialmente a partir da Idade Média, desenvolveu-se na Igreja Católica a prática da penitência associada ao sacramento da confissão. Ou seja: a pessoa se confessava e recebia uma penitência a ser cumprida.</w:t>
-      </w:r>
-    </w:p>
-    <w:p>
-      <w:pPr>
-        <w:pStyle w:val="Normal"/>
-        <w:jc w:val="both"/>
-        <w:rPr>
-          <w:color w:val="auto"/>
-        </w:rPr>
-      </w:pPr>
-      <w:r>
-        <w:rPr>
-          <w:color w:val="auto"/>
-        </w:rPr>
-      </w:r>
-    </w:p>
-    <w:p>
-      <w:pPr>
-        <w:pStyle w:val="Normal"/>
-        <w:jc w:val="both"/>
-        <w:rPr>
-          <w:color w:val="auto"/>
-        </w:rPr>
-      </w:pPr>
-      <w:r>
-        <w:rPr>
-          <w:rFonts w:eastAsia="Times New Roman" w:cs="Times New Roman" w:ascii="Garamond" w:hAnsi="Garamond"/>
-          <w:color w:val="000000"/>
-          <w:kern w:val="0"/>
-          <w:sz w:val="36"/>
-          <w:szCs w:val="36"/>
-          <w:shd w:fill="auto" w:val="clear"/>
-          <w:lang w:val="en-US" w:eastAsia="zh-CN" w:bidi="hi-IN"/>
-        </w:rPr>
-        <w:t xml:space="preserve">Nos primeiros séculos, as penitências eram públicas e, às vezes, bastante rigorosas. Por volta dos séculos VI e VII, surgiu a prática das confissões individuais e mais frequentes. </w:t>
-      </w:r>
-    </w:p>
-    <w:p>
-      <w:pPr>
-        <w:pStyle w:val="Normal"/>
-        <w:jc w:val="both"/>
-        <w:rPr>
-          <w:color w:val="auto"/>
-        </w:rPr>
-      </w:pPr>
-      <w:r>
-        <w:rPr>
-          <w:color w:val="auto"/>
-        </w:rPr>
-      </w:r>
-    </w:p>
-    <w:p>
-      <w:pPr>
-        <w:pStyle w:val="Normal"/>
-        <w:jc w:val="both"/>
-        <w:rPr>
-          <w:color w:val="auto"/>
-        </w:rPr>
-      </w:pPr>
-      <w:r>
-        <w:rPr>
-          <w:rFonts w:eastAsia="Times New Roman" w:cs="Times New Roman" w:ascii="Garamond" w:hAnsi="Garamond"/>
-          <w:color w:val="000000"/>
-          <w:kern w:val="0"/>
-          <w:sz w:val="36"/>
-          <w:szCs w:val="36"/>
-          <w:shd w:fill="auto" w:val="clear"/>
-          <w:lang w:val="en-US" w:eastAsia="zh-CN" w:bidi="hi-IN"/>
-        </w:rPr>
-        <w:t>Surgiram então os chamados “penitenciais”, livros que indicavam orientações espirituais para cada pecado, incluindo jejuns, obras de caridade e também a recitação de determinado número de salmos ou orações.</w:t>
-      </w:r>
-    </w:p>
-    <w:p>
-      <w:pPr>
-        <w:pStyle w:val="Normal"/>
-        <w:jc w:val="both"/>
-        <w:rPr>
-          <w:color w:val="auto"/>
-        </w:rPr>
-      </w:pPr>
-      <w:r>
-        <w:rPr>
-          <w:color w:val="auto"/>
-        </w:rPr>
-      </w:r>
-    </w:p>
-    <w:p>
-      <w:pPr>
-        <w:pStyle w:val="Normal"/>
-        <w:jc w:val="both"/>
-        <w:rPr>
-          <w:color w:val="auto"/>
-        </w:rPr>
-      </w:pPr>
-      <w:r>
-        <w:rPr>
-          <w:rFonts w:eastAsia="Times New Roman" w:cs="Times New Roman" w:ascii="Garamond" w:hAnsi="Garamond"/>
-          <w:color w:val="000000"/>
-          <w:kern w:val="0"/>
-          <w:sz w:val="36"/>
-          <w:szCs w:val="36"/>
-          <w:shd w:fill="auto" w:val="clear"/>
-          <w:lang w:val="en-US" w:eastAsia="zh-CN" w:bidi="hi-IN"/>
-        </w:rPr>
-        <w:t xml:space="preserve">Foi nesse contexto que surgiu a repetição do Pai-Nosso e da Ave-Maria como parte da penitência. O objetivo não era comprar o perdão, até porque, de acordo com a teologia católica, isso não é possível; o perdão só pode ser concedido por Deus .no momento da absolvição. A intenção era propor um exercício espiritual de reparação, disciplina e recolhimento. </w:t>
-      </w:r>
-    </w:p>
-    <w:p>
-      <w:pPr>
-        <w:pStyle w:val="Normal"/>
-        <w:jc w:val="both"/>
-        <w:rPr>
-          <w:color w:val="auto"/>
-        </w:rPr>
-      </w:pPr>
-      <w:r>
-        <w:rPr>
-          <w:color w:val="auto"/>
-        </w:rPr>
-      </w:r>
-    </w:p>
-    <w:p>
-      <w:pPr>
-        <w:pStyle w:val="Normal"/>
-        <w:jc w:val="both"/>
-        <w:rPr>
-          <w:color w:val="auto"/>
-        </w:rPr>
-      </w:pPr>
-      <w:r>
-        <w:rPr>
-          <w:rFonts w:eastAsia="Times New Roman" w:cs="Times New Roman" w:ascii="Garamond" w:hAnsi="Garamond"/>
-          <w:color w:val="000000"/>
-          <w:kern w:val="0"/>
-          <w:sz w:val="36"/>
-          <w:szCs w:val="36"/>
-          <w:shd w:fill="auto" w:val="clear"/>
-          <w:lang w:val="en-US" w:eastAsia="zh-CN" w:bidi="hi-IN"/>
-        </w:rPr>
-        <w:t>Na mesma época surgiu a tradição do Rosário, em que a repetição das orações adquire um ar meditativo e contemplativo. Assim, a fixação de um número de preces nasceu dentro de uma pedagogia espiritual, como maneira de educar a alma na perseverança e na reflexão.</w:t>
-      </w:r>
-    </w:p>
-    <w:p>
-      <w:pPr>
-        <w:pStyle w:val="Normal"/>
-        <w:jc w:val="both"/>
-        <w:rPr>
-          <w:color w:val="auto"/>
-        </w:rPr>
-      </w:pPr>
-      <w:r>
-        <w:rPr>
-          <w:color w:val="auto"/>
-        </w:rPr>
-      </w:r>
-    </w:p>
-    <w:p>
-      <w:pPr>
-        <w:pStyle w:val="Normal"/>
-        <w:jc w:val="both"/>
-        <w:rPr>
-          <w:color w:val="auto"/>
-        </w:rPr>
-      </w:pPr>
-      <w:r>
-        <w:rPr>
-          <w:rFonts w:eastAsia="Times New Roman" w:cs="Times New Roman" w:ascii="Garamond" w:hAnsi="Garamond"/>
-          <w:color w:val="000000"/>
-          <w:kern w:val="0"/>
-          <w:sz w:val="36"/>
-          <w:szCs w:val="36"/>
-          <w:shd w:fill="auto" w:val="clear"/>
-          <w:lang w:val="en-US" w:eastAsia="zh-CN" w:bidi="hi-IN"/>
-        </w:rPr>
-        <w:t xml:space="preserve">Então, quando Jesus nos alerta para não orarmos como os pagãos, que acreditavam ser ouvidos pela multiplicidade das palavras, Ele não está condenando a repetição em si, mas a ideia de que Deus possa ser convencido pela quantidade. </w:t>
-      </w:r>
-    </w:p>
-    <w:p>
-      <w:pPr>
-        <w:pStyle w:val="Normal"/>
-        <w:jc w:val="both"/>
-        <w:rPr>
-          <w:color w:val="auto"/>
-        </w:rPr>
-      </w:pPr>
-      <w:r>
-        <w:rPr>
-          <w:color w:val="auto"/>
-        </w:rPr>
-      </w:r>
-    </w:p>
-    <w:p>
-      <w:pPr>
-        <w:pStyle w:val="Normal"/>
-        <w:jc w:val="both"/>
-        <w:rPr>
-          <w:color w:val="auto"/>
-        </w:rPr>
-      </w:pPr>
-      <w:r>
-        <w:rPr>
-          <w:rFonts w:eastAsia="Times New Roman" w:cs="Times New Roman" w:ascii="Garamond" w:hAnsi="Garamond"/>
-          <w:color w:val="000000"/>
-          <w:kern w:val="0"/>
-          <w:sz w:val="36"/>
-          <w:szCs w:val="36"/>
-          <w:shd w:fill="auto" w:val="clear"/>
-          <w:lang w:val="en-US" w:eastAsia="zh-CN" w:bidi="hi-IN"/>
-        </w:rPr>
-        <w:t xml:space="preserve">A repetição funciona como um instrumento de concentração e disciplina; o que o Evangelho nos convida a evitar é o automatismo vazio. </w:t>
-      </w:r>
-    </w:p>
-    <w:p>
-      <w:pPr>
-        <w:pStyle w:val="Normal"/>
-        <w:jc w:val="both"/>
-        <w:rPr>
-          <w:color w:val="auto"/>
-        </w:rPr>
-      </w:pPr>
-      <w:r>
-        <w:rPr>
-          <w:color w:val="auto"/>
-        </w:rPr>
-      </w:r>
-    </w:p>
-    <w:p>
-      <w:pPr>
-        <w:pStyle w:val="Normal"/>
-        <w:jc w:val="both"/>
-        <w:rPr>
-          <w:color w:val="auto"/>
-        </w:rPr>
-      </w:pPr>
-      <w:r>
-        <w:rPr>
-          <w:rFonts w:eastAsia="Times New Roman" w:cs="Times New Roman" w:ascii="Garamond" w:hAnsi="Garamond"/>
-          <w:color w:val="000000"/>
-          <w:kern w:val="0"/>
-          <w:sz w:val="36"/>
-          <w:szCs w:val="36"/>
-          <w:shd w:fill="auto" w:val="clear"/>
-          <w:lang w:val="en-US" w:eastAsia="zh-CN" w:bidi="hi-IN"/>
-        </w:rPr>
-        <w:t>A bem da verdade, para Deus e Jesus nem mesmo as palavras que utilizamos em nossas preces importam. Embora o Pai Nosso e a Ave Maria sejam orações belíssimas, podemos orar utilizando nossas próprias palavras.</w:t>
-      </w:r>
-    </w:p>
-    <w:p>
-      <w:pPr>
-        <w:pStyle w:val="Normal"/>
-        <w:jc w:val="both"/>
-        <w:rPr>
-          <w:color w:val="auto"/>
-        </w:rPr>
-      </w:pPr>
-      <w:r>
-        <w:rPr>
-          <w:color w:val="auto"/>
-        </w:rPr>
-      </w:r>
-    </w:p>
-    <w:p>
-      <w:pPr>
-        <w:pStyle w:val="Normal"/>
-        <w:jc w:val="both"/>
-        <w:rPr>
-          <w:color w:val="auto"/>
-        </w:rPr>
-      </w:pPr>
-      <w:r>
-        <w:rPr>
-          <w:rFonts w:eastAsia="Times New Roman" w:cs="Times New Roman" w:ascii="Garamond" w:hAnsi="Garamond"/>
-          <w:color w:val="000000"/>
-          <w:kern w:val="0"/>
-          <w:sz w:val="36"/>
-          <w:szCs w:val="36"/>
-          <w:shd w:fill="auto" w:val="clear"/>
-          <w:lang w:val="en-US" w:eastAsia="zh-CN" w:bidi="hi-IN"/>
-        </w:rPr>
-        <w:t>O que é fundamental é que nossas preces carreguem consigo humildade, sinceridade e fé. Quais palavras utilizamos para nos expressarmos dessa forma, pouco importa.</w:t>
-      </w:r>
-    </w:p>
-    <w:p>
-      <w:pPr>
-        <w:pStyle w:val="Normal"/>
-        <w:jc w:val="both"/>
-        <w:rPr>
-          <w:color w:val="auto"/>
-        </w:rPr>
-      </w:pPr>
-      <w:r>
-        <w:rPr>
-          <w:color w:val="auto"/>
-        </w:rPr>
-      </w:r>
-    </w:p>
-    <w:p>
-      <w:pPr>
-        <w:pStyle w:val="Normal"/>
-        <w:jc w:val="both"/>
-        <w:rPr>
-          <w:color w:val="1C99E0"/>
-        </w:rPr>
-      </w:pPr>
-      <w:r>
-        <w:rPr>
-          <w:rFonts w:eastAsia="Times New Roman" w:cs="Times New Roman" w:ascii="Garamond" w:hAnsi="Garamond"/>
-          <w:color w:val="1C99E0"/>
-          <w:kern w:val="0"/>
-          <w:sz w:val="36"/>
-          <w:szCs w:val="36"/>
-          <w:shd w:fill="auto" w:val="clear"/>
-          <w:lang w:val="en-US" w:eastAsia="zh-CN" w:bidi="hi-IN"/>
-        </w:rPr>
-        <w:t>[ Ver se aqui é realmente o melhor ponto para a explicação da transmissão do pensamento.]</w:t>
-      </w:r>
-    </w:p>
-    <w:p>
-      <w:pPr>
-        <w:pStyle w:val="Normal"/>
-        <w:jc w:val="both"/>
-        <w:rPr>
-          <w:color w:val="auto"/>
-        </w:rPr>
-      </w:pPr>
-      <w:r>
-        <w:rPr>
-          <w:color w:val="auto"/>
-        </w:rPr>
-      </w:r>
-    </w:p>
-    <w:p>
-      <w:pPr>
-        <w:pStyle w:val="Normal"/>
-        <w:jc w:val="both"/>
-        <w:rPr>
-          <w:color w:val="auto"/>
-        </w:rPr>
-      </w:pPr>
-      <w:r>
-        <w:rPr>
-          <w:rFonts w:eastAsia="Times New Roman" w:cs="Times New Roman" w:ascii="Garamond" w:hAnsi="Garamond"/>
-          <w:color w:val="000000"/>
-          <w:kern w:val="0"/>
-          <w:sz w:val="36"/>
-          <w:szCs w:val="36"/>
-          <w:shd w:fill="auto" w:val="clear"/>
-          <w:lang w:val="en-US" w:eastAsia="zh-CN" w:bidi="hi-IN"/>
-        </w:rPr>
-        <w:t>Mas por quê deve ser assim? Bom, antes de mais nada é preciso relembrar que o pensamento é a voz do Espírito. Espíritos desencarnados não se utilizam da palavra falada para se comunicarem. Isso é uma necessidade nossa, Espíritos encarnados.</w:t>
-      </w:r>
-    </w:p>
-    <w:p>
-      <w:pPr>
-        <w:pStyle w:val="Normal"/>
-        <w:jc w:val="both"/>
-        <w:rPr>
-          <w:color w:val="auto"/>
-        </w:rPr>
-      </w:pPr>
-      <w:r>
-        <w:rPr>
-          <w:color w:val="auto"/>
-        </w:rPr>
-      </w:r>
-    </w:p>
-    <w:p>
-      <w:pPr>
-        <w:pStyle w:val="Normal"/>
-        <w:jc w:val="both"/>
-        <w:rPr>
-          <w:color w:val="auto"/>
-        </w:rPr>
-      </w:pPr>
-      <w:r>
-        <w:rPr>
-          <w:rFonts w:eastAsia="Times New Roman" w:cs="Times New Roman" w:ascii="Garamond" w:hAnsi="Garamond"/>
-          <w:color w:val="000000"/>
-          <w:kern w:val="0"/>
-          <w:sz w:val="36"/>
-          <w:szCs w:val="36"/>
-          <w:shd w:fill="auto" w:val="clear"/>
-          <w:lang w:val="en-US" w:eastAsia="zh-CN" w:bidi="hi-IN"/>
-        </w:rPr>
-        <w:t>Pelo pensamento o Espírito vai aos lugares que lhe agradam e que  lhe seja permitido estar; pelo pensamento ele cria formas, se comunica com outros Espíritos e  se vincula àqueles que estão na mesma faixa vibratória que ele.</w:t>
-      </w:r>
-    </w:p>
-    <w:p>
-      <w:pPr>
-        <w:pStyle w:val="Normal"/>
-        <w:jc w:val="both"/>
-        <w:rPr>
-          <w:color w:val="auto"/>
-        </w:rPr>
-      </w:pPr>
-      <w:r>
-        <w:rPr>
-          <w:color w:val="auto"/>
-        </w:rPr>
-      </w:r>
-    </w:p>
-    <w:p>
-      <w:pPr>
-        <w:pStyle w:val="Normal"/>
-        <w:jc w:val="both"/>
-        <w:rPr>
-          <w:color w:val="auto"/>
-        </w:rPr>
-      </w:pPr>
-      <w:r>
-        <w:rPr>
-          <w:rFonts w:eastAsia="Times New Roman" w:cs="Times New Roman" w:ascii="Garamond" w:hAnsi="Garamond"/>
-          <w:color w:val="000000"/>
-          <w:kern w:val="0"/>
-          <w:sz w:val="36"/>
-          <w:szCs w:val="36"/>
-          <w:shd w:fill="auto" w:val="clear"/>
-          <w:lang w:val="en-US" w:eastAsia="zh-CN" w:bidi="hi-IN"/>
-        </w:rPr>
-        <w:t>Para entender o que acontece na oração, podemos imaginar que todos nós — encarnados e desencarnados — estamos mergulhados em um tipo de “atmosfera espiritual”, conhecido como fluido cósmico universal.</w:t>
-      </w:r>
-    </w:p>
-    <w:p>
-      <w:pPr>
-        <w:pStyle w:val="Normal"/>
-        <w:jc w:val="both"/>
-        <w:rPr>
-          <w:color w:val="auto"/>
-        </w:rPr>
-      </w:pPr>
-      <w:r>
-        <w:rPr>
-          <w:color w:val="auto"/>
-        </w:rPr>
-      </w:r>
-    </w:p>
-    <w:p>
-      <w:pPr>
-        <w:pStyle w:val="Normal"/>
-        <w:jc w:val="both"/>
-        <w:rPr>
-          <w:color w:val="auto"/>
-        </w:rPr>
-      </w:pPr>
-      <w:r>
-        <w:rPr>
-          <w:rFonts w:eastAsia="Times New Roman" w:cs="Times New Roman" w:ascii="Garamond" w:hAnsi="Garamond"/>
-          <w:color w:val="000000"/>
-          <w:kern w:val="0"/>
-          <w:sz w:val="36"/>
-          <w:szCs w:val="36"/>
-          <w:shd w:fill="auto" w:val="clear"/>
-          <w:lang w:val="en-US" w:eastAsia="zh-CN" w:bidi="hi-IN"/>
-        </w:rPr>
-        <w:t xml:space="preserve">Assim como vivemos dentro da atmosfera da Terra, respirando o ar, também estamos envolvidos por esse fluido que preenche todo o universo. </w:t>
-      </w:r>
-    </w:p>
-    <w:p>
-      <w:pPr>
-        <w:pStyle w:val="Normal"/>
-        <w:jc w:val="both"/>
-        <w:rPr>
-          <w:color w:val="auto"/>
-        </w:rPr>
-      </w:pPr>
-      <w:r>
-        <w:rPr>
-          <w:color w:val="auto"/>
-        </w:rPr>
+        <w:t>Ao nos depararmos com alguém caído na calçada sob o efeito de álcool ou drogas, em vez de lançar um olhar de condenação, vamos orar e pedir a  Deus que dê forças àquele irmão para superar seus vícios e suas dificuldades.</w:t>
+      </w:r>
+    </w:p>
+    <w:p>
+      <w:pPr>
+        <w:pStyle w:val="Normal"/>
+        <w:jc w:val="both"/>
+        <w:rPr>
+          <w:highlight w:val="none"/>
+          <w:shd w:fill="auto" w:val="clear"/>
+        </w:rPr>
+      </w:pPr>
+      <w:r>
+        <w:rPr/>
+      </w:r>
+    </w:p>
+    <w:p>
+      <w:pPr>
+        <w:pStyle w:val="Normal"/>
+        <w:jc w:val="both"/>
+        <w:rPr>
+          <w:color w:val="auto"/>
+        </w:rPr>
+      </w:pPr>
+      <w:r>
+        <w:rPr>
+          <w:rFonts w:eastAsia="Times New Roman" w:cs="Times New Roman" w:ascii="Garamond" w:hAnsi="Garamond"/>
+          <w:color w:val="000000"/>
+          <w:kern w:val="0"/>
+          <w:sz w:val="36"/>
+          <w:szCs w:val="36"/>
+          <w:shd w:fill="auto" w:val="clear"/>
+          <w:lang w:val="en-US" w:eastAsia="zh-CN" w:bidi="hi-IN"/>
+        </w:rPr>
+        <w:t>Quando estivermos dirigindo e nos depararmos um acidente, também podemos orar pelas pessoas envolvidas naquela situação.</w:t>
+      </w:r>
+    </w:p>
+    <w:p>
+      <w:pPr>
+        <w:pStyle w:val="Normal"/>
+        <w:jc w:val="both"/>
+        <w:rPr>
+          <w:color w:val="auto"/>
+        </w:rPr>
+      </w:pPr>
+      <w:r>
+        <w:rPr/>
+      </w:r>
+    </w:p>
+    <w:p>
+      <w:pPr>
+        <w:pStyle w:val="Normal"/>
+        <w:jc w:val="both"/>
+        <w:rPr>
+          <w:color w:val="auto"/>
+        </w:rPr>
+      </w:pPr>
+      <w:r>
+        <w:rPr>
+          <w:rFonts w:eastAsia="Times New Roman" w:cs="Times New Roman" w:ascii="Garamond" w:hAnsi="Garamond"/>
+          <w:color w:val="000000"/>
+          <w:kern w:val="0"/>
+          <w:sz w:val="36"/>
+          <w:szCs w:val="36"/>
+          <w:shd w:fill="auto" w:val="clear"/>
+          <w:lang w:val="en-US" w:eastAsia="zh-CN" w:bidi="hi-IN"/>
+        </w:rPr>
+        <w:t>Eu confesso que não entendo a curiosidade mórbida que muita gente tem em ver pessoas feridas ou mortas em acidentes. Já repararam que quando acontece um acidente de trânsito em uma pista, a outra pista também fica com o trânsito lento? É porque as pessoas dirigindo em sentido contrário reduzem a velocidade para ver o que aconteceu.</w:t>
+      </w:r>
+    </w:p>
+    <w:p>
+      <w:pPr>
+        <w:pStyle w:val="Normal"/>
+        <w:jc w:val="both"/>
+        <w:rPr>
+          <w:color w:val="auto"/>
+        </w:rPr>
+      </w:pPr>
+      <w:r>
+        <w:rPr>
+          <w:color w:val="auto"/>
+        </w:rPr>
+      </w:r>
+      <w:r>
+        <w:br w:type="page"/>
+      </w:r>
+    </w:p>
+    <w:p>
+      <w:pPr>
+        <w:pStyle w:val="Normal"/>
+        <w:jc w:val="both"/>
+        <w:rPr>
+          <w:color w:val="auto"/>
+        </w:rPr>
+      </w:pPr>
+      <w:r>
+        <w:rPr>
+          <w:rFonts w:eastAsia="Times New Roman" w:cs="Times New Roman" w:ascii="Garamond" w:hAnsi="Garamond"/>
+          <w:color w:val="000000"/>
+          <w:kern w:val="0"/>
+          <w:sz w:val="36"/>
+          <w:szCs w:val="36"/>
+          <w:shd w:fill="auto" w:val="clear"/>
+          <w:lang w:val="en-US" w:eastAsia="zh-CN" w:bidi="hi-IN"/>
+        </w:rPr>
+        <w:t>Se por acaso ainda somos tomados por esse tipo de curiosidade, vamos adotar outra postura. Em vez de querer ver o que aconteceu, elevemos um pensamento a Deus, pedindo socorro para os feridos e amparo aos que desencarnaram e seguimos nosso caminho.</w:t>
+      </w:r>
+    </w:p>
+    <w:p>
+      <w:pPr>
+        <w:pStyle w:val="Normal"/>
+        <w:jc w:val="both"/>
+        <w:rPr>
+          <w:color w:val="auto"/>
+        </w:rPr>
+      </w:pPr>
+      <w:r>
+        <w:rPr/>
+      </w:r>
+    </w:p>
+    <w:p>
+      <w:pPr>
+        <w:pStyle w:val="Normal"/>
+        <w:jc w:val="both"/>
+        <w:rPr>
+          <w:color w:val="auto"/>
+        </w:rPr>
+      </w:pPr>
+      <w:r>
+        <w:rPr>
+          <w:rFonts w:eastAsia="Times New Roman" w:cs="Times New Roman" w:ascii="Garamond" w:hAnsi="Garamond"/>
+          <w:color w:val="000000"/>
+          <w:kern w:val="0"/>
+          <w:sz w:val="36"/>
+          <w:szCs w:val="36"/>
+          <w:shd w:fill="auto" w:val="clear"/>
+          <w:lang w:val="en-US" w:eastAsia="zh-CN" w:bidi="hi-IN"/>
+        </w:rPr>
+        <w:t>Retornando à passagem evangélica que estamos analisando, Jesus nos diz para não orarmos como os pagãos, que pensam que é pela quantidade de palavras que suas preces serão ouvidas. O Mestre diz ainda que Deus sabe do que precisamos antes mesmo de o perdirmos.</w:t>
+      </w:r>
+    </w:p>
+    <w:p>
+      <w:pPr>
+        <w:pStyle w:val="Normal"/>
+        <w:jc w:val="both"/>
+        <w:rPr>
+          <w:color w:val="auto"/>
+        </w:rPr>
+      </w:pPr>
+      <w:r>
+        <w:rPr/>
+      </w:r>
+    </w:p>
+    <w:p>
+      <w:pPr>
+        <w:pStyle w:val="Normal"/>
+        <w:jc w:val="both"/>
+        <w:rPr>
+          <w:color w:val="auto"/>
+        </w:rPr>
+      </w:pPr>
+      <w:r>
+        <w:rPr>
+          <w:rFonts w:eastAsia="Times New Roman" w:cs="Times New Roman" w:ascii="Garamond" w:hAnsi="Garamond"/>
+          <w:color w:val="000000"/>
+          <w:kern w:val="0"/>
+          <w:sz w:val="36"/>
+          <w:szCs w:val="36"/>
+          <w:shd w:fill="auto" w:val="clear"/>
+          <w:lang w:val="en-US" w:eastAsia="zh-CN" w:bidi="hi-IN"/>
+        </w:rPr>
+        <w:t>Quem eram os pagãos a quem Jesus se refere? Eles eram principalmente os povos gentios do mundo greco-romano que não pertenciam à tradição judaica e que seguiam religiões politeístas comuns no Império Romano.</w:t>
+      </w:r>
+    </w:p>
+    <w:p>
+      <w:pPr>
+        <w:pStyle w:val="Normal"/>
+        <w:jc w:val="both"/>
+        <w:rPr>
+          <w:color w:val="auto"/>
+        </w:rPr>
+      </w:pPr>
+      <w:r>
+        <w:rPr/>
+      </w:r>
+    </w:p>
+    <w:p>
+      <w:pPr>
+        <w:pStyle w:val="Normal"/>
+        <w:jc w:val="both"/>
+        <w:rPr>
+          <w:color w:val="auto"/>
+        </w:rPr>
+      </w:pPr>
+      <w:r>
+        <w:rPr>
+          <w:rFonts w:eastAsia="Times New Roman" w:cs="Times New Roman" w:ascii="Garamond" w:hAnsi="Garamond"/>
+          <w:color w:val="000000"/>
+          <w:kern w:val="0"/>
+          <w:sz w:val="36"/>
+          <w:szCs w:val="36"/>
+          <w:shd w:fill="auto" w:val="clear"/>
+          <w:lang w:val="en-US" w:eastAsia="zh-CN" w:bidi="hi-IN"/>
+        </w:rPr>
+        <w:t>Nessas práticas religiosas, era frequente a repetição longa de fórmulas e invocações, porque muitos acreditavam que o poder da oração estava na quantidade ou na exatidão em que as palavras eram pronunciadas.</w:t>
+      </w:r>
+    </w:p>
+    <w:p>
+      <w:pPr>
+        <w:pStyle w:val="Normal"/>
+        <w:jc w:val="both"/>
+        <w:rPr>
+          <w:color w:val="auto"/>
+        </w:rPr>
+      </w:pPr>
+      <w:r>
+        <w:rPr/>
+      </w:r>
+    </w:p>
+    <w:p>
+      <w:pPr>
+        <w:pStyle w:val="Normal"/>
+        <w:jc w:val="both"/>
+        <w:rPr>
+          <w:color w:val="auto"/>
+        </w:rPr>
+      </w:pPr>
+      <w:r>
+        <w:rPr>
+          <w:rFonts w:eastAsia="Times New Roman" w:cs="Times New Roman" w:ascii="Garamond" w:hAnsi="Garamond"/>
+          <w:color w:val="000000"/>
+          <w:kern w:val="0"/>
+          <w:sz w:val="36"/>
+          <w:szCs w:val="36"/>
+          <w:shd w:fill="auto" w:val="clear"/>
+          <w:lang w:val="en-US" w:eastAsia="zh-CN" w:bidi="hi-IN"/>
+        </w:rPr>
+        <w:t>Ao fazer essa advertência, Jesus não condena a perseverança na prece; Ele critica o caráter mágico e mecânico que aquelas pessoas davam à oração.</w:t>
+      </w:r>
+    </w:p>
+    <w:p>
+      <w:pPr>
+        <w:pStyle w:val="Normal"/>
+        <w:jc w:val="both"/>
+        <w:rPr>
+          <w:color w:val="auto"/>
+        </w:rPr>
+      </w:pPr>
+      <w:r>
+        <w:rPr/>
+      </w:r>
+    </w:p>
+    <w:p>
+      <w:pPr>
+        <w:pStyle w:val="Normal"/>
+        <w:jc w:val="both"/>
+        <w:rPr>
+          <w:color w:val="auto"/>
+        </w:rPr>
+      </w:pPr>
+      <w:r>
+        <w:rPr>
+          <w:rFonts w:eastAsia="Times New Roman" w:cs="Times New Roman" w:ascii="Garamond" w:hAnsi="Garamond"/>
+          <w:color w:val="000000"/>
+          <w:kern w:val="0"/>
+          <w:sz w:val="36"/>
+          <w:szCs w:val="36"/>
+          <w:shd w:fill="auto" w:val="clear"/>
+          <w:lang w:val="en-US" w:eastAsia="zh-CN" w:bidi="hi-IN"/>
+        </w:rPr>
+        <w:t xml:space="preserve">Jesus também nos recorda que Deus sabe do que necessitamos antes mesmo de pedirmos. Portanto, </w:t>
+      </w:r>
+      <w:r>
+        <w:rPr>
+          <w:rFonts w:eastAsia="Times New Roman" w:cs="Times New Roman" w:ascii="Garamond" w:hAnsi="Garamond"/>
+          <w:color w:val="000000"/>
+          <w:kern w:val="0"/>
+          <w:sz w:val="36"/>
+          <w:szCs w:val="36"/>
+          <w:shd w:fill="auto" w:val="clear"/>
+          <w:lang w:val="en-US" w:eastAsia="zh-CN" w:bidi="hi-IN"/>
+        </w:rPr>
+        <w:t xml:space="preserve">a </w:t>
+      </w:r>
+      <w:r>
+        <w:rPr>
+          <w:rFonts w:eastAsia="Times New Roman" w:cs="Times New Roman" w:ascii="Garamond" w:hAnsi="Garamond"/>
+          <w:color w:val="000000"/>
+          <w:kern w:val="0"/>
+          <w:sz w:val="36"/>
+          <w:szCs w:val="36"/>
+          <w:shd w:fill="auto" w:val="clear"/>
+          <w:lang w:val="en-US" w:eastAsia="zh-CN" w:bidi="hi-IN"/>
+        </w:rPr>
+        <w:t xml:space="preserve">oração não deve ser </w:t>
+      </w:r>
+      <w:r>
+        <w:rPr>
+          <w:rFonts w:eastAsia="Times New Roman" w:cs="Times New Roman" w:ascii="Garamond" w:hAnsi="Garamond"/>
+          <w:color w:val="000000"/>
+          <w:kern w:val="0"/>
+          <w:sz w:val="36"/>
+          <w:szCs w:val="36"/>
+          <w:shd w:fill="auto" w:val="clear"/>
+          <w:lang w:val="en-US" w:eastAsia="zh-CN" w:bidi="hi-IN"/>
+        </w:rPr>
+        <w:t>utilizada</w:t>
+      </w:r>
+      <w:r>
+        <w:rPr>
+          <w:rFonts w:eastAsia="Times New Roman" w:cs="Times New Roman" w:ascii="Garamond" w:hAnsi="Garamond"/>
+          <w:color w:val="000000"/>
+          <w:kern w:val="0"/>
+          <w:sz w:val="36"/>
+          <w:szCs w:val="36"/>
+          <w:shd w:fill="auto" w:val="clear"/>
+          <w:lang w:val="en-US" w:eastAsia="zh-CN" w:bidi="hi-IN"/>
+        </w:rPr>
+        <w:t xml:space="preserve"> como um instrumento de pressão sobre Deus, mas como recurso de transformação interior. </w:t>
+      </w:r>
+    </w:p>
+    <w:p>
+      <w:pPr>
+        <w:pStyle w:val="Normal"/>
+        <w:jc w:val="both"/>
+        <w:rPr>
+          <w:color w:val="auto"/>
+        </w:rPr>
+      </w:pPr>
+      <w:r>
+        <w:rPr/>
+      </w:r>
+    </w:p>
+    <w:p>
+      <w:pPr>
+        <w:pStyle w:val="Normal"/>
+        <w:jc w:val="both"/>
+        <w:rPr>
+          <w:color w:val="auto"/>
+        </w:rPr>
+      </w:pPr>
+      <w:r>
+        <w:rPr>
+          <w:rFonts w:eastAsia="Times New Roman" w:cs="Times New Roman" w:ascii="Garamond" w:hAnsi="Garamond"/>
+          <w:color w:val="000000"/>
+          <w:kern w:val="0"/>
+          <w:sz w:val="36"/>
+          <w:szCs w:val="36"/>
+          <w:shd w:fill="auto" w:val="clear"/>
+          <w:lang w:val="en-US" w:eastAsia="zh-CN" w:bidi="hi-IN"/>
+        </w:rPr>
+        <w:t>É um convite para substituirmos o automatismo pela sinceridade, a quantidade pela qualidade e a palavra vazia pelo sentimento verdadeiro.</w:t>
+      </w:r>
+    </w:p>
+    <w:p>
+      <w:pPr>
+        <w:pStyle w:val="Normal"/>
+        <w:jc w:val="both"/>
+        <w:rPr>
+          <w:color w:val="auto"/>
+        </w:rPr>
+      </w:pPr>
+      <w:r>
+        <w:rPr/>
+      </w:r>
+    </w:p>
+    <w:p>
+      <w:pPr>
+        <w:pStyle w:val="Normal"/>
+        <w:jc w:val="both"/>
+        <w:rPr>
+          <w:color w:val="auto"/>
+        </w:rPr>
+      </w:pPr>
+      <w:r>
+        <w:rPr>
+          <w:rFonts w:eastAsia="Times New Roman" w:cs="Times New Roman" w:ascii="Garamond" w:hAnsi="Garamond"/>
+          <w:color w:val="000000"/>
+          <w:kern w:val="0"/>
+          <w:sz w:val="36"/>
+          <w:szCs w:val="36"/>
+          <w:shd w:fill="auto" w:val="clear"/>
+          <w:lang w:val="en-US" w:eastAsia="zh-CN" w:bidi="hi-IN"/>
+        </w:rPr>
+        <w:t xml:space="preserve">A bem da verdade, para Deus e Jesus nem mesmo as palavras que utilizamos em nossas preces </w:t>
+      </w:r>
+      <w:r>
+        <w:rPr>
+          <w:rFonts w:eastAsia="Times New Roman" w:cs="Times New Roman" w:ascii="Garamond" w:hAnsi="Garamond"/>
+          <w:color w:val="000000"/>
+          <w:kern w:val="0"/>
+          <w:sz w:val="36"/>
+          <w:szCs w:val="36"/>
+          <w:shd w:fill="auto" w:val="clear"/>
+          <w:lang w:val="en-US" w:eastAsia="zh-CN" w:bidi="hi-IN"/>
+        </w:rPr>
+        <w:t>são importantes</w:t>
+      </w:r>
+      <w:r>
+        <w:rPr>
+          <w:rFonts w:eastAsia="Times New Roman" w:cs="Times New Roman" w:ascii="Garamond" w:hAnsi="Garamond"/>
+          <w:color w:val="000000"/>
+          <w:kern w:val="0"/>
+          <w:sz w:val="36"/>
+          <w:szCs w:val="36"/>
+          <w:shd w:fill="auto" w:val="clear"/>
+          <w:lang w:val="en-US" w:eastAsia="zh-CN" w:bidi="hi-IN"/>
+        </w:rPr>
+        <w:t xml:space="preserve">. Embora o Pai Nosso e a Ave Maria sejam orações </w:t>
+      </w:r>
+      <w:r>
+        <w:rPr>
+          <w:rFonts w:eastAsia="Times New Roman" w:cs="Times New Roman" w:ascii="Garamond" w:hAnsi="Garamond"/>
+          <w:color w:val="000000"/>
+          <w:kern w:val="0"/>
+          <w:sz w:val="36"/>
+          <w:szCs w:val="36"/>
+          <w:shd w:fill="auto" w:val="clear"/>
+          <w:lang w:val="en-US" w:eastAsia="zh-CN" w:bidi="hi-IN"/>
+        </w:rPr>
+        <w:t>de uma riqueza e beleza profundas</w:t>
+      </w:r>
+      <w:r>
+        <w:rPr>
+          <w:rFonts w:eastAsia="Times New Roman" w:cs="Times New Roman" w:ascii="Garamond" w:hAnsi="Garamond"/>
+          <w:color w:val="000000"/>
+          <w:kern w:val="0"/>
+          <w:sz w:val="36"/>
+          <w:szCs w:val="36"/>
+          <w:shd w:fill="auto" w:val="clear"/>
+          <w:lang w:val="en-US" w:eastAsia="zh-CN" w:bidi="hi-IN"/>
+        </w:rPr>
+        <w:t>, podemos orar utilizando nossas próprias palavras.</w:t>
+      </w:r>
+    </w:p>
+    <w:p>
+      <w:pPr>
+        <w:pStyle w:val="Normal"/>
+        <w:jc w:val="both"/>
+        <w:rPr>
+          <w:color w:val="auto"/>
+        </w:rPr>
+      </w:pPr>
+      <w:r>
+        <w:rPr/>
+      </w:r>
+    </w:p>
+    <w:p>
+      <w:pPr>
+        <w:pStyle w:val="Normal"/>
+        <w:jc w:val="both"/>
+        <w:rPr>
+          <w:color w:val="auto"/>
+        </w:rPr>
+      </w:pPr>
+      <w:r>
+        <w:rPr>
+          <w:rFonts w:eastAsia="Times New Roman" w:cs="Times New Roman" w:ascii="Garamond" w:hAnsi="Garamond"/>
+          <w:color w:val="000000"/>
+          <w:kern w:val="0"/>
+          <w:sz w:val="36"/>
+          <w:szCs w:val="36"/>
+          <w:shd w:fill="auto" w:val="clear"/>
+          <w:lang w:val="en-US" w:eastAsia="zh-CN" w:bidi="hi-IN"/>
+        </w:rPr>
+        <w:t xml:space="preserve">O que </w:t>
+      </w:r>
+      <w:r>
+        <w:rPr>
+          <w:rFonts w:eastAsia="Times New Roman" w:cs="Times New Roman" w:ascii="Garamond" w:hAnsi="Garamond"/>
+          <w:color w:val="000000"/>
+          <w:kern w:val="0"/>
+          <w:sz w:val="36"/>
+          <w:szCs w:val="36"/>
+          <w:shd w:fill="auto" w:val="clear"/>
+          <w:lang w:val="en-US" w:eastAsia="zh-CN" w:bidi="hi-IN"/>
+        </w:rPr>
+        <w:t xml:space="preserve">realmente importa </w:t>
+      </w:r>
+      <w:r>
+        <w:rPr>
+          <w:rFonts w:eastAsia="Times New Roman" w:cs="Times New Roman" w:ascii="Garamond" w:hAnsi="Garamond"/>
+          <w:color w:val="000000"/>
+          <w:kern w:val="0"/>
+          <w:sz w:val="36"/>
+          <w:szCs w:val="36"/>
+          <w:shd w:fill="auto" w:val="clear"/>
+          <w:lang w:val="en-US" w:eastAsia="zh-CN" w:bidi="hi-IN"/>
+        </w:rPr>
+        <w:t xml:space="preserve">é que nossas preces carreguem consigo humildade, sinceridade e fé. </w:t>
+      </w:r>
+      <w:r>
+        <w:rPr>
+          <w:rFonts w:eastAsia="Times New Roman" w:cs="Times New Roman" w:ascii="Garamond" w:hAnsi="Garamond"/>
+          <w:color w:val="000000"/>
+          <w:kern w:val="0"/>
+          <w:sz w:val="36"/>
+          <w:szCs w:val="36"/>
+          <w:shd w:fill="auto" w:val="clear"/>
+          <w:lang w:val="en-US" w:eastAsia="zh-CN" w:bidi="hi-IN"/>
+        </w:rPr>
+        <w:t>As</w:t>
+      </w:r>
+      <w:r>
+        <w:rPr>
+          <w:rFonts w:eastAsia="Times New Roman" w:cs="Times New Roman" w:ascii="Garamond" w:hAnsi="Garamond"/>
+          <w:color w:val="000000"/>
+          <w:kern w:val="0"/>
+          <w:sz w:val="36"/>
+          <w:szCs w:val="36"/>
+          <w:shd w:fill="auto" w:val="clear"/>
+          <w:lang w:val="en-US" w:eastAsia="zh-CN" w:bidi="hi-IN"/>
+        </w:rPr>
+        <w:t xml:space="preserve"> palavras </w:t>
+      </w:r>
+      <w:r>
+        <w:rPr>
+          <w:rFonts w:eastAsia="Times New Roman" w:cs="Times New Roman" w:ascii="Garamond" w:hAnsi="Garamond"/>
+          <w:color w:val="000000"/>
+          <w:kern w:val="0"/>
+          <w:sz w:val="36"/>
+          <w:szCs w:val="36"/>
+          <w:shd w:fill="auto" w:val="clear"/>
+          <w:lang w:val="en-US" w:eastAsia="zh-CN" w:bidi="hi-IN"/>
+        </w:rPr>
+        <w:t xml:space="preserve">que </w:t>
+      </w:r>
+      <w:r>
+        <w:rPr>
+          <w:rFonts w:eastAsia="Times New Roman" w:cs="Times New Roman" w:ascii="Garamond" w:hAnsi="Garamond"/>
+          <w:color w:val="000000"/>
+          <w:kern w:val="0"/>
+          <w:sz w:val="36"/>
+          <w:szCs w:val="36"/>
+          <w:shd w:fill="auto" w:val="clear"/>
+          <w:lang w:val="en-US" w:eastAsia="zh-CN" w:bidi="hi-IN"/>
+        </w:rPr>
+        <w:t>utilizamos para nos expressarmos dessa forma, pouco importa</w:t>
+      </w:r>
+      <w:r>
+        <w:rPr>
+          <w:rFonts w:eastAsia="Times New Roman" w:cs="Times New Roman" w:ascii="Garamond" w:hAnsi="Garamond"/>
+          <w:color w:val="000000"/>
+          <w:kern w:val="0"/>
+          <w:sz w:val="36"/>
+          <w:szCs w:val="36"/>
+          <w:shd w:fill="auto" w:val="clear"/>
+          <w:lang w:val="en-US" w:eastAsia="zh-CN" w:bidi="hi-IN"/>
+        </w:rPr>
+        <w:t>m</w:t>
+      </w:r>
+      <w:r>
+        <w:rPr>
+          <w:rFonts w:eastAsia="Times New Roman" w:cs="Times New Roman" w:ascii="Garamond" w:hAnsi="Garamond"/>
+          <w:color w:val="000000"/>
+          <w:kern w:val="0"/>
+          <w:sz w:val="36"/>
+          <w:szCs w:val="36"/>
+          <w:shd w:fill="auto" w:val="clear"/>
+          <w:lang w:val="en-US" w:eastAsia="zh-CN" w:bidi="hi-IN"/>
+        </w:rPr>
+        <w:t>.</w:t>
+      </w:r>
+    </w:p>
+    <w:p>
+      <w:pPr>
+        <w:pStyle w:val="Normal"/>
+        <w:jc w:val="both"/>
+        <w:rPr>
+          <w:color w:val="auto"/>
+        </w:rPr>
+      </w:pPr>
+      <w:r>
+        <w:rPr/>
+      </w:r>
+      <w:r>
+        <w:br w:type="page"/>
+      </w:r>
+    </w:p>
+    <w:p>
+      <w:pPr>
+        <w:pStyle w:val="Normal"/>
+        <w:jc w:val="both"/>
+        <w:rPr>
+          <w:color w:val="auto"/>
+        </w:rPr>
+      </w:pPr>
+      <w:r>
+        <w:rPr>
+          <w:rFonts w:eastAsia="Times New Roman" w:cs="Times New Roman" w:ascii="Garamond" w:hAnsi="Garamond"/>
+          <w:color w:val="000000"/>
+          <w:kern w:val="0"/>
+          <w:sz w:val="36"/>
+          <w:szCs w:val="36"/>
+          <w:shd w:fill="auto" w:val="clear"/>
+          <w:lang w:val="en-US" w:eastAsia="zh-CN" w:bidi="hi-IN"/>
+        </w:rPr>
+        <w:t>E</w:t>
+      </w:r>
+      <w:r>
+        <w:rPr>
+          <w:rFonts w:eastAsia="Times New Roman" w:cs="Times New Roman" w:ascii="Garamond" w:hAnsi="Garamond"/>
+          <w:color w:val="000000"/>
+          <w:kern w:val="0"/>
+          <w:sz w:val="36"/>
+          <w:szCs w:val="36"/>
+          <w:shd w:fill="auto" w:val="clear"/>
+          <w:lang w:val="en-US" w:eastAsia="zh-CN" w:bidi="hi-IN"/>
+        </w:rPr>
+        <w:t xml:space="preserve"> por quê deve ser assim? Bom, antes de mais nada é preciso relembrar que</w:t>
+      </w:r>
+      <w:r>
+        <w:rPr>
+          <w:rFonts w:eastAsia="Times New Roman" w:cs="Times New Roman" w:ascii="Garamond" w:hAnsi="Garamond"/>
+          <w:color w:val="000000"/>
+          <w:kern w:val="0"/>
+          <w:sz w:val="36"/>
+          <w:szCs w:val="36"/>
+          <w:shd w:fill="auto" w:val="clear"/>
+          <w:lang w:val="en-US" w:eastAsia="zh-CN" w:bidi="hi-IN"/>
+        </w:rPr>
+        <w:t>, de modo geral,</w:t>
+      </w:r>
+      <w:r>
+        <w:rPr>
+          <w:rFonts w:eastAsia="Times New Roman" w:cs="Times New Roman" w:ascii="Garamond" w:hAnsi="Garamond"/>
+          <w:color w:val="000000"/>
+          <w:kern w:val="0"/>
+          <w:sz w:val="36"/>
+          <w:szCs w:val="36"/>
+          <w:shd w:fill="auto" w:val="clear"/>
+          <w:lang w:val="en-US" w:eastAsia="zh-CN" w:bidi="hi-IN"/>
+        </w:rPr>
+        <w:t xml:space="preserve"> o pensamento é a voz do Espírito. </w:t>
+      </w:r>
+    </w:p>
+    <w:p>
+      <w:pPr>
+        <w:pStyle w:val="Normal"/>
+        <w:jc w:val="both"/>
+        <w:rPr>
+          <w:color w:val="auto"/>
+        </w:rPr>
+      </w:pPr>
+      <w:r>
+        <w:rPr/>
+      </w:r>
+    </w:p>
+    <w:p>
+      <w:pPr>
+        <w:pStyle w:val="Normal"/>
+        <w:jc w:val="both"/>
+        <w:rPr>
+          <w:color w:val="auto"/>
+        </w:rPr>
+      </w:pPr>
+      <w:r>
+        <w:rPr>
+          <w:rFonts w:eastAsia="Times New Roman" w:cs="Times New Roman" w:ascii="Garamond" w:hAnsi="Garamond"/>
+          <w:color w:val="000000"/>
+          <w:kern w:val="0"/>
+          <w:sz w:val="36"/>
+          <w:szCs w:val="36"/>
+          <w:shd w:fill="auto" w:val="clear"/>
+          <w:lang w:val="en-US" w:eastAsia="zh-CN" w:bidi="hi-IN"/>
+        </w:rPr>
+        <w:t xml:space="preserve">Pelo pensamento o Espírito vai aos lugares que lhe agradam e </w:t>
+      </w:r>
+      <w:r>
+        <w:rPr>
+          <w:rFonts w:eastAsia="Times New Roman" w:cs="Times New Roman" w:ascii="Garamond" w:hAnsi="Garamond"/>
+          <w:color w:val="000000"/>
+          <w:kern w:val="0"/>
+          <w:sz w:val="36"/>
+          <w:szCs w:val="36"/>
+          <w:shd w:fill="auto" w:val="clear"/>
+          <w:lang w:val="en-US" w:eastAsia="zh-CN" w:bidi="hi-IN"/>
+        </w:rPr>
+        <w:t>aos quais ele tenha acesso</w:t>
+      </w:r>
+      <w:r>
+        <w:rPr>
+          <w:rFonts w:eastAsia="Times New Roman" w:cs="Times New Roman" w:ascii="Garamond" w:hAnsi="Garamond"/>
+          <w:color w:val="000000"/>
+          <w:kern w:val="0"/>
+          <w:sz w:val="36"/>
+          <w:szCs w:val="36"/>
+          <w:shd w:fill="auto" w:val="clear"/>
+          <w:lang w:val="en-US" w:eastAsia="zh-CN" w:bidi="hi-IN"/>
+        </w:rPr>
+        <w:t xml:space="preserve">; pelo pensamento ele cria formas, se comunica com outros Espíritos e </w:t>
+      </w:r>
+      <w:r>
+        <w:rPr>
+          <w:rFonts w:eastAsia="Times New Roman" w:cs="Times New Roman" w:ascii="Garamond" w:hAnsi="Garamond"/>
+          <w:color w:val="000000"/>
+          <w:kern w:val="0"/>
+          <w:sz w:val="36"/>
+          <w:szCs w:val="36"/>
+          <w:shd w:fill="auto" w:val="clear"/>
+          <w:lang w:val="en-US" w:eastAsia="zh-CN" w:bidi="hi-IN"/>
+        </w:rPr>
+        <w:t>também</w:t>
+      </w:r>
+      <w:r>
+        <w:rPr>
+          <w:rFonts w:eastAsia="Times New Roman" w:cs="Times New Roman" w:ascii="Garamond" w:hAnsi="Garamond"/>
+          <w:color w:val="000000"/>
+          <w:kern w:val="0"/>
+          <w:sz w:val="36"/>
+          <w:szCs w:val="36"/>
+          <w:shd w:fill="auto" w:val="clear"/>
+          <w:lang w:val="en-US" w:eastAsia="zh-CN" w:bidi="hi-IN"/>
+        </w:rPr>
+        <w:t xml:space="preserve"> se vincula àqueles que </w:t>
+      </w:r>
+      <w:r>
+        <w:rPr>
+          <w:rFonts w:eastAsia="Times New Roman" w:cs="Times New Roman" w:ascii="Garamond" w:hAnsi="Garamond"/>
+          <w:color w:val="000000"/>
+          <w:kern w:val="0"/>
+          <w:sz w:val="36"/>
+          <w:szCs w:val="36"/>
+          <w:shd w:fill="auto" w:val="clear"/>
+          <w:lang w:val="en-US" w:eastAsia="zh-CN" w:bidi="hi-IN"/>
+        </w:rPr>
+        <w:t>vibram na mesma faixa que ele</w:t>
+      </w:r>
+      <w:r>
+        <w:rPr>
+          <w:rFonts w:eastAsia="Times New Roman" w:cs="Times New Roman" w:ascii="Garamond" w:hAnsi="Garamond"/>
+          <w:color w:val="000000"/>
+          <w:kern w:val="0"/>
+          <w:sz w:val="36"/>
+          <w:szCs w:val="36"/>
+          <w:shd w:fill="auto" w:val="clear"/>
+          <w:lang w:val="en-US" w:eastAsia="zh-CN" w:bidi="hi-IN"/>
+        </w:rPr>
+        <w:t>.</w:t>
+      </w:r>
+    </w:p>
+    <w:p>
+      <w:pPr>
+        <w:pStyle w:val="Normal"/>
+        <w:jc w:val="both"/>
+        <w:rPr>
+          <w:color w:val="auto"/>
+        </w:rPr>
+      </w:pPr>
+      <w:r>
+        <w:rPr/>
+      </w:r>
+    </w:p>
+    <w:p>
+      <w:pPr>
+        <w:pStyle w:val="Normal"/>
+        <w:jc w:val="both"/>
+        <w:rPr>
+          <w:color w:val="auto"/>
+        </w:rPr>
+      </w:pPr>
+      <w:r>
+        <w:rPr>
+          <w:rFonts w:eastAsia="Times New Roman" w:cs="Times New Roman" w:ascii="Garamond" w:hAnsi="Garamond"/>
+          <w:color w:val="000000"/>
+          <w:kern w:val="0"/>
+          <w:sz w:val="36"/>
+          <w:szCs w:val="36"/>
+          <w:shd w:fill="auto" w:val="clear"/>
+          <w:lang w:val="en-US" w:eastAsia="zh-CN" w:bidi="hi-IN"/>
+        </w:rPr>
+        <w:t xml:space="preserve">Mas qual é, afinal, a influência do pensamento na oração? Para entendermos isso, precisamos lembrar que tudo o que existe — seja material, seja imaterial — está envolvido por aquilo que chamamos de fluido cósmico universal. </w:t>
+      </w:r>
+    </w:p>
+    <w:p>
+      <w:pPr>
+        <w:pStyle w:val="Normal"/>
+        <w:jc w:val="both"/>
+        <w:rPr>
+          <w:color w:val="auto"/>
+        </w:rPr>
+      </w:pPr>
+      <w:r>
+        <w:rPr/>
+      </w:r>
+    </w:p>
+    <w:p>
+      <w:pPr>
+        <w:pStyle w:val="Normal"/>
+        <w:jc w:val="both"/>
+        <w:rPr>
+          <w:color w:val="auto"/>
+        </w:rPr>
+      </w:pPr>
+      <w:r>
+        <w:rPr>
+          <w:rFonts w:eastAsia="Times New Roman" w:cs="Times New Roman" w:ascii="Garamond" w:hAnsi="Garamond"/>
+          <w:color w:val="000000"/>
+          <w:kern w:val="0"/>
+          <w:sz w:val="36"/>
+          <w:szCs w:val="36"/>
+          <w:shd w:fill="auto" w:val="clear"/>
+          <w:lang w:val="en-US" w:eastAsia="zh-CN" w:bidi="hi-IN"/>
+        </w:rPr>
+        <w:t>Esse fluido preenche todo o universo. Qualquer lugar que possamos imaginar, dentro ou fora do nosso planeta, ali também estará o fluido cósmico universal.</w:t>
+      </w:r>
+    </w:p>
+    <w:p>
+      <w:pPr>
+        <w:pStyle w:val="Normal"/>
+        <w:jc w:val="both"/>
+        <w:rPr>
+          <w:color w:val="auto"/>
+        </w:rPr>
+      </w:pPr>
+      <w:r>
+        <w:rPr/>
+      </w:r>
+    </w:p>
+    <w:p>
+      <w:pPr>
+        <w:pStyle w:val="Normal"/>
+        <w:jc w:val="both"/>
+        <w:rPr>
+          <w:color w:val="auto"/>
+        </w:rPr>
+      </w:pPr>
+      <w:r>
+        <w:rPr>
+          <w:rFonts w:eastAsia="Times New Roman" w:cs="Times New Roman" w:ascii="Garamond" w:hAnsi="Garamond"/>
+          <w:color w:val="000000"/>
+          <w:kern w:val="0"/>
+          <w:sz w:val="36"/>
+          <w:szCs w:val="36"/>
+          <w:shd w:fill="auto" w:val="clear"/>
+          <w:lang w:val="en-US" w:eastAsia="zh-CN" w:bidi="hi-IN"/>
+        </w:rPr>
+        <w:t>Para facilitar a compreensão, podemos fazer uma comparação: assim como vivemos no ar que forma a atmosfera da Terra, também estamos envolvidos por esse fluido, que funciona como uma espécie de atmosfera espiritual.</w:t>
+      </w:r>
+    </w:p>
+    <w:p>
+      <w:pPr>
+        <w:pStyle w:val="Normal"/>
+        <w:jc w:val="both"/>
+        <w:rPr>
+          <w:color w:val="auto"/>
+        </w:rPr>
+      </w:pPr>
+      <w:r>
+        <w:rPr/>
       </w:r>
     </w:p>
     <w:p>
@@ -3051,79 +2618,301 @@
         </w:rPr>
       </w:pPr>
       <w:r>
-        <w:rPr>
-          <w:color w:val="auto"/>
-        </w:rPr>
-      </w:r>
-    </w:p>
-    <w:p>
-      <w:pPr>
-        <w:pStyle w:val="Normal"/>
-        <w:jc w:val="both"/>
-        <w:rPr>
-          <w:color w:val="auto"/>
-        </w:rPr>
-      </w:pPr>
-      <w:r>
-        <w:rPr>
-          <w:rFonts w:eastAsia="Times New Roman" w:cs="Times New Roman" w:ascii="Garamond" w:hAnsi="Garamond"/>
-          <w:color w:val="000000"/>
-          <w:kern w:val="0"/>
-          <w:sz w:val="36"/>
-          <w:szCs w:val="36"/>
-          <w:shd w:fill="auto" w:val="clear"/>
-          <w:lang w:val="en-US" w:eastAsia="zh-CN" w:bidi="hi-IN"/>
-        </w:rPr>
-        <w:t>A diferença é que o som só viaja por curtas distâncias, já que ele depende do ar para se propagar. O som não pode ir aonde não existe o ar - como, por exemplo, no espaço. Já o pensamento pode viajar por todo o universo já que seu meio de propagação é o Fluido Cósmico Universal.</w:t>
-      </w:r>
-    </w:p>
-    <w:p>
-      <w:pPr>
-        <w:pStyle w:val="Normal"/>
-        <w:jc w:val="both"/>
-        <w:rPr>
-          <w:color w:val="auto"/>
-        </w:rPr>
-      </w:pPr>
-      <w:r>
-        <w:rPr>
-          <w:color w:val="auto"/>
-        </w:rPr>
-      </w:r>
-    </w:p>
-    <w:p>
-      <w:pPr>
-        <w:pStyle w:val="Normal"/>
-        <w:jc w:val="both"/>
-        <w:rPr>
-          <w:color w:val="auto"/>
-        </w:rPr>
-      </w:pPr>
-      <w:r>
-        <w:rPr>
-          <w:rFonts w:eastAsia="Times New Roman" w:cs="Times New Roman" w:ascii="Garamond" w:hAnsi="Garamond"/>
-          <w:color w:val="000000"/>
-          <w:kern w:val="0"/>
-          <w:sz w:val="36"/>
-          <w:szCs w:val="36"/>
-          <w:shd w:fill="auto" w:val="clear"/>
-          <w:lang w:val="en-US" w:eastAsia="zh-CN" w:bidi="hi-IN"/>
-        </w:rPr>
-        <w:t xml:space="preserve">Quando dirigimos um pensamento a alguém — seja encarnado ou desencarnado — estabelece-se uma corrente no FCU que nos liga àquele a quem endereçamos nosso pensamento. Isso permite que nosso pensamento seja transmitido, assim como o ar transmite o som. </w:t>
-      </w:r>
-    </w:p>
-    <w:p>
-      <w:pPr>
-        <w:pStyle w:val="Normal"/>
-        <w:jc w:val="both"/>
-        <w:rPr>
-          <w:color w:val="auto"/>
-        </w:rPr>
-      </w:pPr>
-      <w:r>
-        <w:rPr>
-          <w:color w:val="auto"/>
-        </w:rPr>
+        <w:rPr/>
+      </w:r>
+    </w:p>
+    <w:p>
+      <w:pPr>
+        <w:pStyle w:val="Normal"/>
+        <w:jc w:val="both"/>
+        <w:rPr>
+          <w:color w:val="auto"/>
+        </w:rPr>
+      </w:pPr>
+      <w:r>
+        <w:rPr>
+          <w:rFonts w:eastAsia="Times New Roman" w:cs="Times New Roman" w:ascii="Garamond" w:hAnsi="Garamond"/>
+          <w:color w:val="000000"/>
+          <w:kern w:val="0"/>
+          <w:sz w:val="36"/>
+          <w:szCs w:val="36"/>
+          <w:shd w:fill="auto" w:val="clear"/>
+          <w:lang w:val="en-US" w:eastAsia="zh-CN" w:bidi="hi-IN"/>
+        </w:rPr>
+        <w:t xml:space="preserve">A diferença é que o som só viaja por curtas distâncias, já que ele depende do ar para se propagar. O som não pode ir aonde não existe o ar - como, por exemplo, no espaço. Já o pensamento pode viajar por todo o universo </w:t>
+      </w:r>
+      <w:r>
+        <w:rPr>
+          <w:rFonts w:eastAsia="Times New Roman" w:cs="Times New Roman" w:ascii="Garamond" w:hAnsi="Garamond"/>
+          <w:color w:val="000000"/>
+          <w:kern w:val="0"/>
+          <w:sz w:val="36"/>
+          <w:szCs w:val="36"/>
+          <w:shd w:fill="auto" w:val="clear"/>
+          <w:lang w:val="en-US" w:eastAsia="zh-CN" w:bidi="hi-IN"/>
+        </w:rPr>
+        <w:t>uma vez que</w:t>
+      </w:r>
+      <w:r>
+        <w:rPr>
+          <w:rFonts w:eastAsia="Times New Roman" w:cs="Times New Roman" w:ascii="Garamond" w:hAnsi="Garamond"/>
+          <w:color w:val="000000"/>
+          <w:kern w:val="0"/>
+          <w:sz w:val="36"/>
+          <w:szCs w:val="36"/>
+          <w:shd w:fill="auto" w:val="clear"/>
+          <w:lang w:val="en-US" w:eastAsia="zh-CN" w:bidi="hi-IN"/>
+        </w:rPr>
+        <w:t xml:space="preserve"> seu meio de propagação é o </w:t>
+      </w:r>
+      <w:r>
+        <w:rPr>
+          <w:rFonts w:eastAsia="Times New Roman" w:cs="Times New Roman" w:ascii="Garamond" w:hAnsi="Garamond"/>
+          <w:color w:val="000000"/>
+          <w:kern w:val="0"/>
+          <w:sz w:val="36"/>
+          <w:szCs w:val="36"/>
+          <w:shd w:fill="auto" w:val="clear"/>
+          <w:lang w:val="en-US" w:eastAsia="zh-CN" w:bidi="hi-IN"/>
+        </w:rPr>
+        <w:t>f</w:t>
+      </w:r>
+      <w:r>
+        <w:rPr>
+          <w:rFonts w:eastAsia="Times New Roman" w:cs="Times New Roman" w:ascii="Garamond" w:hAnsi="Garamond"/>
+          <w:color w:val="000000"/>
+          <w:kern w:val="0"/>
+          <w:sz w:val="36"/>
+          <w:szCs w:val="36"/>
+          <w:shd w:fill="auto" w:val="clear"/>
+          <w:lang w:val="en-US" w:eastAsia="zh-CN" w:bidi="hi-IN"/>
+        </w:rPr>
+        <w:t xml:space="preserve">luido </w:t>
+      </w:r>
+      <w:r>
+        <w:rPr>
+          <w:rFonts w:eastAsia="Times New Roman" w:cs="Times New Roman" w:ascii="Garamond" w:hAnsi="Garamond"/>
+          <w:color w:val="000000"/>
+          <w:kern w:val="0"/>
+          <w:sz w:val="36"/>
+          <w:szCs w:val="36"/>
+          <w:shd w:fill="auto" w:val="clear"/>
+          <w:lang w:val="en-US" w:eastAsia="zh-CN" w:bidi="hi-IN"/>
+        </w:rPr>
+        <w:t>c</w:t>
+      </w:r>
+      <w:r>
+        <w:rPr>
+          <w:rFonts w:eastAsia="Times New Roman" w:cs="Times New Roman" w:ascii="Garamond" w:hAnsi="Garamond"/>
+          <w:color w:val="000000"/>
+          <w:kern w:val="0"/>
+          <w:sz w:val="36"/>
+          <w:szCs w:val="36"/>
+          <w:shd w:fill="auto" w:val="clear"/>
+          <w:lang w:val="en-US" w:eastAsia="zh-CN" w:bidi="hi-IN"/>
+        </w:rPr>
+        <w:t xml:space="preserve">ósmico </w:t>
+      </w:r>
+      <w:r>
+        <w:rPr>
+          <w:rFonts w:eastAsia="Times New Roman" w:cs="Times New Roman" w:ascii="Garamond" w:hAnsi="Garamond"/>
+          <w:color w:val="000000"/>
+          <w:kern w:val="0"/>
+          <w:sz w:val="36"/>
+          <w:szCs w:val="36"/>
+          <w:shd w:fill="auto" w:val="clear"/>
+          <w:lang w:val="en-US" w:eastAsia="zh-CN" w:bidi="hi-IN"/>
+        </w:rPr>
+        <w:t>u</w:t>
+      </w:r>
+      <w:r>
+        <w:rPr>
+          <w:rFonts w:eastAsia="Times New Roman" w:cs="Times New Roman" w:ascii="Garamond" w:hAnsi="Garamond"/>
+          <w:color w:val="000000"/>
+          <w:kern w:val="0"/>
+          <w:sz w:val="36"/>
+          <w:szCs w:val="36"/>
+          <w:shd w:fill="auto" w:val="clear"/>
+          <w:lang w:val="en-US" w:eastAsia="zh-CN" w:bidi="hi-IN"/>
+        </w:rPr>
+        <w:t>niversal.</w:t>
+      </w:r>
+    </w:p>
+    <w:p>
+      <w:pPr>
+        <w:pStyle w:val="Normal"/>
+        <w:jc w:val="both"/>
+        <w:rPr>
+          <w:color w:val="auto"/>
+        </w:rPr>
+      </w:pPr>
+      <w:r>
+        <w:rPr/>
+      </w:r>
+    </w:p>
+    <w:p>
+      <w:pPr>
+        <w:pStyle w:val="Normal"/>
+        <w:jc w:val="both"/>
+        <w:rPr>
+          <w:color w:val="auto"/>
+        </w:rPr>
+      </w:pPr>
+      <w:r>
+        <w:rPr>
+          <w:rFonts w:eastAsia="Times New Roman" w:cs="Times New Roman" w:ascii="Garamond" w:hAnsi="Garamond"/>
+          <w:color w:val="000000"/>
+          <w:kern w:val="0"/>
+          <w:sz w:val="36"/>
+          <w:szCs w:val="36"/>
+          <w:shd w:fill="auto" w:val="clear"/>
+          <w:lang w:val="en-US" w:eastAsia="zh-CN" w:bidi="hi-IN"/>
+        </w:rPr>
+        <w:t xml:space="preserve">Quando </w:t>
+      </w:r>
+      <w:r>
+        <w:rPr>
+          <w:rFonts w:eastAsia="Times New Roman" w:cs="Times New Roman" w:ascii="Garamond" w:hAnsi="Garamond"/>
+          <w:color w:val="000000"/>
+          <w:kern w:val="0"/>
+          <w:sz w:val="36"/>
+          <w:szCs w:val="36"/>
+          <w:shd w:fill="auto" w:val="clear"/>
+          <w:lang w:val="en-US" w:eastAsia="zh-CN" w:bidi="hi-IN"/>
+        </w:rPr>
+        <w:t>endereçamos</w:t>
+      </w:r>
+      <w:r>
+        <w:rPr>
+          <w:rFonts w:eastAsia="Times New Roman" w:cs="Times New Roman" w:ascii="Garamond" w:hAnsi="Garamond"/>
+          <w:color w:val="000000"/>
+          <w:kern w:val="0"/>
+          <w:sz w:val="36"/>
+          <w:szCs w:val="36"/>
+          <w:shd w:fill="auto" w:val="clear"/>
+          <w:lang w:val="en-US" w:eastAsia="zh-CN" w:bidi="hi-IN"/>
+        </w:rPr>
+        <w:t xml:space="preserve"> um pensamento a alguém —  encarnado ou desencarnado — estabelece-se uma corrente no </w:t>
+      </w:r>
+      <w:r>
+        <w:rPr>
+          <w:rFonts w:eastAsia="Times New Roman" w:cs="Times New Roman" w:ascii="Garamond" w:hAnsi="Garamond"/>
+          <w:color w:val="000000"/>
+          <w:kern w:val="0"/>
+          <w:sz w:val="36"/>
+          <w:szCs w:val="36"/>
+          <w:shd w:fill="auto" w:val="clear"/>
+          <w:lang w:val="en-US" w:eastAsia="zh-CN" w:bidi="hi-IN"/>
+        </w:rPr>
+        <w:t>f</w:t>
+      </w:r>
+      <w:r>
+        <w:rPr>
+          <w:rFonts w:eastAsia="Times New Roman" w:cs="Times New Roman" w:ascii="Garamond" w:hAnsi="Garamond"/>
+          <w:color w:val="000000"/>
+          <w:kern w:val="0"/>
+          <w:sz w:val="36"/>
+          <w:szCs w:val="36"/>
+          <w:shd w:fill="auto" w:val="clear"/>
+          <w:lang w:val="en-US" w:eastAsia="zh-CN" w:bidi="hi-IN"/>
+        </w:rPr>
+        <w:t xml:space="preserve">luido </w:t>
+      </w:r>
+      <w:r>
+        <w:rPr>
+          <w:rFonts w:eastAsia="Times New Roman" w:cs="Times New Roman" w:ascii="Garamond" w:hAnsi="Garamond"/>
+          <w:color w:val="000000"/>
+          <w:kern w:val="0"/>
+          <w:sz w:val="36"/>
+          <w:szCs w:val="36"/>
+          <w:shd w:fill="auto" w:val="clear"/>
+          <w:lang w:val="en-US" w:eastAsia="zh-CN" w:bidi="hi-IN"/>
+        </w:rPr>
+        <w:t>c</w:t>
+      </w:r>
+      <w:r>
+        <w:rPr>
+          <w:rFonts w:eastAsia="Times New Roman" w:cs="Times New Roman" w:ascii="Garamond" w:hAnsi="Garamond"/>
+          <w:color w:val="000000"/>
+          <w:kern w:val="0"/>
+          <w:sz w:val="36"/>
+          <w:szCs w:val="36"/>
+          <w:shd w:fill="auto" w:val="clear"/>
+          <w:lang w:val="en-US" w:eastAsia="zh-CN" w:bidi="hi-IN"/>
+        </w:rPr>
+        <w:t xml:space="preserve">ósmico </w:t>
+      </w:r>
+      <w:r>
+        <w:rPr>
+          <w:rFonts w:eastAsia="Times New Roman" w:cs="Times New Roman" w:ascii="Garamond" w:hAnsi="Garamond"/>
+          <w:color w:val="000000"/>
+          <w:kern w:val="0"/>
+          <w:sz w:val="36"/>
+          <w:szCs w:val="36"/>
+          <w:shd w:fill="auto" w:val="clear"/>
+          <w:lang w:val="en-US" w:eastAsia="zh-CN" w:bidi="hi-IN"/>
+        </w:rPr>
+        <w:t>u</w:t>
+      </w:r>
+      <w:r>
+        <w:rPr>
+          <w:rFonts w:eastAsia="Times New Roman" w:cs="Times New Roman" w:ascii="Garamond" w:hAnsi="Garamond"/>
+          <w:color w:val="000000"/>
+          <w:kern w:val="0"/>
+          <w:sz w:val="36"/>
+          <w:szCs w:val="36"/>
+          <w:shd w:fill="auto" w:val="clear"/>
+          <w:lang w:val="en-US" w:eastAsia="zh-CN" w:bidi="hi-IN"/>
+        </w:rPr>
+        <w:t xml:space="preserve">niversal que nos liga </w:t>
+      </w:r>
+      <w:r>
+        <w:rPr>
+          <w:rFonts w:eastAsia="Times New Roman" w:cs="Times New Roman" w:ascii="Garamond" w:hAnsi="Garamond"/>
+          <w:color w:val="000000"/>
+          <w:kern w:val="0"/>
+          <w:sz w:val="36"/>
+          <w:szCs w:val="36"/>
+          <w:shd w:fill="auto" w:val="clear"/>
+          <w:lang w:val="en-US" w:eastAsia="zh-CN" w:bidi="hi-IN"/>
+        </w:rPr>
+        <w:t>a esse alguém</w:t>
+      </w:r>
+      <w:r>
+        <w:rPr>
+          <w:rFonts w:eastAsia="Times New Roman" w:cs="Times New Roman" w:ascii="Garamond" w:hAnsi="Garamond"/>
+          <w:color w:val="000000"/>
+          <w:kern w:val="0"/>
+          <w:sz w:val="36"/>
+          <w:szCs w:val="36"/>
+          <w:shd w:fill="auto" w:val="clear"/>
+          <w:lang w:val="en-US" w:eastAsia="zh-CN" w:bidi="hi-IN"/>
+        </w:rPr>
+        <w:t>. É</w:t>
+      </w:r>
+      <w:r>
+        <w:rPr>
+          <w:rFonts w:eastAsia="Times New Roman" w:cs="Times New Roman" w:ascii="Garamond" w:hAnsi="Garamond"/>
+          <w:color w:val="000000"/>
+          <w:kern w:val="0"/>
+          <w:sz w:val="36"/>
+          <w:szCs w:val="36"/>
+          <w:shd w:fill="auto" w:val="clear"/>
+          <w:lang w:val="en-US" w:eastAsia="zh-CN" w:bidi="hi-IN"/>
+        </w:rPr>
+        <w:t xml:space="preserve"> através dessa corrente que nosso pensamento viaja.</w:t>
+      </w:r>
+    </w:p>
+    <w:p>
+      <w:pPr>
+        <w:pStyle w:val="Normal"/>
+        <w:jc w:val="both"/>
+        <w:rPr>
+          <w:color w:val="auto"/>
+        </w:rPr>
+      </w:pPr>
+      <w:r>
+        <w:rPr/>
       </w:r>
     </w:p>
     <w:p>
@@ -3156,9 +2945,76 @@
         </w:rPr>
       </w:pPr>
       <w:r>
-        <w:rPr>
-          <w:color w:val="auto"/>
-        </w:rPr>
+        <w:rPr/>
+      </w:r>
+    </w:p>
+    <w:p>
+      <w:pPr>
+        <w:pStyle w:val="Normal"/>
+        <w:jc w:val="both"/>
+        <w:rPr>
+          <w:color w:val="auto"/>
+        </w:rPr>
+      </w:pPr>
+      <w:r>
+        <w:rPr/>
+      </w:r>
+    </w:p>
+    <w:p>
+      <w:pPr>
+        <w:pStyle w:val="Normal"/>
+        <w:jc w:val="both"/>
+        <w:rPr>
+          <w:color w:val="auto"/>
+        </w:rPr>
+      </w:pPr>
+      <w:r>
+        <w:rPr/>
+      </w:r>
+    </w:p>
+    <w:p>
+      <w:pPr>
+        <w:pStyle w:val="Normal"/>
+        <w:jc w:val="both"/>
+        <w:rPr>
+          <w:color w:val="auto"/>
+        </w:rPr>
+      </w:pPr>
+      <w:r>
+        <w:rPr/>
+      </w:r>
+    </w:p>
+    <w:p>
+      <w:pPr>
+        <w:pStyle w:val="Normal"/>
+        <w:jc w:val="both"/>
+        <w:rPr>
+          <w:color w:val="18A303"/>
+        </w:rPr>
+      </w:pPr>
+      <w:r>
+        <w:rPr>
+          <w:rFonts w:eastAsia="Times New Roman" w:cs="Times New Roman" w:ascii="Garamond" w:hAnsi="Garamond"/>
+          <w:color w:val="18A303"/>
+          <w:kern w:val="0"/>
+          <w:sz w:val="36"/>
+          <w:szCs w:val="36"/>
+          <w:shd w:fill="auto" w:val="clear"/>
+          <w:lang w:val="en-US" w:eastAsia="zh-CN" w:bidi="hi-IN"/>
+        </w:rPr>
+        <w:t>[ Revisado até aqui em 08/03/2026 ]</w:t>
+      </w:r>
+    </w:p>
+    <w:p>
+      <w:pPr>
+        <w:pStyle w:val="Normal"/>
+        <w:jc w:val="both"/>
+        <w:rPr>
+          <w:color w:val="auto"/>
+        </w:rPr>
+      </w:pPr>
+      <w:r>
+        <w:rPr/>
       </w:r>
     </w:p>
     <w:p>
@@ -3249,151 +3105,21 @@
           <w:shd w:fill="auto" w:val="clear"/>
           <w:lang w:val="en-US" w:eastAsia="zh-CN" w:bidi="hi-IN"/>
         </w:rPr>
-        <w:t xml:space="preserve">O mesmo se dá com a oração. Quanto mais amplificada ela estiver, vamos dizer </w:t>
-      </w:r>
-      <w:r>
-        <w:rPr>
-          <w:rFonts w:eastAsia="Times New Roman" w:cs="Times New Roman" w:ascii="Garamond" w:hAnsi="Garamond"/>
-          <w:color w:val="000000"/>
-          <w:kern w:val="0"/>
-          <w:sz w:val="36"/>
-          <w:szCs w:val="36"/>
-          <w:shd w:fill="auto" w:val="clear"/>
-          <w:lang w:val="en-US" w:eastAsia="zh-CN" w:bidi="hi-IN"/>
-        </w:rPr>
-        <w:t>assim</w:t>
-      </w:r>
-      <w:r>
-        <w:rPr>
-          <w:rFonts w:eastAsia="Times New Roman" w:cs="Times New Roman" w:ascii="Garamond" w:hAnsi="Garamond"/>
-          <w:color w:val="000000"/>
-          <w:kern w:val="0"/>
-          <w:sz w:val="36"/>
-          <w:szCs w:val="36"/>
-          <w:shd w:fill="auto" w:val="clear"/>
-          <w:lang w:val="en-US" w:eastAsia="zh-CN" w:bidi="hi-IN"/>
-        </w:rPr>
-        <w:t xml:space="preserve">, </w:t>
-      </w:r>
-      <w:r>
-        <w:rPr>
-          <w:rFonts w:eastAsia="Times New Roman" w:cs="Times New Roman" w:ascii="Garamond" w:hAnsi="Garamond"/>
-          <w:color w:val="000000"/>
-          <w:kern w:val="0"/>
-          <w:sz w:val="36"/>
-          <w:szCs w:val="36"/>
-          <w:shd w:fill="auto" w:val="clear"/>
-          <w:lang w:val="en-US" w:eastAsia="zh-CN" w:bidi="hi-IN"/>
-        </w:rPr>
-        <w:t>maior o seu alcance</w:t>
-      </w:r>
-      <w:r>
-        <w:rPr>
-          <w:rFonts w:eastAsia="Times New Roman" w:cs="Times New Roman" w:ascii="Garamond" w:hAnsi="Garamond"/>
-          <w:color w:val="000000"/>
-          <w:kern w:val="0"/>
-          <w:sz w:val="36"/>
-          <w:szCs w:val="36"/>
-          <w:shd w:fill="auto" w:val="clear"/>
-          <w:lang w:val="en-US" w:eastAsia="zh-CN" w:bidi="hi-IN"/>
-        </w:rPr>
-        <w:t xml:space="preserve">. </w:t>
-      </w:r>
-      <w:r>
-        <w:rPr>
-          <w:rFonts w:eastAsia="Times New Roman" w:cs="Times New Roman" w:ascii="Garamond" w:hAnsi="Garamond"/>
-          <w:color w:val="000000"/>
-          <w:kern w:val="0"/>
-          <w:sz w:val="36"/>
-          <w:szCs w:val="36"/>
-          <w:shd w:fill="auto" w:val="clear"/>
-          <w:lang w:val="en-US" w:eastAsia="zh-CN" w:bidi="hi-IN"/>
-        </w:rPr>
-        <w:t>E quais são os</w:t>
-      </w:r>
-      <w:r>
-        <w:rPr>
-          <w:rFonts w:eastAsia="Times New Roman" w:cs="Times New Roman" w:ascii="Garamond" w:hAnsi="Garamond"/>
-          <w:color w:val="000000"/>
-          <w:kern w:val="0"/>
-          <w:sz w:val="36"/>
-          <w:szCs w:val="36"/>
-          <w:shd w:fill="auto" w:val="clear"/>
-          <w:lang w:val="en-US" w:eastAsia="zh-CN" w:bidi="hi-IN"/>
-        </w:rPr>
-        <w:t xml:space="preserve"> amplificadores da  oração</w:t>
-      </w:r>
-      <w:r>
-        <w:rPr>
-          <w:rFonts w:eastAsia="Times New Roman" w:cs="Times New Roman" w:ascii="Garamond" w:hAnsi="Garamond"/>
-          <w:color w:val="000000"/>
-          <w:kern w:val="0"/>
-          <w:sz w:val="36"/>
-          <w:szCs w:val="36"/>
-          <w:shd w:fill="auto" w:val="clear"/>
-          <w:lang w:val="en-US" w:eastAsia="zh-CN" w:bidi="hi-IN"/>
-        </w:rPr>
-        <w:t>:</w:t>
-      </w:r>
-      <w:r>
-        <w:rPr>
-          <w:rFonts w:eastAsia="Times New Roman" w:cs="Times New Roman" w:ascii="Garamond" w:hAnsi="Garamond"/>
-          <w:color w:val="000000"/>
-          <w:kern w:val="0"/>
-          <w:sz w:val="36"/>
-          <w:szCs w:val="36"/>
-          <w:shd w:fill="auto" w:val="clear"/>
-          <w:lang w:val="en-US" w:eastAsia="zh-CN" w:bidi="hi-IN"/>
-        </w:rPr>
-        <w:t xml:space="preserve"> são os bons pensamentos, os bons sentimentos, o desejo de </w:t>
-      </w:r>
-      <w:r>
-        <w:rPr>
-          <w:rFonts w:eastAsia="Times New Roman" w:cs="Times New Roman" w:ascii="Garamond" w:hAnsi="Garamond"/>
-          <w:color w:val="000000"/>
-          <w:kern w:val="0"/>
-          <w:sz w:val="36"/>
-          <w:szCs w:val="36"/>
-          <w:shd w:fill="auto" w:val="clear"/>
-          <w:lang w:val="en-US" w:eastAsia="zh-CN" w:bidi="hi-IN"/>
-        </w:rPr>
-        <w:t>se alcançar algo</w:t>
-      </w:r>
-      <w:r>
-        <w:rPr>
-          <w:rFonts w:eastAsia="Times New Roman" w:cs="Times New Roman" w:ascii="Garamond" w:hAnsi="Garamond"/>
-          <w:color w:val="000000"/>
-          <w:kern w:val="0"/>
-          <w:sz w:val="36"/>
-          <w:szCs w:val="36"/>
-          <w:shd w:fill="auto" w:val="clear"/>
-          <w:lang w:val="en-US" w:eastAsia="zh-CN" w:bidi="hi-IN"/>
-        </w:rPr>
-        <w:t xml:space="preserve"> realmente útil e bom</w:t>
-      </w:r>
-      <w:r>
-        <w:rPr>
-          <w:rFonts w:eastAsia="Times New Roman" w:cs="Times New Roman" w:ascii="Garamond" w:hAnsi="Garamond"/>
-          <w:color w:val="000000"/>
-          <w:kern w:val="0"/>
-          <w:sz w:val="36"/>
-          <w:szCs w:val="36"/>
-          <w:shd w:fill="auto" w:val="clear"/>
-          <w:lang w:val="en-US" w:eastAsia="zh-CN" w:bidi="hi-IN"/>
-        </w:rPr>
-        <w:t>.</w:t>
-      </w:r>
-    </w:p>
-    <w:p>
-      <w:pPr>
-        <w:pStyle w:val="Normal"/>
-        <w:jc w:val="both"/>
-        <w:rPr>
-          <w:color w:val="auto"/>
-        </w:rPr>
-      </w:pPr>
-      <w:r>
-        <w:rPr/>
+        <w:t>O mesmo se dá com a oração. Quanto mais amplificada ela estiver, vamos dizer assim, maior o seu alcance. E quais são os amplificadores da  oração: são os bons pensamentos, os bons sentimentos, o desejo de se alcançar algo realmente útil e bom.</w:t>
+      </w:r>
+    </w:p>
+    <w:p>
+      <w:pPr>
+        <w:pStyle w:val="Normal"/>
+        <w:jc w:val="both"/>
+        <w:rPr>
+          <w:color w:val="auto"/>
+        </w:rPr>
+      </w:pPr>
+      <w:r>
+        <w:rPr>
+          <w:color w:val="auto"/>
+        </w:rPr>
       </w:r>
     </w:p>
     <w:p>
@@ -3503,100 +3229,44 @@
         </w:rPr>
       </w:pPr>
       <w:r>
-        <w:rPr/>
-      </w:r>
-    </w:p>
-    <w:p>
-      <w:pPr>
-        <w:pStyle w:val="Normal"/>
-        <w:jc w:val="both"/>
-        <w:rPr>
-          <w:color w:val="auto"/>
-        </w:rPr>
-      </w:pPr>
-      <w:r>
-        <w:rPr>
-          <w:rFonts w:eastAsia="Times New Roman" w:cs="Times New Roman" w:ascii="Garamond" w:hAnsi="Garamond"/>
-          <w:color w:val="000000"/>
-          <w:kern w:val="0"/>
-          <w:sz w:val="36"/>
-          <w:szCs w:val="36"/>
-          <w:shd w:fill="auto" w:val="clear"/>
-          <w:lang w:val="en-US" w:eastAsia="zh-CN" w:bidi="hi-IN"/>
-        </w:rPr>
-        <w:t xml:space="preserve">Ainda na passagem evangélica que estamos analisando, Jesus nos diz que Deus sabe do que necessitamos antes mesmo de pedirmos. </w:t>
-      </w:r>
-      <w:r>
-        <w:rPr>
-          <w:rFonts w:eastAsia="Times New Roman" w:cs="Times New Roman" w:ascii="Garamond" w:hAnsi="Garamond"/>
-          <w:color w:val="000000"/>
-          <w:kern w:val="0"/>
-          <w:sz w:val="36"/>
-          <w:szCs w:val="36"/>
-          <w:shd w:fill="auto" w:val="clear"/>
-          <w:lang w:val="en-US" w:eastAsia="zh-CN" w:bidi="hi-IN"/>
-        </w:rPr>
-        <w:t xml:space="preserve">Os  incrédulos </w:t>
-      </w:r>
-      <w:r>
-        <w:rPr>
-          <w:rFonts w:eastAsia="Times New Roman" w:cs="Times New Roman" w:ascii="Garamond" w:hAnsi="Garamond"/>
-          <w:color w:val="000000"/>
-          <w:kern w:val="0"/>
-          <w:sz w:val="36"/>
-          <w:szCs w:val="36"/>
-          <w:shd w:fill="auto" w:val="clear"/>
-          <w:lang w:val="en-US" w:eastAsia="zh-CN" w:bidi="hi-IN"/>
-        </w:rPr>
-        <w:t>geralmente dizem</w:t>
-      </w:r>
-      <w:r>
-        <w:rPr>
-          <w:rFonts w:eastAsia="Times New Roman" w:cs="Times New Roman" w:ascii="Garamond" w:hAnsi="Garamond"/>
-          <w:color w:val="000000"/>
-          <w:kern w:val="0"/>
-          <w:sz w:val="36"/>
-          <w:szCs w:val="36"/>
-          <w:shd w:fill="auto" w:val="clear"/>
-          <w:lang w:val="en-US" w:eastAsia="zh-CN" w:bidi="hi-IN"/>
-        </w:rPr>
-        <w:t xml:space="preserve">: se Deus conhece tudo aquilo de que necessitamos antes mesmo de pedirmos, por que </w:t>
-      </w:r>
-      <w:r>
-        <w:rPr>
-          <w:rFonts w:eastAsia="Times New Roman" w:cs="Times New Roman" w:ascii="Garamond" w:hAnsi="Garamond"/>
-          <w:color w:val="000000"/>
-          <w:kern w:val="0"/>
-          <w:sz w:val="36"/>
-          <w:szCs w:val="36"/>
-          <w:shd w:fill="auto" w:val="clear"/>
-          <w:lang w:val="en-US" w:eastAsia="zh-CN" w:bidi="hi-IN"/>
-        </w:rPr>
-        <w:t>precisamos</w:t>
-      </w:r>
-      <w:r>
-        <w:rPr>
-          <w:rFonts w:eastAsia="Times New Roman" w:cs="Times New Roman" w:ascii="Garamond" w:hAnsi="Garamond"/>
-          <w:color w:val="000000"/>
-          <w:kern w:val="0"/>
-          <w:sz w:val="36"/>
-          <w:szCs w:val="36"/>
-          <w:shd w:fill="auto" w:val="clear"/>
-          <w:lang w:val="en-US" w:eastAsia="zh-CN" w:bidi="hi-IN"/>
-        </w:rPr>
-        <w:t xml:space="preserve"> orar? </w:t>
-      </w:r>
-    </w:p>
-    <w:p>
-      <w:pPr>
-        <w:pStyle w:val="Normal"/>
-        <w:jc w:val="both"/>
-        <w:rPr>
-          <w:color w:val="auto"/>
-        </w:rPr>
-      </w:pPr>
-      <w:r>
-        <w:rPr/>
+        <w:rPr>
+          <w:color w:val="auto"/>
+        </w:rPr>
+      </w:r>
+    </w:p>
+    <w:p>
+      <w:pPr>
+        <w:pStyle w:val="Normal"/>
+        <w:jc w:val="both"/>
+        <w:rPr>
+          <w:color w:val="auto"/>
+        </w:rPr>
+      </w:pPr>
+      <w:r>
+        <w:rPr>
+          <w:rFonts w:eastAsia="Times New Roman" w:cs="Times New Roman" w:ascii="Garamond" w:hAnsi="Garamond"/>
+          <w:color w:val="000000"/>
+          <w:kern w:val="0"/>
+          <w:sz w:val="36"/>
+          <w:szCs w:val="36"/>
+          <w:shd w:fill="auto" w:val="clear"/>
+          <w:lang w:val="en-US" w:eastAsia="zh-CN" w:bidi="hi-IN"/>
+        </w:rPr>
+        <w:t xml:space="preserve">Ainda na passagem evangélica que estamos analisando, Jesus nos diz que Deus sabe do que necessitamos antes mesmo de pedirmos. Os  incrédulos geralmente dizem: se Deus conhece tudo aquilo de que necessitamos antes mesmo de pedirmos, por que precisamos orar? </w:t>
+      </w:r>
+    </w:p>
+    <w:p>
+      <w:pPr>
+        <w:pStyle w:val="Normal"/>
+        <w:jc w:val="both"/>
+        <w:rPr>
+          <w:color w:val="auto"/>
+        </w:rPr>
+      </w:pPr>
+      <w:r>
+        <w:rPr>
+          <w:color w:val="auto"/>
+        </w:rPr>
       </w:r>
     </w:p>
     <w:p>
@@ -5378,13 +5048,8 @@
       </w:pPr>
       <w:r>
         <w:rPr>
-          <w:rFonts w:eastAsia="Times New Roman" w:cs="Times New Roman" w:ascii="Garamond" w:hAnsi="Garamond"/>
-          <w:color w:val="000000"/>
-          <w:kern w:val="0"/>
-          <w:sz w:val="36"/>
-          <w:szCs w:val="36"/>
-          <w:shd w:fill="auto" w:val="clear"/>
-          <w:lang w:val="en-US" w:eastAsia="zh-CN" w:bidi="hi-IN"/>
+          <w:sz w:val="36"/>
+          <w:szCs w:val="36"/>
         </w:rPr>
       </w:r>
     </w:p>
@@ -5488,7 +5153,7 @@
         <w:bCs/>
         <w:rFonts w:ascii="Garamond" w:hAnsi="Garamond"/>
       </w:rPr>
-      <w:t>28</w:t>
+      <w:t>26</w:t>
     </w:r>
     <w:r>
       <w:rPr>

</xml_diff>

<commit_message>
11/03/2026 - 21:19 h
</commit_message>
<xml_diff>
--- a/Pedi e obtereis/Pedi e obtereis.docx
+++ b/Pedi e obtereis/Pedi e obtereis.docx
@@ -1681,6 +1681,1230 @@
         </w:rPr>
       </w:pPr>
       <w:r>
+        <w:rPr>
+          <w:color w:val="auto"/>
+        </w:rPr>
+      </w:r>
+    </w:p>
+    <w:p>
+      <w:pPr>
+        <w:pStyle w:val="Normal"/>
+        <w:jc w:val="both"/>
+        <w:rPr>
+          <w:color w:val="auto"/>
+        </w:rPr>
+      </w:pPr>
+      <w:r>
+        <w:rPr>
+          <w:rFonts w:eastAsia="Times New Roman" w:cs="Times New Roman" w:ascii="Garamond" w:hAnsi="Garamond"/>
+          <w:color w:val="000000"/>
+          <w:kern w:val="0"/>
+          <w:sz w:val="36"/>
+          <w:szCs w:val="36"/>
+          <w:shd w:fill="auto" w:val="clear"/>
+          <w:lang w:val="en-US" w:eastAsia="zh-CN" w:bidi="hi-IN"/>
+        </w:rPr>
+        <w:t xml:space="preserve">Quando tomamos consciência disso, a oração passa a ser um valioso recurso que podemos utilizar a toda hora e em qualquer lugar. </w:t>
+      </w:r>
+    </w:p>
+    <w:p>
+      <w:pPr>
+        <w:pStyle w:val="Normal"/>
+        <w:jc w:val="both"/>
+        <w:rPr>
+          <w:color w:val="auto"/>
+        </w:rPr>
+      </w:pPr>
+      <w:r>
+        <w:rPr>
+          <w:color w:val="auto"/>
+        </w:rPr>
+      </w:r>
+    </w:p>
+    <w:p>
+      <w:pPr>
+        <w:pStyle w:val="Normal"/>
+        <w:jc w:val="both"/>
+        <w:rPr>
+          <w:highlight w:val="none"/>
+          <w:shd w:fill="auto" w:val="clear"/>
+        </w:rPr>
+      </w:pPr>
+      <w:r>
+        <w:rPr>
+          <w:rFonts w:eastAsia="Times New Roman" w:cs="Times New Roman" w:ascii="Garamond" w:hAnsi="Garamond"/>
+          <w:color w:val="000000"/>
+          <w:kern w:val="0"/>
+          <w:sz w:val="36"/>
+          <w:szCs w:val="36"/>
+          <w:shd w:fill="auto" w:val="clear"/>
+          <w:lang w:val="en-US" w:eastAsia="zh-CN" w:bidi="hi-IN"/>
+        </w:rPr>
+        <w:t>Ao nos depararmos com alguém caído na calçada sob o efeito de álcool ou drogas, em vez de lançar um olhar de condenação, vamos orar e pedir a  Deus que dê forças àquele irmão para superar seus vícios e suas dificuldades.</w:t>
+      </w:r>
+    </w:p>
+    <w:p>
+      <w:pPr>
+        <w:pStyle w:val="Normal"/>
+        <w:jc w:val="both"/>
+        <w:rPr>
+          <w:highlight w:val="none"/>
+          <w:shd w:fill="auto" w:val="clear"/>
+        </w:rPr>
+      </w:pPr>
+      <w:r>
+        <w:rPr>
+          <w:shd w:fill="auto" w:val="clear"/>
+        </w:rPr>
+      </w:r>
+    </w:p>
+    <w:p>
+      <w:pPr>
+        <w:pStyle w:val="Normal"/>
+        <w:jc w:val="both"/>
+        <w:rPr>
+          <w:color w:val="auto"/>
+        </w:rPr>
+      </w:pPr>
+      <w:r>
+        <w:rPr>
+          <w:rFonts w:eastAsia="Times New Roman" w:cs="Times New Roman" w:ascii="Garamond" w:hAnsi="Garamond"/>
+          <w:color w:val="000000"/>
+          <w:kern w:val="0"/>
+          <w:sz w:val="36"/>
+          <w:szCs w:val="36"/>
+          <w:shd w:fill="auto" w:val="clear"/>
+          <w:lang w:val="en-US" w:eastAsia="zh-CN" w:bidi="hi-IN"/>
+        </w:rPr>
+        <w:t>Quando estivermos dirigindo e nos depararmos um acidente, também podemos orar pelas pessoas envolvidas naquela situação.</w:t>
+      </w:r>
+    </w:p>
+    <w:p>
+      <w:pPr>
+        <w:pStyle w:val="Normal"/>
+        <w:jc w:val="both"/>
+        <w:rPr>
+          <w:color w:val="auto"/>
+        </w:rPr>
+      </w:pPr>
+      <w:r>
+        <w:rPr>
+          <w:color w:val="auto"/>
+        </w:rPr>
+      </w:r>
+    </w:p>
+    <w:p>
+      <w:pPr>
+        <w:pStyle w:val="Normal"/>
+        <w:jc w:val="both"/>
+        <w:rPr>
+          <w:color w:val="auto"/>
+        </w:rPr>
+      </w:pPr>
+      <w:r>
+        <w:rPr>
+          <w:rFonts w:eastAsia="Times New Roman" w:cs="Times New Roman" w:ascii="Garamond" w:hAnsi="Garamond"/>
+          <w:color w:val="000000"/>
+          <w:kern w:val="0"/>
+          <w:sz w:val="36"/>
+          <w:szCs w:val="36"/>
+          <w:shd w:fill="auto" w:val="clear"/>
+          <w:lang w:val="en-US" w:eastAsia="zh-CN" w:bidi="hi-IN"/>
+        </w:rPr>
+        <w:t>Eu confesso que não entendo a curiosidade mórbida que muita gente tem em ver pessoas feridas ou mortas em acidentes. Já repararam que quando acontece um acidente de trânsito em uma pista, a outra pista também fica com o trânsito lento? É porque as pessoas dirigindo em sentido contrário reduzem a velocidade para ver o que aconteceu.</w:t>
+      </w:r>
+    </w:p>
+    <w:p>
+      <w:pPr>
+        <w:pStyle w:val="Normal"/>
+        <w:jc w:val="both"/>
+        <w:rPr>
+          <w:color w:val="auto"/>
+        </w:rPr>
+      </w:pPr>
+      <w:r>
+        <w:rPr>
+          <w:color w:val="auto"/>
+        </w:rPr>
+      </w:r>
+      <w:r>
+        <w:br w:type="page"/>
+      </w:r>
+    </w:p>
+    <w:p>
+      <w:pPr>
+        <w:pStyle w:val="Normal"/>
+        <w:jc w:val="both"/>
+        <w:rPr>
+          <w:color w:val="auto"/>
+        </w:rPr>
+      </w:pPr>
+      <w:r>
+        <w:rPr>
+          <w:rFonts w:eastAsia="Times New Roman" w:cs="Times New Roman" w:ascii="Garamond" w:hAnsi="Garamond"/>
+          <w:color w:val="000000"/>
+          <w:kern w:val="0"/>
+          <w:sz w:val="36"/>
+          <w:szCs w:val="36"/>
+          <w:shd w:fill="auto" w:val="clear"/>
+          <w:lang w:val="en-US" w:eastAsia="zh-CN" w:bidi="hi-IN"/>
+        </w:rPr>
+        <w:t>Se por acaso ainda somos tomados por esse tipo de curiosidade, vamos adotar outra postura. Em vez de querer ver o que aconteceu, elevemos um pensamento a Deus, pedindo socorro para os feridos e amparo aos que desencarnaram e seguimos nosso caminho.</w:t>
+      </w:r>
+    </w:p>
+    <w:p>
+      <w:pPr>
+        <w:pStyle w:val="Normal"/>
+        <w:jc w:val="both"/>
+        <w:rPr>
+          <w:color w:val="auto"/>
+        </w:rPr>
+      </w:pPr>
+      <w:r>
+        <w:rPr>
+          <w:color w:val="auto"/>
+        </w:rPr>
+      </w:r>
+    </w:p>
+    <w:p>
+      <w:pPr>
+        <w:pStyle w:val="Normal"/>
+        <w:jc w:val="both"/>
+        <w:rPr>
+          <w:color w:val="auto"/>
+        </w:rPr>
+      </w:pPr>
+      <w:r>
+        <w:rPr>
+          <w:rFonts w:eastAsia="Times New Roman" w:cs="Times New Roman" w:ascii="Garamond" w:hAnsi="Garamond"/>
+          <w:color w:val="000000"/>
+          <w:kern w:val="0"/>
+          <w:sz w:val="36"/>
+          <w:szCs w:val="36"/>
+          <w:shd w:fill="auto" w:val="clear"/>
+          <w:lang w:val="en-US" w:eastAsia="zh-CN" w:bidi="hi-IN"/>
+        </w:rPr>
+        <w:t>Retornando à passagem evangélica que estamos analisando, Jesus nos diz para não orarmos como os pagãos, que pensam que é pela quantidade de palavras que suas preces serão ouvidas. O Mestre diz ainda que Deus sabe do que precisamos antes mesmo de o perdirmos.</w:t>
+      </w:r>
+    </w:p>
+    <w:p>
+      <w:pPr>
+        <w:pStyle w:val="Normal"/>
+        <w:jc w:val="both"/>
+        <w:rPr>
+          <w:color w:val="auto"/>
+        </w:rPr>
+      </w:pPr>
+      <w:r>
+        <w:rPr>
+          <w:color w:val="auto"/>
+        </w:rPr>
+      </w:r>
+    </w:p>
+    <w:p>
+      <w:pPr>
+        <w:pStyle w:val="Normal"/>
+        <w:jc w:val="both"/>
+        <w:rPr>
+          <w:color w:val="auto"/>
+        </w:rPr>
+      </w:pPr>
+      <w:r>
+        <w:rPr>
+          <w:rFonts w:eastAsia="Times New Roman" w:cs="Times New Roman" w:ascii="Garamond" w:hAnsi="Garamond"/>
+          <w:color w:val="000000"/>
+          <w:kern w:val="0"/>
+          <w:sz w:val="36"/>
+          <w:szCs w:val="36"/>
+          <w:shd w:fill="auto" w:val="clear"/>
+          <w:lang w:val="en-US" w:eastAsia="zh-CN" w:bidi="hi-IN"/>
+        </w:rPr>
+        <w:t>Quem eram os pagãos a quem Jesus se refere? Eles eram principalmente os povos gentios do mundo greco-romano que não pertenciam à tradição judaica e que seguiam religiões politeístas comuns no Império Romano.</w:t>
+      </w:r>
+    </w:p>
+    <w:p>
+      <w:pPr>
+        <w:pStyle w:val="Normal"/>
+        <w:jc w:val="both"/>
+        <w:rPr>
+          <w:color w:val="auto"/>
+        </w:rPr>
+      </w:pPr>
+      <w:r>
+        <w:rPr>
+          <w:color w:val="auto"/>
+        </w:rPr>
+      </w:r>
+    </w:p>
+    <w:p>
+      <w:pPr>
+        <w:pStyle w:val="Normal"/>
+        <w:jc w:val="both"/>
+        <w:rPr>
+          <w:color w:val="auto"/>
+        </w:rPr>
+      </w:pPr>
+      <w:r>
+        <w:rPr>
+          <w:rFonts w:eastAsia="Times New Roman" w:cs="Times New Roman" w:ascii="Garamond" w:hAnsi="Garamond"/>
+          <w:color w:val="000000"/>
+          <w:kern w:val="0"/>
+          <w:sz w:val="36"/>
+          <w:szCs w:val="36"/>
+          <w:shd w:fill="auto" w:val="clear"/>
+          <w:lang w:val="en-US" w:eastAsia="zh-CN" w:bidi="hi-IN"/>
+        </w:rPr>
+        <w:t>Nessas práticas religiosas, era frequente a repetição longa de fórmulas e invocações, porque muitos acreditavam que o poder da oração estava na quantidade ou na exatidão em que as palavras eram pronunciadas.</w:t>
+      </w:r>
+    </w:p>
+    <w:p>
+      <w:pPr>
+        <w:pStyle w:val="Normal"/>
+        <w:jc w:val="both"/>
+        <w:rPr>
+          <w:color w:val="auto"/>
+        </w:rPr>
+      </w:pPr>
+      <w:r>
+        <w:rPr>
+          <w:color w:val="auto"/>
+        </w:rPr>
+      </w:r>
+    </w:p>
+    <w:p>
+      <w:pPr>
+        <w:pStyle w:val="Normal"/>
+        <w:jc w:val="both"/>
+        <w:rPr>
+          <w:color w:val="auto"/>
+        </w:rPr>
+      </w:pPr>
+      <w:r>
+        <w:rPr>
+          <w:rFonts w:eastAsia="Times New Roman" w:cs="Times New Roman" w:ascii="Garamond" w:hAnsi="Garamond"/>
+          <w:color w:val="000000"/>
+          <w:kern w:val="0"/>
+          <w:sz w:val="36"/>
+          <w:szCs w:val="36"/>
+          <w:shd w:fill="auto" w:val="clear"/>
+          <w:lang w:val="en-US" w:eastAsia="zh-CN" w:bidi="hi-IN"/>
+        </w:rPr>
+        <w:t>Ao fazer essa advertência, Jesus não condena a perseverança na prece; Ele critica o caráter mágico e mecânico que aquelas pessoas davam à oração.</w:t>
+      </w:r>
+    </w:p>
+    <w:p>
+      <w:pPr>
+        <w:pStyle w:val="Normal"/>
+        <w:jc w:val="both"/>
+        <w:rPr>
+          <w:color w:val="auto"/>
+        </w:rPr>
+      </w:pPr>
+      <w:r>
+        <w:rPr>
+          <w:color w:val="auto"/>
+        </w:rPr>
+      </w:r>
+    </w:p>
+    <w:p>
+      <w:pPr>
+        <w:pStyle w:val="Normal"/>
+        <w:jc w:val="both"/>
+        <w:rPr>
+          <w:color w:val="auto"/>
+        </w:rPr>
+      </w:pPr>
+      <w:r>
+        <w:rPr>
+          <w:rFonts w:eastAsia="Times New Roman" w:cs="Times New Roman" w:ascii="Garamond" w:hAnsi="Garamond"/>
+          <w:color w:val="000000"/>
+          <w:kern w:val="0"/>
+          <w:sz w:val="36"/>
+          <w:szCs w:val="36"/>
+          <w:shd w:fill="auto" w:val="clear"/>
+          <w:lang w:val="en-US" w:eastAsia="zh-CN" w:bidi="hi-IN"/>
+        </w:rPr>
+        <w:t xml:space="preserve">Jesus também nos recorda que Deus sabe do que necessitamos antes mesmo de pedirmos. Portanto, a oração não deve ser utilizada como um instrumento de pressão sobre Deus, mas como recurso de transformação interior. </w:t>
+      </w:r>
+    </w:p>
+    <w:p>
+      <w:pPr>
+        <w:pStyle w:val="Normal"/>
+        <w:jc w:val="both"/>
+        <w:rPr>
+          <w:color w:val="auto"/>
+        </w:rPr>
+      </w:pPr>
+      <w:r>
+        <w:rPr>
+          <w:color w:val="auto"/>
+        </w:rPr>
+      </w:r>
+    </w:p>
+    <w:p>
+      <w:pPr>
+        <w:pStyle w:val="Normal"/>
+        <w:jc w:val="both"/>
+        <w:rPr>
+          <w:color w:val="auto"/>
+        </w:rPr>
+      </w:pPr>
+      <w:r>
+        <w:rPr>
+          <w:rFonts w:eastAsia="Times New Roman" w:cs="Times New Roman" w:ascii="Garamond" w:hAnsi="Garamond"/>
+          <w:color w:val="000000"/>
+          <w:kern w:val="0"/>
+          <w:sz w:val="36"/>
+          <w:szCs w:val="36"/>
+          <w:shd w:fill="auto" w:val="clear"/>
+          <w:lang w:val="en-US" w:eastAsia="zh-CN" w:bidi="hi-IN"/>
+        </w:rPr>
+        <w:t>É um convite para substituirmos o automatismo pela sinceridade, a quantidade pela qualidade e a palavra vazia pelo sentimento verdadeiro.</w:t>
+      </w:r>
+    </w:p>
+    <w:p>
+      <w:pPr>
+        <w:pStyle w:val="Normal"/>
+        <w:jc w:val="both"/>
+        <w:rPr>
+          <w:color w:val="auto"/>
+        </w:rPr>
+      </w:pPr>
+      <w:r>
+        <w:rPr>
+          <w:color w:val="auto"/>
+        </w:rPr>
+      </w:r>
+    </w:p>
+    <w:p>
+      <w:pPr>
+        <w:pStyle w:val="Normal"/>
+        <w:jc w:val="both"/>
+        <w:rPr>
+          <w:color w:val="auto"/>
+        </w:rPr>
+      </w:pPr>
+      <w:r>
+        <w:rPr>
+          <w:rFonts w:eastAsia="Times New Roman" w:cs="Times New Roman" w:ascii="Garamond" w:hAnsi="Garamond"/>
+          <w:color w:val="000000"/>
+          <w:kern w:val="0"/>
+          <w:sz w:val="36"/>
+          <w:szCs w:val="36"/>
+          <w:shd w:fill="auto" w:val="clear"/>
+          <w:lang w:val="en-US" w:eastAsia="zh-CN" w:bidi="hi-IN"/>
+        </w:rPr>
+        <w:t>A bem da verdade, para Deus e Jesus nem mesmo as palavras que utilizamos em nossas preces são importantes. Embora o Pai Nosso e a Ave Maria sejam orações de uma riqueza e beleza profundas, podemos orar utilizando nossas próprias palavras.</w:t>
+      </w:r>
+    </w:p>
+    <w:p>
+      <w:pPr>
+        <w:pStyle w:val="Normal"/>
+        <w:jc w:val="both"/>
+        <w:rPr>
+          <w:color w:val="auto"/>
+        </w:rPr>
+      </w:pPr>
+      <w:r>
+        <w:rPr>
+          <w:color w:val="auto"/>
+        </w:rPr>
+      </w:r>
+    </w:p>
+    <w:p>
+      <w:pPr>
+        <w:pStyle w:val="Normal"/>
+        <w:jc w:val="both"/>
+        <w:rPr>
+          <w:color w:val="auto"/>
+        </w:rPr>
+      </w:pPr>
+      <w:r>
+        <w:rPr>
+          <w:rFonts w:eastAsia="Times New Roman" w:cs="Times New Roman" w:ascii="Garamond" w:hAnsi="Garamond"/>
+          <w:color w:val="000000"/>
+          <w:kern w:val="0"/>
+          <w:sz w:val="36"/>
+          <w:szCs w:val="36"/>
+          <w:shd w:fill="auto" w:val="clear"/>
+          <w:lang w:val="en-US" w:eastAsia="zh-CN" w:bidi="hi-IN"/>
+        </w:rPr>
+        <w:t>O que realmente importa é que nossas preces carreguem consigo humildade, sinceridade e fé. As palavras que utilizamos para nos expressarmos dessa forma, pouco importam.</w:t>
+      </w:r>
+    </w:p>
+    <w:p>
+      <w:pPr>
+        <w:pStyle w:val="Normal"/>
+        <w:jc w:val="both"/>
+        <w:rPr>
+          <w:color w:val="auto"/>
+        </w:rPr>
+      </w:pPr>
+      <w:r>
+        <w:rPr>
+          <w:color w:val="auto"/>
+        </w:rPr>
+      </w:r>
+      <w:r>
+        <w:br w:type="page"/>
+      </w:r>
+    </w:p>
+    <w:p>
+      <w:pPr>
+        <w:pStyle w:val="Normal"/>
+        <w:jc w:val="both"/>
+        <w:rPr>
+          <w:color w:val="auto"/>
+        </w:rPr>
+      </w:pPr>
+      <w:r>
+        <w:rPr>
+          <w:rFonts w:eastAsia="Times New Roman" w:cs="Times New Roman" w:ascii="Garamond" w:hAnsi="Garamond"/>
+          <w:color w:val="000000"/>
+          <w:kern w:val="0"/>
+          <w:sz w:val="36"/>
+          <w:szCs w:val="36"/>
+          <w:shd w:fill="auto" w:val="clear"/>
+          <w:lang w:val="en-US" w:eastAsia="zh-CN" w:bidi="hi-IN"/>
+        </w:rPr>
+        <w:t xml:space="preserve">E por quê deve ser assim? Bom, antes de mais nada é preciso relembrar que, de modo geral, o pensamento é a voz do Espírito. </w:t>
+      </w:r>
+    </w:p>
+    <w:p>
+      <w:pPr>
+        <w:pStyle w:val="Normal"/>
+        <w:jc w:val="both"/>
+        <w:rPr>
+          <w:color w:val="auto"/>
+        </w:rPr>
+      </w:pPr>
+      <w:r>
+        <w:rPr>
+          <w:color w:val="auto"/>
+        </w:rPr>
+      </w:r>
+    </w:p>
+    <w:p>
+      <w:pPr>
+        <w:pStyle w:val="Normal"/>
+        <w:jc w:val="both"/>
+        <w:rPr>
+          <w:color w:val="auto"/>
+        </w:rPr>
+      </w:pPr>
+      <w:r>
+        <w:rPr>
+          <w:rFonts w:eastAsia="Times New Roman" w:cs="Times New Roman" w:ascii="Garamond" w:hAnsi="Garamond"/>
+          <w:color w:val="000000"/>
+          <w:kern w:val="0"/>
+          <w:sz w:val="36"/>
+          <w:szCs w:val="36"/>
+          <w:shd w:fill="auto" w:val="clear"/>
+          <w:lang w:val="en-US" w:eastAsia="zh-CN" w:bidi="hi-IN"/>
+        </w:rPr>
+        <w:t>Pelo pensamento o Espírito vai aos lugares que lhe agradam e aos quais ele tenha acesso; pelo pensamento ele cria formas, se comunica com outros Espíritos e também se vincula àqueles que vibram na mesma faixa que ele.</w:t>
+      </w:r>
+    </w:p>
+    <w:p>
+      <w:pPr>
+        <w:pStyle w:val="Normal"/>
+        <w:jc w:val="both"/>
+        <w:rPr>
+          <w:color w:val="auto"/>
+        </w:rPr>
+      </w:pPr>
+      <w:r>
+        <w:rPr>
+          <w:color w:val="auto"/>
+        </w:rPr>
+      </w:r>
+    </w:p>
+    <w:p>
+      <w:pPr>
+        <w:pStyle w:val="Normal"/>
+        <w:jc w:val="both"/>
+        <w:rPr>
+          <w:color w:val="auto"/>
+        </w:rPr>
+      </w:pPr>
+      <w:r>
+        <w:rPr>
+          <w:rFonts w:eastAsia="Times New Roman" w:cs="Times New Roman" w:ascii="Garamond" w:hAnsi="Garamond"/>
+          <w:color w:val="000000"/>
+          <w:kern w:val="0"/>
+          <w:sz w:val="36"/>
+          <w:szCs w:val="36"/>
+          <w:shd w:fill="auto" w:val="clear"/>
+          <w:lang w:val="en-US" w:eastAsia="zh-CN" w:bidi="hi-IN"/>
+        </w:rPr>
+        <w:t xml:space="preserve">Mas qual é, afinal, a influência do pensamento na oração? Para entendermos isso, precisamos lembrar que tudo o que existe — seja material, seja imaterial — está envolvido por aquilo que chamamos de fluido cósmico universal. </w:t>
+      </w:r>
+    </w:p>
+    <w:p>
+      <w:pPr>
+        <w:pStyle w:val="Normal"/>
+        <w:jc w:val="both"/>
+        <w:rPr>
+          <w:color w:val="auto"/>
+        </w:rPr>
+      </w:pPr>
+      <w:r>
+        <w:rPr>
+          <w:color w:val="auto"/>
+        </w:rPr>
+      </w:r>
+    </w:p>
+    <w:p>
+      <w:pPr>
+        <w:pStyle w:val="Normal"/>
+        <w:jc w:val="both"/>
+        <w:rPr>
+          <w:color w:val="auto"/>
+        </w:rPr>
+      </w:pPr>
+      <w:r>
+        <w:rPr>
+          <w:rFonts w:eastAsia="Times New Roman" w:cs="Times New Roman" w:ascii="Garamond" w:hAnsi="Garamond"/>
+          <w:color w:val="000000"/>
+          <w:kern w:val="0"/>
+          <w:sz w:val="36"/>
+          <w:szCs w:val="36"/>
+          <w:shd w:fill="auto" w:val="clear"/>
+          <w:lang w:val="en-US" w:eastAsia="zh-CN" w:bidi="hi-IN"/>
+        </w:rPr>
+        <w:t>Esse fluido preenche todo o universo. Qualquer lugar que possamos imaginar, dentro ou fora do nosso planeta, ali também estará o fluido cósmico universal.</w:t>
+      </w:r>
+    </w:p>
+    <w:p>
+      <w:pPr>
+        <w:pStyle w:val="Normal"/>
+        <w:jc w:val="both"/>
+        <w:rPr>
+          <w:color w:val="auto"/>
+        </w:rPr>
+      </w:pPr>
+      <w:r>
+        <w:rPr>
+          <w:color w:val="auto"/>
+        </w:rPr>
+      </w:r>
+    </w:p>
+    <w:p>
+      <w:pPr>
+        <w:pStyle w:val="Normal"/>
+        <w:jc w:val="both"/>
+        <w:rPr>
+          <w:color w:val="auto"/>
+        </w:rPr>
+      </w:pPr>
+      <w:r>
+        <w:rPr>
+          <w:rFonts w:eastAsia="Times New Roman" w:cs="Times New Roman" w:ascii="Garamond" w:hAnsi="Garamond"/>
+          <w:color w:val="000000"/>
+          <w:kern w:val="0"/>
+          <w:sz w:val="36"/>
+          <w:szCs w:val="36"/>
+          <w:shd w:fill="auto" w:val="clear"/>
+          <w:lang w:val="en-US" w:eastAsia="zh-CN" w:bidi="hi-IN"/>
+        </w:rPr>
+        <w:t>Para facilitar a compreensão, podemos fazer uma comparação: assim como vivemos no ar que forma a atmosfera da Terra, também estamos envolvidos por esse fluido, que funciona como uma espécie de atmosfera espiritual.</w:t>
+      </w:r>
+    </w:p>
+    <w:p>
+      <w:pPr>
+        <w:pStyle w:val="Normal"/>
+        <w:jc w:val="both"/>
+        <w:rPr>
+          <w:color w:val="auto"/>
+        </w:rPr>
+      </w:pPr>
+      <w:r>
+        <w:rPr>
+          <w:color w:val="auto"/>
+        </w:rPr>
+      </w:r>
+    </w:p>
+    <w:p>
+      <w:pPr>
+        <w:pStyle w:val="Normal"/>
+        <w:jc w:val="both"/>
+        <w:rPr>
+          <w:color w:val="auto"/>
+        </w:rPr>
+      </w:pPr>
+      <w:r>
+        <w:rPr>
+          <w:rFonts w:eastAsia="Times New Roman" w:cs="Times New Roman" w:ascii="Garamond" w:hAnsi="Garamond"/>
+          <w:color w:val="000000"/>
+          <w:kern w:val="0"/>
+          <w:sz w:val="36"/>
+          <w:szCs w:val="36"/>
+          <w:shd w:fill="auto" w:val="clear"/>
+          <w:lang w:val="en-US" w:eastAsia="zh-CN" w:bidi="hi-IN"/>
+        </w:rPr>
+        <w:t xml:space="preserve">Então, quando nós pensamos ou oramos, nossa vontade coloca esse fluido em movimento. Ele funciona como um veículo do pensamento, da mesma forma que o ar é o veículo do som. </w:t>
+      </w:r>
+    </w:p>
+    <w:p>
+      <w:pPr>
+        <w:pStyle w:val="Normal"/>
+        <w:jc w:val="both"/>
+        <w:rPr>
+          <w:color w:val="auto"/>
+        </w:rPr>
+      </w:pPr>
+      <w:r>
+        <w:rPr>
+          <w:color w:val="auto"/>
+        </w:rPr>
+      </w:r>
+    </w:p>
+    <w:p>
+      <w:pPr>
+        <w:pStyle w:val="Normal"/>
+        <w:jc w:val="both"/>
+        <w:rPr>
+          <w:color w:val="auto"/>
+        </w:rPr>
+      </w:pPr>
+      <w:r>
+        <w:rPr>
+          <w:rFonts w:eastAsia="Times New Roman" w:cs="Times New Roman" w:ascii="Garamond" w:hAnsi="Garamond"/>
+          <w:color w:val="000000"/>
+          <w:kern w:val="0"/>
+          <w:sz w:val="36"/>
+          <w:szCs w:val="36"/>
+          <w:shd w:fill="auto" w:val="clear"/>
+          <w:lang w:val="en-US" w:eastAsia="zh-CN" w:bidi="hi-IN"/>
+        </w:rPr>
+        <w:t>A diferença é que o som só viaja por curtas distâncias, já que ele depende do ar para se propagar. O som não pode ir aonde não existe o ar - como, por exemplo, no espaço. Já o pensamento pode viajar por todo o universo uma vez que seu meio de propagação é o fluido cósmico universal.</w:t>
+      </w:r>
+    </w:p>
+    <w:p>
+      <w:pPr>
+        <w:pStyle w:val="Normal"/>
+        <w:jc w:val="both"/>
+        <w:rPr>
+          <w:color w:val="auto"/>
+        </w:rPr>
+      </w:pPr>
+      <w:r>
+        <w:rPr>
+          <w:color w:val="auto"/>
+        </w:rPr>
+      </w:r>
+    </w:p>
+    <w:p>
+      <w:pPr>
+        <w:pStyle w:val="Normal"/>
+        <w:jc w:val="both"/>
+        <w:rPr>
+          <w:color w:val="auto"/>
+        </w:rPr>
+      </w:pPr>
+      <w:r>
+        <w:rPr>
+          <w:rFonts w:eastAsia="Times New Roman" w:cs="Times New Roman" w:ascii="Garamond" w:hAnsi="Garamond"/>
+          <w:color w:val="000000"/>
+          <w:kern w:val="0"/>
+          <w:sz w:val="36"/>
+          <w:szCs w:val="36"/>
+          <w:shd w:fill="auto" w:val="clear"/>
+          <w:lang w:val="en-US" w:eastAsia="zh-CN" w:bidi="hi-IN"/>
+        </w:rPr>
+        <w:t>Quando endereçamos um pensamento a alguém —  encarnado ou desencarnado — estabelece-se uma corrente no fluido cósmico universal que nos liga a esse alguém. É através dessa corrente que nosso pensamento viaja.</w:t>
+      </w:r>
+    </w:p>
+    <w:p>
+      <w:pPr>
+        <w:pStyle w:val="Normal"/>
+        <w:jc w:val="both"/>
+        <w:rPr>
+          <w:color w:val="auto"/>
+        </w:rPr>
+      </w:pPr>
+      <w:r>
+        <w:rPr>
+          <w:color w:val="auto"/>
+        </w:rPr>
+      </w:r>
+    </w:p>
+    <w:p>
+      <w:pPr>
+        <w:pStyle w:val="Normal"/>
+        <w:jc w:val="both"/>
+        <w:rPr>
+          <w:color w:val="auto"/>
+        </w:rPr>
+      </w:pPr>
+      <w:r>
+        <w:rPr>
+          <w:rFonts w:eastAsia="Times New Roman" w:cs="Times New Roman" w:ascii="Garamond" w:hAnsi="Garamond"/>
+          <w:color w:val="000000"/>
+          <w:kern w:val="0"/>
+          <w:sz w:val="36"/>
+          <w:szCs w:val="36"/>
+          <w:shd w:fill="auto" w:val="clear"/>
+          <w:lang w:val="en-US" w:eastAsia="zh-CN" w:bidi="hi-IN"/>
+        </w:rPr>
+        <w:t>Quando oramos</w:t>
+      </w:r>
+      <w:r>
+        <w:rPr>
+          <w:rFonts w:eastAsia="Times New Roman" w:cs="Times New Roman" w:ascii="Garamond" w:hAnsi="Garamond"/>
+          <w:color w:val="000000"/>
+          <w:kern w:val="0"/>
+          <w:sz w:val="36"/>
+          <w:szCs w:val="36"/>
+          <w:shd w:fill="auto" w:val="clear"/>
+          <w:lang w:val="en-US" w:eastAsia="zh-CN" w:bidi="hi-IN"/>
+        </w:rPr>
+        <w:t>, a força dessa corrente depende</w:t>
+      </w:r>
+      <w:r>
+        <w:rPr>
+          <w:rFonts w:eastAsia="Times New Roman" w:cs="Times New Roman" w:ascii="Garamond" w:hAnsi="Garamond"/>
+          <w:color w:val="000000"/>
+          <w:kern w:val="0"/>
+          <w:sz w:val="36"/>
+          <w:szCs w:val="36"/>
+          <w:shd w:fill="auto" w:val="clear"/>
+          <w:lang w:val="en-US" w:eastAsia="zh-CN" w:bidi="hi-IN"/>
+        </w:rPr>
+        <w:t xml:space="preserve"> </w:t>
+      </w:r>
+      <w:r>
+        <w:rPr>
+          <w:rFonts w:eastAsia="Times New Roman" w:cs="Times New Roman" w:ascii="Garamond" w:hAnsi="Garamond"/>
+          <w:color w:val="000000"/>
+          <w:kern w:val="0"/>
+          <w:sz w:val="36"/>
+          <w:szCs w:val="36"/>
+          <w:shd w:fill="auto" w:val="clear"/>
+          <w:lang w:val="en-US" w:eastAsia="zh-CN" w:bidi="hi-IN"/>
+        </w:rPr>
+        <w:t>da qualidade do</w:t>
+      </w:r>
+      <w:r>
+        <w:rPr>
+          <w:rFonts w:eastAsia="Times New Roman" w:cs="Times New Roman" w:ascii="Garamond" w:hAnsi="Garamond"/>
+          <w:color w:val="000000"/>
+          <w:kern w:val="0"/>
+          <w:sz w:val="36"/>
+          <w:szCs w:val="36"/>
+          <w:shd w:fill="auto" w:val="clear"/>
+          <w:lang w:val="en-US" w:eastAsia="zh-CN" w:bidi="hi-IN"/>
+        </w:rPr>
+        <w:t xml:space="preserve"> nosso</w:t>
+      </w:r>
+      <w:r>
+        <w:rPr>
+          <w:rFonts w:eastAsia="Times New Roman" w:cs="Times New Roman" w:ascii="Garamond" w:hAnsi="Garamond"/>
+          <w:color w:val="000000"/>
+          <w:kern w:val="0"/>
+          <w:sz w:val="36"/>
+          <w:szCs w:val="36"/>
+          <w:shd w:fill="auto" w:val="clear"/>
+          <w:lang w:val="en-US" w:eastAsia="zh-CN" w:bidi="hi-IN"/>
+        </w:rPr>
+        <w:t xml:space="preserve"> pensamento e da </w:t>
+      </w:r>
+      <w:r>
+        <w:rPr>
+          <w:rFonts w:eastAsia="Times New Roman" w:cs="Times New Roman" w:ascii="Garamond" w:hAnsi="Garamond"/>
+          <w:color w:val="000000"/>
+          <w:kern w:val="0"/>
+          <w:sz w:val="36"/>
+          <w:szCs w:val="36"/>
+          <w:shd w:fill="auto" w:val="clear"/>
+          <w:lang w:val="en-US" w:eastAsia="zh-CN" w:bidi="hi-IN"/>
+        </w:rPr>
+        <w:t xml:space="preserve">nossa </w:t>
+      </w:r>
+      <w:r>
+        <w:rPr>
+          <w:rFonts w:eastAsia="Times New Roman" w:cs="Times New Roman" w:ascii="Garamond" w:hAnsi="Garamond"/>
+          <w:color w:val="000000"/>
+          <w:kern w:val="0"/>
+          <w:sz w:val="36"/>
+          <w:szCs w:val="36"/>
+          <w:shd w:fill="auto" w:val="clear"/>
+          <w:lang w:val="en-US" w:eastAsia="zh-CN" w:bidi="hi-IN"/>
+        </w:rPr>
+        <w:t xml:space="preserve">vontade. É por isso que os Espíritos podem ouvir as preces que lhes são dirigidas, onde quer que estejam. </w:t>
+      </w:r>
+      <w:r>
+        <w:rPr>
+          <w:rFonts w:eastAsia="Times New Roman" w:cs="Times New Roman" w:ascii="Garamond" w:hAnsi="Garamond"/>
+          <w:color w:val="000000"/>
+          <w:kern w:val="0"/>
+          <w:sz w:val="36"/>
+          <w:szCs w:val="36"/>
+          <w:shd w:fill="auto" w:val="clear"/>
+          <w:lang w:val="en-US" w:eastAsia="zh-CN" w:bidi="hi-IN"/>
+        </w:rPr>
+        <w:t>Pela</w:t>
+      </w:r>
+      <w:r>
+        <w:rPr>
+          <w:rFonts w:eastAsia="Times New Roman" w:cs="Times New Roman" w:ascii="Garamond" w:hAnsi="Garamond"/>
+          <w:color w:val="000000"/>
+          <w:kern w:val="0"/>
+          <w:sz w:val="36"/>
+          <w:szCs w:val="36"/>
+          <w:shd w:fill="auto" w:val="clear"/>
+          <w:lang w:val="en-US" w:eastAsia="zh-CN" w:bidi="hi-IN"/>
+        </w:rPr>
+        <w:t xml:space="preserve"> mesma razão os Espíritos podem nos inspirar e estabelecer relações espirituais mesmo à distância.</w:t>
+      </w:r>
+    </w:p>
+    <w:p>
+      <w:pPr>
+        <w:pStyle w:val="Normal"/>
+        <w:jc w:val="both"/>
+        <w:rPr>
+          <w:color w:val="auto"/>
+        </w:rPr>
+      </w:pPr>
+      <w:r>
+        <w:rPr>
+          <w:color w:val="auto"/>
+        </w:rPr>
+      </w:r>
+    </w:p>
+    <w:p>
+      <w:pPr>
+        <w:pStyle w:val="Normal"/>
+        <w:jc w:val="both"/>
+        <w:rPr>
+          <w:color w:val="auto"/>
+        </w:rPr>
+      </w:pPr>
+      <w:r>
+        <w:rPr>
+          <w:color w:val="auto"/>
+        </w:rPr>
+      </w:r>
+    </w:p>
+    <w:p>
+      <w:pPr>
+        <w:pStyle w:val="Normal"/>
+        <w:jc w:val="both"/>
+        <w:rPr>
+          <w:color w:val="auto"/>
+        </w:rPr>
+      </w:pPr>
+      <w:r>
+        <w:rPr>
+          <w:color w:val="auto"/>
+        </w:rPr>
+      </w:r>
+    </w:p>
+    <w:p>
+      <w:pPr>
+        <w:pStyle w:val="Normal"/>
+        <w:jc w:val="both"/>
+        <w:rPr>
+          <w:color w:val="auto"/>
+        </w:rPr>
+      </w:pPr>
+      <w:r>
+        <w:rPr>
+          <w:color w:val="auto"/>
+        </w:rPr>
+      </w:r>
+    </w:p>
+    <w:p>
+      <w:pPr>
+        <w:pStyle w:val="Normal"/>
+        <w:jc w:val="both"/>
+        <w:rPr>
+          <w:color w:val="18A303"/>
+        </w:rPr>
+      </w:pPr>
+      <w:r>
+        <w:rPr>
+          <w:rFonts w:eastAsia="Times New Roman" w:cs="Times New Roman" w:ascii="Garamond" w:hAnsi="Garamond"/>
+          <w:color w:val="18A303"/>
+          <w:kern w:val="0"/>
+          <w:sz w:val="36"/>
+          <w:szCs w:val="36"/>
+          <w:shd w:fill="auto" w:val="clear"/>
+          <w:lang w:val="en-US" w:eastAsia="zh-CN" w:bidi="hi-IN"/>
+        </w:rPr>
+        <w:t>[ Revisado até aqui em 08/03/2026 ]</w:t>
+      </w:r>
+    </w:p>
+    <w:p>
+      <w:pPr>
+        <w:pStyle w:val="Normal"/>
+        <w:jc w:val="both"/>
+        <w:rPr>
+          <w:color w:val="auto"/>
+        </w:rPr>
+      </w:pPr>
+      <w:r>
+        <w:rPr>
+          <w:color w:val="auto"/>
+        </w:rPr>
+      </w:r>
+    </w:p>
+    <w:p>
+      <w:pPr>
+        <w:pStyle w:val="Normal"/>
+        <w:jc w:val="both"/>
+        <w:rPr>
+          <w:color w:val="auto"/>
+        </w:rPr>
+      </w:pPr>
+      <w:r>
+        <w:rPr>
+          <w:rFonts w:eastAsia="Times New Roman" w:cs="Times New Roman" w:ascii="Garamond" w:hAnsi="Garamond"/>
+          <w:color w:val="000000"/>
+          <w:kern w:val="0"/>
+          <w:sz w:val="36"/>
+          <w:szCs w:val="36"/>
+          <w:shd w:fill="auto" w:val="clear"/>
+          <w:lang w:val="en-US" w:eastAsia="zh-CN" w:bidi="hi-IN"/>
+        </w:rPr>
+        <w:t>Podemos fazer uma comparação para compreender essa dinâmica. As pessoas que estão mais ao fundo do auditório só conseguem ouvir o que estou dizendo porque o som da minha voz foi captado pelo microfone, passou por um amplificador e foi enviado para as caixas de som que estão nas laterais do salão.</w:t>
+      </w:r>
+    </w:p>
+    <w:p>
+      <w:pPr>
+        <w:pStyle w:val="Normal"/>
+        <w:jc w:val="both"/>
+        <w:rPr>
+          <w:color w:val="auto"/>
+        </w:rPr>
+      </w:pPr>
+      <w:r>
+        <w:rPr>
+          <w:color w:val="auto"/>
+        </w:rPr>
+      </w:r>
+    </w:p>
+    <w:p>
+      <w:pPr>
+        <w:pStyle w:val="Normal"/>
+        <w:jc w:val="both"/>
+        <w:rPr>
+          <w:color w:val="auto"/>
+        </w:rPr>
+      </w:pPr>
+      <w:r>
+        <w:rPr>
+          <w:rFonts w:eastAsia="Times New Roman" w:cs="Times New Roman" w:ascii="Garamond" w:hAnsi="Garamond"/>
+          <w:color w:val="000000"/>
+          <w:kern w:val="0"/>
+          <w:sz w:val="36"/>
+          <w:szCs w:val="36"/>
+          <w:shd w:fill="auto" w:val="clear"/>
+          <w:lang w:val="en-US" w:eastAsia="zh-CN" w:bidi="hi-IN"/>
+        </w:rPr>
+        <w:t>Sem esse processo de amplificação, quem está mais distante de mim não conseguiria me ouvir, a menos que eu falasse muito alto.</w:t>
+      </w:r>
+    </w:p>
+    <w:p>
+      <w:pPr>
+        <w:pStyle w:val="Normal"/>
+        <w:jc w:val="both"/>
+        <w:rPr>
+          <w:color w:val="auto"/>
+        </w:rPr>
+      </w:pPr>
+      <w:r>
+        <w:rPr>
+          <w:color w:val="auto"/>
+        </w:rPr>
+      </w:r>
+    </w:p>
+    <w:p>
+      <w:pPr>
+        <w:pStyle w:val="Normal"/>
+        <w:jc w:val="both"/>
+        <w:rPr>
+          <w:color w:val="auto"/>
+        </w:rPr>
+      </w:pPr>
+      <w:r>
+        <w:rPr>
+          <w:rFonts w:eastAsia="Times New Roman" w:cs="Times New Roman" w:ascii="Garamond" w:hAnsi="Garamond"/>
+          <w:color w:val="000000"/>
+          <w:kern w:val="0"/>
+          <w:sz w:val="36"/>
+          <w:szCs w:val="36"/>
+          <w:shd w:fill="auto" w:val="clear"/>
+          <w:lang w:val="en-US" w:eastAsia="zh-CN" w:bidi="hi-IN"/>
+        </w:rPr>
+        <w:t>O mesmo se dá com a oração</w:t>
+      </w:r>
+      <w:r>
+        <w:rPr>
+          <w:rFonts w:eastAsia="Times New Roman" w:cs="Times New Roman" w:ascii="Garamond" w:hAnsi="Garamond"/>
+          <w:color w:val="000000"/>
+          <w:kern w:val="0"/>
+          <w:sz w:val="36"/>
+          <w:szCs w:val="36"/>
+          <w:shd w:fill="auto" w:val="clear"/>
+          <w:lang w:val="en-US" w:eastAsia="zh-CN" w:bidi="hi-IN"/>
+        </w:rPr>
+        <w:t>:</w:t>
+      </w:r>
+      <w:r>
+        <w:rPr>
+          <w:rFonts w:eastAsia="Times New Roman" w:cs="Times New Roman" w:ascii="Garamond" w:hAnsi="Garamond"/>
+          <w:color w:val="000000"/>
+          <w:kern w:val="0"/>
+          <w:sz w:val="36"/>
+          <w:szCs w:val="36"/>
+          <w:shd w:fill="auto" w:val="clear"/>
+          <w:lang w:val="en-US" w:eastAsia="zh-CN" w:bidi="hi-IN"/>
+        </w:rPr>
+        <w:t xml:space="preserve"> </w:t>
+      </w:r>
+      <w:r>
+        <w:rPr>
+          <w:rFonts w:eastAsia="Times New Roman" w:cs="Times New Roman" w:ascii="Garamond" w:hAnsi="Garamond"/>
+          <w:color w:val="000000"/>
+          <w:kern w:val="0"/>
+          <w:sz w:val="36"/>
+          <w:szCs w:val="36"/>
+          <w:shd w:fill="auto" w:val="clear"/>
+          <w:lang w:val="en-US" w:eastAsia="zh-CN" w:bidi="hi-IN"/>
+        </w:rPr>
+        <w:t>q</w:t>
+      </w:r>
+      <w:r>
+        <w:rPr>
+          <w:rFonts w:eastAsia="Times New Roman" w:cs="Times New Roman" w:ascii="Garamond" w:hAnsi="Garamond"/>
+          <w:color w:val="000000"/>
+          <w:kern w:val="0"/>
+          <w:sz w:val="36"/>
+          <w:szCs w:val="36"/>
+          <w:shd w:fill="auto" w:val="clear"/>
+          <w:lang w:val="en-US" w:eastAsia="zh-CN" w:bidi="hi-IN"/>
+        </w:rPr>
+        <w:t xml:space="preserve">uanto mais amplificada ela estiver, maior o seu alcance. E </w:t>
+      </w:r>
+      <w:r>
+        <w:rPr>
+          <w:rFonts w:eastAsia="Times New Roman" w:cs="Times New Roman" w:ascii="Garamond" w:hAnsi="Garamond"/>
+          <w:color w:val="000000"/>
+          <w:kern w:val="0"/>
+          <w:sz w:val="36"/>
+          <w:szCs w:val="36"/>
+          <w:shd w:fill="auto" w:val="clear"/>
+          <w:lang w:val="en-US" w:eastAsia="zh-CN" w:bidi="hi-IN"/>
+        </w:rPr>
+        <w:t>como podemos amplificar nossa oração? Ela deve ser</w:t>
+      </w:r>
+      <w:r>
+        <w:rPr>
+          <w:rFonts w:eastAsia="Times New Roman" w:cs="Times New Roman" w:ascii="Garamond" w:hAnsi="Garamond"/>
+          <w:color w:val="000000"/>
+          <w:kern w:val="0"/>
+          <w:sz w:val="36"/>
+          <w:szCs w:val="36"/>
+          <w:shd w:fill="auto" w:val="clear"/>
+          <w:lang w:val="en-US" w:eastAsia="zh-CN" w:bidi="hi-IN"/>
+        </w:rPr>
+        <w:t xml:space="preserve"> sincera,</w:t>
+      </w:r>
+      <w:r>
+        <w:rPr>
+          <w:rFonts w:eastAsia="Times New Roman" w:cs="Times New Roman" w:ascii="Garamond" w:hAnsi="Garamond"/>
+          <w:color w:val="000000"/>
+          <w:kern w:val="0"/>
+          <w:sz w:val="36"/>
+          <w:szCs w:val="36"/>
+          <w:shd w:fill="auto" w:val="clear"/>
+          <w:lang w:val="en-US" w:eastAsia="zh-CN" w:bidi="hi-IN"/>
+        </w:rPr>
+        <w:t xml:space="preserve"> carregada </w:t>
+      </w:r>
+      <w:r>
+        <w:rPr>
+          <w:rFonts w:eastAsia="Times New Roman" w:cs="Times New Roman" w:ascii="Garamond" w:hAnsi="Garamond"/>
+          <w:color w:val="000000"/>
+          <w:kern w:val="0"/>
+          <w:sz w:val="36"/>
+          <w:szCs w:val="36"/>
+          <w:shd w:fill="auto" w:val="clear"/>
+          <w:lang w:val="en-US" w:eastAsia="zh-CN" w:bidi="hi-IN"/>
+        </w:rPr>
+        <w:t xml:space="preserve">de humildade, </w:t>
+      </w:r>
+      <w:r>
+        <w:rPr>
+          <w:rFonts w:eastAsia="Times New Roman" w:cs="Times New Roman" w:ascii="Garamond" w:hAnsi="Garamond"/>
+          <w:color w:val="000000"/>
+          <w:kern w:val="0"/>
+          <w:sz w:val="36"/>
+          <w:szCs w:val="36"/>
+          <w:shd w:fill="auto" w:val="clear"/>
+          <w:lang w:val="en-US" w:eastAsia="zh-CN" w:bidi="hi-IN"/>
+        </w:rPr>
+        <w:t xml:space="preserve">de </w:t>
+      </w:r>
+      <w:r>
+        <w:rPr>
+          <w:rFonts w:eastAsia="Times New Roman" w:cs="Times New Roman" w:ascii="Garamond" w:hAnsi="Garamond"/>
+          <w:color w:val="000000"/>
+          <w:kern w:val="0"/>
+          <w:sz w:val="36"/>
+          <w:szCs w:val="36"/>
+          <w:shd w:fill="auto" w:val="clear"/>
+          <w:lang w:val="en-US" w:eastAsia="zh-CN" w:bidi="hi-IN"/>
+        </w:rPr>
+        <w:t>bons pensamentos</w:t>
+      </w:r>
+      <w:r>
+        <w:rPr>
+          <w:rFonts w:eastAsia="Times New Roman" w:cs="Times New Roman" w:ascii="Garamond" w:hAnsi="Garamond"/>
+          <w:color w:val="000000"/>
+          <w:kern w:val="0"/>
+          <w:sz w:val="36"/>
+          <w:szCs w:val="36"/>
+          <w:shd w:fill="auto" w:val="clear"/>
+          <w:lang w:val="en-US" w:eastAsia="zh-CN" w:bidi="hi-IN"/>
+        </w:rPr>
+        <w:t xml:space="preserve"> e sentimentos, de um desejo de servir, de consolar, de auxiliar. </w:t>
+      </w:r>
+      <w:r>
+        <w:rPr>
+          <w:rFonts w:eastAsia="Times New Roman" w:cs="Times New Roman" w:ascii="Garamond" w:hAnsi="Garamond"/>
+          <w:color w:val="000000"/>
+          <w:kern w:val="0"/>
+          <w:sz w:val="36"/>
+          <w:szCs w:val="36"/>
+          <w:shd w:fill="auto" w:val="clear"/>
+          <w:lang w:val="en-US" w:eastAsia="zh-CN" w:bidi="hi-IN"/>
+        </w:rPr>
+        <w:t>Deve também expressar nossa gratidão a Deus e a Jesus.</w:t>
+      </w:r>
+      <w:r>
+        <w:rPr>
+          <w:rFonts w:eastAsia="Times New Roman" w:cs="Times New Roman" w:ascii="Garamond" w:hAnsi="Garamond"/>
+          <w:color w:val="000000"/>
+          <w:kern w:val="0"/>
+          <w:sz w:val="36"/>
+          <w:szCs w:val="36"/>
+          <w:shd w:fill="auto" w:val="clear"/>
+          <w:lang w:val="en-US" w:eastAsia="zh-CN" w:bidi="hi-IN"/>
+        </w:rPr>
+        <w:t xml:space="preserve"> </w:t>
+      </w:r>
+    </w:p>
+    <w:p>
+      <w:pPr>
+        <w:pStyle w:val="Normal"/>
+        <w:jc w:val="both"/>
+        <w:rPr>
+          <w:color w:val="auto"/>
+        </w:rPr>
+      </w:pPr>
+      <w:r>
         <w:rPr/>
       </w:r>
     </w:p>
@@ -1702,7 +2926,246 @@
           <w:shd w:fill="auto" w:val="clear"/>
           <w:lang w:val="en-US" w:eastAsia="zh-CN" w:bidi="hi-IN"/>
         </w:rPr>
-        <w:t xml:space="preserve">Quando tomamos consciência disso, a oração passa a ser um valioso recurso que podemos utilizar a toda hora e em qualquer lugar. </w:t>
+        <w:t xml:space="preserve">Entretanto, é muito importante compreender que, ainda que nossa oração tenha todas as características que mencionamos, </w:t>
+      </w:r>
+      <w:r>
+        <w:rPr>
+          <w:rFonts w:eastAsia="Times New Roman" w:cs="Times New Roman" w:ascii="Garamond" w:hAnsi="Garamond"/>
+          <w:color w:val="000000"/>
+          <w:kern w:val="0"/>
+          <w:sz w:val="36"/>
+          <w:szCs w:val="36"/>
+          <w:shd w:fill="auto" w:val="clear"/>
+          <w:lang w:val="en-US" w:eastAsia="zh-CN" w:bidi="hi-IN"/>
+        </w:rPr>
+        <w:t>tudo está sempre subordinado à vontade de Deus</w:t>
+      </w:r>
+      <w:r>
+        <w:rPr>
+          <w:rFonts w:eastAsia="Times New Roman" w:cs="Times New Roman" w:ascii="Garamond" w:hAnsi="Garamond"/>
+          <w:color w:val="000000"/>
+          <w:kern w:val="0"/>
+          <w:sz w:val="36"/>
+          <w:szCs w:val="36"/>
+          <w:shd w:fill="auto" w:val="clear"/>
+          <w:lang w:val="en-US" w:eastAsia="zh-CN" w:bidi="hi-IN"/>
+        </w:rPr>
+        <w:t xml:space="preserve">. É Ele </w:t>
+      </w:r>
+      <w:r>
+        <w:rPr>
+          <w:rFonts w:eastAsia="Times New Roman" w:cs="Times New Roman" w:ascii="Garamond" w:hAnsi="Garamond"/>
+          <w:color w:val="000000"/>
+          <w:kern w:val="0"/>
+          <w:sz w:val="36"/>
+          <w:szCs w:val="36"/>
+          <w:shd w:fill="auto" w:val="clear"/>
+          <w:lang w:val="en-US" w:eastAsia="zh-CN" w:bidi="hi-IN"/>
+        </w:rPr>
+        <w:t>que, em última instância, decide se aquela prece poderá ou não produzir os resultados desejados.</w:t>
+      </w:r>
+    </w:p>
+    <w:p>
+      <w:pPr>
+        <w:pStyle w:val="Normal"/>
+        <w:jc w:val="both"/>
+        <w:rPr>
+          <w:color w:val="auto"/>
+        </w:rPr>
+      </w:pPr>
+      <w:r>
+        <w:rPr>
+          <w:color w:val="auto"/>
+        </w:rPr>
+      </w:r>
+    </w:p>
+    <w:p>
+      <w:pPr>
+        <w:pStyle w:val="Normal"/>
+        <w:jc w:val="both"/>
+        <w:rPr>
+          <w:color w:val="auto"/>
+        </w:rPr>
+      </w:pPr>
+      <w:r>
+        <w:rPr>
+          <w:rFonts w:eastAsia="Times New Roman" w:cs="Times New Roman" w:ascii="Garamond" w:hAnsi="Garamond"/>
+          <w:color w:val="000000"/>
+          <w:kern w:val="0"/>
+          <w:sz w:val="36"/>
+          <w:szCs w:val="36"/>
+          <w:shd w:fill="auto" w:val="clear"/>
+          <w:lang w:val="en-US" w:eastAsia="zh-CN" w:bidi="hi-IN"/>
+        </w:rPr>
+        <w:t>Voltando à</w:t>
+      </w:r>
+      <w:r>
+        <w:rPr>
+          <w:rFonts w:eastAsia="Times New Roman" w:cs="Times New Roman" w:ascii="Garamond" w:hAnsi="Garamond"/>
+          <w:color w:val="000000"/>
+          <w:kern w:val="0"/>
+          <w:sz w:val="36"/>
+          <w:szCs w:val="36"/>
+          <w:shd w:fill="auto" w:val="clear"/>
+          <w:lang w:val="en-US" w:eastAsia="zh-CN" w:bidi="hi-IN"/>
+        </w:rPr>
+        <w:t xml:space="preserve"> passagem evangélica que estamos </w:t>
+      </w:r>
+      <w:r>
+        <w:rPr>
+          <w:rFonts w:eastAsia="Times New Roman" w:cs="Times New Roman" w:ascii="Garamond" w:hAnsi="Garamond"/>
+          <w:color w:val="000000"/>
+          <w:kern w:val="0"/>
+          <w:sz w:val="36"/>
+          <w:szCs w:val="36"/>
+          <w:shd w:fill="auto" w:val="clear"/>
+          <w:lang w:val="en-US" w:eastAsia="zh-CN" w:bidi="hi-IN"/>
+        </w:rPr>
+        <w:t>estudando</w:t>
+      </w:r>
+      <w:r>
+        <w:rPr>
+          <w:rFonts w:eastAsia="Times New Roman" w:cs="Times New Roman" w:ascii="Garamond" w:hAnsi="Garamond"/>
+          <w:color w:val="000000"/>
+          <w:kern w:val="0"/>
+          <w:sz w:val="36"/>
+          <w:szCs w:val="36"/>
+          <w:shd w:fill="auto" w:val="clear"/>
+          <w:lang w:val="en-US" w:eastAsia="zh-CN" w:bidi="hi-IN"/>
+        </w:rPr>
+        <w:t xml:space="preserve">, Jesus nos diz que Deus sabe do que necessitamos antes mesmo de pedirmos. Os  incrédulos </w:t>
+      </w:r>
+      <w:r>
+        <w:rPr>
+          <w:rFonts w:eastAsia="Times New Roman" w:cs="Times New Roman" w:ascii="Garamond" w:hAnsi="Garamond"/>
+          <w:color w:val="000000"/>
+          <w:kern w:val="0"/>
+          <w:sz w:val="36"/>
+          <w:szCs w:val="36"/>
+          <w:shd w:fill="auto" w:val="clear"/>
+          <w:lang w:val="en-US" w:eastAsia="zh-CN" w:bidi="hi-IN"/>
+        </w:rPr>
+        <w:t xml:space="preserve">argumentam </w:t>
+      </w:r>
+      <w:r>
+        <w:rPr>
+          <w:rFonts w:eastAsia="Times New Roman" w:cs="Times New Roman" w:ascii="Garamond" w:hAnsi="Garamond"/>
+          <w:color w:val="000000"/>
+          <w:kern w:val="0"/>
+          <w:sz w:val="36"/>
+          <w:szCs w:val="36"/>
+          <w:shd w:fill="auto" w:val="clear"/>
+          <w:lang w:val="en-US" w:eastAsia="zh-CN" w:bidi="hi-IN"/>
+        </w:rPr>
+        <w:t>que</w:t>
+      </w:r>
+      <w:r>
+        <w:rPr>
+          <w:rFonts w:eastAsia="Times New Roman" w:cs="Times New Roman" w:ascii="Garamond" w:hAnsi="Garamond"/>
+          <w:color w:val="000000"/>
+          <w:kern w:val="0"/>
+          <w:sz w:val="36"/>
+          <w:szCs w:val="36"/>
+          <w:shd w:fill="auto" w:val="clear"/>
+          <w:lang w:val="en-US" w:eastAsia="zh-CN" w:bidi="hi-IN"/>
+        </w:rPr>
+        <w:t xml:space="preserve"> a oração </w:t>
+      </w:r>
+      <w:r>
+        <w:rPr>
+          <w:rFonts w:eastAsia="Times New Roman" w:cs="Times New Roman" w:ascii="Garamond" w:hAnsi="Garamond"/>
+          <w:color w:val="000000"/>
+          <w:kern w:val="0"/>
+          <w:sz w:val="36"/>
+          <w:szCs w:val="36"/>
+          <w:shd w:fill="auto" w:val="clear"/>
+          <w:lang w:val="en-US" w:eastAsia="zh-CN" w:bidi="hi-IN"/>
+        </w:rPr>
+        <w:t xml:space="preserve">então </w:t>
+      </w:r>
+      <w:r>
+        <w:rPr>
+          <w:rFonts w:eastAsia="Times New Roman" w:cs="Times New Roman" w:ascii="Garamond" w:hAnsi="Garamond"/>
+          <w:color w:val="000000"/>
+          <w:kern w:val="0"/>
+          <w:sz w:val="36"/>
+          <w:szCs w:val="36"/>
+          <w:shd w:fill="auto" w:val="clear"/>
+          <w:lang w:val="en-US" w:eastAsia="zh-CN" w:bidi="hi-IN"/>
+        </w:rPr>
+        <w:t xml:space="preserve">é desnecessária. </w:t>
+      </w:r>
+      <w:r>
+        <w:rPr>
+          <w:rFonts w:eastAsia="Times New Roman" w:cs="Times New Roman" w:ascii="Garamond" w:hAnsi="Garamond"/>
+          <w:color w:val="000000"/>
+          <w:kern w:val="0"/>
+          <w:sz w:val="36"/>
+          <w:szCs w:val="36"/>
+          <w:shd w:fill="auto" w:val="clear"/>
+          <w:lang w:val="en-US" w:eastAsia="zh-CN" w:bidi="hi-IN"/>
+        </w:rPr>
+        <w:t>Afinal de contas, se</w:t>
+      </w:r>
+      <w:r>
+        <w:rPr>
+          <w:rFonts w:eastAsia="Times New Roman" w:cs="Times New Roman" w:ascii="Garamond" w:hAnsi="Garamond"/>
+          <w:color w:val="000000"/>
+          <w:kern w:val="0"/>
+          <w:sz w:val="36"/>
+          <w:szCs w:val="36"/>
+          <w:shd w:fill="auto" w:val="clear"/>
+          <w:lang w:val="en-US" w:eastAsia="zh-CN" w:bidi="hi-IN"/>
+        </w:rPr>
+        <w:t xml:space="preserve"> Deus </w:t>
+      </w:r>
+      <w:r>
+        <w:rPr>
+          <w:rFonts w:eastAsia="Times New Roman" w:cs="Times New Roman" w:ascii="Garamond" w:hAnsi="Garamond"/>
+          <w:color w:val="000000"/>
+          <w:kern w:val="0"/>
+          <w:sz w:val="36"/>
+          <w:szCs w:val="36"/>
+          <w:shd w:fill="auto" w:val="clear"/>
+          <w:lang w:val="en-US" w:eastAsia="zh-CN" w:bidi="hi-IN"/>
+        </w:rPr>
+        <w:t xml:space="preserve">já </w:t>
+      </w:r>
+      <w:r>
+        <w:rPr>
+          <w:rFonts w:eastAsia="Times New Roman" w:cs="Times New Roman" w:ascii="Garamond" w:hAnsi="Garamond"/>
+          <w:color w:val="000000"/>
+          <w:kern w:val="0"/>
+          <w:sz w:val="36"/>
+          <w:szCs w:val="36"/>
+          <w:shd w:fill="auto" w:val="clear"/>
+          <w:lang w:val="en-US" w:eastAsia="zh-CN" w:bidi="hi-IN"/>
+        </w:rPr>
+        <w:t xml:space="preserve">sabe do que necessitamos, </w:t>
+      </w:r>
+      <w:r>
+        <w:rPr>
+          <w:rFonts w:eastAsia="Times New Roman" w:cs="Times New Roman" w:ascii="Garamond" w:hAnsi="Garamond"/>
+          <w:color w:val="000000"/>
+          <w:kern w:val="0"/>
+          <w:sz w:val="36"/>
+          <w:szCs w:val="36"/>
+          <w:shd w:fill="auto" w:val="clear"/>
+          <w:lang w:val="en-US" w:eastAsia="zh-CN" w:bidi="hi-IN"/>
+        </w:rPr>
+        <w:t>não há a necessidade de pedir</w:t>
+      </w:r>
+      <w:r>
+        <w:rPr>
+          <w:rFonts w:eastAsia="Times New Roman" w:cs="Times New Roman" w:ascii="Garamond" w:hAnsi="Garamond"/>
+          <w:color w:val="000000"/>
+          <w:kern w:val="0"/>
+          <w:sz w:val="36"/>
+          <w:szCs w:val="36"/>
+          <w:shd w:fill="auto" w:val="clear"/>
+          <w:lang w:val="en-US" w:eastAsia="zh-CN" w:bidi="hi-IN"/>
+        </w:rPr>
+        <w:t>. Esse é um pensamento completamente equivocado.</w:t>
       </w:r>
     </w:p>
     <w:p>
@@ -1722,30 +3185,286 @@
         <w:pStyle w:val="Normal"/>
         <w:jc w:val="both"/>
         <w:rPr>
-          <w:highlight w:val="none"/>
-          <w:shd w:fill="auto" w:val="clear"/>
-        </w:rPr>
-      </w:pPr>
-      <w:r>
-        <w:rPr>
-          <w:rFonts w:eastAsia="Times New Roman" w:cs="Times New Roman" w:ascii="Garamond" w:hAnsi="Garamond"/>
-          <w:color w:val="000000"/>
-          <w:kern w:val="0"/>
-          <w:sz w:val="36"/>
-          <w:szCs w:val="36"/>
-          <w:shd w:fill="auto" w:val="clear"/>
-          <w:lang w:val="en-US" w:eastAsia="zh-CN" w:bidi="hi-IN"/>
-        </w:rPr>
-        <w:t>Ao nos depararmos com alguém caído na calçada sob o efeito de álcool ou drogas, em vez de lançar um olhar de condenação, vamos orar e pedir a  Deus que dê forças àquele irmão para superar seus vícios e suas dificuldades.</w:t>
-      </w:r>
-    </w:p>
-    <w:p>
-      <w:pPr>
-        <w:pStyle w:val="Normal"/>
-        <w:jc w:val="both"/>
-        <w:rPr>
-          <w:highlight w:val="none"/>
-          <w:shd w:fill="auto" w:val="clear"/>
+          <w:color w:val="auto"/>
+        </w:rPr>
+      </w:pPr>
+      <w:r>
+        <w:rPr>
+          <w:rFonts w:eastAsia="Times New Roman" w:cs="Times New Roman" w:ascii="Garamond" w:hAnsi="Garamond"/>
+          <w:color w:val="000000"/>
+          <w:kern w:val="0"/>
+          <w:sz w:val="36"/>
+          <w:szCs w:val="36"/>
+          <w:shd w:fill="auto" w:val="clear"/>
+          <w:lang w:val="en-US" w:eastAsia="zh-CN" w:bidi="hi-IN"/>
+        </w:rPr>
+        <w:t xml:space="preserve">A oração </w:t>
+      </w:r>
+      <w:r>
+        <w:rPr>
+          <w:rFonts w:eastAsia="Times New Roman" w:cs="Times New Roman" w:ascii="Garamond" w:hAnsi="Garamond"/>
+          <w:color w:val="000000"/>
+          <w:kern w:val="0"/>
+          <w:sz w:val="36"/>
+          <w:szCs w:val="36"/>
+          <w:shd w:fill="auto" w:val="clear"/>
+          <w:lang w:val="en-US" w:eastAsia="zh-CN" w:bidi="hi-IN"/>
+        </w:rPr>
+        <w:t>não tem como objetivo</w:t>
+      </w:r>
+      <w:r>
+        <w:rPr>
+          <w:rFonts w:eastAsia="Times New Roman" w:cs="Times New Roman" w:ascii="Garamond" w:hAnsi="Garamond"/>
+          <w:color w:val="000000"/>
+          <w:kern w:val="0"/>
+          <w:sz w:val="36"/>
+          <w:szCs w:val="36"/>
+          <w:shd w:fill="auto" w:val="clear"/>
+          <w:lang w:val="en-US" w:eastAsia="zh-CN" w:bidi="hi-IN"/>
+        </w:rPr>
+        <w:t xml:space="preserve"> informar a Deus  aquilo de que precisamos</w:t>
+      </w:r>
+      <w:r>
+        <w:rPr>
+          <w:rFonts w:eastAsia="Times New Roman" w:cs="Times New Roman" w:ascii="Garamond" w:hAnsi="Garamond"/>
+          <w:color w:val="000000"/>
+          <w:kern w:val="0"/>
+          <w:sz w:val="36"/>
+          <w:szCs w:val="36"/>
+          <w:shd w:fill="auto" w:val="clear"/>
+          <w:lang w:val="en-US" w:eastAsia="zh-CN" w:bidi="hi-IN"/>
+        </w:rPr>
+        <w:t>;</w:t>
+      </w:r>
+      <w:r>
+        <w:rPr>
+          <w:rFonts w:eastAsia="Times New Roman" w:cs="Times New Roman" w:ascii="Garamond" w:hAnsi="Garamond"/>
+          <w:color w:val="000000"/>
+          <w:kern w:val="0"/>
+          <w:sz w:val="36"/>
+          <w:szCs w:val="36"/>
+          <w:shd w:fill="auto" w:val="clear"/>
+          <w:lang w:val="en-US" w:eastAsia="zh-CN" w:bidi="hi-IN"/>
+        </w:rPr>
+        <w:t xml:space="preserve"> </w:t>
+      </w:r>
+      <w:r>
+        <w:rPr>
+          <w:rFonts w:eastAsia="Times New Roman" w:cs="Times New Roman" w:ascii="Garamond" w:hAnsi="Garamond"/>
+          <w:color w:val="000000"/>
+          <w:kern w:val="0"/>
+          <w:sz w:val="36"/>
+          <w:szCs w:val="36"/>
+          <w:shd w:fill="auto" w:val="clear"/>
+          <w:lang w:val="en-US" w:eastAsia="zh-CN" w:bidi="hi-IN"/>
+        </w:rPr>
+        <w:t>o objetivo da oração é</w:t>
+      </w:r>
+      <w:r>
+        <w:rPr>
+          <w:rFonts w:eastAsia="Times New Roman" w:cs="Times New Roman" w:ascii="Garamond" w:hAnsi="Garamond"/>
+          <w:color w:val="000000"/>
+          <w:kern w:val="0"/>
+          <w:sz w:val="36"/>
+          <w:szCs w:val="36"/>
+          <w:shd w:fill="auto" w:val="clear"/>
+          <w:lang w:val="en-US" w:eastAsia="zh-CN" w:bidi="hi-IN"/>
+        </w:rPr>
+        <w:t xml:space="preserve"> nos transformar. Orar é criar, dentro de nós, as condições necessárias para receber aquilo que a Providência </w:t>
+      </w:r>
+      <w:r>
+        <w:rPr>
+          <w:rFonts w:eastAsia="Times New Roman" w:cs="Times New Roman" w:ascii="Garamond" w:hAnsi="Garamond"/>
+          <w:color w:val="000000"/>
+          <w:kern w:val="0"/>
+          <w:sz w:val="36"/>
+          <w:szCs w:val="36"/>
+          <w:shd w:fill="auto" w:val="clear"/>
+          <w:lang w:val="en-US" w:eastAsia="zh-CN" w:bidi="hi-IN"/>
+        </w:rPr>
+        <w:t xml:space="preserve">Divina </w:t>
+      </w:r>
+      <w:r>
+        <w:rPr>
+          <w:rFonts w:eastAsia="Times New Roman" w:cs="Times New Roman" w:ascii="Garamond" w:hAnsi="Garamond"/>
+          <w:color w:val="000000"/>
+          <w:kern w:val="0"/>
+          <w:sz w:val="36"/>
+          <w:szCs w:val="36"/>
+          <w:shd w:fill="auto" w:val="clear"/>
+          <w:lang w:val="en-US" w:eastAsia="zh-CN" w:bidi="hi-IN"/>
+        </w:rPr>
+        <w:t>pode nos oferecer.</w:t>
+      </w:r>
+    </w:p>
+    <w:p>
+      <w:pPr>
+        <w:pStyle w:val="Normal"/>
+        <w:jc w:val="both"/>
+        <w:rPr>
+          <w:rFonts w:ascii="Garamond" w:hAnsi="Garamond" w:eastAsia="Times New Roman" w:cs="Times New Roman"/>
+          <w:kern w:val="0"/>
+          <w:sz w:val="36"/>
+          <w:szCs w:val="36"/>
+          <w:shd w:fill="auto" w:val="clear"/>
+          <w:lang w:val="en-US" w:eastAsia="zh-CN" w:bidi="hi-IN"/>
+        </w:rPr>
+      </w:pPr>
+      <w:r>
+        <w:rPr>
+          <w:rFonts w:eastAsia="Times New Roman" w:cs="Times New Roman" w:ascii="Garamond" w:hAnsi="Garamond"/>
+          <w:kern w:val="0"/>
+          <w:sz w:val="36"/>
+          <w:szCs w:val="36"/>
+          <w:shd w:fill="auto" w:val="clear"/>
+          <w:lang w:val="en-US" w:eastAsia="zh-CN" w:bidi="hi-IN"/>
+        </w:rPr>
+      </w:r>
+    </w:p>
+    <w:p>
+      <w:pPr>
+        <w:pStyle w:val="Normal"/>
+        <w:jc w:val="both"/>
+        <w:rPr>
+          <w:color w:val="auto"/>
+        </w:rPr>
+      </w:pPr>
+      <w:r>
+        <w:rPr>
+          <w:rFonts w:eastAsia="Times New Roman" w:cs="Times New Roman" w:ascii="Garamond" w:hAnsi="Garamond"/>
+          <w:color w:val="000000"/>
+          <w:kern w:val="0"/>
+          <w:sz w:val="36"/>
+          <w:szCs w:val="36"/>
+          <w:shd w:fill="auto" w:val="clear"/>
+          <w:lang w:val="en-US" w:eastAsia="zh-CN" w:bidi="hi-IN"/>
+        </w:rPr>
+        <w:t xml:space="preserve">A oração não muda Deus. Muda quem ora. Quebra o nosso orgulho, abre o nosso coração e nos prepara para receber </w:t>
+      </w:r>
+      <w:r>
+        <w:rPr>
+          <w:rFonts w:eastAsia="Times New Roman" w:cs="Times New Roman" w:ascii="Garamond" w:hAnsi="Garamond"/>
+          <w:color w:val="000000"/>
+          <w:kern w:val="0"/>
+          <w:sz w:val="36"/>
+          <w:szCs w:val="36"/>
+          <w:shd w:fill="auto" w:val="clear"/>
+          <w:lang w:val="en-US" w:eastAsia="zh-CN" w:bidi="hi-IN"/>
+        </w:rPr>
+        <w:t>o</w:t>
+      </w:r>
+      <w:r>
+        <w:rPr>
+          <w:rFonts w:eastAsia="Times New Roman" w:cs="Times New Roman" w:ascii="Garamond" w:hAnsi="Garamond"/>
+          <w:color w:val="000000"/>
+          <w:kern w:val="0"/>
+          <w:sz w:val="36"/>
+          <w:szCs w:val="36"/>
+          <w:shd w:fill="auto" w:val="clear"/>
+          <w:lang w:val="en-US" w:eastAsia="zh-CN" w:bidi="hi-IN"/>
+        </w:rPr>
+        <w:t xml:space="preserve"> que Deus</w:t>
+      </w:r>
+      <w:r>
+        <w:rPr>
+          <w:rFonts w:eastAsia="Times New Roman" w:cs="Times New Roman" w:ascii="Garamond" w:hAnsi="Garamond"/>
+          <w:color w:val="000000"/>
+          <w:kern w:val="0"/>
+          <w:sz w:val="36"/>
+          <w:szCs w:val="36"/>
+          <w:shd w:fill="auto" w:val="clear"/>
+          <w:lang w:val="en-US" w:eastAsia="zh-CN" w:bidi="hi-IN"/>
+        </w:rPr>
+        <w:t xml:space="preserve">, em Sua infinita misericórdia, </w:t>
+      </w:r>
+      <w:r>
+        <w:rPr>
+          <w:rFonts w:eastAsia="Times New Roman" w:cs="Times New Roman" w:ascii="Garamond" w:hAnsi="Garamond"/>
+          <w:color w:val="000000"/>
+          <w:kern w:val="0"/>
+          <w:sz w:val="36"/>
+          <w:szCs w:val="36"/>
+          <w:shd w:fill="auto" w:val="clear"/>
+          <w:lang w:val="en-US" w:eastAsia="zh-CN" w:bidi="hi-IN"/>
+        </w:rPr>
+        <w:t xml:space="preserve"> </w:t>
+      </w:r>
+      <w:r>
+        <w:rPr>
+          <w:rFonts w:eastAsia="Times New Roman" w:cs="Times New Roman" w:ascii="Garamond" w:hAnsi="Garamond"/>
+          <w:color w:val="000000"/>
+          <w:kern w:val="0"/>
+          <w:sz w:val="36"/>
+          <w:szCs w:val="36"/>
+          <w:shd w:fill="auto" w:val="clear"/>
+          <w:lang w:val="en-US" w:eastAsia="zh-CN" w:bidi="hi-IN"/>
+        </w:rPr>
+        <w:t>julga que temos mérito para receber</w:t>
+      </w:r>
+      <w:r>
+        <w:rPr>
+          <w:rFonts w:eastAsia="Times New Roman" w:cs="Times New Roman" w:ascii="Garamond" w:hAnsi="Garamond"/>
+          <w:color w:val="000000"/>
+          <w:kern w:val="0"/>
+          <w:sz w:val="36"/>
+          <w:szCs w:val="36"/>
+          <w:shd w:fill="auto" w:val="clear"/>
+          <w:lang w:val="en-US" w:eastAsia="zh-CN" w:bidi="hi-IN"/>
+        </w:rPr>
+        <w:t>.</w:t>
+      </w:r>
+    </w:p>
+    <w:p>
+      <w:pPr>
+        <w:pStyle w:val="Normal"/>
+        <w:jc w:val="both"/>
+        <w:rPr>
+          <w:rFonts w:ascii="Garamond" w:hAnsi="Garamond" w:eastAsia="Times New Roman" w:cs="Times New Roman"/>
+          <w:kern w:val="0"/>
+          <w:sz w:val="36"/>
+          <w:szCs w:val="36"/>
+          <w:shd w:fill="auto" w:val="clear"/>
+          <w:lang w:val="en-US" w:eastAsia="zh-CN" w:bidi="hi-IN"/>
+        </w:rPr>
+      </w:pPr>
+      <w:r>
+        <w:rPr>
+          <w:rFonts w:eastAsia="Times New Roman" w:cs="Times New Roman" w:ascii="Garamond" w:hAnsi="Garamond"/>
+          <w:kern w:val="0"/>
+          <w:sz w:val="36"/>
+          <w:szCs w:val="36"/>
+          <w:shd w:fill="auto" w:val="clear"/>
+          <w:lang w:val="en-US" w:eastAsia="zh-CN" w:bidi="hi-IN"/>
+        </w:rPr>
+      </w:r>
+    </w:p>
+    <w:p>
+      <w:pPr>
+        <w:pStyle w:val="Normal"/>
+        <w:jc w:val="both"/>
+        <w:rPr>
+          <w:color w:val="auto"/>
+        </w:rPr>
+      </w:pPr>
+      <w:r>
+        <w:rPr>
+          <w:rFonts w:eastAsia="Times New Roman" w:cs="Times New Roman" w:ascii="Garamond" w:hAnsi="Garamond"/>
+          <w:color w:val="000000"/>
+          <w:kern w:val="0"/>
+          <w:sz w:val="36"/>
+          <w:szCs w:val="36"/>
+          <w:shd w:fill="auto" w:val="clear"/>
+          <w:lang w:val="en-US" w:eastAsia="zh-CN" w:bidi="hi-IN"/>
+        </w:rPr>
+        <w:t>Vamos fazer mais uma comparação: aquilo que Deus nos oferece é semelhante a uma fonte de água. Quem vai até a fonte com um copo recolhe um copo; quem leva uma jarra recolhe uma jarra; quem leva um barril recolhe um barril. A fonte não muda — continua a mesma. O que muda é a capacidade que cada um tem de recolher água.</w:t>
+      </w:r>
+    </w:p>
+    <w:p>
+      <w:pPr>
+        <w:pStyle w:val="Normal"/>
+        <w:jc w:val="both"/>
+        <w:rPr>
+          <w:color w:val="auto"/>
         </w:rPr>
       </w:pPr>
       <w:r>
@@ -1757,1238 +3476,6 @@
         <w:pStyle w:val="Normal"/>
         <w:jc w:val="both"/>
         <w:rPr>
-          <w:color w:val="auto"/>
-        </w:rPr>
-      </w:pPr>
-      <w:r>
-        <w:rPr>
-          <w:rFonts w:eastAsia="Times New Roman" w:cs="Times New Roman" w:ascii="Garamond" w:hAnsi="Garamond"/>
-          <w:color w:val="000000"/>
-          <w:kern w:val="0"/>
-          <w:sz w:val="36"/>
-          <w:szCs w:val="36"/>
-          <w:shd w:fill="auto" w:val="clear"/>
-          <w:lang w:val="en-US" w:eastAsia="zh-CN" w:bidi="hi-IN"/>
-        </w:rPr>
-        <w:t>Quando estivermos dirigindo e nos depararmos um acidente, também podemos orar pelas pessoas envolvidas naquela situação.</w:t>
-      </w:r>
-    </w:p>
-    <w:p>
-      <w:pPr>
-        <w:pStyle w:val="Normal"/>
-        <w:jc w:val="both"/>
-        <w:rPr>
-          <w:color w:val="auto"/>
-        </w:rPr>
-      </w:pPr>
-      <w:r>
-        <w:rPr/>
-      </w:r>
-    </w:p>
-    <w:p>
-      <w:pPr>
-        <w:pStyle w:val="Normal"/>
-        <w:jc w:val="both"/>
-        <w:rPr>
-          <w:color w:val="auto"/>
-        </w:rPr>
-      </w:pPr>
-      <w:r>
-        <w:rPr>
-          <w:rFonts w:eastAsia="Times New Roman" w:cs="Times New Roman" w:ascii="Garamond" w:hAnsi="Garamond"/>
-          <w:color w:val="000000"/>
-          <w:kern w:val="0"/>
-          <w:sz w:val="36"/>
-          <w:szCs w:val="36"/>
-          <w:shd w:fill="auto" w:val="clear"/>
-          <w:lang w:val="en-US" w:eastAsia="zh-CN" w:bidi="hi-IN"/>
-        </w:rPr>
-        <w:t>Eu confesso que não entendo a curiosidade mórbida que muita gente tem em ver pessoas feridas ou mortas em acidentes. Já repararam que quando acontece um acidente de trânsito em uma pista, a outra pista também fica com o trânsito lento? É porque as pessoas dirigindo em sentido contrário reduzem a velocidade para ver o que aconteceu.</w:t>
-      </w:r>
-    </w:p>
-    <w:p>
-      <w:pPr>
-        <w:pStyle w:val="Normal"/>
-        <w:jc w:val="both"/>
-        <w:rPr>
-          <w:color w:val="auto"/>
-        </w:rPr>
-      </w:pPr>
-      <w:r>
-        <w:rPr>
-          <w:color w:val="auto"/>
-        </w:rPr>
-      </w:r>
-      <w:r>
-        <w:br w:type="page"/>
-      </w:r>
-    </w:p>
-    <w:p>
-      <w:pPr>
-        <w:pStyle w:val="Normal"/>
-        <w:jc w:val="both"/>
-        <w:rPr>
-          <w:color w:val="auto"/>
-        </w:rPr>
-      </w:pPr>
-      <w:r>
-        <w:rPr>
-          <w:rFonts w:eastAsia="Times New Roman" w:cs="Times New Roman" w:ascii="Garamond" w:hAnsi="Garamond"/>
-          <w:color w:val="000000"/>
-          <w:kern w:val="0"/>
-          <w:sz w:val="36"/>
-          <w:szCs w:val="36"/>
-          <w:shd w:fill="auto" w:val="clear"/>
-          <w:lang w:val="en-US" w:eastAsia="zh-CN" w:bidi="hi-IN"/>
-        </w:rPr>
-        <w:t>Se por acaso ainda somos tomados por esse tipo de curiosidade, vamos adotar outra postura. Em vez de querer ver o que aconteceu, elevemos um pensamento a Deus, pedindo socorro para os feridos e amparo aos que desencarnaram e seguimos nosso caminho.</w:t>
-      </w:r>
-    </w:p>
-    <w:p>
-      <w:pPr>
-        <w:pStyle w:val="Normal"/>
-        <w:jc w:val="both"/>
-        <w:rPr>
-          <w:color w:val="auto"/>
-        </w:rPr>
-      </w:pPr>
-      <w:r>
-        <w:rPr/>
-      </w:r>
-    </w:p>
-    <w:p>
-      <w:pPr>
-        <w:pStyle w:val="Normal"/>
-        <w:jc w:val="both"/>
-        <w:rPr>
-          <w:color w:val="auto"/>
-        </w:rPr>
-      </w:pPr>
-      <w:r>
-        <w:rPr>
-          <w:rFonts w:eastAsia="Times New Roman" w:cs="Times New Roman" w:ascii="Garamond" w:hAnsi="Garamond"/>
-          <w:color w:val="000000"/>
-          <w:kern w:val="0"/>
-          <w:sz w:val="36"/>
-          <w:szCs w:val="36"/>
-          <w:shd w:fill="auto" w:val="clear"/>
-          <w:lang w:val="en-US" w:eastAsia="zh-CN" w:bidi="hi-IN"/>
-        </w:rPr>
-        <w:t>Retornando à passagem evangélica que estamos analisando, Jesus nos diz para não orarmos como os pagãos, que pensam que é pela quantidade de palavras que suas preces serão ouvidas. O Mestre diz ainda que Deus sabe do que precisamos antes mesmo de o perdirmos.</w:t>
-      </w:r>
-    </w:p>
-    <w:p>
-      <w:pPr>
-        <w:pStyle w:val="Normal"/>
-        <w:jc w:val="both"/>
-        <w:rPr>
-          <w:color w:val="auto"/>
-        </w:rPr>
-      </w:pPr>
-      <w:r>
-        <w:rPr/>
-      </w:r>
-    </w:p>
-    <w:p>
-      <w:pPr>
-        <w:pStyle w:val="Normal"/>
-        <w:jc w:val="both"/>
-        <w:rPr>
-          <w:color w:val="auto"/>
-        </w:rPr>
-      </w:pPr>
-      <w:r>
-        <w:rPr>
-          <w:rFonts w:eastAsia="Times New Roman" w:cs="Times New Roman" w:ascii="Garamond" w:hAnsi="Garamond"/>
-          <w:color w:val="000000"/>
-          <w:kern w:val="0"/>
-          <w:sz w:val="36"/>
-          <w:szCs w:val="36"/>
-          <w:shd w:fill="auto" w:val="clear"/>
-          <w:lang w:val="en-US" w:eastAsia="zh-CN" w:bidi="hi-IN"/>
-        </w:rPr>
-        <w:t>Quem eram os pagãos a quem Jesus se refere? Eles eram principalmente os povos gentios do mundo greco-romano que não pertenciam à tradição judaica e que seguiam religiões politeístas comuns no Império Romano.</w:t>
-      </w:r>
-    </w:p>
-    <w:p>
-      <w:pPr>
-        <w:pStyle w:val="Normal"/>
-        <w:jc w:val="both"/>
-        <w:rPr>
-          <w:color w:val="auto"/>
-        </w:rPr>
-      </w:pPr>
-      <w:r>
-        <w:rPr/>
-      </w:r>
-    </w:p>
-    <w:p>
-      <w:pPr>
-        <w:pStyle w:val="Normal"/>
-        <w:jc w:val="both"/>
-        <w:rPr>
-          <w:color w:val="auto"/>
-        </w:rPr>
-      </w:pPr>
-      <w:r>
-        <w:rPr>
-          <w:rFonts w:eastAsia="Times New Roman" w:cs="Times New Roman" w:ascii="Garamond" w:hAnsi="Garamond"/>
-          <w:color w:val="000000"/>
-          <w:kern w:val="0"/>
-          <w:sz w:val="36"/>
-          <w:szCs w:val="36"/>
-          <w:shd w:fill="auto" w:val="clear"/>
-          <w:lang w:val="en-US" w:eastAsia="zh-CN" w:bidi="hi-IN"/>
-        </w:rPr>
-        <w:t>Nessas práticas religiosas, era frequente a repetição longa de fórmulas e invocações, porque muitos acreditavam que o poder da oração estava na quantidade ou na exatidão em que as palavras eram pronunciadas.</w:t>
-      </w:r>
-    </w:p>
-    <w:p>
-      <w:pPr>
-        <w:pStyle w:val="Normal"/>
-        <w:jc w:val="both"/>
-        <w:rPr>
-          <w:color w:val="auto"/>
-        </w:rPr>
-      </w:pPr>
-      <w:r>
-        <w:rPr/>
-      </w:r>
-    </w:p>
-    <w:p>
-      <w:pPr>
-        <w:pStyle w:val="Normal"/>
-        <w:jc w:val="both"/>
-        <w:rPr>
-          <w:color w:val="auto"/>
-        </w:rPr>
-      </w:pPr>
-      <w:r>
-        <w:rPr>
-          <w:rFonts w:eastAsia="Times New Roman" w:cs="Times New Roman" w:ascii="Garamond" w:hAnsi="Garamond"/>
-          <w:color w:val="000000"/>
-          <w:kern w:val="0"/>
-          <w:sz w:val="36"/>
-          <w:szCs w:val="36"/>
-          <w:shd w:fill="auto" w:val="clear"/>
-          <w:lang w:val="en-US" w:eastAsia="zh-CN" w:bidi="hi-IN"/>
-        </w:rPr>
-        <w:t>Ao fazer essa advertência, Jesus não condena a perseverança na prece; Ele critica o caráter mágico e mecânico que aquelas pessoas davam à oração.</w:t>
-      </w:r>
-    </w:p>
-    <w:p>
-      <w:pPr>
-        <w:pStyle w:val="Normal"/>
-        <w:jc w:val="both"/>
-        <w:rPr>
-          <w:color w:val="auto"/>
-        </w:rPr>
-      </w:pPr>
-      <w:r>
-        <w:rPr/>
-      </w:r>
-    </w:p>
-    <w:p>
-      <w:pPr>
-        <w:pStyle w:val="Normal"/>
-        <w:jc w:val="both"/>
-        <w:rPr>
-          <w:color w:val="auto"/>
-        </w:rPr>
-      </w:pPr>
-      <w:r>
-        <w:rPr>
-          <w:rFonts w:eastAsia="Times New Roman" w:cs="Times New Roman" w:ascii="Garamond" w:hAnsi="Garamond"/>
-          <w:color w:val="000000"/>
-          <w:kern w:val="0"/>
-          <w:sz w:val="36"/>
-          <w:szCs w:val="36"/>
-          <w:shd w:fill="auto" w:val="clear"/>
-          <w:lang w:val="en-US" w:eastAsia="zh-CN" w:bidi="hi-IN"/>
-        </w:rPr>
-        <w:t xml:space="preserve">Jesus também nos recorda que Deus sabe do que necessitamos antes mesmo de pedirmos. Portanto, </w:t>
-      </w:r>
-      <w:r>
-        <w:rPr>
-          <w:rFonts w:eastAsia="Times New Roman" w:cs="Times New Roman" w:ascii="Garamond" w:hAnsi="Garamond"/>
-          <w:color w:val="000000"/>
-          <w:kern w:val="0"/>
-          <w:sz w:val="36"/>
-          <w:szCs w:val="36"/>
-          <w:shd w:fill="auto" w:val="clear"/>
-          <w:lang w:val="en-US" w:eastAsia="zh-CN" w:bidi="hi-IN"/>
-        </w:rPr>
-        <w:t xml:space="preserve">a </w:t>
-      </w:r>
-      <w:r>
-        <w:rPr>
-          <w:rFonts w:eastAsia="Times New Roman" w:cs="Times New Roman" w:ascii="Garamond" w:hAnsi="Garamond"/>
-          <w:color w:val="000000"/>
-          <w:kern w:val="0"/>
-          <w:sz w:val="36"/>
-          <w:szCs w:val="36"/>
-          <w:shd w:fill="auto" w:val="clear"/>
-          <w:lang w:val="en-US" w:eastAsia="zh-CN" w:bidi="hi-IN"/>
-        </w:rPr>
-        <w:t xml:space="preserve">oração não deve ser </w:t>
-      </w:r>
-      <w:r>
-        <w:rPr>
-          <w:rFonts w:eastAsia="Times New Roman" w:cs="Times New Roman" w:ascii="Garamond" w:hAnsi="Garamond"/>
-          <w:color w:val="000000"/>
-          <w:kern w:val="0"/>
-          <w:sz w:val="36"/>
-          <w:szCs w:val="36"/>
-          <w:shd w:fill="auto" w:val="clear"/>
-          <w:lang w:val="en-US" w:eastAsia="zh-CN" w:bidi="hi-IN"/>
-        </w:rPr>
-        <w:t>utilizada</w:t>
-      </w:r>
-      <w:r>
-        <w:rPr>
-          <w:rFonts w:eastAsia="Times New Roman" w:cs="Times New Roman" w:ascii="Garamond" w:hAnsi="Garamond"/>
-          <w:color w:val="000000"/>
-          <w:kern w:val="0"/>
-          <w:sz w:val="36"/>
-          <w:szCs w:val="36"/>
-          <w:shd w:fill="auto" w:val="clear"/>
-          <w:lang w:val="en-US" w:eastAsia="zh-CN" w:bidi="hi-IN"/>
-        </w:rPr>
-        <w:t xml:space="preserve"> como um instrumento de pressão sobre Deus, mas como recurso de transformação interior. </w:t>
-      </w:r>
-    </w:p>
-    <w:p>
-      <w:pPr>
-        <w:pStyle w:val="Normal"/>
-        <w:jc w:val="both"/>
-        <w:rPr>
-          <w:color w:val="auto"/>
-        </w:rPr>
-      </w:pPr>
-      <w:r>
-        <w:rPr/>
-      </w:r>
-    </w:p>
-    <w:p>
-      <w:pPr>
-        <w:pStyle w:val="Normal"/>
-        <w:jc w:val="both"/>
-        <w:rPr>
-          <w:color w:val="auto"/>
-        </w:rPr>
-      </w:pPr>
-      <w:r>
-        <w:rPr>
-          <w:rFonts w:eastAsia="Times New Roman" w:cs="Times New Roman" w:ascii="Garamond" w:hAnsi="Garamond"/>
-          <w:color w:val="000000"/>
-          <w:kern w:val="0"/>
-          <w:sz w:val="36"/>
-          <w:szCs w:val="36"/>
-          <w:shd w:fill="auto" w:val="clear"/>
-          <w:lang w:val="en-US" w:eastAsia="zh-CN" w:bidi="hi-IN"/>
-        </w:rPr>
-        <w:t>É um convite para substituirmos o automatismo pela sinceridade, a quantidade pela qualidade e a palavra vazia pelo sentimento verdadeiro.</w:t>
-      </w:r>
-    </w:p>
-    <w:p>
-      <w:pPr>
-        <w:pStyle w:val="Normal"/>
-        <w:jc w:val="both"/>
-        <w:rPr>
-          <w:color w:val="auto"/>
-        </w:rPr>
-      </w:pPr>
-      <w:r>
-        <w:rPr/>
-      </w:r>
-    </w:p>
-    <w:p>
-      <w:pPr>
-        <w:pStyle w:val="Normal"/>
-        <w:jc w:val="both"/>
-        <w:rPr>
-          <w:color w:val="auto"/>
-        </w:rPr>
-      </w:pPr>
-      <w:r>
-        <w:rPr>
-          <w:rFonts w:eastAsia="Times New Roman" w:cs="Times New Roman" w:ascii="Garamond" w:hAnsi="Garamond"/>
-          <w:color w:val="000000"/>
-          <w:kern w:val="0"/>
-          <w:sz w:val="36"/>
-          <w:szCs w:val="36"/>
-          <w:shd w:fill="auto" w:val="clear"/>
-          <w:lang w:val="en-US" w:eastAsia="zh-CN" w:bidi="hi-IN"/>
-        </w:rPr>
-        <w:t xml:space="preserve">A bem da verdade, para Deus e Jesus nem mesmo as palavras que utilizamos em nossas preces </w:t>
-      </w:r>
-      <w:r>
-        <w:rPr>
-          <w:rFonts w:eastAsia="Times New Roman" w:cs="Times New Roman" w:ascii="Garamond" w:hAnsi="Garamond"/>
-          <w:color w:val="000000"/>
-          <w:kern w:val="0"/>
-          <w:sz w:val="36"/>
-          <w:szCs w:val="36"/>
-          <w:shd w:fill="auto" w:val="clear"/>
-          <w:lang w:val="en-US" w:eastAsia="zh-CN" w:bidi="hi-IN"/>
-        </w:rPr>
-        <w:t>são importantes</w:t>
-      </w:r>
-      <w:r>
-        <w:rPr>
-          <w:rFonts w:eastAsia="Times New Roman" w:cs="Times New Roman" w:ascii="Garamond" w:hAnsi="Garamond"/>
-          <w:color w:val="000000"/>
-          <w:kern w:val="0"/>
-          <w:sz w:val="36"/>
-          <w:szCs w:val="36"/>
-          <w:shd w:fill="auto" w:val="clear"/>
-          <w:lang w:val="en-US" w:eastAsia="zh-CN" w:bidi="hi-IN"/>
-        </w:rPr>
-        <w:t xml:space="preserve">. Embora o Pai Nosso e a Ave Maria sejam orações </w:t>
-      </w:r>
-      <w:r>
-        <w:rPr>
-          <w:rFonts w:eastAsia="Times New Roman" w:cs="Times New Roman" w:ascii="Garamond" w:hAnsi="Garamond"/>
-          <w:color w:val="000000"/>
-          <w:kern w:val="0"/>
-          <w:sz w:val="36"/>
-          <w:szCs w:val="36"/>
-          <w:shd w:fill="auto" w:val="clear"/>
-          <w:lang w:val="en-US" w:eastAsia="zh-CN" w:bidi="hi-IN"/>
-        </w:rPr>
-        <w:t>de uma riqueza e beleza profundas</w:t>
-      </w:r>
-      <w:r>
-        <w:rPr>
-          <w:rFonts w:eastAsia="Times New Roman" w:cs="Times New Roman" w:ascii="Garamond" w:hAnsi="Garamond"/>
-          <w:color w:val="000000"/>
-          <w:kern w:val="0"/>
-          <w:sz w:val="36"/>
-          <w:szCs w:val="36"/>
-          <w:shd w:fill="auto" w:val="clear"/>
-          <w:lang w:val="en-US" w:eastAsia="zh-CN" w:bidi="hi-IN"/>
-        </w:rPr>
-        <w:t>, podemos orar utilizando nossas próprias palavras.</w:t>
-      </w:r>
-    </w:p>
-    <w:p>
-      <w:pPr>
-        <w:pStyle w:val="Normal"/>
-        <w:jc w:val="both"/>
-        <w:rPr>
-          <w:color w:val="auto"/>
-        </w:rPr>
-      </w:pPr>
-      <w:r>
-        <w:rPr/>
-      </w:r>
-    </w:p>
-    <w:p>
-      <w:pPr>
-        <w:pStyle w:val="Normal"/>
-        <w:jc w:val="both"/>
-        <w:rPr>
-          <w:color w:val="auto"/>
-        </w:rPr>
-      </w:pPr>
-      <w:r>
-        <w:rPr>
-          <w:rFonts w:eastAsia="Times New Roman" w:cs="Times New Roman" w:ascii="Garamond" w:hAnsi="Garamond"/>
-          <w:color w:val="000000"/>
-          <w:kern w:val="0"/>
-          <w:sz w:val="36"/>
-          <w:szCs w:val="36"/>
-          <w:shd w:fill="auto" w:val="clear"/>
-          <w:lang w:val="en-US" w:eastAsia="zh-CN" w:bidi="hi-IN"/>
-        </w:rPr>
-        <w:t xml:space="preserve">O que </w:t>
-      </w:r>
-      <w:r>
-        <w:rPr>
-          <w:rFonts w:eastAsia="Times New Roman" w:cs="Times New Roman" w:ascii="Garamond" w:hAnsi="Garamond"/>
-          <w:color w:val="000000"/>
-          <w:kern w:val="0"/>
-          <w:sz w:val="36"/>
-          <w:szCs w:val="36"/>
-          <w:shd w:fill="auto" w:val="clear"/>
-          <w:lang w:val="en-US" w:eastAsia="zh-CN" w:bidi="hi-IN"/>
-        </w:rPr>
-        <w:t xml:space="preserve">realmente importa </w:t>
-      </w:r>
-      <w:r>
-        <w:rPr>
-          <w:rFonts w:eastAsia="Times New Roman" w:cs="Times New Roman" w:ascii="Garamond" w:hAnsi="Garamond"/>
-          <w:color w:val="000000"/>
-          <w:kern w:val="0"/>
-          <w:sz w:val="36"/>
-          <w:szCs w:val="36"/>
-          <w:shd w:fill="auto" w:val="clear"/>
-          <w:lang w:val="en-US" w:eastAsia="zh-CN" w:bidi="hi-IN"/>
-        </w:rPr>
-        <w:t xml:space="preserve">é que nossas preces carreguem consigo humildade, sinceridade e fé. </w:t>
-      </w:r>
-      <w:r>
-        <w:rPr>
-          <w:rFonts w:eastAsia="Times New Roman" w:cs="Times New Roman" w:ascii="Garamond" w:hAnsi="Garamond"/>
-          <w:color w:val="000000"/>
-          <w:kern w:val="0"/>
-          <w:sz w:val="36"/>
-          <w:szCs w:val="36"/>
-          <w:shd w:fill="auto" w:val="clear"/>
-          <w:lang w:val="en-US" w:eastAsia="zh-CN" w:bidi="hi-IN"/>
-        </w:rPr>
-        <w:t>As</w:t>
-      </w:r>
-      <w:r>
-        <w:rPr>
-          <w:rFonts w:eastAsia="Times New Roman" w:cs="Times New Roman" w:ascii="Garamond" w:hAnsi="Garamond"/>
-          <w:color w:val="000000"/>
-          <w:kern w:val="0"/>
-          <w:sz w:val="36"/>
-          <w:szCs w:val="36"/>
-          <w:shd w:fill="auto" w:val="clear"/>
-          <w:lang w:val="en-US" w:eastAsia="zh-CN" w:bidi="hi-IN"/>
-        </w:rPr>
-        <w:t xml:space="preserve"> palavras </w:t>
-      </w:r>
-      <w:r>
-        <w:rPr>
-          <w:rFonts w:eastAsia="Times New Roman" w:cs="Times New Roman" w:ascii="Garamond" w:hAnsi="Garamond"/>
-          <w:color w:val="000000"/>
-          <w:kern w:val="0"/>
-          <w:sz w:val="36"/>
-          <w:szCs w:val="36"/>
-          <w:shd w:fill="auto" w:val="clear"/>
-          <w:lang w:val="en-US" w:eastAsia="zh-CN" w:bidi="hi-IN"/>
-        </w:rPr>
-        <w:t xml:space="preserve">que </w:t>
-      </w:r>
-      <w:r>
-        <w:rPr>
-          <w:rFonts w:eastAsia="Times New Roman" w:cs="Times New Roman" w:ascii="Garamond" w:hAnsi="Garamond"/>
-          <w:color w:val="000000"/>
-          <w:kern w:val="0"/>
-          <w:sz w:val="36"/>
-          <w:szCs w:val="36"/>
-          <w:shd w:fill="auto" w:val="clear"/>
-          <w:lang w:val="en-US" w:eastAsia="zh-CN" w:bidi="hi-IN"/>
-        </w:rPr>
-        <w:t>utilizamos para nos expressarmos dessa forma, pouco importa</w:t>
-      </w:r>
-      <w:r>
-        <w:rPr>
-          <w:rFonts w:eastAsia="Times New Roman" w:cs="Times New Roman" w:ascii="Garamond" w:hAnsi="Garamond"/>
-          <w:color w:val="000000"/>
-          <w:kern w:val="0"/>
-          <w:sz w:val="36"/>
-          <w:szCs w:val="36"/>
-          <w:shd w:fill="auto" w:val="clear"/>
-          <w:lang w:val="en-US" w:eastAsia="zh-CN" w:bidi="hi-IN"/>
-        </w:rPr>
-        <w:t>m</w:t>
-      </w:r>
-      <w:r>
-        <w:rPr>
-          <w:rFonts w:eastAsia="Times New Roman" w:cs="Times New Roman" w:ascii="Garamond" w:hAnsi="Garamond"/>
-          <w:color w:val="000000"/>
-          <w:kern w:val="0"/>
-          <w:sz w:val="36"/>
-          <w:szCs w:val="36"/>
-          <w:shd w:fill="auto" w:val="clear"/>
-          <w:lang w:val="en-US" w:eastAsia="zh-CN" w:bidi="hi-IN"/>
-        </w:rPr>
-        <w:t>.</w:t>
-      </w:r>
-    </w:p>
-    <w:p>
-      <w:pPr>
-        <w:pStyle w:val="Normal"/>
-        <w:jc w:val="both"/>
-        <w:rPr>
-          <w:color w:val="auto"/>
-        </w:rPr>
-      </w:pPr>
-      <w:r>
-        <w:rPr/>
-      </w:r>
-      <w:r>
-        <w:br w:type="page"/>
-      </w:r>
-    </w:p>
-    <w:p>
-      <w:pPr>
-        <w:pStyle w:val="Normal"/>
-        <w:jc w:val="both"/>
-        <w:rPr>
-          <w:color w:val="auto"/>
-        </w:rPr>
-      </w:pPr>
-      <w:r>
-        <w:rPr>
-          <w:rFonts w:eastAsia="Times New Roman" w:cs="Times New Roman" w:ascii="Garamond" w:hAnsi="Garamond"/>
-          <w:color w:val="000000"/>
-          <w:kern w:val="0"/>
-          <w:sz w:val="36"/>
-          <w:szCs w:val="36"/>
-          <w:shd w:fill="auto" w:val="clear"/>
-          <w:lang w:val="en-US" w:eastAsia="zh-CN" w:bidi="hi-IN"/>
-        </w:rPr>
-        <w:t>E</w:t>
-      </w:r>
-      <w:r>
-        <w:rPr>
-          <w:rFonts w:eastAsia="Times New Roman" w:cs="Times New Roman" w:ascii="Garamond" w:hAnsi="Garamond"/>
-          <w:color w:val="000000"/>
-          <w:kern w:val="0"/>
-          <w:sz w:val="36"/>
-          <w:szCs w:val="36"/>
-          <w:shd w:fill="auto" w:val="clear"/>
-          <w:lang w:val="en-US" w:eastAsia="zh-CN" w:bidi="hi-IN"/>
-        </w:rPr>
-        <w:t xml:space="preserve"> por quê deve ser assim? Bom, antes de mais nada é preciso relembrar que</w:t>
-      </w:r>
-      <w:r>
-        <w:rPr>
-          <w:rFonts w:eastAsia="Times New Roman" w:cs="Times New Roman" w:ascii="Garamond" w:hAnsi="Garamond"/>
-          <w:color w:val="000000"/>
-          <w:kern w:val="0"/>
-          <w:sz w:val="36"/>
-          <w:szCs w:val="36"/>
-          <w:shd w:fill="auto" w:val="clear"/>
-          <w:lang w:val="en-US" w:eastAsia="zh-CN" w:bidi="hi-IN"/>
-        </w:rPr>
-        <w:t>, de modo geral,</w:t>
-      </w:r>
-      <w:r>
-        <w:rPr>
-          <w:rFonts w:eastAsia="Times New Roman" w:cs="Times New Roman" w:ascii="Garamond" w:hAnsi="Garamond"/>
-          <w:color w:val="000000"/>
-          <w:kern w:val="0"/>
-          <w:sz w:val="36"/>
-          <w:szCs w:val="36"/>
-          <w:shd w:fill="auto" w:val="clear"/>
-          <w:lang w:val="en-US" w:eastAsia="zh-CN" w:bidi="hi-IN"/>
-        </w:rPr>
-        <w:t xml:space="preserve"> o pensamento é a voz do Espírito. </w:t>
-      </w:r>
-    </w:p>
-    <w:p>
-      <w:pPr>
-        <w:pStyle w:val="Normal"/>
-        <w:jc w:val="both"/>
-        <w:rPr>
-          <w:color w:val="auto"/>
-        </w:rPr>
-      </w:pPr>
-      <w:r>
-        <w:rPr/>
-      </w:r>
-    </w:p>
-    <w:p>
-      <w:pPr>
-        <w:pStyle w:val="Normal"/>
-        <w:jc w:val="both"/>
-        <w:rPr>
-          <w:color w:val="auto"/>
-        </w:rPr>
-      </w:pPr>
-      <w:r>
-        <w:rPr>
-          <w:rFonts w:eastAsia="Times New Roman" w:cs="Times New Roman" w:ascii="Garamond" w:hAnsi="Garamond"/>
-          <w:color w:val="000000"/>
-          <w:kern w:val="0"/>
-          <w:sz w:val="36"/>
-          <w:szCs w:val="36"/>
-          <w:shd w:fill="auto" w:val="clear"/>
-          <w:lang w:val="en-US" w:eastAsia="zh-CN" w:bidi="hi-IN"/>
-        </w:rPr>
-        <w:t xml:space="preserve">Pelo pensamento o Espírito vai aos lugares que lhe agradam e </w:t>
-      </w:r>
-      <w:r>
-        <w:rPr>
-          <w:rFonts w:eastAsia="Times New Roman" w:cs="Times New Roman" w:ascii="Garamond" w:hAnsi="Garamond"/>
-          <w:color w:val="000000"/>
-          <w:kern w:val="0"/>
-          <w:sz w:val="36"/>
-          <w:szCs w:val="36"/>
-          <w:shd w:fill="auto" w:val="clear"/>
-          <w:lang w:val="en-US" w:eastAsia="zh-CN" w:bidi="hi-IN"/>
-        </w:rPr>
-        <w:t>aos quais ele tenha acesso</w:t>
-      </w:r>
-      <w:r>
-        <w:rPr>
-          <w:rFonts w:eastAsia="Times New Roman" w:cs="Times New Roman" w:ascii="Garamond" w:hAnsi="Garamond"/>
-          <w:color w:val="000000"/>
-          <w:kern w:val="0"/>
-          <w:sz w:val="36"/>
-          <w:szCs w:val="36"/>
-          <w:shd w:fill="auto" w:val="clear"/>
-          <w:lang w:val="en-US" w:eastAsia="zh-CN" w:bidi="hi-IN"/>
-        </w:rPr>
-        <w:t xml:space="preserve">; pelo pensamento ele cria formas, se comunica com outros Espíritos e </w:t>
-      </w:r>
-      <w:r>
-        <w:rPr>
-          <w:rFonts w:eastAsia="Times New Roman" w:cs="Times New Roman" w:ascii="Garamond" w:hAnsi="Garamond"/>
-          <w:color w:val="000000"/>
-          <w:kern w:val="0"/>
-          <w:sz w:val="36"/>
-          <w:szCs w:val="36"/>
-          <w:shd w:fill="auto" w:val="clear"/>
-          <w:lang w:val="en-US" w:eastAsia="zh-CN" w:bidi="hi-IN"/>
-        </w:rPr>
-        <w:t>também</w:t>
-      </w:r>
-      <w:r>
-        <w:rPr>
-          <w:rFonts w:eastAsia="Times New Roman" w:cs="Times New Roman" w:ascii="Garamond" w:hAnsi="Garamond"/>
-          <w:color w:val="000000"/>
-          <w:kern w:val="0"/>
-          <w:sz w:val="36"/>
-          <w:szCs w:val="36"/>
-          <w:shd w:fill="auto" w:val="clear"/>
-          <w:lang w:val="en-US" w:eastAsia="zh-CN" w:bidi="hi-IN"/>
-        </w:rPr>
-        <w:t xml:space="preserve"> se vincula àqueles que </w:t>
-      </w:r>
-      <w:r>
-        <w:rPr>
-          <w:rFonts w:eastAsia="Times New Roman" w:cs="Times New Roman" w:ascii="Garamond" w:hAnsi="Garamond"/>
-          <w:color w:val="000000"/>
-          <w:kern w:val="0"/>
-          <w:sz w:val="36"/>
-          <w:szCs w:val="36"/>
-          <w:shd w:fill="auto" w:val="clear"/>
-          <w:lang w:val="en-US" w:eastAsia="zh-CN" w:bidi="hi-IN"/>
-        </w:rPr>
-        <w:t>vibram na mesma faixa que ele</w:t>
-      </w:r>
-      <w:r>
-        <w:rPr>
-          <w:rFonts w:eastAsia="Times New Roman" w:cs="Times New Roman" w:ascii="Garamond" w:hAnsi="Garamond"/>
-          <w:color w:val="000000"/>
-          <w:kern w:val="0"/>
-          <w:sz w:val="36"/>
-          <w:szCs w:val="36"/>
-          <w:shd w:fill="auto" w:val="clear"/>
-          <w:lang w:val="en-US" w:eastAsia="zh-CN" w:bidi="hi-IN"/>
-        </w:rPr>
-        <w:t>.</w:t>
-      </w:r>
-    </w:p>
-    <w:p>
-      <w:pPr>
-        <w:pStyle w:val="Normal"/>
-        <w:jc w:val="both"/>
-        <w:rPr>
-          <w:color w:val="auto"/>
-        </w:rPr>
-      </w:pPr>
-      <w:r>
-        <w:rPr/>
-      </w:r>
-    </w:p>
-    <w:p>
-      <w:pPr>
-        <w:pStyle w:val="Normal"/>
-        <w:jc w:val="both"/>
-        <w:rPr>
-          <w:color w:val="auto"/>
-        </w:rPr>
-      </w:pPr>
-      <w:r>
-        <w:rPr>
-          <w:rFonts w:eastAsia="Times New Roman" w:cs="Times New Roman" w:ascii="Garamond" w:hAnsi="Garamond"/>
-          <w:color w:val="000000"/>
-          <w:kern w:val="0"/>
-          <w:sz w:val="36"/>
-          <w:szCs w:val="36"/>
-          <w:shd w:fill="auto" w:val="clear"/>
-          <w:lang w:val="en-US" w:eastAsia="zh-CN" w:bidi="hi-IN"/>
-        </w:rPr>
-        <w:t xml:space="preserve">Mas qual é, afinal, a influência do pensamento na oração? Para entendermos isso, precisamos lembrar que tudo o que existe — seja material, seja imaterial — está envolvido por aquilo que chamamos de fluido cósmico universal. </w:t>
-      </w:r>
-    </w:p>
-    <w:p>
-      <w:pPr>
-        <w:pStyle w:val="Normal"/>
-        <w:jc w:val="both"/>
-        <w:rPr>
-          <w:color w:val="auto"/>
-        </w:rPr>
-      </w:pPr>
-      <w:r>
-        <w:rPr/>
-      </w:r>
-    </w:p>
-    <w:p>
-      <w:pPr>
-        <w:pStyle w:val="Normal"/>
-        <w:jc w:val="both"/>
-        <w:rPr>
-          <w:color w:val="auto"/>
-        </w:rPr>
-      </w:pPr>
-      <w:r>
-        <w:rPr>
-          <w:rFonts w:eastAsia="Times New Roman" w:cs="Times New Roman" w:ascii="Garamond" w:hAnsi="Garamond"/>
-          <w:color w:val="000000"/>
-          <w:kern w:val="0"/>
-          <w:sz w:val="36"/>
-          <w:szCs w:val="36"/>
-          <w:shd w:fill="auto" w:val="clear"/>
-          <w:lang w:val="en-US" w:eastAsia="zh-CN" w:bidi="hi-IN"/>
-        </w:rPr>
-        <w:t>Esse fluido preenche todo o universo. Qualquer lugar que possamos imaginar, dentro ou fora do nosso planeta, ali também estará o fluido cósmico universal.</w:t>
-      </w:r>
-    </w:p>
-    <w:p>
-      <w:pPr>
-        <w:pStyle w:val="Normal"/>
-        <w:jc w:val="both"/>
-        <w:rPr>
-          <w:color w:val="auto"/>
-        </w:rPr>
-      </w:pPr>
-      <w:r>
-        <w:rPr/>
-      </w:r>
-    </w:p>
-    <w:p>
-      <w:pPr>
-        <w:pStyle w:val="Normal"/>
-        <w:jc w:val="both"/>
-        <w:rPr>
-          <w:color w:val="auto"/>
-        </w:rPr>
-      </w:pPr>
-      <w:r>
-        <w:rPr>
-          <w:rFonts w:eastAsia="Times New Roman" w:cs="Times New Roman" w:ascii="Garamond" w:hAnsi="Garamond"/>
-          <w:color w:val="000000"/>
-          <w:kern w:val="0"/>
-          <w:sz w:val="36"/>
-          <w:szCs w:val="36"/>
-          <w:shd w:fill="auto" w:val="clear"/>
-          <w:lang w:val="en-US" w:eastAsia="zh-CN" w:bidi="hi-IN"/>
-        </w:rPr>
-        <w:t>Para facilitar a compreensão, podemos fazer uma comparação: assim como vivemos no ar que forma a atmosfera da Terra, também estamos envolvidos por esse fluido, que funciona como uma espécie de atmosfera espiritual.</w:t>
-      </w:r>
-    </w:p>
-    <w:p>
-      <w:pPr>
-        <w:pStyle w:val="Normal"/>
-        <w:jc w:val="both"/>
-        <w:rPr>
-          <w:color w:val="auto"/>
-        </w:rPr>
-      </w:pPr>
-      <w:r>
-        <w:rPr/>
-      </w:r>
-    </w:p>
-    <w:p>
-      <w:pPr>
-        <w:pStyle w:val="Normal"/>
-        <w:jc w:val="both"/>
-        <w:rPr>
-          <w:color w:val="auto"/>
-        </w:rPr>
-      </w:pPr>
-      <w:r>
-        <w:rPr>
-          <w:rFonts w:eastAsia="Times New Roman" w:cs="Times New Roman" w:ascii="Garamond" w:hAnsi="Garamond"/>
-          <w:color w:val="000000"/>
-          <w:kern w:val="0"/>
-          <w:sz w:val="36"/>
-          <w:szCs w:val="36"/>
-          <w:shd w:fill="auto" w:val="clear"/>
-          <w:lang w:val="en-US" w:eastAsia="zh-CN" w:bidi="hi-IN"/>
-        </w:rPr>
-        <w:t xml:space="preserve">Então, quando nós pensamos ou oramos, nossa vontade coloca esse fluido em movimento. Ele funciona como um veículo do pensamento, da mesma forma que o ar é o veículo do som. </w:t>
-      </w:r>
-    </w:p>
-    <w:p>
-      <w:pPr>
-        <w:pStyle w:val="Normal"/>
-        <w:jc w:val="both"/>
-        <w:rPr>
-          <w:color w:val="auto"/>
-        </w:rPr>
-      </w:pPr>
-      <w:r>
-        <w:rPr/>
-      </w:r>
-    </w:p>
-    <w:p>
-      <w:pPr>
-        <w:pStyle w:val="Normal"/>
-        <w:jc w:val="both"/>
-        <w:rPr>
-          <w:color w:val="auto"/>
-        </w:rPr>
-      </w:pPr>
-      <w:r>
-        <w:rPr>
-          <w:rFonts w:eastAsia="Times New Roman" w:cs="Times New Roman" w:ascii="Garamond" w:hAnsi="Garamond"/>
-          <w:color w:val="000000"/>
-          <w:kern w:val="0"/>
-          <w:sz w:val="36"/>
-          <w:szCs w:val="36"/>
-          <w:shd w:fill="auto" w:val="clear"/>
-          <w:lang w:val="en-US" w:eastAsia="zh-CN" w:bidi="hi-IN"/>
-        </w:rPr>
-        <w:t xml:space="preserve">A diferença é que o som só viaja por curtas distâncias, já que ele depende do ar para se propagar. O som não pode ir aonde não existe o ar - como, por exemplo, no espaço. Já o pensamento pode viajar por todo o universo </w:t>
-      </w:r>
-      <w:r>
-        <w:rPr>
-          <w:rFonts w:eastAsia="Times New Roman" w:cs="Times New Roman" w:ascii="Garamond" w:hAnsi="Garamond"/>
-          <w:color w:val="000000"/>
-          <w:kern w:val="0"/>
-          <w:sz w:val="36"/>
-          <w:szCs w:val="36"/>
-          <w:shd w:fill="auto" w:val="clear"/>
-          <w:lang w:val="en-US" w:eastAsia="zh-CN" w:bidi="hi-IN"/>
-        </w:rPr>
-        <w:t>uma vez que</w:t>
-      </w:r>
-      <w:r>
-        <w:rPr>
-          <w:rFonts w:eastAsia="Times New Roman" w:cs="Times New Roman" w:ascii="Garamond" w:hAnsi="Garamond"/>
-          <w:color w:val="000000"/>
-          <w:kern w:val="0"/>
-          <w:sz w:val="36"/>
-          <w:szCs w:val="36"/>
-          <w:shd w:fill="auto" w:val="clear"/>
-          <w:lang w:val="en-US" w:eastAsia="zh-CN" w:bidi="hi-IN"/>
-        </w:rPr>
-        <w:t xml:space="preserve"> seu meio de propagação é o </w:t>
-      </w:r>
-      <w:r>
-        <w:rPr>
-          <w:rFonts w:eastAsia="Times New Roman" w:cs="Times New Roman" w:ascii="Garamond" w:hAnsi="Garamond"/>
-          <w:color w:val="000000"/>
-          <w:kern w:val="0"/>
-          <w:sz w:val="36"/>
-          <w:szCs w:val="36"/>
-          <w:shd w:fill="auto" w:val="clear"/>
-          <w:lang w:val="en-US" w:eastAsia="zh-CN" w:bidi="hi-IN"/>
-        </w:rPr>
-        <w:t>f</w:t>
-      </w:r>
-      <w:r>
-        <w:rPr>
-          <w:rFonts w:eastAsia="Times New Roman" w:cs="Times New Roman" w:ascii="Garamond" w:hAnsi="Garamond"/>
-          <w:color w:val="000000"/>
-          <w:kern w:val="0"/>
-          <w:sz w:val="36"/>
-          <w:szCs w:val="36"/>
-          <w:shd w:fill="auto" w:val="clear"/>
-          <w:lang w:val="en-US" w:eastAsia="zh-CN" w:bidi="hi-IN"/>
-        </w:rPr>
-        <w:t xml:space="preserve">luido </w:t>
-      </w:r>
-      <w:r>
-        <w:rPr>
-          <w:rFonts w:eastAsia="Times New Roman" w:cs="Times New Roman" w:ascii="Garamond" w:hAnsi="Garamond"/>
-          <w:color w:val="000000"/>
-          <w:kern w:val="0"/>
-          <w:sz w:val="36"/>
-          <w:szCs w:val="36"/>
-          <w:shd w:fill="auto" w:val="clear"/>
-          <w:lang w:val="en-US" w:eastAsia="zh-CN" w:bidi="hi-IN"/>
-        </w:rPr>
-        <w:t>c</w:t>
-      </w:r>
-      <w:r>
-        <w:rPr>
-          <w:rFonts w:eastAsia="Times New Roman" w:cs="Times New Roman" w:ascii="Garamond" w:hAnsi="Garamond"/>
-          <w:color w:val="000000"/>
-          <w:kern w:val="0"/>
-          <w:sz w:val="36"/>
-          <w:szCs w:val="36"/>
-          <w:shd w:fill="auto" w:val="clear"/>
-          <w:lang w:val="en-US" w:eastAsia="zh-CN" w:bidi="hi-IN"/>
-        </w:rPr>
-        <w:t xml:space="preserve">ósmico </w:t>
-      </w:r>
-      <w:r>
-        <w:rPr>
-          <w:rFonts w:eastAsia="Times New Roman" w:cs="Times New Roman" w:ascii="Garamond" w:hAnsi="Garamond"/>
-          <w:color w:val="000000"/>
-          <w:kern w:val="0"/>
-          <w:sz w:val="36"/>
-          <w:szCs w:val="36"/>
-          <w:shd w:fill="auto" w:val="clear"/>
-          <w:lang w:val="en-US" w:eastAsia="zh-CN" w:bidi="hi-IN"/>
-        </w:rPr>
-        <w:t>u</w:t>
-      </w:r>
-      <w:r>
-        <w:rPr>
-          <w:rFonts w:eastAsia="Times New Roman" w:cs="Times New Roman" w:ascii="Garamond" w:hAnsi="Garamond"/>
-          <w:color w:val="000000"/>
-          <w:kern w:val="0"/>
-          <w:sz w:val="36"/>
-          <w:szCs w:val="36"/>
-          <w:shd w:fill="auto" w:val="clear"/>
-          <w:lang w:val="en-US" w:eastAsia="zh-CN" w:bidi="hi-IN"/>
-        </w:rPr>
-        <w:t>niversal.</w:t>
-      </w:r>
-    </w:p>
-    <w:p>
-      <w:pPr>
-        <w:pStyle w:val="Normal"/>
-        <w:jc w:val="both"/>
-        <w:rPr>
-          <w:color w:val="auto"/>
-        </w:rPr>
-      </w:pPr>
-      <w:r>
-        <w:rPr/>
-      </w:r>
-    </w:p>
-    <w:p>
-      <w:pPr>
-        <w:pStyle w:val="Normal"/>
-        <w:jc w:val="both"/>
-        <w:rPr>
-          <w:color w:val="auto"/>
-        </w:rPr>
-      </w:pPr>
-      <w:r>
-        <w:rPr>
-          <w:rFonts w:eastAsia="Times New Roman" w:cs="Times New Roman" w:ascii="Garamond" w:hAnsi="Garamond"/>
-          <w:color w:val="000000"/>
-          <w:kern w:val="0"/>
-          <w:sz w:val="36"/>
-          <w:szCs w:val="36"/>
-          <w:shd w:fill="auto" w:val="clear"/>
-          <w:lang w:val="en-US" w:eastAsia="zh-CN" w:bidi="hi-IN"/>
-        </w:rPr>
-        <w:t xml:space="preserve">Quando </w:t>
-      </w:r>
-      <w:r>
-        <w:rPr>
-          <w:rFonts w:eastAsia="Times New Roman" w:cs="Times New Roman" w:ascii="Garamond" w:hAnsi="Garamond"/>
-          <w:color w:val="000000"/>
-          <w:kern w:val="0"/>
-          <w:sz w:val="36"/>
-          <w:szCs w:val="36"/>
-          <w:shd w:fill="auto" w:val="clear"/>
-          <w:lang w:val="en-US" w:eastAsia="zh-CN" w:bidi="hi-IN"/>
-        </w:rPr>
-        <w:t>endereçamos</w:t>
-      </w:r>
-      <w:r>
-        <w:rPr>
-          <w:rFonts w:eastAsia="Times New Roman" w:cs="Times New Roman" w:ascii="Garamond" w:hAnsi="Garamond"/>
-          <w:color w:val="000000"/>
-          <w:kern w:val="0"/>
-          <w:sz w:val="36"/>
-          <w:szCs w:val="36"/>
-          <w:shd w:fill="auto" w:val="clear"/>
-          <w:lang w:val="en-US" w:eastAsia="zh-CN" w:bidi="hi-IN"/>
-        </w:rPr>
-        <w:t xml:space="preserve"> um pensamento a alguém —  encarnado ou desencarnado — estabelece-se uma corrente no </w:t>
-      </w:r>
-      <w:r>
-        <w:rPr>
-          <w:rFonts w:eastAsia="Times New Roman" w:cs="Times New Roman" w:ascii="Garamond" w:hAnsi="Garamond"/>
-          <w:color w:val="000000"/>
-          <w:kern w:val="0"/>
-          <w:sz w:val="36"/>
-          <w:szCs w:val="36"/>
-          <w:shd w:fill="auto" w:val="clear"/>
-          <w:lang w:val="en-US" w:eastAsia="zh-CN" w:bidi="hi-IN"/>
-        </w:rPr>
-        <w:t>f</w:t>
-      </w:r>
-      <w:r>
-        <w:rPr>
-          <w:rFonts w:eastAsia="Times New Roman" w:cs="Times New Roman" w:ascii="Garamond" w:hAnsi="Garamond"/>
-          <w:color w:val="000000"/>
-          <w:kern w:val="0"/>
-          <w:sz w:val="36"/>
-          <w:szCs w:val="36"/>
-          <w:shd w:fill="auto" w:val="clear"/>
-          <w:lang w:val="en-US" w:eastAsia="zh-CN" w:bidi="hi-IN"/>
-        </w:rPr>
-        <w:t xml:space="preserve">luido </w:t>
-      </w:r>
-      <w:r>
-        <w:rPr>
-          <w:rFonts w:eastAsia="Times New Roman" w:cs="Times New Roman" w:ascii="Garamond" w:hAnsi="Garamond"/>
-          <w:color w:val="000000"/>
-          <w:kern w:val="0"/>
-          <w:sz w:val="36"/>
-          <w:szCs w:val="36"/>
-          <w:shd w:fill="auto" w:val="clear"/>
-          <w:lang w:val="en-US" w:eastAsia="zh-CN" w:bidi="hi-IN"/>
-        </w:rPr>
-        <w:t>c</w:t>
-      </w:r>
-      <w:r>
-        <w:rPr>
-          <w:rFonts w:eastAsia="Times New Roman" w:cs="Times New Roman" w:ascii="Garamond" w:hAnsi="Garamond"/>
-          <w:color w:val="000000"/>
-          <w:kern w:val="0"/>
-          <w:sz w:val="36"/>
-          <w:szCs w:val="36"/>
-          <w:shd w:fill="auto" w:val="clear"/>
-          <w:lang w:val="en-US" w:eastAsia="zh-CN" w:bidi="hi-IN"/>
-        </w:rPr>
-        <w:t xml:space="preserve">ósmico </w:t>
-      </w:r>
-      <w:r>
-        <w:rPr>
-          <w:rFonts w:eastAsia="Times New Roman" w:cs="Times New Roman" w:ascii="Garamond" w:hAnsi="Garamond"/>
-          <w:color w:val="000000"/>
-          <w:kern w:val="0"/>
-          <w:sz w:val="36"/>
-          <w:szCs w:val="36"/>
-          <w:shd w:fill="auto" w:val="clear"/>
-          <w:lang w:val="en-US" w:eastAsia="zh-CN" w:bidi="hi-IN"/>
-        </w:rPr>
-        <w:t>u</w:t>
-      </w:r>
-      <w:r>
-        <w:rPr>
-          <w:rFonts w:eastAsia="Times New Roman" w:cs="Times New Roman" w:ascii="Garamond" w:hAnsi="Garamond"/>
-          <w:color w:val="000000"/>
-          <w:kern w:val="0"/>
-          <w:sz w:val="36"/>
-          <w:szCs w:val="36"/>
-          <w:shd w:fill="auto" w:val="clear"/>
-          <w:lang w:val="en-US" w:eastAsia="zh-CN" w:bidi="hi-IN"/>
-        </w:rPr>
-        <w:t xml:space="preserve">niversal que nos liga </w:t>
-      </w:r>
-      <w:r>
-        <w:rPr>
-          <w:rFonts w:eastAsia="Times New Roman" w:cs="Times New Roman" w:ascii="Garamond" w:hAnsi="Garamond"/>
-          <w:color w:val="000000"/>
-          <w:kern w:val="0"/>
-          <w:sz w:val="36"/>
-          <w:szCs w:val="36"/>
-          <w:shd w:fill="auto" w:val="clear"/>
-          <w:lang w:val="en-US" w:eastAsia="zh-CN" w:bidi="hi-IN"/>
-        </w:rPr>
-        <w:t>a esse alguém</w:t>
-      </w:r>
-      <w:r>
-        <w:rPr>
-          <w:rFonts w:eastAsia="Times New Roman" w:cs="Times New Roman" w:ascii="Garamond" w:hAnsi="Garamond"/>
-          <w:color w:val="000000"/>
-          <w:kern w:val="0"/>
-          <w:sz w:val="36"/>
-          <w:szCs w:val="36"/>
-          <w:shd w:fill="auto" w:val="clear"/>
-          <w:lang w:val="en-US" w:eastAsia="zh-CN" w:bidi="hi-IN"/>
-        </w:rPr>
-        <w:t>. É</w:t>
-      </w:r>
-      <w:r>
-        <w:rPr>
-          <w:rFonts w:eastAsia="Times New Roman" w:cs="Times New Roman" w:ascii="Garamond" w:hAnsi="Garamond"/>
-          <w:color w:val="000000"/>
-          <w:kern w:val="0"/>
-          <w:sz w:val="36"/>
-          <w:szCs w:val="36"/>
-          <w:shd w:fill="auto" w:val="clear"/>
-          <w:lang w:val="en-US" w:eastAsia="zh-CN" w:bidi="hi-IN"/>
-        </w:rPr>
-        <w:t xml:space="preserve"> através dessa corrente que nosso pensamento viaja.</w:t>
-      </w:r>
-    </w:p>
-    <w:p>
-      <w:pPr>
-        <w:pStyle w:val="Normal"/>
-        <w:jc w:val="both"/>
-        <w:rPr>
-          <w:color w:val="auto"/>
-        </w:rPr>
-      </w:pPr>
-      <w:r>
-        <w:rPr/>
-      </w:r>
-    </w:p>
-    <w:p>
-      <w:pPr>
-        <w:pStyle w:val="Normal"/>
-        <w:jc w:val="both"/>
-        <w:rPr>
-          <w:color w:val="auto"/>
-        </w:rPr>
-      </w:pPr>
-      <w:r>
-        <w:rPr>
-          <w:rFonts w:eastAsia="Times New Roman" w:cs="Times New Roman" w:ascii="Garamond" w:hAnsi="Garamond"/>
-          <w:color w:val="000000"/>
-          <w:kern w:val="0"/>
-          <w:sz w:val="36"/>
-          <w:szCs w:val="36"/>
-          <w:shd w:fill="auto" w:val="clear"/>
-          <w:lang w:val="en-US" w:eastAsia="zh-CN" w:bidi="hi-IN"/>
-        </w:rPr>
-        <w:t>Em se tratando da oração, a força dessa corrente depende da intensidade e da qualidade do pensamento e da vontade de quem ora. É por isso que os Espíritos podem ouvir as preces que lhes são dirigidas, onde quer que estejam. É por essa mesma razão que os Espíritos podem nos inspirar e estabelecer relações espirituais mesmo à distância.</w:t>
-      </w:r>
-    </w:p>
-    <w:p>
-      <w:pPr>
-        <w:pStyle w:val="Normal"/>
-        <w:jc w:val="both"/>
-        <w:rPr>
-          <w:color w:val="auto"/>
-        </w:rPr>
-      </w:pPr>
-      <w:r>
-        <w:rPr/>
-      </w:r>
-    </w:p>
-    <w:p>
-      <w:pPr>
-        <w:pStyle w:val="Normal"/>
-        <w:jc w:val="both"/>
-        <w:rPr>
-          <w:color w:val="auto"/>
-        </w:rPr>
-      </w:pPr>
-      <w:r>
-        <w:rPr/>
-      </w:r>
-    </w:p>
-    <w:p>
-      <w:pPr>
-        <w:pStyle w:val="Normal"/>
-        <w:jc w:val="both"/>
-        <w:rPr>
-          <w:color w:val="auto"/>
-        </w:rPr>
-      </w:pPr>
-      <w:r>
-        <w:rPr/>
-      </w:r>
-    </w:p>
-    <w:p>
-      <w:pPr>
-        <w:pStyle w:val="Normal"/>
-        <w:jc w:val="both"/>
-        <w:rPr>
-          <w:color w:val="auto"/>
-        </w:rPr>
-      </w:pPr>
-      <w:r>
-        <w:rPr/>
-      </w:r>
-    </w:p>
-    <w:p>
-      <w:pPr>
-        <w:pStyle w:val="Normal"/>
-        <w:jc w:val="both"/>
-        <w:rPr>
           <w:color w:val="18A303"/>
         </w:rPr>
       </w:pPr>
@@ -3002,417 +3489,19 @@
           <w:shd w:fill="auto" w:val="clear"/>
           <w:lang w:val="en-US" w:eastAsia="zh-CN" w:bidi="hi-IN"/>
         </w:rPr>
-        <w:t>[ Revisado até aqui em 08/03/2026 ]</w:t>
-      </w:r>
-    </w:p>
-    <w:p>
-      <w:pPr>
-        <w:pStyle w:val="Normal"/>
-        <w:jc w:val="both"/>
-        <w:rPr>
-          <w:color w:val="auto"/>
-        </w:rPr>
-      </w:pPr>
-      <w:r>
-        <w:rPr/>
-      </w:r>
-    </w:p>
-    <w:p>
-      <w:pPr>
-        <w:pStyle w:val="Normal"/>
-        <w:jc w:val="both"/>
-        <w:rPr>
-          <w:color w:val="auto"/>
-        </w:rPr>
-      </w:pPr>
-      <w:r>
-        <w:rPr>
-          <w:rFonts w:eastAsia="Times New Roman" w:cs="Times New Roman" w:ascii="Garamond" w:hAnsi="Garamond"/>
-          <w:color w:val="000000"/>
-          <w:kern w:val="0"/>
-          <w:sz w:val="36"/>
-          <w:szCs w:val="36"/>
-          <w:shd w:fill="auto" w:val="clear"/>
-          <w:lang w:val="en-US" w:eastAsia="zh-CN" w:bidi="hi-IN"/>
-        </w:rPr>
-        <w:t>Podemos fazer uma comparação para compreender essa dinâmica. As pessoas que estão mais ao fundo do auditório só conseguem ouvir o que estou dizendo porque o som da minha voz foi captado pelo microfone, passou por um amplificador e foi enviado para as caixas de som que estão nas laterais do salão.</w:t>
-      </w:r>
-    </w:p>
-    <w:p>
-      <w:pPr>
-        <w:pStyle w:val="Normal"/>
-        <w:jc w:val="both"/>
-        <w:rPr>
-          <w:color w:val="auto"/>
-        </w:rPr>
-      </w:pPr>
-      <w:r>
-        <w:rPr>
-          <w:color w:val="auto"/>
-        </w:rPr>
-      </w:r>
-    </w:p>
-    <w:p>
-      <w:pPr>
-        <w:pStyle w:val="Normal"/>
-        <w:jc w:val="both"/>
-        <w:rPr>
-          <w:color w:val="auto"/>
-        </w:rPr>
-      </w:pPr>
-      <w:r>
-        <w:rPr>
-          <w:rFonts w:eastAsia="Times New Roman" w:cs="Times New Roman" w:ascii="Garamond" w:hAnsi="Garamond"/>
-          <w:color w:val="000000"/>
-          <w:kern w:val="0"/>
-          <w:sz w:val="36"/>
-          <w:szCs w:val="36"/>
-          <w:shd w:fill="auto" w:val="clear"/>
-          <w:lang w:val="en-US" w:eastAsia="zh-CN" w:bidi="hi-IN"/>
-        </w:rPr>
-        <w:t>Sem esse processo de amplificação, quem está mais distante de mim não conseguiria me ouvir, a menos que eu falasse muito alto.</w:t>
-      </w:r>
-    </w:p>
-    <w:p>
-      <w:pPr>
-        <w:pStyle w:val="Normal"/>
-        <w:jc w:val="both"/>
-        <w:rPr>
-          <w:color w:val="auto"/>
-        </w:rPr>
-      </w:pPr>
-      <w:r>
-        <w:rPr>
-          <w:color w:val="auto"/>
-        </w:rPr>
-      </w:r>
-    </w:p>
-    <w:p>
-      <w:pPr>
-        <w:pStyle w:val="Normal"/>
-        <w:jc w:val="both"/>
-        <w:rPr>
-          <w:color w:val="auto"/>
-        </w:rPr>
-      </w:pPr>
-      <w:r>
-        <w:rPr>
-          <w:rFonts w:eastAsia="Times New Roman" w:cs="Times New Roman" w:ascii="Garamond" w:hAnsi="Garamond"/>
-          <w:color w:val="000000"/>
-          <w:kern w:val="0"/>
-          <w:sz w:val="36"/>
-          <w:szCs w:val="36"/>
-          <w:shd w:fill="auto" w:val="clear"/>
-          <w:lang w:val="en-US" w:eastAsia="zh-CN" w:bidi="hi-IN"/>
-        </w:rPr>
-        <w:t>O mesmo se dá com a oração. Quanto mais amplificada ela estiver, vamos dizer assim, maior o seu alcance. E quais são os amplificadores da  oração: são os bons pensamentos, os bons sentimentos, o desejo de se alcançar algo realmente útil e bom.</w:t>
-      </w:r>
-    </w:p>
-    <w:p>
-      <w:pPr>
-        <w:pStyle w:val="Normal"/>
-        <w:jc w:val="both"/>
-        <w:rPr>
-          <w:color w:val="auto"/>
-        </w:rPr>
-      </w:pPr>
-      <w:r>
-        <w:rPr>
-          <w:color w:val="auto"/>
-        </w:rPr>
-      </w:r>
-    </w:p>
-    <w:p>
-      <w:pPr>
-        <w:pStyle w:val="Normal"/>
-        <w:jc w:val="both"/>
-        <w:rPr>
-          <w:color w:val="0369A3"/>
-        </w:rPr>
-      </w:pPr>
-      <w:r>
-        <w:rPr>
-          <w:rFonts w:eastAsia="Times New Roman" w:cs="Times New Roman" w:ascii="Garamond" w:hAnsi="Garamond"/>
-          <w:color w:val="0369A3"/>
-          <w:kern w:val="0"/>
-          <w:sz w:val="36"/>
-          <w:szCs w:val="36"/>
-          <w:shd w:fill="auto" w:val="clear"/>
-          <w:lang w:val="en-US" w:eastAsia="zh-CN" w:bidi="hi-IN"/>
-        </w:rPr>
-        <w:t>[ Desenvolver - Início ]</w:t>
-      </w:r>
-    </w:p>
-    <w:p>
-      <w:pPr>
-        <w:pStyle w:val="Normal"/>
-        <w:jc w:val="both"/>
-        <w:rPr>
-          <w:color w:val="auto"/>
-        </w:rPr>
-      </w:pPr>
-      <w:r>
-        <w:rPr>
-          <w:rFonts w:eastAsia="Times New Roman" w:cs="Times New Roman" w:ascii="Garamond" w:hAnsi="Garamond"/>
-          <w:color w:val="000000"/>
-          <w:kern w:val="0"/>
-          <w:sz w:val="36"/>
-          <w:szCs w:val="36"/>
-          <w:shd w:fill="auto" w:val="clear"/>
-          <w:lang w:val="en-US" w:eastAsia="zh-CN" w:bidi="hi-IN"/>
-        </w:rPr>
-        <w:t>Sendo os fluidos o veículo do pensamento, este atua sobre os fluidos como o som sobre o ar; eles nos trazem o pensamento, como o ar nos traz o som. Pode-se pois dizer, sem receio de errar, que há, nesses fluidos, ondas e raios de pensamentos, que se cruzam sem se confundirem, como há no ar ondas e raios sonoros.</w:t>
-      </w:r>
-    </w:p>
-    <w:p>
-      <w:pPr>
-        <w:pStyle w:val="Normal"/>
-        <w:jc w:val="both"/>
-        <w:rPr>
-          <w:color w:val="0369A3"/>
-        </w:rPr>
-      </w:pPr>
-      <w:r>
-        <w:rPr>
-          <w:rFonts w:eastAsia="Times New Roman" w:cs="Times New Roman" w:ascii="Garamond" w:hAnsi="Garamond"/>
-          <w:color w:val="0369A3"/>
-          <w:kern w:val="0"/>
-          <w:sz w:val="36"/>
-          <w:szCs w:val="36"/>
-          <w:shd w:fill="auto" w:val="clear"/>
-          <w:lang w:val="en-US" w:eastAsia="zh-CN" w:bidi="hi-IN"/>
-        </w:rPr>
-        <w:t>[ Desenvolver - Término ]</w:t>
-      </w:r>
-    </w:p>
-    <w:p>
-      <w:pPr>
-        <w:pStyle w:val="Normal"/>
-        <w:jc w:val="both"/>
-        <w:rPr>
-          <w:color w:val="auto"/>
-        </w:rPr>
-      </w:pPr>
-      <w:r>
-        <w:rPr>
-          <w:color w:val="auto"/>
-        </w:rPr>
-      </w:r>
-    </w:p>
-    <w:p>
-      <w:pPr>
-        <w:pStyle w:val="Normal"/>
-        <w:jc w:val="both"/>
-        <w:rPr>
-          <w:color w:val="auto"/>
-        </w:rPr>
-      </w:pPr>
-      <w:r>
-        <w:rPr>
-          <w:rFonts w:eastAsia="Times New Roman" w:cs="Times New Roman" w:ascii="Garamond" w:hAnsi="Garamond"/>
-          <w:color w:val="000000"/>
-          <w:kern w:val="0"/>
-          <w:sz w:val="36"/>
-          <w:szCs w:val="36"/>
-          <w:shd w:fill="auto" w:val="clear"/>
-          <w:lang w:val="en-US" w:eastAsia="zh-CN" w:bidi="hi-IN"/>
-        </w:rPr>
-        <w:t>Essa explicação ajuda especialmente quem tem dificuldade em compreender a utilidade da oração. Ela não pretende transformar a prece em algo material, mas mostrar que a oração pode produzir efeitos reais. Ainda assim, esses efeitos não dependem apenas de nós: tudo está sempre subordinado à vontade de Deus, que é a autoridade suprema e quem, em última instância, decide se aquela prece poderá ou não produzir os resultados desejados.</w:t>
-      </w:r>
-    </w:p>
-    <w:p>
-      <w:pPr>
-        <w:pStyle w:val="Normal"/>
-        <w:jc w:val="both"/>
-        <w:rPr>
-          <w:color w:val="auto"/>
-        </w:rPr>
-      </w:pPr>
-      <w:r>
-        <w:rPr>
-          <w:color w:val="auto"/>
-        </w:rPr>
-      </w:r>
-    </w:p>
-    <w:p>
-      <w:pPr>
-        <w:pStyle w:val="Normal"/>
-        <w:jc w:val="both"/>
-        <w:rPr>
-          <w:color w:val="auto"/>
-        </w:rPr>
-      </w:pPr>
-      <w:r>
-        <w:rPr>
-          <w:rFonts w:eastAsia="Times New Roman" w:cs="Times New Roman" w:ascii="Garamond" w:hAnsi="Garamond"/>
-          <w:color w:val="000000"/>
-          <w:kern w:val="0"/>
-          <w:sz w:val="36"/>
-          <w:szCs w:val="36"/>
-          <w:shd w:fill="auto" w:val="clear"/>
-          <w:lang w:val="en-US" w:eastAsia="zh-CN" w:bidi="hi-IN"/>
-        </w:rPr>
-        <w:t xml:space="preserve">Ainda na passagem evangélica que estamos analisando, Jesus nos diz que Deus sabe do que necessitamos antes mesmo de pedirmos. Os  incrédulos geralmente dizem: se Deus conhece tudo aquilo de que necessitamos antes mesmo de pedirmos, por que precisamos orar? </w:t>
-      </w:r>
-    </w:p>
-    <w:p>
-      <w:pPr>
-        <w:pStyle w:val="Normal"/>
-        <w:jc w:val="both"/>
-        <w:rPr>
-          <w:color w:val="auto"/>
-        </w:rPr>
-      </w:pPr>
-      <w:r>
-        <w:rPr>
-          <w:color w:val="auto"/>
-        </w:rPr>
-      </w:r>
-    </w:p>
-    <w:p>
-      <w:pPr>
-        <w:pStyle w:val="Normal"/>
-        <w:jc w:val="both"/>
-        <w:rPr>
+        <w:t>[ Parei aqui em 11/03/2026 ]</w:t>
+      </w:r>
+      <w:r>
+        <w:rPr>
+          <w:rFonts w:eastAsia="Times New Roman" w:cs="Times New Roman" w:ascii="Garamond" w:hAnsi="Garamond"/>
           <w:color w:val="18A303"/>
-        </w:rPr>
-      </w:pPr>
-      <w:r>
-        <w:rPr>
-          <w:rFonts w:eastAsia="Times New Roman" w:cs="Times New Roman" w:ascii="Garamond" w:hAnsi="Garamond"/>
-          <w:color w:val="18A303"/>
-          <w:kern w:val="0"/>
-          <w:sz w:val="36"/>
-          <w:szCs w:val="36"/>
-          <w:shd w:fill="auto" w:val="clear"/>
-          <w:lang w:val="en-US" w:eastAsia="zh-CN" w:bidi="hi-IN"/>
-        </w:rPr>
-        <w:t>[ Ver se aqui precisa de complemento ]</w:t>
-      </w:r>
-    </w:p>
-    <w:p>
-      <w:pPr>
-        <w:pStyle w:val="Normal"/>
-        <w:jc w:val="both"/>
-        <w:rPr>
-          <w:color w:val="auto"/>
-        </w:rPr>
-      </w:pPr>
-      <w:r>
-        <w:rPr>
-          <w:color w:val="auto"/>
-        </w:rPr>
-      </w:r>
-    </w:p>
-    <w:p>
-      <w:pPr>
-        <w:pStyle w:val="Normal"/>
-        <w:jc w:val="both"/>
-        <w:rPr>
-          <w:color w:val="auto"/>
-        </w:rPr>
-      </w:pPr>
-      <w:r>
-        <w:rPr>
-          <w:rFonts w:eastAsia="Times New Roman" w:cs="Times New Roman" w:ascii="Garamond" w:hAnsi="Garamond"/>
-          <w:color w:val="000000"/>
-          <w:kern w:val="0"/>
-          <w:sz w:val="36"/>
-          <w:szCs w:val="36"/>
-          <w:shd w:fill="auto" w:val="clear"/>
-          <w:lang w:val="en-US" w:eastAsia="zh-CN" w:bidi="hi-IN"/>
-        </w:rPr>
-        <w:t>A resposta é simples: a oração não existe para informar a Deus sobre aquilo de que precisamos, mas para nos transformar. Orar é criar, dentro de nós, as condições necessárias para receber aquilo que a Providência já pode nos oferecer.</w:t>
-      </w:r>
-    </w:p>
-    <w:p>
-      <w:pPr>
-        <w:pStyle w:val="Normal"/>
-        <w:jc w:val="both"/>
-        <w:rPr>
-          <w:rFonts w:ascii="Garamond" w:hAnsi="Garamond" w:eastAsia="Times New Roman" w:cs="Times New Roman"/>
-          <w:kern w:val="0"/>
-          <w:sz w:val="36"/>
-          <w:szCs w:val="36"/>
-          <w:shd w:fill="auto" w:val="clear"/>
-          <w:lang w:val="en-US" w:eastAsia="zh-CN" w:bidi="hi-IN"/>
-        </w:rPr>
-      </w:pPr>
-      <w:r>
-        <w:rPr>
-          <w:rFonts w:eastAsia="Times New Roman" w:cs="Times New Roman" w:ascii="Garamond" w:hAnsi="Garamond"/>
-          <w:kern w:val="0"/>
-          <w:sz w:val="36"/>
-          <w:szCs w:val="36"/>
-          <w:shd w:fill="auto" w:val="clear"/>
-          <w:lang w:val="en-US" w:eastAsia="zh-CN" w:bidi="hi-IN"/>
-        </w:rPr>
-      </w:r>
-    </w:p>
-    <w:p>
-      <w:pPr>
-        <w:pStyle w:val="Normal"/>
-        <w:jc w:val="both"/>
-        <w:rPr>
-          <w:color w:val="auto"/>
-        </w:rPr>
-      </w:pPr>
-      <w:r>
-        <w:rPr>
-          <w:rFonts w:eastAsia="Times New Roman" w:cs="Times New Roman" w:ascii="Garamond" w:hAnsi="Garamond"/>
-          <w:color w:val="000000"/>
-          <w:kern w:val="0"/>
-          <w:sz w:val="36"/>
-          <w:szCs w:val="36"/>
-          <w:shd w:fill="auto" w:val="clear"/>
-          <w:lang w:val="en-US" w:eastAsia="zh-CN" w:bidi="hi-IN"/>
-        </w:rPr>
-        <w:t>A oração não muda Deus. Muda quem ora. Quebra o nosso orgulho, abre o nosso coração e nos prepara para receber aquilo que Deus sempre esteve disposto a nos dar.</w:t>
-      </w:r>
-    </w:p>
-    <w:p>
-      <w:pPr>
-        <w:pStyle w:val="Normal"/>
-        <w:jc w:val="both"/>
-        <w:rPr>
-          <w:rFonts w:ascii="Garamond" w:hAnsi="Garamond" w:eastAsia="Times New Roman" w:cs="Times New Roman"/>
-          <w:kern w:val="0"/>
-          <w:sz w:val="36"/>
-          <w:szCs w:val="36"/>
-          <w:shd w:fill="auto" w:val="clear"/>
-          <w:lang w:val="en-US" w:eastAsia="zh-CN" w:bidi="hi-IN"/>
-        </w:rPr>
-      </w:pPr>
-      <w:r>
-        <w:rPr>
-          <w:rFonts w:eastAsia="Times New Roman" w:cs="Times New Roman" w:ascii="Garamond" w:hAnsi="Garamond"/>
-          <w:kern w:val="0"/>
-          <w:sz w:val="36"/>
-          <w:szCs w:val="36"/>
-          <w:shd w:fill="auto" w:val="clear"/>
-          <w:lang w:val="en-US" w:eastAsia="zh-CN" w:bidi="hi-IN"/>
-        </w:rPr>
-      </w:r>
-    </w:p>
-    <w:p>
-      <w:pPr>
-        <w:pStyle w:val="Normal"/>
-        <w:jc w:val="both"/>
-        <w:rPr>
-          <w:color w:val="auto"/>
-        </w:rPr>
-      </w:pPr>
-      <w:r>
-        <w:rPr>
-          <w:rFonts w:eastAsia="Times New Roman" w:cs="Times New Roman" w:ascii="Garamond" w:hAnsi="Garamond"/>
-          <w:color w:val="000000"/>
-          <w:kern w:val="0"/>
-          <w:sz w:val="36"/>
-          <w:szCs w:val="36"/>
-          <w:shd w:fill="auto" w:val="clear"/>
-          <w:lang w:val="en-US" w:eastAsia="zh-CN" w:bidi="hi-IN"/>
-        </w:rPr>
-        <w:t xml:space="preserve">Podemos comparar aquilo que Deus nos oferece a uma fonte de água: quem vai até ela com um copo recolhe um copo; quem leva uma jarra recolhe uma jarra; quem leva um barril recolhe um barril. A fonte não muda — continua a mesma. O que muda é  a capacidade de cada um de receber. </w:t>
+          <w:kern w:val="0"/>
+          <w:sz w:val="36"/>
+          <w:szCs w:val="36"/>
+          <w:shd w:fill="auto" w:val="clear"/>
+          <w:lang w:val="en-US" w:eastAsia="zh-CN" w:bidi="hi-IN"/>
+        </w:rPr>
+        <w:t xml:space="preserve"> </w:t>
       </w:r>
     </w:p>
     <w:p>

</xml_diff>

<commit_message>
12/03/2026 - 21:29 h
</commit_message>
<xml_diff>
--- a/Pedi e obtereis/Pedi e obtereis.docx
+++ b/Pedi e obtereis/Pedi e obtereis.docx
@@ -2447,19 +2447,108 @@
           <w:shd w:fill="auto" w:val="clear"/>
           <w:lang w:val="en-US" w:eastAsia="zh-CN" w:bidi="hi-IN"/>
         </w:rPr>
-        <w:t>Quando oramos</w:t>
-      </w:r>
-      <w:r>
-        <w:rPr>
-          <w:rFonts w:eastAsia="Times New Roman" w:cs="Times New Roman" w:ascii="Garamond" w:hAnsi="Garamond"/>
-          <w:color w:val="000000"/>
-          <w:kern w:val="0"/>
-          <w:sz w:val="36"/>
-          <w:szCs w:val="36"/>
-          <w:shd w:fill="auto" w:val="clear"/>
-          <w:lang w:val="en-US" w:eastAsia="zh-CN" w:bidi="hi-IN"/>
-        </w:rPr>
-        <w:t>, a força dessa corrente depende</w:t>
+        <w:t xml:space="preserve">Quando oramos, a força dessa corrente depende da qualidade do nosso pensamento e da nossa vontade. É por isso que os Espíritos podem ouvir as preces que lhes são dirigidas, onde quer que estejam. Pela mesma razão os Espíritos podem nos inspirar e estabelecer </w:t>
+      </w:r>
+      <w:r>
+        <w:rPr>
+          <w:rFonts w:eastAsia="Times New Roman" w:cs="Times New Roman" w:ascii="Garamond" w:hAnsi="Garamond"/>
+          <w:color w:val="000000"/>
+          <w:kern w:val="0"/>
+          <w:sz w:val="36"/>
+          <w:szCs w:val="36"/>
+          <w:shd w:fill="auto" w:val="clear"/>
+          <w:lang w:val="en-US" w:eastAsia="zh-CN" w:bidi="hi-IN"/>
+        </w:rPr>
+        <w:t>ligações</w:t>
+      </w:r>
+      <w:r>
+        <w:rPr>
+          <w:rFonts w:eastAsia="Times New Roman" w:cs="Times New Roman" w:ascii="Garamond" w:hAnsi="Garamond"/>
+          <w:color w:val="000000"/>
+          <w:kern w:val="0"/>
+          <w:sz w:val="36"/>
+          <w:szCs w:val="36"/>
+          <w:shd w:fill="auto" w:val="clear"/>
+          <w:lang w:val="en-US" w:eastAsia="zh-CN" w:bidi="hi-IN"/>
+        </w:rPr>
+        <w:t xml:space="preserve"> mesmo à distância.</w:t>
+      </w:r>
+    </w:p>
+    <w:p>
+      <w:pPr>
+        <w:pStyle w:val="Normal"/>
+        <w:jc w:val="both"/>
+        <w:rPr>
+          <w:color w:val="auto"/>
+        </w:rPr>
+      </w:pPr>
+      <w:r>
+        <w:rPr>
+          <w:color w:val="auto"/>
+        </w:rPr>
+      </w:r>
+    </w:p>
+    <w:p>
+      <w:pPr>
+        <w:pStyle w:val="Normal"/>
+        <w:jc w:val="both"/>
+        <w:rPr>
+          <w:color w:val="auto"/>
+        </w:rPr>
+      </w:pPr>
+      <w:r>
+        <w:rPr>
+          <w:color w:val="auto"/>
+        </w:rPr>
+      </w:r>
+    </w:p>
+    <w:p>
+      <w:pPr>
+        <w:pStyle w:val="Normal"/>
+        <w:jc w:val="both"/>
+        <w:rPr>
+          <w:color w:val="auto"/>
+        </w:rPr>
+      </w:pPr>
+      <w:r>
+        <w:rPr>
+          <w:color w:val="auto"/>
+        </w:rPr>
+      </w:r>
+    </w:p>
+    <w:p>
+      <w:pPr>
+        <w:pStyle w:val="Normal"/>
+        <w:jc w:val="both"/>
+        <w:rPr>
+          <w:color w:val="auto"/>
+        </w:rPr>
+      </w:pPr>
+      <w:r>
+        <w:rPr>
+          <w:color w:val="auto"/>
+        </w:rPr>
+      </w:r>
+    </w:p>
+    <w:p>
+      <w:pPr>
+        <w:pStyle w:val="Normal"/>
+        <w:jc w:val="both"/>
+        <w:rPr>
+          <w:color w:val="auto"/>
+        </w:rPr>
+      </w:pPr>
+      <w:r>
+        <w:rPr>
+          <w:rFonts w:eastAsia="Times New Roman" w:cs="Times New Roman" w:ascii="Garamond" w:hAnsi="Garamond"/>
+          <w:color w:val="000000"/>
+          <w:kern w:val="0"/>
+          <w:sz w:val="36"/>
+          <w:szCs w:val="36"/>
+          <w:shd w:fill="auto" w:val="clear"/>
+          <w:lang w:val="en-US" w:eastAsia="zh-CN" w:bidi="hi-IN"/>
+        </w:rPr>
+        <w:t>Podemos fazer uma comparação para compreender essa dinâmica. As pessoas que estão mais ao fundo do auditório só conseguem ouvir o que estou dizendo porque o som da minha voz é</w:t>
       </w:r>
       <w:r>
         <w:rPr>
@@ -2483,121 +2572,1096 @@
           <w:shd w:fill="auto" w:val="clear"/>
           <w:lang w:val="en-US" w:eastAsia="zh-CN" w:bidi="hi-IN"/>
         </w:rPr>
-        <w:t>da qualidade do</w:t>
-      </w:r>
-      <w:r>
-        <w:rPr>
-          <w:rFonts w:eastAsia="Times New Roman" w:cs="Times New Roman" w:ascii="Garamond" w:hAnsi="Garamond"/>
-          <w:color w:val="000000"/>
-          <w:kern w:val="0"/>
-          <w:sz w:val="36"/>
-          <w:szCs w:val="36"/>
-          <w:shd w:fill="auto" w:val="clear"/>
-          <w:lang w:val="en-US" w:eastAsia="zh-CN" w:bidi="hi-IN"/>
-        </w:rPr>
-        <w:t xml:space="preserve"> nosso</w:t>
-      </w:r>
-      <w:r>
-        <w:rPr>
-          <w:rFonts w:eastAsia="Times New Roman" w:cs="Times New Roman" w:ascii="Garamond" w:hAnsi="Garamond"/>
-          <w:color w:val="000000"/>
-          <w:kern w:val="0"/>
-          <w:sz w:val="36"/>
-          <w:szCs w:val="36"/>
-          <w:shd w:fill="auto" w:val="clear"/>
-          <w:lang w:val="en-US" w:eastAsia="zh-CN" w:bidi="hi-IN"/>
-        </w:rPr>
-        <w:t xml:space="preserve"> pensamento e da </w:t>
-      </w:r>
-      <w:r>
-        <w:rPr>
-          <w:rFonts w:eastAsia="Times New Roman" w:cs="Times New Roman" w:ascii="Garamond" w:hAnsi="Garamond"/>
-          <w:color w:val="000000"/>
-          <w:kern w:val="0"/>
-          <w:sz w:val="36"/>
-          <w:szCs w:val="36"/>
-          <w:shd w:fill="auto" w:val="clear"/>
-          <w:lang w:val="en-US" w:eastAsia="zh-CN" w:bidi="hi-IN"/>
-        </w:rPr>
-        <w:t xml:space="preserve">nossa </w:t>
-      </w:r>
-      <w:r>
-        <w:rPr>
-          <w:rFonts w:eastAsia="Times New Roman" w:cs="Times New Roman" w:ascii="Garamond" w:hAnsi="Garamond"/>
-          <w:color w:val="000000"/>
-          <w:kern w:val="0"/>
-          <w:sz w:val="36"/>
-          <w:szCs w:val="36"/>
-          <w:shd w:fill="auto" w:val="clear"/>
-          <w:lang w:val="en-US" w:eastAsia="zh-CN" w:bidi="hi-IN"/>
-        </w:rPr>
-        <w:t xml:space="preserve">vontade. É por isso que os Espíritos podem ouvir as preces que lhes são dirigidas, onde quer que estejam. </w:t>
-      </w:r>
-      <w:r>
-        <w:rPr>
-          <w:rFonts w:eastAsia="Times New Roman" w:cs="Times New Roman" w:ascii="Garamond" w:hAnsi="Garamond"/>
-          <w:color w:val="000000"/>
-          <w:kern w:val="0"/>
-          <w:sz w:val="36"/>
-          <w:szCs w:val="36"/>
-          <w:shd w:fill="auto" w:val="clear"/>
-          <w:lang w:val="en-US" w:eastAsia="zh-CN" w:bidi="hi-IN"/>
-        </w:rPr>
-        <w:t>Pela</w:t>
-      </w:r>
-      <w:r>
-        <w:rPr>
-          <w:rFonts w:eastAsia="Times New Roman" w:cs="Times New Roman" w:ascii="Garamond" w:hAnsi="Garamond"/>
-          <w:color w:val="000000"/>
-          <w:kern w:val="0"/>
-          <w:sz w:val="36"/>
-          <w:szCs w:val="36"/>
-          <w:shd w:fill="auto" w:val="clear"/>
-          <w:lang w:val="en-US" w:eastAsia="zh-CN" w:bidi="hi-IN"/>
-        </w:rPr>
-        <w:t xml:space="preserve"> mesma razão os Espíritos podem nos inspirar e estabelecer relações espirituais mesmo à distância.</w:t>
-      </w:r>
-    </w:p>
-    <w:p>
-      <w:pPr>
-        <w:pStyle w:val="Normal"/>
-        <w:jc w:val="both"/>
-        <w:rPr>
-          <w:color w:val="auto"/>
-        </w:rPr>
-      </w:pPr>
-      <w:r>
-        <w:rPr>
-          <w:color w:val="auto"/>
-        </w:rPr>
-      </w:r>
-    </w:p>
-    <w:p>
-      <w:pPr>
-        <w:pStyle w:val="Normal"/>
-        <w:jc w:val="both"/>
-        <w:rPr>
-          <w:color w:val="auto"/>
-        </w:rPr>
-      </w:pPr>
-      <w:r>
-        <w:rPr>
-          <w:color w:val="auto"/>
-        </w:rPr>
-      </w:r>
-    </w:p>
-    <w:p>
-      <w:pPr>
-        <w:pStyle w:val="Normal"/>
-        <w:jc w:val="both"/>
-        <w:rPr>
-          <w:color w:val="auto"/>
-        </w:rPr>
-      </w:pPr>
-      <w:r>
-        <w:rPr>
-          <w:color w:val="auto"/>
-        </w:rPr>
+        <w:t>captado pelo microfone, pass</w:t>
+      </w:r>
+      <w:r>
+        <w:rPr>
+          <w:rFonts w:eastAsia="Times New Roman" w:cs="Times New Roman" w:ascii="Garamond" w:hAnsi="Garamond"/>
+          <w:color w:val="000000"/>
+          <w:kern w:val="0"/>
+          <w:sz w:val="36"/>
+          <w:szCs w:val="36"/>
+          <w:shd w:fill="auto" w:val="clear"/>
+          <w:lang w:val="en-US" w:eastAsia="zh-CN" w:bidi="hi-IN"/>
+        </w:rPr>
+        <w:t>a</w:t>
+      </w:r>
+      <w:r>
+        <w:rPr>
+          <w:rFonts w:eastAsia="Times New Roman" w:cs="Times New Roman" w:ascii="Garamond" w:hAnsi="Garamond"/>
+          <w:color w:val="000000"/>
+          <w:kern w:val="0"/>
+          <w:sz w:val="36"/>
+          <w:szCs w:val="36"/>
+          <w:shd w:fill="auto" w:val="clear"/>
+          <w:lang w:val="en-US" w:eastAsia="zh-CN" w:bidi="hi-IN"/>
+        </w:rPr>
+        <w:t xml:space="preserve"> por um amplificador e é</w:t>
+      </w:r>
+      <w:r>
+        <w:rPr>
+          <w:rFonts w:eastAsia="Times New Roman" w:cs="Times New Roman" w:ascii="Garamond" w:hAnsi="Garamond"/>
+          <w:color w:val="000000"/>
+          <w:kern w:val="0"/>
+          <w:sz w:val="36"/>
+          <w:szCs w:val="36"/>
+          <w:shd w:fill="auto" w:val="clear"/>
+          <w:lang w:val="en-US" w:eastAsia="zh-CN" w:bidi="hi-IN"/>
+        </w:rPr>
+        <w:t xml:space="preserve"> distribuído</w:t>
+      </w:r>
+      <w:r>
+        <w:rPr>
+          <w:rFonts w:eastAsia="Times New Roman" w:cs="Times New Roman" w:ascii="Garamond" w:hAnsi="Garamond"/>
+          <w:color w:val="000000"/>
+          <w:kern w:val="0"/>
+          <w:sz w:val="36"/>
+          <w:szCs w:val="36"/>
+          <w:shd w:fill="auto" w:val="clear"/>
+          <w:lang w:val="en-US" w:eastAsia="zh-CN" w:bidi="hi-IN"/>
+        </w:rPr>
+        <w:t xml:space="preserve"> p</w:t>
+      </w:r>
+      <w:r>
+        <w:rPr>
+          <w:rFonts w:eastAsia="Times New Roman" w:cs="Times New Roman" w:ascii="Garamond" w:hAnsi="Garamond"/>
+          <w:color w:val="000000"/>
+          <w:kern w:val="0"/>
+          <w:sz w:val="36"/>
+          <w:szCs w:val="36"/>
+          <w:shd w:fill="auto" w:val="clear"/>
+          <w:lang w:val="en-US" w:eastAsia="zh-CN" w:bidi="hi-IN"/>
+        </w:rPr>
+        <w:t>elas</w:t>
+      </w:r>
+      <w:r>
+        <w:rPr>
+          <w:rFonts w:eastAsia="Times New Roman" w:cs="Times New Roman" w:ascii="Garamond" w:hAnsi="Garamond"/>
+          <w:color w:val="000000"/>
+          <w:kern w:val="0"/>
+          <w:sz w:val="36"/>
+          <w:szCs w:val="36"/>
+          <w:shd w:fill="auto" w:val="clear"/>
+          <w:lang w:val="en-US" w:eastAsia="zh-CN" w:bidi="hi-IN"/>
+        </w:rPr>
+        <w:t xml:space="preserve"> caixas de som que estão nas laterais do salão.</w:t>
+      </w:r>
+    </w:p>
+    <w:p>
+      <w:pPr>
+        <w:pStyle w:val="Normal"/>
+        <w:jc w:val="both"/>
+        <w:rPr>
+          <w:color w:val="auto"/>
+        </w:rPr>
+      </w:pPr>
+      <w:r>
+        <w:rPr>
+          <w:color w:val="auto"/>
+        </w:rPr>
+      </w:r>
+    </w:p>
+    <w:p>
+      <w:pPr>
+        <w:pStyle w:val="Normal"/>
+        <w:jc w:val="both"/>
+        <w:rPr>
+          <w:color w:val="auto"/>
+        </w:rPr>
+      </w:pPr>
+      <w:r>
+        <w:rPr>
+          <w:rFonts w:eastAsia="Times New Roman" w:cs="Times New Roman" w:ascii="Garamond" w:hAnsi="Garamond"/>
+          <w:color w:val="000000"/>
+          <w:kern w:val="0"/>
+          <w:sz w:val="36"/>
+          <w:szCs w:val="36"/>
+          <w:shd w:fill="auto" w:val="clear"/>
+          <w:lang w:val="en-US" w:eastAsia="zh-CN" w:bidi="hi-IN"/>
+        </w:rPr>
+        <w:t>Sem esse processo de amplificação, quem está mais distante não conseguiria me ouvir, a menos que eu falasse muito alto.</w:t>
+      </w:r>
+    </w:p>
+    <w:p>
+      <w:pPr>
+        <w:pStyle w:val="Normal"/>
+        <w:jc w:val="both"/>
+        <w:rPr>
+          <w:color w:val="auto"/>
+        </w:rPr>
+      </w:pPr>
+      <w:r>
+        <w:rPr>
+          <w:color w:val="auto"/>
+        </w:rPr>
+      </w:r>
+    </w:p>
+    <w:p>
+      <w:pPr>
+        <w:pStyle w:val="Normal"/>
+        <w:jc w:val="both"/>
+        <w:rPr>
+          <w:color w:val="auto"/>
+        </w:rPr>
+      </w:pPr>
+      <w:r>
+        <w:rPr>
+          <w:rFonts w:eastAsia="Times New Roman" w:cs="Times New Roman" w:ascii="Garamond" w:hAnsi="Garamond"/>
+          <w:color w:val="000000"/>
+          <w:kern w:val="0"/>
+          <w:sz w:val="36"/>
+          <w:szCs w:val="36"/>
+          <w:shd w:fill="auto" w:val="clear"/>
+          <w:lang w:val="en-US" w:eastAsia="zh-CN" w:bidi="hi-IN"/>
+        </w:rPr>
+        <w:t xml:space="preserve">O mesmo se dá com a oração: quanto mais amplificada ela estiver, maior o seu alcance. </w:t>
+      </w:r>
+      <w:r>
+        <w:rPr>
+          <w:rFonts w:eastAsia="Times New Roman" w:cs="Times New Roman" w:ascii="Garamond" w:hAnsi="Garamond"/>
+          <w:color w:val="000000"/>
+          <w:kern w:val="0"/>
+          <w:sz w:val="36"/>
+          <w:szCs w:val="36"/>
+          <w:shd w:fill="auto" w:val="clear"/>
+          <w:lang w:val="en-US" w:eastAsia="zh-CN" w:bidi="hi-IN"/>
+        </w:rPr>
+        <w:t xml:space="preserve">De que maneira </w:t>
+      </w:r>
+      <w:r>
+        <w:rPr>
+          <w:rFonts w:eastAsia="Times New Roman" w:cs="Times New Roman" w:ascii="Garamond" w:hAnsi="Garamond"/>
+          <w:color w:val="000000"/>
+          <w:kern w:val="0"/>
+          <w:sz w:val="36"/>
+          <w:szCs w:val="36"/>
+          <w:shd w:fill="auto" w:val="clear"/>
+          <w:lang w:val="en-US" w:eastAsia="zh-CN" w:bidi="hi-IN"/>
+        </w:rPr>
+        <w:t xml:space="preserve">podemos </w:t>
+      </w:r>
+      <w:r>
+        <w:rPr>
+          <w:rFonts w:eastAsia="Times New Roman" w:cs="Times New Roman" w:ascii="Garamond" w:hAnsi="Garamond"/>
+          <w:color w:val="000000"/>
+          <w:kern w:val="0"/>
+          <w:sz w:val="36"/>
+          <w:szCs w:val="36"/>
+          <w:shd w:fill="auto" w:val="clear"/>
+          <w:lang w:val="en-US" w:eastAsia="zh-CN" w:bidi="hi-IN"/>
+        </w:rPr>
+        <w:t>potencializar</w:t>
+      </w:r>
+      <w:r>
+        <w:rPr>
+          <w:rFonts w:eastAsia="Times New Roman" w:cs="Times New Roman" w:ascii="Garamond" w:hAnsi="Garamond"/>
+          <w:color w:val="000000"/>
+          <w:kern w:val="0"/>
+          <w:sz w:val="36"/>
+          <w:szCs w:val="36"/>
+          <w:shd w:fill="auto" w:val="clear"/>
+          <w:lang w:val="en-US" w:eastAsia="zh-CN" w:bidi="hi-IN"/>
+        </w:rPr>
+        <w:t xml:space="preserve"> nossa oração? </w:t>
+      </w:r>
+      <w:r>
+        <w:rPr>
+          <w:rFonts w:eastAsia="Times New Roman" w:cs="Times New Roman" w:ascii="Garamond" w:hAnsi="Garamond"/>
+          <w:color w:val="000000"/>
+          <w:kern w:val="0"/>
+          <w:sz w:val="36"/>
+          <w:szCs w:val="36"/>
+          <w:shd w:fill="auto" w:val="clear"/>
+          <w:lang w:val="en-US" w:eastAsia="zh-CN" w:bidi="hi-IN"/>
+        </w:rPr>
+        <w:t>Fazendo com que ela seja</w:t>
+      </w:r>
+      <w:r>
+        <w:rPr>
+          <w:rFonts w:eastAsia="Times New Roman" w:cs="Times New Roman" w:ascii="Garamond" w:hAnsi="Garamond"/>
+          <w:color w:val="000000"/>
+          <w:kern w:val="0"/>
+          <w:sz w:val="36"/>
+          <w:szCs w:val="36"/>
+          <w:shd w:fill="auto" w:val="clear"/>
+          <w:lang w:val="en-US" w:eastAsia="zh-CN" w:bidi="hi-IN"/>
+        </w:rPr>
+        <w:t xml:space="preserve"> sincera, </w:t>
+      </w:r>
+      <w:r>
+        <w:rPr>
+          <w:rFonts w:eastAsia="Times New Roman" w:cs="Times New Roman" w:ascii="Garamond" w:hAnsi="Garamond"/>
+          <w:color w:val="000000"/>
+          <w:kern w:val="0"/>
+          <w:sz w:val="36"/>
+          <w:szCs w:val="36"/>
+          <w:shd w:fill="auto" w:val="clear"/>
+          <w:lang w:val="en-US" w:eastAsia="zh-CN" w:bidi="hi-IN"/>
+        </w:rPr>
+        <w:t>humilde</w:t>
+      </w:r>
+      <w:r>
+        <w:rPr>
+          <w:rFonts w:eastAsia="Times New Roman" w:cs="Times New Roman" w:ascii="Garamond" w:hAnsi="Garamond"/>
+          <w:color w:val="000000"/>
+          <w:kern w:val="0"/>
+          <w:sz w:val="36"/>
+          <w:szCs w:val="36"/>
+          <w:shd w:fill="auto" w:val="clear"/>
+          <w:lang w:val="en-US" w:eastAsia="zh-CN" w:bidi="hi-IN"/>
+        </w:rPr>
+        <w:t xml:space="preserve">, </w:t>
+      </w:r>
+      <w:r>
+        <w:rPr>
+          <w:rFonts w:eastAsia="Times New Roman" w:cs="Times New Roman" w:ascii="Garamond" w:hAnsi="Garamond"/>
+          <w:color w:val="000000"/>
+          <w:kern w:val="0"/>
+          <w:sz w:val="36"/>
+          <w:szCs w:val="36"/>
+          <w:shd w:fill="auto" w:val="clear"/>
+          <w:lang w:val="en-US" w:eastAsia="zh-CN" w:bidi="hi-IN"/>
+        </w:rPr>
+        <w:t xml:space="preserve">carregada </w:t>
+      </w:r>
+      <w:r>
+        <w:rPr>
+          <w:rFonts w:eastAsia="Times New Roman" w:cs="Times New Roman" w:ascii="Garamond" w:hAnsi="Garamond"/>
+          <w:color w:val="000000"/>
+          <w:kern w:val="0"/>
+          <w:sz w:val="36"/>
+          <w:szCs w:val="36"/>
+          <w:shd w:fill="auto" w:val="clear"/>
+          <w:lang w:val="en-US" w:eastAsia="zh-CN" w:bidi="hi-IN"/>
+        </w:rPr>
+        <w:t xml:space="preserve">de bons pensamentos e sentimentos, </w:t>
+      </w:r>
+      <w:r>
+        <w:rPr>
+          <w:rFonts w:eastAsia="Times New Roman" w:cs="Times New Roman" w:ascii="Garamond" w:hAnsi="Garamond"/>
+          <w:color w:val="000000"/>
+          <w:kern w:val="0"/>
+          <w:sz w:val="36"/>
+          <w:szCs w:val="36"/>
+          <w:shd w:fill="auto" w:val="clear"/>
+          <w:lang w:val="en-US" w:eastAsia="zh-CN" w:bidi="hi-IN"/>
+        </w:rPr>
+        <w:t>com</w:t>
+      </w:r>
+      <w:r>
+        <w:rPr>
+          <w:rFonts w:eastAsia="Times New Roman" w:cs="Times New Roman" w:ascii="Garamond" w:hAnsi="Garamond"/>
+          <w:color w:val="000000"/>
+          <w:kern w:val="0"/>
+          <w:sz w:val="36"/>
+          <w:szCs w:val="36"/>
+          <w:shd w:fill="auto" w:val="clear"/>
+          <w:lang w:val="en-US" w:eastAsia="zh-CN" w:bidi="hi-IN"/>
+        </w:rPr>
+        <w:t xml:space="preserve"> desejo </w:t>
+      </w:r>
+      <w:r>
+        <w:rPr>
+          <w:rFonts w:eastAsia="Times New Roman" w:cs="Times New Roman" w:ascii="Garamond" w:hAnsi="Garamond"/>
+          <w:color w:val="000000"/>
+          <w:kern w:val="0"/>
+          <w:sz w:val="36"/>
+          <w:szCs w:val="36"/>
+          <w:shd w:fill="auto" w:val="clear"/>
+          <w:lang w:val="en-US" w:eastAsia="zh-CN" w:bidi="hi-IN"/>
+        </w:rPr>
+        <w:t xml:space="preserve">verdadeiro </w:t>
+      </w:r>
+      <w:r>
+        <w:rPr>
+          <w:rFonts w:eastAsia="Times New Roman" w:cs="Times New Roman" w:ascii="Garamond" w:hAnsi="Garamond"/>
+          <w:color w:val="000000"/>
+          <w:kern w:val="0"/>
+          <w:sz w:val="36"/>
+          <w:szCs w:val="36"/>
+          <w:shd w:fill="auto" w:val="clear"/>
+          <w:lang w:val="en-US" w:eastAsia="zh-CN" w:bidi="hi-IN"/>
+        </w:rPr>
+        <w:t>de servir, consolar</w:t>
+      </w:r>
+      <w:r>
+        <w:rPr>
+          <w:rFonts w:eastAsia="Times New Roman" w:cs="Times New Roman" w:ascii="Garamond" w:hAnsi="Garamond"/>
+          <w:color w:val="000000"/>
+          <w:kern w:val="0"/>
+          <w:sz w:val="36"/>
+          <w:szCs w:val="36"/>
+          <w:shd w:fill="auto" w:val="clear"/>
+          <w:lang w:val="en-US" w:eastAsia="zh-CN" w:bidi="hi-IN"/>
+        </w:rPr>
+        <w:t xml:space="preserve"> e</w:t>
+      </w:r>
+      <w:r>
+        <w:rPr>
+          <w:rFonts w:eastAsia="Times New Roman" w:cs="Times New Roman" w:ascii="Garamond" w:hAnsi="Garamond"/>
+          <w:color w:val="000000"/>
+          <w:kern w:val="0"/>
+          <w:sz w:val="36"/>
+          <w:szCs w:val="36"/>
+          <w:shd w:fill="auto" w:val="clear"/>
+          <w:lang w:val="en-US" w:eastAsia="zh-CN" w:bidi="hi-IN"/>
+        </w:rPr>
+        <w:t xml:space="preserve"> auxiliar. </w:t>
+      </w:r>
+      <w:r>
+        <w:rPr>
+          <w:rFonts w:eastAsia="Times New Roman" w:cs="Times New Roman" w:ascii="Garamond" w:hAnsi="Garamond"/>
+          <w:color w:val="000000"/>
+          <w:kern w:val="0"/>
+          <w:sz w:val="36"/>
+          <w:szCs w:val="36"/>
+          <w:shd w:fill="auto" w:val="clear"/>
+          <w:lang w:val="en-US" w:eastAsia="zh-CN" w:bidi="hi-IN"/>
+        </w:rPr>
+        <w:t>A oração d</w:t>
+      </w:r>
+      <w:r>
+        <w:rPr>
+          <w:rFonts w:eastAsia="Times New Roman" w:cs="Times New Roman" w:ascii="Garamond" w:hAnsi="Garamond"/>
+          <w:color w:val="000000"/>
+          <w:kern w:val="0"/>
+          <w:sz w:val="36"/>
+          <w:szCs w:val="36"/>
+          <w:shd w:fill="auto" w:val="clear"/>
+          <w:lang w:val="en-US" w:eastAsia="zh-CN" w:bidi="hi-IN"/>
+        </w:rPr>
+        <w:t xml:space="preserve">eve também expressar nossa gratidão a Deus e a Jesus. </w:t>
+      </w:r>
+    </w:p>
+    <w:p>
+      <w:pPr>
+        <w:pStyle w:val="Normal"/>
+        <w:jc w:val="both"/>
+        <w:rPr>
+          <w:color w:val="auto"/>
+        </w:rPr>
+      </w:pPr>
+      <w:r>
+        <w:rPr/>
+      </w:r>
+    </w:p>
+    <w:p>
+      <w:pPr>
+        <w:pStyle w:val="Normal"/>
+        <w:jc w:val="both"/>
+        <w:rPr>
+          <w:color w:val="auto"/>
+        </w:rPr>
+      </w:pPr>
+      <w:r>
+        <w:rPr>
+          <w:rFonts w:eastAsia="Times New Roman" w:cs="Times New Roman" w:ascii="Garamond" w:hAnsi="Garamond"/>
+          <w:color w:val="000000"/>
+          <w:kern w:val="0"/>
+          <w:sz w:val="36"/>
+          <w:szCs w:val="36"/>
+          <w:shd w:fill="auto" w:val="clear"/>
+          <w:lang w:val="en-US" w:eastAsia="zh-CN" w:bidi="hi-IN"/>
+        </w:rPr>
+        <w:t xml:space="preserve">Voltando </w:t>
+      </w:r>
+      <w:r>
+        <w:rPr>
+          <w:rFonts w:eastAsia="Times New Roman" w:cs="Times New Roman" w:ascii="Garamond" w:hAnsi="Garamond"/>
+          <w:color w:val="000000"/>
+          <w:kern w:val="0"/>
+          <w:sz w:val="36"/>
+          <w:szCs w:val="36"/>
+          <w:shd w:fill="auto" w:val="clear"/>
+          <w:lang w:val="en-US" w:eastAsia="zh-CN" w:bidi="hi-IN"/>
+        </w:rPr>
+        <w:t xml:space="preserve">agora </w:t>
+      </w:r>
+      <w:r>
+        <w:rPr>
+          <w:rFonts w:eastAsia="Times New Roman" w:cs="Times New Roman" w:ascii="Garamond" w:hAnsi="Garamond"/>
+          <w:color w:val="000000"/>
+          <w:kern w:val="0"/>
+          <w:sz w:val="36"/>
+          <w:szCs w:val="36"/>
+          <w:shd w:fill="auto" w:val="clear"/>
+          <w:lang w:val="en-US" w:eastAsia="zh-CN" w:bidi="hi-IN"/>
+        </w:rPr>
+        <w:t xml:space="preserve">à passagem evangélica que estamos estudando, Jesus nos diz que Deus sabe do que necessitamos antes mesmo de pedirmos. Os  incrédulos </w:t>
+      </w:r>
+      <w:r>
+        <w:rPr>
+          <w:rFonts w:eastAsia="Times New Roman" w:cs="Times New Roman" w:ascii="Garamond" w:hAnsi="Garamond"/>
+          <w:color w:val="000000"/>
+          <w:kern w:val="0"/>
+          <w:sz w:val="36"/>
+          <w:szCs w:val="36"/>
+          <w:shd w:fill="auto" w:val="clear"/>
+          <w:lang w:val="en-US" w:eastAsia="zh-CN" w:bidi="hi-IN"/>
+        </w:rPr>
+        <w:t xml:space="preserve">se utilizam dessa fala de Jesus para argumentarem </w:t>
+      </w:r>
+      <w:r>
+        <w:rPr>
+          <w:rFonts w:eastAsia="Times New Roman" w:cs="Times New Roman" w:ascii="Garamond" w:hAnsi="Garamond"/>
+          <w:color w:val="000000"/>
+          <w:kern w:val="0"/>
+          <w:sz w:val="36"/>
+          <w:szCs w:val="36"/>
+          <w:shd w:fill="auto" w:val="clear"/>
+          <w:lang w:val="en-US" w:eastAsia="zh-CN" w:bidi="hi-IN"/>
+        </w:rPr>
+        <w:t>que</w:t>
+      </w:r>
+      <w:r>
+        <w:rPr>
+          <w:rFonts w:eastAsia="Times New Roman" w:cs="Times New Roman" w:ascii="Garamond" w:hAnsi="Garamond"/>
+          <w:color w:val="000000"/>
+          <w:kern w:val="0"/>
+          <w:sz w:val="36"/>
+          <w:szCs w:val="36"/>
+          <w:shd w:fill="auto" w:val="clear"/>
+          <w:lang w:val="en-US" w:eastAsia="zh-CN" w:bidi="hi-IN"/>
+        </w:rPr>
+        <w:t>, se é assim, então</w:t>
+      </w:r>
+      <w:r>
+        <w:rPr>
+          <w:rFonts w:eastAsia="Times New Roman" w:cs="Times New Roman" w:ascii="Garamond" w:hAnsi="Garamond"/>
+          <w:color w:val="000000"/>
+          <w:kern w:val="0"/>
+          <w:sz w:val="36"/>
+          <w:szCs w:val="36"/>
+          <w:shd w:fill="auto" w:val="clear"/>
+          <w:lang w:val="en-US" w:eastAsia="zh-CN" w:bidi="hi-IN"/>
+        </w:rPr>
+        <w:t xml:space="preserve"> a oração é desnecessária. Afinal de contas, se Deus já sabe do que necessitamos, não há </w:t>
+      </w:r>
+      <w:r>
+        <w:rPr>
+          <w:rFonts w:eastAsia="Times New Roman" w:cs="Times New Roman" w:ascii="Garamond" w:hAnsi="Garamond"/>
+          <w:color w:val="000000"/>
+          <w:kern w:val="0"/>
+          <w:sz w:val="36"/>
+          <w:szCs w:val="36"/>
+          <w:shd w:fill="auto" w:val="clear"/>
+          <w:lang w:val="en-US" w:eastAsia="zh-CN" w:bidi="hi-IN"/>
+        </w:rPr>
+        <w:t xml:space="preserve">razão em </w:t>
+      </w:r>
+      <w:r>
+        <w:rPr>
+          <w:rFonts w:eastAsia="Times New Roman" w:cs="Times New Roman" w:ascii="Garamond" w:hAnsi="Garamond"/>
+          <w:color w:val="000000"/>
+          <w:kern w:val="0"/>
+          <w:sz w:val="36"/>
+          <w:szCs w:val="36"/>
+          <w:shd w:fill="auto" w:val="clear"/>
+          <w:lang w:val="en-US" w:eastAsia="zh-CN" w:bidi="hi-IN"/>
+        </w:rPr>
+        <w:t xml:space="preserve"> pedir. </w:t>
+      </w:r>
+      <w:r>
+        <w:rPr>
+          <w:rFonts w:eastAsia="Times New Roman" w:cs="Times New Roman" w:ascii="Garamond" w:hAnsi="Garamond"/>
+          <w:color w:val="000000"/>
+          <w:kern w:val="0"/>
+          <w:sz w:val="36"/>
+          <w:szCs w:val="36"/>
+          <w:shd w:fill="auto" w:val="clear"/>
+          <w:lang w:val="en-US" w:eastAsia="zh-CN" w:bidi="hi-IN"/>
+        </w:rPr>
+        <w:t>Obviamente e</w:t>
+      </w:r>
+      <w:r>
+        <w:rPr>
+          <w:rFonts w:eastAsia="Times New Roman" w:cs="Times New Roman" w:ascii="Garamond" w:hAnsi="Garamond"/>
+          <w:color w:val="000000"/>
+          <w:kern w:val="0"/>
+          <w:sz w:val="36"/>
+          <w:szCs w:val="36"/>
+          <w:shd w:fill="auto" w:val="clear"/>
+          <w:lang w:val="en-US" w:eastAsia="zh-CN" w:bidi="hi-IN"/>
+        </w:rPr>
+        <w:t>sse é um pensamento completamente equivocado.</w:t>
+      </w:r>
+    </w:p>
+    <w:p>
+      <w:pPr>
+        <w:pStyle w:val="Normal"/>
+        <w:jc w:val="both"/>
+        <w:rPr>
+          <w:color w:val="auto"/>
+        </w:rPr>
+      </w:pPr>
+      <w:r>
+        <w:rPr>
+          <w:color w:val="auto"/>
+        </w:rPr>
+      </w:r>
+    </w:p>
+    <w:p>
+      <w:pPr>
+        <w:pStyle w:val="Normal"/>
+        <w:jc w:val="both"/>
+        <w:rPr>
+          <w:color w:val="auto"/>
+        </w:rPr>
+      </w:pPr>
+      <w:r>
+        <w:rPr>
+          <w:rFonts w:eastAsia="Times New Roman" w:cs="Times New Roman" w:ascii="Garamond" w:hAnsi="Garamond"/>
+          <w:color w:val="000000"/>
+          <w:kern w:val="0"/>
+          <w:sz w:val="36"/>
+          <w:szCs w:val="36"/>
+          <w:shd w:fill="auto" w:val="clear"/>
+          <w:lang w:val="en-US" w:eastAsia="zh-CN" w:bidi="hi-IN"/>
+        </w:rPr>
+        <w:t>A questão é que a</w:t>
+      </w:r>
+      <w:r>
+        <w:rPr>
+          <w:rFonts w:eastAsia="Times New Roman" w:cs="Times New Roman" w:ascii="Garamond" w:hAnsi="Garamond"/>
+          <w:color w:val="000000"/>
+          <w:kern w:val="0"/>
+          <w:sz w:val="36"/>
+          <w:szCs w:val="36"/>
+          <w:shd w:fill="auto" w:val="clear"/>
+          <w:lang w:val="en-US" w:eastAsia="zh-CN" w:bidi="hi-IN"/>
+        </w:rPr>
+        <w:t xml:space="preserve"> oração não tem como objetivo informar a Deus  aquilo de que precisamos; o objetivo </w:t>
+      </w:r>
+      <w:r>
+        <w:rPr>
+          <w:rFonts w:eastAsia="Times New Roman" w:cs="Times New Roman" w:ascii="Garamond" w:hAnsi="Garamond"/>
+          <w:color w:val="000000"/>
+          <w:kern w:val="0"/>
+          <w:sz w:val="36"/>
+          <w:szCs w:val="36"/>
+          <w:shd w:fill="auto" w:val="clear"/>
+          <w:lang w:val="en-US" w:eastAsia="zh-CN" w:bidi="hi-IN"/>
+        </w:rPr>
+        <w:t>dela</w:t>
+      </w:r>
+      <w:r>
+        <w:rPr>
+          <w:rFonts w:eastAsia="Times New Roman" w:cs="Times New Roman" w:ascii="Garamond" w:hAnsi="Garamond"/>
+          <w:color w:val="000000"/>
+          <w:kern w:val="0"/>
+          <w:sz w:val="36"/>
+          <w:szCs w:val="36"/>
+          <w:shd w:fill="auto" w:val="clear"/>
+          <w:lang w:val="en-US" w:eastAsia="zh-CN" w:bidi="hi-IN"/>
+        </w:rPr>
+        <w:t xml:space="preserve"> é nos transformar. </w:t>
+      </w:r>
+    </w:p>
+    <w:p>
+      <w:pPr>
+        <w:pStyle w:val="Normal"/>
+        <w:jc w:val="both"/>
+        <w:rPr>
+          <w:color w:val="auto"/>
+        </w:rPr>
+      </w:pPr>
+      <w:r>
+        <w:rPr/>
+      </w:r>
+    </w:p>
+    <w:p>
+      <w:pPr>
+        <w:pStyle w:val="Normal"/>
+        <w:jc w:val="both"/>
+        <w:rPr>
+          <w:color w:val="auto"/>
+        </w:rPr>
+      </w:pPr>
+      <w:r>
+        <w:rPr>
+          <w:rFonts w:eastAsia="Times New Roman" w:cs="Times New Roman" w:ascii="Garamond" w:hAnsi="Garamond"/>
+          <w:color w:val="000000"/>
+          <w:kern w:val="0"/>
+          <w:sz w:val="36"/>
+          <w:szCs w:val="36"/>
+          <w:shd w:fill="auto" w:val="clear"/>
+          <w:lang w:val="en-US" w:eastAsia="zh-CN" w:bidi="hi-IN"/>
+        </w:rPr>
+        <w:t xml:space="preserve">A oração não muda Deus. Muda quem ora. Quebra o nosso orgulho, abre o nosso coração e nos prepara para receber </w:t>
+      </w:r>
+      <w:r>
+        <w:rPr>
+          <w:rFonts w:eastAsia="Times New Roman" w:cs="Times New Roman" w:ascii="Garamond" w:hAnsi="Garamond"/>
+          <w:color w:val="000000"/>
+          <w:kern w:val="0"/>
+          <w:sz w:val="36"/>
+          <w:szCs w:val="36"/>
+          <w:shd w:fill="auto" w:val="clear"/>
+          <w:lang w:val="en-US" w:eastAsia="zh-CN" w:bidi="hi-IN"/>
+        </w:rPr>
+        <w:t>aquil</w:t>
+      </w:r>
+      <w:r>
+        <w:rPr>
+          <w:rFonts w:eastAsia="Times New Roman" w:cs="Times New Roman" w:ascii="Garamond" w:hAnsi="Garamond"/>
+          <w:color w:val="000000"/>
+          <w:kern w:val="0"/>
+          <w:sz w:val="36"/>
+          <w:szCs w:val="36"/>
+          <w:shd w:fill="auto" w:val="clear"/>
+          <w:lang w:val="en-US" w:eastAsia="zh-CN" w:bidi="hi-IN"/>
+        </w:rPr>
+        <w:t>o que Deus, em Sua infinita misericórdia, julga que temos mérito para receber.</w:t>
+      </w:r>
+    </w:p>
+    <w:p>
+      <w:pPr>
+        <w:pStyle w:val="Normal"/>
+        <w:jc w:val="both"/>
+        <w:rPr>
+          <w:rFonts w:ascii="Garamond" w:hAnsi="Garamond" w:eastAsia="Times New Roman" w:cs="Times New Roman"/>
+          <w:kern w:val="0"/>
+          <w:sz w:val="36"/>
+          <w:szCs w:val="36"/>
+          <w:shd w:fill="auto" w:val="clear"/>
+          <w:lang w:val="en-US" w:eastAsia="zh-CN" w:bidi="hi-IN"/>
+        </w:rPr>
+      </w:pPr>
+      <w:r>
+        <w:rPr>
+          <w:rFonts w:eastAsia="Times New Roman" w:cs="Times New Roman" w:ascii="Garamond" w:hAnsi="Garamond"/>
+          <w:kern w:val="0"/>
+          <w:sz w:val="36"/>
+          <w:szCs w:val="36"/>
+          <w:shd w:fill="auto" w:val="clear"/>
+          <w:lang w:val="en-US" w:eastAsia="zh-CN" w:bidi="hi-IN"/>
+        </w:rPr>
+      </w:r>
+    </w:p>
+    <w:p>
+      <w:pPr>
+        <w:pStyle w:val="Normal"/>
+        <w:jc w:val="both"/>
+        <w:rPr>
+          <w:color w:val="auto"/>
+        </w:rPr>
+      </w:pPr>
+      <w:r>
+        <w:rPr>
+          <w:rFonts w:eastAsia="Times New Roman" w:cs="Times New Roman" w:ascii="Garamond" w:hAnsi="Garamond"/>
+          <w:color w:val="000000"/>
+          <w:kern w:val="0"/>
+          <w:sz w:val="36"/>
+          <w:szCs w:val="36"/>
+          <w:shd w:fill="auto" w:val="clear"/>
+          <w:lang w:val="en-US" w:eastAsia="zh-CN" w:bidi="hi-IN"/>
+        </w:rPr>
+        <w:t xml:space="preserve">Vamos fazer mais uma comparação: </w:t>
+      </w:r>
+      <w:r>
+        <w:rPr>
+          <w:rFonts w:eastAsia="Times New Roman" w:cs="Times New Roman" w:ascii="Garamond" w:hAnsi="Garamond"/>
+          <w:color w:val="000000"/>
+          <w:kern w:val="0"/>
+          <w:sz w:val="36"/>
+          <w:szCs w:val="36"/>
+          <w:shd w:fill="auto" w:val="clear"/>
+          <w:lang w:val="en-US" w:eastAsia="zh-CN" w:bidi="hi-IN"/>
+        </w:rPr>
+        <w:t>as bençãos que</w:t>
+      </w:r>
+      <w:r>
+        <w:rPr>
+          <w:rFonts w:eastAsia="Times New Roman" w:cs="Times New Roman" w:ascii="Garamond" w:hAnsi="Garamond"/>
+          <w:color w:val="000000"/>
+          <w:kern w:val="0"/>
+          <w:sz w:val="36"/>
+          <w:szCs w:val="36"/>
+          <w:shd w:fill="auto" w:val="clear"/>
+          <w:lang w:val="en-US" w:eastAsia="zh-CN" w:bidi="hi-IN"/>
+        </w:rPr>
+        <w:t xml:space="preserve"> Deus </w:t>
+      </w:r>
+      <w:r>
+        <w:rPr>
+          <w:rFonts w:eastAsia="Times New Roman" w:cs="Times New Roman" w:ascii="Garamond" w:hAnsi="Garamond"/>
+          <w:color w:val="000000"/>
+          <w:kern w:val="0"/>
+          <w:sz w:val="36"/>
+          <w:szCs w:val="36"/>
+          <w:shd w:fill="auto" w:val="clear"/>
+          <w:lang w:val="en-US" w:eastAsia="zh-CN" w:bidi="hi-IN"/>
+        </w:rPr>
+        <w:t>pode nos conceder assemelham-se</w:t>
+      </w:r>
+      <w:r>
+        <w:rPr>
+          <w:rFonts w:eastAsia="Times New Roman" w:cs="Times New Roman" w:ascii="Garamond" w:hAnsi="Garamond"/>
+          <w:color w:val="000000"/>
+          <w:kern w:val="0"/>
+          <w:sz w:val="36"/>
+          <w:szCs w:val="36"/>
+          <w:shd w:fill="auto" w:val="clear"/>
+          <w:lang w:val="en-US" w:eastAsia="zh-CN" w:bidi="hi-IN"/>
+        </w:rPr>
+        <w:t xml:space="preserve"> a uma fonte de água. Quem vai até a fonte com um copo recolhe um copo; quem leva uma jarra recolhe uma jarra; quem leva um barril recolhe um barril. A fonte </w:t>
+      </w:r>
+      <w:r>
+        <w:rPr>
+          <w:rFonts w:eastAsia="Times New Roman" w:cs="Times New Roman" w:ascii="Garamond" w:hAnsi="Garamond"/>
+          <w:color w:val="000000"/>
+          <w:kern w:val="0"/>
+          <w:sz w:val="36"/>
+          <w:szCs w:val="36"/>
+          <w:shd w:fill="auto" w:val="clear"/>
+          <w:lang w:val="en-US" w:eastAsia="zh-CN" w:bidi="hi-IN"/>
+        </w:rPr>
+        <w:t>nunca</w:t>
+      </w:r>
+      <w:r>
+        <w:rPr>
+          <w:rFonts w:eastAsia="Times New Roman" w:cs="Times New Roman" w:ascii="Garamond" w:hAnsi="Garamond"/>
+          <w:color w:val="000000"/>
+          <w:kern w:val="0"/>
+          <w:sz w:val="36"/>
+          <w:szCs w:val="36"/>
+          <w:shd w:fill="auto" w:val="clear"/>
+          <w:lang w:val="en-US" w:eastAsia="zh-CN" w:bidi="hi-IN"/>
+        </w:rPr>
+        <w:t xml:space="preserve"> muda — </w:t>
+      </w:r>
+      <w:r>
+        <w:rPr>
+          <w:rFonts w:eastAsia="Times New Roman" w:cs="Times New Roman" w:ascii="Garamond" w:hAnsi="Garamond"/>
+          <w:color w:val="000000"/>
+          <w:kern w:val="0"/>
+          <w:sz w:val="36"/>
+          <w:szCs w:val="36"/>
+          <w:shd w:fill="auto" w:val="clear"/>
+          <w:lang w:val="en-US" w:eastAsia="zh-CN" w:bidi="hi-IN"/>
+        </w:rPr>
+        <w:t xml:space="preserve">ela </w:t>
+      </w:r>
+      <w:r>
+        <w:rPr>
+          <w:rFonts w:eastAsia="Times New Roman" w:cs="Times New Roman" w:ascii="Garamond" w:hAnsi="Garamond"/>
+          <w:color w:val="000000"/>
+          <w:kern w:val="0"/>
+          <w:sz w:val="36"/>
+          <w:szCs w:val="36"/>
+          <w:shd w:fill="auto" w:val="clear"/>
+          <w:lang w:val="en-US" w:eastAsia="zh-CN" w:bidi="hi-IN"/>
+        </w:rPr>
+        <w:t>é</w:t>
+      </w:r>
+      <w:r>
+        <w:rPr>
+          <w:rFonts w:eastAsia="Times New Roman" w:cs="Times New Roman" w:ascii="Garamond" w:hAnsi="Garamond"/>
+          <w:color w:val="000000"/>
+          <w:kern w:val="0"/>
+          <w:sz w:val="36"/>
+          <w:szCs w:val="36"/>
+          <w:shd w:fill="auto" w:val="clear"/>
+          <w:lang w:val="en-US" w:eastAsia="zh-CN" w:bidi="hi-IN"/>
+        </w:rPr>
+        <w:t xml:space="preserve"> sempre</w:t>
+      </w:r>
+      <w:r>
+        <w:rPr>
+          <w:rFonts w:eastAsia="Times New Roman" w:cs="Times New Roman" w:ascii="Garamond" w:hAnsi="Garamond"/>
+          <w:color w:val="000000"/>
+          <w:kern w:val="0"/>
+          <w:sz w:val="36"/>
+          <w:szCs w:val="36"/>
+          <w:shd w:fill="auto" w:val="clear"/>
+          <w:lang w:val="en-US" w:eastAsia="zh-CN" w:bidi="hi-IN"/>
+        </w:rPr>
+        <w:t xml:space="preserve"> a mesma. O que muda é a capacidade que cada um tem de recolher água.</w:t>
+      </w:r>
+    </w:p>
+    <w:p>
+      <w:pPr>
+        <w:pStyle w:val="Normal"/>
+        <w:jc w:val="both"/>
+        <w:rPr>
+          <w:color w:val="auto"/>
+        </w:rPr>
+      </w:pPr>
+      <w:r>
+        <w:rPr/>
+      </w:r>
+    </w:p>
+    <w:p>
+      <w:pPr>
+        <w:pStyle w:val="Normal"/>
+        <w:jc w:val="both"/>
+        <w:rPr>
+          <w:color w:val="auto"/>
+        </w:rPr>
+      </w:pPr>
+      <w:r>
+        <w:rPr>
+          <w:rFonts w:eastAsia="Times New Roman" w:cs="Times New Roman" w:ascii="Garamond" w:hAnsi="Garamond"/>
+          <w:color w:val="000000"/>
+          <w:kern w:val="0"/>
+          <w:sz w:val="36"/>
+          <w:szCs w:val="36"/>
+          <w:shd w:fill="auto" w:val="clear"/>
+          <w:lang w:val="en-US" w:eastAsia="zh-CN" w:bidi="hi-IN"/>
+        </w:rPr>
+        <w:t>Portanto, ainda que Deus já saiba do que precisamos, nós devemos sim, orar e pedir, conscientes de que receberemos aquilo que estiver na exata proporção do nosso merecimento.</w:t>
+      </w:r>
+    </w:p>
+    <w:p>
+      <w:pPr>
+        <w:pStyle w:val="Normal"/>
+        <w:jc w:val="both"/>
+        <w:rPr>
+          <w:color w:val="auto"/>
+        </w:rPr>
+      </w:pPr>
+      <w:r>
+        <w:rPr>
+          <w:rFonts w:eastAsia="Times New Roman" w:cs="Times New Roman" w:ascii="Garamond" w:hAnsi="Garamond"/>
+          <w:color w:val="000000"/>
+          <w:kern w:val="0"/>
+          <w:sz w:val="36"/>
+          <w:szCs w:val="36"/>
+          <w:shd w:fill="auto" w:val="clear"/>
+          <w:lang w:val="en-US" w:eastAsia="zh-CN" w:bidi="hi-IN"/>
+        </w:rPr>
+        <w:t xml:space="preserve">Isso nos leva a uma outra questão muito importante dentro do tema Pedi e obtereis. Precisamos ter em mente que </w:t>
+      </w:r>
+      <w:r>
+        <w:rPr>
+          <w:rFonts w:eastAsia="Times New Roman" w:cs="Times New Roman" w:ascii="Garamond" w:hAnsi="Garamond"/>
+          <w:color w:val="000000"/>
+          <w:kern w:val="0"/>
+          <w:sz w:val="36"/>
+          <w:szCs w:val="36"/>
+          <w:shd w:fill="auto" w:val="clear"/>
+          <w:lang w:val="en-US" w:eastAsia="zh-CN" w:bidi="hi-IN"/>
+        </w:rPr>
+        <w:t xml:space="preserve">tudo está sempre subordinado à vontade de Deus. </w:t>
+      </w:r>
+      <w:r>
+        <w:rPr>
+          <w:rFonts w:eastAsia="Times New Roman" w:cs="Times New Roman" w:ascii="Garamond" w:hAnsi="Garamond"/>
+          <w:color w:val="000000"/>
+          <w:kern w:val="0"/>
+          <w:sz w:val="36"/>
+          <w:szCs w:val="36"/>
+          <w:shd w:fill="auto" w:val="clear"/>
+          <w:lang w:val="en-US" w:eastAsia="zh-CN" w:bidi="hi-IN"/>
+        </w:rPr>
+        <w:t>Em última instância, é</w:t>
+      </w:r>
+      <w:r>
+        <w:rPr>
+          <w:rFonts w:eastAsia="Times New Roman" w:cs="Times New Roman" w:ascii="Garamond" w:hAnsi="Garamond"/>
+          <w:color w:val="000000"/>
+          <w:kern w:val="0"/>
+          <w:sz w:val="36"/>
+          <w:szCs w:val="36"/>
+          <w:shd w:fill="auto" w:val="clear"/>
+          <w:lang w:val="en-US" w:eastAsia="zh-CN" w:bidi="hi-IN"/>
+        </w:rPr>
+        <w:t xml:space="preserve"> Ele que</w:t>
+      </w:r>
+      <w:r>
+        <w:rPr>
+          <w:rFonts w:eastAsia="Times New Roman" w:cs="Times New Roman" w:ascii="Garamond" w:hAnsi="Garamond"/>
+          <w:color w:val="000000"/>
+          <w:kern w:val="0"/>
+          <w:sz w:val="36"/>
+          <w:szCs w:val="36"/>
+          <w:shd w:fill="auto" w:val="clear"/>
+          <w:lang w:val="en-US" w:eastAsia="zh-CN" w:bidi="hi-IN"/>
+        </w:rPr>
+        <w:t xml:space="preserve"> </w:t>
+      </w:r>
+      <w:r>
+        <w:rPr>
+          <w:rFonts w:eastAsia="Times New Roman" w:cs="Times New Roman" w:ascii="Garamond" w:hAnsi="Garamond"/>
+          <w:color w:val="000000"/>
+          <w:kern w:val="0"/>
+          <w:sz w:val="36"/>
+          <w:szCs w:val="36"/>
+          <w:shd w:fill="auto" w:val="clear"/>
+          <w:lang w:val="en-US" w:eastAsia="zh-CN" w:bidi="hi-IN"/>
+        </w:rPr>
+        <w:t xml:space="preserve">decide se </w:t>
+      </w:r>
+      <w:r>
+        <w:rPr>
+          <w:rFonts w:eastAsia="Times New Roman" w:cs="Times New Roman" w:ascii="Garamond" w:hAnsi="Garamond"/>
+          <w:color w:val="000000"/>
+          <w:kern w:val="0"/>
+          <w:sz w:val="36"/>
+          <w:szCs w:val="36"/>
+          <w:shd w:fill="auto" w:val="clear"/>
+          <w:lang w:val="en-US" w:eastAsia="zh-CN" w:bidi="hi-IN"/>
+        </w:rPr>
+        <w:t>nossa</w:t>
+      </w:r>
+      <w:r>
+        <w:rPr>
+          <w:rFonts w:eastAsia="Times New Roman" w:cs="Times New Roman" w:ascii="Garamond" w:hAnsi="Garamond"/>
+          <w:color w:val="000000"/>
+          <w:kern w:val="0"/>
+          <w:sz w:val="36"/>
+          <w:szCs w:val="36"/>
+          <w:shd w:fill="auto" w:val="clear"/>
+          <w:lang w:val="en-US" w:eastAsia="zh-CN" w:bidi="hi-IN"/>
+        </w:rPr>
+        <w:t xml:space="preserve"> </w:t>
+      </w:r>
+      <w:r>
+        <w:rPr>
+          <w:rFonts w:eastAsia="Times New Roman" w:cs="Times New Roman" w:ascii="Garamond" w:hAnsi="Garamond"/>
+          <w:color w:val="000000"/>
+          <w:kern w:val="0"/>
+          <w:sz w:val="36"/>
+          <w:szCs w:val="36"/>
+          <w:shd w:fill="auto" w:val="clear"/>
+          <w:lang w:val="en-US" w:eastAsia="zh-CN" w:bidi="hi-IN"/>
+        </w:rPr>
+        <w:t>oração</w:t>
+      </w:r>
+      <w:r>
+        <w:rPr>
+          <w:rFonts w:eastAsia="Times New Roman" w:cs="Times New Roman" w:ascii="Garamond" w:hAnsi="Garamond"/>
+          <w:color w:val="000000"/>
+          <w:kern w:val="0"/>
+          <w:sz w:val="36"/>
+          <w:szCs w:val="36"/>
+          <w:shd w:fill="auto" w:val="clear"/>
+          <w:lang w:val="en-US" w:eastAsia="zh-CN" w:bidi="hi-IN"/>
+        </w:rPr>
+        <w:t xml:space="preserve"> poderá ou não </w:t>
+      </w:r>
+      <w:r>
+        <w:rPr>
+          <w:rFonts w:eastAsia="Times New Roman" w:cs="Times New Roman" w:ascii="Garamond" w:hAnsi="Garamond"/>
+          <w:color w:val="000000"/>
+          <w:kern w:val="0"/>
+          <w:sz w:val="36"/>
+          <w:szCs w:val="36"/>
+          <w:shd w:fill="auto" w:val="clear"/>
+          <w:lang w:val="en-US" w:eastAsia="zh-CN" w:bidi="hi-IN"/>
+        </w:rPr>
+        <w:t>ser atendida</w:t>
+      </w:r>
+      <w:r>
+        <w:rPr>
+          <w:rFonts w:eastAsia="Times New Roman" w:cs="Times New Roman" w:ascii="Garamond" w:hAnsi="Garamond"/>
+          <w:color w:val="000000"/>
+          <w:kern w:val="0"/>
+          <w:sz w:val="36"/>
+          <w:szCs w:val="36"/>
+          <w:shd w:fill="auto" w:val="clear"/>
+          <w:lang w:val="en-US" w:eastAsia="zh-CN" w:bidi="hi-IN"/>
+        </w:rPr>
+        <w:t>.</w:t>
+      </w:r>
+    </w:p>
+    <w:p>
+      <w:pPr>
+        <w:pStyle w:val="Normal"/>
+        <w:jc w:val="both"/>
+        <w:rPr>
+          <w:color w:val="auto"/>
+        </w:rPr>
+      </w:pPr>
+      <w:r>
+        <w:rPr/>
+      </w:r>
+    </w:p>
+    <w:p>
+      <w:pPr>
+        <w:pStyle w:val="Normal"/>
+        <w:jc w:val="both"/>
+        <w:rPr>
+          <w:color w:val="auto"/>
+        </w:rPr>
+      </w:pPr>
+      <w:r>
+        <w:rPr>
+          <w:rFonts w:eastAsia="Times New Roman" w:cs="Times New Roman" w:ascii="Garamond" w:hAnsi="Garamond"/>
+          <w:color w:val="000000"/>
+          <w:kern w:val="0"/>
+          <w:sz w:val="36"/>
+          <w:szCs w:val="36"/>
+          <w:shd w:fill="auto" w:val="clear"/>
+          <w:lang w:val="en-US" w:eastAsia="zh-CN" w:bidi="hi-IN"/>
+        </w:rPr>
+        <w:t>Quantas e quantas vezes nós oramos com humildade, com fé, pedimos algo útil, justo e bom, seja por nós mesmos, seja por alguém e mesmo assim Deus não nos atende da maneira como pedimos? Isso nos causa estranheza e, às vezes, abala a nossa fé.</w:t>
+      </w:r>
+    </w:p>
+    <w:p>
+      <w:pPr>
+        <w:pStyle w:val="Normal"/>
+        <w:jc w:val="both"/>
+        <w:rPr>
+          <w:color w:val="auto"/>
+        </w:rPr>
+      </w:pPr>
+      <w:r>
+        <w:rPr/>
+      </w:r>
+    </w:p>
+    <w:p>
+      <w:pPr>
+        <w:pStyle w:val="Normal"/>
+        <w:jc w:val="both"/>
+        <w:rPr>
+          <w:color w:val="auto"/>
+        </w:rPr>
+      </w:pPr>
+      <w:r>
+        <w:rPr>
+          <w:rFonts w:eastAsia="Times New Roman" w:cs="Times New Roman" w:ascii="Garamond" w:hAnsi="Garamond"/>
+          <w:color w:val="000000"/>
+          <w:kern w:val="0"/>
+          <w:sz w:val="36"/>
+          <w:szCs w:val="36"/>
+          <w:shd w:fill="auto" w:val="clear"/>
+          <w:lang w:val="en-US" w:eastAsia="zh-CN" w:bidi="hi-IN"/>
+        </w:rPr>
+        <w:t>Precisamos ter discernimento para compreender essa questão.</w:t>
+      </w:r>
+    </w:p>
+    <w:p>
+      <w:pPr>
+        <w:pStyle w:val="Normal"/>
+        <w:jc w:val="both"/>
+        <w:rPr>
+          <w:color w:val="auto"/>
+        </w:rPr>
+      </w:pPr>
+      <w:r>
+        <w:rPr/>
+      </w:r>
+    </w:p>
+    <w:p>
+      <w:pPr>
+        <w:pStyle w:val="Normal"/>
+        <w:jc w:val="both"/>
+        <w:rPr>
+          <w:color w:val="auto"/>
+        </w:rPr>
+      </w:pPr>
+      <w:r>
+        <w:rPr>
+          <w:rFonts w:eastAsia="Times New Roman" w:cs="Times New Roman" w:ascii="Garamond" w:hAnsi="Garamond"/>
+          <w:color w:val="000000"/>
+          <w:kern w:val="0"/>
+          <w:sz w:val="36"/>
+          <w:szCs w:val="36"/>
+          <w:shd w:fill="auto" w:val="clear"/>
+          <w:lang w:val="en-US" w:eastAsia="zh-CN" w:bidi="hi-IN"/>
+        </w:rPr>
+        <w:t>O problema é que a visão que temos das pessoas, das situações e dos acontecimentos é muito limitada. Então, aquilo que julgamos ser bom,  aos olhos de Deus - que tudo sabe - pode não ser. Por isso Ele não nos atende da maneira como pedimos, mas não deixará nossas orações sem resposta. O socorro, o auxílio virão, só que de uma maneira diferente daquela que imaginamos.</w:t>
       </w:r>
     </w:p>
     <w:p>
@@ -2632,853 +3696,20 @@
           <w:shd w:fill="auto" w:val="clear"/>
           <w:lang w:val="en-US" w:eastAsia="zh-CN" w:bidi="hi-IN"/>
         </w:rPr>
-        <w:t>[ Revisado até aqui em 08/03/2026 ]</w:t>
-      </w:r>
-    </w:p>
-    <w:p>
-      <w:pPr>
-        <w:pStyle w:val="Normal"/>
-        <w:jc w:val="both"/>
-        <w:rPr>
-          <w:color w:val="auto"/>
-        </w:rPr>
-      </w:pPr>
-      <w:r>
-        <w:rPr>
-          <w:color w:val="auto"/>
-        </w:rPr>
-      </w:r>
-    </w:p>
-    <w:p>
-      <w:pPr>
-        <w:pStyle w:val="Normal"/>
-        <w:jc w:val="both"/>
-        <w:rPr>
-          <w:color w:val="auto"/>
-        </w:rPr>
-      </w:pPr>
-      <w:r>
-        <w:rPr>
-          <w:rFonts w:eastAsia="Times New Roman" w:cs="Times New Roman" w:ascii="Garamond" w:hAnsi="Garamond"/>
-          <w:color w:val="000000"/>
-          <w:kern w:val="0"/>
-          <w:sz w:val="36"/>
-          <w:szCs w:val="36"/>
-          <w:shd w:fill="auto" w:val="clear"/>
-          <w:lang w:val="en-US" w:eastAsia="zh-CN" w:bidi="hi-IN"/>
-        </w:rPr>
-        <w:t>Podemos fazer uma comparação para compreender essa dinâmica. As pessoas que estão mais ao fundo do auditório só conseguem ouvir o que estou dizendo porque o som da minha voz foi captado pelo microfone, passou por um amplificador e foi enviado para as caixas de som que estão nas laterais do salão.</w:t>
-      </w:r>
-    </w:p>
-    <w:p>
-      <w:pPr>
-        <w:pStyle w:val="Normal"/>
-        <w:jc w:val="both"/>
-        <w:rPr>
-          <w:color w:val="auto"/>
-        </w:rPr>
-      </w:pPr>
-      <w:r>
-        <w:rPr>
-          <w:color w:val="auto"/>
-        </w:rPr>
-      </w:r>
-    </w:p>
-    <w:p>
-      <w:pPr>
-        <w:pStyle w:val="Normal"/>
-        <w:jc w:val="both"/>
-        <w:rPr>
-          <w:color w:val="auto"/>
-        </w:rPr>
-      </w:pPr>
-      <w:r>
-        <w:rPr>
-          <w:rFonts w:eastAsia="Times New Roman" w:cs="Times New Roman" w:ascii="Garamond" w:hAnsi="Garamond"/>
-          <w:color w:val="000000"/>
-          <w:kern w:val="0"/>
-          <w:sz w:val="36"/>
-          <w:szCs w:val="36"/>
-          <w:shd w:fill="auto" w:val="clear"/>
-          <w:lang w:val="en-US" w:eastAsia="zh-CN" w:bidi="hi-IN"/>
-        </w:rPr>
-        <w:t>Sem esse processo de amplificação, quem está mais distante de mim não conseguiria me ouvir, a menos que eu falasse muito alto.</w:t>
-      </w:r>
-    </w:p>
-    <w:p>
-      <w:pPr>
-        <w:pStyle w:val="Normal"/>
-        <w:jc w:val="both"/>
-        <w:rPr>
-          <w:color w:val="auto"/>
-        </w:rPr>
-      </w:pPr>
-      <w:r>
-        <w:rPr>
-          <w:color w:val="auto"/>
-        </w:rPr>
-      </w:r>
-    </w:p>
-    <w:p>
-      <w:pPr>
-        <w:pStyle w:val="Normal"/>
-        <w:jc w:val="both"/>
-        <w:rPr>
-          <w:color w:val="auto"/>
-        </w:rPr>
-      </w:pPr>
-      <w:r>
-        <w:rPr>
-          <w:rFonts w:eastAsia="Times New Roman" w:cs="Times New Roman" w:ascii="Garamond" w:hAnsi="Garamond"/>
-          <w:color w:val="000000"/>
-          <w:kern w:val="0"/>
-          <w:sz w:val="36"/>
-          <w:szCs w:val="36"/>
-          <w:shd w:fill="auto" w:val="clear"/>
-          <w:lang w:val="en-US" w:eastAsia="zh-CN" w:bidi="hi-IN"/>
-        </w:rPr>
-        <w:t>O mesmo se dá com a oração</w:t>
-      </w:r>
-      <w:r>
-        <w:rPr>
-          <w:rFonts w:eastAsia="Times New Roman" w:cs="Times New Roman" w:ascii="Garamond" w:hAnsi="Garamond"/>
-          <w:color w:val="000000"/>
-          <w:kern w:val="0"/>
-          <w:sz w:val="36"/>
-          <w:szCs w:val="36"/>
-          <w:shd w:fill="auto" w:val="clear"/>
-          <w:lang w:val="en-US" w:eastAsia="zh-CN" w:bidi="hi-IN"/>
-        </w:rPr>
-        <w:t>:</w:t>
-      </w:r>
-      <w:r>
-        <w:rPr>
-          <w:rFonts w:eastAsia="Times New Roman" w:cs="Times New Roman" w:ascii="Garamond" w:hAnsi="Garamond"/>
-          <w:color w:val="000000"/>
-          <w:kern w:val="0"/>
-          <w:sz w:val="36"/>
-          <w:szCs w:val="36"/>
-          <w:shd w:fill="auto" w:val="clear"/>
-          <w:lang w:val="en-US" w:eastAsia="zh-CN" w:bidi="hi-IN"/>
-        </w:rPr>
-        <w:t xml:space="preserve"> </w:t>
-      </w:r>
-      <w:r>
-        <w:rPr>
-          <w:rFonts w:eastAsia="Times New Roman" w:cs="Times New Roman" w:ascii="Garamond" w:hAnsi="Garamond"/>
-          <w:color w:val="000000"/>
-          <w:kern w:val="0"/>
-          <w:sz w:val="36"/>
-          <w:szCs w:val="36"/>
-          <w:shd w:fill="auto" w:val="clear"/>
-          <w:lang w:val="en-US" w:eastAsia="zh-CN" w:bidi="hi-IN"/>
-        </w:rPr>
-        <w:t>q</w:t>
-      </w:r>
-      <w:r>
-        <w:rPr>
-          <w:rFonts w:eastAsia="Times New Roman" w:cs="Times New Roman" w:ascii="Garamond" w:hAnsi="Garamond"/>
-          <w:color w:val="000000"/>
-          <w:kern w:val="0"/>
-          <w:sz w:val="36"/>
-          <w:szCs w:val="36"/>
-          <w:shd w:fill="auto" w:val="clear"/>
-          <w:lang w:val="en-US" w:eastAsia="zh-CN" w:bidi="hi-IN"/>
-        </w:rPr>
-        <w:t xml:space="preserve">uanto mais amplificada ela estiver, maior o seu alcance. E </w:t>
-      </w:r>
-      <w:r>
-        <w:rPr>
-          <w:rFonts w:eastAsia="Times New Roman" w:cs="Times New Roman" w:ascii="Garamond" w:hAnsi="Garamond"/>
-          <w:color w:val="000000"/>
-          <w:kern w:val="0"/>
-          <w:sz w:val="36"/>
-          <w:szCs w:val="36"/>
-          <w:shd w:fill="auto" w:val="clear"/>
-          <w:lang w:val="en-US" w:eastAsia="zh-CN" w:bidi="hi-IN"/>
-        </w:rPr>
-        <w:t>como podemos amplificar nossa oração? Ela deve ser</w:t>
-      </w:r>
-      <w:r>
-        <w:rPr>
-          <w:rFonts w:eastAsia="Times New Roman" w:cs="Times New Roman" w:ascii="Garamond" w:hAnsi="Garamond"/>
-          <w:color w:val="000000"/>
-          <w:kern w:val="0"/>
-          <w:sz w:val="36"/>
-          <w:szCs w:val="36"/>
-          <w:shd w:fill="auto" w:val="clear"/>
-          <w:lang w:val="en-US" w:eastAsia="zh-CN" w:bidi="hi-IN"/>
-        </w:rPr>
-        <w:t xml:space="preserve"> sincera,</w:t>
-      </w:r>
-      <w:r>
-        <w:rPr>
-          <w:rFonts w:eastAsia="Times New Roman" w:cs="Times New Roman" w:ascii="Garamond" w:hAnsi="Garamond"/>
-          <w:color w:val="000000"/>
-          <w:kern w:val="0"/>
-          <w:sz w:val="36"/>
-          <w:szCs w:val="36"/>
-          <w:shd w:fill="auto" w:val="clear"/>
-          <w:lang w:val="en-US" w:eastAsia="zh-CN" w:bidi="hi-IN"/>
-        </w:rPr>
-        <w:t xml:space="preserve"> carregada </w:t>
-      </w:r>
-      <w:r>
-        <w:rPr>
-          <w:rFonts w:eastAsia="Times New Roman" w:cs="Times New Roman" w:ascii="Garamond" w:hAnsi="Garamond"/>
-          <w:color w:val="000000"/>
-          <w:kern w:val="0"/>
-          <w:sz w:val="36"/>
-          <w:szCs w:val="36"/>
-          <w:shd w:fill="auto" w:val="clear"/>
-          <w:lang w:val="en-US" w:eastAsia="zh-CN" w:bidi="hi-IN"/>
-        </w:rPr>
-        <w:t xml:space="preserve">de humildade, </w:t>
-      </w:r>
-      <w:r>
-        <w:rPr>
-          <w:rFonts w:eastAsia="Times New Roman" w:cs="Times New Roman" w:ascii="Garamond" w:hAnsi="Garamond"/>
-          <w:color w:val="000000"/>
-          <w:kern w:val="0"/>
-          <w:sz w:val="36"/>
-          <w:szCs w:val="36"/>
-          <w:shd w:fill="auto" w:val="clear"/>
-          <w:lang w:val="en-US" w:eastAsia="zh-CN" w:bidi="hi-IN"/>
-        </w:rPr>
-        <w:t xml:space="preserve">de </w:t>
-      </w:r>
-      <w:r>
-        <w:rPr>
-          <w:rFonts w:eastAsia="Times New Roman" w:cs="Times New Roman" w:ascii="Garamond" w:hAnsi="Garamond"/>
-          <w:color w:val="000000"/>
-          <w:kern w:val="0"/>
-          <w:sz w:val="36"/>
-          <w:szCs w:val="36"/>
-          <w:shd w:fill="auto" w:val="clear"/>
-          <w:lang w:val="en-US" w:eastAsia="zh-CN" w:bidi="hi-IN"/>
-        </w:rPr>
-        <w:t>bons pensamentos</w:t>
-      </w:r>
-      <w:r>
-        <w:rPr>
-          <w:rFonts w:eastAsia="Times New Roman" w:cs="Times New Roman" w:ascii="Garamond" w:hAnsi="Garamond"/>
-          <w:color w:val="000000"/>
-          <w:kern w:val="0"/>
-          <w:sz w:val="36"/>
-          <w:szCs w:val="36"/>
-          <w:shd w:fill="auto" w:val="clear"/>
-          <w:lang w:val="en-US" w:eastAsia="zh-CN" w:bidi="hi-IN"/>
-        </w:rPr>
-        <w:t xml:space="preserve"> e sentimentos, de um desejo de servir, de consolar, de auxiliar. </w:t>
-      </w:r>
-      <w:r>
-        <w:rPr>
-          <w:rFonts w:eastAsia="Times New Roman" w:cs="Times New Roman" w:ascii="Garamond" w:hAnsi="Garamond"/>
-          <w:color w:val="000000"/>
-          <w:kern w:val="0"/>
-          <w:sz w:val="36"/>
-          <w:szCs w:val="36"/>
-          <w:shd w:fill="auto" w:val="clear"/>
-          <w:lang w:val="en-US" w:eastAsia="zh-CN" w:bidi="hi-IN"/>
-        </w:rPr>
-        <w:t>Deve também expressar nossa gratidão a Deus e a Jesus.</w:t>
-      </w:r>
-      <w:r>
-        <w:rPr>
-          <w:rFonts w:eastAsia="Times New Roman" w:cs="Times New Roman" w:ascii="Garamond" w:hAnsi="Garamond"/>
-          <w:color w:val="000000"/>
-          <w:kern w:val="0"/>
-          <w:sz w:val="36"/>
-          <w:szCs w:val="36"/>
-          <w:shd w:fill="auto" w:val="clear"/>
-          <w:lang w:val="en-US" w:eastAsia="zh-CN" w:bidi="hi-IN"/>
-        </w:rPr>
-        <w:t xml:space="preserve"> </w:t>
-      </w:r>
-    </w:p>
-    <w:p>
-      <w:pPr>
-        <w:pStyle w:val="Normal"/>
-        <w:jc w:val="both"/>
-        <w:rPr>
-          <w:color w:val="auto"/>
-        </w:rPr>
-      </w:pPr>
-      <w:r>
-        <w:rPr/>
-      </w:r>
-    </w:p>
-    <w:p>
-      <w:pPr>
-        <w:pStyle w:val="Normal"/>
-        <w:jc w:val="both"/>
-        <w:rPr>
-          <w:color w:val="auto"/>
-        </w:rPr>
-      </w:pPr>
-      <w:r>
-        <w:rPr>
-          <w:rFonts w:eastAsia="Times New Roman" w:cs="Times New Roman" w:ascii="Garamond" w:hAnsi="Garamond"/>
-          <w:color w:val="000000"/>
-          <w:kern w:val="0"/>
-          <w:sz w:val="36"/>
-          <w:szCs w:val="36"/>
-          <w:shd w:fill="auto" w:val="clear"/>
-          <w:lang w:val="en-US" w:eastAsia="zh-CN" w:bidi="hi-IN"/>
-        </w:rPr>
-        <w:t xml:space="preserve">Entretanto, é muito importante compreender que, ainda que nossa oração tenha todas as características que mencionamos, </w:t>
-      </w:r>
-      <w:r>
-        <w:rPr>
-          <w:rFonts w:eastAsia="Times New Roman" w:cs="Times New Roman" w:ascii="Garamond" w:hAnsi="Garamond"/>
-          <w:color w:val="000000"/>
-          <w:kern w:val="0"/>
-          <w:sz w:val="36"/>
-          <w:szCs w:val="36"/>
-          <w:shd w:fill="auto" w:val="clear"/>
-          <w:lang w:val="en-US" w:eastAsia="zh-CN" w:bidi="hi-IN"/>
-        </w:rPr>
-        <w:t>tudo está sempre subordinado à vontade de Deus</w:t>
-      </w:r>
-      <w:r>
-        <w:rPr>
-          <w:rFonts w:eastAsia="Times New Roman" w:cs="Times New Roman" w:ascii="Garamond" w:hAnsi="Garamond"/>
-          <w:color w:val="000000"/>
-          <w:kern w:val="0"/>
-          <w:sz w:val="36"/>
-          <w:szCs w:val="36"/>
-          <w:shd w:fill="auto" w:val="clear"/>
-          <w:lang w:val="en-US" w:eastAsia="zh-CN" w:bidi="hi-IN"/>
-        </w:rPr>
-        <w:t xml:space="preserve">. É Ele </w:t>
-      </w:r>
-      <w:r>
-        <w:rPr>
-          <w:rFonts w:eastAsia="Times New Roman" w:cs="Times New Roman" w:ascii="Garamond" w:hAnsi="Garamond"/>
-          <w:color w:val="000000"/>
-          <w:kern w:val="0"/>
-          <w:sz w:val="36"/>
-          <w:szCs w:val="36"/>
-          <w:shd w:fill="auto" w:val="clear"/>
-          <w:lang w:val="en-US" w:eastAsia="zh-CN" w:bidi="hi-IN"/>
-        </w:rPr>
-        <w:t>que, em última instância, decide se aquela prece poderá ou não produzir os resultados desejados.</w:t>
-      </w:r>
-    </w:p>
-    <w:p>
-      <w:pPr>
-        <w:pStyle w:val="Normal"/>
-        <w:jc w:val="both"/>
-        <w:rPr>
-          <w:color w:val="auto"/>
-        </w:rPr>
-      </w:pPr>
-      <w:r>
-        <w:rPr>
-          <w:color w:val="auto"/>
-        </w:rPr>
-      </w:r>
-    </w:p>
-    <w:p>
-      <w:pPr>
-        <w:pStyle w:val="Normal"/>
-        <w:jc w:val="both"/>
-        <w:rPr>
-          <w:color w:val="auto"/>
-        </w:rPr>
-      </w:pPr>
-      <w:r>
-        <w:rPr>
-          <w:rFonts w:eastAsia="Times New Roman" w:cs="Times New Roman" w:ascii="Garamond" w:hAnsi="Garamond"/>
-          <w:color w:val="000000"/>
-          <w:kern w:val="0"/>
-          <w:sz w:val="36"/>
-          <w:szCs w:val="36"/>
-          <w:shd w:fill="auto" w:val="clear"/>
-          <w:lang w:val="en-US" w:eastAsia="zh-CN" w:bidi="hi-IN"/>
-        </w:rPr>
-        <w:t>Voltando à</w:t>
-      </w:r>
-      <w:r>
-        <w:rPr>
-          <w:rFonts w:eastAsia="Times New Roman" w:cs="Times New Roman" w:ascii="Garamond" w:hAnsi="Garamond"/>
-          <w:color w:val="000000"/>
-          <w:kern w:val="0"/>
-          <w:sz w:val="36"/>
-          <w:szCs w:val="36"/>
-          <w:shd w:fill="auto" w:val="clear"/>
-          <w:lang w:val="en-US" w:eastAsia="zh-CN" w:bidi="hi-IN"/>
-        </w:rPr>
-        <w:t xml:space="preserve"> passagem evangélica que estamos </w:t>
-      </w:r>
-      <w:r>
-        <w:rPr>
-          <w:rFonts w:eastAsia="Times New Roman" w:cs="Times New Roman" w:ascii="Garamond" w:hAnsi="Garamond"/>
-          <w:color w:val="000000"/>
-          <w:kern w:val="0"/>
-          <w:sz w:val="36"/>
-          <w:szCs w:val="36"/>
-          <w:shd w:fill="auto" w:val="clear"/>
-          <w:lang w:val="en-US" w:eastAsia="zh-CN" w:bidi="hi-IN"/>
-        </w:rPr>
-        <w:t>estudando</w:t>
-      </w:r>
-      <w:r>
-        <w:rPr>
-          <w:rFonts w:eastAsia="Times New Roman" w:cs="Times New Roman" w:ascii="Garamond" w:hAnsi="Garamond"/>
-          <w:color w:val="000000"/>
-          <w:kern w:val="0"/>
-          <w:sz w:val="36"/>
-          <w:szCs w:val="36"/>
-          <w:shd w:fill="auto" w:val="clear"/>
-          <w:lang w:val="en-US" w:eastAsia="zh-CN" w:bidi="hi-IN"/>
-        </w:rPr>
-        <w:t xml:space="preserve">, Jesus nos diz que Deus sabe do que necessitamos antes mesmo de pedirmos. Os  incrédulos </w:t>
-      </w:r>
-      <w:r>
-        <w:rPr>
-          <w:rFonts w:eastAsia="Times New Roman" w:cs="Times New Roman" w:ascii="Garamond" w:hAnsi="Garamond"/>
-          <w:color w:val="000000"/>
-          <w:kern w:val="0"/>
-          <w:sz w:val="36"/>
-          <w:szCs w:val="36"/>
-          <w:shd w:fill="auto" w:val="clear"/>
-          <w:lang w:val="en-US" w:eastAsia="zh-CN" w:bidi="hi-IN"/>
-        </w:rPr>
-        <w:t xml:space="preserve">argumentam </w:t>
-      </w:r>
-      <w:r>
-        <w:rPr>
-          <w:rFonts w:eastAsia="Times New Roman" w:cs="Times New Roman" w:ascii="Garamond" w:hAnsi="Garamond"/>
-          <w:color w:val="000000"/>
-          <w:kern w:val="0"/>
-          <w:sz w:val="36"/>
-          <w:szCs w:val="36"/>
-          <w:shd w:fill="auto" w:val="clear"/>
-          <w:lang w:val="en-US" w:eastAsia="zh-CN" w:bidi="hi-IN"/>
-        </w:rPr>
-        <w:t>que</w:t>
-      </w:r>
-      <w:r>
-        <w:rPr>
-          <w:rFonts w:eastAsia="Times New Roman" w:cs="Times New Roman" w:ascii="Garamond" w:hAnsi="Garamond"/>
-          <w:color w:val="000000"/>
-          <w:kern w:val="0"/>
-          <w:sz w:val="36"/>
-          <w:szCs w:val="36"/>
-          <w:shd w:fill="auto" w:val="clear"/>
-          <w:lang w:val="en-US" w:eastAsia="zh-CN" w:bidi="hi-IN"/>
-        </w:rPr>
-        <w:t xml:space="preserve"> a oração </w:t>
-      </w:r>
-      <w:r>
-        <w:rPr>
-          <w:rFonts w:eastAsia="Times New Roman" w:cs="Times New Roman" w:ascii="Garamond" w:hAnsi="Garamond"/>
-          <w:color w:val="000000"/>
-          <w:kern w:val="0"/>
-          <w:sz w:val="36"/>
-          <w:szCs w:val="36"/>
-          <w:shd w:fill="auto" w:val="clear"/>
-          <w:lang w:val="en-US" w:eastAsia="zh-CN" w:bidi="hi-IN"/>
-        </w:rPr>
-        <w:t xml:space="preserve">então </w:t>
-      </w:r>
-      <w:r>
-        <w:rPr>
-          <w:rFonts w:eastAsia="Times New Roman" w:cs="Times New Roman" w:ascii="Garamond" w:hAnsi="Garamond"/>
-          <w:color w:val="000000"/>
-          <w:kern w:val="0"/>
-          <w:sz w:val="36"/>
-          <w:szCs w:val="36"/>
-          <w:shd w:fill="auto" w:val="clear"/>
-          <w:lang w:val="en-US" w:eastAsia="zh-CN" w:bidi="hi-IN"/>
-        </w:rPr>
-        <w:t xml:space="preserve">é desnecessária. </w:t>
-      </w:r>
-      <w:r>
-        <w:rPr>
-          <w:rFonts w:eastAsia="Times New Roman" w:cs="Times New Roman" w:ascii="Garamond" w:hAnsi="Garamond"/>
-          <w:color w:val="000000"/>
-          <w:kern w:val="0"/>
-          <w:sz w:val="36"/>
-          <w:szCs w:val="36"/>
-          <w:shd w:fill="auto" w:val="clear"/>
-          <w:lang w:val="en-US" w:eastAsia="zh-CN" w:bidi="hi-IN"/>
-        </w:rPr>
-        <w:t>Afinal de contas, se</w:t>
-      </w:r>
-      <w:r>
-        <w:rPr>
-          <w:rFonts w:eastAsia="Times New Roman" w:cs="Times New Roman" w:ascii="Garamond" w:hAnsi="Garamond"/>
-          <w:color w:val="000000"/>
-          <w:kern w:val="0"/>
-          <w:sz w:val="36"/>
-          <w:szCs w:val="36"/>
-          <w:shd w:fill="auto" w:val="clear"/>
-          <w:lang w:val="en-US" w:eastAsia="zh-CN" w:bidi="hi-IN"/>
-        </w:rPr>
-        <w:t xml:space="preserve"> Deus </w:t>
-      </w:r>
-      <w:r>
-        <w:rPr>
-          <w:rFonts w:eastAsia="Times New Roman" w:cs="Times New Roman" w:ascii="Garamond" w:hAnsi="Garamond"/>
-          <w:color w:val="000000"/>
-          <w:kern w:val="0"/>
-          <w:sz w:val="36"/>
-          <w:szCs w:val="36"/>
-          <w:shd w:fill="auto" w:val="clear"/>
-          <w:lang w:val="en-US" w:eastAsia="zh-CN" w:bidi="hi-IN"/>
-        </w:rPr>
-        <w:t xml:space="preserve">já </w:t>
-      </w:r>
-      <w:r>
-        <w:rPr>
-          <w:rFonts w:eastAsia="Times New Roman" w:cs="Times New Roman" w:ascii="Garamond" w:hAnsi="Garamond"/>
-          <w:color w:val="000000"/>
-          <w:kern w:val="0"/>
-          <w:sz w:val="36"/>
-          <w:szCs w:val="36"/>
-          <w:shd w:fill="auto" w:val="clear"/>
-          <w:lang w:val="en-US" w:eastAsia="zh-CN" w:bidi="hi-IN"/>
-        </w:rPr>
-        <w:t xml:space="preserve">sabe do que necessitamos, </w:t>
-      </w:r>
-      <w:r>
-        <w:rPr>
-          <w:rFonts w:eastAsia="Times New Roman" w:cs="Times New Roman" w:ascii="Garamond" w:hAnsi="Garamond"/>
-          <w:color w:val="000000"/>
-          <w:kern w:val="0"/>
-          <w:sz w:val="36"/>
-          <w:szCs w:val="36"/>
-          <w:shd w:fill="auto" w:val="clear"/>
-          <w:lang w:val="en-US" w:eastAsia="zh-CN" w:bidi="hi-IN"/>
-        </w:rPr>
-        <w:t>não há a necessidade de pedir</w:t>
-      </w:r>
-      <w:r>
-        <w:rPr>
-          <w:rFonts w:eastAsia="Times New Roman" w:cs="Times New Roman" w:ascii="Garamond" w:hAnsi="Garamond"/>
-          <w:color w:val="000000"/>
-          <w:kern w:val="0"/>
-          <w:sz w:val="36"/>
-          <w:szCs w:val="36"/>
-          <w:shd w:fill="auto" w:val="clear"/>
-          <w:lang w:val="en-US" w:eastAsia="zh-CN" w:bidi="hi-IN"/>
-        </w:rPr>
-        <w:t>. Esse é um pensamento completamente equivocado.</w:t>
-      </w:r>
-    </w:p>
-    <w:p>
-      <w:pPr>
-        <w:pStyle w:val="Normal"/>
-        <w:jc w:val="both"/>
-        <w:rPr>
-          <w:color w:val="auto"/>
-        </w:rPr>
-      </w:pPr>
-      <w:r>
-        <w:rPr/>
-      </w:r>
-    </w:p>
-    <w:p>
-      <w:pPr>
-        <w:pStyle w:val="Normal"/>
-        <w:jc w:val="both"/>
-        <w:rPr>
-          <w:color w:val="auto"/>
-        </w:rPr>
-      </w:pPr>
-      <w:r>
-        <w:rPr>
-          <w:rFonts w:eastAsia="Times New Roman" w:cs="Times New Roman" w:ascii="Garamond" w:hAnsi="Garamond"/>
-          <w:color w:val="000000"/>
-          <w:kern w:val="0"/>
-          <w:sz w:val="36"/>
-          <w:szCs w:val="36"/>
-          <w:shd w:fill="auto" w:val="clear"/>
-          <w:lang w:val="en-US" w:eastAsia="zh-CN" w:bidi="hi-IN"/>
-        </w:rPr>
-        <w:t xml:space="preserve">A oração </w:t>
-      </w:r>
-      <w:r>
-        <w:rPr>
-          <w:rFonts w:eastAsia="Times New Roman" w:cs="Times New Roman" w:ascii="Garamond" w:hAnsi="Garamond"/>
-          <w:color w:val="000000"/>
-          <w:kern w:val="0"/>
-          <w:sz w:val="36"/>
-          <w:szCs w:val="36"/>
-          <w:shd w:fill="auto" w:val="clear"/>
-          <w:lang w:val="en-US" w:eastAsia="zh-CN" w:bidi="hi-IN"/>
-        </w:rPr>
-        <w:t>não tem como objetivo</w:t>
-      </w:r>
-      <w:r>
-        <w:rPr>
-          <w:rFonts w:eastAsia="Times New Roman" w:cs="Times New Roman" w:ascii="Garamond" w:hAnsi="Garamond"/>
-          <w:color w:val="000000"/>
-          <w:kern w:val="0"/>
-          <w:sz w:val="36"/>
-          <w:szCs w:val="36"/>
-          <w:shd w:fill="auto" w:val="clear"/>
-          <w:lang w:val="en-US" w:eastAsia="zh-CN" w:bidi="hi-IN"/>
-        </w:rPr>
-        <w:t xml:space="preserve"> informar a Deus  aquilo de que precisamos</w:t>
-      </w:r>
-      <w:r>
-        <w:rPr>
-          <w:rFonts w:eastAsia="Times New Roman" w:cs="Times New Roman" w:ascii="Garamond" w:hAnsi="Garamond"/>
-          <w:color w:val="000000"/>
-          <w:kern w:val="0"/>
-          <w:sz w:val="36"/>
-          <w:szCs w:val="36"/>
-          <w:shd w:fill="auto" w:val="clear"/>
-          <w:lang w:val="en-US" w:eastAsia="zh-CN" w:bidi="hi-IN"/>
-        </w:rPr>
-        <w:t>;</w:t>
-      </w:r>
-      <w:r>
-        <w:rPr>
-          <w:rFonts w:eastAsia="Times New Roman" w:cs="Times New Roman" w:ascii="Garamond" w:hAnsi="Garamond"/>
-          <w:color w:val="000000"/>
-          <w:kern w:val="0"/>
-          <w:sz w:val="36"/>
-          <w:szCs w:val="36"/>
-          <w:shd w:fill="auto" w:val="clear"/>
-          <w:lang w:val="en-US" w:eastAsia="zh-CN" w:bidi="hi-IN"/>
-        </w:rPr>
-        <w:t xml:space="preserve"> </w:t>
-      </w:r>
-      <w:r>
-        <w:rPr>
-          <w:rFonts w:eastAsia="Times New Roman" w:cs="Times New Roman" w:ascii="Garamond" w:hAnsi="Garamond"/>
-          <w:color w:val="000000"/>
-          <w:kern w:val="0"/>
-          <w:sz w:val="36"/>
-          <w:szCs w:val="36"/>
-          <w:shd w:fill="auto" w:val="clear"/>
-          <w:lang w:val="en-US" w:eastAsia="zh-CN" w:bidi="hi-IN"/>
-        </w:rPr>
-        <w:t>o objetivo da oração é</w:t>
-      </w:r>
-      <w:r>
-        <w:rPr>
-          <w:rFonts w:eastAsia="Times New Roman" w:cs="Times New Roman" w:ascii="Garamond" w:hAnsi="Garamond"/>
-          <w:color w:val="000000"/>
-          <w:kern w:val="0"/>
-          <w:sz w:val="36"/>
-          <w:szCs w:val="36"/>
-          <w:shd w:fill="auto" w:val="clear"/>
-          <w:lang w:val="en-US" w:eastAsia="zh-CN" w:bidi="hi-IN"/>
-        </w:rPr>
-        <w:t xml:space="preserve"> nos transformar. Orar é criar, dentro de nós, as condições necessárias para receber aquilo que a Providência </w:t>
-      </w:r>
-      <w:r>
-        <w:rPr>
-          <w:rFonts w:eastAsia="Times New Roman" w:cs="Times New Roman" w:ascii="Garamond" w:hAnsi="Garamond"/>
-          <w:color w:val="000000"/>
-          <w:kern w:val="0"/>
-          <w:sz w:val="36"/>
-          <w:szCs w:val="36"/>
-          <w:shd w:fill="auto" w:val="clear"/>
-          <w:lang w:val="en-US" w:eastAsia="zh-CN" w:bidi="hi-IN"/>
-        </w:rPr>
-        <w:t xml:space="preserve">Divina </w:t>
-      </w:r>
-      <w:r>
-        <w:rPr>
-          <w:rFonts w:eastAsia="Times New Roman" w:cs="Times New Roman" w:ascii="Garamond" w:hAnsi="Garamond"/>
-          <w:color w:val="000000"/>
-          <w:kern w:val="0"/>
-          <w:sz w:val="36"/>
-          <w:szCs w:val="36"/>
-          <w:shd w:fill="auto" w:val="clear"/>
-          <w:lang w:val="en-US" w:eastAsia="zh-CN" w:bidi="hi-IN"/>
-        </w:rPr>
-        <w:t>pode nos oferecer.</w:t>
-      </w:r>
-    </w:p>
-    <w:p>
-      <w:pPr>
-        <w:pStyle w:val="Normal"/>
-        <w:jc w:val="both"/>
-        <w:rPr>
-          <w:rFonts w:ascii="Garamond" w:hAnsi="Garamond" w:eastAsia="Times New Roman" w:cs="Times New Roman"/>
-          <w:kern w:val="0"/>
-          <w:sz w:val="36"/>
-          <w:szCs w:val="36"/>
-          <w:shd w:fill="auto" w:val="clear"/>
-          <w:lang w:val="en-US" w:eastAsia="zh-CN" w:bidi="hi-IN"/>
-        </w:rPr>
-      </w:pPr>
-      <w:r>
-        <w:rPr>
-          <w:rFonts w:eastAsia="Times New Roman" w:cs="Times New Roman" w:ascii="Garamond" w:hAnsi="Garamond"/>
-          <w:kern w:val="0"/>
-          <w:sz w:val="36"/>
-          <w:szCs w:val="36"/>
-          <w:shd w:fill="auto" w:val="clear"/>
-          <w:lang w:val="en-US" w:eastAsia="zh-CN" w:bidi="hi-IN"/>
-        </w:rPr>
-      </w:r>
-    </w:p>
-    <w:p>
-      <w:pPr>
-        <w:pStyle w:val="Normal"/>
-        <w:jc w:val="both"/>
-        <w:rPr>
-          <w:color w:val="auto"/>
-        </w:rPr>
-      </w:pPr>
-      <w:r>
-        <w:rPr>
-          <w:rFonts w:eastAsia="Times New Roman" w:cs="Times New Roman" w:ascii="Garamond" w:hAnsi="Garamond"/>
-          <w:color w:val="000000"/>
-          <w:kern w:val="0"/>
-          <w:sz w:val="36"/>
-          <w:szCs w:val="36"/>
-          <w:shd w:fill="auto" w:val="clear"/>
-          <w:lang w:val="en-US" w:eastAsia="zh-CN" w:bidi="hi-IN"/>
-        </w:rPr>
-        <w:t xml:space="preserve">A oração não muda Deus. Muda quem ora. Quebra o nosso orgulho, abre o nosso coração e nos prepara para receber </w:t>
-      </w:r>
-      <w:r>
-        <w:rPr>
-          <w:rFonts w:eastAsia="Times New Roman" w:cs="Times New Roman" w:ascii="Garamond" w:hAnsi="Garamond"/>
-          <w:color w:val="000000"/>
-          <w:kern w:val="0"/>
-          <w:sz w:val="36"/>
-          <w:szCs w:val="36"/>
-          <w:shd w:fill="auto" w:val="clear"/>
-          <w:lang w:val="en-US" w:eastAsia="zh-CN" w:bidi="hi-IN"/>
-        </w:rPr>
-        <w:t>o</w:t>
-      </w:r>
-      <w:r>
-        <w:rPr>
-          <w:rFonts w:eastAsia="Times New Roman" w:cs="Times New Roman" w:ascii="Garamond" w:hAnsi="Garamond"/>
-          <w:color w:val="000000"/>
-          <w:kern w:val="0"/>
-          <w:sz w:val="36"/>
-          <w:szCs w:val="36"/>
-          <w:shd w:fill="auto" w:val="clear"/>
-          <w:lang w:val="en-US" w:eastAsia="zh-CN" w:bidi="hi-IN"/>
-        </w:rPr>
-        <w:t xml:space="preserve"> que Deus</w:t>
-      </w:r>
-      <w:r>
-        <w:rPr>
-          <w:rFonts w:eastAsia="Times New Roman" w:cs="Times New Roman" w:ascii="Garamond" w:hAnsi="Garamond"/>
-          <w:color w:val="000000"/>
-          <w:kern w:val="0"/>
-          <w:sz w:val="36"/>
-          <w:szCs w:val="36"/>
-          <w:shd w:fill="auto" w:val="clear"/>
-          <w:lang w:val="en-US" w:eastAsia="zh-CN" w:bidi="hi-IN"/>
-        </w:rPr>
-        <w:t xml:space="preserve">, em Sua infinita misericórdia, </w:t>
-      </w:r>
-      <w:r>
-        <w:rPr>
-          <w:rFonts w:eastAsia="Times New Roman" w:cs="Times New Roman" w:ascii="Garamond" w:hAnsi="Garamond"/>
-          <w:color w:val="000000"/>
-          <w:kern w:val="0"/>
-          <w:sz w:val="36"/>
-          <w:szCs w:val="36"/>
-          <w:shd w:fill="auto" w:val="clear"/>
-          <w:lang w:val="en-US" w:eastAsia="zh-CN" w:bidi="hi-IN"/>
-        </w:rPr>
-        <w:t xml:space="preserve"> </w:t>
-      </w:r>
-      <w:r>
-        <w:rPr>
-          <w:rFonts w:eastAsia="Times New Roman" w:cs="Times New Roman" w:ascii="Garamond" w:hAnsi="Garamond"/>
-          <w:color w:val="000000"/>
-          <w:kern w:val="0"/>
-          <w:sz w:val="36"/>
-          <w:szCs w:val="36"/>
-          <w:shd w:fill="auto" w:val="clear"/>
-          <w:lang w:val="en-US" w:eastAsia="zh-CN" w:bidi="hi-IN"/>
-        </w:rPr>
-        <w:t>julga que temos mérito para receber</w:t>
-      </w:r>
-      <w:r>
-        <w:rPr>
-          <w:rFonts w:eastAsia="Times New Roman" w:cs="Times New Roman" w:ascii="Garamond" w:hAnsi="Garamond"/>
-          <w:color w:val="000000"/>
-          <w:kern w:val="0"/>
-          <w:sz w:val="36"/>
-          <w:szCs w:val="36"/>
-          <w:shd w:fill="auto" w:val="clear"/>
-          <w:lang w:val="en-US" w:eastAsia="zh-CN" w:bidi="hi-IN"/>
-        </w:rPr>
-        <w:t>.</w:t>
-      </w:r>
-    </w:p>
-    <w:p>
-      <w:pPr>
-        <w:pStyle w:val="Normal"/>
-        <w:jc w:val="both"/>
-        <w:rPr>
-          <w:rFonts w:ascii="Garamond" w:hAnsi="Garamond" w:eastAsia="Times New Roman" w:cs="Times New Roman"/>
-          <w:kern w:val="0"/>
-          <w:sz w:val="36"/>
-          <w:szCs w:val="36"/>
-          <w:shd w:fill="auto" w:val="clear"/>
-          <w:lang w:val="en-US" w:eastAsia="zh-CN" w:bidi="hi-IN"/>
-        </w:rPr>
-      </w:pPr>
-      <w:r>
-        <w:rPr>
-          <w:rFonts w:eastAsia="Times New Roman" w:cs="Times New Roman" w:ascii="Garamond" w:hAnsi="Garamond"/>
-          <w:kern w:val="0"/>
-          <w:sz w:val="36"/>
-          <w:szCs w:val="36"/>
-          <w:shd w:fill="auto" w:val="clear"/>
-          <w:lang w:val="en-US" w:eastAsia="zh-CN" w:bidi="hi-IN"/>
-        </w:rPr>
-      </w:r>
-    </w:p>
-    <w:p>
-      <w:pPr>
-        <w:pStyle w:val="Normal"/>
-        <w:jc w:val="both"/>
-        <w:rPr>
-          <w:color w:val="auto"/>
-        </w:rPr>
-      </w:pPr>
-      <w:r>
-        <w:rPr>
-          <w:rFonts w:eastAsia="Times New Roman" w:cs="Times New Roman" w:ascii="Garamond" w:hAnsi="Garamond"/>
-          <w:color w:val="000000"/>
-          <w:kern w:val="0"/>
-          <w:sz w:val="36"/>
-          <w:szCs w:val="36"/>
-          <w:shd w:fill="auto" w:val="clear"/>
-          <w:lang w:val="en-US" w:eastAsia="zh-CN" w:bidi="hi-IN"/>
-        </w:rPr>
-        <w:t>Vamos fazer mais uma comparação: aquilo que Deus nos oferece é semelhante a uma fonte de água. Quem vai até a fonte com um copo recolhe um copo; quem leva uma jarra recolhe uma jarra; quem leva um barril recolhe um barril. A fonte não muda — continua a mesma. O que muda é a capacidade que cada um tem de recolher água.</w:t>
-      </w:r>
-    </w:p>
-    <w:p>
-      <w:pPr>
-        <w:pStyle w:val="Normal"/>
-        <w:jc w:val="both"/>
-        <w:rPr>
-          <w:color w:val="auto"/>
-        </w:rPr>
-      </w:pPr>
-      <w:r>
-        <w:rPr/>
-      </w:r>
-    </w:p>
-    <w:p>
-      <w:pPr>
-        <w:pStyle w:val="Normal"/>
-        <w:jc w:val="both"/>
-        <w:rPr>
+        <w:t>[ Parei aqui em 1</w:t>
+      </w:r>
+      <w:r>
+        <w:rPr>
+          <w:rFonts w:eastAsia="Times New Roman" w:cs="Times New Roman" w:ascii="Garamond" w:hAnsi="Garamond"/>
           <w:color w:val="18A303"/>
-        </w:rPr>
-      </w:pPr>
+          <w:kern w:val="0"/>
+          <w:sz w:val="36"/>
+          <w:szCs w:val="36"/>
+          <w:shd w:fill="auto" w:val="clear"/>
+          <w:lang w:val="en-US" w:eastAsia="zh-CN" w:bidi="hi-IN"/>
+        </w:rPr>
+        <w:t>2</w:t>
+      </w:r>
       <w:r>
         <w:rPr>
           <w:rFonts w:eastAsia="Times New Roman" w:cs="Times New Roman" w:ascii="Garamond" w:hAnsi="Garamond"/>
@@ -3489,33 +3720,7 @@
           <w:shd w:fill="auto" w:val="clear"/>
           <w:lang w:val="en-US" w:eastAsia="zh-CN" w:bidi="hi-IN"/>
         </w:rPr>
-        <w:t>[ Parei aqui em 11/03/2026 ]</w:t>
-      </w:r>
-      <w:r>
-        <w:rPr>
-          <w:rFonts w:eastAsia="Times New Roman" w:cs="Times New Roman" w:ascii="Garamond" w:hAnsi="Garamond"/>
-          <w:color w:val="18A303"/>
-          <w:kern w:val="0"/>
-          <w:sz w:val="36"/>
-          <w:szCs w:val="36"/>
-          <w:shd w:fill="auto" w:val="clear"/>
-          <w:lang w:val="en-US" w:eastAsia="zh-CN" w:bidi="hi-IN"/>
-        </w:rPr>
-        <w:t xml:space="preserve"> </w:t>
-      </w:r>
-    </w:p>
-    <w:p>
-      <w:pPr>
-        <w:pStyle w:val="Normal"/>
-        <w:jc w:val="both"/>
-        <w:rPr>
-          <w:color w:val="auto"/>
-        </w:rPr>
-      </w:pPr>
-      <w:r>
-        <w:rPr>
-          <w:color w:val="auto"/>
-        </w:rPr>
+        <w:t xml:space="preserve">/03/2026 ] </w:t>
       </w:r>
     </w:p>
     <w:p>
@@ -5242,7 +5447,7 @@
         <w:bCs/>
         <w:rFonts w:ascii="Garamond" w:hAnsi="Garamond"/>
       </w:rPr>
-      <w:t>26</w:t>
+      <w:t>27</w:t>
     </w:r>
     <w:r>
       <w:rPr>

</xml_diff>

<commit_message>
14/03/2026 - 00:05 h
</commit_message>
<xml_diff>
--- a/Pedi e obtereis/Pedi e obtereis.docx
+++ b/Pedi e obtereis/Pedi e obtereis.docx
@@ -536,9 +536,7 @@
         </w:rPr>
       </w:pPr>
       <w:r>
-        <w:rPr>
-          <w:color w:val="auto"/>
-        </w:rPr>
+        <w:rPr/>
       </w:r>
     </w:p>
     <w:p>
@@ -571,9 +569,7 @@
         </w:rPr>
       </w:pPr>
       <w:r>
-        <w:rPr>
-          <w:color w:val="auto"/>
-        </w:rPr>
+        <w:rPr/>
       </w:r>
     </w:p>
     <w:p>
@@ -606,44 +602,52 @@
         </w:rPr>
       </w:pPr>
       <w:r>
-        <w:rPr>
-          <w:color w:val="auto"/>
-        </w:rPr>
-      </w:r>
-    </w:p>
-    <w:p>
-      <w:pPr>
-        <w:pStyle w:val="Normal"/>
-        <w:jc w:val="both"/>
-        <w:rPr>
-          <w:color w:val="auto"/>
-        </w:rPr>
-      </w:pPr>
-      <w:r>
-        <w:rPr>
-          <w:rFonts w:eastAsia="Times New Roman" w:cs="Times New Roman" w:ascii="Garamond" w:hAnsi="Garamond"/>
-          <w:color w:val="000000"/>
-          <w:kern w:val="0"/>
-          <w:sz w:val="36"/>
-          <w:szCs w:val="36"/>
-          <w:shd w:fill="auto" w:val="clear"/>
-          <w:lang w:val="en-US" w:eastAsia="zh-CN" w:bidi="hi-IN"/>
-        </w:rPr>
-        <w:t>Logo em seguida o Mestre diz:</w:t>
-      </w:r>
-    </w:p>
-    <w:p>
-      <w:pPr>
-        <w:pStyle w:val="Normal"/>
-        <w:jc w:val="both"/>
-        <w:rPr>
-          <w:color w:val="auto"/>
-        </w:rPr>
-      </w:pPr>
-      <w:r>
-        <w:rPr>
-          <w:color w:val="auto"/>
-        </w:rPr>
+        <w:rPr/>
+      </w:r>
+    </w:p>
+    <w:p>
+      <w:pPr>
+        <w:pStyle w:val="Normal"/>
+        <w:jc w:val="both"/>
+        <w:rPr>
+          <w:color w:val="auto"/>
+        </w:rPr>
+      </w:pPr>
+      <w:r>
+        <w:rPr>
+          <w:rFonts w:eastAsia="Times New Roman" w:cs="Times New Roman" w:ascii="Garamond" w:hAnsi="Garamond"/>
+          <w:color w:val="000000"/>
+          <w:kern w:val="0"/>
+          <w:sz w:val="36"/>
+          <w:szCs w:val="36"/>
+          <w:shd w:fill="auto" w:val="clear"/>
+          <w:lang w:val="en-US" w:eastAsia="zh-CN" w:bidi="hi-IN"/>
+        </w:rPr>
+        <w:t>E</w:t>
+      </w:r>
+      <w:r>
+        <w:rPr>
+          <w:rFonts w:eastAsia="Times New Roman" w:cs="Times New Roman" w:ascii="Garamond" w:hAnsi="Garamond"/>
+          <w:color w:val="000000"/>
+          <w:kern w:val="0"/>
+          <w:sz w:val="36"/>
+          <w:szCs w:val="36"/>
+          <w:shd w:fill="auto" w:val="clear"/>
+          <w:lang w:val="en-US" w:eastAsia="zh-CN" w:bidi="hi-IN"/>
+        </w:rPr>
+        <w:t>m seguida o Mestre diz:</w:t>
+      </w:r>
+    </w:p>
+    <w:p>
+      <w:pPr>
+        <w:pStyle w:val="Normal"/>
+        <w:jc w:val="both"/>
+        <w:rPr>
+          <w:color w:val="auto"/>
+        </w:rPr>
+      </w:pPr>
+      <w:r>
+        <w:rPr/>
       </w:r>
     </w:p>
     <w:p>
@@ -699,110 +703,212 @@
           <w:color w:val="auto"/>
         </w:rPr>
       </w:r>
-    </w:p>
-    <w:p>
-      <w:pPr>
-        <w:pStyle w:val="Normal"/>
-        <w:jc w:val="both"/>
-        <w:rPr>
-          <w:color w:val="auto"/>
-        </w:rPr>
-      </w:pPr>
-      <w:r>
-        <w:rPr>
-          <w:rFonts w:eastAsia="Times New Roman" w:cs="Times New Roman" w:ascii="Garamond" w:hAnsi="Garamond"/>
-          <w:color w:val="000000"/>
-          <w:kern w:val="0"/>
-          <w:sz w:val="36"/>
-          <w:szCs w:val="36"/>
-          <w:shd w:fill="auto" w:val="clear"/>
-          <w:lang w:val="en-US" w:eastAsia="zh-CN" w:bidi="hi-IN"/>
-        </w:rPr>
-        <w:t xml:space="preserve">Existem alguns elementos simbólicos nessa parábola. Jesus menciona que o homem procura o amigo à meia-noite, horário que aparece com frequência no Evangelho como símbolo de crise, de dificuldade e de escuridão interior. </w:t>
-      </w:r>
-    </w:p>
-    <w:p>
-      <w:pPr>
-        <w:pStyle w:val="Normal"/>
-        <w:jc w:val="both"/>
-        <w:rPr>
-          <w:color w:val="auto"/>
-        </w:rPr>
-      </w:pPr>
-      <w:r>
-        <w:rPr>
-          <w:color w:val="auto"/>
-        </w:rPr>
-      </w:r>
-    </w:p>
-    <w:p>
-      <w:pPr>
-        <w:pStyle w:val="Normal"/>
-        <w:jc w:val="both"/>
-        <w:rPr>
-          <w:color w:val="auto"/>
-        </w:rPr>
-      </w:pPr>
-      <w:r>
-        <w:rPr>
-          <w:rFonts w:eastAsia="Times New Roman" w:cs="Times New Roman" w:ascii="Garamond" w:hAnsi="Garamond"/>
-          <w:color w:val="000000"/>
-          <w:kern w:val="0"/>
-          <w:sz w:val="36"/>
-          <w:szCs w:val="36"/>
-          <w:shd w:fill="auto" w:val="clear"/>
-          <w:lang w:val="en-US" w:eastAsia="zh-CN" w:bidi="hi-IN"/>
-        </w:rPr>
-        <w:t>Muitas vezes desperdiçamos as oportunidades durante a “luz do dia” e só buscamos auxílio quando a dor, o sofrimento ou a aflição já se instalaram em nós. A “noite”, nesse contexto, simboliza justamente esse momento difícil, em que as dificuldades nos fazem perceber a necessidade de buscar luz e orientação espiritual.</w:t>
-      </w:r>
-    </w:p>
-    <w:p>
-      <w:pPr>
-        <w:pStyle w:val="Normal"/>
-        <w:jc w:val="both"/>
-        <w:rPr>
-          <w:color w:val="auto"/>
-        </w:rPr>
-      </w:pPr>
-      <w:r>
-        <w:rPr>
-          <w:color w:val="auto"/>
-        </w:rPr>
-      </w:r>
-    </w:p>
-    <w:p>
-      <w:pPr>
-        <w:pStyle w:val="Normal"/>
-        <w:jc w:val="both"/>
-        <w:rPr>
-          <w:color w:val="auto"/>
-        </w:rPr>
-      </w:pPr>
-      <w:r>
-        <w:rPr>
-          <w:rFonts w:eastAsia="Times New Roman" w:cs="Times New Roman" w:ascii="Garamond" w:hAnsi="Garamond"/>
-          <w:color w:val="000000"/>
-          <w:kern w:val="0"/>
-          <w:sz w:val="36"/>
-          <w:szCs w:val="36"/>
-          <w:shd w:fill="auto" w:val="clear"/>
-          <w:lang w:val="en-US" w:eastAsia="zh-CN" w:bidi="hi-IN"/>
-        </w:rPr>
-        <w:t xml:space="preserve">O amigo que está dentro da casa representa os valores superiores que já possuímos, porém ainda adormecidos. Quando o homem diz que está deitado e não quer se levantar, isso simboliza nossa própria resistência em sair da zona de conforto. </w:t>
-      </w:r>
-    </w:p>
-    <w:p>
-      <w:pPr>
-        <w:pStyle w:val="Normal"/>
-        <w:jc w:val="both"/>
-        <w:rPr>
-          <w:color w:val="auto"/>
-        </w:rPr>
-      </w:pPr>
-      <w:r>
-        <w:rPr>
-          <w:color w:val="auto"/>
-        </w:rPr>
+      <w:r>
+        <w:br w:type="page"/>
+      </w:r>
+    </w:p>
+    <w:p>
+      <w:pPr>
+        <w:pStyle w:val="Normal"/>
+        <w:jc w:val="both"/>
+        <w:rPr>
+          <w:color w:val="auto"/>
+        </w:rPr>
+      </w:pPr>
+      <w:r>
+        <w:rPr>
+          <w:rFonts w:eastAsia="Times New Roman" w:cs="Times New Roman" w:ascii="Garamond" w:hAnsi="Garamond"/>
+          <w:color w:val="000000"/>
+          <w:kern w:val="0"/>
+          <w:sz w:val="36"/>
+          <w:szCs w:val="36"/>
+          <w:shd w:fill="auto" w:val="clear"/>
+          <w:lang w:val="en-US" w:eastAsia="zh-CN" w:bidi="hi-IN"/>
+        </w:rPr>
+        <w:t>Existem alguns elementos simbólicos nessa parábola. Jesus menciona que o homem procura o amigo à meia-noite, horário que aparece com frequência no</w:t>
+      </w:r>
+      <w:r>
+        <w:rPr>
+          <w:rFonts w:eastAsia="Times New Roman" w:cs="Times New Roman" w:ascii="Garamond" w:hAnsi="Garamond"/>
+          <w:color w:val="000000"/>
+          <w:kern w:val="0"/>
+          <w:sz w:val="36"/>
+          <w:szCs w:val="36"/>
+          <w:shd w:fill="auto" w:val="clear"/>
+          <w:lang w:val="en-US" w:eastAsia="zh-CN" w:bidi="hi-IN"/>
+        </w:rPr>
+        <w:t>s</w:t>
+      </w:r>
+      <w:r>
+        <w:rPr>
+          <w:rFonts w:eastAsia="Times New Roman" w:cs="Times New Roman" w:ascii="Garamond" w:hAnsi="Garamond"/>
+          <w:color w:val="000000"/>
+          <w:kern w:val="0"/>
+          <w:sz w:val="36"/>
+          <w:szCs w:val="36"/>
+          <w:shd w:fill="auto" w:val="clear"/>
+          <w:lang w:val="en-US" w:eastAsia="zh-CN" w:bidi="hi-IN"/>
+        </w:rPr>
+        <w:t xml:space="preserve"> Evangelho</w:t>
+      </w:r>
+      <w:r>
+        <w:rPr>
+          <w:rFonts w:eastAsia="Times New Roman" w:cs="Times New Roman" w:ascii="Garamond" w:hAnsi="Garamond"/>
+          <w:color w:val="000000"/>
+          <w:kern w:val="0"/>
+          <w:sz w:val="36"/>
+          <w:szCs w:val="36"/>
+          <w:shd w:fill="auto" w:val="clear"/>
+          <w:lang w:val="en-US" w:eastAsia="zh-CN" w:bidi="hi-IN"/>
+        </w:rPr>
+        <w:t>s</w:t>
+      </w:r>
+      <w:r>
+        <w:rPr>
+          <w:rFonts w:eastAsia="Times New Roman" w:cs="Times New Roman" w:ascii="Garamond" w:hAnsi="Garamond"/>
+          <w:color w:val="000000"/>
+          <w:kern w:val="0"/>
+          <w:sz w:val="36"/>
+          <w:szCs w:val="36"/>
+          <w:shd w:fill="auto" w:val="clear"/>
+          <w:lang w:val="en-US" w:eastAsia="zh-CN" w:bidi="hi-IN"/>
+        </w:rPr>
+        <w:t xml:space="preserve"> como símbolo de crise e escuridão interior. </w:t>
+      </w:r>
+    </w:p>
+    <w:p>
+      <w:pPr>
+        <w:pStyle w:val="Normal"/>
+        <w:jc w:val="both"/>
+        <w:rPr>
+          <w:color w:val="auto"/>
+        </w:rPr>
+      </w:pPr>
+      <w:r>
+        <w:rPr/>
+      </w:r>
+    </w:p>
+    <w:p>
+      <w:pPr>
+        <w:pStyle w:val="Normal"/>
+        <w:jc w:val="both"/>
+        <w:rPr>
+          <w:color w:val="auto"/>
+        </w:rPr>
+      </w:pPr>
+      <w:r>
+        <w:rPr>
+          <w:rFonts w:eastAsia="Times New Roman" w:cs="Times New Roman" w:ascii="Garamond" w:hAnsi="Garamond"/>
+          <w:color w:val="000000"/>
+          <w:kern w:val="0"/>
+          <w:sz w:val="36"/>
+          <w:szCs w:val="36"/>
+          <w:shd w:fill="auto" w:val="clear"/>
+          <w:lang w:val="en-US" w:eastAsia="zh-CN" w:bidi="hi-IN"/>
+        </w:rPr>
+        <w:t xml:space="preserve">Muitas vezes desperdiçamos as oportunidades durante a “luz do dia” e só buscamos auxílio quando a dor, o sofrimento </w:t>
+      </w:r>
+      <w:r>
+        <w:rPr>
+          <w:rFonts w:eastAsia="Times New Roman" w:cs="Times New Roman" w:ascii="Garamond" w:hAnsi="Garamond"/>
+          <w:color w:val="000000"/>
+          <w:kern w:val="0"/>
+          <w:sz w:val="36"/>
+          <w:szCs w:val="36"/>
+          <w:shd w:fill="auto" w:val="clear"/>
+          <w:lang w:val="en-US" w:eastAsia="zh-CN" w:bidi="hi-IN"/>
+        </w:rPr>
+        <w:t>e</w:t>
+      </w:r>
+      <w:r>
+        <w:rPr>
+          <w:rFonts w:eastAsia="Times New Roman" w:cs="Times New Roman" w:ascii="Garamond" w:hAnsi="Garamond"/>
+          <w:color w:val="000000"/>
+          <w:kern w:val="0"/>
+          <w:sz w:val="36"/>
+          <w:szCs w:val="36"/>
+          <w:shd w:fill="auto" w:val="clear"/>
+          <w:lang w:val="en-US" w:eastAsia="zh-CN" w:bidi="hi-IN"/>
+        </w:rPr>
+        <w:t xml:space="preserve"> a aflição já se instalaram em nós. </w:t>
+      </w:r>
+    </w:p>
+    <w:p>
+      <w:pPr>
+        <w:pStyle w:val="Normal"/>
+        <w:jc w:val="both"/>
+        <w:rPr>
+          <w:color w:val="auto"/>
+        </w:rPr>
+      </w:pPr>
+      <w:r>
+        <w:rPr/>
+      </w:r>
+    </w:p>
+    <w:p>
+      <w:pPr>
+        <w:pStyle w:val="Normal"/>
+        <w:jc w:val="both"/>
+        <w:rPr>
+          <w:color w:val="auto"/>
+        </w:rPr>
+      </w:pPr>
+      <w:r>
+        <w:rPr>
+          <w:rFonts w:eastAsia="Times New Roman" w:cs="Times New Roman" w:ascii="Garamond" w:hAnsi="Garamond"/>
+          <w:color w:val="000000"/>
+          <w:kern w:val="0"/>
+          <w:sz w:val="36"/>
+          <w:szCs w:val="36"/>
+          <w:shd w:fill="auto" w:val="clear"/>
+          <w:lang w:val="en-US" w:eastAsia="zh-CN" w:bidi="hi-IN"/>
+        </w:rPr>
+        <w:t>A “noite”, nesse contexto, simboliza o momento em que as dificuldades nos levam a reconhecer a necessidade de buscar luz e orientação espiritual.</w:t>
+      </w:r>
+    </w:p>
+    <w:p>
+      <w:pPr>
+        <w:pStyle w:val="Normal"/>
+        <w:jc w:val="both"/>
+        <w:rPr>
+          <w:color w:val="auto"/>
+        </w:rPr>
+      </w:pPr>
+      <w:r>
+        <w:rPr/>
+      </w:r>
+    </w:p>
+    <w:p>
+      <w:pPr>
+        <w:pStyle w:val="Normal"/>
+        <w:jc w:val="both"/>
+        <w:rPr>
+          <w:color w:val="auto"/>
+        </w:rPr>
+      </w:pPr>
+      <w:r>
+        <w:rPr>
+          <w:rFonts w:eastAsia="Times New Roman" w:cs="Times New Roman" w:ascii="Garamond" w:hAnsi="Garamond"/>
+          <w:color w:val="000000"/>
+          <w:kern w:val="0"/>
+          <w:sz w:val="36"/>
+          <w:szCs w:val="36"/>
+          <w:shd w:fill="auto" w:val="clear"/>
+          <w:lang w:val="en-US" w:eastAsia="zh-CN" w:bidi="hi-IN"/>
+        </w:rPr>
+        <w:t>O amigo que está dentro da casa representa os valores superiores adormecidos em nosso interior. Ao dizer que já está deitado e não quer se levantar, revela nossa própria resistência em sair da zona de conforto.</w:t>
+      </w:r>
+    </w:p>
+    <w:p>
+      <w:pPr>
+        <w:pStyle w:val="Normal"/>
+        <w:jc w:val="both"/>
+        <w:rPr>
+          <w:color w:val="auto"/>
+        </w:rPr>
+      </w:pPr>
+      <w:r>
+        <w:rPr/>
       </w:r>
     </w:p>
     <w:p>
@@ -835,9 +941,7 @@
         </w:rPr>
       </w:pPr>
       <w:r>
-        <w:rPr>
-          <w:color w:val="auto"/>
-        </w:rPr>
+        <w:rPr/>
       </w:r>
     </w:p>
     <w:p>
@@ -862,99 +966,29 @@
           <w:shd w:fill="auto" w:val="clear"/>
           <w:lang w:val="en-US" w:eastAsia="zh-CN" w:bidi="hi-IN"/>
         </w:rPr>
-        <w:t xml:space="preserve">O </w:t>
-      </w:r>
-      <w:r>
-        <w:rPr>
-          <w:rFonts w:eastAsia="Times New Roman" w:cs="Times New Roman" w:ascii="Garamond" w:hAnsi="Garamond"/>
-          <w:color w:val="000000"/>
-          <w:kern w:val="0"/>
-          <w:sz w:val="36"/>
-          <w:szCs w:val="36"/>
-          <w:shd w:fill="auto" w:val="clear"/>
-          <w:lang w:val="en-US" w:eastAsia="zh-CN" w:bidi="hi-IN"/>
-        </w:rPr>
-        <w:t>homem</w:t>
-      </w:r>
-      <w:r>
-        <w:rPr>
-          <w:rFonts w:eastAsia="Times New Roman" w:cs="Times New Roman" w:ascii="Garamond" w:hAnsi="Garamond"/>
-          <w:kern w:val="0"/>
-          <w:sz w:val="36"/>
-          <w:szCs w:val="36"/>
-          <w:shd w:fill="auto" w:val="clear"/>
-          <w:lang w:val="en-US" w:eastAsia="zh-CN" w:bidi="hi-IN"/>
-        </w:rPr>
-        <w:t xml:space="preserve"> que bate à porta </w:t>
-      </w:r>
-      <w:r>
-        <w:rPr>
-          <w:rFonts w:eastAsia="Times New Roman" w:cs="Times New Roman" w:ascii="Garamond" w:hAnsi="Garamond"/>
-          <w:color w:val="000000"/>
-          <w:kern w:val="0"/>
-          <w:sz w:val="36"/>
-          <w:szCs w:val="36"/>
-          <w:shd w:fill="auto" w:val="clear"/>
-          <w:lang w:val="en-US" w:eastAsia="zh-CN" w:bidi="hi-IN"/>
-        </w:rPr>
-        <w:t>são</w:t>
-      </w:r>
-      <w:r>
-        <w:rPr>
-          <w:rFonts w:eastAsia="Times New Roman" w:cs="Times New Roman" w:ascii="Garamond" w:hAnsi="Garamond"/>
-          <w:kern w:val="0"/>
-          <w:sz w:val="36"/>
-          <w:szCs w:val="36"/>
-          <w:shd w:fill="auto" w:val="clear"/>
-          <w:lang w:val="en-US" w:eastAsia="zh-CN" w:bidi="hi-IN"/>
-        </w:rPr>
-        <w:t xml:space="preserve"> os estímulos — nem sempre agradáveis — que recebemos da vida. São as experiências, os desafios</w:t>
-      </w:r>
-      <w:r>
-        <w:rPr>
-          <w:rFonts w:eastAsia="Times New Roman" w:cs="Times New Roman" w:ascii="Garamond" w:hAnsi="Garamond"/>
-          <w:color w:val="000000"/>
-          <w:kern w:val="0"/>
-          <w:sz w:val="36"/>
-          <w:szCs w:val="36"/>
-          <w:shd w:fill="auto" w:val="clear"/>
-          <w:lang w:val="en-US" w:eastAsia="zh-CN" w:bidi="hi-IN"/>
-        </w:rPr>
-        <w:t xml:space="preserve">, </w:t>
-      </w:r>
-      <w:r>
-        <w:rPr>
-          <w:rFonts w:eastAsia="Times New Roman" w:cs="Times New Roman" w:ascii="Garamond" w:hAnsi="Garamond"/>
-          <w:kern w:val="0"/>
-          <w:sz w:val="36"/>
-          <w:szCs w:val="36"/>
-          <w:shd w:fill="auto" w:val="clear"/>
-          <w:lang w:val="en-US" w:eastAsia="zh-CN" w:bidi="hi-IN"/>
-        </w:rPr>
-        <w:t xml:space="preserve">as dificuldades que nos levam a refletir, a olhar para dentro e a </w:t>
-      </w:r>
-      <w:r>
-        <w:rPr>
-          <w:rFonts w:eastAsia="Times New Roman" w:cs="Times New Roman" w:ascii="Garamond" w:hAnsi="Garamond"/>
-          <w:color w:val="000000"/>
-          <w:kern w:val="0"/>
-          <w:sz w:val="36"/>
-          <w:szCs w:val="36"/>
-          <w:shd w:fill="auto" w:val="clear"/>
-          <w:lang w:val="en-US" w:eastAsia="zh-CN" w:bidi="hi-IN"/>
-        </w:rPr>
-        <w:t>identificar</w:t>
-      </w:r>
-      <w:r>
-        <w:rPr>
-          <w:rFonts w:eastAsia="Times New Roman" w:cs="Times New Roman" w:ascii="Garamond" w:hAnsi="Garamond"/>
-          <w:kern w:val="0"/>
-          <w:sz w:val="36"/>
-          <w:szCs w:val="36"/>
-          <w:shd w:fill="auto" w:val="clear"/>
-          <w:lang w:val="en-US" w:eastAsia="zh-CN" w:bidi="hi-IN"/>
-        </w:rPr>
-        <w:t xml:space="preserve"> aquilo que precisa mudar em nós.</w:t>
+        <w:t xml:space="preserve">O homem que bate à porta representa os estímulos </w:t>
+      </w:r>
+      <w:r>
+        <w:rPr>
+          <w:rFonts w:eastAsia="Times New Roman" w:cs="Times New Roman" w:ascii="Garamond" w:hAnsi="Garamond"/>
+          <w:kern w:val="0"/>
+          <w:sz w:val="36"/>
+          <w:szCs w:val="36"/>
+          <w:shd w:fill="auto" w:val="clear"/>
+          <w:lang w:val="en-US" w:eastAsia="zh-CN" w:bidi="hi-IN"/>
+        </w:rPr>
+        <w:t xml:space="preserve">que recebemos </w:t>
+      </w:r>
+      <w:r>
+        <w:rPr>
+          <w:rFonts w:eastAsia="Times New Roman" w:cs="Times New Roman" w:ascii="Garamond" w:hAnsi="Garamond"/>
+          <w:kern w:val="0"/>
+          <w:sz w:val="36"/>
+          <w:szCs w:val="36"/>
+          <w:shd w:fill="auto" w:val="clear"/>
+          <w:lang w:val="en-US" w:eastAsia="zh-CN" w:bidi="hi-IN"/>
+        </w:rPr>
+        <w:t>da vida, muitas vezes difíceis. São eles que nos levam a refletir, a olhar para dentro e a perceber o que precisamos mudar.</w:t>
       </w:r>
     </w:p>
     <w:p>
@@ -1011,9 +1045,7 @@
         </w:rPr>
       </w:pPr>
       <w:r>
-        <w:rPr>
-          <w:color w:val="auto"/>
-        </w:rPr>
+        <w:rPr/>
       </w:r>
     </w:p>
     <w:p>
@@ -1079,42 +1111,139 @@
           <w:shd w:fill="auto" w:val="clear"/>
           <w:lang w:val="en-US" w:eastAsia="zh-CN" w:bidi="hi-IN"/>
         </w:rPr>
-        <w:t xml:space="preserve">Portanto, essa parábola nos ensina a necessidade da prece constante — não uma prece mecânica, repetitiva ou interesseira, mas sincera, consciente e transformadora. </w:t>
-      </w:r>
-    </w:p>
-    <w:p>
-      <w:pPr>
-        <w:pStyle w:val="Normal"/>
-        <w:jc w:val="both"/>
-        <w:rPr>
-          <w:color w:val="auto"/>
-        </w:rPr>
-      </w:pPr>
-      <w:r>
-        <w:rPr>
-          <w:color w:val="auto"/>
-        </w:rPr>
-      </w:r>
-    </w:p>
-    <w:p>
-      <w:pPr>
-        <w:pStyle w:val="Normal"/>
-        <w:jc w:val="both"/>
-        <w:rPr>
-          <w:color w:val="auto"/>
-        </w:rPr>
-      </w:pPr>
-      <w:r>
-        <w:rPr>
-          <w:rFonts w:eastAsia="Times New Roman" w:cs="Times New Roman" w:ascii="Garamond" w:hAnsi="Garamond"/>
-          <w:color w:val="000000"/>
-          <w:kern w:val="0"/>
-          <w:sz w:val="36"/>
-          <w:szCs w:val="36"/>
-          <w:shd w:fill="auto" w:val="clear"/>
-          <w:lang w:val="en-US" w:eastAsia="zh-CN" w:bidi="hi-IN"/>
-        </w:rPr>
-        <w:t xml:space="preserve">Bom, então agora sabemos que uma parte muito importante do </w:t>
+        <w:t>Através d</w:t>
+      </w:r>
+      <w:r>
+        <w:rPr>
+          <w:rFonts w:eastAsia="Times New Roman" w:cs="Times New Roman" w:ascii="Garamond" w:hAnsi="Garamond"/>
+          <w:color w:val="000000"/>
+          <w:kern w:val="0"/>
+          <w:sz w:val="36"/>
+          <w:szCs w:val="36"/>
+          <w:shd w:fill="auto" w:val="clear"/>
+          <w:lang w:val="en-US" w:eastAsia="zh-CN" w:bidi="hi-IN"/>
+        </w:rPr>
+        <w:t xml:space="preserve">essa parábola </w:t>
+      </w:r>
+      <w:r>
+        <w:rPr>
+          <w:rFonts w:eastAsia="Times New Roman" w:cs="Times New Roman" w:ascii="Garamond" w:hAnsi="Garamond"/>
+          <w:color w:val="000000"/>
+          <w:kern w:val="0"/>
+          <w:sz w:val="36"/>
+          <w:szCs w:val="36"/>
+          <w:shd w:fill="auto" w:val="clear"/>
+          <w:lang w:val="en-US" w:eastAsia="zh-CN" w:bidi="hi-IN"/>
+        </w:rPr>
+        <w:t xml:space="preserve">Jesus </w:t>
+      </w:r>
+      <w:r>
+        <w:rPr>
+          <w:rFonts w:eastAsia="Times New Roman" w:cs="Times New Roman" w:ascii="Garamond" w:hAnsi="Garamond"/>
+          <w:color w:val="000000"/>
+          <w:kern w:val="0"/>
+          <w:sz w:val="36"/>
+          <w:szCs w:val="36"/>
+          <w:shd w:fill="auto" w:val="clear"/>
+          <w:lang w:val="en-US" w:eastAsia="zh-CN" w:bidi="hi-IN"/>
+        </w:rPr>
+        <w:t xml:space="preserve">nos ensina </w:t>
+      </w:r>
+      <w:r>
+        <w:rPr>
+          <w:rFonts w:eastAsia="Times New Roman" w:cs="Times New Roman" w:ascii="Garamond" w:hAnsi="Garamond"/>
+          <w:color w:val="000000"/>
+          <w:kern w:val="0"/>
+          <w:sz w:val="36"/>
+          <w:szCs w:val="36"/>
+          <w:shd w:fill="auto" w:val="clear"/>
+          <w:lang w:val="en-US" w:eastAsia="zh-CN" w:bidi="hi-IN"/>
+        </w:rPr>
+        <w:t xml:space="preserve">que </w:t>
+      </w:r>
+      <w:r>
+        <w:rPr>
+          <w:rFonts w:eastAsia="Times New Roman" w:cs="Times New Roman" w:ascii="Garamond" w:hAnsi="Garamond"/>
+          <w:color w:val="000000"/>
+          <w:kern w:val="0"/>
+          <w:sz w:val="36"/>
+          <w:szCs w:val="36"/>
+          <w:shd w:fill="auto" w:val="clear"/>
+          <w:lang w:val="en-US" w:eastAsia="zh-CN" w:bidi="hi-IN"/>
+        </w:rPr>
+        <w:t xml:space="preserve">a  </w:t>
+      </w:r>
+      <w:r>
+        <w:rPr>
+          <w:rFonts w:eastAsia="Times New Roman" w:cs="Times New Roman" w:ascii="Garamond" w:hAnsi="Garamond"/>
+          <w:color w:val="000000"/>
+          <w:kern w:val="0"/>
+          <w:sz w:val="36"/>
+          <w:szCs w:val="36"/>
+          <w:shd w:fill="auto" w:val="clear"/>
+          <w:lang w:val="en-US" w:eastAsia="zh-CN" w:bidi="hi-IN"/>
+        </w:rPr>
+        <w:t>oração</w:t>
+      </w:r>
+      <w:r>
+        <w:rPr>
+          <w:rFonts w:eastAsia="Times New Roman" w:cs="Times New Roman" w:ascii="Garamond" w:hAnsi="Garamond"/>
+          <w:color w:val="000000"/>
+          <w:kern w:val="0"/>
+          <w:sz w:val="36"/>
+          <w:szCs w:val="36"/>
+          <w:shd w:fill="auto" w:val="clear"/>
+          <w:lang w:val="en-US" w:eastAsia="zh-CN" w:bidi="hi-IN"/>
+        </w:rPr>
+        <w:t xml:space="preserve"> </w:t>
+      </w:r>
+      <w:r>
+        <w:rPr>
+          <w:rFonts w:eastAsia="Times New Roman" w:cs="Times New Roman" w:ascii="Garamond" w:hAnsi="Garamond"/>
+          <w:color w:val="000000"/>
+          <w:kern w:val="0"/>
+          <w:sz w:val="36"/>
+          <w:szCs w:val="36"/>
+          <w:shd w:fill="auto" w:val="clear"/>
+          <w:lang w:val="en-US" w:eastAsia="zh-CN" w:bidi="hi-IN"/>
+        </w:rPr>
+        <w:t>é</w:t>
+      </w:r>
+      <w:r>
+        <w:rPr>
+          <w:rFonts w:eastAsia="Times New Roman" w:cs="Times New Roman" w:ascii="Garamond" w:hAnsi="Garamond"/>
+          <w:color w:val="000000"/>
+          <w:kern w:val="0"/>
+          <w:sz w:val="36"/>
+          <w:szCs w:val="36"/>
+          <w:shd w:fill="auto" w:val="clear"/>
+          <w:lang w:val="en-US" w:eastAsia="zh-CN" w:bidi="hi-IN"/>
+        </w:rPr>
+        <w:t xml:space="preserve"> uma parte </w:t>
+      </w:r>
+      <w:r>
+        <w:rPr>
+          <w:rFonts w:eastAsia="Times New Roman" w:cs="Times New Roman" w:ascii="Garamond" w:hAnsi="Garamond"/>
+          <w:color w:val="000000"/>
+          <w:kern w:val="0"/>
+          <w:sz w:val="36"/>
+          <w:szCs w:val="36"/>
+          <w:shd w:fill="auto" w:val="clear"/>
+          <w:lang w:val="en-US" w:eastAsia="zh-CN" w:bidi="hi-IN"/>
+        </w:rPr>
+        <w:t>importantíssima</w:t>
+      </w:r>
+      <w:r>
+        <w:rPr>
+          <w:rFonts w:eastAsia="Times New Roman" w:cs="Times New Roman" w:ascii="Garamond" w:hAnsi="Garamond"/>
+          <w:color w:val="000000"/>
+          <w:kern w:val="0"/>
+          <w:sz w:val="36"/>
+          <w:szCs w:val="36"/>
+          <w:shd w:fill="auto" w:val="clear"/>
+          <w:lang w:val="en-US" w:eastAsia="zh-CN" w:bidi="hi-IN"/>
+        </w:rPr>
+        <w:t xml:space="preserve"> do </w:t>
       </w:r>
       <w:r>
         <w:rPr>
@@ -1140,172 +1269,136 @@
           <w:shd w:fill="auto" w:val="clear"/>
           <w:lang w:val="en-US" w:eastAsia="zh-CN" w:bidi="hi-IN"/>
         </w:rPr>
-        <w:t xml:space="preserve"> está justamente na oração. </w:t>
-      </w:r>
-    </w:p>
-    <w:p>
-      <w:pPr>
-        <w:pStyle w:val="Normal"/>
-        <w:jc w:val="both"/>
-        <w:rPr>
-          <w:color w:val="auto"/>
-        </w:rPr>
-      </w:pPr>
-      <w:r>
-        <w:rPr>
-          <w:color w:val="auto"/>
-        </w:rPr>
-      </w:r>
-    </w:p>
-    <w:p>
-      <w:pPr>
-        <w:pStyle w:val="Normal"/>
-        <w:jc w:val="both"/>
-        <w:rPr>
-          <w:color w:val="auto"/>
-        </w:rPr>
-      </w:pPr>
-      <w:r>
-        <w:rPr>
-          <w:rFonts w:eastAsia="Times New Roman" w:cs="Times New Roman" w:ascii="Garamond" w:hAnsi="Garamond"/>
-          <w:color w:val="000000"/>
-          <w:kern w:val="0"/>
-          <w:sz w:val="36"/>
-          <w:szCs w:val="36"/>
-          <w:shd w:fill="auto" w:val="clear"/>
-          <w:lang w:val="en-US" w:eastAsia="zh-CN" w:bidi="hi-IN"/>
-        </w:rPr>
-        <w:t xml:space="preserve">E como deve ser a nossa oração? De que maneira  conseguimos efetivamente nos colocar em contato com Deus, Jesus e os planos mais altos da vida? Nossas preces sempre são ouvidas? Podemos pedir qualquer coisa? </w:t>
-      </w:r>
-    </w:p>
-    <w:p>
-      <w:pPr>
-        <w:pStyle w:val="Normal"/>
-        <w:jc w:val="both"/>
-        <w:rPr>
-          <w:color w:val="auto"/>
-        </w:rPr>
-      </w:pPr>
-      <w:r>
-        <w:rPr>
-          <w:color w:val="auto"/>
-        </w:rPr>
-      </w:r>
-    </w:p>
-    <w:p>
-      <w:pPr>
-        <w:pStyle w:val="Normal"/>
-        <w:jc w:val="both"/>
-        <w:rPr>
-          <w:color w:val="auto"/>
-        </w:rPr>
-      </w:pPr>
-      <w:r>
-        <w:rPr>
-          <w:rFonts w:eastAsia="Times New Roman" w:cs="Times New Roman" w:ascii="Garamond" w:hAnsi="Garamond"/>
-          <w:color w:val="000000"/>
-          <w:kern w:val="0"/>
-          <w:sz w:val="36"/>
-          <w:szCs w:val="36"/>
-          <w:shd w:fill="auto" w:val="clear"/>
-          <w:lang w:val="en-US" w:eastAsia="zh-CN" w:bidi="hi-IN"/>
-        </w:rPr>
-        <w:t>As respostas para essas perguntas nós encontramos em O Evangelho Segundo o Espiritismo, no capítulo XXVII, cujo título é exatamente Pedi e Obtereis.</w:t>
-      </w:r>
-    </w:p>
-    <w:p>
-      <w:pPr>
-        <w:pStyle w:val="Normal"/>
-        <w:jc w:val="both"/>
-        <w:rPr>
-          <w:color w:val="auto"/>
-        </w:rPr>
-      </w:pPr>
-      <w:r>
-        <w:rPr>
-          <w:color w:val="auto"/>
-        </w:rPr>
-      </w:r>
-    </w:p>
-    <w:p>
-      <w:pPr>
-        <w:pStyle w:val="Normal"/>
-        <w:jc w:val="both"/>
-        <w:rPr>
-          <w:color w:val="auto"/>
-        </w:rPr>
-      </w:pPr>
-      <w:r>
-        <w:rPr>
-          <w:rFonts w:eastAsia="Times New Roman" w:cs="Times New Roman" w:ascii="Garamond" w:hAnsi="Garamond"/>
-          <w:color w:val="000000"/>
-          <w:kern w:val="0"/>
-          <w:sz w:val="36"/>
-          <w:szCs w:val="36"/>
-          <w:shd w:fill="auto" w:val="clear"/>
-          <w:lang w:val="en-US" w:eastAsia="zh-CN" w:bidi="hi-IN"/>
-        </w:rPr>
-        <w:t>No início desse capítulo, Allan Kardec nos fala sobre a qualidade que a prece deve ter. E para isso ele apresenta algumas passagens evangélicas que vamos analisar aqui.</w:t>
-      </w:r>
-    </w:p>
-    <w:p>
-      <w:pPr>
-        <w:pStyle w:val="Normal"/>
-        <w:jc w:val="both"/>
-        <w:rPr>
-          <w:color w:val="auto"/>
-        </w:rPr>
-      </w:pPr>
-      <w:r>
-        <w:rPr>
-          <w:color w:val="auto"/>
-        </w:rPr>
-      </w:r>
-    </w:p>
-    <w:p>
-      <w:pPr>
-        <w:pStyle w:val="Normal"/>
-        <w:jc w:val="both"/>
-        <w:rPr>
-          <w:color w:val="auto"/>
-        </w:rPr>
-      </w:pPr>
-      <w:r>
-        <w:rPr>
-          <w:rFonts w:eastAsia="Times New Roman" w:cs="Times New Roman" w:ascii="Garamond" w:hAnsi="Garamond"/>
-          <w:color w:val="000000"/>
-          <w:kern w:val="0"/>
-          <w:sz w:val="36"/>
-          <w:szCs w:val="36"/>
-          <w:shd w:fill="auto" w:val="clear"/>
-          <w:lang w:val="en-US" w:eastAsia="zh-CN" w:bidi="hi-IN"/>
-        </w:rPr>
-        <w:t>A primeira está em Mateus 6:5-8:</w:t>
-      </w:r>
-    </w:p>
-    <w:p>
-      <w:pPr>
-        <w:pStyle w:val="Normal"/>
-        <w:jc w:val="both"/>
-        <w:rPr>
-          <w:color w:val="auto"/>
-        </w:rPr>
-      </w:pPr>
-      <w:r>
-        <w:rPr>
-          <w:color w:val="auto"/>
-        </w:rPr>
-      </w:r>
-    </w:p>
-    <w:p>
-      <w:pPr>
-        <w:pStyle w:val="Normal"/>
-        <w:ind w:left="720" w:hanging="0"/>
-        <w:jc w:val="both"/>
-        <w:rPr>
-          <w:color w:val="auto"/>
-        </w:rPr>
-      </w:pPr>
+        <w:t xml:space="preserve">. </w:t>
+      </w:r>
+    </w:p>
+    <w:p>
+      <w:pPr>
+        <w:pStyle w:val="Normal"/>
+        <w:jc w:val="both"/>
+        <w:rPr>
+          <w:color w:val="auto"/>
+        </w:rPr>
+      </w:pPr>
+      <w:r>
+        <w:rPr/>
+      </w:r>
+    </w:p>
+    <w:p>
+      <w:pPr>
+        <w:pStyle w:val="Normal"/>
+        <w:jc w:val="both"/>
+        <w:rPr>
+          <w:color w:val="auto"/>
+        </w:rPr>
+      </w:pPr>
+      <w:r>
+        <w:rPr>
+          <w:rFonts w:eastAsia="Times New Roman" w:cs="Times New Roman" w:ascii="Garamond" w:hAnsi="Garamond"/>
+          <w:color w:val="000000"/>
+          <w:kern w:val="0"/>
+          <w:sz w:val="36"/>
+          <w:szCs w:val="36"/>
+          <w:shd w:fill="auto" w:val="clear"/>
+          <w:lang w:val="en-US" w:eastAsia="zh-CN" w:bidi="hi-IN"/>
+        </w:rPr>
+        <w:t>Mas então, como</w:t>
+      </w:r>
+      <w:r>
+        <w:rPr>
+          <w:rFonts w:eastAsia="Times New Roman" w:cs="Times New Roman" w:ascii="Garamond" w:hAnsi="Garamond"/>
+          <w:color w:val="000000"/>
+          <w:kern w:val="0"/>
+          <w:sz w:val="36"/>
+          <w:szCs w:val="36"/>
+          <w:shd w:fill="auto" w:val="clear"/>
+          <w:lang w:val="en-US" w:eastAsia="zh-CN" w:bidi="hi-IN"/>
+        </w:rPr>
+        <w:t xml:space="preserve"> deve ser a nossa oração? De que maneira  conseguimos </w:t>
+      </w:r>
+      <w:r>
+        <w:rPr>
+          <w:rFonts w:eastAsia="Times New Roman" w:cs="Times New Roman" w:ascii="Garamond" w:hAnsi="Garamond"/>
+          <w:color w:val="000000"/>
+          <w:kern w:val="0"/>
+          <w:sz w:val="36"/>
+          <w:szCs w:val="36"/>
+          <w:shd w:fill="auto" w:val="clear"/>
+          <w:lang w:val="en-US" w:eastAsia="zh-CN" w:bidi="hi-IN"/>
+        </w:rPr>
+        <w:t>verdadeiramente</w:t>
+      </w:r>
+      <w:r>
+        <w:rPr>
+          <w:rFonts w:eastAsia="Times New Roman" w:cs="Times New Roman" w:ascii="Garamond" w:hAnsi="Garamond"/>
+          <w:color w:val="000000"/>
+          <w:kern w:val="0"/>
+          <w:sz w:val="36"/>
+          <w:szCs w:val="36"/>
+          <w:shd w:fill="auto" w:val="clear"/>
+          <w:lang w:val="en-US" w:eastAsia="zh-CN" w:bidi="hi-IN"/>
+        </w:rPr>
+        <w:t xml:space="preserve"> </w:t>
+      </w:r>
+      <w:r>
+        <w:rPr>
+          <w:rFonts w:eastAsia="Times New Roman" w:cs="Times New Roman" w:ascii="Garamond" w:hAnsi="Garamond"/>
+          <w:color w:val="000000"/>
+          <w:kern w:val="0"/>
+          <w:sz w:val="36"/>
+          <w:szCs w:val="36"/>
+          <w:shd w:fill="auto" w:val="clear"/>
+          <w:lang w:val="en-US" w:eastAsia="zh-CN" w:bidi="hi-IN"/>
+        </w:rPr>
+        <w:t>entrar</w:t>
+      </w:r>
+      <w:r>
+        <w:rPr>
+          <w:rFonts w:eastAsia="Times New Roman" w:cs="Times New Roman" w:ascii="Garamond" w:hAnsi="Garamond"/>
+          <w:color w:val="000000"/>
+          <w:kern w:val="0"/>
+          <w:sz w:val="36"/>
+          <w:szCs w:val="36"/>
+          <w:shd w:fill="auto" w:val="clear"/>
+          <w:lang w:val="en-US" w:eastAsia="zh-CN" w:bidi="hi-IN"/>
+        </w:rPr>
+        <w:t xml:space="preserve"> em contato com Deus, Jesus e os planos mais altos da vida? Nossas preces sempre são ouvidas? Podemos pedir qualquer coisa? </w:t>
+      </w:r>
+    </w:p>
+    <w:p>
+      <w:pPr>
+        <w:pStyle w:val="Normal"/>
+        <w:jc w:val="both"/>
+        <w:rPr>
+          <w:color w:val="auto"/>
+        </w:rPr>
+      </w:pPr>
+      <w:r>
+        <w:rPr>
+          <w:color w:val="auto"/>
+        </w:rPr>
+      </w:r>
+    </w:p>
+    <w:p>
+      <w:pPr>
+        <w:pStyle w:val="Normal"/>
+        <w:jc w:val="both"/>
+        <w:rPr>
+          <w:color w:val="auto"/>
+        </w:rPr>
+      </w:pPr>
+      <w:r>
+        <w:rPr>
+          <w:rFonts w:eastAsia="Times New Roman" w:cs="Times New Roman" w:ascii="Garamond" w:hAnsi="Garamond"/>
+          <w:color w:val="000000"/>
+          <w:kern w:val="0"/>
+          <w:sz w:val="36"/>
+          <w:szCs w:val="36"/>
+          <w:shd w:fill="auto" w:val="clear"/>
+          <w:lang w:val="en-US" w:eastAsia="zh-CN" w:bidi="hi-IN"/>
+        </w:rPr>
+        <w:t xml:space="preserve">As respostas para essas perguntas nós encontramos em </w:t>
+      </w:r>
       <w:r>
         <w:rPr>
           <w:rFonts w:eastAsia="Times New Roman" w:cs="Times New Roman" w:ascii="Garamond" w:hAnsi="Garamond"/>
@@ -1318,19 +1411,19 @@
           <w:shd w:fill="auto" w:val="clear"/>
           <w:lang w:val="en-US" w:eastAsia="zh-CN" w:bidi="hi-IN"/>
         </w:rPr>
-        <w:t>Quando orardes, não vos assemelheis aos hipócritas, que, afetadamente, oram de pé nas sinagogas e nos cantos das ruas para serem vistos pelos homens. –</w:t>
-      </w:r>
-      <w:r>
-        <w:rPr>
-          <w:rFonts w:eastAsia="Times New Roman" w:cs="Times New Roman" w:ascii="Garamond" w:hAnsi="Garamond"/>
-          <w:color w:val="000000"/>
-          <w:kern w:val="0"/>
-          <w:sz w:val="36"/>
-          <w:szCs w:val="36"/>
-          <w:shd w:fill="auto" w:val="clear"/>
-          <w:lang w:val="en-US" w:eastAsia="zh-CN" w:bidi="hi-IN"/>
-        </w:rPr>
-        <w:t xml:space="preserve"> </w:t>
+        <w:t>O Evangelho Segundo o Espiritismo</w:t>
+      </w:r>
+      <w:r>
+        <w:rPr>
+          <w:rFonts w:eastAsia="Times New Roman" w:cs="Times New Roman" w:ascii="Garamond" w:hAnsi="Garamond"/>
+          <w:color w:val="000000"/>
+          <w:kern w:val="0"/>
+          <w:sz w:val="36"/>
+          <w:szCs w:val="36"/>
+          <w:shd w:fill="auto" w:val="clear"/>
+          <w:lang w:val="en-US" w:eastAsia="zh-CN" w:bidi="hi-IN"/>
+        </w:rPr>
+        <w:t xml:space="preserve">, no capítulo XXVII, cujo título é exatamente </w:t>
       </w:r>
       <w:r>
         <w:rPr>
@@ -1344,6 +1437,146 @@
           <w:shd w:fill="auto" w:val="clear"/>
           <w:lang w:val="en-US" w:eastAsia="zh-CN" w:bidi="hi-IN"/>
         </w:rPr>
+        <w:t>Pedi e Obtereis</w:t>
+      </w:r>
+      <w:r>
+        <w:rPr>
+          <w:rFonts w:eastAsia="Times New Roman" w:cs="Times New Roman" w:ascii="Garamond" w:hAnsi="Garamond"/>
+          <w:color w:val="000000"/>
+          <w:kern w:val="0"/>
+          <w:sz w:val="36"/>
+          <w:szCs w:val="36"/>
+          <w:shd w:fill="auto" w:val="clear"/>
+          <w:lang w:val="en-US" w:eastAsia="zh-CN" w:bidi="hi-IN"/>
+        </w:rPr>
+        <w:t>.</w:t>
+      </w:r>
+    </w:p>
+    <w:p>
+      <w:pPr>
+        <w:pStyle w:val="Normal"/>
+        <w:jc w:val="both"/>
+        <w:rPr>
+          <w:color w:val="auto"/>
+        </w:rPr>
+      </w:pPr>
+      <w:r>
+        <w:rPr/>
+      </w:r>
+    </w:p>
+    <w:p>
+      <w:pPr>
+        <w:pStyle w:val="Normal"/>
+        <w:jc w:val="both"/>
+        <w:rPr>
+          <w:color w:val="auto"/>
+        </w:rPr>
+      </w:pPr>
+      <w:r>
+        <w:rPr>
+          <w:rFonts w:eastAsia="Times New Roman" w:cs="Times New Roman" w:ascii="Garamond" w:hAnsi="Garamond"/>
+          <w:color w:val="000000"/>
+          <w:kern w:val="0"/>
+          <w:sz w:val="36"/>
+          <w:szCs w:val="36"/>
+          <w:shd w:fill="auto" w:val="clear"/>
+          <w:lang w:val="en-US" w:eastAsia="zh-CN" w:bidi="hi-IN"/>
+        </w:rPr>
+        <w:t>Logo no início deste capítulo, Allan Kardec trata da qualidade que a prece deve ter e apresenta algumas passagens evangélicas que analisaremos a seguir.</w:t>
+      </w:r>
+    </w:p>
+    <w:p>
+      <w:pPr>
+        <w:pStyle w:val="Normal"/>
+        <w:jc w:val="both"/>
+        <w:rPr>
+          <w:color w:val="auto"/>
+        </w:rPr>
+      </w:pPr>
+      <w:r>
+        <w:rPr/>
+      </w:r>
+    </w:p>
+    <w:p>
+      <w:pPr>
+        <w:pStyle w:val="Normal"/>
+        <w:jc w:val="both"/>
+        <w:rPr>
+          <w:color w:val="auto"/>
+        </w:rPr>
+      </w:pPr>
+      <w:r>
+        <w:rPr>
+          <w:rFonts w:eastAsia="Times New Roman" w:cs="Times New Roman" w:ascii="Garamond" w:hAnsi="Garamond"/>
+          <w:color w:val="000000"/>
+          <w:kern w:val="0"/>
+          <w:sz w:val="36"/>
+          <w:szCs w:val="36"/>
+          <w:shd w:fill="auto" w:val="clear"/>
+          <w:lang w:val="en-US" w:eastAsia="zh-CN" w:bidi="hi-IN"/>
+        </w:rPr>
+        <w:t>A primeira está em Mateus 6:5-8:</w:t>
+      </w:r>
+    </w:p>
+    <w:p>
+      <w:pPr>
+        <w:pStyle w:val="Normal"/>
+        <w:jc w:val="both"/>
+        <w:rPr>
+          <w:color w:val="auto"/>
+        </w:rPr>
+      </w:pPr>
+      <w:r>
+        <w:rPr/>
+      </w:r>
+    </w:p>
+    <w:p>
+      <w:pPr>
+        <w:pStyle w:val="Normal"/>
+        <w:ind w:left="720" w:hanging="0"/>
+        <w:jc w:val="both"/>
+        <w:rPr>
+          <w:color w:val="auto"/>
+        </w:rPr>
+      </w:pPr>
+      <w:r>
+        <w:rPr>
+          <w:rFonts w:eastAsia="Times New Roman" w:cs="Times New Roman" w:ascii="Garamond" w:hAnsi="Garamond"/>
+          <w:i/>
+          <w:iCs/>
+          <w:color w:val="000000"/>
+          <w:kern w:val="0"/>
+          <w:sz w:val="36"/>
+          <w:szCs w:val="36"/>
+          <w:shd w:fill="auto" w:val="clear"/>
+          <w:lang w:val="en-US" w:eastAsia="zh-CN" w:bidi="hi-IN"/>
+        </w:rPr>
+        <w:t>Quando orardes, não vos assemelheis aos hipócritas, que, afetadamente, oram de pé nas sinagogas e nos cantos das ruas para serem vistos pelos homens. –</w:t>
+      </w:r>
+      <w:r>
+        <w:rPr>
+          <w:rFonts w:eastAsia="Times New Roman" w:cs="Times New Roman" w:ascii="Garamond" w:hAnsi="Garamond"/>
+          <w:color w:val="000000"/>
+          <w:kern w:val="0"/>
+          <w:sz w:val="36"/>
+          <w:szCs w:val="36"/>
+          <w:shd w:fill="auto" w:val="clear"/>
+          <w:lang w:val="en-US" w:eastAsia="zh-CN" w:bidi="hi-IN"/>
+        </w:rPr>
+        <w:t xml:space="preserve"> </w:t>
+      </w:r>
+      <w:r>
+        <w:rPr>
+          <w:rFonts w:eastAsia="Times New Roman" w:cs="Times New Roman" w:ascii="Garamond" w:hAnsi="Garamond"/>
+          <w:i/>
+          <w:iCs/>
+          <w:color w:val="000000"/>
+          <w:kern w:val="0"/>
+          <w:sz w:val="36"/>
+          <w:szCs w:val="36"/>
+          <w:shd w:fill="auto" w:val="clear"/>
+          <w:lang w:val="en-US" w:eastAsia="zh-CN" w:bidi="hi-IN"/>
+        </w:rPr>
         <w:t xml:space="preserve">Digo-vos, em verdade, que eles já receberam sua recompensa. – Quando quiserdes orar, entrai para o vosso quarto e, fechada a porta, orai a vosso Pai em secreto; e vosso Pai, que vê o que se passa em secreto, vos dará a recompensa. </w:t>
       </w:r>
     </w:p>
@@ -1357,9 +1590,7 @@
         </w:rPr>
       </w:pPr>
       <w:r>
-        <w:rPr>
-          <w:color w:val="auto"/>
-        </w:rPr>
+        <w:rPr/>
       </w:r>
     </w:p>
     <w:p>
@@ -1424,56 +1655,76 @@
           <w:shd w:fill="auto" w:val="clear"/>
           <w:lang w:val="en-US" w:eastAsia="zh-CN" w:bidi="hi-IN"/>
         </w:rPr>
-        <w:t>Quando Jesus diz que, para orarmos, devemos entrar para nosso quarto, fechar a porta e orar em secreto, Ele estava se utilizando de uma simbologia.</w:t>
-      </w:r>
-    </w:p>
-    <w:p>
-      <w:pPr>
-        <w:pStyle w:val="Normal"/>
-        <w:jc w:val="both"/>
-        <w:rPr>
-          <w:color w:val="auto"/>
-        </w:rPr>
-      </w:pPr>
-      <w:r>
-        <w:rPr>
-          <w:color w:val="auto"/>
-        </w:rPr>
-      </w:r>
-    </w:p>
-    <w:p>
-      <w:pPr>
-        <w:pStyle w:val="Normal"/>
-        <w:jc w:val="both"/>
-        <w:rPr>
-          <w:color w:val="auto"/>
-        </w:rPr>
-      </w:pPr>
-      <w:r>
-        <w:rPr>
-          <w:rFonts w:eastAsia="Times New Roman" w:cs="Times New Roman" w:ascii="Garamond" w:hAnsi="Garamond"/>
-          <w:color w:val="000000"/>
-          <w:kern w:val="0"/>
-          <w:sz w:val="36"/>
-          <w:szCs w:val="36"/>
-          <w:shd w:fill="auto" w:val="clear"/>
-          <w:lang w:val="en-US" w:eastAsia="zh-CN" w:bidi="hi-IN"/>
-        </w:rPr>
-        <w:t>Naturalmente que um ambiente silencioso e calmo favorece a oração, mas isso não significa que não podemos alcançar a paz interior quando estamos longe dos redutos de tranquilidade. Se fosse assim, nossos momentos de oração seriam muito limitados.</w:t>
-      </w:r>
-    </w:p>
-    <w:p>
-      <w:pPr>
-        <w:pStyle w:val="Normal"/>
-        <w:jc w:val="both"/>
-        <w:rPr>
-          <w:color w:val="auto"/>
-        </w:rPr>
-      </w:pPr>
-      <w:r>
-        <w:rPr>
-          <w:color w:val="auto"/>
-        </w:rPr>
+        <w:t xml:space="preserve">Quando Jesus diz que, para orarmos, devemos entrar para nosso quarto, fechar a porta e orar em secreto, Ele </w:t>
+      </w:r>
+      <w:r>
+        <w:rPr>
+          <w:rFonts w:eastAsia="Times New Roman" w:cs="Times New Roman" w:ascii="Garamond" w:hAnsi="Garamond"/>
+          <w:color w:val="000000"/>
+          <w:kern w:val="0"/>
+          <w:sz w:val="36"/>
+          <w:szCs w:val="36"/>
+          <w:shd w:fill="auto" w:val="clear"/>
+          <w:lang w:val="en-US" w:eastAsia="zh-CN" w:bidi="hi-IN"/>
+        </w:rPr>
+        <w:t>está</w:t>
+      </w:r>
+      <w:r>
+        <w:rPr>
+          <w:rFonts w:eastAsia="Times New Roman" w:cs="Times New Roman" w:ascii="Garamond" w:hAnsi="Garamond"/>
+          <w:color w:val="000000"/>
+          <w:kern w:val="0"/>
+          <w:sz w:val="36"/>
+          <w:szCs w:val="36"/>
+          <w:shd w:fill="auto" w:val="clear"/>
+          <w:lang w:val="en-US" w:eastAsia="zh-CN" w:bidi="hi-IN"/>
+        </w:rPr>
+        <w:t xml:space="preserve"> se utilizando de uma simbologia.</w:t>
+      </w:r>
+    </w:p>
+    <w:p>
+      <w:pPr>
+        <w:pStyle w:val="Normal"/>
+        <w:jc w:val="both"/>
+        <w:rPr>
+          <w:color w:val="auto"/>
+        </w:rPr>
+      </w:pPr>
+      <w:r>
+        <w:rPr/>
+      </w:r>
+    </w:p>
+    <w:p>
+      <w:pPr>
+        <w:pStyle w:val="Normal"/>
+        <w:jc w:val="both"/>
+        <w:rPr>
+          <w:color w:val="auto"/>
+        </w:rPr>
+      </w:pPr>
+      <w:r>
+        <w:rPr>
+          <w:rFonts w:eastAsia="Times New Roman" w:cs="Times New Roman" w:ascii="Garamond" w:hAnsi="Garamond"/>
+          <w:color w:val="000000"/>
+          <w:kern w:val="0"/>
+          <w:sz w:val="36"/>
+          <w:szCs w:val="36"/>
+          <w:shd w:fill="auto" w:val="clear"/>
+          <w:lang w:val="en-US" w:eastAsia="zh-CN" w:bidi="hi-IN"/>
+        </w:rPr>
+        <w:t>É claro que um ambiente silencioso e calmo favorece a oração, mas isso não significa que não possamos alcançar a paz interior mesmo longe de lugares tranquilos. Se assim fosse, nossos momentos de oração seriam muito limitados.</w:t>
+      </w:r>
+    </w:p>
+    <w:p>
+      <w:pPr>
+        <w:pStyle w:val="Normal"/>
+        <w:jc w:val="both"/>
+        <w:rPr>
+          <w:color w:val="auto"/>
+        </w:rPr>
+      </w:pPr>
+      <w:r>
+        <w:rPr/>
       </w:r>
     </w:p>
     <w:p>
@@ -1506,9 +1757,7 @@
         </w:rPr>
       </w:pPr>
       <w:r>
-        <w:rPr>
-          <w:color w:val="auto"/>
-        </w:rPr>
+        <w:rPr/>
       </w:r>
     </w:p>
     <w:p>
@@ -1541,114 +1790,133 @@
         </w:rPr>
       </w:pPr>
       <w:r>
-        <w:rPr>
-          <w:color w:val="auto"/>
-        </w:rPr>
-      </w:r>
-    </w:p>
-    <w:p>
-      <w:pPr>
-        <w:pStyle w:val="Normal"/>
-        <w:jc w:val="both"/>
-        <w:rPr>
-          <w:color w:val="auto"/>
-        </w:rPr>
-      </w:pPr>
-      <w:r>
-        <w:rPr>
-          <w:rFonts w:eastAsia="Times New Roman" w:cs="Times New Roman" w:ascii="Garamond" w:hAnsi="Garamond"/>
-          <w:color w:val="000000"/>
-          <w:kern w:val="0"/>
-          <w:sz w:val="36"/>
-          <w:szCs w:val="36"/>
-          <w:shd w:fill="auto" w:val="clear"/>
-          <w:lang w:val="en-US" w:eastAsia="zh-CN" w:bidi="hi-IN"/>
-        </w:rPr>
-        <w:t xml:space="preserve">O lugar e a hora em que me encontro são os mais adequados para a prece? Definitivamente que não. Mas vou deixar de orar por aquele amigo querido só porque não estou em um ambiente adequado à oração? De maneira alguma. </w:t>
-      </w:r>
-    </w:p>
-    <w:p>
-      <w:pPr>
-        <w:pStyle w:val="Normal"/>
-        <w:jc w:val="both"/>
-        <w:rPr>
-          <w:color w:val="auto"/>
-        </w:rPr>
-      </w:pPr>
-      <w:r>
-        <w:rPr>
-          <w:color w:val="auto"/>
-        </w:rPr>
-      </w:r>
-    </w:p>
-    <w:p>
-      <w:pPr>
-        <w:pStyle w:val="Normal"/>
-        <w:jc w:val="both"/>
-        <w:rPr>
-          <w:color w:val="auto"/>
-        </w:rPr>
-      </w:pPr>
-      <w:r>
-        <w:rPr>
-          <w:rFonts w:eastAsia="Times New Roman" w:cs="Times New Roman" w:ascii="Garamond" w:hAnsi="Garamond"/>
-          <w:color w:val="000000"/>
-          <w:kern w:val="0"/>
-          <w:sz w:val="36"/>
-          <w:szCs w:val="36"/>
-          <w:shd w:fill="auto" w:val="clear"/>
-          <w:lang w:val="en-US" w:eastAsia="zh-CN" w:bidi="hi-IN"/>
-        </w:rPr>
-        <w:t>Eu posso e devo orar ali mesmo, naquelas condições. Com algum esforço da minha parte consigo me abstrair do tumulto à minha volta e elevar a Deus, a Jesus e à Espiritualidade amiga minhas rogativas em favor do amigo acidentado.</w:t>
-      </w:r>
-    </w:p>
-    <w:p>
-      <w:pPr>
-        <w:pStyle w:val="Normal"/>
-        <w:jc w:val="both"/>
-        <w:rPr>
-          <w:color w:val="auto"/>
-        </w:rPr>
-      </w:pPr>
-      <w:r>
-        <w:rPr>
-          <w:color w:val="auto"/>
-        </w:rPr>
-      </w:r>
-    </w:p>
-    <w:p>
-      <w:pPr>
-        <w:pStyle w:val="Normal"/>
-        <w:jc w:val="both"/>
-        <w:rPr>
-          <w:color w:val="auto"/>
-        </w:rPr>
-      </w:pPr>
-      <w:r>
-        <w:rPr>
-          <w:rFonts w:eastAsia="Times New Roman" w:cs="Times New Roman" w:ascii="Garamond" w:hAnsi="Garamond"/>
-          <w:color w:val="000000"/>
-          <w:kern w:val="0"/>
-          <w:sz w:val="36"/>
-          <w:szCs w:val="36"/>
-          <w:shd w:fill="auto" w:val="clear"/>
-          <w:lang w:val="en-US" w:eastAsia="zh-CN" w:bidi="hi-IN"/>
-        </w:rPr>
-        <w:t>Mais tarde, quando eu já estiver na tranquilidade do meu lar, eu oro novamente em condições mais favoráveis, mas não devo prescindir da prece enquanto eu ainda estou no ônibus.</w:t>
-      </w:r>
-    </w:p>
-    <w:p>
-      <w:pPr>
-        <w:pStyle w:val="Normal"/>
-        <w:jc w:val="both"/>
-        <w:rPr>
-          <w:color w:val="auto"/>
-        </w:rPr>
-      </w:pPr>
-      <w:r>
-        <w:rPr>
-          <w:color w:val="auto"/>
-        </w:rPr>
+        <w:rPr/>
+      </w:r>
+    </w:p>
+    <w:p>
+      <w:pPr>
+        <w:pStyle w:val="Normal"/>
+        <w:jc w:val="both"/>
+        <w:rPr>
+          <w:color w:val="auto"/>
+        </w:rPr>
+      </w:pPr>
+      <w:r>
+        <w:rPr>
+          <w:rFonts w:eastAsia="Times New Roman" w:cs="Times New Roman" w:ascii="Garamond" w:hAnsi="Garamond"/>
+          <w:color w:val="000000"/>
+          <w:kern w:val="0"/>
+          <w:sz w:val="36"/>
+          <w:szCs w:val="36"/>
+          <w:shd w:fill="auto" w:val="clear"/>
+          <w:lang w:val="en-US" w:eastAsia="zh-CN" w:bidi="hi-IN"/>
+        </w:rPr>
+        <w:t xml:space="preserve">O lugar e a hora em que me encontro são os mais adequados para a prece? Definitivamente que não. Mas vou deixar de orar por aquele amigo só porque </w:t>
+      </w:r>
+      <w:r>
+        <w:rPr>
+          <w:rFonts w:eastAsia="Times New Roman" w:cs="Times New Roman" w:ascii="Garamond" w:hAnsi="Garamond"/>
+          <w:color w:val="000000"/>
+          <w:kern w:val="0"/>
+          <w:sz w:val="36"/>
+          <w:szCs w:val="36"/>
+          <w:shd w:fill="auto" w:val="clear"/>
+          <w:lang w:val="en-US" w:eastAsia="zh-CN" w:bidi="hi-IN"/>
+        </w:rPr>
+        <w:t>o ambiente não é favorável</w:t>
+      </w:r>
+      <w:r>
+        <w:rPr>
+          <w:rFonts w:eastAsia="Times New Roman" w:cs="Times New Roman" w:ascii="Garamond" w:hAnsi="Garamond"/>
+          <w:color w:val="000000"/>
+          <w:kern w:val="0"/>
+          <w:sz w:val="36"/>
+          <w:szCs w:val="36"/>
+          <w:shd w:fill="auto" w:val="clear"/>
+          <w:lang w:val="en-US" w:eastAsia="zh-CN" w:bidi="hi-IN"/>
+        </w:rPr>
+        <w:t xml:space="preserve">? De maneira alguma. </w:t>
+      </w:r>
+    </w:p>
+    <w:p>
+      <w:pPr>
+        <w:pStyle w:val="Normal"/>
+        <w:jc w:val="both"/>
+        <w:rPr>
+          <w:color w:val="auto"/>
+        </w:rPr>
+      </w:pPr>
+      <w:r>
+        <w:rPr/>
+      </w:r>
+      <w:r>
+        <w:br w:type="page"/>
+      </w:r>
+    </w:p>
+    <w:p>
+      <w:pPr>
+        <w:pStyle w:val="Normal"/>
+        <w:jc w:val="both"/>
+        <w:rPr>
+          <w:color w:val="auto"/>
+        </w:rPr>
+      </w:pPr>
+      <w:r>
+        <w:rPr>
+          <w:rFonts w:eastAsia="Times New Roman" w:cs="Times New Roman" w:ascii="Garamond" w:hAnsi="Garamond"/>
+          <w:color w:val="000000"/>
+          <w:kern w:val="0"/>
+          <w:sz w:val="36"/>
+          <w:szCs w:val="36"/>
+          <w:shd w:fill="auto" w:val="clear"/>
+          <w:lang w:val="en-US" w:eastAsia="zh-CN" w:bidi="hi-IN"/>
+        </w:rPr>
+        <w:t>Posso e devo orar ali mesmo, naquelas condições. Com algum esforço, consigo me abstrair do tumulto ao meu redor e elevar a Deus minhas rogativas em favor do amigo acidentado.</w:t>
+      </w:r>
+    </w:p>
+    <w:p>
+      <w:pPr>
+        <w:pStyle w:val="Normal"/>
+        <w:jc w:val="both"/>
+        <w:rPr>
+          <w:color w:val="auto"/>
+        </w:rPr>
+      </w:pPr>
+      <w:r>
+        <w:rPr/>
+      </w:r>
+    </w:p>
+    <w:p>
+      <w:pPr>
+        <w:pStyle w:val="Normal"/>
+        <w:jc w:val="both"/>
+        <w:rPr>
+          <w:color w:val="auto"/>
+        </w:rPr>
+      </w:pPr>
+      <w:r>
+        <w:rPr>
+          <w:rFonts w:eastAsia="Times New Roman" w:cs="Times New Roman" w:ascii="Garamond" w:hAnsi="Garamond"/>
+          <w:color w:val="000000"/>
+          <w:kern w:val="0"/>
+          <w:sz w:val="36"/>
+          <w:szCs w:val="36"/>
+          <w:shd w:fill="auto" w:val="clear"/>
+          <w:lang w:val="en-US" w:eastAsia="zh-CN" w:bidi="hi-IN"/>
+        </w:rPr>
+        <w:t>Mais tarde, quando já estiver na tranquilidade do meu lar, poderei orar novamente em condições  favoráveis. Mas não devo abrir mão da prece enquanto ainda estou no ônibus.</w:t>
+      </w:r>
+    </w:p>
+    <w:p>
+      <w:pPr>
+        <w:pStyle w:val="Normal"/>
+        <w:jc w:val="both"/>
+        <w:rPr>
+          <w:color w:val="auto"/>
+        </w:rPr>
+      </w:pPr>
+      <w:r>
+        <w:rPr/>
       </w:r>
     </w:p>
     <w:p>
@@ -1681,44 +1949,40 @@
         </w:rPr>
       </w:pPr>
       <w:r>
-        <w:rPr>
-          <w:color w:val="auto"/>
-        </w:rPr>
-      </w:r>
-    </w:p>
-    <w:p>
-      <w:pPr>
-        <w:pStyle w:val="Normal"/>
-        <w:jc w:val="both"/>
-        <w:rPr>
-          <w:color w:val="auto"/>
-        </w:rPr>
-      </w:pPr>
-      <w:r>
-        <w:rPr>
-          <w:rFonts w:eastAsia="Times New Roman" w:cs="Times New Roman" w:ascii="Garamond" w:hAnsi="Garamond"/>
-          <w:color w:val="000000"/>
-          <w:kern w:val="0"/>
-          <w:sz w:val="36"/>
-          <w:szCs w:val="36"/>
-          <w:shd w:fill="auto" w:val="clear"/>
-          <w:lang w:val="en-US" w:eastAsia="zh-CN" w:bidi="hi-IN"/>
-        </w:rPr>
-        <w:t xml:space="preserve">Quando tomamos consciência disso, a oração passa a ser um valioso recurso que podemos utilizar a toda hora e em qualquer lugar. </w:t>
-      </w:r>
-    </w:p>
-    <w:p>
-      <w:pPr>
-        <w:pStyle w:val="Normal"/>
-        <w:jc w:val="both"/>
-        <w:rPr>
-          <w:color w:val="auto"/>
-        </w:rPr>
-      </w:pPr>
-      <w:r>
-        <w:rPr>
-          <w:color w:val="auto"/>
-        </w:rPr>
+        <w:rPr/>
+      </w:r>
+    </w:p>
+    <w:p>
+      <w:pPr>
+        <w:pStyle w:val="Normal"/>
+        <w:jc w:val="both"/>
+        <w:rPr>
+          <w:color w:val="auto"/>
+        </w:rPr>
+      </w:pPr>
+      <w:r>
+        <w:rPr>
+          <w:rFonts w:eastAsia="Times New Roman" w:cs="Times New Roman" w:ascii="Garamond" w:hAnsi="Garamond"/>
+          <w:color w:val="000000"/>
+          <w:kern w:val="0"/>
+          <w:sz w:val="36"/>
+          <w:szCs w:val="36"/>
+          <w:shd w:fill="auto" w:val="clear"/>
+          <w:lang w:val="en-US" w:eastAsia="zh-CN" w:bidi="hi-IN"/>
+        </w:rPr>
+        <w:t xml:space="preserve">Quando tomamos consciência disso, a oração passa a ser um valioso recurso que podemos utilizar a qualquer hora e em qualquer lugar. </w:t>
+      </w:r>
+    </w:p>
+    <w:p>
+      <w:pPr>
+        <w:pStyle w:val="Normal"/>
+        <w:jc w:val="both"/>
+        <w:rPr>
+          <w:color w:val="auto"/>
+        </w:rPr>
+      </w:pPr>
+      <w:r>
+        <w:rPr/>
       </w:r>
     </w:p>
     <w:p>
@@ -1740,7 +2004,19 @@
           <w:shd w:fill="auto" w:val="clear"/>
           <w:lang w:val="en-US" w:eastAsia="zh-CN" w:bidi="hi-IN"/>
         </w:rPr>
-        <w:t>Ao nos depararmos com alguém caído na calçada sob o efeito de álcool ou drogas, em vez de lançar um olhar de condenação, vamos orar e pedir a  Deus que dê forças àquele irmão para superar seus vícios e suas dificuldades.</w:t>
+        <w:t>Então, quando virmos a</w:t>
+      </w:r>
+      <w:r>
+        <w:rPr>
+          <w:rFonts w:eastAsia="Times New Roman" w:cs="Times New Roman" w:ascii="Garamond" w:hAnsi="Garamond"/>
+          <w:color w:val="000000"/>
+          <w:kern w:val="0"/>
+          <w:sz w:val="36"/>
+          <w:szCs w:val="36"/>
+          <w:shd w:fill="auto" w:val="clear"/>
+          <w:lang w:val="en-US" w:eastAsia="zh-CN" w:bidi="hi-IN"/>
+        </w:rPr>
+        <w:t>lguém caído na calçada sob efeito de álcool ou drogas, em vez de lançar um olhar de condenação, vamos orar e pedir a  Deus que dê forças àquele irmão para superar seus vícios e suas dificuldades.</w:t>
       </w:r>
     </w:p>
     <w:p>
@@ -1776,56 +2052,166 @@
           <w:shd w:fill="auto" w:val="clear"/>
           <w:lang w:val="en-US" w:eastAsia="zh-CN" w:bidi="hi-IN"/>
         </w:rPr>
-        <w:t>Quando estivermos dirigindo e nos depararmos um acidente, também podemos orar pelas pessoas envolvidas naquela situação.</w:t>
-      </w:r>
-    </w:p>
-    <w:p>
-      <w:pPr>
-        <w:pStyle w:val="Normal"/>
-        <w:jc w:val="both"/>
-        <w:rPr>
-          <w:color w:val="auto"/>
-        </w:rPr>
-      </w:pPr>
-      <w:r>
-        <w:rPr>
-          <w:color w:val="auto"/>
-        </w:rPr>
-      </w:r>
-    </w:p>
-    <w:p>
-      <w:pPr>
-        <w:pStyle w:val="Normal"/>
-        <w:jc w:val="both"/>
-        <w:rPr>
-          <w:color w:val="auto"/>
-        </w:rPr>
-      </w:pPr>
-      <w:r>
-        <w:rPr>
-          <w:rFonts w:eastAsia="Times New Roman" w:cs="Times New Roman" w:ascii="Garamond" w:hAnsi="Garamond"/>
-          <w:color w:val="000000"/>
-          <w:kern w:val="0"/>
-          <w:sz w:val="36"/>
-          <w:szCs w:val="36"/>
-          <w:shd w:fill="auto" w:val="clear"/>
-          <w:lang w:val="en-US" w:eastAsia="zh-CN" w:bidi="hi-IN"/>
-        </w:rPr>
-        <w:t>Eu confesso que não entendo a curiosidade mórbida que muita gente tem em ver pessoas feridas ou mortas em acidentes. Já repararam que quando acontece um acidente de trânsito em uma pista, a outra pista também fica com o trânsito lento? É porque as pessoas dirigindo em sentido contrário reduzem a velocidade para ver o que aconteceu.</w:t>
-      </w:r>
-    </w:p>
-    <w:p>
-      <w:pPr>
-        <w:pStyle w:val="Normal"/>
-        <w:jc w:val="both"/>
-        <w:rPr>
-          <w:color w:val="auto"/>
-        </w:rPr>
-      </w:pPr>
-      <w:r>
-        <w:rPr>
-          <w:color w:val="auto"/>
-        </w:rPr>
+        <w:t xml:space="preserve">Quando estivermos dirigindo e </w:t>
+      </w:r>
+      <w:r>
+        <w:rPr>
+          <w:rFonts w:eastAsia="Times New Roman" w:cs="Times New Roman" w:ascii="Garamond" w:hAnsi="Garamond"/>
+          <w:color w:val="000000"/>
+          <w:kern w:val="0"/>
+          <w:sz w:val="36"/>
+          <w:szCs w:val="36"/>
+          <w:shd w:fill="auto" w:val="clear"/>
+          <w:lang w:val="en-US" w:eastAsia="zh-CN" w:bidi="hi-IN"/>
+        </w:rPr>
+        <w:t xml:space="preserve">presenciarmos </w:t>
+      </w:r>
+      <w:r>
+        <w:rPr>
+          <w:rFonts w:eastAsia="Times New Roman" w:cs="Times New Roman" w:ascii="Garamond" w:hAnsi="Garamond"/>
+          <w:color w:val="000000"/>
+          <w:kern w:val="0"/>
+          <w:sz w:val="36"/>
+          <w:szCs w:val="36"/>
+          <w:shd w:fill="auto" w:val="clear"/>
+          <w:lang w:val="en-US" w:eastAsia="zh-CN" w:bidi="hi-IN"/>
+        </w:rPr>
+        <w:t xml:space="preserve">um acidente, </w:t>
+      </w:r>
+      <w:r>
+        <w:rPr>
+          <w:rFonts w:eastAsia="Times New Roman" w:cs="Times New Roman" w:ascii="Garamond" w:hAnsi="Garamond"/>
+          <w:color w:val="000000"/>
+          <w:kern w:val="0"/>
+          <w:sz w:val="36"/>
+          <w:szCs w:val="36"/>
+          <w:shd w:fill="auto" w:val="clear"/>
+          <w:lang w:val="en-US" w:eastAsia="zh-CN" w:bidi="hi-IN"/>
+        </w:rPr>
+        <w:t>vamos</w:t>
+      </w:r>
+      <w:r>
+        <w:rPr>
+          <w:rFonts w:eastAsia="Times New Roman" w:cs="Times New Roman" w:ascii="Garamond" w:hAnsi="Garamond"/>
+          <w:color w:val="000000"/>
+          <w:kern w:val="0"/>
+          <w:sz w:val="36"/>
+          <w:szCs w:val="36"/>
+          <w:shd w:fill="auto" w:val="clear"/>
+          <w:lang w:val="en-US" w:eastAsia="zh-CN" w:bidi="hi-IN"/>
+        </w:rPr>
+        <w:t xml:space="preserve"> orar pelas pessoas envolvidas.</w:t>
+      </w:r>
+    </w:p>
+    <w:p>
+      <w:pPr>
+        <w:pStyle w:val="Normal"/>
+        <w:jc w:val="both"/>
+        <w:rPr>
+          <w:color w:val="auto"/>
+        </w:rPr>
+      </w:pPr>
+      <w:r>
+        <w:rPr/>
+      </w:r>
+    </w:p>
+    <w:p>
+      <w:pPr>
+        <w:pStyle w:val="Normal"/>
+        <w:jc w:val="both"/>
+        <w:rPr>
+          <w:color w:val="auto"/>
+        </w:rPr>
+      </w:pPr>
+      <w:r>
+        <w:rPr>
+          <w:rFonts w:eastAsia="Times New Roman" w:cs="Times New Roman" w:ascii="Garamond" w:hAnsi="Garamond"/>
+          <w:color w:val="000000"/>
+          <w:kern w:val="0"/>
+          <w:sz w:val="36"/>
+          <w:szCs w:val="36"/>
+          <w:shd w:fill="auto" w:val="clear"/>
+          <w:lang w:val="en-US" w:eastAsia="zh-CN" w:bidi="hi-IN"/>
+        </w:rPr>
+        <w:t>Confesso que não entendo a curiosidade mórbida que muitas pessoas têm de ver feridos ou mortos em acidentes. Já repararam que, quando ocorre um acidente em uma pista, o trânsito na pista contrária também fica lento? Isso acontece porque muitos motoristas reduzem a velocidade apenas para observar o que aconteceu.</w:t>
+      </w:r>
+    </w:p>
+    <w:p>
+      <w:pPr>
+        <w:pStyle w:val="Normal"/>
+        <w:jc w:val="both"/>
+        <w:rPr>
+          <w:color w:val="auto"/>
+        </w:rPr>
+      </w:pPr>
+      <w:r>
+        <w:rPr/>
+      </w:r>
+    </w:p>
+    <w:p>
+      <w:pPr>
+        <w:pStyle w:val="Normal"/>
+        <w:jc w:val="both"/>
+        <w:rPr>
+          <w:color w:val="auto"/>
+        </w:rPr>
+      </w:pPr>
+      <w:r>
+        <w:rPr>
+          <w:rFonts w:eastAsia="Times New Roman" w:cs="Times New Roman" w:ascii="Garamond" w:hAnsi="Garamond"/>
+          <w:color w:val="000000"/>
+          <w:kern w:val="0"/>
+          <w:sz w:val="36"/>
+          <w:szCs w:val="36"/>
+          <w:shd w:fill="auto" w:val="clear"/>
+          <w:lang w:val="en-US" w:eastAsia="zh-CN" w:bidi="hi-IN"/>
+        </w:rPr>
+        <w:t>Se por acaso ainda temos esse tipo de curiosidade, procuremos adotar outra postura. Em vez de querer ver o que aconteceu, elevemos um pensamento a Deus, pedindo socorro aos feridos e amparo aos que eventualmente desencarnaram, e sigamos nosso caminho.</w:t>
+      </w:r>
+    </w:p>
+    <w:p>
+      <w:pPr>
+        <w:pStyle w:val="Normal"/>
+        <w:jc w:val="both"/>
+        <w:rPr>
+          <w:color w:val="auto"/>
+        </w:rPr>
+      </w:pPr>
+      <w:r>
+        <w:rPr/>
+      </w:r>
+    </w:p>
+    <w:p>
+      <w:pPr>
+        <w:pStyle w:val="Normal"/>
+        <w:jc w:val="both"/>
+        <w:rPr>
+          <w:color w:val="auto"/>
+        </w:rPr>
+      </w:pPr>
+      <w:r>
+        <w:rPr>
+          <w:rFonts w:eastAsia="Times New Roman" w:cs="Times New Roman" w:ascii="Garamond" w:hAnsi="Garamond"/>
+          <w:color w:val="000000"/>
+          <w:kern w:val="0"/>
+          <w:sz w:val="36"/>
+          <w:szCs w:val="36"/>
+          <w:shd w:fill="auto" w:val="clear"/>
+          <w:lang w:val="en-US" w:eastAsia="zh-CN" w:bidi="hi-IN"/>
+        </w:rPr>
+        <w:t>Retornando à passagem evangélica, Jesus nos orienta a não orar como os pagãos, que acreditam que serão ouvidos pela quantidade de palavras. Ele também afirma que Deus sabe do que precisamos antes mesmo de pedirmos.</w:t>
+      </w:r>
+    </w:p>
+    <w:p>
+      <w:pPr>
+        <w:pStyle w:val="Normal"/>
+        <w:jc w:val="both"/>
+        <w:rPr>
+          <w:color w:val="auto"/>
+        </w:rPr>
+      </w:pPr>
+      <w:r>
+        <w:rPr/>
       </w:r>
       <w:r>
         <w:br w:type="page"/>
@@ -1849,304 +2235,375 @@
           <w:shd w:fill="auto" w:val="clear"/>
           <w:lang w:val="en-US" w:eastAsia="zh-CN" w:bidi="hi-IN"/>
         </w:rPr>
-        <w:t>Se por acaso ainda somos tomados por esse tipo de curiosidade, vamos adotar outra postura. Em vez de querer ver o que aconteceu, elevemos um pensamento a Deus, pedindo socorro para os feridos e amparo aos que desencarnaram e seguimos nosso caminho.</w:t>
-      </w:r>
-    </w:p>
-    <w:p>
-      <w:pPr>
-        <w:pStyle w:val="Normal"/>
-        <w:jc w:val="both"/>
-        <w:rPr>
-          <w:color w:val="auto"/>
-        </w:rPr>
-      </w:pPr>
-      <w:r>
-        <w:rPr>
-          <w:color w:val="auto"/>
-        </w:rPr>
-      </w:r>
-    </w:p>
-    <w:p>
-      <w:pPr>
-        <w:pStyle w:val="Normal"/>
-        <w:jc w:val="both"/>
-        <w:rPr>
-          <w:color w:val="auto"/>
-        </w:rPr>
-      </w:pPr>
-      <w:r>
-        <w:rPr>
-          <w:rFonts w:eastAsia="Times New Roman" w:cs="Times New Roman" w:ascii="Garamond" w:hAnsi="Garamond"/>
-          <w:color w:val="000000"/>
-          <w:kern w:val="0"/>
-          <w:sz w:val="36"/>
-          <w:szCs w:val="36"/>
-          <w:shd w:fill="auto" w:val="clear"/>
-          <w:lang w:val="en-US" w:eastAsia="zh-CN" w:bidi="hi-IN"/>
-        </w:rPr>
-        <w:t>Retornando à passagem evangélica que estamos analisando, Jesus nos diz para não orarmos como os pagãos, que pensam que é pela quantidade de palavras que suas preces serão ouvidas. O Mestre diz ainda que Deus sabe do que precisamos antes mesmo de o perdirmos.</w:t>
-      </w:r>
-    </w:p>
-    <w:p>
-      <w:pPr>
-        <w:pStyle w:val="Normal"/>
-        <w:jc w:val="both"/>
-        <w:rPr>
-          <w:color w:val="auto"/>
-        </w:rPr>
-      </w:pPr>
-      <w:r>
-        <w:rPr>
-          <w:color w:val="auto"/>
-        </w:rPr>
-      </w:r>
-    </w:p>
-    <w:p>
-      <w:pPr>
-        <w:pStyle w:val="Normal"/>
-        <w:jc w:val="both"/>
-        <w:rPr>
-          <w:color w:val="auto"/>
-        </w:rPr>
-      </w:pPr>
-      <w:r>
-        <w:rPr>
-          <w:rFonts w:eastAsia="Times New Roman" w:cs="Times New Roman" w:ascii="Garamond" w:hAnsi="Garamond"/>
-          <w:color w:val="000000"/>
-          <w:kern w:val="0"/>
-          <w:sz w:val="36"/>
-          <w:szCs w:val="36"/>
-          <w:shd w:fill="auto" w:val="clear"/>
-          <w:lang w:val="en-US" w:eastAsia="zh-CN" w:bidi="hi-IN"/>
-        </w:rPr>
-        <w:t>Quem eram os pagãos a quem Jesus se refere? Eles eram principalmente os povos gentios do mundo greco-romano que não pertenciam à tradição judaica e que seguiam religiões politeístas comuns no Império Romano.</w:t>
-      </w:r>
-    </w:p>
-    <w:p>
-      <w:pPr>
-        <w:pStyle w:val="Normal"/>
-        <w:jc w:val="both"/>
-        <w:rPr>
-          <w:color w:val="auto"/>
-        </w:rPr>
-      </w:pPr>
-      <w:r>
-        <w:rPr>
-          <w:color w:val="auto"/>
-        </w:rPr>
-      </w:r>
-    </w:p>
-    <w:p>
-      <w:pPr>
-        <w:pStyle w:val="Normal"/>
-        <w:jc w:val="both"/>
-        <w:rPr>
-          <w:color w:val="auto"/>
-        </w:rPr>
-      </w:pPr>
-      <w:r>
-        <w:rPr>
-          <w:rFonts w:eastAsia="Times New Roman" w:cs="Times New Roman" w:ascii="Garamond" w:hAnsi="Garamond"/>
-          <w:color w:val="000000"/>
-          <w:kern w:val="0"/>
-          <w:sz w:val="36"/>
-          <w:szCs w:val="36"/>
-          <w:shd w:fill="auto" w:val="clear"/>
-          <w:lang w:val="en-US" w:eastAsia="zh-CN" w:bidi="hi-IN"/>
-        </w:rPr>
-        <w:t>Nessas práticas religiosas, era frequente a repetição longa de fórmulas e invocações, porque muitos acreditavam que o poder da oração estava na quantidade ou na exatidão em que as palavras eram pronunciadas.</w:t>
-      </w:r>
-    </w:p>
-    <w:p>
-      <w:pPr>
-        <w:pStyle w:val="Normal"/>
-        <w:jc w:val="both"/>
-        <w:rPr>
-          <w:color w:val="auto"/>
-        </w:rPr>
-      </w:pPr>
-      <w:r>
-        <w:rPr>
-          <w:color w:val="auto"/>
-        </w:rPr>
-      </w:r>
-    </w:p>
-    <w:p>
-      <w:pPr>
-        <w:pStyle w:val="Normal"/>
-        <w:jc w:val="both"/>
-        <w:rPr>
-          <w:color w:val="auto"/>
-        </w:rPr>
-      </w:pPr>
-      <w:r>
-        <w:rPr>
-          <w:rFonts w:eastAsia="Times New Roman" w:cs="Times New Roman" w:ascii="Garamond" w:hAnsi="Garamond"/>
-          <w:color w:val="000000"/>
-          <w:kern w:val="0"/>
-          <w:sz w:val="36"/>
-          <w:szCs w:val="36"/>
-          <w:shd w:fill="auto" w:val="clear"/>
-          <w:lang w:val="en-US" w:eastAsia="zh-CN" w:bidi="hi-IN"/>
-        </w:rPr>
-        <w:t>Ao fazer essa advertência, Jesus não condena a perseverança na prece; Ele critica o caráter mágico e mecânico que aquelas pessoas davam à oração.</w:t>
-      </w:r>
-    </w:p>
-    <w:p>
-      <w:pPr>
-        <w:pStyle w:val="Normal"/>
-        <w:jc w:val="both"/>
-        <w:rPr>
-          <w:color w:val="auto"/>
-        </w:rPr>
-      </w:pPr>
-      <w:r>
-        <w:rPr>
-          <w:color w:val="auto"/>
-        </w:rPr>
-      </w:r>
-    </w:p>
-    <w:p>
-      <w:pPr>
-        <w:pStyle w:val="Normal"/>
-        <w:jc w:val="both"/>
-        <w:rPr>
-          <w:color w:val="auto"/>
-        </w:rPr>
-      </w:pPr>
-      <w:r>
-        <w:rPr>
-          <w:rFonts w:eastAsia="Times New Roman" w:cs="Times New Roman" w:ascii="Garamond" w:hAnsi="Garamond"/>
-          <w:color w:val="000000"/>
-          <w:kern w:val="0"/>
-          <w:sz w:val="36"/>
-          <w:szCs w:val="36"/>
-          <w:shd w:fill="auto" w:val="clear"/>
-          <w:lang w:val="en-US" w:eastAsia="zh-CN" w:bidi="hi-IN"/>
-        </w:rPr>
-        <w:t xml:space="preserve">Jesus também nos recorda que Deus sabe do que necessitamos antes mesmo de pedirmos. Portanto, a oração não deve ser utilizada como um instrumento de pressão sobre Deus, mas como recurso de transformação interior. </w:t>
-      </w:r>
-    </w:p>
-    <w:p>
-      <w:pPr>
-        <w:pStyle w:val="Normal"/>
-        <w:jc w:val="both"/>
-        <w:rPr>
-          <w:color w:val="auto"/>
-        </w:rPr>
-      </w:pPr>
-      <w:r>
-        <w:rPr>
-          <w:color w:val="auto"/>
-        </w:rPr>
-      </w:r>
-    </w:p>
-    <w:p>
-      <w:pPr>
-        <w:pStyle w:val="Normal"/>
-        <w:jc w:val="both"/>
-        <w:rPr>
-          <w:color w:val="auto"/>
-        </w:rPr>
-      </w:pPr>
-      <w:r>
-        <w:rPr>
-          <w:rFonts w:eastAsia="Times New Roman" w:cs="Times New Roman" w:ascii="Garamond" w:hAnsi="Garamond"/>
-          <w:color w:val="000000"/>
-          <w:kern w:val="0"/>
-          <w:sz w:val="36"/>
-          <w:szCs w:val="36"/>
-          <w:shd w:fill="auto" w:val="clear"/>
-          <w:lang w:val="en-US" w:eastAsia="zh-CN" w:bidi="hi-IN"/>
-        </w:rPr>
-        <w:t>É um convite para substituirmos o automatismo pela sinceridade, a quantidade pela qualidade e a palavra vazia pelo sentimento verdadeiro.</w:t>
-      </w:r>
-    </w:p>
-    <w:p>
-      <w:pPr>
-        <w:pStyle w:val="Normal"/>
-        <w:jc w:val="both"/>
-        <w:rPr>
-          <w:color w:val="auto"/>
-        </w:rPr>
-      </w:pPr>
-      <w:r>
-        <w:rPr>
-          <w:color w:val="auto"/>
-        </w:rPr>
-      </w:r>
-    </w:p>
-    <w:p>
-      <w:pPr>
-        <w:pStyle w:val="Normal"/>
-        <w:jc w:val="both"/>
-        <w:rPr>
-          <w:color w:val="auto"/>
-        </w:rPr>
-      </w:pPr>
-      <w:r>
-        <w:rPr>
-          <w:rFonts w:eastAsia="Times New Roman" w:cs="Times New Roman" w:ascii="Garamond" w:hAnsi="Garamond"/>
-          <w:color w:val="000000"/>
-          <w:kern w:val="0"/>
-          <w:sz w:val="36"/>
-          <w:szCs w:val="36"/>
-          <w:shd w:fill="auto" w:val="clear"/>
-          <w:lang w:val="en-US" w:eastAsia="zh-CN" w:bidi="hi-IN"/>
-        </w:rPr>
-        <w:t>A bem da verdade, para Deus e Jesus nem mesmo as palavras que utilizamos em nossas preces são importantes. Embora o Pai Nosso e a Ave Maria sejam orações de uma riqueza e beleza profundas, podemos orar utilizando nossas próprias palavras.</w:t>
-      </w:r>
-    </w:p>
-    <w:p>
-      <w:pPr>
-        <w:pStyle w:val="Normal"/>
-        <w:jc w:val="both"/>
-        <w:rPr>
-          <w:color w:val="auto"/>
-        </w:rPr>
-      </w:pPr>
-      <w:r>
-        <w:rPr>
-          <w:color w:val="auto"/>
-        </w:rPr>
-      </w:r>
-    </w:p>
-    <w:p>
-      <w:pPr>
-        <w:pStyle w:val="Normal"/>
-        <w:jc w:val="both"/>
-        <w:rPr>
-          <w:color w:val="auto"/>
-        </w:rPr>
-      </w:pPr>
-      <w:r>
-        <w:rPr>
-          <w:rFonts w:eastAsia="Times New Roman" w:cs="Times New Roman" w:ascii="Garamond" w:hAnsi="Garamond"/>
-          <w:color w:val="000000"/>
-          <w:kern w:val="0"/>
-          <w:sz w:val="36"/>
-          <w:szCs w:val="36"/>
-          <w:shd w:fill="auto" w:val="clear"/>
-          <w:lang w:val="en-US" w:eastAsia="zh-CN" w:bidi="hi-IN"/>
-        </w:rPr>
-        <w:t>O que realmente importa é que nossas preces carreguem consigo humildade, sinceridade e fé. As palavras que utilizamos para nos expressarmos dessa forma, pouco importam.</w:t>
-      </w:r>
-    </w:p>
-    <w:p>
-      <w:pPr>
-        <w:pStyle w:val="Normal"/>
-        <w:jc w:val="both"/>
-        <w:rPr>
-          <w:color w:val="auto"/>
-        </w:rPr>
-      </w:pPr>
-      <w:r>
-        <w:rPr>
-          <w:color w:val="auto"/>
-        </w:rPr>
-      </w:r>
-      <w:r>
-        <w:br w:type="page"/>
+        <w:t>Quem eram os pagãos? Eles eram principalmente os povos gentios do mundo greco-romano que não pertenciam à tradição judaica e que seguiam religiões politeístas comuns no Império Romano.</w:t>
+      </w:r>
+    </w:p>
+    <w:p>
+      <w:pPr>
+        <w:pStyle w:val="Normal"/>
+        <w:jc w:val="both"/>
+        <w:rPr>
+          <w:color w:val="auto"/>
+        </w:rPr>
+      </w:pPr>
+      <w:r>
+        <w:rPr/>
+      </w:r>
+    </w:p>
+    <w:p>
+      <w:pPr>
+        <w:pStyle w:val="Normal"/>
+        <w:jc w:val="both"/>
+        <w:rPr>
+          <w:color w:val="auto"/>
+        </w:rPr>
+      </w:pPr>
+      <w:r>
+        <w:rPr>
+          <w:rFonts w:eastAsia="Times New Roman" w:cs="Times New Roman" w:ascii="Garamond" w:hAnsi="Garamond"/>
+          <w:color w:val="000000"/>
+          <w:kern w:val="0"/>
+          <w:sz w:val="36"/>
+          <w:szCs w:val="36"/>
+          <w:shd w:fill="auto" w:val="clear"/>
+          <w:lang w:val="en-US" w:eastAsia="zh-CN" w:bidi="hi-IN"/>
+        </w:rPr>
+        <w:t>Nas práticas religiosas desses povos, era comum a repetição prolongada de fórmulas e invocações, pois muitos acreditavam que o poder da oração estava na quantidade ou na precisão com que as palavras eram pronunciadas.</w:t>
+      </w:r>
+    </w:p>
+    <w:p>
+      <w:pPr>
+        <w:pStyle w:val="Normal"/>
+        <w:jc w:val="both"/>
+        <w:rPr>
+          <w:color w:val="auto"/>
+        </w:rPr>
+      </w:pPr>
+      <w:r>
+        <w:rPr/>
+      </w:r>
+    </w:p>
+    <w:p>
+      <w:pPr>
+        <w:pStyle w:val="Normal"/>
+        <w:jc w:val="both"/>
+        <w:rPr>
+          <w:color w:val="auto"/>
+        </w:rPr>
+      </w:pPr>
+      <w:r>
+        <w:rPr>
+          <w:rFonts w:eastAsia="Times New Roman" w:cs="Times New Roman" w:ascii="Garamond" w:hAnsi="Garamond"/>
+          <w:color w:val="000000"/>
+          <w:kern w:val="0"/>
+          <w:sz w:val="36"/>
+          <w:szCs w:val="36"/>
+          <w:shd w:fill="auto" w:val="clear"/>
+          <w:lang w:val="en-US" w:eastAsia="zh-CN" w:bidi="hi-IN"/>
+        </w:rPr>
+        <w:t xml:space="preserve">Ao fazer essa advertência, Jesus não condena a perseverança na prece; </w:t>
+      </w:r>
+      <w:r>
+        <w:rPr>
+          <w:rFonts w:eastAsia="Times New Roman" w:cs="Times New Roman" w:ascii="Garamond" w:hAnsi="Garamond"/>
+          <w:color w:val="000000"/>
+          <w:kern w:val="0"/>
+          <w:sz w:val="36"/>
+          <w:szCs w:val="36"/>
+          <w:shd w:fill="auto" w:val="clear"/>
+          <w:lang w:val="en-US" w:eastAsia="zh-CN" w:bidi="hi-IN"/>
+        </w:rPr>
+        <w:t>E</w:t>
+      </w:r>
+      <w:r>
+        <w:rPr>
+          <w:rFonts w:eastAsia="Times New Roman" w:cs="Times New Roman" w:ascii="Garamond" w:hAnsi="Garamond"/>
+          <w:color w:val="000000"/>
+          <w:kern w:val="0"/>
+          <w:sz w:val="36"/>
+          <w:szCs w:val="36"/>
+          <w:shd w:fill="auto" w:val="clear"/>
+          <w:lang w:val="en-US" w:eastAsia="zh-CN" w:bidi="hi-IN"/>
+        </w:rPr>
+        <w:t>le critica o caráter mecânico e quase mágico que aquelas pessoas atribuíam à oração.</w:t>
+      </w:r>
+    </w:p>
+    <w:p>
+      <w:pPr>
+        <w:pStyle w:val="Normal"/>
+        <w:jc w:val="both"/>
+        <w:rPr>
+          <w:color w:val="auto"/>
+        </w:rPr>
+      </w:pPr>
+      <w:r>
+        <w:rPr/>
+      </w:r>
+    </w:p>
+    <w:p>
+      <w:pPr>
+        <w:pStyle w:val="Normal"/>
+        <w:jc w:val="both"/>
+        <w:rPr>
+          <w:color w:val="auto"/>
+        </w:rPr>
+      </w:pPr>
+      <w:r>
+        <w:rPr>
+          <w:rFonts w:eastAsia="Times New Roman" w:cs="Times New Roman" w:ascii="Garamond" w:hAnsi="Garamond"/>
+          <w:color w:val="000000"/>
+          <w:kern w:val="0"/>
+          <w:sz w:val="36"/>
+          <w:szCs w:val="36"/>
+          <w:shd w:fill="auto" w:val="clear"/>
+          <w:lang w:val="en-US" w:eastAsia="zh-CN" w:bidi="hi-IN"/>
+        </w:rPr>
+        <w:t xml:space="preserve">Jesus também nos recorda que Deus sabe do que necessitamos antes mesmo de pedirmos. Portanto, a oração não deve ser usada como um instrumento de pressão sobre Deus, mas como um recurso de transformação interior. </w:t>
+      </w:r>
+    </w:p>
+    <w:p>
+      <w:pPr>
+        <w:pStyle w:val="Normal"/>
+        <w:jc w:val="both"/>
+        <w:rPr>
+          <w:color w:val="auto"/>
+        </w:rPr>
+      </w:pPr>
+      <w:r>
+        <w:rPr/>
+      </w:r>
+    </w:p>
+    <w:p>
+      <w:pPr>
+        <w:pStyle w:val="Normal"/>
+        <w:jc w:val="both"/>
+        <w:rPr>
+          <w:color w:val="auto"/>
+        </w:rPr>
+      </w:pPr>
+      <w:r>
+        <w:rPr>
+          <w:rFonts w:eastAsia="Times New Roman" w:cs="Times New Roman" w:ascii="Garamond" w:hAnsi="Garamond"/>
+          <w:color w:val="000000"/>
+          <w:kern w:val="0"/>
+          <w:sz w:val="36"/>
+          <w:szCs w:val="36"/>
+          <w:shd w:fill="auto" w:val="clear"/>
+          <w:lang w:val="en-US" w:eastAsia="zh-CN" w:bidi="hi-IN"/>
+        </w:rPr>
+        <w:t>É um convite para substituirmos o automatismo pela sinceridade, a quantidade pela qualidade e as palavras vazias pelo sentimento verdadeiro.</w:t>
+      </w:r>
+    </w:p>
+    <w:p>
+      <w:pPr>
+        <w:pStyle w:val="Normal"/>
+        <w:jc w:val="both"/>
+        <w:rPr>
+          <w:color w:val="auto"/>
+        </w:rPr>
+      </w:pPr>
+      <w:r>
+        <w:rPr>
+          <w:color w:val="auto"/>
+        </w:rPr>
+      </w:r>
+    </w:p>
+    <w:p>
+      <w:pPr>
+        <w:pStyle w:val="Normal"/>
+        <w:jc w:val="both"/>
+        <w:rPr>
+          <w:color w:val="auto"/>
+        </w:rPr>
+      </w:pPr>
+      <w:r>
+        <w:rPr>
+          <w:rFonts w:eastAsia="Times New Roman" w:cs="Times New Roman" w:ascii="Garamond" w:hAnsi="Garamond"/>
+          <w:color w:val="000000"/>
+          <w:kern w:val="0"/>
+          <w:sz w:val="36"/>
+          <w:szCs w:val="36"/>
+          <w:shd w:fill="auto" w:val="clear"/>
+          <w:lang w:val="en-US" w:eastAsia="zh-CN" w:bidi="hi-IN"/>
+        </w:rPr>
+        <w:t>A verdade</w:t>
+      </w:r>
+      <w:r>
+        <w:rPr>
+          <w:rFonts w:eastAsia="Times New Roman" w:cs="Times New Roman" w:ascii="Garamond" w:hAnsi="Garamond"/>
+          <w:color w:val="000000"/>
+          <w:kern w:val="0"/>
+          <w:sz w:val="36"/>
+          <w:szCs w:val="36"/>
+          <w:shd w:fill="auto" w:val="clear"/>
+          <w:lang w:val="en-US" w:eastAsia="zh-CN" w:bidi="hi-IN"/>
+        </w:rPr>
+        <w:t xml:space="preserve"> é que</w:t>
+      </w:r>
+      <w:r>
+        <w:rPr>
+          <w:rFonts w:eastAsia="Times New Roman" w:cs="Times New Roman" w:ascii="Garamond" w:hAnsi="Garamond"/>
+          <w:color w:val="000000"/>
+          <w:kern w:val="0"/>
+          <w:sz w:val="36"/>
+          <w:szCs w:val="36"/>
+          <w:shd w:fill="auto" w:val="clear"/>
+          <w:lang w:val="en-US" w:eastAsia="zh-CN" w:bidi="hi-IN"/>
+        </w:rPr>
+        <w:t>, para Deus e Jesus</w:t>
+      </w:r>
+      <w:r>
+        <w:rPr>
+          <w:rFonts w:eastAsia="Times New Roman" w:cs="Times New Roman" w:ascii="Garamond" w:hAnsi="Garamond"/>
+          <w:color w:val="000000"/>
+          <w:kern w:val="0"/>
+          <w:sz w:val="36"/>
+          <w:szCs w:val="36"/>
+          <w:shd w:fill="auto" w:val="clear"/>
+          <w:lang w:val="en-US" w:eastAsia="zh-CN" w:bidi="hi-IN"/>
+        </w:rPr>
+        <w:t xml:space="preserve"> as palavas que usamos em nossas preces pouco importam.</w:t>
+      </w:r>
+      <w:r>
+        <w:rPr>
+          <w:rFonts w:eastAsia="Times New Roman" w:cs="Times New Roman" w:ascii="Garamond" w:hAnsi="Garamond"/>
+          <w:color w:val="000000"/>
+          <w:kern w:val="0"/>
+          <w:sz w:val="36"/>
+          <w:szCs w:val="36"/>
+          <w:shd w:fill="auto" w:val="clear"/>
+          <w:lang w:val="en-US" w:eastAsia="zh-CN" w:bidi="hi-IN"/>
+        </w:rPr>
+        <w:t xml:space="preserve"> Embora o Pai-Nosso e a Ave-Maria sejam orações </w:t>
+      </w:r>
+      <w:r>
+        <w:rPr>
+          <w:rFonts w:eastAsia="Times New Roman" w:cs="Times New Roman" w:ascii="Garamond" w:hAnsi="Garamond"/>
+          <w:color w:val="000000"/>
+          <w:kern w:val="0"/>
+          <w:sz w:val="36"/>
+          <w:szCs w:val="36"/>
+          <w:shd w:fill="auto" w:val="clear"/>
+          <w:lang w:val="en-US" w:eastAsia="zh-CN" w:bidi="hi-IN"/>
+        </w:rPr>
+        <w:t>belas e de significado profundo</w:t>
+      </w:r>
+      <w:r>
+        <w:rPr>
+          <w:rFonts w:eastAsia="Times New Roman" w:cs="Times New Roman" w:ascii="Garamond" w:hAnsi="Garamond"/>
+          <w:color w:val="000000"/>
+          <w:kern w:val="0"/>
+          <w:sz w:val="36"/>
+          <w:szCs w:val="36"/>
+          <w:shd w:fill="auto" w:val="clear"/>
+          <w:lang w:val="en-US" w:eastAsia="zh-CN" w:bidi="hi-IN"/>
+        </w:rPr>
+        <w:t>, podemos orar com nossas próprias palavras.</w:t>
+      </w:r>
+    </w:p>
+    <w:p>
+      <w:pPr>
+        <w:pStyle w:val="Normal"/>
+        <w:jc w:val="both"/>
+        <w:rPr>
+          <w:color w:val="auto"/>
+        </w:rPr>
+      </w:pPr>
+      <w:r>
+        <w:rPr/>
+      </w:r>
+    </w:p>
+    <w:p>
+      <w:pPr>
+        <w:pStyle w:val="Normal"/>
+        <w:jc w:val="both"/>
+        <w:rPr>
+          <w:color w:val="auto"/>
+        </w:rPr>
+      </w:pPr>
+      <w:r>
+        <w:rPr>
+          <w:rFonts w:eastAsia="Times New Roman" w:cs="Times New Roman" w:ascii="Garamond" w:hAnsi="Garamond"/>
+          <w:color w:val="000000"/>
+          <w:kern w:val="0"/>
+          <w:sz w:val="36"/>
+          <w:szCs w:val="36"/>
+          <w:shd w:fill="auto" w:val="clear"/>
+          <w:lang w:val="en-US" w:eastAsia="zh-CN" w:bidi="hi-IN"/>
+        </w:rPr>
+        <w:t xml:space="preserve">O </w:t>
+      </w:r>
+      <w:r>
+        <w:rPr>
+          <w:rFonts w:eastAsia="Times New Roman" w:cs="Times New Roman" w:ascii="Garamond" w:hAnsi="Garamond"/>
+          <w:color w:val="000000"/>
+          <w:kern w:val="0"/>
+          <w:sz w:val="36"/>
+          <w:szCs w:val="36"/>
+          <w:shd w:fill="auto" w:val="clear"/>
+          <w:lang w:val="en-US" w:eastAsia="zh-CN" w:bidi="hi-IN"/>
+        </w:rPr>
+        <w:t>importante</w:t>
+      </w:r>
+      <w:r>
+        <w:rPr>
+          <w:rFonts w:eastAsia="Times New Roman" w:cs="Times New Roman" w:ascii="Garamond" w:hAnsi="Garamond"/>
+          <w:color w:val="000000"/>
+          <w:kern w:val="0"/>
+          <w:sz w:val="36"/>
+          <w:szCs w:val="36"/>
+          <w:shd w:fill="auto" w:val="clear"/>
+          <w:lang w:val="en-US" w:eastAsia="zh-CN" w:bidi="hi-IN"/>
+        </w:rPr>
+        <w:t xml:space="preserve"> é que nossas preces carreguem consigo humildade, sinceridade e fé. </w:t>
+      </w:r>
+      <w:r>
+        <w:rPr>
+          <w:rFonts w:eastAsia="Times New Roman" w:cs="Times New Roman" w:ascii="Garamond" w:hAnsi="Garamond"/>
+          <w:color w:val="000000"/>
+          <w:kern w:val="0"/>
+          <w:sz w:val="36"/>
+          <w:szCs w:val="36"/>
+          <w:shd w:fill="auto" w:val="clear"/>
+          <w:lang w:val="en-US" w:eastAsia="zh-CN" w:bidi="hi-IN"/>
+        </w:rPr>
+        <w:t>Não faz diferença quais</w:t>
+      </w:r>
+      <w:r>
+        <w:rPr>
+          <w:rFonts w:eastAsia="Times New Roman" w:cs="Times New Roman" w:ascii="Garamond" w:hAnsi="Garamond"/>
+          <w:color w:val="000000"/>
+          <w:kern w:val="0"/>
+          <w:sz w:val="36"/>
+          <w:szCs w:val="36"/>
+          <w:shd w:fill="auto" w:val="clear"/>
+          <w:lang w:val="en-US" w:eastAsia="zh-CN" w:bidi="hi-IN"/>
+        </w:rPr>
+        <w:t xml:space="preserve"> palavras utilizamos para nos expressarmos dessa forma</w:t>
+      </w:r>
+      <w:r>
+        <w:rPr>
+          <w:rFonts w:eastAsia="Times New Roman" w:cs="Times New Roman" w:ascii="Garamond" w:hAnsi="Garamond"/>
+          <w:color w:val="000000"/>
+          <w:kern w:val="0"/>
+          <w:sz w:val="36"/>
+          <w:szCs w:val="36"/>
+          <w:shd w:fill="auto" w:val="clear"/>
+          <w:lang w:val="en-US" w:eastAsia="zh-CN" w:bidi="hi-IN"/>
+        </w:rPr>
+        <w:t>.</w:t>
+      </w:r>
+    </w:p>
+    <w:p>
+      <w:pPr>
+        <w:pStyle w:val="Normal"/>
+        <w:jc w:val="both"/>
+        <w:rPr>
+          <w:color w:val="auto"/>
+        </w:rPr>
+      </w:pPr>
+      <w:r>
+        <w:rPr/>
       </w:r>
     </w:p>
     <w:p>
@@ -2179,65 +2636,145 @@
         </w:rPr>
       </w:pPr>
       <w:r>
-        <w:rPr>
-          <w:color w:val="auto"/>
-        </w:rPr>
-      </w:r>
-    </w:p>
-    <w:p>
-      <w:pPr>
-        <w:pStyle w:val="Normal"/>
-        <w:jc w:val="both"/>
-        <w:rPr>
-          <w:color w:val="auto"/>
-        </w:rPr>
-      </w:pPr>
-      <w:r>
-        <w:rPr>
-          <w:rFonts w:eastAsia="Times New Roman" w:cs="Times New Roman" w:ascii="Garamond" w:hAnsi="Garamond"/>
-          <w:color w:val="000000"/>
-          <w:kern w:val="0"/>
-          <w:sz w:val="36"/>
-          <w:szCs w:val="36"/>
-          <w:shd w:fill="auto" w:val="clear"/>
-          <w:lang w:val="en-US" w:eastAsia="zh-CN" w:bidi="hi-IN"/>
-        </w:rPr>
-        <w:t>Pelo pensamento o Espírito vai aos lugares que lhe agradam e aos quais ele tenha acesso; pelo pensamento ele cria formas, se comunica com outros Espíritos e também se vincula àqueles que vibram na mesma faixa que ele.</w:t>
-      </w:r>
-    </w:p>
-    <w:p>
-      <w:pPr>
-        <w:pStyle w:val="Normal"/>
-        <w:jc w:val="both"/>
-        <w:rPr>
-          <w:color w:val="auto"/>
-        </w:rPr>
-      </w:pPr>
-      <w:r>
-        <w:rPr>
-          <w:color w:val="auto"/>
-        </w:rPr>
-      </w:r>
-    </w:p>
-    <w:p>
-      <w:pPr>
-        <w:pStyle w:val="Normal"/>
-        <w:jc w:val="both"/>
-        <w:rPr>
-          <w:color w:val="auto"/>
-        </w:rPr>
-      </w:pPr>
-      <w:r>
-        <w:rPr>
-          <w:rFonts w:eastAsia="Times New Roman" w:cs="Times New Roman" w:ascii="Garamond" w:hAnsi="Garamond"/>
-          <w:color w:val="000000"/>
-          <w:kern w:val="0"/>
-          <w:sz w:val="36"/>
-          <w:szCs w:val="36"/>
-          <w:shd w:fill="auto" w:val="clear"/>
-          <w:lang w:val="en-US" w:eastAsia="zh-CN" w:bidi="hi-IN"/>
-        </w:rPr>
-        <w:t xml:space="preserve">Mas qual é, afinal, a influência do pensamento na oração? Para entendermos isso, precisamos lembrar que tudo o que existe — seja material, seja imaterial — está envolvido por aquilo que chamamos de fluido cósmico universal. </w:t>
+        <w:rPr/>
+      </w:r>
+    </w:p>
+    <w:p>
+      <w:pPr>
+        <w:pStyle w:val="Normal"/>
+        <w:jc w:val="both"/>
+        <w:rPr>
+          <w:color w:val="auto"/>
+        </w:rPr>
+      </w:pPr>
+      <w:r>
+        <w:rPr>
+          <w:rFonts w:eastAsia="Times New Roman" w:cs="Times New Roman" w:ascii="Garamond" w:hAnsi="Garamond"/>
+          <w:color w:val="000000"/>
+          <w:kern w:val="0"/>
+          <w:sz w:val="36"/>
+          <w:szCs w:val="36"/>
+          <w:shd w:fill="auto" w:val="clear"/>
+          <w:lang w:val="en-US" w:eastAsia="zh-CN" w:bidi="hi-IN"/>
+        </w:rPr>
+        <w:t xml:space="preserve">Pelo pensamento o Espírito vai aos lugares que lhe agradam e aos quais ele tenha acesso; pelo pensamento ele cria formas, se comunica com outros Espíritos e também se vincula àqueles que </w:t>
+      </w:r>
+      <w:r>
+        <w:rPr>
+          <w:rFonts w:eastAsia="Times New Roman" w:cs="Times New Roman" w:ascii="Garamond" w:hAnsi="Garamond"/>
+          <w:color w:val="000000"/>
+          <w:kern w:val="0"/>
+          <w:sz w:val="36"/>
+          <w:szCs w:val="36"/>
+          <w:shd w:fill="auto" w:val="clear"/>
+          <w:lang w:val="en-US" w:eastAsia="zh-CN" w:bidi="hi-IN"/>
+        </w:rPr>
+        <w:t>se encontram na mesma faixa vibratória</w:t>
+      </w:r>
+      <w:r>
+        <w:rPr>
+          <w:rFonts w:eastAsia="Times New Roman" w:cs="Times New Roman" w:ascii="Garamond" w:hAnsi="Garamond"/>
+          <w:color w:val="000000"/>
+          <w:kern w:val="0"/>
+          <w:sz w:val="36"/>
+          <w:szCs w:val="36"/>
+          <w:shd w:fill="auto" w:val="clear"/>
+          <w:lang w:val="en-US" w:eastAsia="zh-CN" w:bidi="hi-IN"/>
+        </w:rPr>
+        <w:t xml:space="preserve"> que ele.</w:t>
+      </w:r>
+    </w:p>
+    <w:p>
+      <w:pPr>
+        <w:pStyle w:val="Normal"/>
+        <w:jc w:val="both"/>
+        <w:rPr>
+          <w:color w:val="auto"/>
+        </w:rPr>
+      </w:pPr>
+      <w:r>
+        <w:rPr/>
+      </w:r>
+    </w:p>
+    <w:p>
+      <w:pPr>
+        <w:pStyle w:val="Normal"/>
+        <w:jc w:val="both"/>
+        <w:rPr>
+          <w:color w:val="auto"/>
+        </w:rPr>
+      </w:pPr>
+      <w:r>
+        <w:rPr>
+          <w:rFonts w:eastAsia="Times New Roman" w:cs="Times New Roman" w:ascii="Garamond" w:hAnsi="Garamond"/>
+          <w:color w:val="000000"/>
+          <w:kern w:val="0"/>
+          <w:sz w:val="36"/>
+          <w:szCs w:val="36"/>
+          <w:shd w:fill="auto" w:val="clear"/>
+          <w:lang w:val="en-US" w:eastAsia="zh-CN" w:bidi="hi-IN"/>
+        </w:rPr>
+        <w:t xml:space="preserve">E qual é </w:t>
+      </w:r>
+      <w:r>
+        <w:rPr>
+          <w:rFonts w:eastAsia="Times New Roman" w:cs="Times New Roman" w:ascii="Garamond" w:hAnsi="Garamond"/>
+          <w:color w:val="000000"/>
+          <w:kern w:val="0"/>
+          <w:sz w:val="36"/>
+          <w:szCs w:val="36"/>
+          <w:shd w:fill="auto" w:val="clear"/>
+          <w:lang w:val="en-US" w:eastAsia="zh-CN" w:bidi="hi-IN"/>
+        </w:rPr>
+        <w:t xml:space="preserve">a influência do pensamento na oração? </w:t>
+      </w:r>
+      <w:r>
+        <w:rPr>
+          <w:rFonts w:eastAsia="Times New Roman" w:cs="Times New Roman" w:ascii="Garamond" w:hAnsi="Garamond"/>
+          <w:color w:val="000000"/>
+          <w:kern w:val="0"/>
+          <w:sz w:val="36"/>
+          <w:szCs w:val="36"/>
+          <w:shd w:fill="auto" w:val="clear"/>
+          <w:lang w:val="en-US" w:eastAsia="zh-CN" w:bidi="hi-IN"/>
+        </w:rPr>
+        <w:t>T</w:t>
+      </w:r>
+      <w:r>
+        <w:rPr>
+          <w:rFonts w:eastAsia="Times New Roman" w:cs="Times New Roman" w:ascii="Garamond" w:hAnsi="Garamond"/>
+          <w:color w:val="000000"/>
+          <w:kern w:val="0"/>
+          <w:sz w:val="36"/>
+          <w:szCs w:val="36"/>
+          <w:shd w:fill="auto" w:val="clear"/>
+          <w:lang w:val="en-US" w:eastAsia="zh-CN" w:bidi="hi-IN"/>
+        </w:rPr>
+        <w:t xml:space="preserve">udo o que existe — seja material, seja imaterial — está </w:t>
+      </w:r>
+      <w:r>
+        <w:rPr>
+          <w:rFonts w:eastAsia="Times New Roman" w:cs="Times New Roman" w:ascii="Garamond" w:hAnsi="Garamond"/>
+          <w:color w:val="000000"/>
+          <w:kern w:val="0"/>
+          <w:sz w:val="36"/>
+          <w:szCs w:val="36"/>
+          <w:shd w:fill="auto" w:val="clear"/>
+          <w:lang w:val="en-US" w:eastAsia="zh-CN" w:bidi="hi-IN"/>
+        </w:rPr>
+        <w:t>mergulhado n</w:t>
+      </w:r>
+      <w:r>
+        <w:rPr>
+          <w:rFonts w:eastAsia="Times New Roman" w:cs="Times New Roman" w:ascii="Garamond" w:hAnsi="Garamond"/>
+          <w:color w:val="000000"/>
+          <w:kern w:val="0"/>
+          <w:sz w:val="36"/>
+          <w:szCs w:val="36"/>
+          <w:shd w:fill="auto" w:val="clear"/>
+          <w:lang w:val="en-US" w:eastAsia="zh-CN" w:bidi="hi-IN"/>
+        </w:rPr>
+        <w:t xml:space="preserve">aquilo que chamamos de fluido cósmico universal. </w:t>
       </w:r>
     </w:p>
     <w:p>
@@ -2280,13 +2817,32 @@
         <w:pStyle w:val="Normal"/>
         <w:jc w:val="both"/>
         <w:rPr>
-          <w:color w:val="auto"/>
-        </w:rPr>
-      </w:pPr>
-      <w:r>
-        <w:rPr>
-          <w:color w:val="auto"/>
-        </w:rPr>
+          <w:color w:val="18A303"/>
+        </w:rPr>
+      </w:pPr>
+      <w:r>
+        <w:rPr>
+          <w:rFonts w:eastAsia="Times New Roman" w:cs="Times New Roman" w:ascii="Garamond" w:hAnsi="Garamond"/>
+          <w:color w:val="18A303"/>
+          <w:kern w:val="0"/>
+          <w:sz w:val="36"/>
+          <w:szCs w:val="36"/>
+          <w:shd w:fill="auto" w:val="clear"/>
+          <w:lang w:val="en-US" w:eastAsia="zh-CN" w:bidi="hi-IN"/>
+        </w:rPr>
+        <w:t>[ Parei aqui na revisão final em 14/03/2026 ]</w:t>
+      </w:r>
+    </w:p>
+    <w:p>
+      <w:pPr>
+        <w:pStyle w:val="Normal"/>
+        <w:jc w:val="both"/>
+        <w:rPr>
+          <w:color w:val="auto"/>
+        </w:rPr>
+      </w:pPr>
+      <w:r>
+        <w:rPr/>
       </w:r>
     </w:p>
     <w:p>
@@ -2447,204 +3003,84 @@
           <w:shd w:fill="auto" w:val="clear"/>
           <w:lang w:val="en-US" w:eastAsia="zh-CN" w:bidi="hi-IN"/>
         </w:rPr>
-        <w:t xml:space="preserve">Quando oramos, a força dessa corrente depende da qualidade do nosso pensamento e da nossa vontade. É por isso que os Espíritos podem ouvir as preces que lhes são dirigidas, onde quer que estejam. Pela mesma razão os Espíritos podem nos inspirar e estabelecer </w:t>
-      </w:r>
-      <w:r>
-        <w:rPr>
-          <w:rFonts w:eastAsia="Times New Roman" w:cs="Times New Roman" w:ascii="Garamond" w:hAnsi="Garamond"/>
-          <w:color w:val="000000"/>
-          <w:kern w:val="0"/>
-          <w:sz w:val="36"/>
-          <w:szCs w:val="36"/>
-          <w:shd w:fill="auto" w:val="clear"/>
-          <w:lang w:val="en-US" w:eastAsia="zh-CN" w:bidi="hi-IN"/>
-        </w:rPr>
-        <w:t>ligações</w:t>
-      </w:r>
-      <w:r>
-        <w:rPr>
-          <w:rFonts w:eastAsia="Times New Roman" w:cs="Times New Roman" w:ascii="Garamond" w:hAnsi="Garamond"/>
-          <w:color w:val="000000"/>
-          <w:kern w:val="0"/>
-          <w:sz w:val="36"/>
-          <w:szCs w:val="36"/>
-          <w:shd w:fill="auto" w:val="clear"/>
-          <w:lang w:val="en-US" w:eastAsia="zh-CN" w:bidi="hi-IN"/>
-        </w:rPr>
-        <w:t xml:space="preserve"> mesmo à distância.</w:t>
-      </w:r>
-    </w:p>
-    <w:p>
-      <w:pPr>
-        <w:pStyle w:val="Normal"/>
-        <w:jc w:val="both"/>
-        <w:rPr>
-          <w:color w:val="auto"/>
-        </w:rPr>
-      </w:pPr>
-      <w:r>
-        <w:rPr>
-          <w:color w:val="auto"/>
-        </w:rPr>
-      </w:r>
-    </w:p>
-    <w:p>
-      <w:pPr>
-        <w:pStyle w:val="Normal"/>
-        <w:jc w:val="both"/>
-        <w:rPr>
-          <w:color w:val="auto"/>
-        </w:rPr>
-      </w:pPr>
-      <w:r>
-        <w:rPr>
-          <w:color w:val="auto"/>
-        </w:rPr>
-      </w:r>
-    </w:p>
-    <w:p>
-      <w:pPr>
-        <w:pStyle w:val="Normal"/>
-        <w:jc w:val="both"/>
-        <w:rPr>
-          <w:color w:val="auto"/>
-        </w:rPr>
-      </w:pPr>
-      <w:r>
-        <w:rPr>
-          <w:color w:val="auto"/>
-        </w:rPr>
-      </w:r>
-    </w:p>
-    <w:p>
-      <w:pPr>
-        <w:pStyle w:val="Normal"/>
-        <w:jc w:val="both"/>
-        <w:rPr>
-          <w:color w:val="auto"/>
-        </w:rPr>
-      </w:pPr>
-      <w:r>
-        <w:rPr>
-          <w:color w:val="auto"/>
-        </w:rPr>
-      </w:r>
-    </w:p>
-    <w:p>
-      <w:pPr>
-        <w:pStyle w:val="Normal"/>
-        <w:jc w:val="both"/>
-        <w:rPr>
-          <w:color w:val="auto"/>
-        </w:rPr>
-      </w:pPr>
-      <w:r>
-        <w:rPr>
-          <w:rFonts w:eastAsia="Times New Roman" w:cs="Times New Roman" w:ascii="Garamond" w:hAnsi="Garamond"/>
-          <w:color w:val="000000"/>
-          <w:kern w:val="0"/>
-          <w:sz w:val="36"/>
-          <w:szCs w:val="36"/>
-          <w:shd w:fill="auto" w:val="clear"/>
-          <w:lang w:val="en-US" w:eastAsia="zh-CN" w:bidi="hi-IN"/>
-        </w:rPr>
-        <w:t>Podemos fazer uma comparação para compreender essa dinâmica. As pessoas que estão mais ao fundo do auditório só conseguem ouvir o que estou dizendo porque o som da minha voz é</w:t>
-      </w:r>
-      <w:r>
-        <w:rPr>
-          <w:rFonts w:eastAsia="Times New Roman" w:cs="Times New Roman" w:ascii="Garamond" w:hAnsi="Garamond"/>
-          <w:color w:val="000000"/>
-          <w:kern w:val="0"/>
-          <w:sz w:val="36"/>
-          <w:szCs w:val="36"/>
-          <w:shd w:fill="auto" w:val="clear"/>
-          <w:lang w:val="en-US" w:eastAsia="zh-CN" w:bidi="hi-IN"/>
-        </w:rPr>
-        <w:t xml:space="preserve"> </w:t>
-      </w:r>
-      <w:r>
-        <w:rPr>
-          <w:rFonts w:eastAsia="Times New Roman" w:cs="Times New Roman" w:ascii="Garamond" w:hAnsi="Garamond"/>
-          <w:color w:val="000000"/>
-          <w:kern w:val="0"/>
-          <w:sz w:val="36"/>
-          <w:szCs w:val="36"/>
-          <w:shd w:fill="auto" w:val="clear"/>
-          <w:lang w:val="en-US" w:eastAsia="zh-CN" w:bidi="hi-IN"/>
-        </w:rPr>
-        <w:t>captado pelo microfone, pass</w:t>
-      </w:r>
-      <w:r>
-        <w:rPr>
-          <w:rFonts w:eastAsia="Times New Roman" w:cs="Times New Roman" w:ascii="Garamond" w:hAnsi="Garamond"/>
-          <w:color w:val="000000"/>
-          <w:kern w:val="0"/>
-          <w:sz w:val="36"/>
-          <w:szCs w:val="36"/>
-          <w:shd w:fill="auto" w:val="clear"/>
-          <w:lang w:val="en-US" w:eastAsia="zh-CN" w:bidi="hi-IN"/>
-        </w:rPr>
-        <w:t>a</w:t>
-      </w:r>
-      <w:r>
-        <w:rPr>
-          <w:rFonts w:eastAsia="Times New Roman" w:cs="Times New Roman" w:ascii="Garamond" w:hAnsi="Garamond"/>
-          <w:color w:val="000000"/>
-          <w:kern w:val="0"/>
-          <w:sz w:val="36"/>
-          <w:szCs w:val="36"/>
-          <w:shd w:fill="auto" w:val="clear"/>
-          <w:lang w:val="en-US" w:eastAsia="zh-CN" w:bidi="hi-IN"/>
-        </w:rPr>
-        <w:t xml:space="preserve"> por um amplificador e é</w:t>
-      </w:r>
-      <w:r>
-        <w:rPr>
-          <w:rFonts w:eastAsia="Times New Roman" w:cs="Times New Roman" w:ascii="Garamond" w:hAnsi="Garamond"/>
-          <w:color w:val="000000"/>
-          <w:kern w:val="0"/>
-          <w:sz w:val="36"/>
-          <w:szCs w:val="36"/>
-          <w:shd w:fill="auto" w:val="clear"/>
-          <w:lang w:val="en-US" w:eastAsia="zh-CN" w:bidi="hi-IN"/>
-        </w:rPr>
-        <w:t xml:space="preserve"> distribuído</w:t>
-      </w:r>
-      <w:r>
-        <w:rPr>
-          <w:rFonts w:eastAsia="Times New Roman" w:cs="Times New Roman" w:ascii="Garamond" w:hAnsi="Garamond"/>
-          <w:color w:val="000000"/>
-          <w:kern w:val="0"/>
-          <w:sz w:val="36"/>
-          <w:szCs w:val="36"/>
-          <w:shd w:fill="auto" w:val="clear"/>
-          <w:lang w:val="en-US" w:eastAsia="zh-CN" w:bidi="hi-IN"/>
-        </w:rPr>
-        <w:t xml:space="preserve"> p</w:t>
-      </w:r>
-      <w:r>
-        <w:rPr>
-          <w:rFonts w:eastAsia="Times New Roman" w:cs="Times New Roman" w:ascii="Garamond" w:hAnsi="Garamond"/>
-          <w:color w:val="000000"/>
-          <w:kern w:val="0"/>
-          <w:sz w:val="36"/>
-          <w:szCs w:val="36"/>
-          <w:shd w:fill="auto" w:val="clear"/>
-          <w:lang w:val="en-US" w:eastAsia="zh-CN" w:bidi="hi-IN"/>
-        </w:rPr>
-        <w:t>elas</w:t>
-      </w:r>
-      <w:r>
-        <w:rPr>
-          <w:rFonts w:eastAsia="Times New Roman" w:cs="Times New Roman" w:ascii="Garamond" w:hAnsi="Garamond"/>
-          <w:color w:val="000000"/>
-          <w:kern w:val="0"/>
-          <w:sz w:val="36"/>
-          <w:szCs w:val="36"/>
-          <w:shd w:fill="auto" w:val="clear"/>
-          <w:lang w:val="en-US" w:eastAsia="zh-CN" w:bidi="hi-IN"/>
-        </w:rPr>
-        <w:t xml:space="preserve"> caixas de som que estão nas laterais do salão.</w:t>
+        <w:t>Quando oramos, a força dessa corrente depende da qualidade do nosso pensamento e da nossa vontade. É por isso que os Espíritos podem ouvir as preces que lhes são dirigidas, onde quer que estejam. Pela mesma razão os Espíritos podem nos inspirar e estabelecer ligações mesmo à distância.</w:t>
+      </w:r>
+    </w:p>
+    <w:p>
+      <w:pPr>
+        <w:pStyle w:val="Normal"/>
+        <w:jc w:val="both"/>
+        <w:rPr>
+          <w:color w:val="auto"/>
+        </w:rPr>
+      </w:pPr>
+      <w:r>
+        <w:rPr>
+          <w:color w:val="auto"/>
+        </w:rPr>
+      </w:r>
+    </w:p>
+    <w:p>
+      <w:pPr>
+        <w:pStyle w:val="Normal"/>
+        <w:jc w:val="both"/>
+        <w:rPr>
+          <w:color w:val="auto"/>
+        </w:rPr>
+      </w:pPr>
+      <w:r>
+        <w:rPr>
+          <w:color w:val="auto"/>
+        </w:rPr>
+      </w:r>
+    </w:p>
+    <w:p>
+      <w:pPr>
+        <w:pStyle w:val="Normal"/>
+        <w:jc w:val="both"/>
+        <w:rPr>
+          <w:color w:val="auto"/>
+        </w:rPr>
+      </w:pPr>
+      <w:r>
+        <w:rPr>
+          <w:color w:val="auto"/>
+        </w:rPr>
+      </w:r>
+    </w:p>
+    <w:p>
+      <w:pPr>
+        <w:pStyle w:val="Normal"/>
+        <w:jc w:val="both"/>
+        <w:rPr>
+          <w:color w:val="auto"/>
+        </w:rPr>
+      </w:pPr>
+      <w:r>
+        <w:rPr>
+          <w:color w:val="auto"/>
+        </w:rPr>
+      </w:r>
+    </w:p>
+    <w:p>
+      <w:pPr>
+        <w:pStyle w:val="Normal"/>
+        <w:jc w:val="both"/>
+        <w:rPr>
+          <w:color w:val="auto"/>
+        </w:rPr>
+      </w:pPr>
+      <w:r>
+        <w:rPr>
+          <w:rFonts w:eastAsia="Times New Roman" w:cs="Times New Roman" w:ascii="Garamond" w:hAnsi="Garamond"/>
+          <w:color w:val="000000"/>
+          <w:kern w:val="0"/>
+          <w:sz w:val="36"/>
+          <w:szCs w:val="36"/>
+          <w:shd w:fill="auto" w:val="clear"/>
+          <w:lang w:val="en-US" w:eastAsia="zh-CN" w:bidi="hi-IN"/>
+        </w:rPr>
+        <w:t>Podemos fazer uma comparação para compreender essa dinâmica. As pessoas que estão mais ao fundo do auditório só conseguem ouvir o que estou dizendo porque o som da minha voz é captado pelo microfone, passa por um amplificador e é distribuído pelas caixas de som que estão nas laterais do salão.</w:t>
       </w:r>
     </w:p>
     <w:p>
@@ -2714,504 +3150,112 @@
           <w:shd w:fill="auto" w:val="clear"/>
           <w:lang w:val="en-US" w:eastAsia="zh-CN" w:bidi="hi-IN"/>
         </w:rPr>
-        <w:t xml:space="preserve">O mesmo se dá com a oração: quanto mais amplificada ela estiver, maior o seu alcance. </w:t>
-      </w:r>
-      <w:r>
-        <w:rPr>
-          <w:rFonts w:eastAsia="Times New Roman" w:cs="Times New Roman" w:ascii="Garamond" w:hAnsi="Garamond"/>
-          <w:color w:val="000000"/>
-          <w:kern w:val="0"/>
-          <w:sz w:val="36"/>
-          <w:szCs w:val="36"/>
-          <w:shd w:fill="auto" w:val="clear"/>
-          <w:lang w:val="en-US" w:eastAsia="zh-CN" w:bidi="hi-IN"/>
-        </w:rPr>
-        <w:t xml:space="preserve">De que maneira </w:t>
-      </w:r>
-      <w:r>
-        <w:rPr>
-          <w:rFonts w:eastAsia="Times New Roman" w:cs="Times New Roman" w:ascii="Garamond" w:hAnsi="Garamond"/>
-          <w:color w:val="000000"/>
-          <w:kern w:val="0"/>
-          <w:sz w:val="36"/>
-          <w:szCs w:val="36"/>
-          <w:shd w:fill="auto" w:val="clear"/>
-          <w:lang w:val="en-US" w:eastAsia="zh-CN" w:bidi="hi-IN"/>
-        </w:rPr>
-        <w:t xml:space="preserve">podemos </w:t>
-      </w:r>
-      <w:r>
-        <w:rPr>
-          <w:rFonts w:eastAsia="Times New Roman" w:cs="Times New Roman" w:ascii="Garamond" w:hAnsi="Garamond"/>
-          <w:color w:val="000000"/>
-          <w:kern w:val="0"/>
-          <w:sz w:val="36"/>
-          <w:szCs w:val="36"/>
-          <w:shd w:fill="auto" w:val="clear"/>
-          <w:lang w:val="en-US" w:eastAsia="zh-CN" w:bidi="hi-IN"/>
-        </w:rPr>
-        <w:t>potencializar</w:t>
-      </w:r>
-      <w:r>
-        <w:rPr>
-          <w:rFonts w:eastAsia="Times New Roman" w:cs="Times New Roman" w:ascii="Garamond" w:hAnsi="Garamond"/>
-          <w:color w:val="000000"/>
-          <w:kern w:val="0"/>
-          <w:sz w:val="36"/>
-          <w:szCs w:val="36"/>
-          <w:shd w:fill="auto" w:val="clear"/>
-          <w:lang w:val="en-US" w:eastAsia="zh-CN" w:bidi="hi-IN"/>
-        </w:rPr>
-        <w:t xml:space="preserve"> nossa oração? </w:t>
-      </w:r>
-      <w:r>
-        <w:rPr>
-          <w:rFonts w:eastAsia="Times New Roman" w:cs="Times New Roman" w:ascii="Garamond" w:hAnsi="Garamond"/>
-          <w:color w:val="000000"/>
-          <w:kern w:val="0"/>
-          <w:sz w:val="36"/>
-          <w:szCs w:val="36"/>
-          <w:shd w:fill="auto" w:val="clear"/>
-          <w:lang w:val="en-US" w:eastAsia="zh-CN" w:bidi="hi-IN"/>
-        </w:rPr>
-        <w:t>Fazendo com que ela seja</w:t>
-      </w:r>
-      <w:r>
-        <w:rPr>
-          <w:rFonts w:eastAsia="Times New Roman" w:cs="Times New Roman" w:ascii="Garamond" w:hAnsi="Garamond"/>
-          <w:color w:val="000000"/>
-          <w:kern w:val="0"/>
-          <w:sz w:val="36"/>
-          <w:szCs w:val="36"/>
-          <w:shd w:fill="auto" w:val="clear"/>
-          <w:lang w:val="en-US" w:eastAsia="zh-CN" w:bidi="hi-IN"/>
-        </w:rPr>
-        <w:t xml:space="preserve"> sincera, </w:t>
-      </w:r>
-      <w:r>
-        <w:rPr>
-          <w:rFonts w:eastAsia="Times New Roman" w:cs="Times New Roman" w:ascii="Garamond" w:hAnsi="Garamond"/>
-          <w:color w:val="000000"/>
-          <w:kern w:val="0"/>
-          <w:sz w:val="36"/>
-          <w:szCs w:val="36"/>
-          <w:shd w:fill="auto" w:val="clear"/>
-          <w:lang w:val="en-US" w:eastAsia="zh-CN" w:bidi="hi-IN"/>
-        </w:rPr>
-        <w:t>humilde</w:t>
-      </w:r>
-      <w:r>
-        <w:rPr>
-          <w:rFonts w:eastAsia="Times New Roman" w:cs="Times New Roman" w:ascii="Garamond" w:hAnsi="Garamond"/>
-          <w:color w:val="000000"/>
-          <w:kern w:val="0"/>
-          <w:sz w:val="36"/>
-          <w:szCs w:val="36"/>
-          <w:shd w:fill="auto" w:val="clear"/>
-          <w:lang w:val="en-US" w:eastAsia="zh-CN" w:bidi="hi-IN"/>
-        </w:rPr>
-        <w:t xml:space="preserve">, </w:t>
-      </w:r>
-      <w:r>
-        <w:rPr>
-          <w:rFonts w:eastAsia="Times New Roman" w:cs="Times New Roman" w:ascii="Garamond" w:hAnsi="Garamond"/>
-          <w:color w:val="000000"/>
-          <w:kern w:val="0"/>
-          <w:sz w:val="36"/>
-          <w:szCs w:val="36"/>
-          <w:shd w:fill="auto" w:val="clear"/>
-          <w:lang w:val="en-US" w:eastAsia="zh-CN" w:bidi="hi-IN"/>
-        </w:rPr>
-        <w:t xml:space="preserve">carregada </w:t>
-      </w:r>
-      <w:r>
-        <w:rPr>
-          <w:rFonts w:eastAsia="Times New Roman" w:cs="Times New Roman" w:ascii="Garamond" w:hAnsi="Garamond"/>
-          <w:color w:val="000000"/>
-          <w:kern w:val="0"/>
-          <w:sz w:val="36"/>
-          <w:szCs w:val="36"/>
-          <w:shd w:fill="auto" w:val="clear"/>
-          <w:lang w:val="en-US" w:eastAsia="zh-CN" w:bidi="hi-IN"/>
-        </w:rPr>
-        <w:t xml:space="preserve">de bons pensamentos e sentimentos, </w:t>
-      </w:r>
-      <w:r>
-        <w:rPr>
-          <w:rFonts w:eastAsia="Times New Roman" w:cs="Times New Roman" w:ascii="Garamond" w:hAnsi="Garamond"/>
-          <w:color w:val="000000"/>
-          <w:kern w:val="0"/>
-          <w:sz w:val="36"/>
-          <w:szCs w:val="36"/>
-          <w:shd w:fill="auto" w:val="clear"/>
-          <w:lang w:val="en-US" w:eastAsia="zh-CN" w:bidi="hi-IN"/>
-        </w:rPr>
-        <w:t>com</w:t>
-      </w:r>
-      <w:r>
-        <w:rPr>
-          <w:rFonts w:eastAsia="Times New Roman" w:cs="Times New Roman" w:ascii="Garamond" w:hAnsi="Garamond"/>
-          <w:color w:val="000000"/>
-          <w:kern w:val="0"/>
-          <w:sz w:val="36"/>
-          <w:szCs w:val="36"/>
-          <w:shd w:fill="auto" w:val="clear"/>
-          <w:lang w:val="en-US" w:eastAsia="zh-CN" w:bidi="hi-IN"/>
-        </w:rPr>
-        <w:t xml:space="preserve"> desejo </w:t>
-      </w:r>
-      <w:r>
-        <w:rPr>
-          <w:rFonts w:eastAsia="Times New Roman" w:cs="Times New Roman" w:ascii="Garamond" w:hAnsi="Garamond"/>
-          <w:color w:val="000000"/>
-          <w:kern w:val="0"/>
-          <w:sz w:val="36"/>
-          <w:szCs w:val="36"/>
-          <w:shd w:fill="auto" w:val="clear"/>
-          <w:lang w:val="en-US" w:eastAsia="zh-CN" w:bidi="hi-IN"/>
-        </w:rPr>
-        <w:t xml:space="preserve">verdadeiro </w:t>
-      </w:r>
-      <w:r>
-        <w:rPr>
-          <w:rFonts w:eastAsia="Times New Roman" w:cs="Times New Roman" w:ascii="Garamond" w:hAnsi="Garamond"/>
-          <w:color w:val="000000"/>
-          <w:kern w:val="0"/>
-          <w:sz w:val="36"/>
-          <w:szCs w:val="36"/>
-          <w:shd w:fill="auto" w:val="clear"/>
-          <w:lang w:val="en-US" w:eastAsia="zh-CN" w:bidi="hi-IN"/>
-        </w:rPr>
-        <w:t>de servir, consolar</w:t>
-      </w:r>
-      <w:r>
-        <w:rPr>
-          <w:rFonts w:eastAsia="Times New Roman" w:cs="Times New Roman" w:ascii="Garamond" w:hAnsi="Garamond"/>
-          <w:color w:val="000000"/>
-          <w:kern w:val="0"/>
-          <w:sz w:val="36"/>
-          <w:szCs w:val="36"/>
-          <w:shd w:fill="auto" w:val="clear"/>
-          <w:lang w:val="en-US" w:eastAsia="zh-CN" w:bidi="hi-IN"/>
-        </w:rPr>
-        <w:t xml:space="preserve"> e</w:t>
-      </w:r>
-      <w:r>
-        <w:rPr>
-          <w:rFonts w:eastAsia="Times New Roman" w:cs="Times New Roman" w:ascii="Garamond" w:hAnsi="Garamond"/>
-          <w:color w:val="000000"/>
-          <w:kern w:val="0"/>
-          <w:sz w:val="36"/>
-          <w:szCs w:val="36"/>
-          <w:shd w:fill="auto" w:val="clear"/>
-          <w:lang w:val="en-US" w:eastAsia="zh-CN" w:bidi="hi-IN"/>
-        </w:rPr>
-        <w:t xml:space="preserve"> auxiliar. </w:t>
-      </w:r>
-      <w:r>
-        <w:rPr>
-          <w:rFonts w:eastAsia="Times New Roman" w:cs="Times New Roman" w:ascii="Garamond" w:hAnsi="Garamond"/>
-          <w:color w:val="000000"/>
-          <w:kern w:val="0"/>
-          <w:sz w:val="36"/>
-          <w:szCs w:val="36"/>
-          <w:shd w:fill="auto" w:val="clear"/>
-          <w:lang w:val="en-US" w:eastAsia="zh-CN" w:bidi="hi-IN"/>
-        </w:rPr>
-        <w:t>A oração d</w:t>
-      </w:r>
-      <w:r>
-        <w:rPr>
-          <w:rFonts w:eastAsia="Times New Roman" w:cs="Times New Roman" w:ascii="Garamond" w:hAnsi="Garamond"/>
-          <w:color w:val="000000"/>
-          <w:kern w:val="0"/>
-          <w:sz w:val="36"/>
-          <w:szCs w:val="36"/>
-          <w:shd w:fill="auto" w:val="clear"/>
-          <w:lang w:val="en-US" w:eastAsia="zh-CN" w:bidi="hi-IN"/>
-        </w:rPr>
-        <w:t xml:space="preserve">eve também expressar nossa gratidão a Deus e a Jesus. </w:t>
-      </w:r>
-    </w:p>
-    <w:p>
-      <w:pPr>
-        <w:pStyle w:val="Normal"/>
-        <w:jc w:val="both"/>
-        <w:rPr>
-          <w:color w:val="auto"/>
-        </w:rPr>
-      </w:pPr>
-      <w:r>
-        <w:rPr/>
-      </w:r>
-    </w:p>
-    <w:p>
-      <w:pPr>
-        <w:pStyle w:val="Normal"/>
-        <w:jc w:val="both"/>
-        <w:rPr>
-          <w:color w:val="auto"/>
-        </w:rPr>
-      </w:pPr>
-      <w:r>
-        <w:rPr>
-          <w:rFonts w:eastAsia="Times New Roman" w:cs="Times New Roman" w:ascii="Garamond" w:hAnsi="Garamond"/>
-          <w:color w:val="000000"/>
-          <w:kern w:val="0"/>
-          <w:sz w:val="36"/>
-          <w:szCs w:val="36"/>
-          <w:shd w:fill="auto" w:val="clear"/>
-          <w:lang w:val="en-US" w:eastAsia="zh-CN" w:bidi="hi-IN"/>
-        </w:rPr>
-        <w:t xml:space="preserve">Voltando </w:t>
-      </w:r>
-      <w:r>
-        <w:rPr>
-          <w:rFonts w:eastAsia="Times New Roman" w:cs="Times New Roman" w:ascii="Garamond" w:hAnsi="Garamond"/>
-          <w:color w:val="000000"/>
-          <w:kern w:val="0"/>
-          <w:sz w:val="36"/>
-          <w:szCs w:val="36"/>
-          <w:shd w:fill="auto" w:val="clear"/>
-          <w:lang w:val="en-US" w:eastAsia="zh-CN" w:bidi="hi-IN"/>
-        </w:rPr>
-        <w:t xml:space="preserve">agora </w:t>
-      </w:r>
-      <w:r>
-        <w:rPr>
-          <w:rFonts w:eastAsia="Times New Roman" w:cs="Times New Roman" w:ascii="Garamond" w:hAnsi="Garamond"/>
-          <w:color w:val="000000"/>
-          <w:kern w:val="0"/>
-          <w:sz w:val="36"/>
-          <w:szCs w:val="36"/>
-          <w:shd w:fill="auto" w:val="clear"/>
-          <w:lang w:val="en-US" w:eastAsia="zh-CN" w:bidi="hi-IN"/>
-        </w:rPr>
-        <w:t xml:space="preserve">à passagem evangélica que estamos estudando, Jesus nos diz que Deus sabe do que necessitamos antes mesmo de pedirmos. Os  incrédulos </w:t>
-      </w:r>
-      <w:r>
-        <w:rPr>
-          <w:rFonts w:eastAsia="Times New Roman" w:cs="Times New Roman" w:ascii="Garamond" w:hAnsi="Garamond"/>
-          <w:color w:val="000000"/>
-          <w:kern w:val="0"/>
-          <w:sz w:val="36"/>
-          <w:szCs w:val="36"/>
-          <w:shd w:fill="auto" w:val="clear"/>
-          <w:lang w:val="en-US" w:eastAsia="zh-CN" w:bidi="hi-IN"/>
-        </w:rPr>
-        <w:t xml:space="preserve">se utilizam dessa fala de Jesus para argumentarem </w:t>
-      </w:r>
-      <w:r>
-        <w:rPr>
-          <w:rFonts w:eastAsia="Times New Roman" w:cs="Times New Roman" w:ascii="Garamond" w:hAnsi="Garamond"/>
-          <w:color w:val="000000"/>
-          <w:kern w:val="0"/>
-          <w:sz w:val="36"/>
-          <w:szCs w:val="36"/>
-          <w:shd w:fill="auto" w:val="clear"/>
-          <w:lang w:val="en-US" w:eastAsia="zh-CN" w:bidi="hi-IN"/>
-        </w:rPr>
-        <w:t>que</w:t>
-      </w:r>
-      <w:r>
-        <w:rPr>
-          <w:rFonts w:eastAsia="Times New Roman" w:cs="Times New Roman" w:ascii="Garamond" w:hAnsi="Garamond"/>
-          <w:color w:val="000000"/>
-          <w:kern w:val="0"/>
-          <w:sz w:val="36"/>
-          <w:szCs w:val="36"/>
-          <w:shd w:fill="auto" w:val="clear"/>
-          <w:lang w:val="en-US" w:eastAsia="zh-CN" w:bidi="hi-IN"/>
-        </w:rPr>
-        <w:t>, se é assim, então</w:t>
-      </w:r>
-      <w:r>
-        <w:rPr>
-          <w:rFonts w:eastAsia="Times New Roman" w:cs="Times New Roman" w:ascii="Garamond" w:hAnsi="Garamond"/>
-          <w:color w:val="000000"/>
-          <w:kern w:val="0"/>
-          <w:sz w:val="36"/>
-          <w:szCs w:val="36"/>
-          <w:shd w:fill="auto" w:val="clear"/>
-          <w:lang w:val="en-US" w:eastAsia="zh-CN" w:bidi="hi-IN"/>
-        </w:rPr>
-        <w:t xml:space="preserve"> a oração é desnecessária. Afinal de contas, se Deus já sabe do que necessitamos, não há </w:t>
-      </w:r>
-      <w:r>
-        <w:rPr>
-          <w:rFonts w:eastAsia="Times New Roman" w:cs="Times New Roman" w:ascii="Garamond" w:hAnsi="Garamond"/>
-          <w:color w:val="000000"/>
-          <w:kern w:val="0"/>
-          <w:sz w:val="36"/>
-          <w:szCs w:val="36"/>
-          <w:shd w:fill="auto" w:val="clear"/>
-          <w:lang w:val="en-US" w:eastAsia="zh-CN" w:bidi="hi-IN"/>
-        </w:rPr>
-        <w:t xml:space="preserve">razão em </w:t>
-      </w:r>
-      <w:r>
-        <w:rPr>
-          <w:rFonts w:eastAsia="Times New Roman" w:cs="Times New Roman" w:ascii="Garamond" w:hAnsi="Garamond"/>
-          <w:color w:val="000000"/>
-          <w:kern w:val="0"/>
-          <w:sz w:val="36"/>
-          <w:szCs w:val="36"/>
-          <w:shd w:fill="auto" w:val="clear"/>
-          <w:lang w:val="en-US" w:eastAsia="zh-CN" w:bidi="hi-IN"/>
-        </w:rPr>
-        <w:t xml:space="preserve"> pedir. </w:t>
-      </w:r>
-      <w:r>
-        <w:rPr>
-          <w:rFonts w:eastAsia="Times New Roman" w:cs="Times New Roman" w:ascii="Garamond" w:hAnsi="Garamond"/>
-          <w:color w:val="000000"/>
-          <w:kern w:val="0"/>
-          <w:sz w:val="36"/>
-          <w:szCs w:val="36"/>
-          <w:shd w:fill="auto" w:val="clear"/>
-          <w:lang w:val="en-US" w:eastAsia="zh-CN" w:bidi="hi-IN"/>
-        </w:rPr>
-        <w:t>Obviamente e</w:t>
-      </w:r>
-      <w:r>
-        <w:rPr>
-          <w:rFonts w:eastAsia="Times New Roman" w:cs="Times New Roman" w:ascii="Garamond" w:hAnsi="Garamond"/>
-          <w:color w:val="000000"/>
-          <w:kern w:val="0"/>
-          <w:sz w:val="36"/>
-          <w:szCs w:val="36"/>
-          <w:shd w:fill="auto" w:val="clear"/>
-          <w:lang w:val="en-US" w:eastAsia="zh-CN" w:bidi="hi-IN"/>
-        </w:rPr>
-        <w:t>sse é um pensamento completamente equivocado.</w:t>
-      </w:r>
-    </w:p>
-    <w:p>
-      <w:pPr>
-        <w:pStyle w:val="Normal"/>
-        <w:jc w:val="both"/>
-        <w:rPr>
-          <w:color w:val="auto"/>
-        </w:rPr>
-      </w:pPr>
-      <w:r>
-        <w:rPr>
-          <w:color w:val="auto"/>
-        </w:rPr>
-      </w:r>
-    </w:p>
-    <w:p>
-      <w:pPr>
-        <w:pStyle w:val="Normal"/>
-        <w:jc w:val="both"/>
-        <w:rPr>
-          <w:color w:val="auto"/>
-        </w:rPr>
-      </w:pPr>
-      <w:r>
-        <w:rPr>
-          <w:rFonts w:eastAsia="Times New Roman" w:cs="Times New Roman" w:ascii="Garamond" w:hAnsi="Garamond"/>
-          <w:color w:val="000000"/>
-          <w:kern w:val="0"/>
-          <w:sz w:val="36"/>
-          <w:szCs w:val="36"/>
-          <w:shd w:fill="auto" w:val="clear"/>
-          <w:lang w:val="en-US" w:eastAsia="zh-CN" w:bidi="hi-IN"/>
-        </w:rPr>
-        <w:t>A questão é que a</w:t>
-      </w:r>
-      <w:r>
-        <w:rPr>
-          <w:rFonts w:eastAsia="Times New Roman" w:cs="Times New Roman" w:ascii="Garamond" w:hAnsi="Garamond"/>
-          <w:color w:val="000000"/>
-          <w:kern w:val="0"/>
-          <w:sz w:val="36"/>
-          <w:szCs w:val="36"/>
-          <w:shd w:fill="auto" w:val="clear"/>
-          <w:lang w:val="en-US" w:eastAsia="zh-CN" w:bidi="hi-IN"/>
-        </w:rPr>
-        <w:t xml:space="preserve"> oração não tem como objetivo informar a Deus  aquilo de que precisamos; o objetivo </w:t>
-      </w:r>
-      <w:r>
-        <w:rPr>
-          <w:rFonts w:eastAsia="Times New Roman" w:cs="Times New Roman" w:ascii="Garamond" w:hAnsi="Garamond"/>
-          <w:color w:val="000000"/>
-          <w:kern w:val="0"/>
-          <w:sz w:val="36"/>
-          <w:szCs w:val="36"/>
-          <w:shd w:fill="auto" w:val="clear"/>
-          <w:lang w:val="en-US" w:eastAsia="zh-CN" w:bidi="hi-IN"/>
-        </w:rPr>
-        <w:t>dela</w:t>
-      </w:r>
-      <w:r>
-        <w:rPr>
-          <w:rFonts w:eastAsia="Times New Roman" w:cs="Times New Roman" w:ascii="Garamond" w:hAnsi="Garamond"/>
-          <w:color w:val="000000"/>
-          <w:kern w:val="0"/>
-          <w:sz w:val="36"/>
-          <w:szCs w:val="36"/>
-          <w:shd w:fill="auto" w:val="clear"/>
-          <w:lang w:val="en-US" w:eastAsia="zh-CN" w:bidi="hi-IN"/>
-        </w:rPr>
-        <w:t xml:space="preserve"> é nos transformar. </w:t>
-      </w:r>
-    </w:p>
-    <w:p>
-      <w:pPr>
-        <w:pStyle w:val="Normal"/>
-        <w:jc w:val="both"/>
-        <w:rPr>
-          <w:color w:val="auto"/>
-        </w:rPr>
-      </w:pPr>
-      <w:r>
-        <w:rPr/>
-      </w:r>
-    </w:p>
-    <w:p>
-      <w:pPr>
-        <w:pStyle w:val="Normal"/>
-        <w:jc w:val="both"/>
-        <w:rPr>
-          <w:color w:val="auto"/>
-        </w:rPr>
-      </w:pPr>
-      <w:r>
-        <w:rPr>
-          <w:rFonts w:eastAsia="Times New Roman" w:cs="Times New Roman" w:ascii="Garamond" w:hAnsi="Garamond"/>
-          <w:color w:val="000000"/>
-          <w:kern w:val="0"/>
-          <w:sz w:val="36"/>
-          <w:szCs w:val="36"/>
-          <w:shd w:fill="auto" w:val="clear"/>
-          <w:lang w:val="en-US" w:eastAsia="zh-CN" w:bidi="hi-IN"/>
-        </w:rPr>
-        <w:t xml:space="preserve">A oração não muda Deus. Muda quem ora. Quebra o nosso orgulho, abre o nosso coração e nos prepara para receber </w:t>
-      </w:r>
-      <w:r>
-        <w:rPr>
-          <w:rFonts w:eastAsia="Times New Roman" w:cs="Times New Roman" w:ascii="Garamond" w:hAnsi="Garamond"/>
-          <w:color w:val="000000"/>
-          <w:kern w:val="0"/>
-          <w:sz w:val="36"/>
-          <w:szCs w:val="36"/>
-          <w:shd w:fill="auto" w:val="clear"/>
-          <w:lang w:val="en-US" w:eastAsia="zh-CN" w:bidi="hi-IN"/>
-        </w:rPr>
-        <w:t>aquil</w:t>
-      </w:r>
-      <w:r>
-        <w:rPr>
-          <w:rFonts w:eastAsia="Times New Roman" w:cs="Times New Roman" w:ascii="Garamond" w:hAnsi="Garamond"/>
-          <w:color w:val="000000"/>
-          <w:kern w:val="0"/>
-          <w:sz w:val="36"/>
-          <w:szCs w:val="36"/>
-          <w:shd w:fill="auto" w:val="clear"/>
-          <w:lang w:val="en-US" w:eastAsia="zh-CN" w:bidi="hi-IN"/>
-        </w:rPr>
-        <w:t>o que Deus, em Sua infinita misericórdia, julga que temos mérito para receber.</w:t>
+        <w:t xml:space="preserve">O mesmo se dá com a oração: quanto mais amplificada ela estiver, maior o seu alcance. De que maneira podemos potencializar nossa oração? Fazendo com que ela seja sincera, humilde, carregada de bons pensamentos e sentimentos, com desejo verdadeiro de servir, consolar e auxiliar. A oração deve também expressar nossa gratidão a Deus e a Jesus. </w:t>
+      </w:r>
+    </w:p>
+    <w:p>
+      <w:pPr>
+        <w:pStyle w:val="Normal"/>
+        <w:jc w:val="both"/>
+        <w:rPr>
+          <w:color w:val="auto"/>
+        </w:rPr>
+      </w:pPr>
+      <w:r>
+        <w:rPr>
+          <w:color w:val="auto"/>
+        </w:rPr>
+      </w:r>
+    </w:p>
+    <w:p>
+      <w:pPr>
+        <w:pStyle w:val="Normal"/>
+        <w:jc w:val="both"/>
+        <w:rPr>
+          <w:color w:val="auto"/>
+        </w:rPr>
+      </w:pPr>
+      <w:r>
+        <w:rPr>
+          <w:rFonts w:eastAsia="Times New Roman" w:cs="Times New Roman" w:ascii="Garamond" w:hAnsi="Garamond"/>
+          <w:color w:val="000000"/>
+          <w:kern w:val="0"/>
+          <w:sz w:val="36"/>
+          <w:szCs w:val="36"/>
+          <w:shd w:fill="auto" w:val="clear"/>
+          <w:lang w:val="en-US" w:eastAsia="zh-CN" w:bidi="hi-IN"/>
+        </w:rPr>
+        <w:t>Voltando agora à passagem evangélica que estamos estudando, Jesus nos diz que Deus sabe do que necessitamos antes mesmo de pedirmos. Os  incrédulos se utilizam dessa fala de Jesus para argumentarem que, se é assim, então a oração é desnecessária. Afinal de contas, se Deus já sabe do que necessitamos, não há razão em  pedir. Obviamente esse é um pensamento completamente equivocado.</w:t>
+      </w:r>
+    </w:p>
+    <w:p>
+      <w:pPr>
+        <w:pStyle w:val="Normal"/>
+        <w:jc w:val="both"/>
+        <w:rPr>
+          <w:color w:val="auto"/>
+        </w:rPr>
+      </w:pPr>
+      <w:r>
+        <w:rPr>
+          <w:color w:val="auto"/>
+        </w:rPr>
+      </w:r>
+    </w:p>
+    <w:p>
+      <w:pPr>
+        <w:pStyle w:val="Normal"/>
+        <w:jc w:val="both"/>
+        <w:rPr>
+          <w:color w:val="auto"/>
+        </w:rPr>
+      </w:pPr>
+      <w:r>
+        <w:rPr>
+          <w:rFonts w:eastAsia="Times New Roman" w:cs="Times New Roman" w:ascii="Garamond" w:hAnsi="Garamond"/>
+          <w:color w:val="000000"/>
+          <w:kern w:val="0"/>
+          <w:sz w:val="36"/>
+          <w:szCs w:val="36"/>
+          <w:shd w:fill="auto" w:val="clear"/>
+          <w:lang w:val="en-US" w:eastAsia="zh-CN" w:bidi="hi-IN"/>
+        </w:rPr>
+        <w:t xml:space="preserve">A questão é que a oração não tem como objetivo informar a Deus  aquilo de que precisamos; o objetivo dela é nos transformar. </w:t>
+      </w:r>
+    </w:p>
+    <w:p>
+      <w:pPr>
+        <w:pStyle w:val="Normal"/>
+        <w:jc w:val="both"/>
+        <w:rPr>
+          <w:color w:val="auto"/>
+        </w:rPr>
+      </w:pPr>
+      <w:r>
+        <w:rPr>
+          <w:color w:val="auto"/>
+        </w:rPr>
+      </w:r>
+    </w:p>
+    <w:p>
+      <w:pPr>
+        <w:pStyle w:val="Normal"/>
+        <w:jc w:val="both"/>
+        <w:rPr>
+          <w:color w:val="auto"/>
+        </w:rPr>
+      </w:pPr>
+      <w:r>
+        <w:rPr>
+          <w:rFonts w:eastAsia="Times New Roman" w:cs="Times New Roman" w:ascii="Garamond" w:hAnsi="Garamond"/>
+          <w:color w:val="000000"/>
+          <w:kern w:val="0"/>
+          <w:sz w:val="36"/>
+          <w:szCs w:val="36"/>
+          <w:shd w:fill="auto" w:val="clear"/>
+          <w:lang w:val="en-US" w:eastAsia="zh-CN" w:bidi="hi-IN"/>
+        </w:rPr>
+        <w:t>A oração não muda Deus. Muda quem ora. Quebra o nosso orgulho, abre o nosso coração e nos prepara para receber aquilo que Deus, em Sua infinita misericórdia, julga que temos mérito para receber.</w:t>
       </w:r>
     </w:p>
     <w:p>
@@ -3256,139 +3300,21 @@
           <w:shd w:fill="auto" w:val="clear"/>
           <w:lang w:val="en-US" w:eastAsia="zh-CN" w:bidi="hi-IN"/>
         </w:rPr>
-        <w:t xml:space="preserve">Vamos fazer mais uma comparação: </w:t>
-      </w:r>
-      <w:r>
-        <w:rPr>
-          <w:rFonts w:eastAsia="Times New Roman" w:cs="Times New Roman" w:ascii="Garamond" w:hAnsi="Garamond"/>
-          <w:color w:val="000000"/>
-          <w:kern w:val="0"/>
-          <w:sz w:val="36"/>
-          <w:szCs w:val="36"/>
-          <w:shd w:fill="auto" w:val="clear"/>
-          <w:lang w:val="en-US" w:eastAsia="zh-CN" w:bidi="hi-IN"/>
-        </w:rPr>
-        <w:t>as bençãos que</w:t>
-      </w:r>
-      <w:r>
-        <w:rPr>
-          <w:rFonts w:eastAsia="Times New Roman" w:cs="Times New Roman" w:ascii="Garamond" w:hAnsi="Garamond"/>
-          <w:color w:val="000000"/>
-          <w:kern w:val="0"/>
-          <w:sz w:val="36"/>
-          <w:szCs w:val="36"/>
-          <w:shd w:fill="auto" w:val="clear"/>
-          <w:lang w:val="en-US" w:eastAsia="zh-CN" w:bidi="hi-IN"/>
-        </w:rPr>
-        <w:t xml:space="preserve"> Deus </w:t>
-      </w:r>
-      <w:r>
-        <w:rPr>
-          <w:rFonts w:eastAsia="Times New Roman" w:cs="Times New Roman" w:ascii="Garamond" w:hAnsi="Garamond"/>
-          <w:color w:val="000000"/>
-          <w:kern w:val="0"/>
-          <w:sz w:val="36"/>
-          <w:szCs w:val="36"/>
-          <w:shd w:fill="auto" w:val="clear"/>
-          <w:lang w:val="en-US" w:eastAsia="zh-CN" w:bidi="hi-IN"/>
-        </w:rPr>
-        <w:t>pode nos conceder assemelham-se</w:t>
-      </w:r>
-      <w:r>
-        <w:rPr>
-          <w:rFonts w:eastAsia="Times New Roman" w:cs="Times New Roman" w:ascii="Garamond" w:hAnsi="Garamond"/>
-          <w:color w:val="000000"/>
-          <w:kern w:val="0"/>
-          <w:sz w:val="36"/>
-          <w:szCs w:val="36"/>
-          <w:shd w:fill="auto" w:val="clear"/>
-          <w:lang w:val="en-US" w:eastAsia="zh-CN" w:bidi="hi-IN"/>
-        </w:rPr>
-        <w:t xml:space="preserve"> a uma fonte de água. Quem vai até a fonte com um copo recolhe um copo; quem leva uma jarra recolhe uma jarra; quem leva um barril recolhe um barril. A fonte </w:t>
-      </w:r>
-      <w:r>
-        <w:rPr>
-          <w:rFonts w:eastAsia="Times New Roman" w:cs="Times New Roman" w:ascii="Garamond" w:hAnsi="Garamond"/>
-          <w:color w:val="000000"/>
-          <w:kern w:val="0"/>
-          <w:sz w:val="36"/>
-          <w:szCs w:val="36"/>
-          <w:shd w:fill="auto" w:val="clear"/>
-          <w:lang w:val="en-US" w:eastAsia="zh-CN" w:bidi="hi-IN"/>
-        </w:rPr>
-        <w:t>nunca</w:t>
-      </w:r>
-      <w:r>
-        <w:rPr>
-          <w:rFonts w:eastAsia="Times New Roman" w:cs="Times New Roman" w:ascii="Garamond" w:hAnsi="Garamond"/>
-          <w:color w:val="000000"/>
-          <w:kern w:val="0"/>
-          <w:sz w:val="36"/>
-          <w:szCs w:val="36"/>
-          <w:shd w:fill="auto" w:val="clear"/>
-          <w:lang w:val="en-US" w:eastAsia="zh-CN" w:bidi="hi-IN"/>
-        </w:rPr>
-        <w:t xml:space="preserve"> muda — </w:t>
-      </w:r>
-      <w:r>
-        <w:rPr>
-          <w:rFonts w:eastAsia="Times New Roman" w:cs="Times New Roman" w:ascii="Garamond" w:hAnsi="Garamond"/>
-          <w:color w:val="000000"/>
-          <w:kern w:val="0"/>
-          <w:sz w:val="36"/>
-          <w:szCs w:val="36"/>
-          <w:shd w:fill="auto" w:val="clear"/>
-          <w:lang w:val="en-US" w:eastAsia="zh-CN" w:bidi="hi-IN"/>
-        </w:rPr>
-        <w:t xml:space="preserve">ela </w:t>
-      </w:r>
-      <w:r>
-        <w:rPr>
-          <w:rFonts w:eastAsia="Times New Roman" w:cs="Times New Roman" w:ascii="Garamond" w:hAnsi="Garamond"/>
-          <w:color w:val="000000"/>
-          <w:kern w:val="0"/>
-          <w:sz w:val="36"/>
-          <w:szCs w:val="36"/>
-          <w:shd w:fill="auto" w:val="clear"/>
-          <w:lang w:val="en-US" w:eastAsia="zh-CN" w:bidi="hi-IN"/>
-        </w:rPr>
-        <w:t>é</w:t>
-      </w:r>
-      <w:r>
-        <w:rPr>
-          <w:rFonts w:eastAsia="Times New Roman" w:cs="Times New Roman" w:ascii="Garamond" w:hAnsi="Garamond"/>
-          <w:color w:val="000000"/>
-          <w:kern w:val="0"/>
-          <w:sz w:val="36"/>
-          <w:szCs w:val="36"/>
-          <w:shd w:fill="auto" w:val="clear"/>
-          <w:lang w:val="en-US" w:eastAsia="zh-CN" w:bidi="hi-IN"/>
-        </w:rPr>
-        <w:t xml:space="preserve"> sempre</w:t>
-      </w:r>
-      <w:r>
-        <w:rPr>
-          <w:rFonts w:eastAsia="Times New Roman" w:cs="Times New Roman" w:ascii="Garamond" w:hAnsi="Garamond"/>
-          <w:color w:val="000000"/>
-          <w:kern w:val="0"/>
-          <w:sz w:val="36"/>
-          <w:szCs w:val="36"/>
-          <w:shd w:fill="auto" w:val="clear"/>
-          <w:lang w:val="en-US" w:eastAsia="zh-CN" w:bidi="hi-IN"/>
-        </w:rPr>
-        <w:t xml:space="preserve"> a mesma. O que muda é a capacidade que cada um tem de recolher água.</w:t>
-      </w:r>
-    </w:p>
-    <w:p>
-      <w:pPr>
-        <w:pStyle w:val="Normal"/>
-        <w:jc w:val="both"/>
-        <w:rPr>
-          <w:color w:val="auto"/>
-        </w:rPr>
-      </w:pPr>
-      <w:r>
-        <w:rPr/>
+        <w:t>Vamos fazer mais uma comparação: as bençãos que Deus pode nos conceder assemelham-se a uma fonte de água. Quem vai até a fonte com um copo recolhe um copo; quem leva uma jarra recolhe uma jarra; quem leva um barril recolhe um barril. A fonte nunca muda — ela é sempre a mesma. O que muda é a capacidade que cada um tem de recolher água.</w:t>
+      </w:r>
+    </w:p>
+    <w:p>
+      <w:pPr>
+        <w:pStyle w:val="Normal"/>
+        <w:jc w:val="both"/>
+        <w:rPr>
+          <w:color w:val="auto"/>
+        </w:rPr>
+      </w:pPr>
+      <w:r>
+        <w:rPr>
+          <w:color w:val="auto"/>
+        </w:rPr>
       </w:r>
     </w:p>
     <w:p>
@@ -3430,151 +3356,21 @@
           <w:shd w:fill="auto" w:val="clear"/>
           <w:lang w:val="en-US" w:eastAsia="zh-CN" w:bidi="hi-IN"/>
         </w:rPr>
-        <w:t xml:space="preserve">Isso nos leva a uma outra questão muito importante dentro do tema Pedi e obtereis. Precisamos ter em mente que </w:t>
-      </w:r>
-      <w:r>
-        <w:rPr>
-          <w:rFonts w:eastAsia="Times New Roman" w:cs="Times New Roman" w:ascii="Garamond" w:hAnsi="Garamond"/>
-          <w:color w:val="000000"/>
-          <w:kern w:val="0"/>
-          <w:sz w:val="36"/>
-          <w:szCs w:val="36"/>
-          <w:shd w:fill="auto" w:val="clear"/>
-          <w:lang w:val="en-US" w:eastAsia="zh-CN" w:bidi="hi-IN"/>
-        </w:rPr>
-        <w:t xml:space="preserve">tudo está sempre subordinado à vontade de Deus. </w:t>
-      </w:r>
-      <w:r>
-        <w:rPr>
-          <w:rFonts w:eastAsia="Times New Roman" w:cs="Times New Roman" w:ascii="Garamond" w:hAnsi="Garamond"/>
-          <w:color w:val="000000"/>
-          <w:kern w:val="0"/>
-          <w:sz w:val="36"/>
-          <w:szCs w:val="36"/>
-          <w:shd w:fill="auto" w:val="clear"/>
-          <w:lang w:val="en-US" w:eastAsia="zh-CN" w:bidi="hi-IN"/>
-        </w:rPr>
-        <w:t>Em última instância, é</w:t>
-      </w:r>
-      <w:r>
-        <w:rPr>
-          <w:rFonts w:eastAsia="Times New Roman" w:cs="Times New Roman" w:ascii="Garamond" w:hAnsi="Garamond"/>
-          <w:color w:val="000000"/>
-          <w:kern w:val="0"/>
-          <w:sz w:val="36"/>
-          <w:szCs w:val="36"/>
-          <w:shd w:fill="auto" w:val="clear"/>
-          <w:lang w:val="en-US" w:eastAsia="zh-CN" w:bidi="hi-IN"/>
-        </w:rPr>
-        <w:t xml:space="preserve"> Ele que</w:t>
-      </w:r>
-      <w:r>
-        <w:rPr>
-          <w:rFonts w:eastAsia="Times New Roman" w:cs="Times New Roman" w:ascii="Garamond" w:hAnsi="Garamond"/>
-          <w:color w:val="000000"/>
-          <w:kern w:val="0"/>
-          <w:sz w:val="36"/>
-          <w:szCs w:val="36"/>
-          <w:shd w:fill="auto" w:val="clear"/>
-          <w:lang w:val="en-US" w:eastAsia="zh-CN" w:bidi="hi-IN"/>
-        </w:rPr>
-        <w:t xml:space="preserve"> </w:t>
-      </w:r>
-      <w:r>
-        <w:rPr>
-          <w:rFonts w:eastAsia="Times New Roman" w:cs="Times New Roman" w:ascii="Garamond" w:hAnsi="Garamond"/>
-          <w:color w:val="000000"/>
-          <w:kern w:val="0"/>
-          <w:sz w:val="36"/>
-          <w:szCs w:val="36"/>
-          <w:shd w:fill="auto" w:val="clear"/>
-          <w:lang w:val="en-US" w:eastAsia="zh-CN" w:bidi="hi-IN"/>
-        </w:rPr>
-        <w:t xml:space="preserve">decide se </w:t>
-      </w:r>
-      <w:r>
-        <w:rPr>
-          <w:rFonts w:eastAsia="Times New Roman" w:cs="Times New Roman" w:ascii="Garamond" w:hAnsi="Garamond"/>
-          <w:color w:val="000000"/>
-          <w:kern w:val="0"/>
-          <w:sz w:val="36"/>
-          <w:szCs w:val="36"/>
-          <w:shd w:fill="auto" w:val="clear"/>
-          <w:lang w:val="en-US" w:eastAsia="zh-CN" w:bidi="hi-IN"/>
-        </w:rPr>
-        <w:t>nossa</w:t>
-      </w:r>
-      <w:r>
-        <w:rPr>
-          <w:rFonts w:eastAsia="Times New Roman" w:cs="Times New Roman" w:ascii="Garamond" w:hAnsi="Garamond"/>
-          <w:color w:val="000000"/>
-          <w:kern w:val="0"/>
-          <w:sz w:val="36"/>
-          <w:szCs w:val="36"/>
-          <w:shd w:fill="auto" w:val="clear"/>
-          <w:lang w:val="en-US" w:eastAsia="zh-CN" w:bidi="hi-IN"/>
-        </w:rPr>
-        <w:t xml:space="preserve"> </w:t>
-      </w:r>
-      <w:r>
-        <w:rPr>
-          <w:rFonts w:eastAsia="Times New Roman" w:cs="Times New Roman" w:ascii="Garamond" w:hAnsi="Garamond"/>
-          <w:color w:val="000000"/>
-          <w:kern w:val="0"/>
-          <w:sz w:val="36"/>
-          <w:szCs w:val="36"/>
-          <w:shd w:fill="auto" w:val="clear"/>
-          <w:lang w:val="en-US" w:eastAsia="zh-CN" w:bidi="hi-IN"/>
-        </w:rPr>
-        <w:t>oração</w:t>
-      </w:r>
-      <w:r>
-        <w:rPr>
-          <w:rFonts w:eastAsia="Times New Roman" w:cs="Times New Roman" w:ascii="Garamond" w:hAnsi="Garamond"/>
-          <w:color w:val="000000"/>
-          <w:kern w:val="0"/>
-          <w:sz w:val="36"/>
-          <w:szCs w:val="36"/>
-          <w:shd w:fill="auto" w:val="clear"/>
-          <w:lang w:val="en-US" w:eastAsia="zh-CN" w:bidi="hi-IN"/>
-        </w:rPr>
-        <w:t xml:space="preserve"> poderá ou não </w:t>
-      </w:r>
-      <w:r>
-        <w:rPr>
-          <w:rFonts w:eastAsia="Times New Roman" w:cs="Times New Roman" w:ascii="Garamond" w:hAnsi="Garamond"/>
-          <w:color w:val="000000"/>
-          <w:kern w:val="0"/>
-          <w:sz w:val="36"/>
-          <w:szCs w:val="36"/>
-          <w:shd w:fill="auto" w:val="clear"/>
-          <w:lang w:val="en-US" w:eastAsia="zh-CN" w:bidi="hi-IN"/>
-        </w:rPr>
-        <w:t>ser atendida</w:t>
-      </w:r>
-      <w:r>
-        <w:rPr>
-          <w:rFonts w:eastAsia="Times New Roman" w:cs="Times New Roman" w:ascii="Garamond" w:hAnsi="Garamond"/>
-          <w:color w:val="000000"/>
-          <w:kern w:val="0"/>
-          <w:sz w:val="36"/>
-          <w:szCs w:val="36"/>
-          <w:shd w:fill="auto" w:val="clear"/>
-          <w:lang w:val="en-US" w:eastAsia="zh-CN" w:bidi="hi-IN"/>
-        </w:rPr>
-        <w:t>.</w:t>
-      </w:r>
-    </w:p>
-    <w:p>
-      <w:pPr>
-        <w:pStyle w:val="Normal"/>
-        <w:jc w:val="both"/>
-        <w:rPr>
-          <w:color w:val="auto"/>
-        </w:rPr>
-      </w:pPr>
-      <w:r>
-        <w:rPr/>
+        <w:t>Isso nos leva a uma outra questão muito importante dentro do tema Pedi e obtereis. Precisamos ter em mente que tudo está sempre subordinado à vontade de Deus. Em última instância, é Ele que decide se nossa oração poderá ou não ser atendida.</w:t>
+      </w:r>
+    </w:p>
+    <w:p>
+      <w:pPr>
+        <w:pStyle w:val="Normal"/>
+        <w:jc w:val="both"/>
+        <w:rPr>
+          <w:color w:val="auto"/>
+        </w:rPr>
+      </w:pPr>
+      <w:r>
+        <w:rPr>
+          <w:color w:val="auto"/>
+        </w:rPr>
       </w:r>
     </w:p>
     <w:p>
@@ -3607,7 +3403,9 @@
         </w:rPr>
       </w:pPr>
       <w:r>
-        <w:rPr/>
+        <w:rPr>
+          <w:color w:val="auto"/>
+        </w:rPr>
       </w:r>
     </w:p>
     <w:p>
@@ -3640,7 +3438,9 @@
         </w:rPr>
       </w:pPr>
       <w:r>
-        <w:rPr/>
+        <w:rPr>
+          <w:color w:val="auto"/>
+        </w:rPr>
       </w:r>
     </w:p>
     <w:p>
@@ -3696,31 +3496,7 @@
           <w:shd w:fill="auto" w:val="clear"/>
           <w:lang w:val="en-US" w:eastAsia="zh-CN" w:bidi="hi-IN"/>
         </w:rPr>
-        <w:t>[ Parei aqui em 1</w:t>
-      </w:r>
-      <w:r>
-        <w:rPr>
-          <w:rFonts w:eastAsia="Times New Roman" w:cs="Times New Roman" w:ascii="Garamond" w:hAnsi="Garamond"/>
-          <w:color w:val="18A303"/>
-          <w:kern w:val="0"/>
-          <w:sz w:val="36"/>
-          <w:szCs w:val="36"/>
-          <w:shd w:fill="auto" w:val="clear"/>
-          <w:lang w:val="en-US" w:eastAsia="zh-CN" w:bidi="hi-IN"/>
-        </w:rPr>
-        <w:t>2</w:t>
-      </w:r>
-      <w:r>
-        <w:rPr>
-          <w:rFonts w:eastAsia="Times New Roman" w:cs="Times New Roman" w:ascii="Garamond" w:hAnsi="Garamond"/>
-          <w:color w:val="18A303"/>
-          <w:kern w:val="0"/>
-          <w:sz w:val="36"/>
-          <w:szCs w:val="36"/>
-          <w:shd w:fill="auto" w:val="clear"/>
-          <w:lang w:val="en-US" w:eastAsia="zh-CN" w:bidi="hi-IN"/>
-        </w:rPr>
-        <w:t xml:space="preserve">/03/2026 ] </w:t>
+        <w:t xml:space="preserve">[ Parei aqui em 12/03/2026 ] </w:t>
       </w:r>
     </w:p>
     <w:p>
@@ -5447,7 +5223,7 @@
         <w:bCs/>
         <w:rFonts w:ascii="Garamond" w:hAnsi="Garamond"/>
       </w:rPr>
-      <w:t>27</w:t>
+      <w:t>26</w:t>
     </w:r>
     <w:r>
       <w:rPr>

</xml_diff>